<commit_message>
Rebuild install guide PDF/DOCX for 1.0.0 release
Regenerated from Installing.md after this session's doc fixes: SDRPlay
setup moved to §3A (after Radioconda + app install), §2 device steps
generalized beyond the B210, and the §3 download location added.
</commit_message>
<xml_diff>
--- a/DSES_RFI_Spectrum_Analyzer_Installation.docx
+++ b/DSES_RFI_Spectrum_Analyzer_Installation.docx
@@ -41,7 +41,7 @@
           <w:noProof/>
         </w:rPr>
         <w:drawing>
-          <wp:inline distT="0" distB="0" distL="0" distR="0" wp14:anchorId="578B8CDE" wp14:editId="1FA7FDA3">
+          <wp:inline distT="0" distB="0" distL="0" distR="0" wp14:anchorId="681B6E9B" wp14:editId="7F6F1815">
             <wp:extent cx="1371600" cy="1371600"/>
             <wp:effectExtent l="0" t="0" r="0" b="0"/>
             <wp:docPr id="1" name="Picture 1"/>
@@ -138,7 +138,7 @@
         <w:pStyle w:val="Heading1"/>
         <w:shd w:val="clear" w:color="auto" w:fill="156082"/>
       </w:pPr>
-      <w:bookmarkStart w:id="0" w:name="_Toc229939638"/>
+      <w:bookmarkStart w:id="0" w:name="_Toc230433309"/>
       <w:r>
         <w:lastRenderedPageBreak/>
         <w:t>Contents</w:t>
@@ -169,7 +169,7 @@
       <w:r>
         <w:fldChar w:fldCharType="separate"/>
       </w:r>
-      <w:hyperlink w:anchor="_Toc229939638" w:history="1">
+      <w:hyperlink w:anchor="_Toc230433309" w:history="1">
         <w:r>
           <w:rPr>
             <w:rStyle w:val="Hyperlink"/>
@@ -196,7 +196,7 @@
             <w:noProof/>
             <w:webHidden/>
           </w:rPr>
-          <w:instrText xml:space="preserve"> PAGEREF _Toc229939638 \h </w:instrText>
+          <w:instrText xml:space="preserve"> PAGEREF _Toc230433309 \h </w:instrText>
         </w:r>
         <w:r>
           <w:rPr>
@@ -242,13 +242,13 @@
           <w14:ligatures w14:val="standardContextual"/>
         </w:rPr>
       </w:pPr>
-      <w:hyperlink w:anchor="_Toc229939639" w:history="1">
+      <w:hyperlink w:anchor="_Toc230433310" w:history="1">
         <w:r>
           <w:rPr>
             <w:rStyle w:val="Hyperlink"/>
             <w:noProof/>
           </w:rPr>
-          <w:t>B210 Spectrum Analyzer — Installation Guide</w:t>
+          <w:t>DSES Spectrum Analyzer — Installation Guide</w:t>
         </w:r>
         <w:r>
           <w:rPr>
@@ -269,7 +269,7 @@
             <w:noProof/>
             <w:webHidden/>
           </w:rPr>
-          <w:instrText xml:space="preserve"> PAGEREF _Toc229939639 \h </w:instrText>
+          <w:instrText xml:space="preserve"> PAGEREF _Toc230433310 \h </w:instrText>
         </w:r>
         <w:r>
           <w:rPr>
@@ -315,7 +315,7 @@
           <w14:ligatures w14:val="standardContextual"/>
         </w:rPr>
       </w:pPr>
-      <w:hyperlink w:anchor="_Toc229939640" w:history="1">
+      <w:hyperlink w:anchor="_Toc230433311" w:history="1">
         <w:r>
           <w:rPr>
             <w:rStyle w:val="Hyperlink"/>
@@ -342,7 +342,7 @@
             <w:noProof/>
             <w:webHidden/>
           </w:rPr>
-          <w:instrText xml:space="preserve"> PAGEREF _Toc229939640 \h </w:instrText>
+          <w:instrText xml:space="preserve"> PAGEREF _Toc230433311 \h </w:instrText>
         </w:r>
         <w:r>
           <w:rPr>
@@ -388,7 +388,7 @@
           <w14:ligatures w14:val="standardContextual"/>
         </w:rPr>
       </w:pPr>
-      <w:hyperlink w:anchor="_Toc229939641" w:history="1">
+      <w:hyperlink w:anchor="_Toc230433312" w:history="1">
         <w:r>
           <w:rPr>
             <w:rStyle w:val="Hyperlink"/>
@@ -415,7 +415,7 @@
             <w:noProof/>
             <w:webHidden/>
           </w:rPr>
-          <w:instrText xml:space="preserve"> PAGEREF _Toc229939641 \h </w:instrText>
+          <w:instrText xml:space="preserve"> PAGEREF _Toc230433312 \h </w:instrText>
         </w:r>
         <w:r>
           <w:rPr>
@@ -461,13 +461,13 @@
           <w14:ligatures w14:val="standardContextual"/>
         </w:rPr>
       </w:pPr>
-      <w:hyperlink w:anchor="_Toc229939642" w:history="1">
+      <w:hyperlink w:anchor="_Toc230433313" w:history="1">
         <w:r>
           <w:rPr>
             <w:rStyle w:val="Hyperlink"/>
             <w:noProof/>
           </w:rPr>
-          <w:t>1A. Optional: extra setup for SDRPlay (RSP1A / RSP1B / RSPduo)</w:t>
+          <w:t>2. Installing Radioconda</w:t>
         </w:r>
         <w:r>
           <w:rPr>
@@ -488,7 +488,7 @@
             <w:noProof/>
             <w:webHidden/>
           </w:rPr>
-          <w:instrText xml:space="preserve"> PAGEREF _Toc229939642 \h </w:instrText>
+          <w:instrText xml:space="preserve"> PAGEREF _Toc230433313 \h </w:instrText>
         </w:r>
         <w:r>
           <w:rPr>
@@ -534,13 +534,13 @@
           <w14:ligatures w14:val="standardContextual"/>
         </w:rPr>
       </w:pPr>
-      <w:hyperlink w:anchor="_Toc229939643" w:history="1">
+      <w:hyperlink w:anchor="_Toc230433314" w:history="1">
         <w:r>
           <w:rPr>
             <w:rStyle w:val="Hyperlink"/>
             <w:noProof/>
           </w:rPr>
-          <w:t>1A.1 Install the SDRplay API</w:t>
+          <w:t>2.1 Windows 11</w:t>
         </w:r>
         <w:r>
           <w:rPr>
@@ -561,7 +561,7 @@
             <w:noProof/>
             <w:webHidden/>
           </w:rPr>
-          <w:instrText xml:space="preserve"> PAGEREF _Toc229939643 \h </w:instrText>
+          <w:instrText xml:space="preserve"> PAGEREF _Toc230433314 \h </w:instrText>
         </w:r>
         <w:r>
           <w:rPr>
@@ -607,13 +607,13 @@
           <w14:ligatures w14:val="standardContextual"/>
         </w:rPr>
       </w:pPr>
-      <w:hyperlink w:anchor="_Toc229939644" w:history="1">
+      <w:hyperlink w:anchor="_Toc230433315" w:history="1">
         <w:r>
           <w:rPr>
             <w:rStyle w:val="Hyperlink"/>
             <w:noProof/>
           </w:rPr>
-          <w:t>1A.2 Install the SoapySDRPlay module</w:t>
+          <w:t>2.2 Linux</w:t>
         </w:r>
         <w:r>
           <w:rPr>
@@ -634,7 +634,7 @@
             <w:noProof/>
             <w:webHidden/>
           </w:rPr>
-          <w:instrText xml:space="preserve"> PAGEREF _Toc229939644 \h </w:instrText>
+          <w:instrText xml:space="preserve"> PAGEREF _Toc230433315 \h </w:instrText>
         </w:r>
         <w:r>
           <w:rPr>
@@ -667,7 +667,7 @@
     </w:p>
     <w:p>
       <w:pPr>
-        <w:pStyle w:val="TOC2"/>
+        <w:pStyle w:val="TOC3"/>
         <w:tabs>
           <w:tab w:val="right" w:leader="dot" w:pos="9624"/>
         </w:tabs>
@@ -680,13 +680,13 @@
           <w14:ligatures w14:val="standardContextual"/>
         </w:rPr>
       </w:pPr>
-      <w:hyperlink w:anchor="_Toc229939645" w:history="1">
+      <w:hyperlink w:anchor="_Toc230433316" w:history="1">
         <w:r>
           <w:rPr>
             <w:rStyle w:val="Hyperlink"/>
             <w:noProof/>
           </w:rPr>
-          <w:t>2. Installing Radioconda</w:t>
+          <w:t>2.3 macOS (Intel and Apple Silicon)</w:t>
         </w:r>
         <w:r>
           <w:rPr>
@@ -707,7 +707,7 @@
             <w:noProof/>
             <w:webHidden/>
           </w:rPr>
-          <w:instrText xml:space="preserve"> PAGEREF _Toc229939645 \h </w:instrText>
+          <w:instrText xml:space="preserve"> PAGEREF _Toc230433316 \h </w:instrText>
         </w:r>
         <w:r>
           <w:rPr>
@@ -727,7 +727,7 @@
             <w:noProof/>
             <w:webHidden/>
           </w:rPr>
-          <w:t>5</w:t>
+          <w:t>6</w:t>
         </w:r>
         <w:r>
           <w:rPr>
@@ -740,7 +740,7 @@
     </w:p>
     <w:p>
       <w:pPr>
-        <w:pStyle w:val="TOC3"/>
+        <w:pStyle w:val="TOC2"/>
         <w:tabs>
           <w:tab w:val="right" w:leader="dot" w:pos="9624"/>
         </w:tabs>
@@ -753,13 +753,13 @@
           <w14:ligatures w14:val="standardContextual"/>
         </w:rPr>
       </w:pPr>
-      <w:hyperlink w:anchor="_Toc229939646" w:history="1">
+      <w:hyperlink w:anchor="_Toc230433317" w:history="1">
         <w:r>
           <w:rPr>
             <w:rStyle w:val="Hyperlink"/>
             <w:noProof/>
           </w:rPr>
-          <w:t>2.1 Windows 11</w:t>
+          <w:t>3. Installing the DSES Spectrum Analyzer</w:t>
         </w:r>
         <w:r>
           <w:rPr>
@@ -780,7 +780,7 @@
             <w:noProof/>
             <w:webHidden/>
           </w:rPr>
-          <w:instrText xml:space="preserve"> PAGEREF _Toc229939646 \h </w:instrText>
+          <w:instrText xml:space="preserve"> PAGEREF _Toc230433317 \h </w:instrText>
         </w:r>
         <w:r>
           <w:rPr>
@@ -800,7 +800,7 @@
             <w:noProof/>
             <w:webHidden/>
           </w:rPr>
-          <w:t>5</w:t>
+          <w:t>6</w:t>
         </w:r>
         <w:r>
           <w:rPr>
@@ -826,13 +826,13 @@
           <w14:ligatures w14:val="standardContextual"/>
         </w:rPr>
       </w:pPr>
-      <w:hyperlink w:anchor="_Toc229939647" w:history="1">
+      <w:hyperlink w:anchor="_Toc230433318" w:history="1">
         <w:r>
           <w:rPr>
             <w:rStyle w:val="Hyperlink"/>
             <w:noProof/>
           </w:rPr>
-          <w:t>2.2 Linux</w:t>
+          <w:t>3.1 Windows 11</w:t>
         </w:r>
         <w:r>
           <w:rPr>
@@ -853,7 +853,7 @@
             <w:noProof/>
             <w:webHidden/>
           </w:rPr>
-          <w:instrText xml:space="preserve"> PAGEREF _Toc229939647 \h </w:instrText>
+          <w:instrText xml:space="preserve"> PAGEREF _Toc230433318 \h </w:instrText>
         </w:r>
         <w:r>
           <w:rPr>
@@ -873,7 +873,7 @@
             <w:noProof/>
             <w:webHidden/>
           </w:rPr>
-          <w:t>6</w:t>
+          <w:t>7</w:t>
         </w:r>
         <w:r>
           <w:rPr>
@@ -899,13 +899,13 @@
           <w14:ligatures w14:val="standardContextual"/>
         </w:rPr>
       </w:pPr>
-      <w:hyperlink w:anchor="_Toc229939648" w:history="1">
+      <w:hyperlink w:anchor="_Toc230433319" w:history="1">
         <w:r>
           <w:rPr>
             <w:rStyle w:val="Hyperlink"/>
             <w:noProof/>
           </w:rPr>
-          <w:t>2.3 macOS (Intel and Apple Silicon)</w:t>
+          <w:t>3.2 Linux</w:t>
         </w:r>
         <w:r>
           <w:rPr>
@@ -926,7 +926,7 @@
             <w:noProof/>
             <w:webHidden/>
           </w:rPr>
-          <w:instrText xml:space="preserve"> PAGEREF _Toc229939648 \h </w:instrText>
+          <w:instrText xml:space="preserve"> PAGEREF _Toc230433319 \h </w:instrText>
         </w:r>
         <w:r>
           <w:rPr>
@@ -946,7 +946,7 @@
             <w:noProof/>
             <w:webHidden/>
           </w:rPr>
-          <w:t>6</w:t>
+          <w:t>7</w:t>
         </w:r>
         <w:r>
           <w:rPr>
@@ -959,7 +959,7 @@
     </w:p>
     <w:p>
       <w:pPr>
-        <w:pStyle w:val="TOC2"/>
+        <w:pStyle w:val="TOC3"/>
         <w:tabs>
           <w:tab w:val="right" w:leader="dot" w:pos="9624"/>
         </w:tabs>
@@ -972,13 +972,13 @@
           <w14:ligatures w14:val="standardContextual"/>
         </w:rPr>
       </w:pPr>
-      <w:hyperlink w:anchor="_Toc229939649" w:history="1">
+      <w:hyperlink w:anchor="_Toc230433320" w:history="1">
         <w:r>
           <w:rPr>
             <w:rStyle w:val="Hyperlink"/>
             <w:noProof/>
           </w:rPr>
-          <w:t>3. Installing the B210 Spectrum Analyzer</w:t>
+          <w:t>3.3 macOS</w:t>
         </w:r>
         <w:r>
           <w:rPr>
@@ -999,7 +999,7 @@
             <w:noProof/>
             <w:webHidden/>
           </w:rPr>
-          <w:instrText xml:space="preserve"> PAGEREF _Toc229939649 \h </w:instrText>
+          <w:instrText xml:space="preserve"> PAGEREF _Toc230433320 \h </w:instrText>
         </w:r>
         <w:r>
           <w:rPr>
@@ -1019,7 +1019,7 @@
             <w:noProof/>
             <w:webHidden/>
           </w:rPr>
-          <w:t>7</w:t>
+          <w:t>8</w:t>
         </w:r>
         <w:r>
           <w:rPr>
@@ -1032,7 +1032,7 @@
     </w:p>
     <w:p>
       <w:pPr>
-        <w:pStyle w:val="TOC3"/>
+        <w:pStyle w:val="TOC2"/>
         <w:tabs>
           <w:tab w:val="right" w:leader="dot" w:pos="9624"/>
         </w:tabs>
@@ -1045,13 +1045,13 @@
           <w14:ligatures w14:val="standardContextual"/>
         </w:rPr>
       </w:pPr>
-      <w:hyperlink w:anchor="_Toc229939650" w:history="1">
+      <w:hyperlink w:anchor="_Toc230433321" w:history="1">
         <w:r>
           <w:rPr>
             <w:rStyle w:val="Hyperlink"/>
             <w:noProof/>
           </w:rPr>
-          <w:t>3.1 Windows 11</w:t>
+          <w:t>3A. Extra setup for SDRPlay receivers (RSP1A / RSP1B / RSPduo / RSPdx)</w:t>
         </w:r>
         <w:r>
           <w:rPr>
@@ -1072,7 +1072,7 @@
             <w:noProof/>
             <w:webHidden/>
           </w:rPr>
-          <w:instrText xml:space="preserve"> PAGEREF _Toc229939650 \h </w:instrText>
+          <w:instrText xml:space="preserve"> PAGEREF _Toc230433321 \h </w:instrText>
         </w:r>
         <w:r>
           <w:rPr>
@@ -1092,7 +1092,7 @@
             <w:noProof/>
             <w:webHidden/>
           </w:rPr>
-          <w:t>7</w:t>
+          <w:t>8</w:t>
         </w:r>
         <w:r>
           <w:rPr>
@@ -1118,13 +1118,13 @@
           <w14:ligatures w14:val="standardContextual"/>
         </w:rPr>
       </w:pPr>
-      <w:hyperlink w:anchor="_Toc229939651" w:history="1">
+      <w:hyperlink w:anchor="_Toc230433322" w:history="1">
         <w:r>
           <w:rPr>
             <w:rStyle w:val="Hyperlink"/>
             <w:noProof/>
           </w:rPr>
-          <w:t>3.2 Linux</w:t>
+          <w:t>3A.1 Install the SDRplay API</w:t>
         </w:r>
         <w:r>
           <w:rPr>
@@ -1145,7 +1145,7 @@
             <w:noProof/>
             <w:webHidden/>
           </w:rPr>
-          <w:instrText xml:space="preserve"> PAGEREF _Toc229939651 \h </w:instrText>
+          <w:instrText xml:space="preserve"> PAGEREF _Toc230433322 \h </w:instrText>
         </w:r>
         <w:r>
           <w:rPr>
@@ -1165,7 +1165,7 @@
             <w:noProof/>
             <w:webHidden/>
           </w:rPr>
-          <w:t>7</w:t>
+          <w:t>8</w:t>
         </w:r>
         <w:r>
           <w:rPr>
@@ -1191,13 +1191,13 @@
           <w14:ligatures w14:val="standardContextual"/>
         </w:rPr>
       </w:pPr>
-      <w:hyperlink w:anchor="_Toc229939652" w:history="1">
+      <w:hyperlink w:anchor="_Toc230433323" w:history="1">
         <w:r>
           <w:rPr>
             <w:rStyle w:val="Hyperlink"/>
             <w:noProof/>
           </w:rPr>
-          <w:t>3.3 macOS</w:t>
+          <w:t>3A.2 Install the SoapySDRPlay module</w:t>
         </w:r>
         <w:r>
           <w:rPr>
@@ -1218,7 +1218,7 @@
             <w:noProof/>
             <w:webHidden/>
           </w:rPr>
-          <w:instrText xml:space="preserve"> PAGEREF _Toc229939652 \h </w:instrText>
+          <w:instrText xml:space="preserve"> PAGEREF _Toc230433323 \h </w:instrText>
         </w:r>
         <w:r>
           <w:rPr>
@@ -1264,7 +1264,7 @@
           <w14:ligatures w14:val="standardContextual"/>
         </w:rPr>
       </w:pPr>
-      <w:hyperlink w:anchor="_Toc229939653" w:history="1">
+      <w:hyperlink w:anchor="_Toc230433324" w:history="1">
         <w:r>
           <w:rPr>
             <w:rStyle w:val="Hyperlink"/>
@@ -1291,7 +1291,7 @@
             <w:noProof/>
             <w:webHidden/>
           </w:rPr>
-          <w:instrText xml:space="preserve"> PAGEREF _Toc229939653 \h </w:instrText>
+          <w:instrText xml:space="preserve"> PAGEREF _Toc230433324 \h </w:instrText>
         </w:r>
         <w:r>
           <w:rPr>
@@ -1311,7 +1311,7 @@
             <w:noProof/>
             <w:webHidden/>
           </w:rPr>
-          <w:t>8</w:t>
+          <w:t>9</w:t>
         </w:r>
         <w:r>
           <w:rPr>
@@ -1324,7 +1324,7 @@
     </w:p>
     <w:p>
       <w:pPr>
-        <w:pStyle w:val="TOC2"/>
+        <w:pStyle w:val="TOC3"/>
         <w:tabs>
           <w:tab w:val="right" w:leader="dot" w:pos="9624"/>
         </w:tabs>
@@ -1337,13 +1337,13 @@
           <w14:ligatures w14:val="standardContextual"/>
         </w:rPr>
       </w:pPr>
-      <w:hyperlink w:anchor="_Toc229939654" w:history="1">
+      <w:hyperlink w:anchor="_Toc230433325" w:history="1">
         <w:r>
           <w:rPr>
             <w:rStyle w:val="Hyperlink"/>
             <w:noProof/>
           </w:rPr>
-          <w:t>5. Updating to a new version</w:t>
+          <w:t>Recommended one-time VOLK tuning</w:t>
         </w:r>
         <w:r>
           <w:rPr>
@@ -1364,7 +1364,7 @@
             <w:noProof/>
             <w:webHidden/>
           </w:rPr>
-          <w:instrText xml:space="preserve"> PAGEREF _Toc229939654 \h </w:instrText>
+          <w:instrText xml:space="preserve"> PAGEREF _Toc230433325 \h </w:instrText>
         </w:r>
         <w:r>
           <w:rPr>
@@ -1384,7 +1384,7 @@
             <w:noProof/>
             <w:webHidden/>
           </w:rPr>
-          <w:t>9</w:t>
+          <w:t>10</w:t>
         </w:r>
         <w:r>
           <w:rPr>
@@ -1397,7 +1397,7 @@
     </w:p>
     <w:p>
       <w:pPr>
-        <w:pStyle w:val="TOC3"/>
+        <w:pStyle w:val="TOC2"/>
         <w:tabs>
           <w:tab w:val="right" w:leader="dot" w:pos="9624"/>
         </w:tabs>
@@ -1410,13 +1410,13 @@
           <w14:ligatures w14:val="standardContextual"/>
         </w:rPr>
       </w:pPr>
-      <w:hyperlink w:anchor="_Toc229939655" w:history="1">
+      <w:hyperlink w:anchor="_Toc230433326" w:history="1">
         <w:r>
           <w:rPr>
             <w:rStyle w:val="Hyperlink"/>
             <w:noProof/>
           </w:rPr>
-          <w:t>Auto-update notifications</w:t>
+          <w:t>5. Updating to a new version</w:t>
         </w:r>
         <w:r>
           <w:rPr>
@@ -1437,7 +1437,7 @@
             <w:noProof/>
             <w:webHidden/>
           </w:rPr>
-          <w:instrText xml:space="preserve"> PAGEREF _Toc229939655 \h </w:instrText>
+          <w:instrText xml:space="preserve"> PAGEREF _Toc230433326 \h </w:instrText>
         </w:r>
         <w:r>
           <w:rPr>
@@ -1457,7 +1457,7 @@
             <w:noProof/>
             <w:webHidden/>
           </w:rPr>
-          <w:t>9</w:t>
+          <w:t>10</w:t>
         </w:r>
         <w:r>
           <w:rPr>
@@ -1483,13 +1483,13 @@
           <w14:ligatures w14:val="standardContextual"/>
         </w:rPr>
       </w:pPr>
-      <w:hyperlink w:anchor="_Toc229939656" w:history="1">
+      <w:hyperlink w:anchor="_Toc230433327" w:history="1">
         <w:r>
           <w:rPr>
             <w:rStyle w:val="Hyperlink"/>
             <w:noProof/>
           </w:rPr>
-          <w:t>Performing the update</w:t>
+          <w:t>Auto-update notifications</w:t>
         </w:r>
         <w:r>
           <w:rPr>
@@ -1510,7 +1510,7 @@
             <w:noProof/>
             <w:webHidden/>
           </w:rPr>
-          <w:instrText xml:space="preserve"> PAGEREF _Toc229939656 \h </w:instrText>
+          <w:instrText xml:space="preserve"> PAGEREF _Toc230433327 \h </w:instrText>
         </w:r>
         <w:r>
           <w:rPr>
@@ -1530,7 +1530,7 @@
             <w:noProof/>
             <w:webHidden/>
           </w:rPr>
-          <w:t>9</w:t>
+          <w:t>10</w:t>
         </w:r>
         <w:r>
           <w:rPr>
@@ -1556,13 +1556,13 @@
           <w14:ligatures w14:val="standardContextual"/>
         </w:rPr>
       </w:pPr>
-      <w:hyperlink w:anchor="_Toc229939657" w:history="1">
+      <w:hyperlink w:anchor="_Toc230433328" w:history="1">
         <w:r>
           <w:rPr>
             <w:rStyle w:val="Hyperlink"/>
             <w:noProof/>
           </w:rPr>
-          <w:t>What is preserved across versions</w:t>
+          <w:t>Performing the update</w:t>
         </w:r>
         <w:r>
           <w:rPr>
@@ -1583,7 +1583,7 @@
             <w:noProof/>
             <w:webHidden/>
           </w:rPr>
-          <w:instrText xml:space="preserve"> PAGEREF _Toc229939657 \h </w:instrText>
+          <w:instrText xml:space="preserve"> PAGEREF _Toc230433328 \h </w:instrText>
         </w:r>
         <w:r>
           <w:rPr>
@@ -1603,7 +1603,7 @@
             <w:noProof/>
             <w:webHidden/>
           </w:rPr>
-          <w:t>9</w:t>
+          <w:t>11</w:t>
         </w:r>
         <w:r>
           <w:rPr>
@@ -1629,13 +1629,13 @@
           <w14:ligatures w14:val="standardContextual"/>
         </w:rPr>
       </w:pPr>
-      <w:hyperlink w:anchor="_Toc229939658" w:history="1">
+      <w:hyperlink w:anchor="_Toc230433329" w:history="1">
         <w:r>
           <w:rPr>
             <w:rStyle w:val="Hyperlink"/>
             <w:noProof/>
           </w:rPr>
-          <w:t>Backing up your settings</w:t>
+          <w:t>What is preserved across versions</w:t>
         </w:r>
         <w:r>
           <w:rPr>
@@ -1656,7 +1656,7 @@
             <w:noProof/>
             <w:webHidden/>
           </w:rPr>
-          <w:instrText xml:space="preserve"> PAGEREF _Toc229939658 \h </w:instrText>
+          <w:instrText xml:space="preserve"> PAGEREF _Toc230433329 \h </w:instrText>
         </w:r>
         <w:r>
           <w:rPr>
@@ -1676,7 +1676,7 @@
             <w:noProof/>
             <w:webHidden/>
           </w:rPr>
-          <w:t>9</w:t>
+          <w:t>11</w:t>
         </w:r>
         <w:r>
           <w:rPr>
@@ -1689,7 +1689,7 @@
     </w:p>
     <w:p>
       <w:pPr>
-        <w:pStyle w:val="TOC2"/>
+        <w:pStyle w:val="TOC3"/>
         <w:tabs>
           <w:tab w:val="right" w:leader="dot" w:pos="9624"/>
         </w:tabs>
@@ -1702,13 +1702,13 @@
           <w14:ligatures w14:val="standardContextual"/>
         </w:rPr>
       </w:pPr>
-      <w:hyperlink w:anchor="_Toc229939659" w:history="1">
+      <w:hyperlink w:anchor="_Toc230433330" w:history="1">
         <w:r>
           <w:rPr>
             <w:rStyle w:val="Hyperlink"/>
             <w:noProof/>
           </w:rPr>
-          <w:t>6. Troubleshooting</w:t>
+          <w:t>Backing up your settings</w:t>
         </w:r>
         <w:r>
           <w:rPr>
@@ -1729,7 +1729,7 @@
             <w:noProof/>
             <w:webHidden/>
           </w:rPr>
-          <w:instrText xml:space="preserve"> PAGEREF _Toc229939659 \h </w:instrText>
+          <w:instrText xml:space="preserve"> PAGEREF _Toc230433330 \h </w:instrText>
         </w:r>
         <w:r>
           <w:rPr>
@@ -1749,7 +1749,7 @@
             <w:noProof/>
             <w:webHidden/>
           </w:rPr>
-          <w:t>10</w:t>
+          <w:t>11</w:t>
         </w:r>
         <w:r>
           <w:rPr>
@@ -1762,7 +1762,7 @@
     </w:p>
     <w:p>
       <w:pPr>
-        <w:pStyle w:val="TOC3"/>
+        <w:pStyle w:val="TOC2"/>
         <w:tabs>
           <w:tab w:val="right" w:leader="dot" w:pos="9624"/>
         </w:tabs>
@@ -1775,13 +1775,13 @@
           <w14:ligatures w14:val="standardContextual"/>
         </w:rPr>
       </w:pPr>
-      <w:hyperlink w:anchor="_Toc229939660" w:history="1">
+      <w:hyperlink w:anchor="_Toc230433331" w:history="1">
         <w:r>
           <w:rPr>
             <w:rStyle w:val="Hyperlink"/>
             <w:noProof/>
           </w:rPr>
-          <w:t>“Radioconda not found in standard locations”</w:t>
+          <w:t>6. Troubleshooting</w:t>
         </w:r>
         <w:r>
           <w:rPr>
@@ -1802,7 +1802,7 @@
             <w:noProof/>
             <w:webHidden/>
           </w:rPr>
-          <w:instrText xml:space="preserve"> PAGEREF _Toc229939660 \h </w:instrText>
+          <w:instrText xml:space="preserve"> PAGEREF _Toc230433331 \h </w:instrText>
         </w:r>
         <w:r>
           <w:rPr>
@@ -1822,7 +1822,7 @@
             <w:noProof/>
             <w:webHidden/>
           </w:rPr>
-          <w:t>10</w:t>
+          <w:t>11</w:t>
         </w:r>
         <w:r>
           <w:rPr>
@@ -1848,13 +1848,13 @@
           <w14:ligatures w14:val="standardContextual"/>
         </w:rPr>
       </w:pPr>
-      <w:hyperlink w:anchor="_Toc229939661" w:history="1">
+      <w:hyperlink w:anchor="_Toc230433332" w:history="1">
         <w:r>
           <w:rPr>
             <w:rStyle w:val="Hyperlink"/>
             <w:noProof/>
           </w:rPr>
-          <w:t>“No UHD Devices Found”</w:t>
+          <w:t>“Radioconda not found in standard locations”</w:t>
         </w:r>
         <w:r>
           <w:rPr>
@@ -1875,7 +1875,7 @@
             <w:noProof/>
             <w:webHidden/>
           </w:rPr>
-          <w:instrText xml:space="preserve"> PAGEREF _Toc229939661 \h </w:instrText>
+          <w:instrText xml:space="preserve"> PAGEREF _Toc230433332 \h </w:instrText>
         </w:r>
         <w:r>
           <w:rPr>
@@ -1895,7 +1895,7 @@
             <w:noProof/>
             <w:webHidden/>
           </w:rPr>
-          <w:t>10</w:t>
+          <w:t>11</w:t>
         </w:r>
         <w:r>
           <w:rPr>
@@ -1921,13 +1921,13 @@
           <w14:ligatures w14:val="standardContextual"/>
         </w:rPr>
       </w:pPr>
-      <w:hyperlink w:anchor="_Toc229939662" w:history="1">
+      <w:hyperlink w:anchor="_Toc230433333" w:history="1">
         <w:r>
           <w:rPr>
             <w:rStyle w:val="Hyperlink"/>
             <w:noProof/>
           </w:rPr>
-          <w:t>Persistent “O” overflows at high sample rates</w:t>
+          <w:t>“No UHD Devices Found”</w:t>
         </w:r>
         <w:r>
           <w:rPr>
@@ -1948,7 +1948,7 @@
             <w:noProof/>
             <w:webHidden/>
           </w:rPr>
-          <w:instrText xml:space="preserve"> PAGEREF _Toc229939662 \h </w:instrText>
+          <w:instrText xml:space="preserve"> PAGEREF _Toc230433333 \h </w:instrText>
         </w:r>
         <w:r>
           <w:rPr>
@@ -1968,7 +1968,7 @@
             <w:noProof/>
             <w:webHidden/>
           </w:rPr>
-          <w:t>10</w:t>
+          <w:t>12</w:t>
         </w:r>
         <w:r>
           <w:rPr>
@@ -1994,13 +1994,13 @@
           <w14:ligatures w14:val="standardContextual"/>
         </w:rPr>
       </w:pPr>
-      <w:hyperlink w:anchor="_Toc229939663" w:history="1">
+      <w:hyperlink w:anchor="_Toc230433334" w:history="1">
         <w:r>
           <w:rPr>
             <w:rStyle w:val="Hyperlink"/>
             <w:noProof/>
           </w:rPr>
-          <w:t>Spectrum looks flat at −140 dB</w:t>
+          <w:t>Persistent “O” overflows at high sample rates</w:t>
         </w:r>
         <w:r>
           <w:rPr>
@@ -2021,7 +2021,7 @@
             <w:noProof/>
             <w:webHidden/>
           </w:rPr>
-          <w:instrText xml:space="preserve"> PAGEREF _Toc229939663 \h </w:instrText>
+          <w:instrText xml:space="preserve"> PAGEREF _Toc230433334 \h </w:instrText>
         </w:r>
         <w:r>
           <w:rPr>
@@ -2041,7 +2041,7 @@
             <w:noProof/>
             <w:webHidden/>
           </w:rPr>
-          <w:t>10</w:t>
+          <w:t>12</w:t>
         </w:r>
         <w:r>
           <w:rPr>
@@ -2067,13 +2067,13 @@
           <w14:ligatures w14:val="standardContextual"/>
         </w:rPr>
       </w:pPr>
-      <w:hyperlink w:anchor="_Toc229939664" w:history="1">
+      <w:hyperlink w:anchor="_Toc230433335" w:history="1">
         <w:r>
           <w:rPr>
             <w:rStyle w:val="Hyperlink"/>
             <w:noProof/>
           </w:rPr>
-          <w:t>macOS: “developer cannot be verified”</w:t>
+          <w:t>Spectrum looks flat at −140 dB</w:t>
         </w:r>
         <w:r>
           <w:rPr>
@@ -2094,7 +2094,7 @@
             <w:noProof/>
             <w:webHidden/>
           </w:rPr>
-          <w:instrText xml:space="preserve"> PAGEREF _Toc229939664 \h </w:instrText>
+          <w:instrText xml:space="preserve"> PAGEREF _Toc230433335 \h </w:instrText>
         </w:r>
         <w:r>
           <w:rPr>
@@ -2114,7 +2114,7 @@
             <w:noProof/>
             <w:webHidden/>
           </w:rPr>
-          <w:t>11</w:t>
+          <w:t>12</w:t>
         </w:r>
         <w:r>
           <w:rPr>
@@ -2140,13 +2140,13 @@
           <w14:ligatures w14:val="standardContextual"/>
         </w:rPr>
       </w:pPr>
-      <w:hyperlink w:anchor="_Toc229939665" w:history="1">
+      <w:hyperlink w:anchor="_Toc230433336" w:history="1">
         <w:r>
           <w:rPr>
             <w:rStyle w:val="Hyperlink"/>
             <w:noProof/>
           </w:rPr>
-          <w:t>Settings won’t persist</w:t>
+          <w:t>macOS: “developer cannot be verified”</w:t>
         </w:r>
         <w:r>
           <w:rPr>
@@ -2167,7 +2167,7 @@
             <w:noProof/>
             <w:webHidden/>
           </w:rPr>
-          <w:instrText xml:space="preserve"> PAGEREF _Toc229939665 \h </w:instrText>
+          <w:instrText xml:space="preserve"> PAGEREF _Toc230433336 \h </w:instrText>
         </w:r>
         <w:r>
           <w:rPr>
@@ -2187,7 +2187,7 @@
             <w:noProof/>
             <w:webHidden/>
           </w:rPr>
-          <w:t>11</w:t>
+          <w:t>12</w:t>
         </w:r>
         <w:r>
           <w:rPr>
@@ -2200,7 +2200,7 @@
     </w:p>
     <w:p>
       <w:pPr>
-        <w:pStyle w:val="TOC2"/>
+        <w:pStyle w:val="TOC3"/>
         <w:tabs>
           <w:tab w:val="right" w:leader="dot" w:pos="9624"/>
         </w:tabs>
@@ -2213,13 +2213,13 @@
           <w14:ligatures w14:val="standardContextual"/>
         </w:rPr>
       </w:pPr>
-      <w:hyperlink w:anchor="_Toc229939666" w:history="1">
+      <w:hyperlink w:anchor="_Toc230433337" w:history="1">
         <w:r>
           <w:rPr>
             <w:rStyle w:val="Hyperlink"/>
             <w:noProof/>
           </w:rPr>
-          <w:t>7. Appendix A — Settings file reference</w:t>
+          <w:t>Settings won’t persist</w:t>
         </w:r>
         <w:r>
           <w:rPr>
@@ -2240,7 +2240,7 @@
             <w:noProof/>
             <w:webHidden/>
           </w:rPr>
-          <w:instrText xml:space="preserve"> PAGEREF _Toc229939666 \h </w:instrText>
+          <w:instrText xml:space="preserve"> PAGEREF _Toc230433337 \h </w:instrText>
         </w:r>
         <w:r>
           <w:rPr>
@@ -2260,7 +2260,7 @@
             <w:noProof/>
             <w:webHidden/>
           </w:rPr>
-          <w:t>11</w:t>
+          <w:t>12</w:t>
         </w:r>
         <w:r>
           <w:rPr>
@@ -2286,13 +2286,13 @@
           <w14:ligatures w14:val="standardContextual"/>
         </w:rPr>
       </w:pPr>
-      <w:hyperlink w:anchor="_Toc229939667" w:history="1">
+      <w:hyperlink w:anchor="_Toc230433338" w:history="1">
         <w:r>
           <w:rPr>
             <w:rStyle w:val="Hyperlink"/>
             <w:noProof/>
           </w:rPr>
-          <w:t>8. Appendix B — Device selection and SigMF playback</w:t>
+          <w:t>7. Appendix A — Settings file reference</w:t>
         </w:r>
         <w:r>
           <w:rPr>
@@ -2313,7 +2313,7 @@
             <w:noProof/>
             <w:webHidden/>
           </w:rPr>
-          <w:instrText xml:space="preserve"> PAGEREF _Toc229939667 \h </w:instrText>
+          <w:instrText xml:space="preserve"> PAGEREF _Toc230433338 \h </w:instrText>
         </w:r>
         <w:r>
           <w:rPr>
@@ -2333,7 +2333,7 @@
             <w:noProof/>
             <w:webHidden/>
           </w:rPr>
-          <w:t>11</w:t>
+          <w:t>13</w:t>
         </w:r>
         <w:r>
           <w:rPr>
@@ -2346,7 +2346,7 @@
     </w:p>
     <w:p>
       <w:pPr>
-        <w:pStyle w:val="TOC3"/>
+        <w:pStyle w:val="TOC2"/>
         <w:tabs>
           <w:tab w:val="right" w:leader="dot" w:pos="9624"/>
         </w:tabs>
@@ -2359,13 +2359,13 @@
           <w14:ligatures w14:val="standardContextual"/>
         </w:rPr>
       </w:pPr>
-      <w:hyperlink w:anchor="_Toc229939668" w:history="1">
+      <w:hyperlink w:anchor="_Toc230433339" w:history="1">
         <w:r>
           <w:rPr>
             <w:rStyle w:val="Hyperlink"/>
             <w:noProof/>
           </w:rPr>
-          <w:t>Choosing among multiple radios</w:t>
+          <w:t>8. Appendix B — Device selection and SigMF playback</w:t>
         </w:r>
         <w:r>
           <w:rPr>
@@ -2386,7 +2386,7 @@
             <w:noProof/>
             <w:webHidden/>
           </w:rPr>
-          <w:instrText xml:space="preserve"> PAGEREF _Toc229939668 \h </w:instrText>
+          <w:instrText xml:space="preserve"> PAGEREF _Toc230433339 \h </w:instrText>
         </w:r>
         <w:r>
           <w:rPr>
@@ -2406,7 +2406,7 @@
             <w:noProof/>
             <w:webHidden/>
           </w:rPr>
-          <w:t>11</w:t>
+          <w:t>13</w:t>
         </w:r>
         <w:r>
           <w:rPr>
@@ -2432,12 +2432,85 @@
           <w14:ligatures w14:val="standardContextual"/>
         </w:rPr>
       </w:pPr>
-      <w:hyperlink w:anchor="_Toc229939669" w:history="1">
+      <w:hyperlink w:anchor="_Toc230433340" w:history="1">
         <w:r>
           <w:rPr>
             <w:rStyle w:val="Hyperlink"/>
             <w:noProof/>
           </w:rPr>
+          <w:t>Choosing among multiple radios</w:t>
+        </w:r>
+        <w:r>
+          <w:rPr>
+            <w:noProof/>
+            <w:webHidden/>
+          </w:rPr>
+          <w:tab/>
+        </w:r>
+        <w:r>
+          <w:rPr>
+            <w:noProof/>
+            <w:webHidden/>
+          </w:rPr>
+          <w:fldChar w:fldCharType="begin"/>
+        </w:r>
+        <w:r>
+          <w:rPr>
+            <w:noProof/>
+            <w:webHidden/>
+          </w:rPr>
+          <w:instrText xml:space="preserve"> PAGEREF _Toc230433340 \h </w:instrText>
+        </w:r>
+        <w:r>
+          <w:rPr>
+            <w:noProof/>
+            <w:webHidden/>
+          </w:rPr>
+        </w:r>
+        <w:r>
+          <w:rPr>
+            <w:noProof/>
+            <w:webHidden/>
+          </w:rPr>
+          <w:fldChar w:fldCharType="separate"/>
+        </w:r>
+        <w:r>
+          <w:rPr>
+            <w:noProof/>
+            <w:webHidden/>
+          </w:rPr>
+          <w:t>13</w:t>
+        </w:r>
+        <w:r>
+          <w:rPr>
+            <w:noProof/>
+            <w:webHidden/>
+          </w:rPr>
+          <w:fldChar w:fldCharType="end"/>
+        </w:r>
+      </w:hyperlink>
+    </w:p>
+    <w:p>
+      <w:pPr>
+        <w:pStyle w:val="TOC3"/>
+        <w:tabs>
+          <w:tab w:val="right" w:leader="dot" w:pos="9624"/>
+        </w:tabs>
+        <w:rPr>
+          <w:rFonts w:asciiTheme="minorHAnsi" w:hAnsiTheme="minorHAnsi"/>
+          <w:noProof/>
+          <w:kern w:val="2"/>
+          <w:sz w:val="24"/>
+          <w:szCs w:val="24"/>
+          <w14:ligatures w14:val="standardContextual"/>
+        </w:rPr>
+      </w:pPr>
+      <w:hyperlink w:anchor="_Toc230433341" w:history="1">
+        <w:r>
+          <w:rPr>
+            <w:rStyle w:val="Hyperlink"/>
+            <w:noProof/>
+          </w:rPr>
           <w:t>SigMF playback mode (no-device fallback)</w:t>
         </w:r>
         <w:r>
@@ -2459,7 +2532,7 @@
             <w:noProof/>
             <w:webHidden/>
           </w:rPr>
-          <w:instrText xml:space="preserve"> PAGEREF _Toc229939669 \h </w:instrText>
+          <w:instrText xml:space="preserve"> PAGEREF _Toc230433341 \h </w:instrText>
         </w:r>
         <w:r>
           <w:rPr>
@@ -2479,7 +2552,7 @@
             <w:noProof/>
             <w:webHidden/>
           </w:rPr>
-          <w:t>12</w:t>
+          <w:t>14</w:t>
         </w:r>
         <w:r>
           <w:rPr>
@@ -2505,10 +2578,10 @@
         <w:pStyle w:val="Heading1"/>
         <w:shd w:val="clear" w:color="auto" w:fill="156082"/>
       </w:pPr>
-      <w:bookmarkStart w:id="1" w:name="_Toc229939639"/>
+      <w:bookmarkStart w:id="1" w:name="_Toc230433310"/>
       <w:r>
         <w:lastRenderedPageBreak/>
-        <w:t xml:space="preserve">B210 Spectrum Analyzer — </w:t>
+        <w:t xml:space="preserve">DSES Spectrum Analyzer — </w:t>
       </w:r>
       <w:r>
         <w:t>Installation Guide</w:t>
@@ -2536,7 +2609,7 @@
         <w:pStyle w:val="ListBullet"/>
       </w:pPr>
       <w:r>
-        <w:t>How to install the B210 Spectrum Analyzer on Windows 11, Linux, and macOS (Intel and Apple Silicon).</w:t>
+        <w:t>How to install the DSES Spectrum Analyzer on Windows 11, Linux, and macOS (Intel and Apple Silicon).</w:t>
       </w:r>
     </w:p>
     <w:p>
@@ -2577,14 +2650,14 @@
         <w:t>Supported radios.</w:t>
       </w:r>
       <w:r>
-        <w:t xml:space="preserve"> The program is designed around the Ettus USRP B210 but also drives any SoapySDR-compatible receiver: SDRPlay RSP1A / RSP1B / RSPduo / RSPdx (with one extra setup step — see §1A), RTL-SDR, HackRF, Airspy / Airspy HF+, BladeRF, LimeSDR, and PlutoSDR. The sample-rate combo and gain slider adapt automatically to whichever device you pick at startup.</w:t>
+        <w:t xml:space="preserve"> The program is designed around the Ettus USRP B210 but also drives any SoapySDR-compatible receiver: SDRPlay RSP1A / RSP1B / RSPduo / RSPdx (with one extra setup step — see §3A), RTL-SDR, HackRF, Airspy / Airspy HF+, BladeRF, LimeSDR, and PlutoSDR. The sample-rate combo and gain slider adapt automatically to whichever device you pick at startup.</w:t>
       </w:r>
     </w:p>
     <w:p>
       <w:pPr>
         <w:pStyle w:val="Heading2"/>
       </w:pPr>
-      <w:bookmarkStart w:id="2" w:name="_Toc229939640"/>
+      <w:bookmarkStart w:id="2" w:name="_Toc230433311"/>
       <w:r>
         <w:t>1. What the recipient needs to know first</w:t>
       </w:r>
@@ -2618,7 +2691,7 @@
         <w:t>Install Radioconda</w:t>
       </w:r>
       <w:r>
-        <w:t xml:space="preserve"> (one-time). Radioconda is a curated conda distribution that bundles GNU Radio, UHD, SoapySDR, and the surrounding scientific Python stack for software-defined radio. We require version 4.8 or newer (it ships with UHD ≥ 4.8). Download: &lt;https://github.com/ryanvolz/radioconda/releases&gt;.</w:t>
+        <w:t xml:space="preserve"> (one-time). Radioconda is a curated conda distribution that bundles GNU Radio, UHD, SoapySDR, and the surrounding scientific Python stack for software-defined radio. We require version 4.8 or newer (it ships with UHD ≥ 4.8). Download: &lt;https://github.com/ryanvolz/radioconda/releases&gt;. (§2)</w:t>
       </w:r>
     </w:p>
     <w:p>
@@ -2632,7 +2705,7 @@
         <w:t>Install this app</w:t>
       </w:r>
       <w:r>
-        <w:t>, which is just a small zip of Python and launcher scripts.</w:t>
+        <w:t>, which is just a small zip of Python and launcher scripts. (§3)</w:t>
       </w:r>
     </w:p>
     <w:p>
@@ -2643,10 +2716,10 @@
         <w:rPr>
           <w:b/>
         </w:rPr>
-        <w:t>If using SDRPlay only:</w:t>
-      </w:r>
-      <w:r>
-        <w:t xml:space="preserve"> install the SDRplay API + SoapySDRPlay module (see §1A). Other supported radios work without any extra setup.</w:t>
+        <w:t>If using an SDRPlay receiver:</w:t>
+      </w:r>
+      <w:r>
+        <w:t xml:space="preserve"> after the two installs above, do the extra SDRPlay setup in §3A (install the SDRplay API + the SoapySDRPlay module). It comes last because it copies a file from the app’s zip into Radioconda’s folders. Other supported radios need no extra setup.</w:t>
       </w:r>
     </w:p>
     <w:p>
@@ -2658,7 +2731,7 @@
       <w:pPr>
         <w:pStyle w:val="Heading3"/>
       </w:pPr>
-      <w:bookmarkStart w:id="3" w:name="_Toc229939641"/>
+      <w:bookmarkStart w:id="3" w:name="_Toc230433312"/>
       <w:r>
         <w:t>System requirements</w:t>
       </w:r>
@@ -2823,7 +2896,10 @@
               <w:cnfStyle w:val="000000010000" w:firstRow="0" w:lastRow="0" w:firstColumn="0" w:lastColumn="0" w:oddVBand="0" w:evenVBand="0" w:oddHBand="0" w:evenHBand="1" w:firstRowFirstColumn="0" w:firstRowLastColumn="0" w:lastRowFirstColumn="0" w:lastRowLastColumn="0"/>
             </w:pPr>
             <w:r>
-              <w:t>One USB 3.0 port (5 Gbps) for the B210</w:t>
+              <w:t>One</w:t>
+            </w:r>
+            <w:r>
+              <w:t xml:space="preserve"> USB 3.0 port (5 Gbps) for the B210</w:t>
             </w:r>
           </w:p>
         </w:tc>
@@ -2861,11 +2937,11 @@
               <w:t>or</w:t>
             </w:r>
             <w:r>
-              <w:t xml:space="preserve"> any SoapySDR-supported receiver (SDRPlay RSPx, RTL-SDR, HackRF, Airspy, BladeRF, LimeSDR, PlutoSDR). With one radio attached the app uses it silently; with several, a </w:t>
+              <w:t xml:space="preserve"> any SoapySDR-supported receiver (SDRPlay RSPx, RTL-SDR, HackRF, Airspy, BladeRF, LimeSDR, PlutoSDR). With one radio </w:t>
             </w:r>
             <w:r>
               <w:lastRenderedPageBreak/>
-              <w:t>picker appears. See §8 for details.</w:t>
+              <w:t>attached the app uses it silently; with several, a picker appears. See §8 for details.</w:t>
             </w:r>
           </w:p>
         </w:tc>
@@ -2895,10 +2971,7 @@
               <w:cnfStyle w:val="000000010000" w:firstRow="0" w:lastRow="0" w:firstColumn="0" w:lastColumn="0" w:oddVBand="0" w:evenVBand="0" w:oddHBand="0" w:evenHBand="1" w:firstRowFirstColumn="0" w:firstRowLastColumn="0" w:lastRowFirstColumn="0" w:lastRowLastColumn="0"/>
             </w:pPr>
             <w:r>
-              <w:t xml:space="preserve">~3 GB for Radioconda, plus ~1 MB for this </w:t>
-            </w:r>
-            <w:r>
-              <w:t>app</w:t>
+              <w:t>~3 GB for Radioconda, plus ~1 MB for this app</w:t>
             </w:r>
           </w:p>
         </w:tc>
@@ -2937,103 +3010,91 @@
       <w:pPr>
         <w:pStyle w:val="Heading2"/>
       </w:pPr>
-      <w:bookmarkStart w:id="4" w:name="_Toc229939642"/>
-      <w:r>
-        <w:t>1A. Optional: extra setup for SDRPlay (RSP1A / RSP1B / RSPduo)</w:t>
+      <w:bookmarkStart w:id="4" w:name="_Toc230433313"/>
+      <w:r>
+        <w:t>2. Installing Radioconda</w:t>
       </w:r>
       <w:bookmarkEnd w:id="4"/>
     </w:p>
     <w:p>
-      <w:r>
-        <w:t xml:space="preserve">If you’re using an </w:t>
-      </w:r>
-      <w:r>
-        <w:rPr>
-          <w:b/>
-        </w:rPr>
-        <w:t>SDRPlay</w:t>
-      </w:r>
-      <w:r>
-        <w:t xml:space="preserve"> receiver (RSP1A, RSP1B, RSPduo, or RSPdx), you need two extra pieces beyond Radioconda. </w:t>
-      </w:r>
-      <w:r>
-        <w:rPr>
-          <w:b/>
-        </w:rPr>
-        <w:t>Skip this section entirely if you’re only using a B210, RTL-SDR, HackRF, Airspy, BladeRF, LimeSDR, or PlutoSDR — those work out of the box once Radioconda is installed.</w:t>
-      </w:r>
-    </w:p>
-    <w:p>
       <w:pPr>
         <w:pStyle w:val="Heading3"/>
       </w:pPr>
-      <w:bookmarkStart w:id="5" w:name="_Toc229939643"/>
-      <w:r>
-        <w:t>1A.1 Install the SDRplay API</w:t>
+      <w:bookmarkStart w:id="5" w:name="_Toc230433314"/>
+      <w:r>
+        <w:t>2.1 Windows 11</w:t>
       </w:r>
       <w:bookmarkEnd w:id="5"/>
     </w:p>
     <w:p>
-      <w:r>
-        <w:t>SDRPlay devices need the manufacturer’s proprietary API driver. Download and install it from &lt;https://www.sdrplay.com/api/&gt; — pick the installer for your OS.</w:t>
-      </w:r>
-    </w:p>
-    <w:p>
-      <w:pPr>
-        <w:pStyle w:val="ListBullet"/>
-      </w:pPr>
-      <w:r>
-        <w:rPr>
-          <w:b/>
-        </w:rPr>
-        <w:t>Windows:</w:t>
-      </w:r>
-      <w:r>
-        <w:t xml:space="preserve"> run the </w:t>
+      <w:pPr>
+        <w:pStyle w:val="ListNumber"/>
+      </w:pPr>
+      <w:r>
+        <w:t xml:space="preserve">Download </w:t>
       </w:r>
       <w:r>
         <w:rPr>
           <w:rFonts w:ascii="Consolas" w:hAnsi="Consolas"/>
           <w:sz w:val="20"/>
         </w:rPr>
-        <w:t>.exe</w:t>
-      </w:r>
-      <w:r>
-        <w:t xml:space="preserve"> installer; accept defaults. A reboot may be needed.</w:t>
-      </w:r>
-    </w:p>
-    <w:p>
-      <w:pPr>
-        <w:pStyle w:val="ListBullet"/>
-      </w:pPr>
-      <w:r>
-        <w:rPr>
-          <w:b/>
-        </w:rPr>
-        <w:t>Linux:</w:t>
-      </w:r>
-      <w:r>
-        <w:t xml:space="preserve"> run the </w:t>
+        <w:t>radioconda-Windows-x86_64.exe</w:t>
+      </w:r>
+      <w:r>
+        <w:t xml:space="preserve"> from the Radioconda releases page.</w:t>
+      </w:r>
+    </w:p>
+    <w:p>
+      <w:pPr>
+        <w:pStyle w:val="ListNumber"/>
+      </w:pPr>
+      <w:r>
+        <w:t xml:space="preserve">Double-click the installer. Accept defaults; the installer offers to put Radioconda under </w:t>
       </w:r>
       <w:r>
         <w:rPr>
           <w:rFonts w:ascii="Consolas" w:hAnsi="Consolas"/>
           <w:sz w:val="20"/>
         </w:rPr>
-        <w:t>.run</w:t>
-      </w:r>
-      <w:r>
-        <w:t xml:space="preserve"> installer with </w:t>
+        <w:t>C:\ProgramData\radioconda</w:t>
+      </w:r>
+      <w:r>
+        <w:t xml:space="preserve"> (system-wide) or </w:t>
       </w:r>
       <w:r>
         <w:rPr>
           <w:rFonts w:ascii="Consolas" w:hAnsi="Consolas"/>
           <w:sz w:val="20"/>
         </w:rPr>
-        <w:t>sudo</w:t>
-      </w:r>
-      <w:r>
-        <w:t>.</w:t>
+        <w:t>%LOCALAPPDATA%\radioconda</w:t>
+      </w:r>
+      <w:r>
+        <w:t xml:space="preserve"> (per-user). Either works; the app’s launcher checks both.</w:t>
+      </w:r>
+    </w:p>
+    <w:p>
+      <w:pPr>
+        <w:pStyle w:val="ListNumber"/>
+      </w:pPr>
+      <w:r>
+        <w:t>If you have a radio, plug it into a USB 3 port. A B210 silently installs its UHD driver from Radioconda the first time it’s connected (no prompt).</w:t>
+      </w:r>
+    </w:p>
+    <w:p>
+      <w:pPr>
+        <w:pStyle w:val="ListNumber"/>
+      </w:pPr>
+      <w:r>
+        <w:t xml:space="preserve">(Optional) Confirm your radio is detected — open the </w:t>
+      </w:r>
+      <w:r>
+        <w:rPr>
+          <w:b/>
+        </w:rPr>
+        <w:t>Anaconda Prompt (Radioconda)</w:t>
+      </w:r>
+      <w:r>
+        <w:t xml:space="preserve"> shortcut from the Start menu and run the command for your device:</w:t>
       </w:r>
     </w:p>
     <w:p>
@@ -3044,143 +3105,75 @@
         <w:rPr>
           <w:b/>
         </w:rPr>
-        <w:t>macOS:</w:t>
-      </w:r>
-      <w:r>
-        <w:t xml:space="preserve"> run the </w:t>
+        <w:t>B210 / USRP:</w:t>
+      </w:r>
+      <w:r>
+        <w:t xml:space="preserve"> </w:t>
       </w:r>
       <w:r>
         <w:rPr>
           <w:rFonts w:ascii="Consolas" w:hAnsi="Consolas"/>
           <w:sz w:val="20"/>
         </w:rPr>
-        <w:t>.pkg</w:t>
-      </w:r>
-      <w:r>
-        <w:t xml:space="preserve"> installer.</w:t>
-      </w:r>
-    </w:p>
-    <w:p>
-      <w:r>
-        <w:t xml:space="preserve">After installation, verify the API can see your unit with the SDRplay Service / Status app (Windows) or </w:t>
+        <w:t>uhd_find_devices</w:t>
+      </w:r>
+      <w:r>
+        <w:t xml:space="preserve"> — lists the unit with its own serial number.</w:t>
+      </w:r>
+    </w:p>
+    <w:p>
+      <w:pPr>
+        <w:pStyle w:val="ListBullet"/>
+      </w:pPr>
+      <w:r>
+        <w:rPr>
+          <w:b/>
+        </w:rPr>
+        <w:t>RTL-SDR, HackRF, Airspy, BladeRF, LimeSDR, PlutoSDR:</w:t>
+      </w:r>
+      <w:r>
+        <w:t xml:space="preserve"> </w:t>
       </w:r>
       <w:r>
         <w:rPr>
           <w:rFonts w:ascii="Consolas" w:hAnsi="Consolas"/>
           <w:sz w:val="20"/>
         </w:rPr>
-        <w:t>SDRplayService</w:t>
-      </w:r>
-      <w:r>
-        <w:t xml:space="preserve"> (Linux/macOS). You should see your RSP listed.</w:t>
-      </w:r>
-    </w:p>
-    <w:p>
-      <w:pPr>
-        <w:pStyle w:val="Heading3"/>
-      </w:pPr>
-      <w:bookmarkStart w:id="6" w:name="_Toc229939644"/>
-      <w:r>
-        <w:t>1A.2 Install the SoapySDRPlay module</w:t>
-      </w:r>
-      <w:bookmarkEnd w:id="6"/>
-    </w:p>
-    <w:p>
-      <w:r>
-        <w:t>This is the glue between SDRplay’s API and the SoapySDR layer the program uses.</w:t>
-      </w:r>
-    </w:p>
-    <w:tbl>
-      <w:tblPr>
-        <w:tblW w:w="0" w:type="auto"/>
-        <w:tblLook w:val="04A0" w:firstRow="1" w:lastRow="0" w:firstColumn="1" w:lastColumn="0" w:noHBand="0" w:noVBand="1"/>
-      </w:tblPr>
-      <w:tblGrid>
-        <w:gridCol w:w="9634"/>
-      </w:tblGrid>
-      <w:tr>
-        <w:tc>
-          <w:tcPr>
-            <w:tcW w:w="9634" w:type="dxa"/>
-            <w:shd w:val="clear" w:color="auto" w:fill="F2F2F2"/>
-          </w:tcPr>
-          <w:p>
-            <w:r>
-              <w:rPr>
-                <w:rFonts w:ascii="Consolas" w:hAnsi="Consolas"/>
-                <w:sz w:val="18"/>
-              </w:rPr>
-              <w:t>Windows / Linux / macOS — from an activated Radioconda prompt:</w:t>
-            </w:r>
-          </w:p>
-          <w:p>
-            <w:r>
-              <w:rPr>
-                <w:rFonts w:ascii="Consolas" w:hAnsi="Consolas"/>
-                <w:sz w:val="18"/>
-              </w:rPr>
-              <w:t xml:space="preserve">  conda install -c conda-forge soapysdr-module-sdrplay</w:t>
-            </w:r>
-          </w:p>
-        </w:tc>
-      </w:tr>
-    </w:tbl>
-    <w:p>
-      <w:r>
-        <w:t>Verify it loaded:</w:t>
-      </w:r>
-    </w:p>
-    <w:tbl>
-      <w:tblPr>
-        <w:tblW w:w="0" w:type="auto"/>
-        <w:tblLook w:val="04A0" w:firstRow="1" w:lastRow="0" w:firstColumn="1" w:lastColumn="0" w:noHBand="0" w:noVBand="1"/>
-      </w:tblPr>
-      <w:tblGrid>
-        <w:gridCol w:w="9634"/>
-      </w:tblGrid>
-      <w:tr>
-        <w:tc>
-          <w:tcPr>
-            <w:tcW w:w="9634" w:type="dxa"/>
-            <w:shd w:val="clear" w:color="auto" w:fill="F2F2F2"/>
-          </w:tcPr>
-          <w:p>
-            <w:r>
-              <w:rPr>
-                <w:rFonts w:ascii="Consolas" w:hAnsi="Consolas"/>
-                <w:sz w:val="18"/>
-              </w:rPr>
-              <w:t>SoapySDRUtil --info</w:t>
-            </w:r>
-          </w:p>
-        </w:tc>
-      </w:tr>
-    </w:tbl>
-    <w:p>
-      <w:r>
-        <w:t xml:space="preserve">…should list </w:t>
+        <w:t>SoapySDRUtil --find</w:t>
+      </w:r>
+      <w:r>
+        <w:t xml:space="preserve"> — lists the device under its driver name.</w:t>
+      </w:r>
+    </w:p>
+    <w:p>
+      <w:pPr>
+        <w:pStyle w:val="ListBullet"/>
+      </w:pPr>
+      <w:r>
+        <w:rPr>
+          <w:b/>
+        </w:rPr>
+        <w:t>SDRPlay (RSPx):</w:t>
+      </w:r>
+      <w:r>
+        <w:t xml:space="preserve"> do §3A first, then </w:t>
       </w:r>
       <w:r>
         <w:rPr>
           <w:rFonts w:ascii="Consolas" w:hAnsi="Consolas"/>
           <w:sz w:val="20"/>
         </w:rPr>
-        <w:t>sdrplay</w:t>
-      </w:r>
-      <w:r>
-        <w:t xml:space="preserve"> in the “Available factories” line. If it doesn’t, the API install in §1A.1 didn’t take — recheck that.</w:t>
-      </w:r>
-    </w:p>
-    <w:p>
-      <w:r>
-        <w:t xml:space="preserve">When you launch the spectrum analyzer with an RSP attached, it will appear in the device picker as e.g. </w:t>
+        <w:t>SoapySDRUtil --find</w:t>
+      </w:r>
+      <w:r>
+        <w:t xml:space="preserve"> shows it as </w:t>
       </w:r>
       <w:r>
         <w:rPr>
           <w:rFonts w:ascii="Consolas" w:hAnsi="Consolas"/>
           <w:sz w:val="20"/>
         </w:rPr>
-        <w:t>RSPduo — 1234567 [sdrplay]</w:t>
+        <w:t>driver = sdrplay</w:t>
       </w:r>
       <w:r>
         <w:t>.</w:t>
@@ -3188,146 +3181,27 @@
     </w:p>
     <w:p>
       <w:pPr>
-        <w:pStyle w:val="Heading2"/>
-      </w:pPr>
-      <w:bookmarkStart w:id="7" w:name="_Toc229939645"/>
-      <w:r>
-        <w:t>2. Installing Radioconda</w:t>
-      </w:r>
-      <w:bookmarkEnd w:id="7"/>
+        <w:pStyle w:val="ListBullet"/>
+      </w:pPr>
+      <w:r>
+        <w:rPr>
+          <w:b/>
+        </w:rPr>
+        <w:t>No radio yet:</w:t>
+      </w:r>
+      <w:r>
+        <w:t xml:space="preserve"> skip this — the app starts in playback mode using the bundled sample file (see §8), which is ideal for training.</w:t>
+      </w:r>
     </w:p>
     <w:p>
       <w:pPr>
         <w:pStyle w:val="Heading3"/>
       </w:pPr>
-      <w:bookmarkStart w:id="8" w:name="_Toc229939646"/>
-      <w:r>
-        <w:t>2.1 Windows 11</w:t>
-      </w:r>
-      <w:bookmarkEnd w:id="8"/>
-    </w:p>
-    <w:p>
-      <w:pPr>
-        <w:pStyle w:val="ListNumber"/>
-      </w:pPr>
-      <w:r>
-        <w:t xml:space="preserve">Download </w:t>
-      </w:r>
-      <w:r>
-        <w:rPr>
-          <w:rFonts w:ascii="Consolas" w:hAnsi="Consolas"/>
-          <w:sz w:val="20"/>
-        </w:rPr>
-        <w:t>radioconda-Windows-x86_64.exe</w:t>
-      </w:r>
-      <w:r>
-        <w:t xml:space="preserve"> from the Radioconda releases page.</w:t>
-      </w:r>
-    </w:p>
-    <w:p>
-      <w:pPr>
-        <w:pStyle w:val="ListNumber"/>
-      </w:pPr>
-      <w:r>
-        <w:t xml:space="preserve">Double-click the installer. Accept defaults; the installer offers to put Radioconda under </w:t>
-      </w:r>
-      <w:r>
-        <w:rPr>
-          <w:rFonts w:ascii="Consolas" w:hAnsi="Consolas"/>
-          <w:sz w:val="20"/>
-        </w:rPr>
-        <w:t>C:\ProgramData\radioconda</w:t>
-      </w:r>
-      <w:r>
-        <w:t xml:space="preserve"> (system-wide) or </w:t>
-      </w:r>
-      <w:r>
-        <w:rPr>
-          <w:rFonts w:ascii="Consolas" w:hAnsi="Consolas"/>
-          <w:sz w:val="20"/>
-        </w:rPr>
-        <w:t>%LOCALAPPDATA%\radioconda</w:t>
-      </w:r>
-      <w:r>
-        <w:t xml:space="preserve"> (per-user). Either works; the app’s launcher checks both.</w:t>
-      </w:r>
-    </w:p>
-    <w:p>
-      <w:pPr>
-        <w:pStyle w:val="ListNumber"/>
-      </w:pPr>
-      <w:r>
-        <w:lastRenderedPageBreak/>
-        <w:t>After the install finishes, plug the B210 into a USB 3 port. The first time you do this, Windows will silently install the UHD driver from the Radioconda install. No prompt should appear.</w:t>
-      </w:r>
-    </w:p>
-    <w:p>
-      <w:pPr>
-        <w:pStyle w:val="ListNumber"/>
-      </w:pPr>
-      <w:r>
-        <w:t xml:space="preserve">Verify the B210 is detected by opening the </w:t>
-      </w:r>
-      <w:r>
-        <w:rPr>
-          <w:b/>
-        </w:rPr>
-        <w:t>Anaconda Prompt (Radioconda)</w:t>
-      </w:r>
-      <w:r>
-        <w:t xml:space="preserve"> shortcut from the Start menu and running:</w:t>
-      </w:r>
-    </w:p>
-    <w:tbl>
-      <w:tblPr>
-        <w:tblW w:w="0" w:type="auto"/>
-        <w:tblLook w:val="04A0" w:firstRow="1" w:lastRow="0" w:firstColumn="1" w:lastColumn="0" w:noHBand="0" w:noVBand="1"/>
-      </w:tblPr>
-      <w:tblGrid>
-        <w:gridCol w:w="9634"/>
-      </w:tblGrid>
-      <w:tr>
-        <w:tc>
-          <w:tcPr>
-            <w:tcW w:w="9634" w:type="dxa"/>
-            <w:shd w:val="clear" w:color="auto" w:fill="F2F2F2"/>
-          </w:tcPr>
-          <w:p>
-            <w:r>
-              <w:rPr>
-                <w:rFonts w:ascii="Consolas" w:hAnsi="Consolas"/>
-                <w:sz w:val="18"/>
-              </w:rPr>
-              <w:t xml:space="preserve">   uhd_find_devices</w:t>
-            </w:r>
-          </w:p>
-        </w:tc>
-      </w:tr>
-    </w:tbl>
-    <w:p>
-      <w:r>
-        <w:t xml:space="preserve">You should see one device with </w:t>
-      </w:r>
-      <w:r>
-        <w:rPr>
-          <w:rFonts w:ascii="Consolas" w:hAnsi="Consolas"/>
-          <w:sz w:val="20"/>
-        </w:rPr>
-        <w:t>serial: 3273A91</w:t>
-      </w:r>
-      <w:r>
-        <w:t>.</w:t>
-      </w:r>
-    </w:p>
-    <w:p>
-      <w:pPr>
-        <w:pStyle w:val="Heading3"/>
-      </w:pPr>
-      <w:bookmarkStart w:id="9" w:name="_Toc229939647"/>
+      <w:bookmarkStart w:id="6" w:name="_Toc230433315"/>
       <w:r>
         <w:t>2.2 Linux</w:t>
       </w:r>
-      <w:bookmarkEnd w:id="9"/>
+      <w:bookmarkEnd w:id="6"/>
     </w:p>
     <w:p>
       <w:pPr>
@@ -3404,10 +3278,10 @@
         <w:rPr>
           <w:b/>
         </w:rPr>
-        <w:t>USB permissions for the B210.</w:t>
-      </w:r>
-      <w:r>
-        <w:t xml:space="preserve"> Radioconda installs the Ettus udev rules, but they need to be activated:</w:t>
+        <w:t>USB permissions (B210 / USRP only).</w:t>
+      </w:r>
+      <w:r>
+        <w:t xml:space="preserve"> If you have a B210, activate the Ettus udev rules so the device is reachable without root:</w:t>
       </w:r>
     </w:p>
     <w:tbl>
@@ -3447,15 +3321,7 @@
     </w:tbl>
     <w:p>
       <w:r>
-        <w:t>Without this step, you’ll get permission errors when the B210 is plugged in.</w:t>
-      </w:r>
-    </w:p>
-    <w:p>
-      <w:pPr>
-        <w:pStyle w:val="ListNumber"/>
-      </w:pPr>
-      <w:r>
-        <w:t xml:space="preserve">Add yourself to the </w:t>
+        <w:t xml:space="preserve">Without this you’ll get permission errors when the B210 is plugged in. Then add yourself to the </w:t>
       </w:r>
       <w:r>
         <w:rPr>
@@ -3475,7 +3341,13 @@
         <w:t>plugdev</w:t>
       </w:r>
       <w:r>
-        <w:t>, depending on distro) group if your distribution uses one. Log out and back in.</w:t>
+        <w:t>) group if your distro uses one, and log out/in.</w:t>
+      </w:r>
+    </w:p>
+    <w:p>
+      <w:r>
+        <w:lastRenderedPageBreak/>
+        <w:t>Other USB SDRs (RTL-SDR, HackRF, Airspy, etc.) have their own udev rules, usually installed with the device’s own package. SDRPlay uses its API service (see §3A) and needs no udev rules.</w:t>
       </w:r>
     </w:p>
     <w:p>
@@ -3483,7 +3355,7 @@
         <w:pStyle w:val="ListNumber"/>
       </w:pPr>
       <w:r>
-        <w:t>Plug in the B210 and verify:</w:t>
+        <w:t>(Optional) Confirm your radio is detected, using the command for your device:</w:t>
       </w:r>
     </w:p>
     <w:tbl>
@@ -3506,21 +3378,35 @@
                 <w:rFonts w:ascii="Consolas" w:hAnsi="Consolas"/>
                 <w:sz w:val="18"/>
               </w:rPr>
-              <w:t xml:space="preserve">   ~/radioconda/bin/uhd_find_devices</w:t>
+              <w:t xml:space="preserve">   ~/radioconda/bin/uhd_find_devices      # B210 / USRP</w:t>
+            </w:r>
+          </w:p>
+          <w:p>
+            <w:r>
+              <w:rPr>
+                <w:rFonts w:ascii="Consolas" w:hAnsi="Consolas"/>
+                <w:sz w:val="18"/>
+              </w:rPr>
+              <w:t xml:space="preserve">   ~/radioconda/bin/SoapySDRUtil --find   # RTL-SDR, HackRF, Airspy, SDRPlay (after §3A), …</w:t>
             </w:r>
           </w:p>
         </w:tc>
       </w:tr>
     </w:tbl>
     <w:p>
+      <w:r>
+        <w:t>No radio yet? Skip this — the app starts in playback mode from the bundled sample (see §8).</w:t>
+      </w:r>
+    </w:p>
+    <w:p>
       <w:pPr>
         <w:pStyle w:val="Heading3"/>
       </w:pPr>
-      <w:bookmarkStart w:id="10" w:name="_Toc229939648"/>
+      <w:bookmarkStart w:id="7" w:name="_Toc230433316"/>
       <w:r>
         <w:t>2.3 macOS (Intel and Apple Silicon)</w:t>
       </w:r>
-      <w:bookmarkEnd w:id="10"/>
+      <w:bookmarkEnd w:id="7"/>
     </w:p>
     <w:p>
       <w:r>
@@ -3658,7 +3544,7 @@
         <w:pStyle w:val="ListNumber"/>
       </w:pPr>
       <w:r>
-        <w:t>Plug in the B210. macOS does not require a driver install.</w:t>
+        <w:t>If you have a radio, plug it in. macOS needs no driver install for the B210.</w:t>
       </w:r>
     </w:p>
     <w:p>
@@ -3666,8 +3552,7 @@
         <w:pStyle w:val="ListNumber"/>
       </w:pPr>
       <w:r>
-        <w:lastRenderedPageBreak/>
-        <w:t>Verify:</w:t>
+        <w:t>(Optional) Confirm your radio is detected, using the command for your device:</w:t>
       </w:r>
     </w:p>
     <w:tbl>
@@ -3690,12 +3575,26 @@
                 <w:rFonts w:ascii="Consolas" w:hAnsi="Consolas"/>
                 <w:sz w:val="18"/>
               </w:rPr>
-              <w:t xml:space="preserve">   ~/radioconda/bin/uhd_find_devices</w:t>
+              <w:t xml:space="preserve">   ~/radioconda/bin/uhd_find_devices      # B210 / USRP</w:t>
+            </w:r>
+          </w:p>
+          <w:p>
+            <w:r>
+              <w:rPr>
+                <w:rFonts w:ascii="Consolas" w:hAnsi="Consolas"/>
+                <w:sz w:val="18"/>
+              </w:rPr>
+              <w:t xml:space="preserve">   ~/radioconda/bin/SoapySDRUtil --find   # RTL-SDR, HackRF, Airspy, SDRPlay (after §3A), …</w:t>
             </w:r>
           </w:p>
         </w:tc>
       </w:tr>
     </w:tbl>
+    <w:p>
+      <w:r>
+        <w:t>No radio yet? Skip this — the app starts in playback mode from the bundled sample (see §8).</w:t>
+      </w:r>
+    </w:p>
     <w:p>
       <w:pPr>
         <w:pStyle w:val="ListNumber"/>
@@ -3740,22 +3639,32 @@
       <w:pPr>
         <w:pStyle w:val="Heading2"/>
       </w:pPr>
-      <w:bookmarkStart w:id="11" w:name="_Toc229939649"/>
-      <w:r>
-        <w:t>3. Installing the B210 Spectrum Analyzer</w:t>
-      </w:r>
-      <w:bookmarkEnd w:id="11"/>
-    </w:p>
-    <w:p>
-      <w:r>
-        <w:t xml:space="preserve">You will have received a zip file named </w:t>
+      <w:bookmarkStart w:id="8" w:name="_Toc230433317"/>
+      <w:r>
+        <w:t>3. Installing the DSES Spectrum Analyzer</w:t>
+      </w:r>
+      <w:bookmarkEnd w:id="8"/>
+    </w:p>
+    <w:p>
+      <w:r>
+        <w:t>Download the application zip from the distribution site:</w:t>
+      </w:r>
+    </w:p>
+    <w:p>
+      <w:r>
+        <w:t>&lt;https://gpstime.com/sw_distribution/b210_sa/&gt;</w:t>
+      </w:r>
+    </w:p>
+    <w:p>
+      <w:r>
+        <w:t xml:space="preserve">Get the file named </w:t>
       </w:r>
       <w:r>
         <w:rPr>
           <w:rFonts w:ascii="Consolas" w:hAnsi="Consolas"/>
           <w:sz w:val="20"/>
         </w:rPr>
-        <w:t>b210-spectrum-analyzer-&lt;version&gt;.zip</w:t>
+        <w:t>dses-spectrum-analyzer-&lt;version&gt;.zip</w:t>
       </w:r>
       <w:r>
         <w:t xml:space="preserve"> (e.g. </w:t>
@@ -3765,65 +3674,69 @@
           <w:rFonts w:ascii="Consolas" w:hAnsi="Consolas"/>
           <w:sz w:val="20"/>
         </w:rPr>
-        <w:t>b210-spectrum-analyzer-1.0.0.zip</w:t>
-      </w:r>
-      <w:r>
-        <w:t>).</w:t>
-      </w:r>
-    </w:p>
-    <w:p>
-      <w:pPr>
-        <w:pStyle w:val="Heading3"/>
-      </w:pPr>
-      <w:bookmarkStart w:id="12" w:name="_Toc229939650"/>
-      <w:r>
-        <w:t>3.1 Windows 11</w:t>
-      </w:r>
-      <w:bookmarkEnd w:id="12"/>
-    </w:p>
-    <w:p>
-      <w:pPr>
-        <w:pStyle w:val="ListNumber"/>
-      </w:pPr>
-      <w:r>
-        <w:t xml:space="preserve">Extract the zip anywhere you have write permission. A common choice is </w:t>
+        <w:t>dses-spectrum-analyzer-1.0.0.zip</w:t>
+      </w:r>
+      <w:r>
+        <w:t>) — that’s the latest release. This guide (</w:t>
       </w:r>
       <w:r>
         <w:rPr>
           <w:rFonts w:ascii="Consolas" w:hAnsi="Consolas"/>
           <w:sz w:val="20"/>
         </w:rPr>
-        <w:t>Documents\B210-Spectrum-Analyzer</w:t>
-      </w:r>
-      <w:r>
-        <w:t xml:space="preserve">. The extracted folder will be </w:t>
+        <w:t>DSES_RFI_Spectrum_Analyzer_Installation.pdf</w:t>
+      </w:r>
+      <w:r>
+        <w:t xml:space="preserve">) </w:t>
+      </w:r>
+      <w:r>
+        <w:lastRenderedPageBreak/>
+        <w:t>lives in the same directory if you ever need a fresh copy. The zip is large (a few hundred MB) because it includes a sample recording for playback mode.</w:t>
+      </w:r>
+    </w:p>
+    <w:p>
+      <w:pPr>
+        <w:pStyle w:val="Heading3"/>
+      </w:pPr>
+      <w:bookmarkStart w:id="9" w:name="_Toc230433318"/>
+      <w:r>
+        <w:t>3.1 Windows 11</w:t>
+      </w:r>
+      <w:bookmarkEnd w:id="9"/>
+    </w:p>
+    <w:p>
+      <w:pPr>
+        <w:pStyle w:val="ListNumber"/>
+      </w:pPr>
+      <w:r>
+        <w:t xml:space="preserve">Extract the zip anywhere you have write permission. A common choice is </w:t>
       </w:r>
       <w:r>
         <w:rPr>
           <w:rFonts w:ascii="Consolas" w:hAnsi="Consolas"/>
           <w:sz w:val="20"/>
         </w:rPr>
-        <w:t>b210-spectrum-analyzer-1.0.0\</w:t>
-      </w:r>
-      <w:r>
-        <w:t xml:space="preserve"> and will contain </w:t>
+        <w:t>Documents\DSES-Spectrum-Analyzer</w:t>
+      </w:r>
+      <w:r>
+        <w:t xml:space="preserve">. The extracted folder will be </w:t>
       </w:r>
       <w:r>
         <w:rPr>
           <w:rFonts w:ascii="Consolas" w:hAnsi="Consolas"/>
           <w:sz w:val="20"/>
         </w:rPr>
-        <w:t>b210_spectrum_analyzer.py</w:t>
-      </w:r>
-      <w:r>
-        <w:t xml:space="preserve">, </w:t>
+        <w:t>dses-spectrum-analyzer-1.0.0\</w:t>
+      </w:r>
+      <w:r>
+        <w:t xml:space="preserve"> and will contain </w:t>
       </w:r>
       <w:r>
         <w:rPr>
           <w:rFonts w:ascii="Consolas" w:hAnsi="Consolas"/>
           <w:sz w:val="20"/>
         </w:rPr>
-        <w:t>launcher.bat</w:t>
+        <w:t>dses_spectrum_analyzer.py</w:t>
       </w:r>
       <w:r>
         <w:t xml:space="preserve">, </w:t>
@@ -3833,7 +3746,7 @@
           <w:rFonts w:ascii="Consolas" w:hAnsi="Consolas"/>
           <w:sz w:val="20"/>
         </w:rPr>
-        <w:t>launcher.ps1</w:t>
+        <w:t>launcher.bat</w:t>
       </w:r>
       <w:r>
         <w:t xml:space="preserve">, </w:t>
@@ -3843,7 +3756,7 @@
           <w:rFonts w:ascii="Consolas" w:hAnsi="Consolas"/>
           <w:sz w:val="20"/>
         </w:rPr>
-        <w:t>install-shortcut.ps1</w:t>
+        <w:t>launcher.ps1</w:t>
       </w:r>
       <w:r>
         <w:t xml:space="preserve">, </w:t>
@@ -3853,72 +3766,72 @@
           <w:rFonts w:ascii="Consolas" w:hAnsi="Consolas"/>
           <w:sz w:val="20"/>
         </w:rPr>
-        <w:t>LICENSE</w:t>
-      </w:r>
-      <w:r>
-        <w:t xml:space="preserve">, the </w:t>
+        <w:t>install-shortcut.ps1</w:t>
+      </w:r>
+      <w:r>
+        <w:t xml:space="preserve">, </w:t>
       </w:r>
       <w:r>
         <w:rPr>
           <w:rFonts w:ascii="Consolas" w:hAnsi="Consolas"/>
           <w:sz w:val="20"/>
         </w:rPr>
-        <w:t>icons\</w:t>
-      </w:r>
-      <w:r>
-        <w:t xml:space="preserve"> folder, and this guide.</w:t>
-      </w:r>
-    </w:p>
-    <w:p>
-      <w:pPr>
-        <w:pStyle w:val="ListNumber"/>
-      </w:pPr>
-      <w:r>
-        <w:t xml:space="preserve">Double-click </w:t>
-      </w:r>
-      <w:r>
-        <w:rPr>
-          <w:b/>
-        </w:rPr>
-        <w:t>`launcher.bat`</w:t>
-      </w:r>
-      <w:r>
-        <w:t xml:space="preserve"> to start the application.</w:t>
-      </w:r>
-    </w:p>
-    <w:p>
-      <w:pPr>
-        <w:pStyle w:val="ListNumber"/>
-      </w:pPr>
-      <w:r>
-        <w:t xml:space="preserve">The first time you run it, the launcher searches for Radioconda in this order: the </w:t>
+        <w:t>LICENSE</w:t>
+      </w:r>
+      <w:r>
+        <w:t xml:space="preserve">, the </w:t>
       </w:r>
       <w:r>
         <w:rPr>
           <w:rFonts w:ascii="Consolas" w:hAnsi="Consolas"/>
           <w:sz w:val="20"/>
         </w:rPr>
-        <w:t>RADIOCONDA_ROOT</w:t>
-      </w:r>
-      <w:r>
-        <w:t xml:space="preserve"> environment variable, any currently-activated conda env, </w:t>
+        <w:t>icons\</w:t>
+      </w:r>
+      <w:r>
+        <w:t xml:space="preserve"> folder, and this guide.</w:t>
+      </w:r>
+    </w:p>
+    <w:p>
+      <w:pPr>
+        <w:pStyle w:val="ListNumber"/>
+      </w:pPr>
+      <w:r>
+        <w:t xml:space="preserve">Double-click </w:t>
+      </w:r>
+      <w:r>
+        <w:rPr>
+          <w:b/>
+        </w:rPr>
+        <w:t>`launcher.bat`</w:t>
+      </w:r>
+      <w:r>
+        <w:t xml:space="preserve"> to start the application.</w:t>
+      </w:r>
+    </w:p>
+    <w:p>
+      <w:pPr>
+        <w:pStyle w:val="ListNumber"/>
+      </w:pPr>
+      <w:r>
+        <w:t xml:space="preserve">The first time you run it, the launcher searches for Radioconda in this order: the </w:t>
       </w:r>
       <w:r>
         <w:rPr>
           <w:rFonts w:ascii="Consolas" w:hAnsi="Consolas"/>
           <w:sz w:val="20"/>
         </w:rPr>
-        <w:t>%LOCALAPPDATA%\radioconda</w:t>
-      </w:r>
-      <w:r>
-        <w:t xml:space="preserve">, </w:t>
+        <w:t>RADIOCONDA_ROOT</w:t>
+      </w:r>
+      <w:r>
+        <w:t xml:space="preserve"> environment variable, any currently-activated conda env, </w:t>
       </w:r>
       <w:r>
         <w:rPr>
           <w:rFonts w:ascii="Consolas" w:hAnsi="Consolas"/>
           <w:sz w:val="20"/>
         </w:rPr>
-        <w:t>C:\ProgramData\radioconda</w:t>
+        <w:t>%LOCALAPPDATA%\radioconda</w:t>
       </w:r>
       <w:r>
         <w:t xml:space="preserve">, </w:t>
@@ -3928,26 +3841,36 @@
           <w:rFonts w:ascii="Consolas" w:hAnsi="Consolas"/>
           <w:sz w:val="20"/>
         </w:rPr>
-        <w:t>%USERPROFILE%\radioconda</w:t>
-      </w:r>
-      <w:r>
-        <w:t xml:space="preserve">, a cached config file, then </w:t>
+        <w:t>C:\ProgramData\radioconda</w:t>
+      </w:r>
+      <w:r>
+        <w:t xml:space="preserve">, </w:t>
       </w:r>
       <w:r>
         <w:rPr>
           <w:rFonts w:ascii="Consolas" w:hAnsi="Consolas"/>
           <w:sz w:val="20"/>
         </w:rPr>
-        <w:t>conda info --base</w:t>
-      </w:r>
-      <w:r>
-        <w:t xml:space="preserve"> if </w:t>
+        <w:t>%USERPROFILE%\radioconda</w:t>
+      </w:r>
+      <w:r>
+        <w:t xml:space="preserve">, a cached config file, then </w:t>
       </w:r>
       <w:r>
         <w:rPr>
           <w:rFonts w:ascii="Consolas" w:hAnsi="Consolas"/>
           <w:sz w:val="20"/>
         </w:rPr>
+        <w:t>conda info --base</w:t>
+      </w:r>
+      <w:r>
+        <w:t xml:space="preserve"> if </w:t>
+      </w:r>
+      <w:r>
+        <w:rPr>
+          <w:rFonts w:ascii="Consolas" w:hAnsi="Consolas"/>
+          <w:sz w:val="20"/>
+        </w:rPr>
         <w:t>conda</w:t>
       </w:r>
       <w:r>
@@ -3968,7 +3891,7 @@
         <w:t>`install-shortcut.ps1`</w:t>
       </w:r>
       <w:r>
-        <w:t xml:space="preserve"> → “Run with PowerShell” to put a “B210 Spectrum Analyzer” shortcut on your desktop and Start menu.</w:t>
+        <w:t xml:space="preserve"> → “Run with PowerShell” to put a “DSES Spectrum Analyzer” shortcut on your desktop and Start menu.</w:t>
       </w:r>
     </w:p>
     <w:p>
@@ -3980,11 +3903,11 @@
       <w:pPr>
         <w:pStyle w:val="Heading3"/>
       </w:pPr>
-      <w:bookmarkStart w:id="13" w:name="_Toc229939651"/>
+      <w:bookmarkStart w:id="10" w:name="_Toc230433319"/>
       <w:r>
         <w:t>3.2 Linux</w:t>
       </w:r>
-      <w:bookmarkEnd w:id="13"/>
+      <w:bookmarkEnd w:id="10"/>
     </w:p>
     <w:p>
       <w:pPr>
@@ -4014,7 +3937,7 @@
                 <w:rFonts w:ascii="Consolas" w:hAnsi="Consolas"/>
                 <w:sz w:val="18"/>
               </w:rPr>
-              <w:t xml:space="preserve">   unzip b210-spectrum-analyzer-1.0.0.zip</w:t>
+              <w:t xml:space="preserve">   unzip dses-spectrum-analyzer-1.0.0.zip</w:t>
             </w:r>
           </w:p>
           <w:p>
@@ -4023,7 +3946,7 @@
                 <w:rFonts w:ascii="Consolas" w:hAnsi="Consolas"/>
                 <w:sz w:val="18"/>
               </w:rPr>
-              <w:t xml:space="preserve">   cd b210-spectrum-analyzer-1.0.0</w:t>
+              <w:t xml:space="preserve">   cd dses-spectrum-analyzer-1.0.0</w:t>
             </w:r>
           </w:p>
           <w:p>
@@ -4100,7 +4023,6 @@
                 <w:rFonts w:ascii="Consolas" w:hAnsi="Consolas"/>
                 <w:sz w:val="18"/>
               </w:rPr>
-              <w:lastRenderedPageBreak/>
               <w:t xml:space="preserve">   INSTALL_DIR="$(pwd)"</w:t>
             </w:r>
           </w:p>
@@ -4110,7 +4032,7 @@
                 <w:rFonts w:ascii="Consolas" w:hAnsi="Consolas"/>
                 <w:sz w:val="18"/>
               </w:rPr>
-              <w:t xml:space="preserve">   sed "s|__INSTALL_DIR__|$INSTALL_DIR|g" b210-spectrum-analyzer.desktop \</w:t>
+              <w:t xml:space="preserve">   sed "s|__INSTALL_DIR__|$INSTALL_DIR|g" dses-spectrum-analyzer.desktop \</w:t>
             </w:r>
           </w:p>
           <w:p>
@@ -4119,7 +4041,7 @@
                 <w:rFonts w:ascii="Consolas" w:hAnsi="Consolas"/>
                 <w:sz w:val="18"/>
               </w:rPr>
-              <w:t xml:space="preserve">       &gt; ~/.local/share/applications/b210-spectrum-analyzer.desktop</w:t>
+              <w:t xml:space="preserve">       &gt; ~/.local/share/applications/dses-spectrum-analyzer.desktop</w:t>
             </w:r>
           </w:p>
           <w:p>
@@ -4173,11 +4095,12 @@
       <w:pPr>
         <w:pStyle w:val="Heading3"/>
       </w:pPr>
-      <w:bookmarkStart w:id="14" w:name="_Toc229939652"/>
-      <w:r>
+      <w:bookmarkStart w:id="11" w:name="_Toc230433320"/>
+      <w:r>
+        <w:lastRenderedPageBreak/>
         <w:t>3.3 macOS</w:t>
       </w:r>
-      <w:bookmarkEnd w:id="14"/>
+      <w:bookmarkEnd w:id="11"/>
     </w:p>
     <w:p>
       <w:r>
@@ -4204,7 +4127,7 @@
                 <w:rFonts w:ascii="Consolas" w:hAnsi="Consolas"/>
                 <w:sz w:val="18"/>
               </w:rPr>
-              <w:t>unzip b210-spectrum-analyzer-1.0.0.zip</w:t>
+              <w:t>unzip dses-spectrum-analyzer-1.0.0.zip</w:t>
             </w:r>
           </w:p>
           <w:p>
@@ -4213,7 +4136,7 @@
                 <w:rFonts w:ascii="Consolas" w:hAnsi="Consolas"/>
                 <w:sz w:val="18"/>
               </w:rPr>
-              <w:t>cd b210-spectrum-analyzer-1.0.0</w:t>
+              <w:t>cd dses-spectrum-analyzer-1.0.0</w:t>
             </w:r>
           </w:p>
           <w:p>
@@ -4316,7 +4239,7 @@
                 <w:rFonts w:ascii="Consolas" w:hAnsi="Consolas"/>
                 <w:sz w:val="18"/>
               </w:rPr>
-              <w:t>xattr -dr com.apple.quarantine b210-spectrum-analyzer-1.0.0</w:t>
+              <w:t>xattr -dr com.apple.quarantine dses-spectrum-analyzer-1.0.0</w:t>
             </w:r>
           </w:p>
         </w:tc>
@@ -4326,18 +4249,50 @@
       <w:pPr>
         <w:pStyle w:val="Heading2"/>
       </w:pPr>
-      <w:bookmarkStart w:id="15" w:name="_Toc229939653"/>
-      <w:r>
-        <w:t xml:space="preserve">4. </w:t>
-      </w:r>
-      <w:r>
-        <w:t>First-run checklist</w:t>
-      </w:r>
-      <w:bookmarkEnd w:id="15"/>
-    </w:p>
-    <w:p>
-      <w:r>
-        <w:t>Regardless of OS, before declaring the install good:</w:t>
+      <w:bookmarkStart w:id="12" w:name="_Toc230433321"/>
+      <w:r>
+        <w:t>3A. Extra setup for SDRPlay receivers (RSP1A / RSP1B / RSPduo / RSPdx)</w:t>
+      </w:r>
+      <w:bookmarkEnd w:id="12"/>
+    </w:p>
+    <w:p>
+      <w:r>
+        <w:rPr>
+          <w:b/>
+        </w:rPr>
+        <w:t>Do this only if you’re using an SDRPlay receiver</w:t>
+      </w:r>
+      <w:r>
+        <w:t xml:space="preserve"> — and only </w:t>
+      </w:r>
+      <w:r>
+        <w:rPr>
+          <w:i/>
+        </w:rPr>
+        <w:t>after</w:t>
+      </w:r>
+      <w:r>
+        <w:t xml:space="preserve"> you’ve installed Radioconda (§2) and extracted this app (§3), because the steps below put files into Radioconda’s folders and use a file that ships inside the app’s zip. B210, RTL-SDR, HackRF, Airspy, BladeRF, LimeSDR, and PlutoSDR users can skip this section entirely.</w:t>
+      </w:r>
+    </w:p>
+    <w:p>
+      <w:r>
+        <w:t>SDRPlay needs two extra pieces: the manufacturer’s API driver, and the SoapySDRPlay module that bridges that driver to the SoapySDR layer the program uses.</w:t>
+      </w:r>
+    </w:p>
+    <w:p>
+      <w:pPr>
+        <w:pStyle w:val="Heading3"/>
+      </w:pPr>
+      <w:bookmarkStart w:id="13" w:name="_Toc230433322"/>
+      <w:r>
+        <w:t>3A.1 Install the SDRplay API</w:t>
+      </w:r>
+      <w:bookmarkEnd w:id="13"/>
+    </w:p>
+    <w:p>
+      <w:r>
+        <w:t>Download and install it from &lt;https://www.sdrplay.com/api/&gt; — pick the installer for your OS.</w:t>
       </w:r>
     </w:p>
     <w:p>
@@ -4345,17 +4300,23 @@
         <w:pStyle w:val="ListBullet"/>
       </w:pPr>
       <w:r>
-        <w:t xml:space="preserve">The window title bar reads </w:t>
+        <w:rPr>
+          <w:b/>
+        </w:rPr>
+        <w:t>Windows:</w:t>
+      </w:r>
+      <w:r>
+        <w:t xml:space="preserve"> run the </w:t>
       </w:r>
       <w:r>
         <w:rPr>
           <w:rFonts w:ascii="Consolas" w:hAnsi="Consolas"/>
           <w:sz w:val="20"/>
         </w:rPr>
-        <w:t>B210 Spectrum Analyzer — v1.0.0 — B210 Spectrum Analyzer</w:t>
-      </w:r>
-      <w:r>
-        <w:t>. The version number must match the bundle you installed.</w:t>
+        <w:t>.exe</w:t>
+      </w:r>
+      <w:r>
+        <w:t xml:space="preserve"> installer; accept defaults. A reboot may be needed.</w:t>
       </w:r>
     </w:p>
     <w:p>
@@ -4363,243 +4324,882 @@
         <w:pStyle w:val="ListBullet"/>
       </w:pPr>
       <w:r>
-        <w:t xml:space="preserve">Pull up </w:t>
-      </w:r>
-      <w:r>
         <w:rPr>
           <w:b/>
         </w:rPr>
-        <w:t>Help → User Guide</w:t>
-      </w:r>
-      <w:r>
-        <w:t xml:space="preserve"> from the menu bar. The guide should open.</w:t>
-      </w:r>
-    </w:p>
-    <w:p>
-      <w:pPr>
-        <w:pStyle w:val="ListBullet"/>
-      </w:pPr>
-      <w:r>
-        <w:t xml:space="preserve">Pull up </w:t>
-      </w:r>
-      <w:r>
-        <w:rPr>
-          <w:b/>
-        </w:rPr>
-        <w:t>Help → About</w:t>
-      </w:r>
-      <w:r>
-        <w:t>. The author, version, license, and the path to the settings file should be readable.</w:t>
-      </w:r>
-    </w:p>
-    <w:p>
-      <w:pPr>
-        <w:pStyle w:val="ListBullet"/>
-      </w:pPr>
-      <w:r>
-        <w:t>The spectrum plot should show live data (not a flat line at −140 dB). If it’s flat, the B210 isn’t streaming — see Troubleshooting §6.</w:t>
-      </w:r>
-    </w:p>
-    <w:p>
-      <w:pPr>
-        <w:pStyle w:val="ListBullet"/>
-      </w:pPr>
-      <w:r>
-        <w:t xml:space="preserve">Click the </w:t>
-      </w:r>
-      <w:r>
-        <w:rPr>
-          <w:b/>
-        </w:rPr>
-        <w:t>408 MHz</w:t>
-      </w:r>
-      <w:r>
-        <w:t xml:space="preserve"> preset under Pulsar Band. The center frequency should retune and the trace should redraw.</w:t>
-      </w:r>
-    </w:p>
-    <w:p>
-      <w:pPr>
-        <w:pStyle w:val="Heading2"/>
-      </w:pPr>
-      <w:bookmarkStart w:id="16" w:name="_Toc229939654"/>
-      <w:r>
-        <w:lastRenderedPageBreak/>
-        <w:t>5. Updating to a new version</w:t>
-      </w:r>
-      <w:bookmarkEnd w:id="16"/>
-    </w:p>
-    <w:p>
-      <w:pPr>
-        <w:pStyle w:val="Heading3"/>
-      </w:pPr>
-      <w:bookmarkStart w:id="17" w:name="_Toc229939655"/>
-      <w:r>
-        <w:t>Auto-update notifications</w:t>
-      </w:r>
-      <w:bookmarkEnd w:id="17"/>
-    </w:p>
-    <w:p>
-      <w:r>
-        <w:t xml:space="preserve">The program checks for new versions at launch (no more than once per 24 hours). If a newer version is available, a small dialog opens with the release notes, a button to </w:t>
-      </w:r>
-      <w:r>
-        <w:rPr>
-          <w:b/>
-        </w:rPr>
-        <w:t>Open Download Page</w:t>
-      </w:r>
-      <w:r>
-        <w:t xml:space="preserve"> in your browser, a </w:t>
-      </w:r>
-      <w:r>
-        <w:rPr>
-          <w:b/>
-        </w:rPr>
-        <w:t>Skip this version</w:t>
-      </w:r>
-      <w:r>
-        <w:t xml:space="preserve"> button (won’t nag again about that specific version), and a </w:t>
-      </w:r>
-      <w:r>
-        <w:rPr>
-          <w:b/>
-        </w:rPr>
-        <w:t>Remind me later</w:t>
-      </w:r>
-      <w:r>
-        <w:t xml:space="preserve"> button.</w:t>
-      </w:r>
-    </w:p>
-    <w:p>
-      <w:r>
-        <w:t xml:space="preserve">You can also trigger a check at any time via </w:t>
-      </w:r>
-      <w:r>
-        <w:rPr>
-          <w:b/>
-        </w:rPr>
-        <w:t>Help → Check for Updates…</w:t>
-      </w:r>
-      <w:r>
-        <w:t>.</w:t>
-      </w:r>
-    </w:p>
-    <w:p>
-      <w:r>
-        <w:t xml:space="preserve">The check is read-only — the program never auto-downloads or auto-installs anything. To disable the auto-check entirely, edit your </w:t>
+        <w:t>Linux:</w:t>
+      </w:r>
+      <w:r>
+        <w:t xml:space="preserve"> run the </w:t>
       </w:r>
       <w:r>
         <w:rPr>
           <w:rFonts w:ascii="Consolas" w:hAnsi="Consolas"/>
           <w:sz w:val="20"/>
         </w:rPr>
-        <w:t>settings.ini</w:t>
-      </w:r>
-      <w:r>
-        <w:t xml:space="preserve"> and set </w:t>
+        <w:t>.run</w:t>
+      </w:r>
+      <w:r>
+        <w:t xml:space="preserve"> installer with </w:t>
       </w:r>
       <w:r>
         <w:rPr>
           <w:rFonts w:ascii="Consolas" w:hAnsi="Consolas"/>
           <w:sz w:val="20"/>
         </w:rPr>
-        <w:t>auto_check = false</w:t>
-      </w:r>
-      <w:r>
-        <w:t xml:space="preserve"> under </w:t>
+        <w:t>sudo</w:t>
+      </w:r>
+      <w:r>
+        <w:t>.</w:t>
+      </w:r>
+    </w:p>
+    <w:p>
+      <w:pPr>
+        <w:pStyle w:val="ListBullet"/>
+      </w:pPr>
+      <w:r>
+        <w:rPr>
+          <w:b/>
+        </w:rPr>
+        <w:t>macOS:</w:t>
+      </w:r>
+      <w:r>
+        <w:t xml:space="preserve"> run the </w:t>
       </w:r>
       <w:r>
         <w:rPr>
           <w:rFonts w:ascii="Consolas" w:hAnsi="Consolas"/>
           <w:sz w:val="20"/>
         </w:rPr>
-        <w:t>[updates]</w:t>
-      </w:r>
-      <w:r>
-        <w:t>.</w:t>
-      </w:r>
-    </w:p>
-    <w:p>
-      <w:pPr>
-        <w:pStyle w:val="Heading3"/>
-      </w:pPr>
-      <w:bookmarkStart w:id="18" w:name="_Toc229939656"/>
-      <w:r>
-        <w:t>Performing the update</w:t>
-      </w:r>
-      <w:bookmarkEnd w:id="18"/>
-    </w:p>
-    <w:p>
-      <w:r>
-        <w:t>Each release is a self-contained zip. To update:</w:t>
-      </w:r>
-    </w:p>
-    <w:p>
-      <w:pPr>
-        <w:pStyle w:val="ListNumber"/>
-      </w:pPr>
-      <w:r>
-        <w:rPr>
-          <w:b/>
-        </w:rPr>
-        <w:t>Close</w:t>
-      </w:r>
-      <w:r>
-        <w:t xml:space="preserve"> the running app.</w:t>
-      </w:r>
-    </w:p>
-    <w:p>
-      <w:pPr>
-        <w:pStyle w:val="ListNumber"/>
-      </w:pPr>
-      <w:r>
-        <w:rPr>
-          <w:b/>
-        </w:rPr>
-        <w:t>Extract</w:t>
-      </w:r>
-      <w:r>
-        <w:t xml:space="preserve"> the new zip alongside the old one (or over the top of the old folder). The new folder is named with the new version (e.g. </w:t>
+        <w:t>.pkg</w:t>
+      </w:r>
+      <w:r>
+        <w:t xml:space="preserve"> installer.</w:t>
+      </w:r>
+    </w:p>
+    <w:p>
+      <w:r>
+        <w:t xml:space="preserve">After installation, verify the API can see your unit with the SDRplay Service / Status app (Windows) or </w:t>
       </w:r>
       <w:r>
         <w:rPr>
           <w:rFonts w:ascii="Consolas" w:hAnsi="Consolas"/>
           <w:sz w:val="20"/>
         </w:rPr>
-        <w:t>b210-spectrum-analyzer-1.0.1</w:t>
-      </w:r>
-      <w:r>
-        <w:t>).</w:t>
-      </w:r>
-    </w:p>
-    <w:p>
-      <w:pPr>
-        <w:pStyle w:val="ListNumber"/>
-      </w:pPr>
+        <w:t>SDRplayService</w:t>
+      </w:r>
+      <w:r>
+        <w:t xml:space="preserve"> (Linux/macOS). You should see your RSP listed.</w:t>
+      </w:r>
+    </w:p>
+    <w:p>
+      <w:pPr>
+        <w:pStyle w:val="Heading3"/>
+      </w:pPr>
+      <w:bookmarkStart w:id="14" w:name="_Toc230433323"/>
+      <w:r>
+        <w:t>3A.2 Install the SoapySDRPlay module</w:t>
+      </w:r>
+      <w:bookmarkEnd w:id="14"/>
+    </w:p>
+    <w:p>
+      <w:r>
+        <w:t xml:space="preserve">This module is </w:t>
+      </w:r>
       <w:r>
         <w:rPr>
           <w:b/>
         </w:rPr>
-        <w:t>Run</w:t>
-      </w:r>
-      <w:r>
-        <w:t xml:space="preserve"> </w:t>
+        <w:t>not</w:t>
+      </w:r>
+      <w:r>
+        <w:t xml:space="preserve"> available through </w:t>
       </w:r>
       <w:r>
         <w:rPr>
           <w:rFonts w:ascii="Consolas" w:hAnsi="Consolas"/>
           <w:sz w:val="20"/>
         </w:rPr>
-        <w:t>launcher.bat</w:t>
-      </w:r>
-      <w:r>
-        <w:t xml:space="preserve"> or </w:t>
+        <w:t>conda install</w:t>
+      </w:r>
+      <w:r>
+        <w:t xml:space="preserve"> on any platform, so the steps differ by OS.</w:t>
+      </w:r>
+    </w:p>
+    <w:p>
+      <w:r>
+        <w:rPr>
+          <w:b/>
+        </w:rPr>
+        <w:t>Windows</w:t>
+      </w:r>
+      <w:r>
+        <w:t xml:space="preserve"> — copy the pre-built module that ships in this distribution:</w:t>
+      </w:r>
+    </w:p>
+    <w:p>
+      <w:r>
+        <w:lastRenderedPageBreak/>
+        <w:t xml:space="preserve">The extracted release folder (from §3) contains </w:t>
       </w:r>
       <w:r>
         <w:rPr>
           <w:rFonts w:ascii="Consolas" w:hAnsi="Consolas"/>
           <w:sz w:val="20"/>
         </w:rPr>
+        <w:t>sdrplay\sdrPlaySupport.dll</w:t>
+      </w:r>
+      <w:r>
+        <w:t xml:space="preserve">. Copy it into Radioconda’s SoapySDR module directory. That directory is under </w:t>
+      </w:r>
+      <w:r>
+        <w:rPr>
+          <w:rFonts w:ascii="Consolas" w:hAnsi="Consolas"/>
+          <w:sz w:val="20"/>
+        </w:rPr>
+        <w:t>C:\ProgramData</w:t>
+      </w:r>
+      <w:r>
+        <w:t xml:space="preserve">, so you need an </w:t>
+      </w:r>
+      <w:r>
+        <w:rPr>
+          <w:b/>
+        </w:rPr>
+        <w:t>Administrator</w:t>
+      </w:r>
+      <w:r>
+        <w:t xml:space="preserve"> PowerShell (right-click Windows PowerShell → “Run as administrator”):</w:t>
+      </w:r>
+    </w:p>
+    <w:tbl>
+      <w:tblPr>
+        <w:tblW w:w="0" w:type="auto"/>
+        <w:tblLook w:val="04A0" w:firstRow="1" w:lastRow="0" w:firstColumn="1" w:lastColumn="0" w:noHBand="0" w:noVBand="1"/>
+      </w:tblPr>
+      <w:tblGrid>
+        <w:gridCol w:w="9634"/>
+      </w:tblGrid>
+      <w:tr>
+        <w:tc>
+          <w:tcPr>
+            <w:tcW w:w="9634" w:type="dxa"/>
+            <w:shd w:val="clear" w:color="auto" w:fill="F2F2F2"/>
+          </w:tcPr>
+          <w:p>
+            <w:r>
+              <w:rPr>
+                <w:rFonts w:ascii="Consolas" w:hAnsi="Consolas"/>
+                <w:sz w:val="18"/>
+              </w:rPr>
+              <w:t>Copy-Item ".\sdrplay\sdrPlaySupport.dll" `</w:t>
+            </w:r>
+          </w:p>
+          <w:p>
+            <w:r>
+              <w:rPr>
+                <w:rFonts w:ascii="Consolas" w:hAnsi="Consolas"/>
+                <w:sz w:val="18"/>
+              </w:rPr>
+              <w:t xml:space="preserve">  "C:\ProgramData\radioconda\Library\lib\SoapySDR\modules0.8\" -Force</w:t>
+            </w:r>
+          </w:p>
+        </w:tc>
+      </w:tr>
+    </w:tbl>
+    <w:p>
+      <w:r>
+        <w:t xml:space="preserve">(Run it from the extracted release folder, or give the full path to the DLL.) If your Radioconda is installed somewhere else, adjust the path — the target is always </w:t>
+      </w:r>
+      <w:r>
+        <w:rPr>
+          <w:rFonts w:ascii="Consolas" w:hAnsi="Consolas"/>
+          <w:sz w:val="20"/>
+        </w:rPr>
+        <w:t>…\Library\lib\SoapySDR\modules0.8\</w:t>
+      </w:r>
+      <w:r>
+        <w:t>.</w:t>
+      </w:r>
+    </w:p>
+    <w:p>
+      <w:r>
+        <w:t>Then start the SDRplay API service (also from the Administrator PowerShell — the installer leaves it stopped):</w:t>
+      </w:r>
+    </w:p>
+    <w:tbl>
+      <w:tblPr>
+        <w:tblW w:w="0" w:type="auto"/>
+        <w:tblLook w:val="04A0" w:firstRow="1" w:lastRow="0" w:firstColumn="1" w:lastColumn="0" w:noHBand="0" w:noVBand="1"/>
+      </w:tblPr>
+      <w:tblGrid>
+        <w:gridCol w:w="9634"/>
+      </w:tblGrid>
+      <w:tr>
+        <w:tc>
+          <w:tcPr>
+            <w:tcW w:w="9634" w:type="dxa"/>
+            <w:shd w:val="clear" w:color="auto" w:fill="F2F2F2"/>
+          </w:tcPr>
+          <w:p>
+            <w:r>
+              <w:rPr>
+                <w:rFonts w:ascii="Consolas" w:hAnsi="Consolas"/>
+                <w:sz w:val="18"/>
+              </w:rPr>
+              <w:t>Set-Service SDRplayAPIService -StartupType Automatic</w:t>
+            </w:r>
+          </w:p>
+          <w:p>
+            <w:r>
+              <w:rPr>
+                <w:rFonts w:ascii="Consolas" w:hAnsi="Consolas"/>
+                <w:sz w:val="18"/>
+              </w:rPr>
+              <w:t>Start-Service SDRplayAPIService</w:t>
+            </w:r>
+          </w:p>
+        </w:tc>
+      </w:tr>
+    </w:tbl>
+    <w:p>
+      <w:r>
+        <w:rPr>
+          <w:b/>
+        </w:rPr>
+        <w:t>Linux</w:t>
+      </w:r>
+      <w:r>
+        <w:t xml:space="preserve"> — install from your package manager:</w:t>
+      </w:r>
+    </w:p>
+    <w:tbl>
+      <w:tblPr>
+        <w:tblW w:w="0" w:type="auto"/>
+        <w:tblLook w:val="04A0" w:firstRow="1" w:lastRow="0" w:firstColumn="1" w:lastColumn="0" w:noHBand="0" w:noVBand="1"/>
+      </w:tblPr>
+      <w:tblGrid>
+        <w:gridCol w:w="9634"/>
+      </w:tblGrid>
+      <w:tr>
+        <w:tc>
+          <w:tcPr>
+            <w:tcW w:w="9634" w:type="dxa"/>
+            <w:shd w:val="clear" w:color="auto" w:fill="F2F2F2"/>
+          </w:tcPr>
+          <w:p>
+            <w:r>
+              <w:rPr>
+                <w:rFonts w:ascii="Consolas" w:hAnsi="Consolas"/>
+                <w:sz w:val="18"/>
+              </w:rPr>
+              <w:t>Debian / Ubuntu:   sudo apt install soapysdr-module-sdrplay</w:t>
+            </w:r>
+          </w:p>
+          <w:p>
+            <w:r>
+              <w:rPr>
+                <w:rFonts w:ascii="Consolas" w:hAnsi="Consolas"/>
+                <w:sz w:val="18"/>
+              </w:rPr>
+              <w:t>Fedora:            sudo dnf install SoapySDRPlay</w:t>
+            </w:r>
+          </w:p>
+        </w:tc>
+      </w:tr>
+    </w:tbl>
+    <w:p>
+      <w:r>
+        <w:rPr>
+          <w:b/>
+        </w:rPr>
+        <w:t>macOS</w:t>
+      </w:r>
+      <w:r>
+        <w:t xml:space="preserve"> — install from the Pothosware Homebrew tap:</w:t>
+      </w:r>
+    </w:p>
+    <w:tbl>
+      <w:tblPr>
+        <w:tblW w:w="0" w:type="auto"/>
+        <w:tblLook w:val="04A0" w:firstRow="1" w:lastRow="0" w:firstColumn="1" w:lastColumn="0" w:noHBand="0" w:noVBand="1"/>
+      </w:tblPr>
+      <w:tblGrid>
+        <w:gridCol w:w="9634"/>
+      </w:tblGrid>
+      <w:tr>
+        <w:tc>
+          <w:tcPr>
+            <w:tcW w:w="9634" w:type="dxa"/>
+            <w:shd w:val="clear" w:color="auto" w:fill="F2F2F2"/>
+          </w:tcPr>
+          <w:p>
+            <w:r>
+              <w:rPr>
+                <w:rFonts w:ascii="Consolas" w:hAnsi="Consolas"/>
+                <w:sz w:val="18"/>
+              </w:rPr>
+              <w:t>brew tap pothosware/homebrew-pothos</w:t>
+            </w:r>
+          </w:p>
+          <w:p>
+            <w:r>
+              <w:rPr>
+                <w:rFonts w:ascii="Consolas" w:hAnsi="Consolas"/>
+                <w:sz w:val="18"/>
+              </w:rPr>
+              <w:t>brew install soapysdrplay3</w:t>
+            </w:r>
+          </w:p>
+        </w:tc>
+      </w:tr>
+    </w:tbl>
+    <w:p>
+      <w:r>
+        <w:t>Verify it loaded (any OS, from a Radioconda prompt):</w:t>
+      </w:r>
+    </w:p>
+    <w:tbl>
+      <w:tblPr>
+        <w:tblW w:w="0" w:type="auto"/>
+        <w:tblLook w:val="04A0" w:firstRow="1" w:lastRow="0" w:firstColumn="1" w:lastColumn="0" w:noHBand="0" w:noVBand="1"/>
+      </w:tblPr>
+      <w:tblGrid>
+        <w:gridCol w:w="9634"/>
+      </w:tblGrid>
+      <w:tr>
+        <w:tc>
+          <w:tcPr>
+            <w:tcW w:w="9634" w:type="dxa"/>
+            <w:shd w:val="clear" w:color="auto" w:fill="F2F2F2"/>
+          </w:tcPr>
+          <w:p>
+            <w:r>
+              <w:rPr>
+                <w:rFonts w:ascii="Consolas" w:hAnsi="Consolas"/>
+                <w:sz w:val="18"/>
+              </w:rPr>
+              <w:t>SoapySDRUtil --info</w:t>
+            </w:r>
+          </w:p>
+        </w:tc>
+      </w:tr>
+    </w:tbl>
+    <w:p>
+      <w:r>
+        <w:t xml:space="preserve">…should list </w:t>
+      </w:r>
+      <w:r>
+        <w:rPr>
+          <w:rFonts w:ascii="Consolas" w:hAnsi="Consolas"/>
+          <w:sz w:val="20"/>
+        </w:rPr>
+        <w:t>sdrplay</w:t>
+      </w:r>
+      <w:r>
+        <w:t xml:space="preserve"> in the “Available factories” line. If it doesn’t:</w:t>
+      </w:r>
+    </w:p>
+    <w:p>
+      <w:pPr>
+        <w:pStyle w:val="ListBullet"/>
+      </w:pPr>
+      <w:r>
+        <w:t>Re-check that the SDRplay API from §3A.1 installed correctly.</w:t>
+      </w:r>
+    </w:p>
+    <w:p>
+      <w:pPr>
+        <w:pStyle w:val="ListBullet"/>
+      </w:pPr>
+      <w:r>
+        <w:t xml:space="preserve">On Windows, confirm the DLL landed in </w:t>
+      </w:r>
+      <w:r>
+        <w:rPr>
+          <w:rFonts w:ascii="Consolas" w:hAnsi="Consolas"/>
+          <w:sz w:val="20"/>
+        </w:rPr>
+        <w:t>modules0.8\</w:t>
+      </w:r>
+      <w:r>
+        <w:t xml:space="preserve"> and the </w:t>
+      </w:r>
+      <w:r>
+        <w:rPr>
+          <w:rFonts w:ascii="Consolas" w:hAnsi="Consolas"/>
+          <w:sz w:val="20"/>
+        </w:rPr>
+        <w:t>SDRplayAPIService</w:t>
+      </w:r>
+      <w:r>
+        <w:t xml:space="preserve"> is running (</w:t>
+      </w:r>
+      <w:r>
+        <w:rPr>
+          <w:rFonts w:ascii="Consolas" w:hAnsi="Consolas"/>
+          <w:sz w:val="20"/>
+        </w:rPr>
+        <w:t>Get-Service SDRplayAPIService</w:t>
+      </w:r>
+      <w:r>
+        <w:t>).</w:t>
+      </w:r>
+    </w:p>
+    <w:p>
+      <w:r>
+        <w:t xml:space="preserve">When you launch the spectrum analyzer with an RSP attached, it appears in the device picker as e.g. </w:t>
+      </w:r>
+      <w:r>
+        <w:rPr>
+          <w:rFonts w:ascii="Consolas" w:hAnsi="Consolas"/>
+          <w:sz w:val="20"/>
+        </w:rPr>
+        <w:t>RSP1B — 240513BE60  [sdrplay]</w:t>
+      </w:r>
+      <w:r>
+        <w:t>.</w:t>
+      </w:r>
+    </w:p>
+    <w:p>
+      <w:pPr>
+        <w:pStyle w:val="Heading2"/>
+      </w:pPr>
+      <w:bookmarkStart w:id="15" w:name="_Toc230433324"/>
+      <w:r>
+        <w:t>4. First-run checklist</w:t>
+      </w:r>
+      <w:bookmarkEnd w:id="15"/>
+    </w:p>
+    <w:p>
+      <w:r>
+        <w:t>Regardless of OS, before declaring the install good:</w:t>
+      </w:r>
+    </w:p>
+    <w:p>
+      <w:pPr>
+        <w:pStyle w:val="ListBullet"/>
+      </w:pPr>
+      <w:r>
+        <w:lastRenderedPageBreak/>
+        <w:t xml:space="preserve">The window title bar reads </w:t>
+      </w:r>
+      <w:r>
+        <w:rPr>
+          <w:rFonts w:ascii="Consolas" w:hAnsi="Consolas"/>
+          <w:sz w:val="20"/>
+        </w:rPr>
+        <w:t>DSES Spectrum Analyzer — v1.0.0 — &lt;radio model&gt; — &lt;serial&gt;</w:t>
+      </w:r>
+      <w:r>
+        <w:t xml:space="preserve"> (e.g. </w:t>
+      </w:r>
+      <w:r>
+        <w:rPr>
+          <w:rFonts w:ascii="Consolas" w:hAnsi="Consolas"/>
+          <w:sz w:val="20"/>
+        </w:rPr>
+        <w:t>… — USRP B210 — 3273A91</w:t>
+      </w:r>
+      <w:r>
+        <w:t xml:space="preserve"> or </w:t>
+      </w:r>
+      <w:r>
+        <w:rPr>
+          <w:rFonts w:ascii="Consolas" w:hAnsi="Consolas"/>
+          <w:sz w:val="20"/>
+        </w:rPr>
+        <w:t>… — RSP1B — 240513BE60</w:t>
+      </w:r>
+      <w:r>
+        <w:t>). The version number must match the bundle you installed; the radio portion confirms which device is being used.</w:t>
+      </w:r>
+    </w:p>
+    <w:p>
+      <w:pPr>
+        <w:pStyle w:val="ListBullet"/>
+      </w:pPr>
+      <w:r>
+        <w:t xml:space="preserve">Pull up </w:t>
+      </w:r>
+      <w:r>
+        <w:rPr>
+          <w:b/>
+        </w:rPr>
+        <w:t>Help → User Guide</w:t>
+      </w:r>
+      <w:r>
+        <w:t xml:space="preserve"> from the menu bar. The guide should open.</w:t>
+      </w:r>
+    </w:p>
+    <w:p>
+      <w:pPr>
+        <w:pStyle w:val="ListBullet"/>
+      </w:pPr>
+      <w:r>
+        <w:t xml:space="preserve">Pull up </w:t>
+      </w:r>
+      <w:r>
+        <w:rPr>
+          <w:b/>
+        </w:rPr>
+        <w:t>Help → About</w:t>
+      </w:r>
+      <w:r>
+        <w:t>. The author, version, license, and the path to the settings file should be readable.</w:t>
+      </w:r>
+    </w:p>
+    <w:p>
+      <w:pPr>
+        <w:pStyle w:val="ListBullet"/>
+      </w:pPr>
+      <w:r>
+        <w:t>The spectrum plot should show live data (not a flat line at −140 dB). If it’s flat, the radio isn’t streaming — see Troubleshooting §6.</w:t>
+      </w:r>
+    </w:p>
+    <w:p>
+      <w:pPr>
+        <w:pStyle w:val="ListBullet"/>
+      </w:pPr>
+      <w:r>
+        <w:t xml:space="preserve">Click the </w:t>
+      </w:r>
+      <w:r>
+        <w:rPr>
+          <w:b/>
+        </w:rPr>
+        <w:t>408 MHz</w:t>
+      </w:r>
+      <w:r>
+        <w:t xml:space="preserve"> preset under Pulsar Band. The center frequency should retune and the trace should redraw.</w:t>
+      </w:r>
+    </w:p>
+    <w:p>
+      <w:pPr>
+        <w:pStyle w:val="Heading3"/>
+      </w:pPr>
+      <w:bookmarkStart w:id="16" w:name="_Toc230433325"/>
+      <w:r>
+        <w:t>Recommended one-time VOLK tuning</w:t>
+      </w:r>
+      <w:bookmarkEnd w:id="16"/>
+    </w:p>
+    <w:p>
+      <w:r>
+        <w:t xml:space="preserve">GNU Radio’s number-crunching uses </w:t>
+      </w:r>
+      <w:r>
+        <w:rPr>
+          <w:b/>
+        </w:rPr>
+        <w:t>VOLK</w:t>
+      </w:r>
+      <w:r>
+        <w:t>, which can profile your CPU once and pick the fastest SIMD kernels (AVX2, NEON, etc.) for the rest of your machine’s life. Without the profile, you’ll see this warning every time you launch the app:</w:t>
+      </w:r>
+    </w:p>
+    <w:tbl>
+      <w:tblPr>
+        <w:tblW w:w="0" w:type="auto"/>
+        <w:tblLook w:val="04A0" w:firstRow="1" w:lastRow="0" w:firstColumn="1" w:lastColumn="0" w:noHBand="0" w:noVBand="1"/>
+      </w:tblPr>
+      <w:tblGrid>
+        <w:gridCol w:w="9634"/>
+      </w:tblGrid>
+      <w:tr>
+        <w:tc>
+          <w:tcPr>
+            <w:tcW w:w="9634" w:type="dxa"/>
+            <w:shd w:val="clear" w:color="auto" w:fill="F2F2F2"/>
+          </w:tcPr>
+          <w:p>
+            <w:r>
+              <w:rPr>
+                <w:rFonts w:ascii="Consolas" w:hAnsi="Consolas"/>
+                <w:sz w:val="18"/>
+              </w:rPr>
+              <w:t>[WARNING] SoapyVOLKConverters: no VOLK config file found.</w:t>
+            </w:r>
+          </w:p>
+          <w:p>
+            <w:r>
+              <w:rPr>
+                <w:rFonts w:ascii="Consolas" w:hAnsi="Consolas"/>
+                <w:sz w:val="18"/>
+              </w:rPr>
+              <w:t xml:space="preserve">          Run volk_profile for best performance.</w:t>
+            </w:r>
+          </w:p>
+        </w:tc>
+      </w:tr>
+    </w:tbl>
+    <w:p>
+      <w:r>
+        <w:t>To run it once and silence the warning:</w:t>
+      </w:r>
+    </w:p>
+    <w:tbl>
+      <w:tblPr>
+        <w:tblW w:w="0" w:type="auto"/>
+        <w:tblLook w:val="04A0" w:firstRow="1" w:lastRow="0" w:firstColumn="1" w:lastColumn="0" w:noHBand="0" w:noVBand="1"/>
+      </w:tblPr>
+      <w:tblGrid>
+        <w:gridCol w:w="9634"/>
+      </w:tblGrid>
+      <w:tr>
+        <w:tc>
+          <w:tcPr>
+            <w:tcW w:w="9634" w:type="dxa"/>
+            <w:shd w:val="clear" w:color="auto" w:fill="F2F2F2"/>
+          </w:tcPr>
+          <w:p>
+            <w:r>
+              <w:rPr>
+                <w:rFonts w:ascii="Consolas" w:hAnsi="Consolas"/>
+                <w:sz w:val="18"/>
+              </w:rPr>
+              <w:t>Windows: open the "Anaconda Prompt (Radioconda)" shortcut, then:</w:t>
+            </w:r>
+          </w:p>
+          <w:p>
+            <w:r>
+              <w:rPr>
+                <w:rFonts w:ascii="Consolas" w:hAnsi="Consolas"/>
+                <w:sz w:val="18"/>
+              </w:rPr>
+              <w:t xml:space="preserve">  volk_profile</w:t>
+            </w:r>
+          </w:p>
+          <w:p/>
+          <w:p>
+            <w:r>
+              <w:rPr>
+                <w:rFonts w:ascii="Consolas" w:hAnsi="Consolas"/>
+                <w:sz w:val="18"/>
+              </w:rPr>
+              <w:t>Linux / macOS: open a terminal with Radioconda on PATH, then:</w:t>
+            </w:r>
+          </w:p>
+          <w:p>
+            <w:r>
+              <w:rPr>
+                <w:rFonts w:ascii="Consolas" w:hAnsi="Consolas"/>
+                <w:sz w:val="18"/>
+              </w:rPr>
+              <w:t xml:space="preserve">  volk_profile</w:t>
+            </w:r>
+          </w:p>
+        </w:tc>
+      </w:tr>
+    </w:tbl>
+    <w:p>
+      <w:r>
+        <w:t xml:space="preserve">Takes about 30 seconds. Writes the chosen kernels to </w:t>
+      </w:r>
+      <w:r>
+        <w:rPr>
+          <w:rFonts w:ascii="Consolas" w:hAnsi="Consolas"/>
+          <w:sz w:val="20"/>
+        </w:rPr>
+        <w:t>%APPDATA%\.volk\volk_config</w:t>
+      </w:r>
+      <w:r>
+        <w:t xml:space="preserve"> on Windows or </w:t>
+      </w:r>
+      <w:r>
+        <w:rPr>
+          <w:rFonts w:ascii="Consolas" w:hAnsi="Consolas"/>
+          <w:sz w:val="20"/>
+        </w:rPr>
+        <w:t>~/.volk/volk_config</w:t>
+      </w:r>
+      <w:r>
+        <w:t xml:space="preserve"> on Linux/macOS. The warning disappears next time you launch the analyzer, and FFT throughput improves on machines with newer SIMD instruction sets.</w:t>
+      </w:r>
+    </w:p>
+    <w:p>
+      <w:pPr>
+        <w:pStyle w:val="Heading2"/>
+      </w:pPr>
+      <w:bookmarkStart w:id="17" w:name="_Toc230433326"/>
+      <w:r>
+        <w:t>5. Updating to a new version</w:t>
+      </w:r>
+      <w:bookmarkEnd w:id="17"/>
+    </w:p>
+    <w:p>
+      <w:pPr>
+        <w:pStyle w:val="Heading3"/>
+      </w:pPr>
+      <w:bookmarkStart w:id="18" w:name="_Toc230433327"/>
+      <w:r>
+        <w:t>Auto-update notifications</w:t>
+      </w:r>
+      <w:bookmarkEnd w:id="18"/>
+    </w:p>
+    <w:p>
+      <w:r>
+        <w:t xml:space="preserve">The program checks for new versions at launch (no more than once per 24 hours). If a newer version is available, a small dialog opens with the release notes, a button to </w:t>
+      </w:r>
+      <w:r>
+        <w:rPr>
+          <w:b/>
+        </w:rPr>
+        <w:t>Open Download Page</w:t>
+      </w:r>
+      <w:r>
+        <w:t xml:space="preserve"> in your browser, a </w:t>
+      </w:r>
+      <w:r>
+        <w:rPr>
+          <w:b/>
+        </w:rPr>
+        <w:t>Skip this version</w:t>
+      </w:r>
+      <w:r>
+        <w:t xml:space="preserve"> button (won’t nag again about that specific version), and a </w:t>
+      </w:r>
+      <w:r>
+        <w:rPr>
+          <w:b/>
+        </w:rPr>
+        <w:t>Remind me later</w:t>
+      </w:r>
+      <w:r>
+        <w:t xml:space="preserve"> button.</w:t>
+      </w:r>
+    </w:p>
+    <w:p>
+      <w:r>
+        <w:t xml:space="preserve">You can also trigger a check at any time via </w:t>
+      </w:r>
+      <w:r>
+        <w:rPr>
+          <w:b/>
+        </w:rPr>
+        <w:t>Help → Check for Updates…</w:t>
+      </w:r>
+      <w:r>
+        <w:t>.</w:t>
+      </w:r>
+    </w:p>
+    <w:p>
+      <w:r>
+        <w:t xml:space="preserve">The check is read-only — the program never auto-downloads or auto-installs anything. To disable the auto-check entirely, edit your </w:t>
+      </w:r>
+      <w:r>
+        <w:rPr>
+          <w:rFonts w:ascii="Consolas" w:hAnsi="Consolas"/>
+          <w:sz w:val="20"/>
+        </w:rPr>
+        <w:t>settings.ini</w:t>
+      </w:r>
+      <w:r>
+        <w:t xml:space="preserve"> and set </w:t>
+      </w:r>
+      <w:r>
+        <w:rPr>
+          <w:rFonts w:ascii="Consolas" w:hAnsi="Consolas"/>
+          <w:sz w:val="20"/>
+        </w:rPr>
+        <w:t>auto_check = false</w:t>
+      </w:r>
+      <w:r>
+        <w:t xml:space="preserve"> under </w:t>
+      </w:r>
+      <w:r>
+        <w:rPr>
+          <w:rFonts w:ascii="Consolas" w:hAnsi="Consolas"/>
+          <w:sz w:val="20"/>
+        </w:rPr>
+        <w:t>[updates]</w:t>
+      </w:r>
+      <w:r>
+        <w:t>.</w:t>
+      </w:r>
+    </w:p>
+    <w:p>
+      <w:pPr>
+        <w:pStyle w:val="Heading3"/>
+      </w:pPr>
+      <w:bookmarkStart w:id="19" w:name="_Toc230433328"/>
+      <w:r>
+        <w:lastRenderedPageBreak/>
+        <w:t>Performing the update</w:t>
+      </w:r>
+      <w:bookmarkEnd w:id="19"/>
+    </w:p>
+    <w:p>
+      <w:r>
+        <w:t>Each release is a self-contained zip. To update:</w:t>
+      </w:r>
+    </w:p>
+    <w:p>
+      <w:pPr>
+        <w:pStyle w:val="ListNumber"/>
+      </w:pPr>
+      <w:r>
+        <w:rPr>
+          <w:b/>
+        </w:rPr>
+        <w:t>Close</w:t>
+      </w:r>
+      <w:r>
+        <w:t xml:space="preserve"> the running app.</w:t>
+      </w:r>
+    </w:p>
+    <w:p>
+      <w:pPr>
+        <w:pStyle w:val="ListNumber"/>
+      </w:pPr>
+      <w:r>
+        <w:rPr>
+          <w:b/>
+        </w:rPr>
+        <w:t>Extract</w:t>
+      </w:r>
+      <w:r>
+        <w:t xml:space="preserve"> the new zip alongside the old one (or over the top of the old folder). The new folder is named with the new version (e.g. </w:t>
+      </w:r>
+      <w:r>
+        <w:rPr>
+          <w:rFonts w:ascii="Consolas" w:hAnsi="Consolas"/>
+          <w:sz w:val="20"/>
+        </w:rPr>
+        <w:t>dses-spectrum-analyzer-1.0.1</w:t>
+      </w:r>
+      <w:r>
+        <w:t>).</w:t>
+      </w:r>
+    </w:p>
+    <w:p>
+      <w:pPr>
+        <w:pStyle w:val="ListNumber"/>
+      </w:pPr>
+      <w:r>
+        <w:rPr>
+          <w:b/>
+        </w:rPr>
+        <w:t>Run</w:t>
+      </w:r>
+      <w:r>
+        <w:t xml:space="preserve"> </w:t>
+      </w:r>
+      <w:r>
+        <w:rPr>
+          <w:rFonts w:ascii="Consolas" w:hAnsi="Consolas"/>
+          <w:sz w:val="20"/>
+        </w:rPr>
+        <w:t>launcher.bat</w:t>
+      </w:r>
+      <w:r>
+        <w:t xml:space="preserve"> or </w:t>
+      </w:r>
+      <w:r>
+        <w:rPr>
+          <w:rFonts w:ascii="Consolas" w:hAnsi="Consolas"/>
+          <w:sz w:val="20"/>
+        </w:rPr>
         <w:t>launcher.sh</w:t>
       </w:r>
       <w:r>
@@ -4619,11 +5219,11 @@
       <w:pPr>
         <w:pStyle w:val="Heading3"/>
       </w:pPr>
-      <w:bookmarkStart w:id="19" w:name="_Toc229939657"/>
+      <w:bookmarkStart w:id="20" w:name="_Toc230433329"/>
       <w:r>
         <w:t>What is preserved across versions</w:t>
       </w:r>
-      <w:bookmarkEnd w:id="19"/>
+      <w:bookmarkEnd w:id="20"/>
     </w:p>
     <w:p>
       <w:r>
@@ -4697,7 +5297,7 @@
                 <w:rFonts w:ascii="Consolas" w:hAnsi="Consolas"/>
                 <w:sz w:val="20"/>
               </w:rPr>
-              <w:t>%APPDATA%\B210Analyzer\settings.ini</w:t>
+              <w:t>%APPDATA%\DSES_Analyzer\settings.ini</w:t>
             </w:r>
           </w:p>
         </w:tc>
@@ -4730,7 +5330,7 @@
                 <w:rFonts w:ascii="Consolas" w:hAnsi="Consolas"/>
                 <w:sz w:val="20"/>
               </w:rPr>
-              <w:t>~/Library/Application Support/B210Analyzer/settings.ini</w:t>
+              <w:t>~/Library/Application Support/DSES_Analyzer/settings.ini</w:t>
             </w:r>
           </w:p>
         </w:tc>
@@ -4763,7 +5363,7 @@
                 <w:rFonts w:ascii="Consolas" w:hAnsi="Consolas"/>
                 <w:sz w:val="20"/>
               </w:rPr>
-              <w:t>~/.local/share/B210Analyzer/settings.ini</w:t>
+              <w:t>~/.local/share/DSES_Analyzer/settings.ini</w:t>
             </w:r>
           </w:p>
         </w:tc>
@@ -4792,7 +5392,7 @@
           <w:rFonts w:ascii="Consolas" w:hAnsi="Consolas"/>
           <w:sz w:val="20"/>
         </w:rPr>
-        <w:t>HKEY_CURRENT_USER\Software\gnuradio\flowgraphs\b210_spectrum_analyzer</w:t>
+        <w:t>HKEY_CURRENT_USER\Software\gnuradio\flowgraphs\dses_spectrum_analyzer</w:t>
       </w:r>
       <w:r>
         <w:t xml:space="preserve"> on Windows; the equivalent QSettings storage on Mac/Linux). You don’t need to touch it.</w:t>
@@ -4802,18 +5402,15 @@
       <w:pPr>
         <w:pStyle w:val="Heading3"/>
       </w:pPr>
-      <w:bookmarkStart w:id="20" w:name="_Toc229939658"/>
+      <w:bookmarkStart w:id="21" w:name="_Toc230433330"/>
       <w:r>
         <w:t>Backing up your settings</w:t>
       </w:r>
-      <w:bookmarkEnd w:id="20"/>
-    </w:p>
-    <w:p>
-      <w:r>
-        <w:t xml:space="preserve">The settings file is </w:t>
-      </w:r>
-      <w:r>
-        <w:t>small (~1 KB). Copy it somewhere before a major upgrade if you want a quick rollback path:</w:t>
+      <w:bookmarkEnd w:id="21"/>
+    </w:p>
+    <w:p>
+      <w:r>
+        <w:t>The settings file is small (~1 KB). Copy it somewhere before a major upgrade if you want a quick rollback path:</w:t>
       </w:r>
     </w:p>
     <w:tbl>
@@ -4836,7 +5433,7 @@
                 <w:rFonts w:ascii="Consolas" w:hAnsi="Consolas"/>
                 <w:sz w:val="18"/>
               </w:rPr>
-              <w:t>Windows:  copy "%APPDATA%\B210Analyzer\settings.ini" "%USERPROFILE%\Desktop\settings.ini.bak"</w:t>
+              <w:t>Windows:  copy "%APPDATA%\DSES_Analyzer\settings.ini" "%USERPROFILE%\Desktop\settings.ini.bak"</w:t>
             </w:r>
           </w:p>
           <w:p>
@@ -4845,14 +5442,7 @@
                 <w:rFonts w:ascii="Consolas" w:hAnsi="Consolas"/>
                 <w:sz w:val="18"/>
               </w:rPr>
-              <w:t xml:space="preserve">macOS:    cp "~/Library/Application </w:t>
-            </w:r>
-            <w:r>
-              <w:rPr>
-                <w:rFonts w:ascii="Consolas" w:hAnsi="Consolas"/>
-                <w:sz w:val="18"/>
-              </w:rPr>
-              <w:t>Support/B210Analyzer/settings.ini" ~/Desktop/settings.ini.bak</w:t>
+              <w:t>macOS:    cp "~/Library/Application Support/DSES_Analyzer/settings.ini" ~/Desktop/settings.ini.bak</w:t>
             </w:r>
           </w:p>
           <w:p>
@@ -4861,8 +5451,7 @@
                 <w:rFonts w:ascii="Consolas" w:hAnsi="Consolas"/>
                 <w:sz w:val="18"/>
               </w:rPr>
-              <w:lastRenderedPageBreak/>
-              <w:t>Linux:    cp ~/.local/share/B210Analyzer/settings.ini ~/Desktop/settings.ini.bak</w:t>
+              <w:t>Linux:    cp ~/.local/share/DSES_Analyzer/settings.ini ~/Desktop/settings.ini.bak</w:t>
             </w:r>
           </w:p>
         </w:tc>
@@ -4872,22 +5461,21 @@
       <w:pPr>
         <w:pStyle w:val="Heading2"/>
       </w:pPr>
-      <w:bookmarkStart w:id="21" w:name="_Toc229939659"/>
-      <w:r>
-        <w:lastRenderedPageBreak/>
+      <w:bookmarkStart w:id="22" w:name="_Toc230433331"/>
+      <w:r>
         <w:t>6. Troubleshooting</w:t>
       </w:r>
-      <w:bookmarkEnd w:id="21"/>
+      <w:bookmarkEnd w:id="22"/>
     </w:p>
     <w:p>
       <w:pPr>
         <w:pStyle w:val="Heading3"/>
       </w:pPr>
-      <w:bookmarkStart w:id="22" w:name="_Toc229939660"/>
+      <w:bookmarkStart w:id="23" w:name="_Toc230433332"/>
       <w:r>
         <w:t>“Radioconda not found in standard locations”</w:t>
       </w:r>
-      <w:bookmarkEnd w:id="22"/>
+      <w:bookmarkEnd w:id="23"/>
     </w:p>
     <w:p>
       <w:r>
@@ -4944,11 +5532,12 @@
       <w:pPr>
         <w:pStyle w:val="Heading3"/>
       </w:pPr>
-      <w:bookmarkStart w:id="23" w:name="_Toc229939661"/>
-      <w:r>
+      <w:bookmarkStart w:id="24" w:name="_Toc230433333"/>
+      <w:r>
+        <w:lastRenderedPageBreak/>
         <w:t>“No UHD Devices Found”</w:t>
       </w:r>
-      <w:bookmarkEnd w:id="23"/>
+      <w:bookmarkEnd w:id="24"/>
     </w:p>
     <w:p>
       <w:r>
@@ -5042,11 +5631,11 @@
       <w:pPr>
         <w:pStyle w:val="Heading3"/>
       </w:pPr>
-      <w:bookmarkStart w:id="24" w:name="_Toc229939662"/>
+      <w:bookmarkStart w:id="25" w:name="_Toc230433334"/>
       <w:r>
         <w:t>Persistent “O” overflows at high sample rates</w:t>
       </w:r>
-      <w:bookmarkEnd w:id="24"/>
+      <w:bookmarkEnd w:id="25"/>
     </w:p>
     <w:p>
       <w:r>
@@ -5066,10 +5655,7 @@
         <w:pStyle w:val="ListBullet"/>
       </w:pPr>
       <w:r>
-        <w:t xml:space="preserve">Other USB devices on the same controller (especially other 5 Gbps </w:t>
-      </w:r>
-      <w:r>
-        <w:t>devices, or a heavily used external drive) compete for bandwidth. Move the B210 to its own controller if you have one.</w:t>
+        <w:t>Other USB devices on the same controller (especially other 5 Gbps devices, or a heavily used external drive) compete for bandwidth. Move the B210 to its own controller if you have one.</w:t>
       </w:r>
     </w:p>
     <w:p>
@@ -5089,11 +5675,11 @@
       <w:pPr>
         <w:pStyle w:val="Heading3"/>
       </w:pPr>
-      <w:bookmarkStart w:id="25" w:name="_Toc229939663"/>
+      <w:bookmarkStart w:id="26" w:name="_Toc230433335"/>
       <w:r>
         <w:t>Spectrum looks flat at −140 dB</w:t>
       </w:r>
-      <w:bookmarkEnd w:id="25"/>
+      <w:bookmarkEnd w:id="26"/>
     </w:p>
     <w:p>
       <w:r>
@@ -5113,7 +5699,6 @@
         <w:pStyle w:val="ListBullet"/>
       </w:pPr>
       <w:r>
-        <w:lastRenderedPageBreak/>
         <w:t>Antenna is disconnected (this app uses RX2 by default). Confirm a cable is on RX2.</w:t>
       </w:r>
     </w:p>
@@ -5129,11 +5714,11 @@
       <w:pPr>
         <w:pStyle w:val="Heading3"/>
       </w:pPr>
-      <w:bookmarkStart w:id="26" w:name="_Toc229939664"/>
+      <w:bookmarkStart w:id="27" w:name="_Toc230433336"/>
       <w:r>
         <w:t>macOS: “developer cannot be verified”</w:t>
       </w:r>
-      <w:bookmarkEnd w:id="26"/>
+      <w:bookmarkEnd w:id="27"/>
     </w:p>
     <w:tbl>
       <w:tblPr>
@@ -5155,7 +5740,7 @@
                 <w:rFonts w:ascii="Consolas" w:hAnsi="Consolas"/>
                 <w:sz w:val="18"/>
               </w:rPr>
-              <w:t>xattr -dr com.apple.quarantine /path/to/b210-spectrum-analyzer-1.0.0</w:t>
+              <w:t>xattr -dr com.apple.quarantine /path/to/dses-spectrum-analyzer-1.0.0</w:t>
             </w:r>
           </w:p>
         </w:tc>
@@ -5165,15 +5750,18 @@
       <w:pPr>
         <w:pStyle w:val="Heading3"/>
       </w:pPr>
-      <w:bookmarkStart w:id="27" w:name="_Toc229939665"/>
+      <w:bookmarkStart w:id="28" w:name="_Toc230433337"/>
       <w:r>
         <w:t>Settings won’t persist</w:t>
       </w:r>
-      <w:bookmarkEnd w:id="27"/>
-    </w:p>
-    <w:p>
-      <w:r>
-        <w:t>Settings should be saved automatically on every change and on app close. If they aren’t:</w:t>
+      <w:bookmarkEnd w:id="28"/>
+    </w:p>
+    <w:p>
+      <w:r>
+        <w:t xml:space="preserve">Settings should be saved automatically on every </w:t>
+      </w:r>
+      <w:r>
+        <w:t>change and on app close. If they aren’t:</w:t>
       </w:r>
     </w:p>
     <w:p>
@@ -5198,6 +5786,7 @@
         <w:pStyle w:val="ListBullet"/>
       </w:pPr>
       <w:r>
+        <w:lastRenderedPageBreak/>
         <w:t xml:space="preserve">If the directory’s parent doesn’t exist, the app will fail to create it silently. On first run after install, click </w:t>
       </w:r>
       <w:r>
@@ -5214,11 +5803,11 @@
       <w:pPr>
         <w:pStyle w:val="Heading2"/>
       </w:pPr>
-      <w:bookmarkStart w:id="28" w:name="_Toc229939666"/>
+      <w:bookmarkStart w:id="29" w:name="_Toc230433338"/>
       <w:r>
         <w:t>7. Appendix A — Settings file reference</w:t>
       </w:r>
-      <w:bookmarkEnd w:id="28"/>
+      <w:bookmarkEnd w:id="29"/>
     </w:p>
     <w:p>
       <w:r>
@@ -5402,10 +5991,7 @@
     </w:p>
     <w:p>
       <w:r>
-        <w:t xml:space="preserve">Missing keys are filled in from built-in defaults on next launch. The file is rewritten on close </w:t>
-      </w:r>
-      <w:r>
-        <w:t>with a header comment explaining what it is.</w:t>
+        <w:t>Missing keys are filled in from built-in defaults on next launch. The file is rewritten on close with a header comment explaining what it is.</w:t>
       </w:r>
     </w:p>
     <w:p>
@@ -5426,25 +6012,28 @@
       <w:pPr>
         <w:pStyle w:val="Heading2"/>
       </w:pPr>
-      <w:bookmarkStart w:id="29" w:name="_Toc229939667"/>
+      <w:bookmarkStart w:id="30" w:name="_Toc230433339"/>
       <w:r>
         <w:t>8. Appendix B — Device selection and SigMF playback</w:t>
       </w:r>
-      <w:bookmarkEnd w:id="29"/>
+      <w:bookmarkEnd w:id="30"/>
     </w:p>
     <w:p>
       <w:pPr>
         <w:pStyle w:val="Heading3"/>
       </w:pPr>
-      <w:bookmarkStart w:id="30" w:name="_Toc229939668"/>
+      <w:bookmarkStart w:id="31" w:name="_Toc230433340"/>
       <w:r>
         <w:t>Choosing among multiple radios</w:t>
       </w:r>
-      <w:bookmarkEnd w:id="30"/>
-    </w:p>
-    <w:p>
-      <w:r>
-        <w:t>The program enumerates everything supported at launch — Ettus B210s via UHD, plus any SoapySDR-recognised receiver (SDRPlay, RTL-SDR, HackRF, Airspy, Airspy HF+, BladeRF, LimeSDR, PlutoSDR). Behavior:</w:t>
+      <w:bookmarkEnd w:id="31"/>
+    </w:p>
+    <w:p>
+      <w:r>
+        <w:t xml:space="preserve">The program enumerates everything supported at launch — Ettus B210s via UHD, plus any SoapySDR-recognised receiver (SDRPlay, RTL-SDR, HackRF, Airspy, </w:t>
+      </w:r>
+      <w:r>
+        <w:t>Airspy HF+, BladeRF, LimeSDR, PlutoSDR). Behavior:</w:t>
       </w:r>
     </w:p>
     <w:p>
@@ -5469,7 +6058,6 @@
         <w:rPr>
           <w:b/>
         </w:rPr>
-        <w:lastRenderedPageBreak/>
         <w:t>No radio attached, but `sample.sigmf-data` + `sample.sigmf-meta` are present next to the program:</w:t>
       </w:r>
       <w:r>
@@ -5496,7 +6084,7 @@
         <w:t>One radio attached:</w:t>
       </w:r>
       <w:r>
-        <w:t xml:space="preserve"> the app opens it and remembers it in </w:t>
+        <w:t xml:space="preserve"> the app opens it silently and remembers it in </w:t>
       </w:r>
       <w:r>
         <w:rPr>
@@ -5517,61 +6105,10 @@
         <w:rPr>
           <w:b/>
         </w:rPr>
-        <w:t>One B210 attached alongside other types</w:t>
-      </w:r>
-      <w:r>
-        <w:t xml:space="preserve"> (e.g. B210 + RSPduo, B210 + RTL-SDR): the app silently opens the B210. The B210 is the primary supported device; other types are still reachable through the </w:t>
-      </w:r>
-      <w:r>
-        <w:rPr>
-          <w:b/>
-        </w:rPr>
-        <w:t>Device</w:t>
-      </w:r>
-      <w:r>
-        <w:t xml:space="preserve"> button on the sidebar.</w:t>
-      </w:r>
-    </w:p>
-    <w:p>
-      <w:pPr>
-        <w:pStyle w:val="ListBullet"/>
-      </w:pPr>
-      <w:r>
-        <w:rPr>
-          <w:b/>
-        </w:rPr>
-        <w:t>Multiple B210s attached:</w:t>
-      </w:r>
-      <w:r>
-        <w:t xml:space="preserve"> a picker shows the B210s; pick one. Other attached non-B210 radios are reachable through the </w:t>
-      </w:r>
-      <w:r>
-        <w:rPr>
-          <w:b/>
-        </w:rPr>
-        <w:t>Device</w:t>
-      </w:r>
-      <w:r>
-        <w:t xml:space="preserve"> button after launch.</w:t>
-      </w:r>
-    </w:p>
-    <w:p>
-      <w:pPr>
-        <w:pStyle w:val="ListBullet"/>
-      </w:pPr>
-      <w:r>
-        <w:rPr>
-          <w:b/>
-        </w:rPr>
-        <w:t>Multiple non-B210 radios attached (no B210)</w:t>
-      </w:r>
-      <w:r>
-        <w:t>: a picker shows them all (e.g. an RSPduo and an RTL-SDR); pick one. The app remembers your choice.</w:t>
-      </w:r>
-    </w:p>
-    <w:p>
-      <w:r>
-        <w:t>If the remembered device isn’t attached on a later launch, the picker re-opens.</w:t>
+        <w:t>Two or more radios attached</w:t>
+      </w:r>
+      <w:r>
+        <w:t xml:space="preserve"> (any mix of B210s and SoapySDR receivers): a picker always appears so you choose which one to use. Your previously-used radio is pre-selected, so pressing Enter reuses the same one. The app remembers your selection for next launch.</w:t>
       </w:r>
     </w:p>
     <w:p>
@@ -5592,14 +6129,15 @@
           <w:rFonts w:ascii="Consolas" w:hAnsi="Consolas"/>
           <w:sz w:val="20"/>
         </w:rPr>
-        <w:t>Device: &lt;product&gt; &lt;serial&gt;</w:t>
-      </w:r>
-      <w:r>
-        <w:t xml:space="preserve"> showing which radio the current session is using. Clicking it re-opens the picker; the new choice takes effect on the next launch.</w:t>
-      </w:r>
-    </w:p>
-    <w:p>
-      <w:r>
+        <w:t>Device: &lt;product&gt; — &lt;serial&gt;</w:t>
+      </w:r>
+      <w:r>
+        <w:t xml:space="preserve"> showing which radio the current session is using. Clicking it re-opens the picker; the new choice is saved and takes effect on the next launch.</w:t>
+      </w:r>
+    </w:p>
+    <w:p>
+      <w:r>
+        <w:lastRenderedPageBreak/>
         <w:t>The sample-rate combo and gain-slider range adapt automatically to whichever radio is open. SDRPlay caps at 10 MHz; RTL-SDR maxes around 3.2 MHz; HackRF goes to 20 MHz; the B210 to 25 MHz. Saved gain is clamped to the new device’s range if you switch to a narrower one.</w:t>
       </w:r>
     </w:p>
@@ -5662,15 +6200,18 @@
       <w:pPr>
         <w:pStyle w:val="Heading3"/>
       </w:pPr>
-      <w:bookmarkStart w:id="31" w:name="_Toc229939669"/>
+      <w:bookmarkStart w:id="32" w:name="_Toc230433341"/>
       <w:r>
         <w:t>SigMF playback mode (no-device fallback)</w:t>
       </w:r>
-      <w:bookmarkEnd w:id="31"/>
-    </w:p>
-    <w:p>
-      <w:r>
-        <w:t>The distribution bundle includes a short SigMF recording so that users without a B210 can still launch the program, see live spectrum, and try the controls.</w:t>
+      <w:bookmarkEnd w:id="32"/>
+    </w:p>
+    <w:p>
+      <w:r>
+        <w:t xml:space="preserve">The distribution bundle includes a short SigMF recording so that </w:t>
+      </w:r>
+      <w:r>
+        <w:t>users without any SDR attached can still launch the program, see live spectrum, and try the controls.</w:t>
       </w:r>
     </w:p>
     <w:p>
@@ -5703,7 +6244,7 @@
           <w:rFonts w:ascii="Consolas" w:hAnsi="Consolas"/>
           <w:sz w:val="20"/>
         </w:rPr>
-        <w:t>b210_spectrum_analyzer.py</w:t>
+        <w:t>dses_spectrum_analyzer.py</w:t>
       </w:r>
       <w:r>
         <w:t xml:space="preserve"> in your install folder.</w:t>
@@ -5714,10 +6255,7 @@
         <w:pStyle w:val="ListBullet"/>
       </w:pPr>
       <w:r>
-        <w:t xml:space="preserve">The file is read in a continuous loop, paced to match the original </w:t>
-      </w:r>
-      <w:r>
-        <w:t>capture’s sample rate.</w:t>
+        <w:t>The file is read in a continuous loop, paced to match the original capture’s sample rate.</w:t>
       </w:r>
     </w:p>
     <w:p>
@@ -5810,7 +6348,6 @@
         <w:pStyle w:val="ListBullet"/>
       </w:pPr>
       <w:r>
-        <w:lastRenderedPageBreak/>
         <w:t>All visualization controls (Spectrum panel, Waterfall panel, including the dark/light background toggle, FFT averaging, max/min hold, intensity range, colormap, etc.) work normally.</w:t>
       </w:r>
     </w:p>
@@ -5847,7 +6384,7 @@
         <w:pStyle w:val="ListBullet"/>
       </w:pPr>
       <w:r>
-        <w:t xml:space="preserve">To skip playback mode and force an error exit when no B210 is attached, delete or rename either of the two </w:t>
+        <w:t xml:space="preserve">To skip playback mode and force an error exit when no SDR is attached, delete or rename either of the two </w:t>
       </w:r>
       <w:r>
         <w:rPr>
@@ -5908,7 +6445,7 @@
         <w:color w:val="595959"/>
         <w:sz w:val="18"/>
       </w:rPr>
-      <w:t>17-May-26</w:t>
+      <w:t>23-May-26</w:t>
     </w:r>
     <w:r>
       <w:rPr>
@@ -6182,31 +6719,31 @@
       </w:rPr>
     </w:lvl>
   </w:abstractNum>
-  <w:num w:numId="1" w16cid:durableId="1557859923">
+  <w:num w:numId="1" w16cid:durableId="1188836227">
     <w:abstractNumId w:val="8"/>
   </w:num>
-  <w:num w:numId="2" w16cid:durableId="1349214416">
+  <w:num w:numId="2" w16cid:durableId="400257040">
     <w:abstractNumId w:val="6"/>
   </w:num>
-  <w:num w:numId="3" w16cid:durableId="921644797">
+  <w:num w:numId="3" w16cid:durableId="394360041">
     <w:abstractNumId w:val="5"/>
   </w:num>
-  <w:num w:numId="4" w16cid:durableId="1608391632">
+  <w:num w:numId="4" w16cid:durableId="1655910633">
     <w:abstractNumId w:val="4"/>
   </w:num>
-  <w:num w:numId="5" w16cid:durableId="33046709">
+  <w:num w:numId="5" w16cid:durableId="251820447">
     <w:abstractNumId w:val="7"/>
   </w:num>
-  <w:num w:numId="6" w16cid:durableId="2072576303">
+  <w:num w:numId="6" w16cid:durableId="806094822">
     <w:abstractNumId w:val="3"/>
   </w:num>
-  <w:num w:numId="7" w16cid:durableId="781874539">
+  <w:num w:numId="7" w16cid:durableId="1499878705">
     <w:abstractNumId w:val="2"/>
   </w:num>
-  <w:num w:numId="8" w16cid:durableId="1871918337">
+  <w:num w:numId="8" w16cid:durableId="1241252040">
     <w:abstractNumId w:val="1"/>
   </w:num>
-  <w:num w:numId="9" w16cid:durableId="1897812474">
+  <w:num w:numId="9" w16cid:durableId="1779907954">
     <w:abstractNumId w:val="0"/>
   </w:num>
 </w:numbering>
@@ -17601,7 +18138,7 @@
     <w:autoRedefine/>
     <w:uiPriority w:val="39"/>
     <w:unhideWhenUsed/>
-    <w:rsid w:val="00465FDC"/>
+    <w:rsid w:val="00332F5A"/>
     <w:pPr>
       <w:spacing w:after="100"/>
     </w:pPr>
@@ -17613,7 +18150,7 @@
     <w:autoRedefine/>
     <w:uiPriority w:val="39"/>
     <w:unhideWhenUsed/>
-    <w:rsid w:val="00465FDC"/>
+    <w:rsid w:val="00332F5A"/>
     <w:pPr>
       <w:spacing w:after="100"/>
       <w:ind w:left="220"/>
@@ -17626,7 +18163,7 @@
     <w:autoRedefine/>
     <w:uiPriority w:val="39"/>
     <w:unhideWhenUsed/>
-    <w:rsid w:val="00465FDC"/>
+    <w:rsid w:val="00332F5A"/>
     <w:pPr>
       <w:spacing w:after="100"/>
       <w:ind w:left="440"/>
@@ -17637,7 +18174,7 @@
     <w:basedOn w:val="DefaultParagraphFont"/>
     <w:uiPriority w:val="99"/>
     <w:unhideWhenUsed/>
-    <w:rsid w:val="00465FDC"/>
+    <w:rsid w:val="00332F5A"/>
     <w:rPr>
       <w:color w:val="0000FF" w:themeColor="hyperlink"/>
       <w:u w:val="single"/>

</xml_diff>

<commit_message>
Rebuild install guide PDF/DOCX with Operating Guide appendix
Regenerated from Installing.md after adding section 9 (Appendix C -
Operating Guide). PDF grew to ~464 KB with the mirrored in-app Help text.
</commit_message>
<xml_diff>
--- a/DSES_RFI_Spectrum_Analyzer_Installation.docx
+++ b/DSES_RFI_Spectrum_Analyzer_Installation.docx
@@ -41,7 +41,7 @@
           <w:noProof/>
         </w:rPr>
         <w:drawing>
-          <wp:inline distT="0" distB="0" distL="0" distR="0" wp14:anchorId="681B6E9B" wp14:editId="7F6F1815">
+          <wp:inline distT="0" distB="0" distL="0" distR="0" wp14:anchorId="1E570C06" wp14:editId="0C74FF8D">
             <wp:extent cx="1371600" cy="1371600"/>
             <wp:effectExtent l="0" t="0" r="0" b="0"/>
             <wp:docPr id="1" name="Picture 1"/>
@@ -138,7 +138,7 @@
         <w:pStyle w:val="Heading1"/>
         <w:shd w:val="clear" w:color="auto" w:fill="156082"/>
       </w:pPr>
-      <w:bookmarkStart w:id="0" w:name="_Toc230433309"/>
+      <w:bookmarkStart w:id="0" w:name="_Toc230435092"/>
       <w:r>
         <w:lastRenderedPageBreak/>
         <w:t>Contents</w:t>
@@ -169,7 +169,7 @@
       <w:r>
         <w:fldChar w:fldCharType="separate"/>
       </w:r>
-      <w:hyperlink w:anchor="_Toc230433309" w:history="1">
+      <w:hyperlink w:anchor="_Toc230435092" w:history="1">
         <w:r>
           <w:rPr>
             <w:rStyle w:val="Hyperlink"/>
@@ -196,7 +196,7 @@
             <w:noProof/>
             <w:webHidden/>
           </w:rPr>
-          <w:instrText xml:space="preserve"> PAGEREF _Toc230433309 \h </w:instrText>
+          <w:instrText xml:space="preserve"> PAGEREF _Toc230435092 \h </w:instrText>
         </w:r>
         <w:r>
           <w:rPr>
@@ -242,7 +242,7 @@
           <w14:ligatures w14:val="standardContextual"/>
         </w:rPr>
       </w:pPr>
-      <w:hyperlink w:anchor="_Toc230433310" w:history="1">
+      <w:hyperlink w:anchor="_Toc230435093" w:history="1">
         <w:r>
           <w:rPr>
             <w:rStyle w:val="Hyperlink"/>
@@ -269,7 +269,7 @@
             <w:noProof/>
             <w:webHidden/>
           </w:rPr>
-          <w:instrText xml:space="preserve"> PAGEREF _Toc230433310 \h </w:instrText>
+          <w:instrText xml:space="preserve"> PAGEREF _Toc230435093 \h </w:instrText>
         </w:r>
         <w:r>
           <w:rPr>
@@ -315,7 +315,7 @@
           <w14:ligatures w14:val="standardContextual"/>
         </w:rPr>
       </w:pPr>
-      <w:hyperlink w:anchor="_Toc230433311" w:history="1">
+      <w:hyperlink w:anchor="_Toc230435094" w:history="1">
         <w:r>
           <w:rPr>
             <w:rStyle w:val="Hyperlink"/>
@@ -342,7 +342,7 @@
             <w:noProof/>
             <w:webHidden/>
           </w:rPr>
-          <w:instrText xml:space="preserve"> PAGEREF _Toc230433311 \h </w:instrText>
+          <w:instrText xml:space="preserve"> PAGEREF _Toc230435094 \h </w:instrText>
         </w:r>
         <w:r>
           <w:rPr>
@@ -388,7 +388,7 @@
           <w14:ligatures w14:val="standardContextual"/>
         </w:rPr>
       </w:pPr>
-      <w:hyperlink w:anchor="_Toc230433312" w:history="1">
+      <w:hyperlink w:anchor="_Toc230435095" w:history="1">
         <w:r>
           <w:rPr>
             <w:rStyle w:val="Hyperlink"/>
@@ -415,7 +415,7 @@
             <w:noProof/>
             <w:webHidden/>
           </w:rPr>
-          <w:instrText xml:space="preserve"> PAGEREF _Toc230433312 \h </w:instrText>
+          <w:instrText xml:space="preserve"> PAGEREF _Toc230435095 \h </w:instrText>
         </w:r>
         <w:r>
           <w:rPr>
@@ -461,7 +461,7 @@
           <w14:ligatures w14:val="standardContextual"/>
         </w:rPr>
       </w:pPr>
-      <w:hyperlink w:anchor="_Toc230433313" w:history="1">
+      <w:hyperlink w:anchor="_Toc230435096" w:history="1">
         <w:r>
           <w:rPr>
             <w:rStyle w:val="Hyperlink"/>
@@ -488,7 +488,7 @@
             <w:noProof/>
             <w:webHidden/>
           </w:rPr>
-          <w:instrText xml:space="preserve"> PAGEREF _Toc230433313 \h </w:instrText>
+          <w:instrText xml:space="preserve"> PAGEREF _Toc230435096 \h </w:instrText>
         </w:r>
         <w:r>
           <w:rPr>
@@ -534,7 +534,7 @@
           <w14:ligatures w14:val="standardContextual"/>
         </w:rPr>
       </w:pPr>
-      <w:hyperlink w:anchor="_Toc230433314" w:history="1">
+      <w:hyperlink w:anchor="_Toc230435097" w:history="1">
         <w:r>
           <w:rPr>
             <w:rStyle w:val="Hyperlink"/>
@@ -561,7 +561,7 @@
             <w:noProof/>
             <w:webHidden/>
           </w:rPr>
-          <w:instrText xml:space="preserve"> PAGEREF _Toc230433314 \h </w:instrText>
+          <w:instrText xml:space="preserve"> PAGEREF _Toc230435097 \h </w:instrText>
         </w:r>
         <w:r>
           <w:rPr>
@@ -607,7 +607,7 @@
           <w14:ligatures w14:val="standardContextual"/>
         </w:rPr>
       </w:pPr>
-      <w:hyperlink w:anchor="_Toc230433315" w:history="1">
+      <w:hyperlink w:anchor="_Toc230435098" w:history="1">
         <w:r>
           <w:rPr>
             <w:rStyle w:val="Hyperlink"/>
@@ -634,7 +634,7 @@
             <w:noProof/>
             <w:webHidden/>
           </w:rPr>
-          <w:instrText xml:space="preserve"> PAGEREF _Toc230433315 \h </w:instrText>
+          <w:instrText xml:space="preserve"> PAGEREF _Toc230435098 \h </w:instrText>
         </w:r>
         <w:r>
           <w:rPr>
@@ -680,7 +680,7 @@
           <w14:ligatures w14:val="standardContextual"/>
         </w:rPr>
       </w:pPr>
-      <w:hyperlink w:anchor="_Toc230433316" w:history="1">
+      <w:hyperlink w:anchor="_Toc230435099" w:history="1">
         <w:r>
           <w:rPr>
             <w:rStyle w:val="Hyperlink"/>
@@ -707,7 +707,7 @@
             <w:noProof/>
             <w:webHidden/>
           </w:rPr>
-          <w:instrText xml:space="preserve"> PAGEREF _Toc230433316 \h </w:instrText>
+          <w:instrText xml:space="preserve"> PAGEREF _Toc230435099 \h </w:instrText>
         </w:r>
         <w:r>
           <w:rPr>
@@ -753,7 +753,7 @@
           <w14:ligatures w14:val="standardContextual"/>
         </w:rPr>
       </w:pPr>
-      <w:hyperlink w:anchor="_Toc230433317" w:history="1">
+      <w:hyperlink w:anchor="_Toc230435100" w:history="1">
         <w:r>
           <w:rPr>
             <w:rStyle w:val="Hyperlink"/>
@@ -780,7 +780,7 @@
             <w:noProof/>
             <w:webHidden/>
           </w:rPr>
-          <w:instrText xml:space="preserve"> PAGEREF _Toc230433317 \h </w:instrText>
+          <w:instrText xml:space="preserve"> PAGEREF _Toc230435100 \h </w:instrText>
         </w:r>
         <w:r>
           <w:rPr>
@@ -826,7 +826,7 @@
           <w14:ligatures w14:val="standardContextual"/>
         </w:rPr>
       </w:pPr>
-      <w:hyperlink w:anchor="_Toc230433318" w:history="1">
+      <w:hyperlink w:anchor="_Toc230435101" w:history="1">
         <w:r>
           <w:rPr>
             <w:rStyle w:val="Hyperlink"/>
@@ -853,7 +853,7 @@
             <w:noProof/>
             <w:webHidden/>
           </w:rPr>
-          <w:instrText xml:space="preserve"> PAGEREF _Toc230433318 \h </w:instrText>
+          <w:instrText xml:space="preserve"> PAGEREF _Toc230435101 \h </w:instrText>
         </w:r>
         <w:r>
           <w:rPr>
@@ -899,7 +899,7 @@
           <w14:ligatures w14:val="standardContextual"/>
         </w:rPr>
       </w:pPr>
-      <w:hyperlink w:anchor="_Toc230433319" w:history="1">
+      <w:hyperlink w:anchor="_Toc230435102" w:history="1">
         <w:r>
           <w:rPr>
             <w:rStyle w:val="Hyperlink"/>
@@ -926,7 +926,7 @@
             <w:noProof/>
             <w:webHidden/>
           </w:rPr>
-          <w:instrText xml:space="preserve"> PAGEREF _Toc230433319 \h </w:instrText>
+          <w:instrText xml:space="preserve"> PAGEREF _Toc230435102 \h </w:instrText>
         </w:r>
         <w:r>
           <w:rPr>
@@ -972,7 +972,7 @@
           <w14:ligatures w14:val="standardContextual"/>
         </w:rPr>
       </w:pPr>
-      <w:hyperlink w:anchor="_Toc230433320" w:history="1">
+      <w:hyperlink w:anchor="_Toc230435103" w:history="1">
         <w:r>
           <w:rPr>
             <w:rStyle w:val="Hyperlink"/>
@@ -999,7 +999,7 @@
             <w:noProof/>
             <w:webHidden/>
           </w:rPr>
-          <w:instrText xml:space="preserve"> PAGEREF _Toc230433320 \h </w:instrText>
+          <w:instrText xml:space="preserve"> PAGEREF _Toc230435103 \h </w:instrText>
         </w:r>
         <w:r>
           <w:rPr>
@@ -1045,7 +1045,7 @@
           <w14:ligatures w14:val="standardContextual"/>
         </w:rPr>
       </w:pPr>
-      <w:hyperlink w:anchor="_Toc230433321" w:history="1">
+      <w:hyperlink w:anchor="_Toc230435104" w:history="1">
         <w:r>
           <w:rPr>
             <w:rStyle w:val="Hyperlink"/>
@@ -1072,7 +1072,7 @@
             <w:noProof/>
             <w:webHidden/>
           </w:rPr>
-          <w:instrText xml:space="preserve"> PAGEREF _Toc230433321 \h </w:instrText>
+          <w:instrText xml:space="preserve"> PAGEREF _Toc230435104 \h </w:instrText>
         </w:r>
         <w:r>
           <w:rPr>
@@ -1118,7 +1118,7 @@
           <w14:ligatures w14:val="standardContextual"/>
         </w:rPr>
       </w:pPr>
-      <w:hyperlink w:anchor="_Toc230433322" w:history="1">
+      <w:hyperlink w:anchor="_Toc230435105" w:history="1">
         <w:r>
           <w:rPr>
             <w:rStyle w:val="Hyperlink"/>
@@ -1145,7 +1145,7 @@
             <w:noProof/>
             <w:webHidden/>
           </w:rPr>
-          <w:instrText xml:space="preserve"> PAGEREF _Toc230433322 \h </w:instrText>
+          <w:instrText xml:space="preserve"> PAGEREF _Toc230435105 \h </w:instrText>
         </w:r>
         <w:r>
           <w:rPr>
@@ -1191,7 +1191,7 @@
           <w14:ligatures w14:val="standardContextual"/>
         </w:rPr>
       </w:pPr>
-      <w:hyperlink w:anchor="_Toc230433323" w:history="1">
+      <w:hyperlink w:anchor="_Toc230435106" w:history="1">
         <w:r>
           <w:rPr>
             <w:rStyle w:val="Hyperlink"/>
@@ -1218,7 +1218,7 @@
             <w:noProof/>
             <w:webHidden/>
           </w:rPr>
-          <w:instrText xml:space="preserve"> PAGEREF _Toc230433323 \h </w:instrText>
+          <w:instrText xml:space="preserve"> PAGEREF _Toc230435106 \h </w:instrText>
         </w:r>
         <w:r>
           <w:rPr>
@@ -1264,7 +1264,7 @@
           <w14:ligatures w14:val="standardContextual"/>
         </w:rPr>
       </w:pPr>
-      <w:hyperlink w:anchor="_Toc230433324" w:history="1">
+      <w:hyperlink w:anchor="_Toc230435107" w:history="1">
         <w:r>
           <w:rPr>
             <w:rStyle w:val="Hyperlink"/>
@@ -1291,7 +1291,7 @@
             <w:noProof/>
             <w:webHidden/>
           </w:rPr>
-          <w:instrText xml:space="preserve"> PAGEREF _Toc230433324 \h </w:instrText>
+          <w:instrText xml:space="preserve"> PAGEREF _Toc230435107 \h </w:instrText>
         </w:r>
         <w:r>
           <w:rPr>
@@ -1337,7 +1337,7 @@
           <w14:ligatures w14:val="standardContextual"/>
         </w:rPr>
       </w:pPr>
-      <w:hyperlink w:anchor="_Toc230433325" w:history="1">
+      <w:hyperlink w:anchor="_Toc230435108" w:history="1">
         <w:r>
           <w:rPr>
             <w:rStyle w:val="Hyperlink"/>
@@ -1364,7 +1364,7 @@
             <w:noProof/>
             <w:webHidden/>
           </w:rPr>
-          <w:instrText xml:space="preserve"> PAGEREF _Toc230433325 \h </w:instrText>
+          <w:instrText xml:space="preserve"> PAGEREF _Toc230435108 \h </w:instrText>
         </w:r>
         <w:r>
           <w:rPr>
@@ -1410,7 +1410,7 @@
           <w14:ligatures w14:val="standardContextual"/>
         </w:rPr>
       </w:pPr>
-      <w:hyperlink w:anchor="_Toc230433326" w:history="1">
+      <w:hyperlink w:anchor="_Toc230435109" w:history="1">
         <w:r>
           <w:rPr>
             <w:rStyle w:val="Hyperlink"/>
@@ -1437,7 +1437,7 @@
             <w:noProof/>
             <w:webHidden/>
           </w:rPr>
-          <w:instrText xml:space="preserve"> PAGEREF _Toc230433326 \h </w:instrText>
+          <w:instrText xml:space="preserve"> PAGEREF _Toc230435109 \h </w:instrText>
         </w:r>
         <w:r>
           <w:rPr>
@@ -1483,7 +1483,7 @@
           <w14:ligatures w14:val="standardContextual"/>
         </w:rPr>
       </w:pPr>
-      <w:hyperlink w:anchor="_Toc230433327" w:history="1">
+      <w:hyperlink w:anchor="_Toc230435110" w:history="1">
         <w:r>
           <w:rPr>
             <w:rStyle w:val="Hyperlink"/>
@@ -1510,7 +1510,7 @@
             <w:noProof/>
             <w:webHidden/>
           </w:rPr>
-          <w:instrText xml:space="preserve"> PAGEREF _Toc230433327 \h </w:instrText>
+          <w:instrText xml:space="preserve"> PAGEREF _Toc230435110 \h </w:instrText>
         </w:r>
         <w:r>
           <w:rPr>
@@ -1556,7 +1556,7 @@
           <w14:ligatures w14:val="standardContextual"/>
         </w:rPr>
       </w:pPr>
-      <w:hyperlink w:anchor="_Toc230433328" w:history="1">
+      <w:hyperlink w:anchor="_Toc230435111" w:history="1">
         <w:r>
           <w:rPr>
             <w:rStyle w:val="Hyperlink"/>
@@ -1583,7 +1583,7 @@
             <w:noProof/>
             <w:webHidden/>
           </w:rPr>
-          <w:instrText xml:space="preserve"> PAGEREF _Toc230433328 \h </w:instrText>
+          <w:instrText xml:space="preserve"> PAGEREF _Toc230435111 \h </w:instrText>
         </w:r>
         <w:r>
           <w:rPr>
@@ -1629,7 +1629,7 @@
           <w14:ligatures w14:val="standardContextual"/>
         </w:rPr>
       </w:pPr>
-      <w:hyperlink w:anchor="_Toc230433329" w:history="1">
+      <w:hyperlink w:anchor="_Toc230435112" w:history="1">
         <w:r>
           <w:rPr>
             <w:rStyle w:val="Hyperlink"/>
@@ -1656,7 +1656,7 @@
             <w:noProof/>
             <w:webHidden/>
           </w:rPr>
-          <w:instrText xml:space="preserve"> PAGEREF _Toc230433329 \h </w:instrText>
+          <w:instrText xml:space="preserve"> PAGEREF _Toc230435112 \h </w:instrText>
         </w:r>
         <w:r>
           <w:rPr>
@@ -1702,7 +1702,7 @@
           <w14:ligatures w14:val="standardContextual"/>
         </w:rPr>
       </w:pPr>
-      <w:hyperlink w:anchor="_Toc230433330" w:history="1">
+      <w:hyperlink w:anchor="_Toc230435113" w:history="1">
         <w:r>
           <w:rPr>
             <w:rStyle w:val="Hyperlink"/>
@@ -1729,7 +1729,7 @@
             <w:noProof/>
             <w:webHidden/>
           </w:rPr>
-          <w:instrText xml:space="preserve"> PAGEREF _Toc230433330 \h </w:instrText>
+          <w:instrText xml:space="preserve"> PAGEREF _Toc230435113 \h </w:instrText>
         </w:r>
         <w:r>
           <w:rPr>
@@ -1775,7 +1775,7 @@
           <w14:ligatures w14:val="standardContextual"/>
         </w:rPr>
       </w:pPr>
-      <w:hyperlink w:anchor="_Toc230433331" w:history="1">
+      <w:hyperlink w:anchor="_Toc230435114" w:history="1">
         <w:r>
           <w:rPr>
             <w:rStyle w:val="Hyperlink"/>
@@ -1802,7 +1802,7 @@
             <w:noProof/>
             <w:webHidden/>
           </w:rPr>
-          <w:instrText xml:space="preserve"> PAGEREF _Toc230433331 \h </w:instrText>
+          <w:instrText xml:space="preserve"> PAGEREF _Toc230435114 \h </w:instrText>
         </w:r>
         <w:r>
           <w:rPr>
@@ -1848,7 +1848,7 @@
           <w14:ligatures w14:val="standardContextual"/>
         </w:rPr>
       </w:pPr>
-      <w:hyperlink w:anchor="_Toc230433332" w:history="1">
+      <w:hyperlink w:anchor="_Toc230435115" w:history="1">
         <w:r>
           <w:rPr>
             <w:rStyle w:val="Hyperlink"/>
@@ -1875,7 +1875,7 @@
             <w:noProof/>
             <w:webHidden/>
           </w:rPr>
-          <w:instrText xml:space="preserve"> PAGEREF _Toc230433332 \h </w:instrText>
+          <w:instrText xml:space="preserve"> PAGEREF _Toc230435115 \h </w:instrText>
         </w:r>
         <w:r>
           <w:rPr>
@@ -1921,7 +1921,7 @@
           <w14:ligatures w14:val="standardContextual"/>
         </w:rPr>
       </w:pPr>
-      <w:hyperlink w:anchor="_Toc230433333" w:history="1">
+      <w:hyperlink w:anchor="_Toc230435116" w:history="1">
         <w:r>
           <w:rPr>
             <w:rStyle w:val="Hyperlink"/>
@@ -1948,7 +1948,7 @@
             <w:noProof/>
             <w:webHidden/>
           </w:rPr>
-          <w:instrText xml:space="preserve"> PAGEREF _Toc230433333 \h </w:instrText>
+          <w:instrText xml:space="preserve"> PAGEREF _Toc230435116 \h </w:instrText>
         </w:r>
         <w:r>
           <w:rPr>
@@ -1994,7 +1994,7 @@
           <w14:ligatures w14:val="standardContextual"/>
         </w:rPr>
       </w:pPr>
-      <w:hyperlink w:anchor="_Toc230433334" w:history="1">
+      <w:hyperlink w:anchor="_Toc230435117" w:history="1">
         <w:r>
           <w:rPr>
             <w:rStyle w:val="Hyperlink"/>
@@ -2021,7 +2021,7 @@
             <w:noProof/>
             <w:webHidden/>
           </w:rPr>
-          <w:instrText xml:space="preserve"> PAGEREF _Toc230433334 \h </w:instrText>
+          <w:instrText xml:space="preserve"> PAGEREF _Toc230435117 \h </w:instrText>
         </w:r>
         <w:r>
           <w:rPr>
@@ -2067,7 +2067,7 @@
           <w14:ligatures w14:val="standardContextual"/>
         </w:rPr>
       </w:pPr>
-      <w:hyperlink w:anchor="_Toc230433335" w:history="1">
+      <w:hyperlink w:anchor="_Toc230435118" w:history="1">
         <w:r>
           <w:rPr>
             <w:rStyle w:val="Hyperlink"/>
@@ -2094,7 +2094,7 @@
             <w:noProof/>
             <w:webHidden/>
           </w:rPr>
-          <w:instrText xml:space="preserve"> PAGEREF _Toc230433335 \h </w:instrText>
+          <w:instrText xml:space="preserve"> PAGEREF _Toc230435118 \h </w:instrText>
         </w:r>
         <w:r>
           <w:rPr>
@@ -2140,7 +2140,7 @@
           <w14:ligatures w14:val="standardContextual"/>
         </w:rPr>
       </w:pPr>
-      <w:hyperlink w:anchor="_Toc230433336" w:history="1">
+      <w:hyperlink w:anchor="_Toc230435119" w:history="1">
         <w:r>
           <w:rPr>
             <w:rStyle w:val="Hyperlink"/>
@@ -2167,7 +2167,7 @@
             <w:noProof/>
             <w:webHidden/>
           </w:rPr>
-          <w:instrText xml:space="preserve"> PAGEREF _Toc230433336 \h </w:instrText>
+          <w:instrText xml:space="preserve"> PAGEREF _Toc230435119 \h </w:instrText>
         </w:r>
         <w:r>
           <w:rPr>
@@ -2213,7 +2213,7 @@
           <w14:ligatures w14:val="standardContextual"/>
         </w:rPr>
       </w:pPr>
-      <w:hyperlink w:anchor="_Toc230433337" w:history="1">
+      <w:hyperlink w:anchor="_Toc230435120" w:history="1">
         <w:r>
           <w:rPr>
             <w:rStyle w:val="Hyperlink"/>
@@ -2240,7 +2240,7 @@
             <w:noProof/>
             <w:webHidden/>
           </w:rPr>
-          <w:instrText xml:space="preserve"> PAGEREF _Toc230433337 \h </w:instrText>
+          <w:instrText xml:space="preserve"> PAGEREF _Toc230435120 \h </w:instrText>
         </w:r>
         <w:r>
           <w:rPr>
@@ -2286,7 +2286,7 @@
           <w14:ligatures w14:val="standardContextual"/>
         </w:rPr>
       </w:pPr>
-      <w:hyperlink w:anchor="_Toc230433338" w:history="1">
+      <w:hyperlink w:anchor="_Toc230435121" w:history="1">
         <w:r>
           <w:rPr>
             <w:rStyle w:val="Hyperlink"/>
@@ -2313,7 +2313,7 @@
             <w:noProof/>
             <w:webHidden/>
           </w:rPr>
-          <w:instrText xml:space="preserve"> PAGEREF _Toc230433338 \h </w:instrText>
+          <w:instrText xml:space="preserve"> PAGEREF _Toc230435121 \h </w:instrText>
         </w:r>
         <w:r>
           <w:rPr>
@@ -2359,7 +2359,7 @@
           <w14:ligatures w14:val="standardContextual"/>
         </w:rPr>
       </w:pPr>
-      <w:hyperlink w:anchor="_Toc230433339" w:history="1">
+      <w:hyperlink w:anchor="_Toc230435122" w:history="1">
         <w:r>
           <w:rPr>
             <w:rStyle w:val="Hyperlink"/>
@@ -2386,7 +2386,7 @@
             <w:noProof/>
             <w:webHidden/>
           </w:rPr>
-          <w:instrText xml:space="preserve"> PAGEREF _Toc230433339 \h </w:instrText>
+          <w:instrText xml:space="preserve"> PAGEREF _Toc230435122 \h </w:instrText>
         </w:r>
         <w:r>
           <w:rPr>
@@ -2432,7 +2432,7 @@
           <w14:ligatures w14:val="standardContextual"/>
         </w:rPr>
       </w:pPr>
-      <w:hyperlink w:anchor="_Toc230433340" w:history="1">
+      <w:hyperlink w:anchor="_Toc230435123" w:history="1">
         <w:r>
           <w:rPr>
             <w:rStyle w:val="Hyperlink"/>
@@ -2459,7 +2459,7 @@
             <w:noProof/>
             <w:webHidden/>
           </w:rPr>
-          <w:instrText xml:space="preserve"> PAGEREF _Toc230433340 \h </w:instrText>
+          <w:instrText xml:space="preserve"> PAGEREF _Toc230435123 \h </w:instrText>
         </w:r>
         <w:r>
           <w:rPr>
@@ -2505,7 +2505,7 @@
           <w14:ligatures w14:val="standardContextual"/>
         </w:rPr>
       </w:pPr>
-      <w:hyperlink w:anchor="_Toc230433341" w:history="1">
+      <w:hyperlink w:anchor="_Toc230435124" w:history="1">
         <w:r>
           <w:rPr>
             <w:rStyle w:val="Hyperlink"/>
@@ -2532,7 +2532,7 @@
             <w:noProof/>
             <w:webHidden/>
           </w:rPr>
-          <w:instrText xml:space="preserve"> PAGEREF _Toc230433341 \h </w:instrText>
+          <w:instrText xml:space="preserve"> PAGEREF _Toc230435124 \h </w:instrText>
         </w:r>
         <w:r>
           <w:rPr>
@@ -2553,6 +2553,663 @@
             <w:webHidden/>
           </w:rPr>
           <w:t>14</w:t>
+        </w:r>
+        <w:r>
+          <w:rPr>
+            <w:noProof/>
+            <w:webHidden/>
+          </w:rPr>
+          <w:fldChar w:fldCharType="end"/>
+        </w:r>
+      </w:hyperlink>
+    </w:p>
+    <w:p>
+      <w:pPr>
+        <w:pStyle w:val="TOC2"/>
+        <w:tabs>
+          <w:tab w:val="right" w:leader="dot" w:pos="9624"/>
+        </w:tabs>
+        <w:rPr>
+          <w:rFonts w:asciiTheme="minorHAnsi" w:hAnsiTheme="minorHAnsi"/>
+          <w:noProof/>
+          <w:kern w:val="2"/>
+          <w:sz w:val="24"/>
+          <w:szCs w:val="24"/>
+          <w14:ligatures w14:val="standardContextual"/>
+        </w:rPr>
+      </w:pPr>
+      <w:hyperlink w:anchor="_Toc230435125" w:history="1">
+        <w:r>
+          <w:rPr>
+            <w:rStyle w:val="Hyperlink"/>
+            <w:noProof/>
+          </w:rPr>
+          <w:t>9. Appendix C — Operating Guide</w:t>
+        </w:r>
+        <w:r>
+          <w:rPr>
+            <w:noProof/>
+            <w:webHidden/>
+          </w:rPr>
+          <w:tab/>
+        </w:r>
+        <w:r>
+          <w:rPr>
+            <w:noProof/>
+            <w:webHidden/>
+          </w:rPr>
+          <w:fldChar w:fldCharType="begin"/>
+        </w:r>
+        <w:r>
+          <w:rPr>
+            <w:noProof/>
+            <w:webHidden/>
+          </w:rPr>
+          <w:instrText xml:space="preserve"> PAGEREF _Toc230435125 \h </w:instrText>
+        </w:r>
+        <w:r>
+          <w:rPr>
+            <w:noProof/>
+            <w:webHidden/>
+          </w:rPr>
+        </w:r>
+        <w:r>
+          <w:rPr>
+            <w:noProof/>
+            <w:webHidden/>
+          </w:rPr>
+          <w:fldChar w:fldCharType="separate"/>
+        </w:r>
+        <w:r>
+          <w:rPr>
+            <w:noProof/>
+            <w:webHidden/>
+          </w:rPr>
+          <w:t>14</w:t>
+        </w:r>
+        <w:r>
+          <w:rPr>
+            <w:noProof/>
+            <w:webHidden/>
+          </w:rPr>
+          <w:fldChar w:fldCharType="end"/>
+        </w:r>
+      </w:hyperlink>
+    </w:p>
+    <w:p>
+      <w:pPr>
+        <w:pStyle w:val="TOC3"/>
+        <w:tabs>
+          <w:tab w:val="right" w:leader="dot" w:pos="9624"/>
+        </w:tabs>
+        <w:rPr>
+          <w:rFonts w:asciiTheme="minorHAnsi" w:hAnsiTheme="minorHAnsi"/>
+          <w:noProof/>
+          <w:kern w:val="2"/>
+          <w:sz w:val="24"/>
+          <w:szCs w:val="24"/>
+          <w14:ligatures w14:val="standardContextual"/>
+        </w:rPr>
+      </w:pPr>
+      <w:hyperlink w:anchor="_Toc230435126" w:history="1">
+        <w:r>
+          <w:rPr>
+            <w:rStyle w:val="Hyperlink"/>
+            <w:noProof/>
+          </w:rPr>
+          <w:t>Starting up — device selection</w:t>
+        </w:r>
+        <w:r>
+          <w:rPr>
+            <w:noProof/>
+            <w:webHidden/>
+          </w:rPr>
+          <w:tab/>
+        </w:r>
+        <w:r>
+          <w:rPr>
+            <w:noProof/>
+            <w:webHidden/>
+          </w:rPr>
+          <w:fldChar w:fldCharType="begin"/>
+        </w:r>
+        <w:r>
+          <w:rPr>
+            <w:noProof/>
+            <w:webHidden/>
+          </w:rPr>
+          <w:instrText xml:space="preserve"> PAGEREF _Toc230435126 \h </w:instrText>
+        </w:r>
+        <w:r>
+          <w:rPr>
+            <w:noProof/>
+            <w:webHidden/>
+          </w:rPr>
+        </w:r>
+        <w:r>
+          <w:rPr>
+            <w:noProof/>
+            <w:webHidden/>
+          </w:rPr>
+          <w:fldChar w:fldCharType="separate"/>
+        </w:r>
+        <w:r>
+          <w:rPr>
+            <w:noProof/>
+            <w:webHidden/>
+          </w:rPr>
+          <w:t>14</w:t>
+        </w:r>
+        <w:r>
+          <w:rPr>
+            <w:noProof/>
+            <w:webHidden/>
+          </w:rPr>
+          <w:fldChar w:fldCharType="end"/>
+        </w:r>
+      </w:hyperlink>
+    </w:p>
+    <w:p>
+      <w:pPr>
+        <w:pStyle w:val="TOC3"/>
+        <w:tabs>
+          <w:tab w:val="right" w:leader="dot" w:pos="9624"/>
+        </w:tabs>
+        <w:rPr>
+          <w:rFonts w:asciiTheme="minorHAnsi" w:hAnsiTheme="minorHAnsi"/>
+          <w:noProof/>
+          <w:kern w:val="2"/>
+          <w:sz w:val="24"/>
+          <w:szCs w:val="24"/>
+          <w14:ligatures w14:val="standardContextual"/>
+        </w:rPr>
+      </w:pPr>
+      <w:hyperlink w:anchor="_Toc230435127" w:history="1">
+        <w:r>
+          <w:rPr>
+            <w:rStyle w:val="Hyperlink"/>
+            <w:noProof/>
+          </w:rPr>
+          <w:t>Playback mode</w:t>
+        </w:r>
+        <w:r>
+          <w:rPr>
+            <w:noProof/>
+            <w:webHidden/>
+          </w:rPr>
+          <w:tab/>
+        </w:r>
+        <w:r>
+          <w:rPr>
+            <w:noProof/>
+            <w:webHidden/>
+          </w:rPr>
+          <w:fldChar w:fldCharType="begin"/>
+        </w:r>
+        <w:r>
+          <w:rPr>
+            <w:noProof/>
+            <w:webHidden/>
+          </w:rPr>
+          <w:instrText xml:space="preserve"> PAGEREF _Toc230435127 \h </w:instrText>
+        </w:r>
+        <w:r>
+          <w:rPr>
+            <w:noProof/>
+            <w:webHidden/>
+          </w:rPr>
+        </w:r>
+        <w:r>
+          <w:rPr>
+            <w:noProof/>
+            <w:webHidden/>
+          </w:rPr>
+          <w:fldChar w:fldCharType="separate"/>
+        </w:r>
+        <w:r>
+          <w:rPr>
+            <w:noProof/>
+            <w:webHidden/>
+          </w:rPr>
+          <w:t>15</w:t>
+        </w:r>
+        <w:r>
+          <w:rPr>
+            <w:noProof/>
+            <w:webHidden/>
+          </w:rPr>
+          <w:fldChar w:fldCharType="end"/>
+        </w:r>
+      </w:hyperlink>
+    </w:p>
+    <w:p>
+      <w:pPr>
+        <w:pStyle w:val="TOC3"/>
+        <w:tabs>
+          <w:tab w:val="right" w:leader="dot" w:pos="9624"/>
+        </w:tabs>
+        <w:rPr>
+          <w:rFonts w:asciiTheme="minorHAnsi" w:hAnsiTheme="minorHAnsi"/>
+          <w:noProof/>
+          <w:kern w:val="2"/>
+          <w:sz w:val="24"/>
+          <w:szCs w:val="24"/>
+          <w14:ligatures w14:val="standardContextual"/>
+        </w:rPr>
+      </w:pPr>
+      <w:hyperlink w:anchor="_Toc230435128" w:history="1">
+        <w:r>
+          <w:rPr>
+            <w:rStyle w:val="Hyperlink"/>
+            <w:noProof/>
+          </w:rPr>
+          <w:t>Sidebar controls (right side)</w:t>
+        </w:r>
+        <w:r>
+          <w:rPr>
+            <w:noProof/>
+            <w:webHidden/>
+          </w:rPr>
+          <w:tab/>
+        </w:r>
+        <w:r>
+          <w:rPr>
+            <w:noProof/>
+            <w:webHidden/>
+          </w:rPr>
+          <w:fldChar w:fldCharType="begin"/>
+        </w:r>
+        <w:r>
+          <w:rPr>
+            <w:noProof/>
+            <w:webHidden/>
+          </w:rPr>
+          <w:instrText xml:space="preserve"> PAGEREF _Toc230435128 \h </w:instrText>
+        </w:r>
+        <w:r>
+          <w:rPr>
+            <w:noProof/>
+            <w:webHidden/>
+          </w:rPr>
+        </w:r>
+        <w:r>
+          <w:rPr>
+            <w:noProof/>
+            <w:webHidden/>
+          </w:rPr>
+          <w:fldChar w:fldCharType="separate"/>
+        </w:r>
+        <w:r>
+          <w:rPr>
+            <w:noProof/>
+            <w:webHidden/>
+          </w:rPr>
+          <w:t>15</w:t>
+        </w:r>
+        <w:r>
+          <w:rPr>
+            <w:noProof/>
+            <w:webHidden/>
+          </w:rPr>
+          <w:fldChar w:fldCharType="end"/>
+        </w:r>
+      </w:hyperlink>
+    </w:p>
+    <w:p>
+      <w:pPr>
+        <w:pStyle w:val="TOC3"/>
+        <w:tabs>
+          <w:tab w:val="right" w:leader="dot" w:pos="9624"/>
+        </w:tabs>
+        <w:rPr>
+          <w:rFonts w:asciiTheme="minorHAnsi" w:hAnsiTheme="minorHAnsi"/>
+          <w:noProof/>
+          <w:kern w:val="2"/>
+          <w:sz w:val="24"/>
+          <w:szCs w:val="24"/>
+          <w14:ligatures w14:val="standardContextual"/>
+        </w:rPr>
+      </w:pPr>
+      <w:hyperlink w:anchor="_Toc230435129" w:history="1">
+        <w:r>
+          <w:rPr>
+            <w:rStyle w:val="Hyperlink"/>
+            <w:noProof/>
+          </w:rPr>
+          <w:t>Spectrum (top plot)</w:t>
+        </w:r>
+        <w:r>
+          <w:rPr>
+            <w:noProof/>
+            <w:webHidden/>
+          </w:rPr>
+          <w:tab/>
+        </w:r>
+        <w:r>
+          <w:rPr>
+            <w:noProof/>
+            <w:webHidden/>
+          </w:rPr>
+          <w:fldChar w:fldCharType="begin"/>
+        </w:r>
+        <w:r>
+          <w:rPr>
+            <w:noProof/>
+            <w:webHidden/>
+          </w:rPr>
+          <w:instrText xml:space="preserve"> PAGEREF _Toc230435129 \h </w:instrText>
+        </w:r>
+        <w:r>
+          <w:rPr>
+            <w:noProof/>
+            <w:webHidden/>
+          </w:rPr>
+        </w:r>
+        <w:r>
+          <w:rPr>
+            <w:noProof/>
+            <w:webHidden/>
+          </w:rPr>
+          <w:fldChar w:fldCharType="separate"/>
+        </w:r>
+        <w:r>
+          <w:rPr>
+            <w:noProof/>
+            <w:webHidden/>
+          </w:rPr>
+          <w:t>16</w:t>
+        </w:r>
+        <w:r>
+          <w:rPr>
+            <w:noProof/>
+            <w:webHidden/>
+          </w:rPr>
+          <w:fldChar w:fldCharType="end"/>
+        </w:r>
+      </w:hyperlink>
+    </w:p>
+    <w:p>
+      <w:pPr>
+        <w:pStyle w:val="TOC3"/>
+        <w:tabs>
+          <w:tab w:val="right" w:leader="dot" w:pos="9624"/>
+        </w:tabs>
+        <w:rPr>
+          <w:rFonts w:asciiTheme="minorHAnsi" w:hAnsiTheme="minorHAnsi"/>
+          <w:noProof/>
+          <w:kern w:val="2"/>
+          <w:sz w:val="24"/>
+          <w:szCs w:val="24"/>
+          <w14:ligatures w14:val="standardContextual"/>
+        </w:rPr>
+      </w:pPr>
+      <w:hyperlink w:anchor="_Toc230435130" w:history="1">
+        <w:r>
+          <w:rPr>
+            <w:rStyle w:val="Hyperlink"/>
+            <w:noProof/>
+          </w:rPr>
+          <w:t>Waterfall (bottom plot)</w:t>
+        </w:r>
+        <w:r>
+          <w:rPr>
+            <w:noProof/>
+            <w:webHidden/>
+          </w:rPr>
+          <w:tab/>
+        </w:r>
+        <w:r>
+          <w:rPr>
+            <w:noProof/>
+            <w:webHidden/>
+          </w:rPr>
+          <w:fldChar w:fldCharType="begin"/>
+        </w:r>
+        <w:r>
+          <w:rPr>
+            <w:noProof/>
+            <w:webHidden/>
+          </w:rPr>
+          <w:instrText xml:space="preserve"> PAGEREF _Toc230435130 \h </w:instrText>
+        </w:r>
+        <w:r>
+          <w:rPr>
+            <w:noProof/>
+            <w:webHidden/>
+          </w:rPr>
+        </w:r>
+        <w:r>
+          <w:rPr>
+            <w:noProof/>
+            <w:webHidden/>
+          </w:rPr>
+          <w:fldChar w:fldCharType="separate"/>
+        </w:r>
+        <w:r>
+          <w:rPr>
+            <w:noProof/>
+            <w:webHidden/>
+          </w:rPr>
+          <w:t>16</w:t>
+        </w:r>
+        <w:r>
+          <w:rPr>
+            <w:noProof/>
+            <w:webHidden/>
+          </w:rPr>
+          <w:fldChar w:fldCharType="end"/>
+        </w:r>
+      </w:hyperlink>
+    </w:p>
+    <w:p>
+      <w:pPr>
+        <w:pStyle w:val="TOC3"/>
+        <w:tabs>
+          <w:tab w:val="right" w:leader="dot" w:pos="9624"/>
+        </w:tabs>
+        <w:rPr>
+          <w:rFonts w:asciiTheme="minorHAnsi" w:hAnsiTheme="minorHAnsi"/>
+          <w:noProof/>
+          <w:kern w:val="2"/>
+          <w:sz w:val="24"/>
+          <w:szCs w:val="24"/>
+          <w14:ligatures w14:val="standardContextual"/>
+        </w:rPr>
+      </w:pPr>
+      <w:hyperlink w:anchor="_Toc230435131" w:history="1">
+        <w:r>
+          <w:rPr>
+            <w:rStyle w:val="Hyperlink"/>
+            <w:noProof/>
+          </w:rPr>
+          <w:t>Persistence</w:t>
+        </w:r>
+        <w:r>
+          <w:rPr>
+            <w:noProof/>
+            <w:webHidden/>
+          </w:rPr>
+          <w:tab/>
+        </w:r>
+        <w:r>
+          <w:rPr>
+            <w:noProof/>
+            <w:webHidden/>
+          </w:rPr>
+          <w:fldChar w:fldCharType="begin"/>
+        </w:r>
+        <w:r>
+          <w:rPr>
+            <w:noProof/>
+            <w:webHidden/>
+          </w:rPr>
+          <w:instrText xml:space="preserve"> PAGEREF _Toc230435131 \h </w:instrText>
+        </w:r>
+        <w:r>
+          <w:rPr>
+            <w:noProof/>
+            <w:webHidden/>
+          </w:rPr>
+        </w:r>
+        <w:r>
+          <w:rPr>
+            <w:noProof/>
+            <w:webHidden/>
+          </w:rPr>
+          <w:fldChar w:fldCharType="separate"/>
+        </w:r>
+        <w:r>
+          <w:rPr>
+            <w:noProof/>
+            <w:webHidden/>
+          </w:rPr>
+          <w:t>17</w:t>
+        </w:r>
+        <w:r>
+          <w:rPr>
+            <w:noProof/>
+            <w:webHidden/>
+          </w:rPr>
+          <w:fldChar w:fldCharType="end"/>
+        </w:r>
+      </w:hyperlink>
+    </w:p>
+    <w:p>
+      <w:pPr>
+        <w:pStyle w:val="TOC3"/>
+        <w:tabs>
+          <w:tab w:val="right" w:leader="dot" w:pos="9624"/>
+        </w:tabs>
+        <w:rPr>
+          <w:rFonts w:asciiTheme="minorHAnsi" w:hAnsiTheme="minorHAnsi"/>
+          <w:noProof/>
+          <w:kern w:val="2"/>
+          <w:sz w:val="24"/>
+          <w:szCs w:val="24"/>
+          <w14:ligatures w14:val="standardContextual"/>
+        </w:rPr>
+      </w:pPr>
+      <w:hyperlink w:anchor="_Toc230435132" w:history="1">
+        <w:r>
+          <w:rPr>
+            <w:rStyle w:val="Hyperlink"/>
+            <w:noProof/>
+          </w:rPr>
+          <w:t>Update checks</w:t>
+        </w:r>
+        <w:r>
+          <w:rPr>
+            <w:noProof/>
+            <w:webHidden/>
+          </w:rPr>
+          <w:tab/>
+        </w:r>
+        <w:r>
+          <w:rPr>
+            <w:noProof/>
+            <w:webHidden/>
+          </w:rPr>
+          <w:fldChar w:fldCharType="begin"/>
+        </w:r>
+        <w:r>
+          <w:rPr>
+            <w:noProof/>
+            <w:webHidden/>
+          </w:rPr>
+          <w:instrText xml:space="preserve"> PAGEREF _Toc230435132 \h </w:instrText>
+        </w:r>
+        <w:r>
+          <w:rPr>
+            <w:noProof/>
+            <w:webHidden/>
+          </w:rPr>
+        </w:r>
+        <w:r>
+          <w:rPr>
+            <w:noProof/>
+            <w:webHidden/>
+          </w:rPr>
+          <w:fldChar w:fldCharType="separate"/>
+        </w:r>
+        <w:r>
+          <w:rPr>
+            <w:noProof/>
+            <w:webHidden/>
+          </w:rPr>
+          <w:t>17</w:t>
+        </w:r>
+        <w:r>
+          <w:rPr>
+            <w:noProof/>
+            <w:webHidden/>
+          </w:rPr>
+          <w:fldChar w:fldCharType="end"/>
+        </w:r>
+      </w:hyperlink>
+    </w:p>
+    <w:p>
+      <w:pPr>
+        <w:pStyle w:val="TOC3"/>
+        <w:tabs>
+          <w:tab w:val="right" w:leader="dot" w:pos="9624"/>
+        </w:tabs>
+        <w:rPr>
+          <w:rFonts w:asciiTheme="minorHAnsi" w:hAnsiTheme="minorHAnsi"/>
+          <w:noProof/>
+          <w:kern w:val="2"/>
+          <w:sz w:val="24"/>
+          <w:szCs w:val="24"/>
+          <w14:ligatures w14:val="standardContextual"/>
+        </w:rPr>
+      </w:pPr>
+      <w:hyperlink w:anchor="_Toc230435133" w:history="1">
+        <w:r>
+          <w:rPr>
+            <w:rStyle w:val="Hyperlink"/>
+            <w:noProof/>
+          </w:rPr>
+          <w:t>Tips for pulsar work</w:t>
+        </w:r>
+        <w:r>
+          <w:rPr>
+            <w:noProof/>
+            <w:webHidden/>
+          </w:rPr>
+          <w:tab/>
+        </w:r>
+        <w:r>
+          <w:rPr>
+            <w:noProof/>
+            <w:webHidden/>
+          </w:rPr>
+          <w:fldChar w:fldCharType="begin"/>
+        </w:r>
+        <w:r>
+          <w:rPr>
+            <w:noProof/>
+            <w:webHidden/>
+          </w:rPr>
+          <w:instrText xml:space="preserve"> PAGEREF _Toc230435133 \h </w:instrText>
+        </w:r>
+        <w:r>
+          <w:rPr>
+            <w:noProof/>
+            <w:webHidden/>
+          </w:rPr>
+        </w:r>
+        <w:r>
+          <w:rPr>
+            <w:noProof/>
+            <w:webHidden/>
+          </w:rPr>
+          <w:fldChar w:fldCharType="separate"/>
+        </w:r>
+        <w:r>
+          <w:rPr>
+            <w:noProof/>
+            <w:webHidden/>
+          </w:rPr>
+          <w:t>17</w:t>
         </w:r>
         <w:r>
           <w:rPr>
@@ -2578,7 +3235,7 @@
         <w:pStyle w:val="Heading1"/>
         <w:shd w:val="clear" w:color="auto" w:fill="156082"/>
       </w:pPr>
-      <w:bookmarkStart w:id="1" w:name="_Toc230433310"/>
+      <w:bookmarkStart w:id="1" w:name="_Toc230435093"/>
       <w:r>
         <w:lastRenderedPageBreak/>
         <w:t xml:space="preserve">DSES Spectrum Analyzer — </w:t>
@@ -2657,7 +3314,7 @@
       <w:pPr>
         <w:pStyle w:val="Heading2"/>
       </w:pPr>
-      <w:bookmarkStart w:id="2" w:name="_Toc230433311"/>
+      <w:bookmarkStart w:id="2" w:name="_Toc230435094"/>
       <w:r>
         <w:t>1. What the recipient needs to know first</w:t>
       </w:r>
@@ -2731,7 +3388,7 @@
       <w:pPr>
         <w:pStyle w:val="Heading3"/>
       </w:pPr>
-      <w:bookmarkStart w:id="3" w:name="_Toc230433312"/>
+      <w:bookmarkStart w:id="3" w:name="_Toc230435095"/>
       <w:r>
         <w:t>System requirements</w:t>
       </w:r>
@@ -3010,7 +3667,7 @@
       <w:pPr>
         <w:pStyle w:val="Heading2"/>
       </w:pPr>
-      <w:bookmarkStart w:id="4" w:name="_Toc230433313"/>
+      <w:bookmarkStart w:id="4" w:name="_Toc230435096"/>
       <w:r>
         <w:t>2. Installing Radioconda</w:t>
       </w:r>
@@ -3020,7 +3677,7 @@
       <w:pPr>
         <w:pStyle w:val="Heading3"/>
       </w:pPr>
-      <w:bookmarkStart w:id="5" w:name="_Toc230433314"/>
+      <w:bookmarkStart w:id="5" w:name="_Toc230435097"/>
       <w:r>
         <w:t>2.1 Windows 11</w:t>
       </w:r>
@@ -3197,7 +3854,7 @@
       <w:pPr>
         <w:pStyle w:val="Heading3"/>
       </w:pPr>
-      <w:bookmarkStart w:id="6" w:name="_Toc230433315"/>
+      <w:bookmarkStart w:id="6" w:name="_Toc230435098"/>
       <w:r>
         <w:t>2.2 Linux</w:t>
       </w:r>
@@ -3402,7 +4059,7 @@
       <w:pPr>
         <w:pStyle w:val="Heading3"/>
       </w:pPr>
-      <w:bookmarkStart w:id="7" w:name="_Toc230433316"/>
+      <w:bookmarkStart w:id="7" w:name="_Toc230435099"/>
       <w:r>
         <w:t>2.3 macOS (Intel and Apple Silicon)</w:t>
       </w:r>
@@ -3639,7 +4296,7 @@
       <w:pPr>
         <w:pStyle w:val="Heading2"/>
       </w:pPr>
-      <w:bookmarkStart w:id="8" w:name="_Toc230433317"/>
+      <w:bookmarkStart w:id="8" w:name="_Toc230435100"/>
       <w:r>
         <w:t>3. Installing the DSES Spectrum Analyzer</w:t>
       </w:r>
@@ -3698,7 +4355,7 @@
       <w:pPr>
         <w:pStyle w:val="Heading3"/>
       </w:pPr>
-      <w:bookmarkStart w:id="9" w:name="_Toc230433318"/>
+      <w:bookmarkStart w:id="9" w:name="_Toc230435101"/>
       <w:r>
         <w:t>3.1 Windows 11</w:t>
       </w:r>
@@ -3903,7 +4560,7 @@
       <w:pPr>
         <w:pStyle w:val="Heading3"/>
       </w:pPr>
-      <w:bookmarkStart w:id="10" w:name="_Toc230433319"/>
+      <w:bookmarkStart w:id="10" w:name="_Toc230435102"/>
       <w:r>
         <w:t>3.2 Linux</w:t>
       </w:r>
@@ -4095,7 +4752,7 @@
       <w:pPr>
         <w:pStyle w:val="Heading3"/>
       </w:pPr>
-      <w:bookmarkStart w:id="11" w:name="_Toc230433320"/>
+      <w:bookmarkStart w:id="11" w:name="_Toc230435103"/>
       <w:r>
         <w:lastRenderedPageBreak/>
         <w:t>3.3 macOS</w:t>
@@ -4249,7 +4906,7 @@
       <w:pPr>
         <w:pStyle w:val="Heading2"/>
       </w:pPr>
-      <w:bookmarkStart w:id="12" w:name="_Toc230433321"/>
+      <w:bookmarkStart w:id="12" w:name="_Toc230435104"/>
       <w:r>
         <w:t>3A. Extra setup for SDRPlay receivers (RSP1A / RSP1B / RSPduo / RSPdx)</w:t>
       </w:r>
@@ -4284,7 +4941,7 @@
       <w:pPr>
         <w:pStyle w:val="Heading3"/>
       </w:pPr>
-      <w:bookmarkStart w:id="13" w:name="_Toc230433322"/>
+      <w:bookmarkStart w:id="13" w:name="_Toc230435105"/>
       <w:r>
         <w:t>3A.1 Install the SDRplay API</w:t>
       </w:r>
@@ -4396,7 +5053,7 @@
       <w:pPr>
         <w:pStyle w:val="Heading3"/>
       </w:pPr>
-      <w:bookmarkStart w:id="14" w:name="_Toc230433323"/>
+      <w:bookmarkStart w:id="14" w:name="_Toc230435106"/>
       <w:r>
         <w:t>3A.2 Install the SoapySDRPlay module</w:t>
       </w:r>
@@ -4765,7 +5422,7 @@
       <w:pPr>
         <w:pStyle w:val="Heading2"/>
       </w:pPr>
-      <w:bookmarkStart w:id="15" w:name="_Toc230433324"/>
+      <w:bookmarkStart w:id="15" w:name="_Toc230435107"/>
       <w:r>
         <w:t>4. First-run checklist</w:t>
       </w:r>
@@ -4878,7 +5535,7 @@
       <w:pPr>
         <w:pStyle w:val="Heading3"/>
       </w:pPr>
-      <w:bookmarkStart w:id="16" w:name="_Toc230433325"/>
+      <w:bookmarkStart w:id="16" w:name="_Toc230435108"/>
       <w:r>
         <w:t>Recommended one-time VOLK tuning</w:t>
       </w:r>
@@ -5021,7 +5678,7 @@
       <w:pPr>
         <w:pStyle w:val="Heading2"/>
       </w:pPr>
-      <w:bookmarkStart w:id="17" w:name="_Toc230433326"/>
+      <w:bookmarkStart w:id="17" w:name="_Toc230435109"/>
       <w:r>
         <w:t>5. Updating to a new version</w:t>
       </w:r>
@@ -5031,7 +5688,7 @@
       <w:pPr>
         <w:pStyle w:val="Heading3"/>
       </w:pPr>
-      <w:bookmarkStart w:id="18" w:name="_Toc230433327"/>
+      <w:bookmarkStart w:id="18" w:name="_Toc230435110"/>
       <w:r>
         <w:t>Auto-update notifications</w:t>
       </w:r>
@@ -5122,7 +5779,7 @@
       <w:pPr>
         <w:pStyle w:val="Heading3"/>
       </w:pPr>
-      <w:bookmarkStart w:id="19" w:name="_Toc230433328"/>
+      <w:bookmarkStart w:id="19" w:name="_Toc230435111"/>
       <w:r>
         <w:lastRenderedPageBreak/>
         <w:t>Performing the update</w:t>
@@ -5219,7 +5876,7 @@
       <w:pPr>
         <w:pStyle w:val="Heading3"/>
       </w:pPr>
-      <w:bookmarkStart w:id="20" w:name="_Toc230433329"/>
+      <w:bookmarkStart w:id="20" w:name="_Toc230435112"/>
       <w:r>
         <w:t>What is preserved across versions</w:t>
       </w:r>
@@ -5402,7 +6059,7 @@
       <w:pPr>
         <w:pStyle w:val="Heading3"/>
       </w:pPr>
-      <w:bookmarkStart w:id="21" w:name="_Toc230433330"/>
+      <w:bookmarkStart w:id="21" w:name="_Toc230435113"/>
       <w:r>
         <w:t>Backing up your settings</w:t>
       </w:r>
@@ -5461,7 +6118,7 @@
       <w:pPr>
         <w:pStyle w:val="Heading2"/>
       </w:pPr>
-      <w:bookmarkStart w:id="22" w:name="_Toc230433331"/>
+      <w:bookmarkStart w:id="22" w:name="_Toc230435114"/>
       <w:r>
         <w:t>6. Troubleshooting</w:t>
       </w:r>
@@ -5471,7 +6128,7 @@
       <w:pPr>
         <w:pStyle w:val="Heading3"/>
       </w:pPr>
-      <w:bookmarkStart w:id="23" w:name="_Toc230433332"/>
+      <w:bookmarkStart w:id="23" w:name="_Toc230435115"/>
       <w:r>
         <w:t>“Radioconda not found in standard locations”</w:t>
       </w:r>
@@ -5532,7 +6189,7 @@
       <w:pPr>
         <w:pStyle w:val="Heading3"/>
       </w:pPr>
-      <w:bookmarkStart w:id="24" w:name="_Toc230433333"/>
+      <w:bookmarkStart w:id="24" w:name="_Toc230435116"/>
       <w:r>
         <w:lastRenderedPageBreak/>
         <w:t>“No UHD Devices Found”</w:t>
@@ -5631,7 +6288,7 @@
       <w:pPr>
         <w:pStyle w:val="Heading3"/>
       </w:pPr>
-      <w:bookmarkStart w:id="25" w:name="_Toc230433334"/>
+      <w:bookmarkStart w:id="25" w:name="_Toc230435117"/>
       <w:r>
         <w:t>Persistent “O” overflows at high sample rates</w:t>
       </w:r>
@@ -5675,7 +6332,7 @@
       <w:pPr>
         <w:pStyle w:val="Heading3"/>
       </w:pPr>
-      <w:bookmarkStart w:id="26" w:name="_Toc230433335"/>
+      <w:bookmarkStart w:id="26" w:name="_Toc230435118"/>
       <w:r>
         <w:t>Spectrum looks flat at −140 dB</w:t>
       </w:r>
@@ -5714,7 +6371,7 @@
       <w:pPr>
         <w:pStyle w:val="Heading3"/>
       </w:pPr>
-      <w:bookmarkStart w:id="27" w:name="_Toc230433336"/>
+      <w:bookmarkStart w:id="27" w:name="_Toc230435119"/>
       <w:r>
         <w:t>macOS: “developer cannot be verified”</w:t>
       </w:r>
@@ -5750,7 +6407,7 @@
       <w:pPr>
         <w:pStyle w:val="Heading3"/>
       </w:pPr>
-      <w:bookmarkStart w:id="28" w:name="_Toc230433337"/>
+      <w:bookmarkStart w:id="28" w:name="_Toc230435120"/>
       <w:r>
         <w:t>Settings won’t persist</w:t>
       </w:r>
@@ -5803,7 +6460,7 @@
       <w:pPr>
         <w:pStyle w:val="Heading2"/>
       </w:pPr>
-      <w:bookmarkStart w:id="29" w:name="_Toc230433338"/>
+      <w:bookmarkStart w:id="29" w:name="_Toc230435121"/>
       <w:r>
         <w:t>7. Appendix A — Settings file reference</w:t>
       </w:r>
@@ -6012,7 +6669,7 @@
       <w:pPr>
         <w:pStyle w:val="Heading2"/>
       </w:pPr>
-      <w:bookmarkStart w:id="30" w:name="_Toc230433339"/>
+      <w:bookmarkStart w:id="30" w:name="_Toc230435122"/>
       <w:r>
         <w:t>8. Appendix B — Device selection and SigMF playback</w:t>
       </w:r>
@@ -6022,7 +6679,7 @@
       <w:pPr>
         <w:pStyle w:val="Heading3"/>
       </w:pPr>
-      <w:bookmarkStart w:id="31" w:name="_Toc230433340"/>
+      <w:bookmarkStart w:id="31" w:name="_Toc230435123"/>
       <w:r>
         <w:t>Choosing among multiple radios</w:t>
       </w:r>
@@ -6200,7 +6857,7 @@
       <w:pPr>
         <w:pStyle w:val="Heading3"/>
       </w:pPr>
-      <w:bookmarkStart w:id="32" w:name="_Toc230433341"/>
+      <w:bookmarkStart w:id="32" w:name="_Toc230435124"/>
       <w:r>
         <w:t>SigMF playback mode (no-device fallback)</w:t>
       </w:r>
@@ -6395,6 +7052,922 @@
       </w:r>
       <w:r>
         <w:t xml:space="preserve"> files.</w:t>
+      </w:r>
+    </w:p>
+    <w:p>
+      <w:pPr>
+        <w:pStyle w:val="Heading2"/>
+      </w:pPr>
+      <w:bookmarkStart w:id="33" w:name="_Toc230435125"/>
+      <w:r>
+        <w:t>9. Appendix C — Operating Guide</w:t>
+      </w:r>
+      <w:bookmarkEnd w:id="33"/>
+    </w:p>
+    <w:p>
+      <w:r>
+        <w:t xml:space="preserve">&gt; This appendix is a copy of the program’s built-in </w:t>
+      </w:r>
+      <w:r>
+        <w:rPr>
+          <w:b/>
+        </w:rPr>
+        <w:t>Help → User Guide</w:t>
+      </w:r>
+      <w:r>
+        <w:t>. If the two ever differ, the in-app Help is authoritative for the version you’re actually running (it ships inside the application).</w:t>
+      </w:r>
+    </w:p>
+    <w:p>
+      <w:r>
+        <w:t>This is a live spectrum analyzer and waterfall display for the Ettus USRP B210 and other software-defined radios (SDRPlay RSP1A/RSP1B/RSPduo/RSPdx, RTL-SDR, HackRF, Airspy, BladeRF, LimeSDR, PlutoSDR via SoapySDR), designed for pulsar RFI investigation but useful for general-purpose spectrum monitoring.</w:t>
+      </w:r>
+    </w:p>
+    <w:p>
+      <w:pPr>
+        <w:pStyle w:val="Heading3"/>
+      </w:pPr>
+      <w:bookmarkStart w:id="34" w:name="_Toc230435126"/>
+      <w:r>
+        <w:t>Starting up — device selection</w:t>
+      </w:r>
+      <w:bookmarkEnd w:id="34"/>
+    </w:p>
+    <w:p>
+      <w:r>
+        <w:t>At launch the program enumerates attached SDRs (UHD + SoapySDR) and decides what to use:</w:t>
+      </w:r>
+    </w:p>
+    <w:p>
+      <w:pPr>
+        <w:pStyle w:val="ListBullet"/>
+      </w:pPr>
+      <w:r>
+        <w:rPr>
+          <w:b/>
+        </w:rPr>
+        <w:lastRenderedPageBreak/>
+        <w:t>One supported SDR attached</w:t>
+      </w:r>
+      <w:r>
+        <w:t>: opens it silently and remembers the driver and serial in the settings file.</w:t>
+      </w:r>
+    </w:p>
+    <w:p>
+      <w:pPr>
+        <w:pStyle w:val="ListBullet"/>
+      </w:pPr>
+      <w:r>
+        <w:rPr>
+          <w:b/>
+        </w:rPr>
+        <w:t>Two or more radios attached</w:t>
+      </w:r>
+      <w:r>
+        <w:t>: a picker dialog always appears so you can choose which one to use. Your previous choice is pre-selected, so you can just press Enter to use the same radio as last time. Your selection is remembered for next launch.</w:t>
+      </w:r>
+    </w:p>
+    <w:p>
+      <w:pPr>
+        <w:pStyle w:val="ListBullet"/>
+      </w:pPr>
+      <w:r>
+        <w:rPr>
+          <w:b/>
+        </w:rPr>
+        <w:t>No SDR attached, but a bundled SigMF sample is present</w:t>
+      </w:r>
+      <w:r>
+        <w:t xml:space="preserve">: the program falls back to </w:t>
+      </w:r>
+      <w:r>
+        <w:rPr>
+          <w:b/>
+        </w:rPr>
+        <w:t>playback mode</w:t>
+      </w:r>
+      <w:r>
+        <w:t xml:space="preserve"> — see below.</w:t>
+      </w:r>
+    </w:p>
+    <w:p>
+      <w:pPr>
+        <w:pStyle w:val="ListBullet"/>
+      </w:pPr>
+      <w:r>
+        <w:rPr>
+          <w:b/>
+        </w:rPr>
+        <w:t>No SDR and no sample</w:t>
+      </w:r>
+      <w:r>
+        <w:t>: an error dialog explains how to fix it and the program exits.</w:t>
+      </w:r>
+    </w:p>
+    <w:p>
+      <w:r>
+        <w:t xml:space="preserve">The window title always shows which radio is feeding the display, and the </w:t>
+      </w:r>
+      <w:r>
+        <w:rPr>
+          <w:b/>
+        </w:rPr>
+        <w:t>RX</w:t>
+      </w:r>
+      <w:r>
+        <w:t xml:space="preserve"> group has a </w:t>
+      </w:r>
+      <w:r>
+        <w:rPr>
+          <w:rFonts w:ascii="Consolas" w:hAnsi="Consolas"/>
+          <w:sz w:val="20"/>
+        </w:rPr>
+        <w:t>Device:</w:t>
+      </w:r>
+      <w:r>
+        <w:t xml:space="preserve"> button you can click to re-open the picker. The new choice takes effect on the next launch.</w:t>
+      </w:r>
+    </w:p>
+    <w:p>
+      <w:pPr>
+        <w:pStyle w:val="Heading3"/>
+      </w:pPr>
+      <w:bookmarkStart w:id="35" w:name="_Toc230435127"/>
+      <w:r>
+        <w:t>Playback mode</w:t>
+      </w:r>
+      <w:bookmarkEnd w:id="35"/>
+    </w:p>
+    <w:p>
+      <w:r>
+        <w:t xml:space="preserve">If no SDR is attached, the program looks next to the application file for </w:t>
+      </w:r>
+      <w:r>
+        <w:rPr>
+          <w:rFonts w:ascii="Consolas" w:hAnsi="Consolas"/>
+          <w:sz w:val="20"/>
+        </w:rPr>
+        <w:t>sample.sigmf-data</w:t>
+      </w:r>
+      <w:r>
+        <w:t xml:space="preserve"> + </w:t>
+      </w:r>
+      <w:r>
+        <w:rPr>
+          <w:rFonts w:ascii="Consolas" w:hAnsi="Consolas"/>
+          <w:sz w:val="20"/>
+        </w:rPr>
+        <w:t>sample.sigmf-meta</w:t>
+      </w:r>
+      <w:r>
+        <w:t xml:space="preserve"> and, if both are found, plays the file back in a continuous loop. The window title shows </w:t>
+      </w:r>
+      <w:r>
+        <w:rPr>
+          <w:b/>
+        </w:rPr>
+        <w:t>[Playback]</w:t>
+      </w:r>
+      <w:r>
+        <w:t>. The data source is the file, paced to the original capture’s sample rate.</w:t>
+      </w:r>
+    </w:p>
+    <w:p>
+      <w:pPr>
+        <w:pStyle w:val="ListBullet"/>
+      </w:pPr>
+      <w:r>
+        <w:rPr>
+          <w:b/>
+        </w:rPr>
+        <w:t>Sample Rate</w:t>
+      </w:r>
+      <w:r>
+        <w:t xml:space="preserve">, </w:t>
+      </w:r>
+      <w:r>
+        <w:rPr>
+          <w:b/>
+        </w:rPr>
+        <w:t>RX Gain</w:t>
+      </w:r>
+      <w:r>
+        <w:t xml:space="preserve">, and </w:t>
+      </w:r>
+      <w:r>
+        <w:rPr>
+          <w:b/>
+        </w:rPr>
+        <w:t>Recording</w:t>
+      </w:r>
+      <w:r>
+        <w:t xml:space="preserve"> controls are disabled — they have no meaning for a recorded file. Sample rate comes from the file’s metadata.</w:t>
+      </w:r>
+    </w:p>
+    <w:p>
+      <w:pPr>
+        <w:pStyle w:val="ListBullet"/>
+      </w:pPr>
+      <w:r>
+        <w:rPr>
+          <w:b/>
+        </w:rPr>
+        <w:t>Tuning is enabled</w:t>
+      </w:r>
+      <w:r>
+        <w:t xml:space="preserve"> and works as a digital frequency shift on the file’s baseband. Tuning to the file’s actual center frequency (read from the .sigmf-meta) shows the recording’s true content; tuning to other frequencies within ±(sample_rate/2) of the file’s center lets you “look around” inside the recorded bandwidth. Tune well outside that window and you’ll just see noise / wrap-around — exactly what you’d expect, since the recording doesn’t contain data at those frequencies.</w:t>
+      </w:r>
+    </w:p>
+    <w:p>
+      <w:pPr>
+        <w:pStyle w:val="ListBullet"/>
+      </w:pPr>
+      <w:r>
+        <w:t>All visualization controls (Spectrum panel, Waterfall panel) work normally.</w:t>
+      </w:r>
+    </w:p>
+    <w:p>
+      <w:pPr>
+        <w:pStyle w:val="ListBullet"/>
+      </w:pPr>
+      <w:r>
+        <w:t xml:space="preserve">To replace the sample with your own, save a SigMF recording, rename the two files to </w:t>
+      </w:r>
+      <w:r>
+        <w:rPr>
+          <w:rFonts w:ascii="Consolas" w:hAnsi="Consolas"/>
+          <w:sz w:val="20"/>
+        </w:rPr>
+        <w:t>sample.sigmf-data</w:t>
+      </w:r>
+      <w:r>
+        <w:t xml:space="preserve"> and </w:t>
+      </w:r>
+      <w:r>
+        <w:rPr>
+          <w:rFonts w:ascii="Consolas" w:hAnsi="Consolas"/>
+          <w:sz w:val="20"/>
+        </w:rPr>
+        <w:t>sample.sigmf-meta</w:t>
+      </w:r>
+      <w:r>
+        <w:t>, and drop them next to the program. (You don’t need to change any code.)</w:t>
+      </w:r>
+    </w:p>
+    <w:p>
+      <w:pPr>
+        <w:pStyle w:val="Heading3"/>
+      </w:pPr>
+      <w:bookmarkStart w:id="36" w:name="_Toc230435128"/>
+      <w:r>
+        <w:t>Sidebar controls (right side)</w:t>
+      </w:r>
+      <w:bookmarkEnd w:id="36"/>
+    </w:p>
+    <w:p>
+      <w:r>
+        <w:t>#### Tuning</w:t>
+      </w:r>
+    </w:p>
+    <w:p>
+      <w:pPr>
+        <w:pStyle w:val="ListBullet"/>
+      </w:pPr>
+      <w:r>
+        <w:rPr>
+          <w:b/>
+        </w:rPr>
+        <w:t>Pulsar Band</w:t>
+      </w:r>
+      <w:r>
+        <w:t xml:space="preserve">: preset frequencies for common pulsar observation bands. Choose </w:t>
+      </w:r>
+      <w:r>
+        <w:rPr>
+          <w:i/>
+        </w:rPr>
+        <w:t>Manual</w:t>
+      </w:r>
+      <w:r>
+        <w:t xml:space="preserve"> to use the Manual Frequency field instead.</w:t>
+      </w:r>
+    </w:p>
+    <w:p>
+      <w:pPr>
+        <w:pStyle w:val="ListBullet"/>
+      </w:pPr>
+      <w:r>
+        <w:rPr>
+          <w:b/>
+        </w:rPr>
+        <w:t>Coarse Tune</w:t>
+      </w:r>
+      <w:r>
+        <w:t>: ±100 MHz offset from the selected preset (or from the manual frequency).</w:t>
+      </w:r>
+    </w:p>
+    <w:p>
+      <w:pPr>
+        <w:pStyle w:val="ListBullet"/>
+      </w:pPr>
+      <w:r>
+        <w:rPr>
+          <w:b/>
+        </w:rPr>
+        <w:t>Fine Tune</w:t>
+      </w:r>
+      <w:r>
+        <w:t>: ±10 MHz offset, layered on top of Coarse Tune.</w:t>
+      </w:r>
+    </w:p>
+    <w:p>
+      <w:pPr>
+        <w:pStyle w:val="ListBullet"/>
+      </w:pPr>
+      <w:r>
+        <w:rPr>
+          <w:b/>
+        </w:rPr>
+        <w:t>Manual Frequency</w:t>
+      </w:r>
+      <w:r>
+        <w:t xml:space="preserve">: used when the </w:t>
+      </w:r>
+      <w:r>
+        <w:rPr>
+          <w:i/>
+        </w:rPr>
+        <w:t>Manual</w:t>
+      </w:r>
+      <w:r>
+        <w:t xml:space="preserve"> preset is selected. Accepts engineering notation, e.g. </w:t>
+      </w:r>
+      <w:r>
+        <w:rPr>
+          <w:rFonts w:ascii="Consolas" w:hAnsi="Consolas"/>
+          <w:sz w:val="20"/>
+        </w:rPr>
+        <w:t>1.42G</w:t>
+      </w:r>
+      <w:r>
+        <w:t xml:space="preserve"> or </w:t>
+      </w:r>
+      <w:r>
+        <w:rPr>
+          <w:rFonts w:ascii="Consolas" w:hAnsi="Consolas"/>
+          <w:sz w:val="20"/>
+        </w:rPr>
+        <w:t>408M</w:t>
+      </w:r>
+      <w:r>
+        <w:t>.</w:t>
+      </w:r>
+    </w:p>
+    <w:p>
+      <w:r>
+        <w:t>#### RX</w:t>
+      </w:r>
+    </w:p>
+    <w:p>
+      <w:pPr>
+        <w:pStyle w:val="ListBullet"/>
+      </w:pPr>
+      <w:r>
+        <w:rPr>
+          <w:b/>
+        </w:rPr>
+        <w:lastRenderedPageBreak/>
+        <w:t>Sample Rate</w:t>
+      </w:r>
+      <w:r>
+        <w:t>: per-radio. The combo shows the rates the connected radio actually supports (e.g. B210: 1–25 MHz; SDRPlay: 2–10 MHz; RTL-SDR: 0.25–3.2 MHz). Higher rate = wider spectrum but more disk usage when recording.</w:t>
+      </w:r>
+    </w:p>
+    <w:p>
+      <w:pPr>
+        <w:pStyle w:val="ListBullet"/>
+      </w:pPr>
+      <w:r>
+        <w:rPr>
+          <w:b/>
+        </w:rPr>
+        <w:t>RX Gain</w:t>
+      </w:r>
+      <w:r>
+        <w:t>: per-radio range and meaning. The slider’s min/max matches what the driver reports (e.g. B210: 0–76 dB on the AD9361 gain table; SDRPlay: 0–48 dB, internally inverted so higher = stronger signal; RTL-SDR: 0–49.6 dB). AGC, if the driver defaults it on, is disabled at startup so the slider always takes effect.</w:t>
+      </w:r>
+    </w:p>
+    <w:p>
+      <w:pPr>
+        <w:pStyle w:val="ListBullet"/>
+      </w:pPr>
+      <w:r>
+        <w:rPr>
+          <w:b/>
+        </w:rPr>
+        <w:t>Antenna</w:t>
+      </w:r>
+      <w:r>
+        <w:t xml:space="preserve">: appears only when the open radio has more than one RF input. For a B210 this lists all four physical connectors as </w:t>
+      </w:r>
+      <w:r>
+        <w:rPr>
+          <w:rFonts w:ascii="Consolas" w:hAnsi="Consolas"/>
+          <w:sz w:val="20"/>
+        </w:rPr>
+        <w:t>A : RX2</w:t>
+      </w:r>
+      <w:r>
+        <w:t xml:space="preserve">, </w:t>
+      </w:r>
+      <w:r>
+        <w:rPr>
+          <w:rFonts w:ascii="Consolas" w:hAnsi="Consolas"/>
+          <w:sz w:val="20"/>
+        </w:rPr>
+        <w:t>A : TX/RX</w:t>
+      </w:r>
+      <w:r>
+        <w:t xml:space="preserve">, </w:t>
+      </w:r>
+      <w:r>
+        <w:rPr>
+          <w:rFonts w:ascii="Consolas" w:hAnsi="Consolas"/>
+          <w:sz w:val="20"/>
+        </w:rPr>
+        <w:t>B : RX2</w:t>
+      </w:r>
+      <w:r>
+        <w:t xml:space="preserve">, </w:t>
+      </w:r>
+      <w:r>
+        <w:rPr>
+          <w:rFonts w:ascii="Consolas" w:hAnsi="Consolas"/>
+          <w:sz w:val="20"/>
+        </w:rPr>
+        <w:t>B : TX/RX</w:t>
+      </w:r>
+      <w:r>
+        <w:t xml:space="preserve"> — receiver A and receiver B, each with its two SMA ports — and switching includes hopping between the two receivers. An RSPduo lists its two tuners. Pick the connector your cable is actually plugged into; the choice is remembered per radio. Single-port radios (most RTL dongles, the RSP1B) don’t show this control.</w:t>
+      </w:r>
+    </w:p>
+    <w:p>
+      <w:pPr>
+        <w:pStyle w:val="ListBullet"/>
+      </w:pPr>
+      <w:r>
+        <w:rPr>
+          <w:b/>
+        </w:rPr>
+        <w:t>Device</w:t>
+      </w:r>
+      <w:r>
+        <w:t>: shows the currently-open radio and re-opens the picker on click.</w:t>
+      </w:r>
+    </w:p>
+    <w:p>
+      <w:r>
+        <w:t>#### Recording</w:t>
+      </w:r>
+    </w:p>
+    <w:p>
+      <w:pPr>
+        <w:pStyle w:val="ListBullet"/>
+      </w:pPr>
+      <w:r>
+        <w:rPr>
+          <w:b/>
+        </w:rPr>
+        <w:t>Folder</w:t>
+      </w:r>
+      <w:r>
+        <w:t xml:space="preserve">: where SigMF capture pairs (.sigmf-meta / .sigmf-data) land. Defaults to </w:t>
+      </w:r>
+      <w:r>
+        <w:rPr>
+          <w:rFonts w:ascii="Consolas" w:hAnsi="Consolas"/>
+          <w:sz w:val="20"/>
+        </w:rPr>
+        <w:t>~/Documents/DSES_SA_Recordings</w:t>
+      </w:r>
+      <w:r>
+        <w:t>.</w:t>
+      </w:r>
+    </w:p>
+    <w:p>
+      <w:pPr>
+        <w:pStyle w:val="ListBullet"/>
+      </w:pPr>
+      <w:r>
+        <w:rPr>
+          <w:b/>
+        </w:rPr>
+        <w:t>Record</w:t>
+      </w:r>
+      <w:r>
+        <w:t xml:space="preserve">: </w:t>
+      </w:r>
+      <w:r>
+        <w:rPr>
+          <w:i/>
+        </w:rPr>
+        <w:t>Stopped</w:t>
+      </w:r>
+      <w:r>
+        <w:t xml:space="preserve"> / </w:t>
+      </w:r>
+      <w:r>
+        <w:rPr>
+          <w:i/>
+        </w:rPr>
+        <w:t>Recording</w:t>
+      </w:r>
+      <w:r>
+        <w:t xml:space="preserve">. Recording always starts </w:t>
+      </w:r>
+      <w:r>
+        <w:rPr>
+          <w:i/>
+        </w:rPr>
+        <w:t>Stopped</w:t>
+      </w:r>
+      <w:r>
+        <w:t xml:space="preserve"> on launch.</w:t>
+      </w:r>
+    </w:p>
+    <w:p>
+      <w:pPr>
+        <w:pStyle w:val="Heading3"/>
+      </w:pPr>
+      <w:bookmarkStart w:id="37" w:name="_Toc230435129"/>
+      <w:r>
+        <w:t>Spectrum (top plot)</w:t>
+      </w:r>
+      <w:bookmarkEnd w:id="37"/>
+    </w:p>
+    <w:p>
+      <w:r>
+        <w:t>Live FFT magnitude in dB. Use the control panel on the right side to adjust:</w:t>
+      </w:r>
+    </w:p>
+    <w:p>
+      <w:pPr>
+        <w:pStyle w:val="ListBullet"/>
+      </w:pPr>
+      <w:r>
+        <w:rPr>
+          <w:b/>
+        </w:rPr>
+        <w:t>FFT Size</w:t>
+      </w:r>
+      <w:r>
+        <w:t>: 256–8192. Larger = finer frequency resolution but slower response and more averaging-window flicker.</w:t>
+      </w:r>
+    </w:p>
+    <w:p>
+      <w:pPr>
+        <w:pStyle w:val="ListBullet"/>
+      </w:pPr>
+      <w:r>
+        <w:rPr>
+          <w:b/>
+        </w:rPr>
+        <w:t>Window</w:t>
+      </w:r>
+      <w:r>
+        <w:t>: Blackman-Harris is the default — low sidelobes, good for RFI hunting. Hann/Hamming have narrower main lobes; Rectangular has the sharpest peak but the worst sidelobes.</w:t>
+      </w:r>
+    </w:p>
+    <w:p>
+      <w:pPr>
+        <w:pStyle w:val="ListBullet"/>
+      </w:pPr>
+      <w:r>
+        <w:rPr>
+          <w:b/>
+        </w:rPr>
+        <w:t>Avg α</w:t>
+      </w:r>
+      <w:r>
+        <w:t>: exponential averaging. 1.0 = no smoothing (every frame is a fresh measurement). Smaller = more smoothing.</w:t>
+      </w:r>
+    </w:p>
+    <w:p>
+      <w:pPr>
+        <w:pStyle w:val="ListBullet"/>
+      </w:pPr>
+      <w:r>
+        <w:rPr>
+          <w:b/>
+        </w:rPr>
+        <w:t>Max / Min hold</w:t>
+      </w:r>
+      <w:r>
+        <w:t xml:space="preserve">: overlay traces showing the highest/lowest value ever seen at each bin. Use </w:t>
+      </w:r>
+      <w:r>
+        <w:rPr>
+          <w:b/>
+        </w:rPr>
+        <w:t>Reset</w:t>
+      </w:r>
+      <w:r>
+        <w:t xml:space="preserve"> to clear.</w:t>
+      </w:r>
+    </w:p>
+    <w:p>
+      <w:pPr>
+        <w:pStyle w:val="ListBullet"/>
+      </w:pPr>
+      <w:r>
+        <w:rPr>
+          <w:b/>
+        </w:rPr>
+        <w:t>Y-Axis</w:t>
+      </w:r>
+      <w:r>
+        <w:t xml:space="preserve">: dB min/max, or click </w:t>
+      </w:r>
+      <w:r>
+        <w:rPr>
+          <w:b/>
+        </w:rPr>
+        <w:t>Autoscale</w:t>
+      </w:r>
+      <w:r>
+        <w:t xml:space="preserve"> to fit the current data. </w:t>
+      </w:r>
+      <w:r>
+        <w:rPr>
+          <w:b/>
+        </w:rPr>
+        <w:t>Reset Axes</w:t>
+      </w:r>
+      <w:r>
+        <w:t xml:space="preserve"> snaps the plot back to the default dB range and full-span frequency view — handy after you’ve zoomed/panned with the mouse or nudged the min/max and want to get un-lost. It leaves FFT size, window, traces, and colors untouched.</w:t>
+      </w:r>
+    </w:p>
+    <w:p>
+      <w:pPr>
+        <w:pStyle w:val="ListBullet"/>
+      </w:pPr>
+      <w:r>
+        <w:rPr>
+          <w:b/>
+        </w:rPr>
+        <w:t>Linear scale</w:t>
+      </w:r>
+      <w:r>
+        <w:t>: plots linear magnitude instead of dB (the default log scale). In linear mode the Y axis auto-fits and the dB Min/Max boxes are disabled. Affects the spectrum plot only — the waterfall stays in dB.</w:t>
+      </w:r>
+    </w:p>
+    <w:p>
+      <w:pPr>
+        <w:pStyle w:val="ListBullet"/>
+      </w:pPr>
+      <w:r>
+        <w:rPr>
+          <w:b/>
+        </w:rPr>
+        <w:t>Trace</w:t>
+      </w:r>
+      <w:r>
+        <w:t xml:space="preserve">: color, line width, alpha, </w:t>
+      </w:r>
+      <w:r>
+        <w:t>label.</w:t>
+      </w:r>
+    </w:p>
+    <w:p>
+      <w:pPr>
+        <w:pStyle w:val="Heading3"/>
+      </w:pPr>
+      <w:bookmarkStart w:id="38" w:name="_Toc230435130"/>
+      <w:r>
+        <w:t>Waterfall (bottom plot)</w:t>
+      </w:r>
+      <w:bookmarkEnd w:id="38"/>
+    </w:p>
+    <w:p>
+      <w:r>
+        <w:t>Scrolling 2-D image of FFT vs. time. Newest row at the bottom.</w:t>
+      </w:r>
+    </w:p>
+    <w:p>
+      <w:pPr>
+        <w:pStyle w:val="ListBullet"/>
+      </w:pPr>
+      <w:r>
+        <w:rPr>
+          <w:b/>
+        </w:rPr>
+        <w:lastRenderedPageBreak/>
+        <w:t>Intensity Min/Max</w:t>
+      </w:r>
+      <w:r>
+        <w:t xml:space="preserve">: dB range that maps to the colormap. </w:t>
+      </w:r>
+      <w:r>
+        <w:rPr>
+          <w:b/>
+        </w:rPr>
+        <w:t>Autoscale intensity</w:t>
+      </w:r>
+      <w:r>
+        <w:t xml:space="preserve"> picks the 5%–99% percentile of the current data.</w:t>
+      </w:r>
+    </w:p>
+    <w:p>
+      <w:pPr>
+        <w:pStyle w:val="ListBullet"/>
+      </w:pPr>
+      <w:r>
+        <w:rPr>
+          <w:b/>
+        </w:rPr>
+        <w:t>Colormap</w:t>
+      </w:r>
+      <w:r>
+        <w:t>: viridis (default), plasma, inferno, magma, turbo, cividis, gray.</w:t>
+      </w:r>
+    </w:p>
+    <w:p>
+      <w:pPr>
+        <w:pStyle w:val="ListBullet"/>
+      </w:pPr>
+      <w:r>
+        <w:rPr>
+          <w:b/>
+        </w:rPr>
+        <w:t>Rows</w:t>
+      </w:r>
+      <w:r>
+        <w:t>: how many history rows to display (default 256).</w:t>
+      </w:r>
+    </w:p>
+    <w:p>
+      <w:pPr>
+        <w:pStyle w:val="Heading3"/>
+      </w:pPr>
+      <w:bookmarkStart w:id="39" w:name="_Toc230435131"/>
+      <w:r>
+        <w:t>Persistence</w:t>
+      </w:r>
+      <w:bookmarkEnd w:id="39"/>
+    </w:p>
+    <w:p>
+      <w:r>
+        <w:t xml:space="preserve">All selections are saved to a plain-text INI file and restored on next launch. The file location is shown in </w:t>
+      </w:r>
+      <w:r>
+        <w:rPr>
+          <w:b/>
+        </w:rPr>
+        <w:t>Help → About</w:t>
+      </w:r>
+      <w:r>
+        <w:t xml:space="preserve">; you can open the folder directly with the </w:t>
+      </w:r>
+      <w:r>
+        <w:rPr>
+          <w:b/>
+        </w:rPr>
+        <w:t>Open Settings Folder</w:t>
+      </w:r>
+      <w:r>
+        <w:t xml:space="preserve"> button.</w:t>
+      </w:r>
+    </w:p>
+    <w:p>
+      <w:r>
+        <w:t xml:space="preserve">To revert everything to factory defaults, use </w:t>
+      </w:r>
+      <w:r>
+        <w:rPr>
+          <w:b/>
+        </w:rPr>
+        <w:t>Restore Defaults</w:t>
+      </w:r>
+      <w:r>
+        <w:t xml:space="preserve"> in the About dialog.</w:t>
+      </w:r>
+    </w:p>
+    <w:p>
+      <w:pPr>
+        <w:pStyle w:val="Heading3"/>
+      </w:pPr>
+      <w:bookmarkStart w:id="40" w:name="_Toc230435132"/>
+      <w:r>
+        <w:t>Update checks</w:t>
+      </w:r>
+      <w:bookmarkEnd w:id="40"/>
+    </w:p>
+    <w:p>
+      <w:r>
+        <w:t xml:space="preserve">If the developer has configured a manifest URL, the program checks for a newer release in the background at launch (no more than once every 24 hours). When a newer version is found, a non-modal dialog opens with the release notes and a button that opens the download page in your browser — you can ignore it and keep using the app, or click </w:t>
+      </w:r>
+      <w:r>
+        <w:rPr>
+          <w:b/>
+        </w:rPr>
+        <w:t>Skip this version</w:t>
+      </w:r>
+      <w:r>
+        <w:t xml:space="preserve"> to not be reminded about that particular version again.</w:t>
+      </w:r>
+    </w:p>
+    <w:p>
+      <w:r>
+        <w:t xml:space="preserve">The check is read-only and never auto-downloads or auto-installs. To trigger a check manually, use </w:t>
+      </w:r>
+      <w:r>
+        <w:rPr>
+          <w:b/>
+        </w:rPr>
+        <w:t>Help → Check for Updates…</w:t>
+      </w:r>
+      <w:r>
+        <w:t xml:space="preserve">. To disable auto-checks, set </w:t>
+      </w:r>
+      <w:r>
+        <w:rPr>
+          <w:rFonts w:ascii="Consolas" w:hAnsi="Consolas"/>
+          <w:sz w:val="20"/>
+        </w:rPr>
+        <w:t>auto_check = false</w:t>
+      </w:r>
+      <w:r>
+        <w:t xml:space="preserve"> under </w:t>
+      </w:r>
+      <w:r>
+        <w:rPr>
+          <w:rFonts w:ascii="Consolas" w:hAnsi="Consolas"/>
+          <w:sz w:val="20"/>
+        </w:rPr>
+        <w:t>[updates]</w:t>
+      </w:r>
+      <w:r>
+        <w:t xml:space="preserve"> in the settings file. If the manifest URL has not been configured yet, the auto-check is silently skipped.</w:t>
+      </w:r>
+    </w:p>
+    <w:p>
+      <w:pPr>
+        <w:pStyle w:val="Heading3"/>
+      </w:pPr>
+      <w:bookmarkStart w:id="41" w:name="_Toc230435133"/>
+      <w:r>
+        <w:t>Tips for pulsar work</w:t>
+      </w:r>
+      <w:bookmarkEnd w:id="41"/>
+    </w:p>
+    <w:p>
+      <w:pPr>
+        <w:pStyle w:val="ListBullet"/>
+      </w:pPr>
+      <w:r>
+        <w:t>1422 MHz preset is centered on the neutral-hydrogen line (HI).</w:t>
+      </w:r>
+    </w:p>
+    <w:p>
+      <w:pPr>
+        <w:pStyle w:val="ListBullet"/>
+      </w:pPr>
+      <w:r>
+        <w:t>1666 MHz preset covers the OH maser band.</w:t>
+      </w:r>
+    </w:p>
+    <w:p>
+      <w:pPr>
+        <w:pStyle w:val="ListBullet"/>
+      </w:pPr>
+      <w:r>
+        <w:t xml:space="preserve">Use </w:t>
+      </w:r>
+      <w:r>
+        <w:rPr>
+          <w:b/>
+        </w:rPr>
+        <w:t>Avg α</w:t>
+      </w:r>
+      <w:r>
+        <w:t xml:space="preserve"> ≈ 0.05 and </w:t>
+      </w:r>
+      <w:r>
+        <w:rPr>
+          <w:b/>
+        </w:rPr>
+        <w:t>Max hold</w:t>
+      </w:r>
+      <w:r>
+        <w:t xml:space="preserve"> to find intermittent RFI sources.</w:t>
+      </w:r>
+    </w:p>
+    <w:p>
+      <w:pPr>
+        <w:pStyle w:val="ListBullet"/>
+      </w:pPr>
+      <w:r>
+        <w:t>The waterfall reveals time-structured interference (e.g. radar sweeps, ADS-B bursts) that the live spectrum smears out.</w:t>
       </w:r>
     </w:p>
     <w:sectPr>
@@ -6719,31 +8292,31 @@
       </w:rPr>
     </w:lvl>
   </w:abstractNum>
-  <w:num w:numId="1" w16cid:durableId="1188836227">
+  <w:num w:numId="1" w16cid:durableId="1003893812">
     <w:abstractNumId w:val="8"/>
   </w:num>
-  <w:num w:numId="2" w16cid:durableId="400257040">
+  <w:num w:numId="2" w16cid:durableId="1160268639">
     <w:abstractNumId w:val="6"/>
   </w:num>
-  <w:num w:numId="3" w16cid:durableId="394360041">
+  <w:num w:numId="3" w16cid:durableId="1239707553">
     <w:abstractNumId w:val="5"/>
   </w:num>
-  <w:num w:numId="4" w16cid:durableId="1655910633">
+  <w:num w:numId="4" w16cid:durableId="1997950097">
     <w:abstractNumId w:val="4"/>
   </w:num>
-  <w:num w:numId="5" w16cid:durableId="251820447">
+  <w:num w:numId="5" w16cid:durableId="468940398">
     <w:abstractNumId w:val="7"/>
   </w:num>
-  <w:num w:numId="6" w16cid:durableId="806094822">
+  <w:num w:numId="6" w16cid:durableId="400058824">
     <w:abstractNumId w:val="3"/>
   </w:num>
-  <w:num w:numId="7" w16cid:durableId="1499878705">
+  <w:num w:numId="7" w16cid:durableId="639965639">
     <w:abstractNumId w:val="2"/>
   </w:num>
-  <w:num w:numId="8" w16cid:durableId="1241252040">
+  <w:num w:numId="8" w16cid:durableId="1132674869">
     <w:abstractNumId w:val="1"/>
   </w:num>
-  <w:num w:numId="9" w16cid:durableId="1779907954">
+  <w:num w:numId="9" w16cid:durableId="220289261">
     <w:abstractNumId w:val="0"/>
   </w:num>
 </w:numbering>
@@ -18138,7 +19711,7 @@
     <w:autoRedefine/>
     <w:uiPriority w:val="39"/>
     <w:unhideWhenUsed/>
-    <w:rsid w:val="00332F5A"/>
+    <w:rsid w:val="00FD125D"/>
     <w:pPr>
       <w:spacing w:after="100"/>
     </w:pPr>
@@ -18150,7 +19723,7 @@
     <w:autoRedefine/>
     <w:uiPriority w:val="39"/>
     <w:unhideWhenUsed/>
-    <w:rsid w:val="00332F5A"/>
+    <w:rsid w:val="00FD125D"/>
     <w:pPr>
       <w:spacing w:after="100"/>
       <w:ind w:left="220"/>
@@ -18163,7 +19736,7 @@
     <w:autoRedefine/>
     <w:uiPriority w:val="39"/>
     <w:unhideWhenUsed/>
-    <w:rsid w:val="00332F5A"/>
+    <w:rsid w:val="00FD125D"/>
     <w:pPr>
       <w:spacing w:after="100"/>
       <w:ind w:left="440"/>
@@ -18174,7 +19747,7 @@
     <w:basedOn w:val="DefaultParagraphFont"/>
     <w:uiPriority w:val="99"/>
     <w:unhideWhenUsed/>
-    <w:rsid w:val="00332F5A"/>
+    <w:rsid w:val="00FD125D"/>
     <w:rPr>
       <w:color w:val="0000FF" w:themeColor="hyperlink"/>
       <w:u w:val="single"/>

</xml_diff>

<commit_message>
Retitle install guide cover to "DSES Spectrum Analyzer" + larger cover text
Cover-page title was still "B210 Spectrum Analyzer". Rename it and enlarge
the title-page fonts (title 26->38, subtitle 16->24, version/author/org/date
12->16). Regenerated the PDF/DOCX.
</commit_message>
<xml_diff>
--- a/DSES_RFI_Spectrum_Analyzer_Installation.docx
+++ b/DSES_RFI_Spectrum_Analyzer_Installation.docx
@@ -12,9 +12,9 @@
         <w:rPr>
           <w:b/>
           <w:color w:val="156082"/>
-          <w:sz w:val="52"/>
-        </w:rPr>
-        <w:t>B210 Spectrum Analyzer</w:t>
+          <w:sz w:val="76"/>
+        </w:rPr>
+        <w:t>DSES Spectrum Analyzer</w:t>
       </w:r>
     </w:p>
     <w:p>
@@ -25,7 +25,7 @@
         <w:rPr>
           <w:i/>
           <w:color w:val="595959"/>
-          <w:sz w:val="32"/>
+          <w:sz w:val="48"/>
         </w:rPr>
         <w:t>Installation Guide</w:t>
       </w:r>
@@ -41,7 +41,7 @@
           <w:noProof/>
         </w:rPr>
         <w:drawing>
-          <wp:inline distT="0" distB="0" distL="0" distR="0" wp14:anchorId="1E570C06" wp14:editId="0C74FF8D">
+          <wp:inline distT="0" distB="0" distL="0" distR="0" wp14:anchorId="3BF05B8F" wp14:editId="0EF54602">
             <wp:extent cx="1371600" cy="1371600"/>
             <wp:effectExtent l="0" t="0" r="0" b="0"/>
             <wp:docPr id="1" name="Picture 1"/>
@@ -87,7 +87,7 @@
       <w:r>
         <w:rPr>
           <w:color w:val="595959"/>
-          <w:sz w:val="24"/>
+          <w:sz w:val="32"/>
         </w:rPr>
         <w:t>Version 1.0.0</w:t>
       </w:r>
@@ -99,7 +99,7 @@
       <w:r>
         <w:rPr>
           <w:color w:val="595959"/>
-          <w:sz w:val="24"/>
+          <w:sz w:val="32"/>
         </w:rPr>
         <w:t>Richard M Hambly (K0GD)</w:t>
       </w:r>
@@ -111,7 +111,7 @@
       <w:r>
         <w:rPr>
           <w:color w:val="595959"/>
-          <w:sz w:val="24"/>
+          <w:sz w:val="32"/>
         </w:rPr>
         <w:t>DSES</w:t>
       </w:r>
@@ -123,7 +123,7 @@
       <w:r>
         <w:rPr>
           <w:color w:val="595959"/>
-          <w:sz w:val="24"/>
+          <w:sz w:val="32"/>
         </w:rPr>
         <w:t>May 2026</w:t>
       </w:r>
@@ -138,7 +138,7 @@
         <w:pStyle w:val="Heading1"/>
         <w:shd w:val="clear" w:color="auto" w:fill="156082"/>
       </w:pPr>
-      <w:bookmarkStart w:id="0" w:name="_Toc230435092"/>
+      <w:bookmarkStart w:id="0" w:name="_Toc230444534"/>
       <w:r>
         <w:lastRenderedPageBreak/>
         <w:t>Contents</w:t>
@@ -169,7 +169,7 @@
       <w:r>
         <w:fldChar w:fldCharType="separate"/>
       </w:r>
-      <w:hyperlink w:anchor="_Toc230435092" w:history="1">
+      <w:hyperlink w:anchor="_Toc230444534" w:history="1">
         <w:r>
           <w:rPr>
             <w:rStyle w:val="Hyperlink"/>
@@ -196,7 +196,7 @@
             <w:noProof/>
             <w:webHidden/>
           </w:rPr>
-          <w:instrText xml:space="preserve"> PAGEREF _Toc230435092 \h </w:instrText>
+          <w:instrText xml:space="preserve"> PAGEREF _Toc230444534 \h </w:instrText>
         </w:r>
         <w:r>
           <w:rPr>
@@ -242,7 +242,7 @@
           <w14:ligatures w14:val="standardContextual"/>
         </w:rPr>
       </w:pPr>
-      <w:hyperlink w:anchor="_Toc230435093" w:history="1">
+      <w:hyperlink w:anchor="_Toc230444535" w:history="1">
         <w:r>
           <w:rPr>
             <w:rStyle w:val="Hyperlink"/>
@@ -269,7 +269,7 @@
             <w:noProof/>
             <w:webHidden/>
           </w:rPr>
-          <w:instrText xml:space="preserve"> PAGEREF _Toc230435093 \h </w:instrText>
+          <w:instrText xml:space="preserve"> PAGEREF _Toc230444535 \h </w:instrText>
         </w:r>
         <w:r>
           <w:rPr>
@@ -315,7 +315,7 @@
           <w14:ligatures w14:val="standardContextual"/>
         </w:rPr>
       </w:pPr>
-      <w:hyperlink w:anchor="_Toc230435094" w:history="1">
+      <w:hyperlink w:anchor="_Toc230444536" w:history="1">
         <w:r>
           <w:rPr>
             <w:rStyle w:val="Hyperlink"/>
@@ -342,7 +342,7 @@
             <w:noProof/>
             <w:webHidden/>
           </w:rPr>
-          <w:instrText xml:space="preserve"> PAGEREF _Toc230435094 \h </w:instrText>
+          <w:instrText xml:space="preserve"> PAGEREF _Toc230444536 \h </w:instrText>
         </w:r>
         <w:r>
           <w:rPr>
@@ -388,7 +388,7 @@
           <w14:ligatures w14:val="standardContextual"/>
         </w:rPr>
       </w:pPr>
-      <w:hyperlink w:anchor="_Toc230435095" w:history="1">
+      <w:hyperlink w:anchor="_Toc230444537" w:history="1">
         <w:r>
           <w:rPr>
             <w:rStyle w:val="Hyperlink"/>
@@ -415,7 +415,7 @@
             <w:noProof/>
             <w:webHidden/>
           </w:rPr>
-          <w:instrText xml:space="preserve"> PAGEREF _Toc230435095 \h </w:instrText>
+          <w:instrText xml:space="preserve"> PAGEREF _Toc230444537 \h </w:instrText>
         </w:r>
         <w:r>
           <w:rPr>
@@ -461,7 +461,7 @@
           <w14:ligatures w14:val="standardContextual"/>
         </w:rPr>
       </w:pPr>
-      <w:hyperlink w:anchor="_Toc230435096" w:history="1">
+      <w:hyperlink w:anchor="_Toc230444538" w:history="1">
         <w:r>
           <w:rPr>
             <w:rStyle w:val="Hyperlink"/>
@@ -488,7 +488,7 @@
             <w:noProof/>
             <w:webHidden/>
           </w:rPr>
-          <w:instrText xml:space="preserve"> PAGEREF _Toc230435096 \h </w:instrText>
+          <w:instrText xml:space="preserve"> PAGEREF _Toc230444538 \h </w:instrText>
         </w:r>
         <w:r>
           <w:rPr>
@@ -534,7 +534,7 @@
           <w14:ligatures w14:val="standardContextual"/>
         </w:rPr>
       </w:pPr>
-      <w:hyperlink w:anchor="_Toc230435097" w:history="1">
+      <w:hyperlink w:anchor="_Toc230444539" w:history="1">
         <w:r>
           <w:rPr>
             <w:rStyle w:val="Hyperlink"/>
@@ -561,7 +561,7 @@
             <w:noProof/>
             <w:webHidden/>
           </w:rPr>
-          <w:instrText xml:space="preserve"> PAGEREF _Toc230435097 \h </w:instrText>
+          <w:instrText xml:space="preserve"> PAGEREF _Toc230444539 \h </w:instrText>
         </w:r>
         <w:r>
           <w:rPr>
@@ -607,7 +607,7 @@
           <w14:ligatures w14:val="standardContextual"/>
         </w:rPr>
       </w:pPr>
-      <w:hyperlink w:anchor="_Toc230435098" w:history="1">
+      <w:hyperlink w:anchor="_Toc230444540" w:history="1">
         <w:r>
           <w:rPr>
             <w:rStyle w:val="Hyperlink"/>
@@ -634,7 +634,7 @@
             <w:noProof/>
             <w:webHidden/>
           </w:rPr>
-          <w:instrText xml:space="preserve"> PAGEREF _Toc230435098 \h </w:instrText>
+          <w:instrText xml:space="preserve"> PAGEREF _Toc230444540 \h </w:instrText>
         </w:r>
         <w:r>
           <w:rPr>
@@ -680,7 +680,7 @@
           <w14:ligatures w14:val="standardContextual"/>
         </w:rPr>
       </w:pPr>
-      <w:hyperlink w:anchor="_Toc230435099" w:history="1">
+      <w:hyperlink w:anchor="_Toc230444541" w:history="1">
         <w:r>
           <w:rPr>
             <w:rStyle w:val="Hyperlink"/>
@@ -707,7 +707,7 @@
             <w:noProof/>
             <w:webHidden/>
           </w:rPr>
-          <w:instrText xml:space="preserve"> PAGEREF _Toc230435099 \h </w:instrText>
+          <w:instrText xml:space="preserve"> PAGEREF _Toc230444541 \h </w:instrText>
         </w:r>
         <w:r>
           <w:rPr>
@@ -753,7 +753,7 @@
           <w14:ligatures w14:val="standardContextual"/>
         </w:rPr>
       </w:pPr>
-      <w:hyperlink w:anchor="_Toc230435100" w:history="1">
+      <w:hyperlink w:anchor="_Toc230444542" w:history="1">
         <w:r>
           <w:rPr>
             <w:rStyle w:val="Hyperlink"/>
@@ -780,7 +780,7 @@
             <w:noProof/>
             <w:webHidden/>
           </w:rPr>
-          <w:instrText xml:space="preserve"> PAGEREF _Toc230435100 \h </w:instrText>
+          <w:instrText xml:space="preserve"> PAGEREF _Toc230444542 \h </w:instrText>
         </w:r>
         <w:r>
           <w:rPr>
@@ -826,7 +826,7 @@
           <w14:ligatures w14:val="standardContextual"/>
         </w:rPr>
       </w:pPr>
-      <w:hyperlink w:anchor="_Toc230435101" w:history="1">
+      <w:hyperlink w:anchor="_Toc230444543" w:history="1">
         <w:r>
           <w:rPr>
             <w:rStyle w:val="Hyperlink"/>
@@ -853,7 +853,7 @@
             <w:noProof/>
             <w:webHidden/>
           </w:rPr>
-          <w:instrText xml:space="preserve"> PAGEREF _Toc230435101 \h </w:instrText>
+          <w:instrText xml:space="preserve"> PAGEREF _Toc230444543 \h </w:instrText>
         </w:r>
         <w:r>
           <w:rPr>
@@ -899,7 +899,7 @@
           <w14:ligatures w14:val="standardContextual"/>
         </w:rPr>
       </w:pPr>
-      <w:hyperlink w:anchor="_Toc230435102" w:history="1">
+      <w:hyperlink w:anchor="_Toc230444544" w:history="1">
         <w:r>
           <w:rPr>
             <w:rStyle w:val="Hyperlink"/>
@@ -926,7 +926,7 @@
             <w:noProof/>
             <w:webHidden/>
           </w:rPr>
-          <w:instrText xml:space="preserve"> PAGEREF _Toc230435102 \h </w:instrText>
+          <w:instrText xml:space="preserve"> PAGEREF _Toc230444544 \h </w:instrText>
         </w:r>
         <w:r>
           <w:rPr>
@@ -972,7 +972,7 @@
           <w14:ligatures w14:val="standardContextual"/>
         </w:rPr>
       </w:pPr>
-      <w:hyperlink w:anchor="_Toc230435103" w:history="1">
+      <w:hyperlink w:anchor="_Toc230444545" w:history="1">
         <w:r>
           <w:rPr>
             <w:rStyle w:val="Hyperlink"/>
@@ -999,7 +999,7 @@
             <w:noProof/>
             <w:webHidden/>
           </w:rPr>
-          <w:instrText xml:space="preserve"> PAGEREF _Toc230435103 \h </w:instrText>
+          <w:instrText xml:space="preserve"> PAGEREF _Toc230444545 \h </w:instrText>
         </w:r>
         <w:r>
           <w:rPr>
@@ -1045,7 +1045,7 @@
           <w14:ligatures w14:val="standardContextual"/>
         </w:rPr>
       </w:pPr>
-      <w:hyperlink w:anchor="_Toc230435104" w:history="1">
+      <w:hyperlink w:anchor="_Toc230444546" w:history="1">
         <w:r>
           <w:rPr>
             <w:rStyle w:val="Hyperlink"/>
@@ -1072,7 +1072,7 @@
             <w:noProof/>
             <w:webHidden/>
           </w:rPr>
-          <w:instrText xml:space="preserve"> PAGEREF _Toc230435104 \h </w:instrText>
+          <w:instrText xml:space="preserve"> PAGEREF _Toc230444546 \h </w:instrText>
         </w:r>
         <w:r>
           <w:rPr>
@@ -1118,7 +1118,7 @@
           <w14:ligatures w14:val="standardContextual"/>
         </w:rPr>
       </w:pPr>
-      <w:hyperlink w:anchor="_Toc230435105" w:history="1">
+      <w:hyperlink w:anchor="_Toc230444547" w:history="1">
         <w:r>
           <w:rPr>
             <w:rStyle w:val="Hyperlink"/>
@@ -1145,7 +1145,7 @@
             <w:noProof/>
             <w:webHidden/>
           </w:rPr>
-          <w:instrText xml:space="preserve"> PAGEREF _Toc230435105 \h </w:instrText>
+          <w:instrText xml:space="preserve"> PAGEREF _Toc230444547 \h </w:instrText>
         </w:r>
         <w:r>
           <w:rPr>
@@ -1191,7 +1191,7 @@
           <w14:ligatures w14:val="standardContextual"/>
         </w:rPr>
       </w:pPr>
-      <w:hyperlink w:anchor="_Toc230435106" w:history="1">
+      <w:hyperlink w:anchor="_Toc230444548" w:history="1">
         <w:r>
           <w:rPr>
             <w:rStyle w:val="Hyperlink"/>
@@ -1218,7 +1218,7 @@
             <w:noProof/>
             <w:webHidden/>
           </w:rPr>
-          <w:instrText xml:space="preserve"> PAGEREF _Toc230435106 \h </w:instrText>
+          <w:instrText xml:space="preserve"> PAGEREF _Toc230444548 \h </w:instrText>
         </w:r>
         <w:r>
           <w:rPr>
@@ -1264,7 +1264,7 @@
           <w14:ligatures w14:val="standardContextual"/>
         </w:rPr>
       </w:pPr>
-      <w:hyperlink w:anchor="_Toc230435107" w:history="1">
+      <w:hyperlink w:anchor="_Toc230444549" w:history="1">
         <w:r>
           <w:rPr>
             <w:rStyle w:val="Hyperlink"/>
@@ -1291,7 +1291,7 @@
             <w:noProof/>
             <w:webHidden/>
           </w:rPr>
-          <w:instrText xml:space="preserve"> PAGEREF _Toc230435107 \h </w:instrText>
+          <w:instrText xml:space="preserve"> PAGEREF _Toc230444549 \h </w:instrText>
         </w:r>
         <w:r>
           <w:rPr>
@@ -1337,7 +1337,7 @@
           <w14:ligatures w14:val="standardContextual"/>
         </w:rPr>
       </w:pPr>
-      <w:hyperlink w:anchor="_Toc230435108" w:history="1">
+      <w:hyperlink w:anchor="_Toc230444550" w:history="1">
         <w:r>
           <w:rPr>
             <w:rStyle w:val="Hyperlink"/>
@@ -1364,7 +1364,7 @@
             <w:noProof/>
             <w:webHidden/>
           </w:rPr>
-          <w:instrText xml:space="preserve"> PAGEREF _Toc230435108 \h </w:instrText>
+          <w:instrText xml:space="preserve"> PAGEREF _Toc230444550 \h </w:instrText>
         </w:r>
         <w:r>
           <w:rPr>
@@ -1410,7 +1410,7 @@
           <w14:ligatures w14:val="standardContextual"/>
         </w:rPr>
       </w:pPr>
-      <w:hyperlink w:anchor="_Toc230435109" w:history="1">
+      <w:hyperlink w:anchor="_Toc230444551" w:history="1">
         <w:r>
           <w:rPr>
             <w:rStyle w:val="Hyperlink"/>
@@ -1437,7 +1437,7 @@
             <w:noProof/>
             <w:webHidden/>
           </w:rPr>
-          <w:instrText xml:space="preserve"> PAGEREF _Toc230435109 \h </w:instrText>
+          <w:instrText xml:space="preserve"> PAGEREF _Toc230444551 \h </w:instrText>
         </w:r>
         <w:r>
           <w:rPr>
@@ -1483,7 +1483,7 @@
           <w14:ligatures w14:val="standardContextual"/>
         </w:rPr>
       </w:pPr>
-      <w:hyperlink w:anchor="_Toc230435110" w:history="1">
+      <w:hyperlink w:anchor="_Toc230444552" w:history="1">
         <w:r>
           <w:rPr>
             <w:rStyle w:val="Hyperlink"/>
@@ -1510,7 +1510,7 @@
             <w:noProof/>
             <w:webHidden/>
           </w:rPr>
-          <w:instrText xml:space="preserve"> PAGEREF _Toc230435110 \h </w:instrText>
+          <w:instrText xml:space="preserve"> PAGEREF _Toc230444552 \h </w:instrText>
         </w:r>
         <w:r>
           <w:rPr>
@@ -1556,7 +1556,7 @@
           <w14:ligatures w14:val="standardContextual"/>
         </w:rPr>
       </w:pPr>
-      <w:hyperlink w:anchor="_Toc230435111" w:history="1">
+      <w:hyperlink w:anchor="_Toc230444553" w:history="1">
         <w:r>
           <w:rPr>
             <w:rStyle w:val="Hyperlink"/>
@@ -1583,7 +1583,7 @@
             <w:noProof/>
             <w:webHidden/>
           </w:rPr>
-          <w:instrText xml:space="preserve"> PAGEREF _Toc230435111 \h </w:instrText>
+          <w:instrText xml:space="preserve"> PAGEREF _Toc230444553 \h </w:instrText>
         </w:r>
         <w:r>
           <w:rPr>
@@ -1629,7 +1629,7 @@
           <w14:ligatures w14:val="standardContextual"/>
         </w:rPr>
       </w:pPr>
-      <w:hyperlink w:anchor="_Toc230435112" w:history="1">
+      <w:hyperlink w:anchor="_Toc230444554" w:history="1">
         <w:r>
           <w:rPr>
             <w:rStyle w:val="Hyperlink"/>
@@ -1656,7 +1656,7 @@
             <w:noProof/>
             <w:webHidden/>
           </w:rPr>
-          <w:instrText xml:space="preserve"> PAGEREF _Toc230435112 \h </w:instrText>
+          <w:instrText xml:space="preserve"> PAGEREF _Toc230444554 \h </w:instrText>
         </w:r>
         <w:r>
           <w:rPr>
@@ -1702,7 +1702,7 @@
           <w14:ligatures w14:val="standardContextual"/>
         </w:rPr>
       </w:pPr>
-      <w:hyperlink w:anchor="_Toc230435113" w:history="1">
+      <w:hyperlink w:anchor="_Toc230444555" w:history="1">
         <w:r>
           <w:rPr>
             <w:rStyle w:val="Hyperlink"/>
@@ -1729,7 +1729,7 @@
             <w:noProof/>
             <w:webHidden/>
           </w:rPr>
-          <w:instrText xml:space="preserve"> PAGEREF _Toc230435113 \h </w:instrText>
+          <w:instrText xml:space="preserve"> PAGEREF _Toc230444555 \h </w:instrText>
         </w:r>
         <w:r>
           <w:rPr>
@@ -1775,7 +1775,7 @@
           <w14:ligatures w14:val="standardContextual"/>
         </w:rPr>
       </w:pPr>
-      <w:hyperlink w:anchor="_Toc230435114" w:history="1">
+      <w:hyperlink w:anchor="_Toc230444556" w:history="1">
         <w:r>
           <w:rPr>
             <w:rStyle w:val="Hyperlink"/>
@@ -1802,7 +1802,7 @@
             <w:noProof/>
             <w:webHidden/>
           </w:rPr>
-          <w:instrText xml:space="preserve"> PAGEREF _Toc230435114 \h </w:instrText>
+          <w:instrText xml:space="preserve"> PAGEREF _Toc230444556 \h </w:instrText>
         </w:r>
         <w:r>
           <w:rPr>
@@ -1848,7 +1848,7 @@
           <w14:ligatures w14:val="standardContextual"/>
         </w:rPr>
       </w:pPr>
-      <w:hyperlink w:anchor="_Toc230435115" w:history="1">
+      <w:hyperlink w:anchor="_Toc230444557" w:history="1">
         <w:r>
           <w:rPr>
             <w:rStyle w:val="Hyperlink"/>
@@ -1875,7 +1875,7 @@
             <w:noProof/>
             <w:webHidden/>
           </w:rPr>
-          <w:instrText xml:space="preserve"> PAGEREF _Toc230435115 \h </w:instrText>
+          <w:instrText xml:space="preserve"> PAGEREF _Toc230444557 \h </w:instrText>
         </w:r>
         <w:r>
           <w:rPr>
@@ -1921,7 +1921,7 @@
           <w14:ligatures w14:val="standardContextual"/>
         </w:rPr>
       </w:pPr>
-      <w:hyperlink w:anchor="_Toc230435116" w:history="1">
+      <w:hyperlink w:anchor="_Toc230444558" w:history="1">
         <w:r>
           <w:rPr>
             <w:rStyle w:val="Hyperlink"/>
@@ -1948,7 +1948,7 @@
             <w:noProof/>
             <w:webHidden/>
           </w:rPr>
-          <w:instrText xml:space="preserve"> PAGEREF _Toc230435116 \h </w:instrText>
+          <w:instrText xml:space="preserve"> PAGEREF _Toc230444558 \h </w:instrText>
         </w:r>
         <w:r>
           <w:rPr>
@@ -1994,7 +1994,7 @@
           <w14:ligatures w14:val="standardContextual"/>
         </w:rPr>
       </w:pPr>
-      <w:hyperlink w:anchor="_Toc230435117" w:history="1">
+      <w:hyperlink w:anchor="_Toc230444559" w:history="1">
         <w:r>
           <w:rPr>
             <w:rStyle w:val="Hyperlink"/>
@@ -2021,7 +2021,7 @@
             <w:noProof/>
             <w:webHidden/>
           </w:rPr>
-          <w:instrText xml:space="preserve"> PAGEREF _Toc230435117 \h </w:instrText>
+          <w:instrText xml:space="preserve"> PAGEREF _Toc230444559 \h </w:instrText>
         </w:r>
         <w:r>
           <w:rPr>
@@ -2067,7 +2067,7 @@
           <w14:ligatures w14:val="standardContextual"/>
         </w:rPr>
       </w:pPr>
-      <w:hyperlink w:anchor="_Toc230435118" w:history="1">
+      <w:hyperlink w:anchor="_Toc230444560" w:history="1">
         <w:r>
           <w:rPr>
             <w:rStyle w:val="Hyperlink"/>
@@ -2094,7 +2094,7 @@
             <w:noProof/>
             <w:webHidden/>
           </w:rPr>
-          <w:instrText xml:space="preserve"> PAGEREF _Toc230435118 \h </w:instrText>
+          <w:instrText xml:space="preserve"> PAGEREF _Toc230444560 \h </w:instrText>
         </w:r>
         <w:r>
           <w:rPr>
@@ -2140,7 +2140,7 @@
           <w14:ligatures w14:val="standardContextual"/>
         </w:rPr>
       </w:pPr>
-      <w:hyperlink w:anchor="_Toc230435119" w:history="1">
+      <w:hyperlink w:anchor="_Toc230444561" w:history="1">
         <w:r>
           <w:rPr>
             <w:rStyle w:val="Hyperlink"/>
@@ -2167,7 +2167,7 @@
             <w:noProof/>
             <w:webHidden/>
           </w:rPr>
-          <w:instrText xml:space="preserve"> PAGEREF _Toc230435119 \h </w:instrText>
+          <w:instrText xml:space="preserve"> PAGEREF _Toc230444561 \h </w:instrText>
         </w:r>
         <w:r>
           <w:rPr>
@@ -2213,7 +2213,7 @@
           <w14:ligatures w14:val="standardContextual"/>
         </w:rPr>
       </w:pPr>
-      <w:hyperlink w:anchor="_Toc230435120" w:history="1">
+      <w:hyperlink w:anchor="_Toc230444562" w:history="1">
         <w:r>
           <w:rPr>
             <w:rStyle w:val="Hyperlink"/>
@@ -2240,7 +2240,7 @@
             <w:noProof/>
             <w:webHidden/>
           </w:rPr>
-          <w:instrText xml:space="preserve"> PAGEREF _Toc230435120 \h </w:instrText>
+          <w:instrText xml:space="preserve"> PAGEREF _Toc230444562 \h </w:instrText>
         </w:r>
         <w:r>
           <w:rPr>
@@ -2286,7 +2286,7 @@
           <w14:ligatures w14:val="standardContextual"/>
         </w:rPr>
       </w:pPr>
-      <w:hyperlink w:anchor="_Toc230435121" w:history="1">
+      <w:hyperlink w:anchor="_Toc230444563" w:history="1">
         <w:r>
           <w:rPr>
             <w:rStyle w:val="Hyperlink"/>
@@ -2313,7 +2313,7 @@
             <w:noProof/>
             <w:webHidden/>
           </w:rPr>
-          <w:instrText xml:space="preserve"> PAGEREF _Toc230435121 \h </w:instrText>
+          <w:instrText xml:space="preserve"> PAGEREF _Toc230444563 \h </w:instrText>
         </w:r>
         <w:r>
           <w:rPr>
@@ -2359,7 +2359,7 @@
           <w14:ligatures w14:val="standardContextual"/>
         </w:rPr>
       </w:pPr>
-      <w:hyperlink w:anchor="_Toc230435122" w:history="1">
+      <w:hyperlink w:anchor="_Toc230444564" w:history="1">
         <w:r>
           <w:rPr>
             <w:rStyle w:val="Hyperlink"/>
@@ -2386,7 +2386,7 @@
             <w:noProof/>
             <w:webHidden/>
           </w:rPr>
-          <w:instrText xml:space="preserve"> PAGEREF _Toc230435122 \h </w:instrText>
+          <w:instrText xml:space="preserve"> PAGEREF _Toc230444564 \h </w:instrText>
         </w:r>
         <w:r>
           <w:rPr>
@@ -2432,7 +2432,7 @@
           <w14:ligatures w14:val="standardContextual"/>
         </w:rPr>
       </w:pPr>
-      <w:hyperlink w:anchor="_Toc230435123" w:history="1">
+      <w:hyperlink w:anchor="_Toc230444565" w:history="1">
         <w:r>
           <w:rPr>
             <w:rStyle w:val="Hyperlink"/>
@@ -2459,7 +2459,7 @@
             <w:noProof/>
             <w:webHidden/>
           </w:rPr>
-          <w:instrText xml:space="preserve"> PAGEREF _Toc230435123 \h </w:instrText>
+          <w:instrText xml:space="preserve"> PAGEREF _Toc230444565 \h </w:instrText>
         </w:r>
         <w:r>
           <w:rPr>
@@ -2505,7 +2505,7 @@
           <w14:ligatures w14:val="standardContextual"/>
         </w:rPr>
       </w:pPr>
-      <w:hyperlink w:anchor="_Toc230435124" w:history="1">
+      <w:hyperlink w:anchor="_Toc230444566" w:history="1">
         <w:r>
           <w:rPr>
             <w:rStyle w:val="Hyperlink"/>
@@ -2532,7 +2532,7 @@
             <w:noProof/>
             <w:webHidden/>
           </w:rPr>
-          <w:instrText xml:space="preserve"> PAGEREF _Toc230435124 \h </w:instrText>
+          <w:instrText xml:space="preserve"> PAGEREF _Toc230444566 \h </w:instrText>
         </w:r>
         <w:r>
           <w:rPr>
@@ -2578,7 +2578,7 @@
           <w14:ligatures w14:val="standardContextual"/>
         </w:rPr>
       </w:pPr>
-      <w:hyperlink w:anchor="_Toc230435125" w:history="1">
+      <w:hyperlink w:anchor="_Toc230444567" w:history="1">
         <w:r>
           <w:rPr>
             <w:rStyle w:val="Hyperlink"/>
@@ -2605,7 +2605,7 @@
             <w:noProof/>
             <w:webHidden/>
           </w:rPr>
-          <w:instrText xml:space="preserve"> PAGEREF _Toc230435125 \h </w:instrText>
+          <w:instrText xml:space="preserve"> PAGEREF _Toc230444567 \h </w:instrText>
         </w:r>
         <w:r>
           <w:rPr>
@@ -2651,7 +2651,7 @@
           <w14:ligatures w14:val="standardContextual"/>
         </w:rPr>
       </w:pPr>
-      <w:hyperlink w:anchor="_Toc230435126" w:history="1">
+      <w:hyperlink w:anchor="_Toc230444568" w:history="1">
         <w:r>
           <w:rPr>
             <w:rStyle w:val="Hyperlink"/>
@@ -2678,7 +2678,7 @@
             <w:noProof/>
             <w:webHidden/>
           </w:rPr>
-          <w:instrText xml:space="preserve"> PAGEREF _Toc230435126 \h </w:instrText>
+          <w:instrText xml:space="preserve"> PAGEREF _Toc230444568 \h </w:instrText>
         </w:r>
         <w:r>
           <w:rPr>
@@ -2724,7 +2724,7 @@
           <w14:ligatures w14:val="standardContextual"/>
         </w:rPr>
       </w:pPr>
-      <w:hyperlink w:anchor="_Toc230435127" w:history="1">
+      <w:hyperlink w:anchor="_Toc230444569" w:history="1">
         <w:r>
           <w:rPr>
             <w:rStyle w:val="Hyperlink"/>
@@ -2751,7 +2751,7 @@
             <w:noProof/>
             <w:webHidden/>
           </w:rPr>
-          <w:instrText xml:space="preserve"> PAGEREF _Toc230435127 \h </w:instrText>
+          <w:instrText xml:space="preserve"> PAGEREF _Toc230444569 \h </w:instrText>
         </w:r>
         <w:r>
           <w:rPr>
@@ -2797,7 +2797,7 @@
           <w14:ligatures w14:val="standardContextual"/>
         </w:rPr>
       </w:pPr>
-      <w:hyperlink w:anchor="_Toc230435128" w:history="1">
+      <w:hyperlink w:anchor="_Toc230444570" w:history="1">
         <w:r>
           <w:rPr>
             <w:rStyle w:val="Hyperlink"/>
@@ -2824,7 +2824,7 @@
             <w:noProof/>
             <w:webHidden/>
           </w:rPr>
-          <w:instrText xml:space="preserve"> PAGEREF _Toc230435128 \h </w:instrText>
+          <w:instrText xml:space="preserve"> PAGEREF _Toc230444570 \h </w:instrText>
         </w:r>
         <w:r>
           <w:rPr>
@@ -2870,7 +2870,7 @@
           <w14:ligatures w14:val="standardContextual"/>
         </w:rPr>
       </w:pPr>
-      <w:hyperlink w:anchor="_Toc230435129" w:history="1">
+      <w:hyperlink w:anchor="_Toc230444571" w:history="1">
         <w:r>
           <w:rPr>
             <w:rStyle w:val="Hyperlink"/>
@@ -2897,7 +2897,7 @@
             <w:noProof/>
             <w:webHidden/>
           </w:rPr>
-          <w:instrText xml:space="preserve"> PAGEREF _Toc230435129 \h </w:instrText>
+          <w:instrText xml:space="preserve"> PAGEREF _Toc230444571 \h </w:instrText>
         </w:r>
         <w:r>
           <w:rPr>
@@ -2943,7 +2943,7 @@
           <w14:ligatures w14:val="standardContextual"/>
         </w:rPr>
       </w:pPr>
-      <w:hyperlink w:anchor="_Toc230435130" w:history="1">
+      <w:hyperlink w:anchor="_Toc230444572" w:history="1">
         <w:r>
           <w:rPr>
             <w:rStyle w:val="Hyperlink"/>
@@ -2970,7 +2970,7 @@
             <w:noProof/>
             <w:webHidden/>
           </w:rPr>
-          <w:instrText xml:space="preserve"> PAGEREF _Toc230435130 \h </w:instrText>
+          <w:instrText xml:space="preserve"> PAGEREF _Toc230444572 \h </w:instrText>
         </w:r>
         <w:r>
           <w:rPr>
@@ -3016,7 +3016,7 @@
           <w14:ligatures w14:val="standardContextual"/>
         </w:rPr>
       </w:pPr>
-      <w:hyperlink w:anchor="_Toc230435131" w:history="1">
+      <w:hyperlink w:anchor="_Toc230444573" w:history="1">
         <w:r>
           <w:rPr>
             <w:rStyle w:val="Hyperlink"/>
@@ -3043,7 +3043,7 @@
             <w:noProof/>
             <w:webHidden/>
           </w:rPr>
-          <w:instrText xml:space="preserve"> PAGEREF _Toc230435131 \h </w:instrText>
+          <w:instrText xml:space="preserve"> PAGEREF _Toc230444573 \h </w:instrText>
         </w:r>
         <w:r>
           <w:rPr>
@@ -3089,7 +3089,7 @@
           <w14:ligatures w14:val="standardContextual"/>
         </w:rPr>
       </w:pPr>
-      <w:hyperlink w:anchor="_Toc230435132" w:history="1">
+      <w:hyperlink w:anchor="_Toc230444574" w:history="1">
         <w:r>
           <w:rPr>
             <w:rStyle w:val="Hyperlink"/>
@@ -3116,7 +3116,7 @@
             <w:noProof/>
             <w:webHidden/>
           </w:rPr>
-          <w:instrText xml:space="preserve"> PAGEREF _Toc230435132 \h </w:instrText>
+          <w:instrText xml:space="preserve"> PAGEREF _Toc230444574 \h </w:instrText>
         </w:r>
         <w:r>
           <w:rPr>
@@ -3162,7 +3162,7 @@
           <w14:ligatures w14:val="standardContextual"/>
         </w:rPr>
       </w:pPr>
-      <w:hyperlink w:anchor="_Toc230435133" w:history="1">
+      <w:hyperlink w:anchor="_Toc230444575" w:history="1">
         <w:r>
           <w:rPr>
             <w:rStyle w:val="Hyperlink"/>
@@ -3189,7 +3189,7 @@
             <w:noProof/>
             <w:webHidden/>
           </w:rPr>
-          <w:instrText xml:space="preserve"> PAGEREF _Toc230435133 \h </w:instrText>
+          <w:instrText xml:space="preserve"> PAGEREF _Toc230444575 \h </w:instrText>
         </w:r>
         <w:r>
           <w:rPr>
@@ -3235,7 +3235,7 @@
         <w:pStyle w:val="Heading1"/>
         <w:shd w:val="clear" w:color="auto" w:fill="156082"/>
       </w:pPr>
-      <w:bookmarkStart w:id="1" w:name="_Toc230435093"/>
+      <w:bookmarkStart w:id="1" w:name="_Toc230444535"/>
       <w:r>
         <w:lastRenderedPageBreak/>
         <w:t xml:space="preserve">DSES Spectrum Analyzer — </w:t>
@@ -3314,7 +3314,7 @@
       <w:pPr>
         <w:pStyle w:val="Heading2"/>
       </w:pPr>
-      <w:bookmarkStart w:id="2" w:name="_Toc230435094"/>
+      <w:bookmarkStart w:id="2" w:name="_Toc230444536"/>
       <w:r>
         <w:t>1. What the recipient needs to know first</w:t>
       </w:r>
@@ -3388,7 +3388,7 @@
       <w:pPr>
         <w:pStyle w:val="Heading3"/>
       </w:pPr>
-      <w:bookmarkStart w:id="3" w:name="_Toc230435095"/>
+      <w:bookmarkStart w:id="3" w:name="_Toc230444537"/>
       <w:r>
         <w:t>System requirements</w:t>
       </w:r>
@@ -3667,7 +3667,7 @@
       <w:pPr>
         <w:pStyle w:val="Heading2"/>
       </w:pPr>
-      <w:bookmarkStart w:id="4" w:name="_Toc230435096"/>
+      <w:bookmarkStart w:id="4" w:name="_Toc230444538"/>
       <w:r>
         <w:t>2. Installing Radioconda</w:t>
       </w:r>
@@ -3677,7 +3677,7 @@
       <w:pPr>
         <w:pStyle w:val="Heading3"/>
       </w:pPr>
-      <w:bookmarkStart w:id="5" w:name="_Toc230435097"/>
+      <w:bookmarkStart w:id="5" w:name="_Toc230444539"/>
       <w:r>
         <w:t>2.1 Windows 11</w:t>
       </w:r>
@@ -3854,7 +3854,7 @@
       <w:pPr>
         <w:pStyle w:val="Heading3"/>
       </w:pPr>
-      <w:bookmarkStart w:id="6" w:name="_Toc230435098"/>
+      <w:bookmarkStart w:id="6" w:name="_Toc230444540"/>
       <w:r>
         <w:t>2.2 Linux</w:t>
       </w:r>
@@ -4059,7 +4059,7 @@
       <w:pPr>
         <w:pStyle w:val="Heading3"/>
       </w:pPr>
-      <w:bookmarkStart w:id="7" w:name="_Toc230435099"/>
+      <w:bookmarkStart w:id="7" w:name="_Toc230444541"/>
       <w:r>
         <w:t>2.3 macOS (Intel and Apple Silicon)</w:t>
       </w:r>
@@ -4296,7 +4296,7 @@
       <w:pPr>
         <w:pStyle w:val="Heading2"/>
       </w:pPr>
-      <w:bookmarkStart w:id="8" w:name="_Toc230435100"/>
+      <w:bookmarkStart w:id="8" w:name="_Toc230444542"/>
       <w:r>
         <w:t>3. Installing the DSES Spectrum Analyzer</w:t>
       </w:r>
@@ -4355,7 +4355,7 @@
       <w:pPr>
         <w:pStyle w:val="Heading3"/>
       </w:pPr>
-      <w:bookmarkStart w:id="9" w:name="_Toc230435101"/>
+      <w:bookmarkStart w:id="9" w:name="_Toc230444543"/>
       <w:r>
         <w:t>3.1 Windows 11</w:t>
       </w:r>
@@ -4560,7 +4560,7 @@
       <w:pPr>
         <w:pStyle w:val="Heading3"/>
       </w:pPr>
-      <w:bookmarkStart w:id="10" w:name="_Toc230435102"/>
+      <w:bookmarkStart w:id="10" w:name="_Toc230444544"/>
       <w:r>
         <w:t>3.2 Linux</w:t>
       </w:r>
@@ -4752,7 +4752,7 @@
       <w:pPr>
         <w:pStyle w:val="Heading3"/>
       </w:pPr>
-      <w:bookmarkStart w:id="11" w:name="_Toc230435103"/>
+      <w:bookmarkStart w:id="11" w:name="_Toc230444545"/>
       <w:r>
         <w:lastRenderedPageBreak/>
         <w:t>3.3 macOS</w:t>
@@ -4906,7 +4906,7 @@
       <w:pPr>
         <w:pStyle w:val="Heading2"/>
       </w:pPr>
-      <w:bookmarkStart w:id="12" w:name="_Toc230435104"/>
+      <w:bookmarkStart w:id="12" w:name="_Toc230444546"/>
       <w:r>
         <w:t>3A. Extra setup for SDRPlay receivers (RSP1A / RSP1B / RSPduo / RSPdx)</w:t>
       </w:r>
@@ -4941,7 +4941,7 @@
       <w:pPr>
         <w:pStyle w:val="Heading3"/>
       </w:pPr>
-      <w:bookmarkStart w:id="13" w:name="_Toc230435105"/>
+      <w:bookmarkStart w:id="13" w:name="_Toc230444547"/>
       <w:r>
         <w:t>3A.1 Install the SDRplay API</w:t>
       </w:r>
@@ -5053,7 +5053,7 @@
       <w:pPr>
         <w:pStyle w:val="Heading3"/>
       </w:pPr>
-      <w:bookmarkStart w:id="14" w:name="_Toc230435106"/>
+      <w:bookmarkStart w:id="14" w:name="_Toc230444548"/>
       <w:r>
         <w:t>3A.2 Install the SoapySDRPlay module</w:t>
       </w:r>
@@ -5422,7 +5422,7 @@
       <w:pPr>
         <w:pStyle w:val="Heading2"/>
       </w:pPr>
-      <w:bookmarkStart w:id="15" w:name="_Toc230435107"/>
+      <w:bookmarkStart w:id="15" w:name="_Toc230444549"/>
       <w:r>
         <w:t>4. First-run checklist</w:t>
       </w:r>
@@ -5535,7 +5535,7 @@
       <w:pPr>
         <w:pStyle w:val="Heading3"/>
       </w:pPr>
-      <w:bookmarkStart w:id="16" w:name="_Toc230435108"/>
+      <w:bookmarkStart w:id="16" w:name="_Toc230444550"/>
       <w:r>
         <w:t>Recommended one-time VOLK tuning</w:t>
       </w:r>
@@ -5678,7 +5678,7 @@
       <w:pPr>
         <w:pStyle w:val="Heading2"/>
       </w:pPr>
-      <w:bookmarkStart w:id="17" w:name="_Toc230435109"/>
+      <w:bookmarkStart w:id="17" w:name="_Toc230444551"/>
       <w:r>
         <w:t>5. Updating to a new version</w:t>
       </w:r>
@@ -5688,7 +5688,7 @@
       <w:pPr>
         <w:pStyle w:val="Heading3"/>
       </w:pPr>
-      <w:bookmarkStart w:id="18" w:name="_Toc230435110"/>
+      <w:bookmarkStart w:id="18" w:name="_Toc230444552"/>
       <w:r>
         <w:t>Auto-update notifications</w:t>
       </w:r>
@@ -5779,7 +5779,7 @@
       <w:pPr>
         <w:pStyle w:val="Heading3"/>
       </w:pPr>
-      <w:bookmarkStart w:id="19" w:name="_Toc230435111"/>
+      <w:bookmarkStart w:id="19" w:name="_Toc230444553"/>
       <w:r>
         <w:lastRenderedPageBreak/>
         <w:t>Performing the update</w:t>
@@ -5876,7 +5876,7 @@
       <w:pPr>
         <w:pStyle w:val="Heading3"/>
       </w:pPr>
-      <w:bookmarkStart w:id="20" w:name="_Toc230435112"/>
+      <w:bookmarkStart w:id="20" w:name="_Toc230444554"/>
       <w:r>
         <w:t>What is preserved across versions</w:t>
       </w:r>
@@ -6059,7 +6059,7 @@
       <w:pPr>
         <w:pStyle w:val="Heading3"/>
       </w:pPr>
-      <w:bookmarkStart w:id="21" w:name="_Toc230435113"/>
+      <w:bookmarkStart w:id="21" w:name="_Toc230444555"/>
       <w:r>
         <w:t>Backing up your settings</w:t>
       </w:r>
@@ -6118,7 +6118,7 @@
       <w:pPr>
         <w:pStyle w:val="Heading2"/>
       </w:pPr>
-      <w:bookmarkStart w:id="22" w:name="_Toc230435114"/>
+      <w:bookmarkStart w:id="22" w:name="_Toc230444556"/>
       <w:r>
         <w:t>6. Troubleshooting</w:t>
       </w:r>
@@ -6128,7 +6128,7 @@
       <w:pPr>
         <w:pStyle w:val="Heading3"/>
       </w:pPr>
-      <w:bookmarkStart w:id="23" w:name="_Toc230435115"/>
+      <w:bookmarkStart w:id="23" w:name="_Toc230444557"/>
       <w:r>
         <w:t>“Radioconda not found in standard locations”</w:t>
       </w:r>
@@ -6189,7 +6189,7 @@
       <w:pPr>
         <w:pStyle w:val="Heading3"/>
       </w:pPr>
-      <w:bookmarkStart w:id="24" w:name="_Toc230435116"/>
+      <w:bookmarkStart w:id="24" w:name="_Toc230444558"/>
       <w:r>
         <w:lastRenderedPageBreak/>
         <w:t>“No UHD Devices Found”</w:t>
@@ -6288,7 +6288,7 @@
       <w:pPr>
         <w:pStyle w:val="Heading3"/>
       </w:pPr>
-      <w:bookmarkStart w:id="25" w:name="_Toc230435117"/>
+      <w:bookmarkStart w:id="25" w:name="_Toc230444559"/>
       <w:r>
         <w:t>Persistent “O” overflows at high sample rates</w:t>
       </w:r>
@@ -6332,7 +6332,7 @@
       <w:pPr>
         <w:pStyle w:val="Heading3"/>
       </w:pPr>
-      <w:bookmarkStart w:id="26" w:name="_Toc230435118"/>
+      <w:bookmarkStart w:id="26" w:name="_Toc230444560"/>
       <w:r>
         <w:t>Spectrum looks flat at −140 dB</w:t>
       </w:r>
@@ -6371,7 +6371,7 @@
       <w:pPr>
         <w:pStyle w:val="Heading3"/>
       </w:pPr>
-      <w:bookmarkStart w:id="27" w:name="_Toc230435119"/>
+      <w:bookmarkStart w:id="27" w:name="_Toc230444561"/>
       <w:r>
         <w:t>macOS: “developer cannot be verified”</w:t>
       </w:r>
@@ -6407,7 +6407,7 @@
       <w:pPr>
         <w:pStyle w:val="Heading3"/>
       </w:pPr>
-      <w:bookmarkStart w:id="28" w:name="_Toc230435120"/>
+      <w:bookmarkStart w:id="28" w:name="_Toc230444562"/>
       <w:r>
         <w:t>Settings won’t persist</w:t>
       </w:r>
@@ -6460,7 +6460,7 @@
       <w:pPr>
         <w:pStyle w:val="Heading2"/>
       </w:pPr>
-      <w:bookmarkStart w:id="29" w:name="_Toc230435121"/>
+      <w:bookmarkStart w:id="29" w:name="_Toc230444563"/>
       <w:r>
         <w:t>7. Appendix A — Settings file reference</w:t>
       </w:r>
@@ -6669,7 +6669,7 @@
       <w:pPr>
         <w:pStyle w:val="Heading2"/>
       </w:pPr>
-      <w:bookmarkStart w:id="30" w:name="_Toc230435122"/>
+      <w:bookmarkStart w:id="30" w:name="_Toc230444564"/>
       <w:r>
         <w:t>8. Appendix B — Device selection and SigMF playback</w:t>
       </w:r>
@@ -6679,7 +6679,7 @@
       <w:pPr>
         <w:pStyle w:val="Heading3"/>
       </w:pPr>
-      <w:bookmarkStart w:id="31" w:name="_Toc230435123"/>
+      <w:bookmarkStart w:id="31" w:name="_Toc230444565"/>
       <w:r>
         <w:t>Choosing among multiple radios</w:t>
       </w:r>
@@ -6857,7 +6857,7 @@
       <w:pPr>
         <w:pStyle w:val="Heading3"/>
       </w:pPr>
-      <w:bookmarkStart w:id="32" w:name="_Toc230435124"/>
+      <w:bookmarkStart w:id="32" w:name="_Toc230444566"/>
       <w:r>
         <w:t>SigMF playback mode (no-device fallback)</w:t>
       </w:r>
@@ -7058,7 +7058,7 @@
       <w:pPr>
         <w:pStyle w:val="Heading2"/>
       </w:pPr>
-      <w:bookmarkStart w:id="33" w:name="_Toc230435125"/>
+      <w:bookmarkStart w:id="33" w:name="_Toc230444567"/>
       <w:r>
         <w:t>9. Appendix C — Operating Guide</w:t>
       </w:r>
@@ -7087,7 +7087,7 @@
       <w:pPr>
         <w:pStyle w:val="Heading3"/>
       </w:pPr>
-      <w:bookmarkStart w:id="34" w:name="_Toc230435126"/>
+      <w:bookmarkStart w:id="34" w:name="_Toc230444568"/>
       <w:r>
         <w:t>Starting up — device selection</w:t>
       </w:r>
@@ -7192,7 +7192,7 @@
       <w:pPr>
         <w:pStyle w:val="Heading3"/>
       </w:pPr>
-      <w:bookmarkStart w:id="35" w:name="_Toc230435127"/>
+      <w:bookmarkStart w:id="35" w:name="_Toc230444569"/>
       <w:r>
         <w:t>Playback mode</w:t>
       </w:r>
@@ -7318,7 +7318,7 @@
       <w:pPr>
         <w:pStyle w:val="Heading3"/>
       </w:pPr>
-      <w:bookmarkStart w:id="36" w:name="_Toc230435128"/>
+      <w:bookmarkStart w:id="36" w:name="_Toc230444570"/>
       <w:r>
         <w:t>Sidebar controls (right side)</w:t>
       </w:r>
@@ -7599,7 +7599,7 @@
       <w:pPr>
         <w:pStyle w:val="Heading3"/>
       </w:pPr>
-      <w:bookmarkStart w:id="37" w:name="_Toc230435129"/>
+      <w:bookmarkStart w:id="37" w:name="_Toc230444571"/>
       <w:r>
         <w:t>Spectrum (top plot)</w:t>
       </w:r>
@@ -7742,7 +7742,7 @@
       <w:pPr>
         <w:pStyle w:val="Heading3"/>
       </w:pPr>
-      <w:bookmarkStart w:id="38" w:name="_Toc230435130"/>
+      <w:bookmarkStart w:id="38" w:name="_Toc230444572"/>
       <w:r>
         <w:t>Waterfall (bottom plot)</w:t>
       </w:r>
@@ -7809,7 +7809,7 @@
       <w:pPr>
         <w:pStyle w:val="Heading3"/>
       </w:pPr>
-      <w:bookmarkStart w:id="39" w:name="_Toc230435131"/>
+      <w:bookmarkStart w:id="39" w:name="_Toc230444573"/>
       <w:r>
         <w:t>Persistence</w:t>
       </w:r>
@@ -7856,7 +7856,7 @@
       <w:pPr>
         <w:pStyle w:val="Heading3"/>
       </w:pPr>
-      <w:bookmarkStart w:id="40" w:name="_Toc230435132"/>
+      <w:bookmarkStart w:id="40" w:name="_Toc230444574"/>
       <w:r>
         <w:t>Update checks</w:t>
       </w:r>
@@ -7914,7 +7914,7 @@
       <w:pPr>
         <w:pStyle w:val="Heading3"/>
       </w:pPr>
-      <w:bookmarkStart w:id="41" w:name="_Toc230435133"/>
+      <w:bookmarkStart w:id="41" w:name="_Toc230444575"/>
       <w:r>
         <w:t>Tips for pulsar work</w:t>
       </w:r>
@@ -8292,31 +8292,31 @@
       </w:rPr>
     </w:lvl>
   </w:abstractNum>
-  <w:num w:numId="1" w16cid:durableId="1003893812">
+  <w:num w:numId="1" w16cid:durableId="1654025250">
     <w:abstractNumId w:val="8"/>
   </w:num>
-  <w:num w:numId="2" w16cid:durableId="1160268639">
+  <w:num w:numId="2" w16cid:durableId="1887178433">
     <w:abstractNumId w:val="6"/>
   </w:num>
-  <w:num w:numId="3" w16cid:durableId="1239707553">
+  <w:num w:numId="3" w16cid:durableId="1714304887">
     <w:abstractNumId w:val="5"/>
   </w:num>
-  <w:num w:numId="4" w16cid:durableId="1997950097">
+  <w:num w:numId="4" w16cid:durableId="78915479">
     <w:abstractNumId w:val="4"/>
   </w:num>
-  <w:num w:numId="5" w16cid:durableId="468940398">
+  <w:num w:numId="5" w16cid:durableId="1053238674">
     <w:abstractNumId w:val="7"/>
   </w:num>
-  <w:num w:numId="6" w16cid:durableId="400058824">
+  <w:num w:numId="6" w16cid:durableId="1088112628">
     <w:abstractNumId w:val="3"/>
   </w:num>
-  <w:num w:numId="7" w16cid:durableId="639965639">
+  <w:num w:numId="7" w16cid:durableId="561259652">
     <w:abstractNumId w:val="2"/>
   </w:num>
-  <w:num w:numId="8" w16cid:durableId="1132674869">
+  <w:num w:numId="8" w16cid:durableId="1143890558">
     <w:abstractNumId w:val="1"/>
   </w:num>
-  <w:num w:numId="9" w16cid:durableId="220289261">
+  <w:num w:numId="9" w16cid:durableId="579172002">
     <w:abstractNumId w:val="0"/>
   </w:num>
 </w:numbering>
@@ -19711,7 +19711,7 @@
     <w:autoRedefine/>
     <w:uiPriority w:val="39"/>
     <w:unhideWhenUsed/>
-    <w:rsid w:val="00FD125D"/>
+    <w:rsid w:val="00485157"/>
     <w:pPr>
       <w:spacing w:after="100"/>
     </w:pPr>
@@ -19723,7 +19723,7 @@
     <w:autoRedefine/>
     <w:uiPriority w:val="39"/>
     <w:unhideWhenUsed/>
-    <w:rsid w:val="00FD125D"/>
+    <w:rsid w:val="00485157"/>
     <w:pPr>
       <w:spacing w:after="100"/>
       <w:ind w:left="220"/>
@@ -19736,7 +19736,7 @@
     <w:autoRedefine/>
     <w:uiPriority w:val="39"/>
     <w:unhideWhenUsed/>
-    <w:rsid w:val="00FD125D"/>
+    <w:rsid w:val="00485157"/>
     <w:pPr>
       <w:spacing w:after="100"/>
       <w:ind w:left="440"/>
@@ -19747,7 +19747,7 @@
     <w:basedOn w:val="DefaultParagraphFont"/>
     <w:uiPriority w:val="99"/>
     <w:unhideWhenUsed/>
-    <w:rsid w:val="00FD125D"/>
+    <w:rsid w:val="00485157"/>
     <w:rPr>
       <w:color w:val="0000FF" w:themeColor="hyperlink"/>
       <w:u w:val="single"/>

</xml_diff>

<commit_message>
Set page header to full title; drop header/footer on the cover page
Header line 1 now reads "DSES Spectrum Analyzer" (was "DSES"). Enable a
distinct, empty first-page header/footer so the cover page has neither;
the title/subtitle header and date/page footer apply from page 2 on.
Regenerated PDF/DOCX.
</commit_message>
<xml_diff>
--- a/DSES_RFI_Spectrum_Analyzer_Installation.docx
+++ b/DSES_RFI_Spectrum_Analyzer_Installation.docx
@@ -41,7 +41,7 @@
           <w:noProof/>
         </w:rPr>
         <w:drawing>
-          <wp:inline distT="0" distB="0" distL="0" distR="0" wp14:anchorId="3BF05B8F" wp14:editId="0EF54602">
+          <wp:inline distT="0" distB="0" distL="0" distR="0" wp14:anchorId="4D14D9C9" wp14:editId="33F3CACA">
             <wp:extent cx="1371600" cy="1371600"/>
             <wp:effectExtent l="0" t="0" r="0" b="0"/>
             <wp:docPr id="1" name="Picture 1"/>
@@ -138,7 +138,7 @@
         <w:pStyle w:val="Heading1"/>
         <w:shd w:val="clear" w:color="auto" w:fill="156082"/>
       </w:pPr>
-      <w:bookmarkStart w:id="0" w:name="_Toc230444534"/>
+      <w:bookmarkStart w:id="0" w:name="_Toc230444922"/>
       <w:r>
         <w:lastRenderedPageBreak/>
         <w:t>Contents</w:t>
@@ -169,7 +169,7 @@
       <w:r>
         <w:fldChar w:fldCharType="separate"/>
       </w:r>
-      <w:hyperlink w:anchor="_Toc230444534" w:history="1">
+      <w:hyperlink w:anchor="_Toc230444922" w:history="1">
         <w:r>
           <w:rPr>
             <w:rStyle w:val="Hyperlink"/>
@@ -196,7 +196,7 @@
             <w:noProof/>
             <w:webHidden/>
           </w:rPr>
-          <w:instrText xml:space="preserve"> PAGEREF _Toc230444534 \h </w:instrText>
+          <w:instrText xml:space="preserve"> PAGEREF _Toc230444922 \h </w:instrText>
         </w:r>
         <w:r>
           <w:rPr>
@@ -242,7 +242,7 @@
           <w14:ligatures w14:val="standardContextual"/>
         </w:rPr>
       </w:pPr>
-      <w:hyperlink w:anchor="_Toc230444535" w:history="1">
+      <w:hyperlink w:anchor="_Toc230444923" w:history="1">
         <w:r>
           <w:rPr>
             <w:rStyle w:val="Hyperlink"/>
@@ -269,7 +269,7 @@
             <w:noProof/>
             <w:webHidden/>
           </w:rPr>
-          <w:instrText xml:space="preserve"> PAGEREF _Toc230444535 \h </w:instrText>
+          <w:instrText xml:space="preserve"> PAGEREF _Toc230444923 \h </w:instrText>
         </w:r>
         <w:r>
           <w:rPr>
@@ -315,7 +315,7 @@
           <w14:ligatures w14:val="standardContextual"/>
         </w:rPr>
       </w:pPr>
-      <w:hyperlink w:anchor="_Toc230444536" w:history="1">
+      <w:hyperlink w:anchor="_Toc230444924" w:history="1">
         <w:r>
           <w:rPr>
             <w:rStyle w:val="Hyperlink"/>
@@ -342,7 +342,7 @@
             <w:noProof/>
             <w:webHidden/>
           </w:rPr>
-          <w:instrText xml:space="preserve"> PAGEREF _Toc230444536 \h </w:instrText>
+          <w:instrText xml:space="preserve"> PAGEREF _Toc230444924 \h </w:instrText>
         </w:r>
         <w:r>
           <w:rPr>
@@ -388,7 +388,7 @@
           <w14:ligatures w14:val="standardContextual"/>
         </w:rPr>
       </w:pPr>
-      <w:hyperlink w:anchor="_Toc230444537" w:history="1">
+      <w:hyperlink w:anchor="_Toc230444925" w:history="1">
         <w:r>
           <w:rPr>
             <w:rStyle w:val="Hyperlink"/>
@@ -415,7 +415,7 @@
             <w:noProof/>
             <w:webHidden/>
           </w:rPr>
-          <w:instrText xml:space="preserve"> PAGEREF _Toc230444537 \h </w:instrText>
+          <w:instrText xml:space="preserve"> PAGEREF _Toc230444925 \h </w:instrText>
         </w:r>
         <w:r>
           <w:rPr>
@@ -461,7 +461,7 @@
           <w14:ligatures w14:val="standardContextual"/>
         </w:rPr>
       </w:pPr>
-      <w:hyperlink w:anchor="_Toc230444538" w:history="1">
+      <w:hyperlink w:anchor="_Toc230444926" w:history="1">
         <w:r>
           <w:rPr>
             <w:rStyle w:val="Hyperlink"/>
@@ -488,7 +488,7 @@
             <w:noProof/>
             <w:webHidden/>
           </w:rPr>
-          <w:instrText xml:space="preserve"> PAGEREF _Toc230444538 \h </w:instrText>
+          <w:instrText xml:space="preserve"> PAGEREF _Toc230444926 \h </w:instrText>
         </w:r>
         <w:r>
           <w:rPr>
@@ -534,7 +534,7 @@
           <w14:ligatures w14:val="standardContextual"/>
         </w:rPr>
       </w:pPr>
-      <w:hyperlink w:anchor="_Toc230444539" w:history="1">
+      <w:hyperlink w:anchor="_Toc230444927" w:history="1">
         <w:r>
           <w:rPr>
             <w:rStyle w:val="Hyperlink"/>
@@ -561,7 +561,7 @@
             <w:noProof/>
             <w:webHidden/>
           </w:rPr>
-          <w:instrText xml:space="preserve"> PAGEREF _Toc230444539 \h </w:instrText>
+          <w:instrText xml:space="preserve"> PAGEREF _Toc230444927 \h </w:instrText>
         </w:r>
         <w:r>
           <w:rPr>
@@ -607,7 +607,7 @@
           <w14:ligatures w14:val="standardContextual"/>
         </w:rPr>
       </w:pPr>
-      <w:hyperlink w:anchor="_Toc230444540" w:history="1">
+      <w:hyperlink w:anchor="_Toc230444928" w:history="1">
         <w:r>
           <w:rPr>
             <w:rStyle w:val="Hyperlink"/>
@@ -634,7 +634,7 @@
             <w:noProof/>
             <w:webHidden/>
           </w:rPr>
-          <w:instrText xml:space="preserve"> PAGEREF _Toc230444540 \h </w:instrText>
+          <w:instrText xml:space="preserve"> PAGEREF _Toc230444928 \h </w:instrText>
         </w:r>
         <w:r>
           <w:rPr>
@@ -680,7 +680,7 @@
           <w14:ligatures w14:val="standardContextual"/>
         </w:rPr>
       </w:pPr>
-      <w:hyperlink w:anchor="_Toc230444541" w:history="1">
+      <w:hyperlink w:anchor="_Toc230444929" w:history="1">
         <w:r>
           <w:rPr>
             <w:rStyle w:val="Hyperlink"/>
@@ -707,7 +707,7 @@
             <w:noProof/>
             <w:webHidden/>
           </w:rPr>
-          <w:instrText xml:space="preserve"> PAGEREF _Toc230444541 \h </w:instrText>
+          <w:instrText xml:space="preserve"> PAGEREF _Toc230444929 \h </w:instrText>
         </w:r>
         <w:r>
           <w:rPr>
@@ -753,7 +753,7 @@
           <w14:ligatures w14:val="standardContextual"/>
         </w:rPr>
       </w:pPr>
-      <w:hyperlink w:anchor="_Toc230444542" w:history="1">
+      <w:hyperlink w:anchor="_Toc230444930" w:history="1">
         <w:r>
           <w:rPr>
             <w:rStyle w:val="Hyperlink"/>
@@ -780,7 +780,7 @@
             <w:noProof/>
             <w:webHidden/>
           </w:rPr>
-          <w:instrText xml:space="preserve"> PAGEREF _Toc230444542 \h </w:instrText>
+          <w:instrText xml:space="preserve"> PAGEREF _Toc230444930 \h </w:instrText>
         </w:r>
         <w:r>
           <w:rPr>
@@ -826,7 +826,7 @@
           <w14:ligatures w14:val="standardContextual"/>
         </w:rPr>
       </w:pPr>
-      <w:hyperlink w:anchor="_Toc230444543" w:history="1">
+      <w:hyperlink w:anchor="_Toc230444931" w:history="1">
         <w:r>
           <w:rPr>
             <w:rStyle w:val="Hyperlink"/>
@@ -853,7 +853,7 @@
             <w:noProof/>
             <w:webHidden/>
           </w:rPr>
-          <w:instrText xml:space="preserve"> PAGEREF _Toc230444543 \h </w:instrText>
+          <w:instrText xml:space="preserve"> PAGEREF _Toc230444931 \h </w:instrText>
         </w:r>
         <w:r>
           <w:rPr>
@@ -899,7 +899,7 @@
           <w14:ligatures w14:val="standardContextual"/>
         </w:rPr>
       </w:pPr>
-      <w:hyperlink w:anchor="_Toc230444544" w:history="1">
+      <w:hyperlink w:anchor="_Toc230444932" w:history="1">
         <w:r>
           <w:rPr>
             <w:rStyle w:val="Hyperlink"/>
@@ -926,7 +926,7 @@
             <w:noProof/>
             <w:webHidden/>
           </w:rPr>
-          <w:instrText xml:space="preserve"> PAGEREF _Toc230444544 \h </w:instrText>
+          <w:instrText xml:space="preserve"> PAGEREF _Toc230444932 \h </w:instrText>
         </w:r>
         <w:r>
           <w:rPr>
@@ -972,7 +972,7 @@
           <w14:ligatures w14:val="standardContextual"/>
         </w:rPr>
       </w:pPr>
-      <w:hyperlink w:anchor="_Toc230444545" w:history="1">
+      <w:hyperlink w:anchor="_Toc230444933" w:history="1">
         <w:r>
           <w:rPr>
             <w:rStyle w:val="Hyperlink"/>
@@ -999,7 +999,7 @@
             <w:noProof/>
             <w:webHidden/>
           </w:rPr>
-          <w:instrText xml:space="preserve"> PAGEREF _Toc230444545 \h </w:instrText>
+          <w:instrText xml:space="preserve"> PAGEREF _Toc230444933 \h </w:instrText>
         </w:r>
         <w:r>
           <w:rPr>
@@ -1045,7 +1045,7 @@
           <w14:ligatures w14:val="standardContextual"/>
         </w:rPr>
       </w:pPr>
-      <w:hyperlink w:anchor="_Toc230444546" w:history="1">
+      <w:hyperlink w:anchor="_Toc230444934" w:history="1">
         <w:r>
           <w:rPr>
             <w:rStyle w:val="Hyperlink"/>
@@ -1072,7 +1072,7 @@
             <w:noProof/>
             <w:webHidden/>
           </w:rPr>
-          <w:instrText xml:space="preserve"> PAGEREF _Toc230444546 \h </w:instrText>
+          <w:instrText xml:space="preserve"> PAGEREF _Toc230444934 \h </w:instrText>
         </w:r>
         <w:r>
           <w:rPr>
@@ -1118,7 +1118,7 @@
           <w14:ligatures w14:val="standardContextual"/>
         </w:rPr>
       </w:pPr>
-      <w:hyperlink w:anchor="_Toc230444547" w:history="1">
+      <w:hyperlink w:anchor="_Toc230444935" w:history="1">
         <w:r>
           <w:rPr>
             <w:rStyle w:val="Hyperlink"/>
@@ -1145,7 +1145,7 @@
             <w:noProof/>
             <w:webHidden/>
           </w:rPr>
-          <w:instrText xml:space="preserve"> PAGEREF _Toc230444547 \h </w:instrText>
+          <w:instrText xml:space="preserve"> PAGEREF _Toc230444935 \h </w:instrText>
         </w:r>
         <w:r>
           <w:rPr>
@@ -1191,7 +1191,7 @@
           <w14:ligatures w14:val="standardContextual"/>
         </w:rPr>
       </w:pPr>
-      <w:hyperlink w:anchor="_Toc230444548" w:history="1">
+      <w:hyperlink w:anchor="_Toc230444936" w:history="1">
         <w:r>
           <w:rPr>
             <w:rStyle w:val="Hyperlink"/>
@@ -1218,7 +1218,7 @@
             <w:noProof/>
             <w:webHidden/>
           </w:rPr>
-          <w:instrText xml:space="preserve"> PAGEREF _Toc230444548 \h </w:instrText>
+          <w:instrText xml:space="preserve"> PAGEREF _Toc230444936 \h </w:instrText>
         </w:r>
         <w:r>
           <w:rPr>
@@ -1264,7 +1264,7 @@
           <w14:ligatures w14:val="standardContextual"/>
         </w:rPr>
       </w:pPr>
-      <w:hyperlink w:anchor="_Toc230444549" w:history="1">
+      <w:hyperlink w:anchor="_Toc230444937" w:history="1">
         <w:r>
           <w:rPr>
             <w:rStyle w:val="Hyperlink"/>
@@ -1291,7 +1291,7 @@
             <w:noProof/>
             <w:webHidden/>
           </w:rPr>
-          <w:instrText xml:space="preserve"> PAGEREF _Toc230444549 \h </w:instrText>
+          <w:instrText xml:space="preserve"> PAGEREF _Toc230444937 \h </w:instrText>
         </w:r>
         <w:r>
           <w:rPr>
@@ -1337,7 +1337,7 @@
           <w14:ligatures w14:val="standardContextual"/>
         </w:rPr>
       </w:pPr>
-      <w:hyperlink w:anchor="_Toc230444550" w:history="1">
+      <w:hyperlink w:anchor="_Toc230444938" w:history="1">
         <w:r>
           <w:rPr>
             <w:rStyle w:val="Hyperlink"/>
@@ -1364,7 +1364,7 @@
             <w:noProof/>
             <w:webHidden/>
           </w:rPr>
-          <w:instrText xml:space="preserve"> PAGEREF _Toc230444550 \h </w:instrText>
+          <w:instrText xml:space="preserve"> PAGEREF _Toc230444938 \h </w:instrText>
         </w:r>
         <w:r>
           <w:rPr>
@@ -1410,7 +1410,7 @@
           <w14:ligatures w14:val="standardContextual"/>
         </w:rPr>
       </w:pPr>
-      <w:hyperlink w:anchor="_Toc230444551" w:history="1">
+      <w:hyperlink w:anchor="_Toc230444939" w:history="1">
         <w:r>
           <w:rPr>
             <w:rStyle w:val="Hyperlink"/>
@@ -1437,7 +1437,7 @@
             <w:noProof/>
             <w:webHidden/>
           </w:rPr>
-          <w:instrText xml:space="preserve"> PAGEREF _Toc230444551 \h </w:instrText>
+          <w:instrText xml:space="preserve"> PAGEREF _Toc230444939 \h </w:instrText>
         </w:r>
         <w:r>
           <w:rPr>
@@ -1483,7 +1483,7 @@
           <w14:ligatures w14:val="standardContextual"/>
         </w:rPr>
       </w:pPr>
-      <w:hyperlink w:anchor="_Toc230444552" w:history="1">
+      <w:hyperlink w:anchor="_Toc230444940" w:history="1">
         <w:r>
           <w:rPr>
             <w:rStyle w:val="Hyperlink"/>
@@ -1510,7 +1510,7 @@
             <w:noProof/>
             <w:webHidden/>
           </w:rPr>
-          <w:instrText xml:space="preserve"> PAGEREF _Toc230444552 \h </w:instrText>
+          <w:instrText xml:space="preserve"> PAGEREF _Toc230444940 \h </w:instrText>
         </w:r>
         <w:r>
           <w:rPr>
@@ -1556,7 +1556,7 @@
           <w14:ligatures w14:val="standardContextual"/>
         </w:rPr>
       </w:pPr>
-      <w:hyperlink w:anchor="_Toc230444553" w:history="1">
+      <w:hyperlink w:anchor="_Toc230444941" w:history="1">
         <w:r>
           <w:rPr>
             <w:rStyle w:val="Hyperlink"/>
@@ -1583,7 +1583,7 @@
             <w:noProof/>
             <w:webHidden/>
           </w:rPr>
-          <w:instrText xml:space="preserve"> PAGEREF _Toc230444553 \h </w:instrText>
+          <w:instrText xml:space="preserve"> PAGEREF _Toc230444941 \h </w:instrText>
         </w:r>
         <w:r>
           <w:rPr>
@@ -1629,7 +1629,7 @@
           <w14:ligatures w14:val="standardContextual"/>
         </w:rPr>
       </w:pPr>
-      <w:hyperlink w:anchor="_Toc230444554" w:history="1">
+      <w:hyperlink w:anchor="_Toc230444942" w:history="1">
         <w:r>
           <w:rPr>
             <w:rStyle w:val="Hyperlink"/>
@@ -1656,7 +1656,7 @@
             <w:noProof/>
             <w:webHidden/>
           </w:rPr>
-          <w:instrText xml:space="preserve"> PAGEREF _Toc230444554 \h </w:instrText>
+          <w:instrText xml:space="preserve"> PAGEREF _Toc230444942 \h </w:instrText>
         </w:r>
         <w:r>
           <w:rPr>
@@ -1702,7 +1702,7 @@
           <w14:ligatures w14:val="standardContextual"/>
         </w:rPr>
       </w:pPr>
-      <w:hyperlink w:anchor="_Toc230444555" w:history="1">
+      <w:hyperlink w:anchor="_Toc230444943" w:history="1">
         <w:r>
           <w:rPr>
             <w:rStyle w:val="Hyperlink"/>
@@ -1729,7 +1729,7 @@
             <w:noProof/>
             <w:webHidden/>
           </w:rPr>
-          <w:instrText xml:space="preserve"> PAGEREF _Toc230444555 \h </w:instrText>
+          <w:instrText xml:space="preserve"> PAGEREF _Toc230444943 \h </w:instrText>
         </w:r>
         <w:r>
           <w:rPr>
@@ -1775,7 +1775,7 @@
           <w14:ligatures w14:val="standardContextual"/>
         </w:rPr>
       </w:pPr>
-      <w:hyperlink w:anchor="_Toc230444556" w:history="1">
+      <w:hyperlink w:anchor="_Toc230444944" w:history="1">
         <w:r>
           <w:rPr>
             <w:rStyle w:val="Hyperlink"/>
@@ -1802,7 +1802,7 @@
             <w:noProof/>
             <w:webHidden/>
           </w:rPr>
-          <w:instrText xml:space="preserve"> PAGEREF _Toc230444556 \h </w:instrText>
+          <w:instrText xml:space="preserve"> PAGEREF _Toc230444944 \h </w:instrText>
         </w:r>
         <w:r>
           <w:rPr>
@@ -1848,7 +1848,7 @@
           <w14:ligatures w14:val="standardContextual"/>
         </w:rPr>
       </w:pPr>
-      <w:hyperlink w:anchor="_Toc230444557" w:history="1">
+      <w:hyperlink w:anchor="_Toc230444945" w:history="1">
         <w:r>
           <w:rPr>
             <w:rStyle w:val="Hyperlink"/>
@@ -1875,7 +1875,7 @@
             <w:noProof/>
             <w:webHidden/>
           </w:rPr>
-          <w:instrText xml:space="preserve"> PAGEREF _Toc230444557 \h </w:instrText>
+          <w:instrText xml:space="preserve"> PAGEREF _Toc230444945 \h </w:instrText>
         </w:r>
         <w:r>
           <w:rPr>
@@ -1921,7 +1921,7 @@
           <w14:ligatures w14:val="standardContextual"/>
         </w:rPr>
       </w:pPr>
-      <w:hyperlink w:anchor="_Toc230444558" w:history="1">
+      <w:hyperlink w:anchor="_Toc230444946" w:history="1">
         <w:r>
           <w:rPr>
             <w:rStyle w:val="Hyperlink"/>
@@ -1948,7 +1948,7 @@
             <w:noProof/>
             <w:webHidden/>
           </w:rPr>
-          <w:instrText xml:space="preserve"> PAGEREF _Toc230444558 \h </w:instrText>
+          <w:instrText xml:space="preserve"> PAGEREF _Toc230444946 \h </w:instrText>
         </w:r>
         <w:r>
           <w:rPr>
@@ -1994,7 +1994,7 @@
           <w14:ligatures w14:val="standardContextual"/>
         </w:rPr>
       </w:pPr>
-      <w:hyperlink w:anchor="_Toc230444559" w:history="1">
+      <w:hyperlink w:anchor="_Toc230444947" w:history="1">
         <w:r>
           <w:rPr>
             <w:rStyle w:val="Hyperlink"/>
@@ -2021,7 +2021,7 @@
             <w:noProof/>
             <w:webHidden/>
           </w:rPr>
-          <w:instrText xml:space="preserve"> PAGEREF _Toc230444559 \h </w:instrText>
+          <w:instrText xml:space="preserve"> PAGEREF _Toc230444947 \h </w:instrText>
         </w:r>
         <w:r>
           <w:rPr>
@@ -2067,7 +2067,7 @@
           <w14:ligatures w14:val="standardContextual"/>
         </w:rPr>
       </w:pPr>
-      <w:hyperlink w:anchor="_Toc230444560" w:history="1">
+      <w:hyperlink w:anchor="_Toc230444948" w:history="1">
         <w:r>
           <w:rPr>
             <w:rStyle w:val="Hyperlink"/>
@@ -2094,7 +2094,7 @@
             <w:noProof/>
             <w:webHidden/>
           </w:rPr>
-          <w:instrText xml:space="preserve"> PAGEREF _Toc230444560 \h </w:instrText>
+          <w:instrText xml:space="preserve"> PAGEREF _Toc230444948 \h </w:instrText>
         </w:r>
         <w:r>
           <w:rPr>
@@ -2140,7 +2140,7 @@
           <w14:ligatures w14:val="standardContextual"/>
         </w:rPr>
       </w:pPr>
-      <w:hyperlink w:anchor="_Toc230444561" w:history="1">
+      <w:hyperlink w:anchor="_Toc230444949" w:history="1">
         <w:r>
           <w:rPr>
             <w:rStyle w:val="Hyperlink"/>
@@ -2167,7 +2167,7 @@
             <w:noProof/>
             <w:webHidden/>
           </w:rPr>
-          <w:instrText xml:space="preserve"> PAGEREF _Toc230444561 \h </w:instrText>
+          <w:instrText xml:space="preserve"> PAGEREF _Toc230444949 \h </w:instrText>
         </w:r>
         <w:r>
           <w:rPr>
@@ -2213,7 +2213,7 @@
           <w14:ligatures w14:val="standardContextual"/>
         </w:rPr>
       </w:pPr>
-      <w:hyperlink w:anchor="_Toc230444562" w:history="1">
+      <w:hyperlink w:anchor="_Toc230444950" w:history="1">
         <w:r>
           <w:rPr>
             <w:rStyle w:val="Hyperlink"/>
@@ -2240,7 +2240,7 @@
             <w:noProof/>
             <w:webHidden/>
           </w:rPr>
-          <w:instrText xml:space="preserve"> PAGEREF _Toc230444562 \h </w:instrText>
+          <w:instrText xml:space="preserve"> PAGEREF _Toc230444950 \h </w:instrText>
         </w:r>
         <w:r>
           <w:rPr>
@@ -2286,7 +2286,7 @@
           <w14:ligatures w14:val="standardContextual"/>
         </w:rPr>
       </w:pPr>
-      <w:hyperlink w:anchor="_Toc230444563" w:history="1">
+      <w:hyperlink w:anchor="_Toc230444951" w:history="1">
         <w:r>
           <w:rPr>
             <w:rStyle w:val="Hyperlink"/>
@@ -2313,7 +2313,7 @@
             <w:noProof/>
             <w:webHidden/>
           </w:rPr>
-          <w:instrText xml:space="preserve"> PAGEREF _Toc230444563 \h </w:instrText>
+          <w:instrText xml:space="preserve"> PAGEREF _Toc230444951 \h </w:instrText>
         </w:r>
         <w:r>
           <w:rPr>
@@ -2359,7 +2359,7 @@
           <w14:ligatures w14:val="standardContextual"/>
         </w:rPr>
       </w:pPr>
-      <w:hyperlink w:anchor="_Toc230444564" w:history="1">
+      <w:hyperlink w:anchor="_Toc230444952" w:history="1">
         <w:r>
           <w:rPr>
             <w:rStyle w:val="Hyperlink"/>
@@ -2386,7 +2386,7 @@
             <w:noProof/>
             <w:webHidden/>
           </w:rPr>
-          <w:instrText xml:space="preserve"> PAGEREF _Toc230444564 \h </w:instrText>
+          <w:instrText xml:space="preserve"> PAGEREF _Toc230444952 \h </w:instrText>
         </w:r>
         <w:r>
           <w:rPr>
@@ -2432,7 +2432,7 @@
           <w14:ligatures w14:val="standardContextual"/>
         </w:rPr>
       </w:pPr>
-      <w:hyperlink w:anchor="_Toc230444565" w:history="1">
+      <w:hyperlink w:anchor="_Toc230444953" w:history="1">
         <w:r>
           <w:rPr>
             <w:rStyle w:val="Hyperlink"/>
@@ -2459,7 +2459,7 @@
             <w:noProof/>
             <w:webHidden/>
           </w:rPr>
-          <w:instrText xml:space="preserve"> PAGEREF _Toc230444565 \h </w:instrText>
+          <w:instrText xml:space="preserve"> PAGEREF _Toc230444953 \h </w:instrText>
         </w:r>
         <w:r>
           <w:rPr>
@@ -2505,7 +2505,7 @@
           <w14:ligatures w14:val="standardContextual"/>
         </w:rPr>
       </w:pPr>
-      <w:hyperlink w:anchor="_Toc230444566" w:history="1">
+      <w:hyperlink w:anchor="_Toc230444954" w:history="1">
         <w:r>
           <w:rPr>
             <w:rStyle w:val="Hyperlink"/>
@@ -2532,7 +2532,7 @@
             <w:noProof/>
             <w:webHidden/>
           </w:rPr>
-          <w:instrText xml:space="preserve"> PAGEREF _Toc230444566 \h </w:instrText>
+          <w:instrText xml:space="preserve"> PAGEREF _Toc230444954 \h </w:instrText>
         </w:r>
         <w:r>
           <w:rPr>
@@ -2578,7 +2578,7 @@
           <w14:ligatures w14:val="standardContextual"/>
         </w:rPr>
       </w:pPr>
-      <w:hyperlink w:anchor="_Toc230444567" w:history="1">
+      <w:hyperlink w:anchor="_Toc230444955" w:history="1">
         <w:r>
           <w:rPr>
             <w:rStyle w:val="Hyperlink"/>
@@ -2605,7 +2605,7 @@
             <w:noProof/>
             <w:webHidden/>
           </w:rPr>
-          <w:instrText xml:space="preserve"> PAGEREF _Toc230444567 \h </w:instrText>
+          <w:instrText xml:space="preserve"> PAGEREF _Toc230444955 \h </w:instrText>
         </w:r>
         <w:r>
           <w:rPr>
@@ -2651,7 +2651,7 @@
           <w14:ligatures w14:val="standardContextual"/>
         </w:rPr>
       </w:pPr>
-      <w:hyperlink w:anchor="_Toc230444568" w:history="1">
+      <w:hyperlink w:anchor="_Toc230444956" w:history="1">
         <w:r>
           <w:rPr>
             <w:rStyle w:val="Hyperlink"/>
@@ -2678,7 +2678,7 @@
             <w:noProof/>
             <w:webHidden/>
           </w:rPr>
-          <w:instrText xml:space="preserve"> PAGEREF _Toc230444568 \h </w:instrText>
+          <w:instrText xml:space="preserve"> PAGEREF _Toc230444956 \h </w:instrText>
         </w:r>
         <w:r>
           <w:rPr>
@@ -2724,7 +2724,7 @@
           <w14:ligatures w14:val="standardContextual"/>
         </w:rPr>
       </w:pPr>
-      <w:hyperlink w:anchor="_Toc230444569" w:history="1">
+      <w:hyperlink w:anchor="_Toc230444957" w:history="1">
         <w:r>
           <w:rPr>
             <w:rStyle w:val="Hyperlink"/>
@@ -2751,7 +2751,7 @@
             <w:noProof/>
             <w:webHidden/>
           </w:rPr>
-          <w:instrText xml:space="preserve"> PAGEREF _Toc230444569 \h </w:instrText>
+          <w:instrText xml:space="preserve"> PAGEREF _Toc230444957 \h </w:instrText>
         </w:r>
         <w:r>
           <w:rPr>
@@ -2797,7 +2797,7 @@
           <w14:ligatures w14:val="standardContextual"/>
         </w:rPr>
       </w:pPr>
-      <w:hyperlink w:anchor="_Toc230444570" w:history="1">
+      <w:hyperlink w:anchor="_Toc230444958" w:history="1">
         <w:r>
           <w:rPr>
             <w:rStyle w:val="Hyperlink"/>
@@ -2824,7 +2824,7 @@
             <w:noProof/>
             <w:webHidden/>
           </w:rPr>
-          <w:instrText xml:space="preserve"> PAGEREF _Toc230444570 \h </w:instrText>
+          <w:instrText xml:space="preserve"> PAGEREF _Toc230444958 \h </w:instrText>
         </w:r>
         <w:r>
           <w:rPr>
@@ -2870,7 +2870,7 @@
           <w14:ligatures w14:val="standardContextual"/>
         </w:rPr>
       </w:pPr>
-      <w:hyperlink w:anchor="_Toc230444571" w:history="1">
+      <w:hyperlink w:anchor="_Toc230444959" w:history="1">
         <w:r>
           <w:rPr>
             <w:rStyle w:val="Hyperlink"/>
@@ -2897,7 +2897,7 @@
             <w:noProof/>
             <w:webHidden/>
           </w:rPr>
-          <w:instrText xml:space="preserve"> PAGEREF _Toc230444571 \h </w:instrText>
+          <w:instrText xml:space="preserve"> PAGEREF _Toc230444959 \h </w:instrText>
         </w:r>
         <w:r>
           <w:rPr>
@@ -2943,7 +2943,7 @@
           <w14:ligatures w14:val="standardContextual"/>
         </w:rPr>
       </w:pPr>
-      <w:hyperlink w:anchor="_Toc230444572" w:history="1">
+      <w:hyperlink w:anchor="_Toc230444960" w:history="1">
         <w:r>
           <w:rPr>
             <w:rStyle w:val="Hyperlink"/>
@@ -2970,7 +2970,7 @@
             <w:noProof/>
             <w:webHidden/>
           </w:rPr>
-          <w:instrText xml:space="preserve"> PAGEREF _Toc230444572 \h </w:instrText>
+          <w:instrText xml:space="preserve"> PAGEREF _Toc230444960 \h </w:instrText>
         </w:r>
         <w:r>
           <w:rPr>
@@ -3016,7 +3016,7 @@
           <w14:ligatures w14:val="standardContextual"/>
         </w:rPr>
       </w:pPr>
-      <w:hyperlink w:anchor="_Toc230444573" w:history="1">
+      <w:hyperlink w:anchor="_Toc230444961" w:history="1">
         <w:r>
           <w:rPr>
             <w:rStyle w:val="Hyperlink"/>
@@ -3043,7 +3043,7 @@
             <w:noProof/>
             <w:webHidden/>
           </w:rPr>
-          <w:instrText xml:space="preserve"> PAGEREF _Toc230444573 \h </w:instrText>
+          <w:instrText xml:space="preserve"> PAGEREF _Toc230444961 \h </w:instrText>
         </w:r>
         <w:r>
           <w:rPr>
@@ -3089,7 +3089,7 @@
           <w14:ligatures w14:val="standardContextual"/>
         </w:rPr>
       </w:pPr>
-      <w:hyperlink w:anchor="_Toc230444574" w:history="1">
+      <w:hyperlink w:anchor="_Toc230444962" w:history="1">
         <w:r>
           <w:rPr>
             <w:rStyle w:val="Hyperlink"/>
@@ -3116,7 +3116,7 @@
             <w:noProof/>
             <w:webHidden/>
           </w:rPr>
-          <w:instrText xml:space="preserve"> PAGEREF _Toc230444574 \h </w:instrText>
+          <w:instrText xml:space="preserve"> PAGEREF _Toc230444962 \h </w:instrText>
         </w:r>
         <w:r>
           <w:rPr>
@@ -3162,7 +3162,7 @@
           <w14:ligatures w14:val="standardContextual"/>
         </w:rPr>
       </w:pPr>
-      <w:hyperlink w:anchor="_Toc230444575" w:history="1">
+      <w:hyperlink w:anchor="_Toc230444963" w:history="1">
         <w:r>
           <w:rPr>
             <w:rStyle w:val="Hyperlink"/>
@@ -3189,7 +3189,7 @@
             <w:noProof/>
             <w:webHidden/>
           </w:rPr>
-          <w:instrText xml:space="preserve"> PAGEREF _Toc230444575 \h </w:instrText>
+          <w:instrText xml:space="preserve"> PAGEREF _Toc230444963 \h </w:instrText>
         </w:r>
         <w:r>
           <w:rPr>
@@ -3235,7 +3235,7 @@
         <w:pStyle w:val="Heading1"/>
         <w:shd w:val="clear" w:color="auto" w:fill="156082"/>
       </w:pPr>
-      <w:bookmarkStart w:id="1" w:name="_Toc230444535"/>
+      <w:bookmarkStart w:id="1" w:name="_Toc230444923"/>
       <w:r>
         <w:lastRenderedPageBreak/>
         <w:t xml:space="preserve">DSES Spectrum Analyzer — </w:t>
@@ -3314,7 +3314,7 @@
       <w:pPr>
         <w:pStyle w:val="Heading2"/>
       </w:pPr>
-      <w:bookmarkStart w:id="2" w:name="_Toc230444536"/>
+      <w:bookmarkStart w:id="2" w:name="_Toc230444924"/>
       <w:r>
         <w:t>1. What the recipient needs to know first</w:t>
       </w:r>
@@ -3388,7 +3388,7 @@
       <w:pPr>
         <w:pStyle w:val="Heading3"/>
       </w:pPr>
-      <w:bookmarkStart w:id="3" w:name="_Toc230444537"/>
+      <w:bookmarkStart w:id="3" w:name="_Toc230444925"/>
       <w:r>
         <w:t>System requirements</w:t>
       </w:r>
@@ -3667,7 +3667,7 @@
       <w:pPr>
         <w:pStyle w:val="Heading2"/>
       </w:pPr>
-      <w:bookmarkStart w:id="4" w:name="_Toc230444538"/>
+      <w:bookmarkStart w:id="4" w:name="_Toc230444926"/>
       <w:r>
         <w:t>2. Installing Radioconda</w:t>
       </w:r>
@@ -3677,7 +3677,7 @@
       <w:pPr>
         <w:pStyle w:val="Heading3"/>
       </w:pPr>
-      <w:bookmarkStart w:id="5" w:name="_Toc230444539"/>
+      <w:bookmarkStart w:id="5" w:name="_Toc230444927"/>
       <w:r>
         <w:t>2.1 Windows 11</w:t>
       </w:r>
@@ -3854,7 +3854,7 @@
       <w:pPr>
         <w:pStyle w:val="Heading3"/>
       </w:pPr>
-      <w:bookmarkStart w:id="6" w:name="_Toc230444540"/>
+      <w:bookmarkStart w:id="6" w:name="_Toc230444928"/>
       <w:r>
         <w:t>2.2 Linux</w:t>
       </w:r>
@@ -4059,7 +4059,7 @@
       <w:pPr>
         <w:pStyle w:val="Heading3"/>
       </w:pPr>
-      <w:bookmarkStart w:id="7" w:name="_Toc230444541"/>
+      <w:bookmarkStart w:id="7" w:name="_Toc230444929"/>
       <w:r>
         <w:t>2.3 macOS (Intel and Apple Silicon)</w:t>
       </w:r>
@@ -4296,7 +4296,7 @@
       <w:pPr>
         <w:pStyle w:val="Heading2"/>
       </w:pPr>
-      <w:bookmarkStart w:id="8" w:name="_Toc230444542"/>
+      <w:bookmarkStart w:id="8" w:name="_Toc230444930"/>
       <w:r>
         <w:t>3. Installing the DSES Spectrum Analyzer</w:t>
       </w:r>
@@ -4355,7 +4355,7 @@
       <w:pPr>
         <w:pStyle w:val="Heading3"/>
       </w:pPr>
-      <w:bookmarkStart w:id="9" w:name="_Toc230444543"/>
+      <w:bookmarkStart w:id="9" w:name="_Toc230444931"/>
       <w:r>
         <w:t>3.1 Windows 11</w:t>
       </w:r>
@@ -4560,7 +4560,7 @@
       <w:pPr>
         <w:pStyle w:val="Heading3"/>
       </w:pPr>
-      <w:bookmarkStart w:id="10" w:name="_Toc230444544"/>
+      <w:bookmarkStart w:id="10" w:name="_Toc230444932"/>
       <w:r>
         <w:t>3.2 Linux</w:t>
       </w:r>
@@ -4752,7 +4752,7 @@
       <w:pPr>
         <w:pStyle w:val="Heading3"/>
       </w:pPr>
-      <w:bookmarkStart w:id="11" w:name="_Toc230444545"/>
+      <w:bookmarkStart w:id="11" w:name="_Toc230444933"/>
       <w:r>
         <w:lastRenderedPageBreak/>
         <w:t>3.3 macOS</w:t>
@@ -4906,7 +4906,7 @@
       <w:pPr>
         <w:pStyle w:val="Heading2"/>
       </w:pPr>
-      <w:bookmarkStart w:id="12" w:name="_Toc230444546"/>
+      <w:bookmarkStart w:id="12" w:name="_Toc230444934"/>
       <w:r>
         <w:t>3A. Extra setup for SDRPlay receivers (RSP1A / RSP1B / RSPduo / RSPdx)</w:t>
       </w:r>
@@ -4941,7 +4941,7 @@
       <w:pPr>
         <w:pStyle w:val="Heading3"/>
       </w:pPr>
-      <w:bookmarkStart w:id="13" w:name="_Toc230444547"/>
+      <w:bookmarkStart w:id="13" w:name="_Toc230444935"/>
       <w:r>
         <w:t>3A.1 Install the SDRplay API</w:t>
       </w:r>
@@ -5053,7 +5053,7 @@
       <w:pPr>
         <w:pStyle w:val="Heading3"/>
       </w:pPr>
-      <w:bookmarkStart w:id="14" w:name="_Toc230444548"/>
+      <w:bookmarkStart w:id="14" w:name="_Toc230444936"/>
       <w:r>
         <w:t>3A.2 Install the SoapySDRPlay module</w:t>
       </w:r>
@@ -5422,7 +5422,7 @@
       <w:pPr>
         <w:pStyle w:val="Heading2"/>
       </w:pPr>
-      <w:bookmarkStart w:id="15" w:name="_Toc230444549"/>
+      <w:bookmarkStart w:id="15" w:name="_Toc230444937"/>
       <w:r>
         <w:t>4. First-run checklist</w:t>
       </w:r>
@@ -5535,7 +5535,7 @@
       <w:pPr>
         <w:pStyle w:val="Heading3"/>
       </w:pPr>
-      <w:bookmarkStart w:id="16" w:name="_Toc230444550"/>
+      <w:bookmarkStart w:id="16" w:name="_Toc230444938"/>
       <w:r>
         <w:t>Recommended one-time VOLK tuning</w:t>
       </w:r>
@@ -5678,7 +5678,7 @@
       <w:pPr>
         <w:pStyle w:val="Heading2"/>
       </w:pPr>
-      <w:bookmarkStart w:id="17" w:name="_Toc230444551"/>
+      <w:bookmarkStart w:id="17" w:name="_Toc230444939"/>
       <w:r>
         <w:t>5. Updating to a new version</w:t>
       </w:r>
@@ -5688,7 +5688,7 @@
       <w:pPr>
         <w:pStyle w:val="Heading3"/>
       </w:pPr>
-      <w:bookmarkStart w:id="18" w:name="_Toc230444552"/>
+      <w:bookmarkStart w:id="18" w:name="_Toc230444940"/>
       <w:r>
         <w:t>Auto-update notifications</w:t>
       </w:r>
@@ -5779,7 +5779,7 @@
       <w:pPr>
         <w:pStyle w:val="Heading3"/>
       </w:pPr>
-      <w:bookmarkStart w:id="19" w:name="_Toc230444553"/>
+      <w:bookmarkStart w:id="19" w:name="_Toc230444941"/>
       <w:r>
         <w:lastRenderedPageBreak/>
         <w:t>Performing the update</w:t>
@@ -5876,7 +5876,7 @@
       <w:pPr>
         <w:pStyle w:val="Heading3"/>
       </w:pPr>
-      <w:bookmarkStart w:id="20" w:name="_Toc230444554"/>
+      <w:bookmarkStart w:id="20" w:name="_Toc230444942"/>
       <w:r>
         <w:t>What is preserved across versions</w:t>
       </w:r>
@@ -6059,7 +6059,7 @@
       <w:pPr>
         <w:pStyle w:val="Heading3"/>
       </w:pPr>
-      <w:bookmarkStart w:id="21" w:name="_Toc230444555"/>
+      <w:bookmarkStart w:id="21" w:name="_Toc230444943"/>
       <w:r>
         <w:t>Backing up your settings</w:t>
       </w:r>
@@ -6118,7 +6118,7 @@
       <w:pPr>
         <w:pStyle w:val="Heading2"/>
       </w:pPr>
-      <w:bookmarkStart w:id="22" w:name="_Toc230444556"/>
+      <w:bookmarkStart w:id="22" w:name="_Toc230444944"/>
       <w:r>
         <w:t>6. Troubleshooting</w:t>
       </w:r>
@@ -6128,7 +6128,7 @@
       <w:pPr>
         <w:pStyle w:val="Heading3"/>
       </w:pPr>
-      <w:bookmarkStart w:id="23" w:name="_Toc230444557"/>
+      <w:bookmarkStart w:id="23" w:name="_Toc230444945"/>
       <w:r>
         <w:t>“Radioconda not found in standard locations”</w:t>
       </w:r>
@@ -6189,7 +6189,7 @@
       <w:pPr>
         <w:pStyle w:val="Heading3"/>
       </w:pPr>
-      <w:bookmarkStart w:id="24" w:name="_Toc230444558"/>
+      <w:bookmarkStart w:id="24" w:name="_Toc230444946"/>
       <w:r>
         <w:lastRenderedPageBreak/>
         <w:t>“No UHD Devices Found”</w:t>
@@ -6288,7 +6288,7 @@
       <w:pPr>
         <w:pStyle w:val="Heading3"/>
       </w:pPr>
-      <w:bookmarkStart w:id="25" w:name="_Toc230444559"/>
+      <w:bookmarkStart w:id="25" w:name="_Toc230444947"/>
       <w:r>
         <w:t>Persistent “O” overflows at high sample rates</w:t>
       </w:r>
@@ -6332,7 +6332,7 @@
       <w:pPr>
         <w:pStyle w:val="Heading3"/>
       </w:pPr>
-      <w:bookmarkStart w:id="26" w:name="_Toc230444560"/>
+      <w:bookmarkStart w:id="26" w:name="_Toc230444948"/>
       <w:r>
         <w:t>Spectrum looks flat at −140 dB</w:t>
       </w:r>
@@ -6371,7 +6371,7 @@
       <w:pPr>
         <w:pStyle w:val="Heading3"/>
       </w:pPr>
-      <w:bookmarkStart w:id="27" w:name="_Toc230444561"/>
+      <w:bookmarkStart w:id="27" w:name="_Toc230444949"/>
       <w:r>
         <w:t>macOS: “developer cannot be verified”</w:t>
       </w:r>
@@ -6407,7 +6407,7 @@
       <w:pPr>
         <w:pStyle w:val="Heading3"/>
       </w:pPr>
-      <w:bookmarkStart w:id="28" w:name="_Toc230444562"/>
+      <w:bookmarkStart w:id="28" w:name="_Toc230444950"/>
       <w:r>
         <w:t>Settings won’t persist</w:t>
       </w:r>
@@ -6460,7 +6460,7 @@
       <w:pPr>
         <w:pStyle w:val="Heading2"/>
       </w:pPr>
-      <w:bookmarkStart w:id="29" w:name="_Toc230444563"/>
+      <w:bookmarkStart w:id="29" w:name="_Toc230444951"/>
       <w:r>
         <w:t>7. Appendix A — Settings file reference</w:t>
       </w:r>
@@ -6669,7 +6669,7 @@
       <w:pPr>
         <w:pStyle w:val="Heading2"/>
       </w:pPr>
-      <w:bookmarkStart w:id="30" w:name="_Toc230444564"/>
+      <w:bookmarkStart w:id="30" w:name="_Toc230444952"/>
       <w:r>
         <w:t>8. Appendix B — Device selection and SigMF playback</w:t>
       </w:r>
@@ -6679,7 +6679,7 @@
       <w:pPr>
         <w:pStyle w:val="Heading3"/>
       </w:pPr>
-      <w:bookmarkStart w:id="31" w:name="_Toc230444565"/>
+      <w:bookmarkStart w:id="31" w:name="_Toc230444953"/>
       <w:r>
         <w:t>Choosing among multiple radios</w:t>
       </w:r>
@@ -6857,7 +6857,7 @@
       <w:pPr>
         <w:pStyle w:val="Heading3"/>
       </w:pPr>
-      <w:bookmarkStart w:id="32" w:name="_Toc230444566"/>
+      <w:bookmarkStart w:id="32" w:name="_Toc230444954"/>
       <w:r>
         <w:t>SigMF playback mode (no-device fallback)</w:t>
       </w:r>
@@ -7058,7 +7058,7 @@
       <w:pPr>
         <w:pStyle w:val="Heading2"/>
       </w:pPr>
-      <w:bookmarkStart w:id="33" w:name="_Toc230444567"/>
+      <w:bookmarkStart w:id="33" w:name="_Toc230444955"/>
       <w:r>
         <w:t>9. Appendix C — Operating Guide</w:t>
       </w:r>
@@ -7087,7 +7087,7 @@
       <w:pPr>
         <w:pStyle w:val="Heading3"/>
       </w:pPr>
-      <w:bookmarkStart w:id="34" w:name="_Toc230444568"/>
+      <w:bookmarkStart w:id="34" w:name="_Toc230444956"/>
       <w:r>
         <w:t>Starting up — device selection</w:t>
       </w:r>
@@ -7192,7 +7192,7 @@
       <w:pPr>
         <w:pStyle w:val="Heading3"/>
       </w:pPr>
-      <w:bookmarkStart w:id="35" w:name="_Toc230444569"/>
+      <w:bookmarkStart w:id="35" w:name="_Toc230444957"/>
       <w:r>
         <w:t>Playback mode</w:t>
       </w:r>
@@ -7318,7 +7318,7 @@
       <w:pPr>
         <w:pStyle w:val="Heading3"/>
       </w:pPr>
-      <w:bookmarkStart w:id="36" w:name="_Toc230444570"/>
+      <w:bookmarkStart w:id="36" w:name="_Toc230444958"/>
       <w:r>
         <w:t>Sidebar controls (right side)</w:t>
       </w:r>
@@ -7599,7 +7599,7 @@
       <w:pPr>
         <w:pStyle w:val="Heading3"/>
       </w:pPr>
-      <w:bookmarkStart w:id="37" w:name="_Toc230444571"/>
+      <w:bookmarkStart w:id="37" w:name="_Toc230444959"/>
       <w:r>
         <w:t>Spectrum (top plot)</w:t>
       </w:r>
@@ -7742,7 +7742,7 @@
       <w:pPr>
         <w:pStyle w:val="Heading3"/>
       </w:pPr>
-      <w:bookmarkStart w:id="38" w:name="_Toc230444572"/>
+      <w:bookmarkStart w:id="38" w:name="_Toc230444960"/>
       <w:r>
         <w:t>Waterfall (bottom plot)</w:t>
       </w:r>
@@ -7809,7 +7809,7 @@
       <w:pPr>
         <w:pStyle w:val="Heading3"/>
       </w:pPr>
-      <w:bookmarkStart w:id="39" w:name="_Toc230444573"/>
+      <w:bookmarkStart w:id="39" w:name="_Toc230444961"/>
       <w:r>
         <w:t>Persistence</w:t>
       </w:r>
@@ -7856,7 +7856,7 @@
       <w:pPr>
         <w:pStyle w:val="Heading3"/>
       </w:pPr>
-      <w:bookmarkStart w:id="40" w:name="_Toc230444574"/>
+      <w:bookmarkStart w:id="40" w:name="_Toc230444962"/>
       <w:r>
         <w:t>Update checks</w:t>
       </w:r>
@@ -7914,7 +7914,7 @@
       <w:pPr>
         <w:pStyle w:val="Heading3"/>
       </w:pPr>
-      <w:bookmarkStart w:id="41" w:name="_Toc230444575"/>
+      <w:bookmarkStart w:id="41" w:name="_Toc230444963"/>
       <w:r>
         <w:t>Tips for pulsar work</w:t>
       </w:r>
@@ -7976,6 +7976,7 @@
       <w:pgSz w:w="12240" w:h="15840"/>
       <w:pgMar w:top="1958" w:right="1166" w:bottom="1440" w:left="1440" w:header="720" w:footer="720" w:gutter="0"/>
       <w:cols w:space="720"/>
+      <w:titlePg/>
       <w:docGrid w:linePitch="360"/>
     </w:sectPr>
   </w:body>
@@ -8054,7 +8055,7 @@
         <w:color w:val="595959"/>
         <w:sz w:val="18"/>
       </w:rPr>
-      <w:t>1</w:t>
+      <w:t>2</w:t>
     </w:r>
     <w:r>
       <w:rPr>
@@ -8103,7 +8104,7 @@
         <w:b/>
         <w:color w:val="156082"/>
       </w:rPr>
-      <w:t>DSES</w:t>
+      <w:t>DSES Spectrum Analyzer</w:t>
     </w:r>
   </w:p>
   <w:p>
@@ -8292,31 +8293,31 @@
       </w:rPr>
     </w:lvl>
   </w:abstractNum>
-  <w:num w:numId="1" w16cid:durableId="1654025250">
+  <w:num w:numId="1" w16cid:durableId="238096582">
     <w:abstractNumId w:val="8"/>
   </w:num>
-  <w:num w:numId="2" w16cid:durableId="1887178433">
+  <w:num w:numId="2" w16cid:durableId="189993513">
     <w:abstractNumId w:val="6"/>
   </w:num>
-  <w:num w:numId="3" w16cid:durableId="1714304887">
+  <w:num w:numId="3" w16cid:durableId="705717964">
     <w:abstractNumId w:val="5"/>
   </w:num>
-  <w:num w:numId="4" w16cid:durableId="78915479">
+  <w:num w:numId="4" w16cid:durableId="1595362466">
     <w:abstractNumId w:val="4"/>
   </w:num>
-  <w:num w:numId="5" w16cid:durableId="1053238674">
+  <w:num w:numId="5" w16cid:durableId="1037581104">
     <w:abstractNumId w:val="7"/>
   </w:num>
-  <w:num w:numId="6" w16cid:durableId="1088112628">
+  <w:num w:numId="6" w16cid:durableId="976763883">
     <w:abstractNumId w:val="3"/>
   </w:num>
-  <w:num w:numId="7" w16cid:durableId="561259652">
+  <w:num w:numId="7" w16cid:durableId="1439716899">
     <w:abstractNumId w:val="2"/>
   </w:num>
-  <w:num w:numId="8" w16cid:durableId="1143890558">
+  <w:num w:numId="8" w16cid:durableId="1071192319">
     <w:abstractNumId w:val="1"/>
   </w:num>
-  <w:num w:numId="9" w16cid:durableId="579172002">
+  <w:num w:numId="9" w16cid:durableId="1876851047">
     <w:abstractNumId w:val="0"/>
   </w:num>
 </w:numbering>
@@ -19711,7 +19712,7 @@
     <w:autoRedefine/>
     <w:uiPriority w:val="39"/>
     <w:unhideWhenUsed/>
-    <w:rsid w:val="00485157"/>
+    <w:rsid w:val="00B931F4"/>
     <w:pPr>
       <w:spacing w:after="100"/>
     </w:pPr>
@@ -19723,7 +19724,7 @@
     <w:autoRedefine/>
     <w:uiPriority w:val="39"/>
     <w:unhideWhenUsed/>
-    <w:rsid w:val="00485157"/>
+    <w:rsid w:val="00B931F4"/>
     <w:pPr>
       <w:spacing w:after="100"/>
       <w:ind w:left="220"/>
@@ -19736,7 +19737,7 @@
     <w:autoRedefine/>
     <w:uiPriority w:val="39"/>
     <w:unhideWhenUsed/>
-    <w:rsid w:val="00485157"/>
+    <w:rsid w:val="00B931F4"/>
     <w:pPr>
       <w:spacing w:after="100"/>
       <w:ind w:left="440"/>
@@ -19747,7 +19748,7 @@
     <w:basedOn w:val="DefaultParagraphFont"/>
     <w:uiPriority w:val="99"/>
     <w:unhideWhenUsed/>
-    <w:rsid w:val="00485157"/>
+    <w:rsid w:val="00B931F4"/>
     <w:rPr>
       <w:color w:val="0000FF" w:themeColor="hyperlink"/>
       <w:u w:val="single"/>

</xml_diff>

<commit_message>
Use direct download links in install guide §3 (folder isn't browsable)
The server returns 403 on the bare sw_distribution/b210_sa/ directory
(indexing disabled), so the guide pointed users at an un-browsable folder.
Replace it with direct file links to the zip and PDF, note the 403 is
normal, and update the zip-size note (~60 MB after the sample trim). Add a
Release_Workflow §4.3 reminder to bump the version-stamped §3 link each
release. Regenerated PDF/DOCX.
</commit_message>
<xml_diff>
--- a/DSES_RFI_Spectrum_Analyzer_Installation.docx
+++ b/DSES_RFI_Spectrum_Analyzer_Installation.docx
@@ -41,7 +41,7 @@
           <w:noProof/>
         </w:rPr>
         <w:drawing>
-          <wp:inline distT="0" distB="0" distL="0" distR="0" wp14:anchorId="4D14D9C9" wp14:editId="33F3CACA">
+          <wp:inline distT="0" distB="0" distL="0" distR="0" wp14:anchorId="432C1891" wp14:editId="0DB73FA1">
             <wp:extent cx="1371600" cy="1371600"/>
             <wp:effectExtent l="0" t="0" r="0" b="0"/>
             <wp:docPr id="1" name="Picture 1"/>
@@ -138,7 +138,7 @@
         <w:pStyle w:val="Heading1"/>
         <w:shd w:val="clear" w:color="auto" w:fill="156082"/>
       </w:pPr>
-      <w:bookmarkStart w:id="0" w:name="_Toc230444922"/>
+      <w:bookmarkStart w:id="0" w:name="_Toc230445918"/>
       <w:r>
         <w:lastRenderedPageBreak/>
         <w:t>Contents</w:t>
@@ -169,7 +169,7 @@
       <w:r>
         <w:fldChar w:fldCharType="separate"/>
       </w:r>
-      <w:hyperlink w:anchor="_Toc230444922" w:history="1">
+      <w:hyperlink w:anchor="_Toc230445918" w:history="1">
         <w:r>
           <w:rPr>
             <w:rStyle w:val="Hyperlink"/>
@@ -196,7 +196,7 @@
             <w:noProof/>
             <w:webHidden/>
           </w:rPr>
-          <w:instrText xml:space="preserve"> PAGEREF _Toc230444922 \h </w:instrText>
+          <w:instrText xml:space="preserve"> PAGEREF _Toc230445918 \h </w:instrText>
         </w:r>
         <w:r>
           <w:rPr>
@@ -242,7 +242,7 @@
           <w14:ligatures w14:val="standardContextual"/>
         </w:rPr>
       </w:pPr>
-      <w:hyperlink w:anchor="_Toc230444923" w:history="1">
+      <w:hyperlink w:anchor="_Toc230445919" w:history="1">
         <w:r>
           <w:rPr>
             <w:rStyle w:val="Hyperlink"/>
@@ -269,7 +269,7 @@
             <w:noProof/>
             <w:webHidden/>
           </w:rPr>
-          <w:instrText xml:space="preserve"> PAGEREF _Toc230444923 \h </w:instrText>
+          <w:instrText xml:space="preserve"> PAGEREF _Toc230445919 \h </w:instrText>
         </w:r>
         <w:r>
           <w:rPr>
@@ -315,7 +315,7 @@
           <w14:ligatures w14:val="standardContextual"/>
         </w:rPr>
       </w:pPr>
-      <w:hyperlink w:anchor="_Toc230444924" w:history="1">
+      <w:hyperlink w:anchor="_Toc230445920" w:history="1">
         <w:r>
           <w:rPr>
             <w:rStyle w:val="Hyperlink"/>
@@ -342,7 +342,7 @@
             <w:noProof/>
             <w:webHidden/>
           </w:rPr>
-          <w:instrText xml:space="preserve"> PAGEREF _Toc230444924 \h </w:instrText>
+          <w:instrText xml:space="preserve"> PAGEREF _Toc230445920 \h </w:instrText>
         </w:r>
         <w:r>
           <w:rPr>
@@ -388,7 +388,7 @@
           <w14:ligatures w14:val="standardContextual"/>
         </w:rPr>
       </w:pPr>
-      <w:hyperlink w:anchor="_Toc230444925" w:history="1">
+      <w:hyperlink w:anchor="_Toc230445921" w:history="1">
         <w:r>
           <w:rPr>
             <w:rStyle w:val="Hyperlink"/>
@@ -415,7 +415,7 @@
             <w:noProof/>
             <w:webHidden/>
           </w:rPr>
-          <w:instrText xml:space="preserve"> PAGEREF _Toc230444925 \h </w:instrText>
+          <w:instrText xml:space="preserve"> PAGEREF _Toc230445921 \h </w:instrText>
         </w:r>
         <w:r>
           <w:rPr>
@@ -461,7 +461,7 @@
           <w14:ligatures w14:val="standardContextual"/>
         </w:rPr>
       </w:pPr>
-      <w:hyperlink w:anchor="_Toc230444926" w:history="1">
+      <w:hyperlink w:anchor="_Toc230445922" w:history="1">
         <w:r>
           <w:rPr>
             <w:rStyle w:val="Hyperlink"/>
@@ -488,7 +488,7 @@
             <w:noProof/>
             <w:webHidden/>
           </w:rPr>
-          <w:instrText xml:space="preserve"> PAGEREF _Toc230444926 \h </w:instrText>
+          <w:instrText xml:space="preserve"> PAGEREF _Toc230445922 \h </w:instrText>
         </w:r>
         <w:r>
           <w:rPr>
@@ -534,7 +534,7 @@
           <w14:ligatures w14:val="standardContextual"/>
         </w:rPr>
       </w:pPr>
-      <w:hyperlink w:anchor="_Toc230444927" w:history="1">
+      <w:hyperlink w:anchor="_Toc230445923" w:history="1">
         <w:r>
           <w:rPr>
             <w:rStyle w:val="Hyperlink"/>
@@ -561,7 +561,7 @@
             <w:noProof/>
             <w:webHidden/>
           </w:rPr>
-          <w:instrText xml:space="preserve"> PAGEREF _Toc230444927 \h </w:instrText>
+          <w:instrText xml:space="preserve"> PAGEREF _Toc230445923 \h </w:instrText>
         </w:r>
         <w:r>
           <w:rPr>
@@ -607,7 +607,7 @@
           <w14:ligatures w14:val="standardContextual"/>
         </w:rPr>
       </w:pPr>
-      <w:hyperlink w:anchor="_Toc230444928" w:history="1">
+      <w:hyperlink w:anchor="_Toc230445924" w:history="1">
         <w:r>
           <w:rPr>
             <w:rStyle w:val="Hyperlink"/>
@@ -634,7 +634,7 @@
             <w:noProof/>
             <w:webHidden/>
           </w:rPr>
-          <w:instrText xml:space="preserve"> PAGEREF _Toc230444928 \h </w:instrText>
+          <w:instrText xml:space="preserve"> PAGEREF _Toc230445924 \h </w:instrText>
         </w:r>
         <w:r>
           <w:rPr>
@@ -680,7 +680,7 @@
           <w14:ligatures w14:val="standardContextual"/>
         </w:rPr>
       </w:pPr>
-      <w:hyperlink w:anchor="_Toc230444929" w:history="1">
+      <w:hyperlink w:anchor="_Toc230445925" w:history="1">
         <w:r>
           <w:rPr>
             <w:rStyle w:val="Hyperlink"/>
@@ -707,7 +707,7 @@
             <w:noProof/>
             <w:webHidden/>
           </w:rPr>
-          <w:instrText xml:space="preserve"> PAGEREF _Toc230444929 \h </w:instrText>
+          <w:instrText xml:space="preserve"> PAGEREF _Toc230445925 \h </w:instrText>
         </w:r>
         <w:r>
           <w:rPr>
@@ -753,7 +753,7 @@
           <w14:ligatures w14:val="standardContextual"/>
         </w:rPr>
       </w:pPr>
-      <w:hyperlink w:anchor="_Toc230444930" w:history="1">
+      <w:hyperlink w:anchor="_Toc230445926" w:history="1">
         <w:r>
           <w:rPr>
             <w:rStyle w:val="Hyperlink"/>
@@ -780,7 +780,7 @@
             <w:noProof/>
             <w:webHidden/>
           </w:rPr>
-          <w:instrText xml:space="preserve"> PAGEREF _Toc230444930 \h </w:instrText>
+          <w:instrText xml:space="preserve"> PAGEREF _Toc230445926 \h </w:instrText>
         </w:r>
         <w:r>
           <w:rPr>
@@ -826,7 +826,7 @@
           <w14:ligatures w14:val="standardContextual"/>
         </w:rPr>
       </w:pPr>
-      <w:hyperlink w:anchor="_Toc230444931" w:history="1">
+      <w:hyperlink w:anchor="_Toc230445927" w:history="1">
         <w:r>
           <w:rPr>
             <w:rStyle w:val="Hyperlink"/>
@@ -853,7 +853,7 @@
             <w:noProof/>
             <w:webHidden/>
           </w:rPr>
-          <w:instrText xml:space="preserve"> PAGEREF _Toc230444931 \h </w:instrText>
+          <w:instrText xml:space="preserve"> PAGEREF _Toc230445927 \h </w:instrText>
         </w:r>
         <w:r>
           <w:rPr>
@@ -899,7 +899,7 @@
           <w14:ligatures w14:val="standardContextual"/>
         </w:rPr>
       </w:pPr>
-      <w:hyperlink w:anchor="_Toc230444932" w:history="1">
+      <w:hyperlink w:anchor="_Toc230445928" w:history="1">
         <w:r>
           <w:rPr>
             <w:rStyle w:val="Hyperlink"/>
@@ -926,7 +926,7 @@
             <w:noProof/>
             <w:webHidden/>
           </w:rPr>
-          <w:instrText xml:space="preserve"> PAGEREF _Toc230444932 \h </w:instrText>
+          <w:instrText xml:space="preserve"> PAGEREF _Toc230445928 \h </w:instrText>
         </w:r>
         <w:r>
           <w:rPr>
@@ -972,7 +972,7 @@
           <w14:ligatures w14:val="standardContextual"/>
         </w:rPr>
       </w:pPr>
-      <w:hyperlink w:anchor="_Toc230444933" w:history="1">
+      <w:hyperlink w:anchor="_Toc230445929" w:history="1">
         <w:r>
           <w:rPr>
             <w:rStyle w:val="Hyperlink"/>
@@ -999,7 +999,7 @@
             <w:noProof/>
             <w:webHidden/>
           </w:rPr>
-          <w:instrText xml:space="preserve"> PAGEREF _Toc230444933 \h </w:instrText>
+          <w:instrText xml:space="preserve"> PAGEREF _Toc230445929 \h </w:instrText>
         </w:r>
         <w:r>
           <w:rPr>
@@ -1045,7 +1045,7 @@
           <w14:ligatures w14:val="standardContextual"/>
         </w:rPr>
       </w:pPr>
-      <w:hyperlink w:anchor="_Toc230444934" w:history="1">
+      <w:hyperlink w:anchor="_Toc230445930" w:history="1">
         <w:r>
           <w:rPr>
             <w:rStyle w:val="Hyperlink"/>
@@ -1072,7 +1072,7 @@
             <w:noProof/>
             <w:webHidden/>
           </w:rPr>
-          <w:instrText xml:space="preserve"> PAGEREF _Toc230444934 \h </w:instrText>
+          <w:instrText xml:space="preserve"> PAGEREF _Toc230445930 \h </w:instrText>
         </w:r>
         <w:r>
           <w:rPr>
@@ -1118,7 +1118,7 @@
           <w14:ligatures w14:val="standardContextual"/>
         </w:rPr>
       </w:pPr>
-      <w:hyperlink w:anchor="_Toc230444935" w:history="1">
+      <w:hyperlink w:anchor="_Toc230445931" w:history="1">
         <w:r>
           <w:rPr>
             <w:rStyle w:val="Hyperlink"/>
@@ -1145,7 +1145,7 @@
             <w:noProof/>
             <w:webHidden/>
           </w:rPr>
-          <w:instrText xml:space="preserve"> PAGEREF _Toc230444935 \h </w:instrText>
+          <w:instrText xml:space="preserve"> PAGEREF _Toc230445931 \h </w:instrText>
         </w:r>
         <w:r>
           <w:rPr>
@@ -1191,7 +1191,7 @@
           <w14:ligatures w14:val="standardContextual"/>
         </w:rPr>
       </w:pPr>
-      <w:hyperlink w:anchor="_Toc230444936" w:history="1">
+      <w:hyperlink w:anchor="_Toc230445932" w:history="1">
         <w:r>
           <w:rPr>
             <w:rStyle w:val="Hyperlink"/>
@@ -1218,7 +1218,7 @@
             <w:noProof/>
             <w:webHidden/>
           </w:rPr>
-          <w:instrText xml:space="preserve"> PAGEREF _Toc230444936 \h </w:instrText>
+          <w:instrText xml:space="preserve"> PAGEREF _Toc230445932 \h </w:instrText>
         </w:r>
         <w:r>
           <w:rPr>
@@ -1264,7 +1264,7 @@
           <w14:ligatures w14:val="standardContextual"/>
         </w:rPr>
       </w:pPr>
-      <w:hyperlink w:anchor="_Toc230444937" w:history="1">
+      <w:hyperlink w:anchor="_Toc230445933" w:history="1">
         <w:r>
           <w:rPr>
             <w:rStyle w:val="Hyperlink"/>
@@ -1291,7 +1291,7 @@
             <w:noProof/>
             <w:webHidden/>
           </w:rPr>
-          <w:instrText xml:space="preserve"> PAGEREF _Toc230444937 \h </w:instrText>
+          <w:instrText xml:space="preserve"> PAGEREF _Toc230445933 \h </w:instrText>
         </w:r>
         <w:r>
           <w:rPr>
@@ -1337,7 +1337,7 @@
           <w14:ligatures w14:val="standardContextual"/>
         </w:rPr>
       </w:pPr>
-      <w:hyperlink w:anchor="_Toc230444938" w:history="1">
+      <w:hyperlink w:anchor="_Toc230445934" w:history="1">
         <w:r>
           <w:rPr>
             <w:rStyle w:val="Hyperlink"/>
@@ -1364,7 +1364,7 @@
             <w:noProof/>
             <w:webHidden/>
           </w:rPr>
-          <w:instrText xml:space="preserve"> PAGEREF _Toc230444938 \h </w:instrText>
+          <w:instrText xml:space="preserve"> PAGEREF _Toc230445934 \h </w:instrText>
         </w:r>
         <w:r>
           <w:rPr>
@@ -1410,7 +1410,7 @@
           <w14:ligatures w14:val="standardContextual"/>
         </w:rPr>
       </w:pPr>
-      <w:hyperlink w:anchor="_Toc230444939" w:history="1">
+      <w:hyperlink w:anchor="_Toc230445935" w:history="1">
         <w:r>
           <w:rPr>
             <w:rStyle w:val="Hyperlink"/>
@@ -1437,7 +1437,7 @@
             <w:noProof/>
             <w:webHidden/>
           </w:rPr>
-          <w:instrText xml:space="preserve"> PAGEREF _Toc230444939 \h </w:instrText>
+          <w:instrText xml:space="preserve"> PAGEREF _Toc230445935 \h </w:instrText>
         </w:r>
         <w:r>
           <w:rPr>
@@ -1483,7 +1483,7 @@
           <w14:ligatures w14:val="standardContextual"/>
         </w:rPr>
       </w:pPr>
-      <w:hyperlink w:anchor="_Toc230444940" w:history="1">
+      <w:hyperlink w:anchor="_Toc230445936" w:history="1">
         <w:r>
           <w:rPr>
             <w:rStyle w:val="Hyperlink"/>
@@ -1510,7 +1510,7 @@
             <w:noProof/>
             <w:webHidden/>
           </w:rPr>
-          <w:instrText xml:space="preserve"> PAGEREF _Toc230444940 \h </w:instrText>
+          <w:instrText xml:space="preserve"> PAGEREF _Toc230445936 \h </w:instrText>
         </w:r>
         <w:r>
           <w:rPr>
@@ -1556,7 +1556,7 @@
           <w14:ligatures w14:val="standardContextual"/>
         </w:rPr>
       </w:pPr>
-      <w:hyperlink w:anchor="_Toc230444941" w:history="1">
+      <w:hyperlink w:anchor="_Toc230445937" w:history="1">
         <w:r>
           <w:rPr>
             <w:rStyle w:val="Hyperlink"/>
@@ -1583,7 +1583,7 @@
             <w:noProof/>
             <w:webHidden/>
           </w:rPr>
-          <w:instrText xml:space="preserve"> PAGEREF _Toc230444941 \h </w:instrText>
+          <w:instrText xml:space="preserve"> PAGEREF _Toc230445937 \h </w:instrText>
         </w:r>
         <w:r>
           <w:rPr>
@@ -1629,7 +1629,7 @@
           <w14:ligatures w14:val="standardContextual"/>
         </w:rPr>
       </w:pPr>
-      <w:hyperlink w:anchor="_Toc230444942" w:history="1">
+      <w:hyperlink w:anchor="_Toc230445938" w:history="1">
         <w:r>
           <w:rPr>
             <w:rStyle w:val="Hyperlink"/>
@@ -1656,7 +1656,7 @@
             <w:noProof/>
             <w:webHidden/>
           </w:rPr>
-          <w:instrText xml:space="preserve"> PAGEREF _Toc230444942 \h </w:instrText>
+          <w:instrText xml:space="preserve"> PAGEREF _Toc230445938 \h </w:instrText>
         </w:r>
         <w:r>
           <w:rPr>
@@ -1702,7 +1702,7 @@
           <w14:ligatures w14:val="standardContextual"/>
         </w:rPr>
       </w:pPr>
-      <w:hyperlink w:anchor="_Toc230444943" w:history="1">
+      <w:hyperlink w:anchor="_Toc230445939" w:history="1">
         <w:r>
           <w:rPr>
             <w:rStyle w:val="Hyperlink"/>
@@ -1729,7 +1729,7 @@
             <w:noProof/>
             <w:webHidden/>
           </w:rPr>
-          <w:instrText xml:space="preserve"> PAGEREF _Toc230444943 \h </w:instrText>
+          <w:instrText xml:space="preserve"> PAGEREF _Toc230445939 \h </w:instrText>
         </w:r>
         <w:r>
           <w:rPr>
@@ -1775,7 +1775,7 @@
           <w14:ligatures w14:val="standardContextual"/>
         </w:rPr>
       </w:pPr>
-      <w:hyperlink w:anchor="_Toc230444944" w:history="1">
+      <w:hyperlink w:anchor="_Toc230445940" w:history="1">
         <w:r>
           <w:rPr>
             <w:rStyle w:val="Hyperlink"/>
@@ -1802,7 +1802,7 @@
             <w:noProof/>
             <w:webHidden/>
           </w:rPr>
-          <w:instrText xml:space="preserve"> PAGEREF _Toc230444944 \h </w:instrText>
+          <w:instrText xml:space="preserve"> PAGEREF _Toc230445940 \h </w:instrText>
         </w:r>
         <w:r>
           <w:rPr>
@@ -1848,7 +1848,7 @@
           <w14:ligatures w14:val="standardContextual"/>
         </w:rPr>
       </w:pPr>
-      <w:hyperlink w:anchor="_Toc230444945" w:history="1">
+      <w:hyperlink w:anchor="_Toc230445941" w:history="1">
         <w:r>
           <w:rPr>
             <w:rStyle w:val="Hyperlink"/>
@@ -1875,7 +1875,7 @@
             <w:noProof/>
             <w:webHidden/>
           </w:rPr>
-          <w:instrText xml:space="preserve"> PAGEREF _Toc230444945 \h </w:instrText>
+          <w:instrText xml:space="preserve"> PAGEREF _Toc230445941 \h </w:instrText>
         </w:r>
         <w:r>
           <w:rPr>
@@ -1921,7 +1921,7 @@
           <w14:ligatures w14:val="standardContextual"/>
         </w:rPr>
       </w:pPr>
-      <w:hyperlink w:anchor="_Toc230444946" w:history="1">
+      <w:hyperlink w:anchor="_Toc230445942" w:history="1">
         <w:r>
           <w:rPr>
             <w:rStyle w:val="Hyperlink"/>
@@ -1948,7 +1948,7 @@
             <w:noProof/>
             <w:webHidden/>
           </w:rPr>
-          <w:instrText xml:space="preserve"> PAGEREF _Toc230444946 \h </w:instrText>
+          <w:instrText xml:space="preserve"> PAGEREF _Toc230445942 \h </w:instrText>
         </w:r>
         <w:r>
           <w:rPr>
@@ -1994,7 +1994,7 @@
           <w14:ligatures w14:val="standardContextual"/>
         </w:rPr>
       </w:pPr>
-      <w:hyperlink w:anchor="_Toc230444947" w:history="1">
+      <w:hyperlink w:anchor="_Toc230445943" w:history="1">
         <w:r>
           <w:rPr>
             <w:rStyle w:val="Hyperlink"/>
@@ -2021,7 +2021,7 @@
             <w:noProof/>
             <w:webHidden/>
           </w:rPr>
-          <w:instrText xml:space="preserve"> PAGEREF _Toc230444947 \h </w:instrText>
+          <w:instrText xml:space="preserve"> PAGEREF _Toc230445943 \h </w:instrText>
         </w:r>
         <w:r>
           <w:rPr>
@@ -2067,7 +2067,7 @@
           <w14:ligatures w14:val="standardContextual"/>
         </w:rPr>
       </w:pPr>
-      <w:hyperlink w:anchor="_Toc230444948" w:history="1">
+      <w:hyperlink w:anchor="_Toc230445944" w:history="1">
         <w:r>
           <w:rPr>
             <w:rStyle w:val="Hyperlink"/>
@@ -2094,7 +2094,7 @@
             <w:noProof/>
             <w:webHidden/>
           </w:rPr>
-          <w:instrText xml:space="preserve"> PAGEREF _Toc230444948 \h </w:instrText>
+          <w:instrText xml:space="preserve"> PAGEREF _Toc230445944 \h </w:instrText>
         </w:r>
         <w:r>
           <w:rPr>
@@ -2140,7 +2140,7 @@
           <w14:ligatures w14:val="standardContextual"/>
         </w:rPr>
       </w:pPr>
-      <w:hyperlink w:anchor="_Toc230444949" w:history="1">
+      <w:hyperlink w:anchor="_Toc230445945" w:history="1">
         <w:r>
           <w:rPr>
             <w:rStyle w:val="Hyperlink"/>
@@ -2167,7 +2167,7 @@
             <w:noProof/>
             <w:webHidden/>
           </w:rPr>
-          <w:instrText xml:space="preserve"> PAGEREF _Toc230444949 \h </w:instrText>
+          <w:instrText xml:space="preserve"> PAGEREF _Toc230445945 \h </w:instrText>
         </w:r>
         <w:r>
           <w:rPr>
@@ -2213,7 +2213,7 @@
           <w14:ligatures w14:val="standardContextual"/>
         </w:rPr>
       </w:pPr>
-      <w:hyperlink w:anchor="_Toc230444950" w:history="1">
+      <w:hyperlink w:anchor="_Toc230445946" w:history="1">
         <w:r>
           <w:rPr>
             <w:rStyle w:val="Hyperlink"/>
@@ -2240,7 +2240,7 @@
             <w:noProof/>
             <w:webHidden/>
           </w:rPr>
-          <w:instrText xml:space="preserve"> PAGEREF _Toc230444950 \h </w:instrText>
+          <w:instrText xml:space="preserve"> PAGEREF _Toc230445946 \h </w:instrText>
         </w:r>
         <w:r>
           <w:rPr>
@@ -2286,7 +2286,7 @@
           <w14:ligatures w14:val="standardContextual"/>
         </w:rPr>
       </w:pPr>
-      <w:hyperlink w:anchor="_Toc230444951" w:history="1">
+      <w:hyperlink w:anchor="_Toc230445947" w:history="1">
         <w:r>
           <w:rPr>
             <w:rStyle w:val="Hyperlink"/>
@@ -2313,7 +2313,7 @@
             <w:noProof/>
             <w:webHidden/>
           </w:rPr>
-          <w:instrText xml:space="preserve"> PAGEREF _Toc230444951 \h </w:instrText>
+          <w:instrText xml:space="preserve"> PAGEREF _Toc230445947 \h </w:instrText>
         </w:r>
         <w:r>
           <w:rPr>
@@ -2359,7 +2359,7 @@
           <w14:ligatures w14:val="standardContextual"/>
         </w:rPr>
       </w:pPr>
-      <w:hyperlink w:anchor="_Toc230444952" w:history="1">
+      <w:hyperlink w:anchor="_Toc230445948" w:history="1">
         <w:r>
           <w:rPr>
             <w:rStyle w:val="Hyperlink"/>
@@ -2386,7 +2386,7 @@
             <w:noProof/>
             <w:webHidden/>
           </w:rPr>
-          <w:instrText xml:space="preserve"> PAGEREF _Toc230444952 \h </w:instrText>
+          <w:instrText xml:space="preserve"> PAGEREF _Toc230445948 \h </w:instrText>
         </w:r>
         <w:r>
           <w:rPr>
@@ -2432,7 +2432,7 @@
           <w14:ligatures w14:val="standardContextual"/>
         </w:rPr>
       </w:pPr>
-      <w:hyperlink w:anchor="_Toc230444953" w:history="1">
+      <w:hyperlink w:anchor="_Toc230445949" w:history="1">
         <w:r>
           <w:rPr>
             <w:rStyle w:val="Hyperlink"/>
@@ -2459,7 +2459,7 @@
             <w:noProof/>
             <w:webHidden/>
           </w:rPr>
-          <w:instrText xml:space="preserve"> PAGEREF _Toc230444953 \h </w:instrText>
+          <w:instrText xml:space="preserve"> PAGEREF _Toc230445949 \h </w:instrText>
         </w:r>
         <w:r>
           <w:rPr>
@@ -2505,7 +2505,7 @@
           <w14:ligatures w14:val="standardContextual"/>
         </w:rPr>
       </w:pPr>
-      <w:hyperlink w:anchor="_Toc230444954" w:history="1">
+      <w:hyperlink w:anchor="_Toc230445950" w:history="1">
         <w:r>
           <w:rPr>
             <w:rStyle w:val="Hyperlink"/>
@@ -2532,7 +2532,7 @@
             <w:noProof/>
             <w:webHidden/>
           </w:rPr>
-          <w:instrText xml:space="preserve"> PAGEREF _Toc230444954 \h </w:instrText>
+          <w:instrText xml:space="preserve"> PAGEREF _Toc230445950 \h </w:instrText>
         </w:r>
         <w:r>
           <w:rPr>
@@ -2578,7 +2578,7 @@
           <w14:ligatures w14:val="standardContextual"/>
         </w:rPr>
       </w:pPr>
-      <w:hyperlink w:anchor="_Toc230444955" w:history="1">
+      <w:hyperlink w:anchor="_Toc230445951" w:history="1">
         <w:r>
           <w:rPr>
             <w:rStyle w:val="Hyperlink"/>
@@ -2605,7 +2605,7 @@
             <w:noProof/>
             <w:webHidden/>
           </w:rPr>
-          <w:instrText xml:space="preserve"> PAGEREF _Toc230444955 \h </w:instrText>
+          <w:instrText xml:space="preserve"> PAGEREF _Toc230445951 \h </w:instrText>
         </w:r>
         <w:r>
           <w:rPr>
@@ -2651,7 +2651,7 @@
           <w14:ligatures w14:val="standardContextual"/>
         </w:rPr>
       </w:pPr>
-      <w:hyperlink w:anchor="_Toc230444956" w:history="1">
+      <w:hyperlink w:anchor="_Toc230445952" w:history="1">
         <w:r>
           <w:rPr>
             <w:rStyle w:val="Hyperlink"/>
@@ -2678,7 +2678,7 @@
             <w:noProof/>
             <w:webHidden/>
           </w:rPr>
-          <w:instrText xml:space="preserve"> PAGEREF _Toc230444956 \h </w:instrText>
+          <w:instrText xml:space="preserve"> PAGEREF _Toc230445952 \h </w:instrText>
         </w:r>
         <w:r>
           <w:rPr>
@@ -2724,7 +2724,7 @@
           <w14:ligatures w14:val="standardContextual"/>
         </w:rPr>
       </w:pPr>
-      <w:hyperlink w:anchor="_Toc230444957" w:history="1">
+      <w:hyperlink w:anchor="_Toc230445953" w:history="1">
         <w:r>
           <w:rPr>
             <w:rStyle w:val="Hyperlink"/>
@@ -2751,7 +2751,7 @@
             <w:noProof/>
             <w:webHidden/>
           </w:rPr>
-          <w:instrText xml:space="preserve"> PAGEREF _Toc230444957 \h </w:instrText>
+          <w:instrText xml:space="preserve"> PAGEREF _Toc230445953 \h </w:instrText>
         </w:r>
         <w:r>
           <w:rPr>
@@ -2797,7 +2797,7 @@
           <w14:ligatures w14:val="standardContextual"/>
         </w:rPr>
       </w:pPr>
-      <w:hyperlink w:anchor="_Toc230444958" w:history="1">
+      <w:hyperlink w:anchor="_Toc230445954" w:history="1">
         <w:r>
           <w:rPr>
             <w:rStyle w:val="Hyperlink"/>
@@ -2824,7 +2824,7 @@
             <w:noProof/>
             <w:webHidden/>
           </w:rPr>
-          <w:instrText xml:space="preserve"> PAGEREF _Toc230444958 \h </w:instrText>
+          <w:instrText xml:space="preserve"> PAGEREF _Toc230445954 \h </w:instrText>
         </w:r>
         <w:r>
           <w:rPr>
@@ -2870,7 +2870,7 @@
           <w14:ligatures w14:val="standardContextual"/>
         </w:rPr>
       </w:pPr>
-      <w:hyperlink w:anchor="_Toc230444959" w:history="1">
+      <w:hyperlink w:anchor="_Toc230445955" w:history="1">
         <w:r>
           <w:rPr>
             <w:rStyle w:val="Hyperlink"/>
@@ -2897,7 +2897,7 @@
             <w:noProof/>
             <w:webHidden/>
           </w:rPr>
-          <w:instrText xml:space="preserve"> PAGEREF _Toc230444959 \h </w:instrText>
+          <w:instrText xml:space="preserve"> PAGEREF _Toc230445955 \h </w:instrText>
         </w:r>
         <w:r>
           <w:rPr>
@@ -2943,7 +2943,7 @@
           <w14:ligatures w14:val="standardContextual"/>
         </w:rPr>
       </w:pPr>
-      <w:hyperlink w:anchor="_Toc230444960" w:history="1">
+      <w:hyperlink w:anchor="_Toc230445956" w:history="1">
         <w:r>
           <w:rPr>
             <w:rStyle w:val="Hyperlink"/>
@@ -2970,7 +2970,7 @@
             <w:noProof/>
             <w:webHidden/>
           </w:rPr>
-          <w:instrText xml:space="preserve"> PAGEREF _Toc230444960 \h </w:instrText>
+          <w:instrText xml:space="preserve"> PAGEREF _Toc230445956 \h </w:instrText>
         </w:r>
         <w:r>
           <w:rPr>
@@ -3016,7 +3016,7 @@
           <w14:ligatures w14:val="standardContextual"/>
         </w:rPr>
       </w:pPr>
-      <w:hyperlink w:anchor="_Toc230444961" w:history="1">
+      <w:hyperlink w:anchor="_Toc230445957" w:history="1">
         <w:r>
           <w:rPr>
             <w:rStyle w:val="Hyperlink"/>
@@ -3043,7 +3043,7 @@
             <w:noProof/>
             <w:webHidden/>
           </w:rPr>
-          <w:instrText xml:space="preserve"> PAGEREF _Toc230444961 \h </w:instrText>
+          <w:instrText xml:space="preserve"> PAGEREF _Toc230445957 \h </w:instrText>
         </w:r>
         <w:r>
           <w:rPr>
@@ -3089,7 +3089,7 @@
           <w14:ligatures w14:val="standardContextual"/>
         </w:rPr>
       </w:pPr>
-      <w:hyperlink w:anchor="_Toc230444962" w:history="1">
+      <w:hyperlink w:anchor="_Toc230445958" w:history="1">
         <w:r>
           <w:rPr>
             <w:rStyle w:val="Hyperlink"/>
@@ -3116,7 +3116,7 @@
             <w:noProof/>
             <w:webHidden/>
           </w:rPr>
-          <w:instrText xml:space="preserve"> PAGEREF _Toc230444962 \h </w:instrText>
+          <w:instrText xml:space="preserve"> PAGEREF _Toc230445958 \h </w:instrText>
         </w:r>
         <w:r>
           <w:rPr>
@@ -3162,7 +3162,7 @@
           <w14:ligatures w14:val="standardContextual"/>
         </w:rPr>
       </w:pPr>
-      <w:hyperlink w:anchor="_Toc230444963" w:history="1">
+      <w:hyperlink w:anchor="_Toc230445959" w:history="1">
         <w:r>
           <w:rPr>
             <w:rStyle w:val="Hyperlink"/>
@@ -3189,7 +3189,7 @@
             <w:noProof/>
             <w:webHidden/>
           </w:rPr>
-          <w:instrText xml:space="preserve"> PAGEREF _Toc230444963 \h </w:instrText>
+          <w:instrText xml:space="preserve"> PAGEREF _Toc230445959 \h </w:instrText>
         </w:r>
         <w:r>
           <w:rPr>
@@ -3235,7 +3235,7 @@
         <w:pStyle w:val="Heading1"/>
         <w:shd w:val="clear" w:color="auto" w:fill="156082"/>
       </w:pPr>
-      <w:bookmarkStart w:id="1" w:name="_Toc230444923"/>
+      <w:bookmarkStart w:id="1" w:name="_Toc230445919"/>
       <w:r>
         <w:lastRenderedPageBreak/>
         <w:t xml:space="preserve">DSES Spectrum Analyzer — </w:t>
@@ -3314,7 +3314,7 @@
       <w:pPr>
         <w:pStyle w:val="Heading2"/>
       </w:pPr>
-      <w:bookmarkStart w:id="2" w:name="_Toc230444924"/>
+      <w:bookmarkStart w:id="2" w:name="_Toc230445920"/>
       <w:r>
         <w:t>1. What the recipient needs to know first</w:t>
       </w:r>
@@ -3388,7 +3388,7 @@
       <w:pPr>
         <w:pStyle w:val="Heading3"/>
       </w:pPr>
-      <w:bookmarkStart w:id="3" w:name="_Toc230444925"/>
+      <w:bookmarkStart w:id="3" w:name="_Toc230445921"/>
       <w:r>
         <w:t>System requirements</w:t>
       </w:r>
@@ -3667,7 +3667,7 @@
       <w:pPr>
         <w:pStyle w:val="Heading2"/>
       </w:pPr>
-      <w:bookmarkStart w:id="4" w:name="_Toc230444926"/>
+      <w:bookmarkStart w:id="4" w:name="_Toc230445922"/>
       <w:r>
         <w:t>2. Installing Radioconda</w:t>
       </w:r>
@@ -3677,7 +3677,7 @@
       <w:pPr>
         <w:pStyle w:val="Heading3"/>
       </w:pPr>
-      <w:bookmarkStart w:id="5" w:name="_Toc230444927"/>
+      <w:bookmarkStart w:id="5" w:name="_Toc230445923"/>
       <w:r>
         <w:t>2.1 Windows 11</w:t>
       </w:r>
@@ -3854,7 +3854,7 @@
       <w:pPr>
         <w:pStyle w:val="Heading3"/>
       </w:pPr>
-      <w:bookmarkStart w:id="6" w:name="_Toc230444928"/>
+      <w:bookmarkStart w:id="6" w:name="_Toc230445924"/>
       <w:r>
         <w:t>2.2 Linux</w:t>
       </w:r>
@@ -4059,7 +4059,7 @@
       <w:pPr>
         <w:pStyle w:val="Heading3"/>
       </w:pPr>
-      <w:bookmarkStart w:id="7" w:name="_Toc230444929"/>
+      <w:bookmarkStart w:id="7" w:name="_Toc230445925"/>
       <w:r>
         <w:t>2.3 macOS (Intel and Apple Silicon)</w:t>
       </w:r>
@@ -4296,7 +4296,7 @@
       <w:pPr>
         <w:pStyle w:val="Heading2"/>
       </w:pPr>
-      <w:bookmarkStart w:id="8" w:name="_Toc230444930"/>
+      <w:bookmarkStart w:id="8" w:name="_Toc230445926"/>
       <w:r>
         <w:t>3. Installing the DSES Spectrum Analyzer</w:t>
       </w:r>
@@ -4304,96 +4304,116 @@
     </w:p>
     <w:p>
       <w:r>
-        <w:t>Download the application zip from the distribution site:</w:t>
-      </w:r>
-    </w:p>
-    <w:p>
-      <w:r>
-        <w:t>&lt;https://gpstime.com/sw_distribution/b210_sa/&gt;</w:t>
-      </w:r>
-    </w:p>
-    <w:p>
-      <w:r>
-        <w:t xml:space="preserve">Get the file named </w:t>
+        <w:t xml:space="preserve">Download the application from the distribution site using the direct links below. (The folder itself is not browsable — opening </w:t>
       </w:r>
       <w:r>
         <w:rPr>
           <w:rFonts w:ascii="Consolas" w:hAnsi="Consolas"/>
           <w:sz w:val="20"/>
         </w:rPr>
-        <w:t>dses-spectrum-analyzer-&lt;version&gt;.zip</w:t>
-      </w:r>
-      <w:r>
-        <w:t xml:space="preserve"> (e.g. </w:t>
+        <w:t>https://gpstime.com/sw_distribution/b210_sa/</w:t>
+      </w:r>
+      <w:r>
+        <w:t xml:space="preserve"> in a browser returns “Forbidden”, which is normal; use the file links directly.)</w:t>
+      </w:r>
+    </w:p>
+    <w:p>
+      <w:pPr>
+        <w:pStyle w:val="ListBullet"/>
+      </w:pPr>
+      <w:r>
+        <w:rPr>
+          <w:b/>
+        </w:rPr>
+        <w:t>Application (zip):</w:t>
+      </w:r>
+      <w:r>
+        <w:t xml:space="preserve"> &lt;https://gpstime.com/sw_distribution/b210_sa/dses-spectrum-analyzer-1.0.0.zip&gt;</w:t>
+      </w:r>
+    </w:p>
+    <w:p>
+      <w:pPr>
+        <w:pStyle w:val="ListBullet"/>
+      </w:pPr>
+      <w:r>
+        <w:rPr>
+          <w:b/>
+        </w:rPr>
+        <w:lastRenderedPageBreak/>
+        <w:t>This guide (PDF):</w:t>
+      </w:r>
+      <w:r>
+        <w:t xml:space="preserve"> &lt;https://gpstime.com/sw_distribution/b210_sa/DSES_RFI_Spectrum_Analyzer_Installation.pdf&gt;</w:t>
+      </w:r>
+    </w:p>
+    <w:p>
+      <w:r>
+        <w:t xml:space="preserve">The zip is roughly 60 MB — it includes a short sample recording so the program can run in playback mode when no radio is attached. (Replace </w:t>
       </w:r>
       <w:r>
         <w:rPr>
           <w:rFonts w:ascii="Consolas" w:hAnsi="Consolas"/>
           <w:sz w:val="20"/>
         </w:rPr>
-        <w:t>dses-spectrum-analyzer-1.0.0.zip</w:t>
-      </w:r>
-      <w:r>
-        <w:t>) — that’s the latest release. This guide (</w:t>
+        <w:t>1.0.0</w:t>
+      </w:r>
+      <w:r>
+        <w:t xml:space="preserve"> in the link with a newer version number if a later release has been published.)</w:t>
+      </w:r>
+    </w:p>
+    <w:p>
+      <w:pPr>
+        <w:pStyle w:val="Heading3"/>
+      </w:pPr>
+      <w:bookmarkStart w:id="9" w:name="_Toc230445927"/>
+      <w:r>
+        <w:t>3.1 Windows 11</w:t>
+      </w:r>
+      <w:bookmarkEnd w:id="9"/>
+    </w:p>
+    <w:p>
+      <w:pPr>
+        <w:pStyle w:val="ListNumber"/>
+      </w:pPr>
+      <w:r>
+        <w:t xml:space="preserve">Extract the zip anywhere you have write permission. A common choice is </w:t>
       </w:r>
       <w:r>
         <w:rPr>
           <w:rFonts w:ascii="Consolas" w:hAnsi="Consolas"/>
           <w:sz w:val="20"/>
         </w:rPr>
-        <w:t>DSES_RFI_Spectrum_Analyzer_Installation.pdf</w:t>
-      </w:r>
-      <w:r>
-        <w:t xml:space="preserve">) </w:t>
-      </w:r>
-      <w:r>
-        <w:lastRenderedPageBreak/>
-        <w:t>lives in the same directory if you ever need a fresh copy. The zip is large (a few hundred MB) because it includes a sample recording for playback mode.</w:t>
-      </w:r>
-    </w:p>
-    <w:p>
-      <w:pPr>
-        <w:pStyle w:val="Heading3"/>
-      </w:pPr>
-      <w:bookmarkStart w:id="9" w:name="_Toc230444931"/>
-      <w:r>
-        <w:t>3.1 Windows 11</w:t>
-      </w:r>
-      <w:bookmarkEnd w:id="9"/>
-    </w:p>
-    <w:p>
-      <w:pPr>
-        <w:pStyle w:val="ListNumber"/>
-      </w:pPr>
-      <w:r>
-        <w:t xml:space="preserve">Extract the zip anywhere you have write permission. A common choice is </w:t>
+        <w:t>Documents\DSES-Spectrum-Analyzer</w:t>
+      </w:r>
+      <w:r>
+        <w:t xml:space="preserve">. The extracted folder will be </w:t>
       </w:r>
       <w:r>
         <w:rPr>
           <w:rFonts w:ascii="Consolas" w:hAnsi="Consolas"/>
           <w:sz w:val="20"/>
         </w:rPr>
-        <w:t>Documents\DSES-Spectrum-Analyzer</w:t>
-      </w:r>
-      <w:r>
-        <w:t xml:space="preserve">. The extracted folder will be </w:t>
+        <w:t>dses-spectrum-analyzer-1.0.0\</w:t>
+      </w:r>
+      <w:r>
+        <w:t xml:space="preserve"> and will contain </w:t>
       </w:r>
       <w:r>
         <w:rPr>
           <w:rFonts w:ascii="Consolas" w:hAnsi="Consolas"/>
           <w:sz w:val="20"/>
         </w:rPr>
-        <w:t>dses-spectrum-analyzer-1.0.0\</w:t>
-      </w:r>
-      <w:r>
-        <w:t xml:space="preserve"> and will contain </w:t>
+        <w:t>dses_spectrum_analyzer.py</w:t>
+      </w:r>
+      <w:r>
+        <w:t xml:space="preserve">, </w:t>
       </w:r>
       <w:r>
         <w:rPr>
           <w:rFonts w:ascii="Consolas" w:hAnsi="Consolas"/>
           <w:sz w:val="20"/>
         </w:rPr>
-        <w:t>dses_spectrum_analyzer.py</w:t>
+        <w:t>launcher.bat</w:t>
       </w:r>
       <w:r>
         <w:t xml:space="preserve">, </w:t>
@@ -4403,7 +4423,7 @@
           <w:rFonts w:ascii="Consolas" w:hAnsi="Consolas"/>
           <w:sz w:val="20"/>
         </w:rPr>
-        <w:t>launcher.bat</w:t>
+        <w:t>launcher.ps1</w:t>
       </w:r>
       <w:r>
         <w:t xml:space="preserve">, </w:t>
@@ -4413,7 +4433,7 @@
           <w:rFonts w:ascii="Consolas" w:hAnsi="Consolas"/>
           <w:sz w:val="20"/>
         </w:rPr>
-        <w:t>launcher.ps1</w:t>
+        <w:t>install-shortcut.ps1</w:t>
       </w:r>
       <w:r>
         <w:t xml:space="preserve">, </w:t>
@@ -4423,72 +4443,72 @@
           <w:rFonts w:ascii="Consolas" w:hAnsi="Consolas"/>
           <w:sz w:val="20"/>
         </w:rPr>
-        <w:t>install-shortcut.ps1</w:t>
-      </w:r>
-      <w:r>
-        <w:t xml:space="preserve">, </w:t>
+        <w:t>LICENSE</w:t>
+      </w:r>
+      <w:r>
+        <w:t xml:space="preserve">, the </w:t>
       </w:r>
       <w:r>
         <w:rPr>
           <w:rFonts w:ascii="Consolas" w:hAnsi="Consolas"/>
           <w:sz w:val="20"/>
         </w:rPr>
-        <w:t>LICENSE</w:t>
-      </w:r>
-      <w:r>
-        <w:t xml:space="preserve">, the </w:t>
+        <w:t>icons\</w:t>
+      </w:r>
+      <w:r>
+        <w:t xml:space="preserve"> folder, and this guide.</w:t>
+      </w:r>
+    </w:p>
+    <w:p>
+      <w:pPr>
+        <w:pStyle w:val="ListNumber"/>
+      </w:pPr>
+      <w:r>
+        <w:t xml:space="preserve">Double-click </w:t>
+      </w:r>
+      <w:r>
+        <w:rPr>
+          <w:b/>
+        </w:rPr>
+        <w:t>`launcher.bat`</w:t>
+      </w:r>
+      <w:r>
+        <w:t xml:space="preserve"> to start the application.</w:t>
+      </w:r>
+    </w:p>
+    <w:p>
+      <w:pPr>
+        <w:pStyle w:val="ListNumber"/>
+      </w:pPr>
+      <w:r>
+        <w:t xml:space="preserve">The first time you run it, the launcher searches for Radioconda in this order: the </w:t>
       </w:r>
       <w:r>
         <w:rPr>
           <w:rFonts w:ascii="Consolas" w:hAnsi="Consolas"/>
           <w:sz w:val="20"/>
         </w:rPr>
-        <w:t>icons\</w:t>
-      </w:r>
-      <w:r>
-        <w:t xml:space="preserve"> folder, and this guide.</w:t>
-      </w:r>
-    </w:p>
-    <w:p>
-      <w:pPr>
-        <w:pStyle w:val="ListNumber"/>
-      </w:pPr>
-      <w:r>
-        <w:t xml:space="preserve">Double-click </w:t>
-      </w:r>
-      <w:r>
-        <w:rPr>
-          <w:b/>
-        </w:rPr>
-        <w:t>`launcher.bat`</w:t>
-      </w:r>
-      <w:r>
-        <w:t xml:space="preserve"> to start the application.</w:t>
-      </w:r>
-    </w:p>
-    <w:p>
-      <w:pPr>
-        <w:pStyle w:val="ListNumber"/>
-      </w:pPr>
-      <w:r>
-        <w:t xml:space="preserve">The first time you run it, the launcher searches for Radioconda in this order: the </w:t>
+        <w:t>RADIOCONDA_ROOT</w:t>
+      </w:r>
+      <w:r>
+        <w:t xml:space="preserve"> environment variable, any currently-activated conda env, </w:t>
       </w:r>
       <w:r>
         <w:rPr>
           <w:rFonts w:ascii="Consolas" w:hAnsi="Consolas"/>
           <w:sz w:val="20"/>
         </w:rPr>
-        <w:t>RADIOCONDA_ROOT</w:t>
-      </w:r>
-      <w:r>
-        <w:t xml:space="preserve"> environment variable, any currently-activated conda env, </w:t>
+        <w:t>%LOCALAPPDATA%\radioconda</w:t>
+      </w:r>
+      <w:r>
+        <w:t xml:space="preserve">, </w:t>
       </w:r>
       <w:r>
         <w:rPr>
           <w:rFonts w:ascii="Consolas" w:hAnsi="Consolas"/>
           <w:sz w:val="20"/>
         </w:rPr>
-        <w:t>%LOCALAPPDATA%\radioconda</w:t>
+        <w:t>C:\ProgramData\radioconda</w:t>
       </w:r>
       <w:r>
         <w:t xml:space="preserve">, </w:t>
@@ -4498,36 +4518,26 @@
           <w:rFonts w:ascii="Consolas" w:hAnsi="Consolas"/>
           <w:sz w:val="20"/>
         </w:rPr>
-        <w:t>C:\ProgramData\radioconda</w:t>
-      </w:r>
-      <w:r>
-        <w:t xml:space="preserve">, </w:t>
+        <w:t>%USERPROFILE%\radioconda</w:t>
+      </w:r>
+      <w:r>
+        <w:t xml:space="preserve">, a cached config file, then </w:t>
       </w:r>
       <w:r>
         <w:rPr>
           <w:rFonts w:ascii="Consolas" w:hAnsi="Consolas"/>
           <w:sz w:val="20"/>
         </w:rPr>
-        <w:t>%USERPROFILE%\radioconda</w:t>
-      </w:r>
-      <w:r>
-        <w:t xml:space="preserve">, a cached config file, then </w:t>
+        <w:t>conda info --base</w:t>
+      </w:r>
+      <w:r>
+        <w:t xml:space="preserve"> if </w:t>
       </w:r>
       <w:r>
         <w:rPr>
           <w:rFonts w:ascii="Consolas" w:hAnsi="Consolas"/>
           <w:sz w:val="20"/>
         </w:rPr>
-        <w:t>conda info --base</w:t>
-      </w:r>
-      <w:r>
-        <w:t xml:space="preserve"> if </w:t>
-      </w:r>
-      <w:r>
-        <w:rPr>
-          <w:rFonts w:ascii="Consolas" w:hAnsi="Consolas"/>
-          <w:sz w:val="20"/>
-        </w:rPr>
         <w:t>conda</w:t>
       </w:r>
       <w:r>
@@ -4560,7 +4570,7 @@
       <w:pPr>
         <w:pStyle w:val="Heading3"/>
       </w:pPr>
-      <w:bookmarkStart w:id="10" w:name="_Toc230444932"/>
+      <w:bookmarkStart w:id="10" w:name="_Toc230445928"/>
       <w:r>
         <w:t>3.2 Linux</w:t>
       </w:r>
@@ -4715,6 +4725,7 @@
     </w:tbl>
     <w:p>
       <w:r>
+        <w:lastRenderedPageBreak/>
         <w:t xml:space="preserve">(The </w:t>
       </w:r>
       <w:r>
@@ -4752,9 +4763,8 @@
       <w:pPr>
         <w:pStyle w:val="Heading3"/>
       </w:pPr>
-      <w:bookmarkStart w:id="11" w:name="_Toc230444933"/>
-      <w:r>
-        <w:lastRenderedPageBreak/>
+      <w:bookmarkStart w:id="11" w:name="_Toc230445929"/>
+      <w:r>
         <w:t>3.3 macOS</w:t>
       </w:r>
       <w:bookmarkEnd w:id="11"/>
@@ -4906,9 +4916,12 @@
       <w:pPr>
         <w:pStyle w:val="Heading2"/>
       </w:pPr>
-      <w:bookmarkStart w:id="12" w:name="_Toc230444934"/>
-      <w:r>
-        <w:t>3A. Extra setup for SDRPlay receivers (RSP1A / RSP1B / RSPduo / RSPdx)</w:t>
+      <w:bookmarkStart w:id="12" w:name="_Toc230445930"/>
+      <w:r>
+        <w:t xml:space="preserve">3A. Extra setup for </w:t>
+      </w:r>
+      <w:r>
+        <w:t>SDRPlay receivers (RSP1A / RSP1B / RSPduo / RSPdx)</w:t>
       </w:r>
       <w:bookmarkEnd w:id="12"/>
     </w:p>
@@ -4941,7 +4954,7 @@
       <w:pPr>
         <w:pStyle w:val="Heading3"/>
       </w:pPr>
-      <w:bookmarkStart w:id="13" w:name="_Toc230444935"/>
+      <w:bookmarkStart w:id="13" w:name="_Toc230445931"/>
       <w:r>
         <w:t>3A.1 Install the SDRplay API</w:t>
       </w:r>
@@ -5053,7 +5066,7 @@
       <w:pPr>
         <w:pStyle w:val="Heading3"/>
       </w:pPr>
-      <w:bookmarkStart w:id="14" w:name="_Toc230444936"/>
+      <w:bookmarkStart w:id="14" w:name="_Toc230445932"/>
       <w:r>
         <w:t>3A.2 Install the SoapySDRPlay module</w:t>
       </w:r>
@@ -5088,6 +5101,7 @@
         <w:rPr>
           <w:b/>
         </w:rPr>
+        <w:lastRenderedPageBreak/>
         <w:t>Windows</w:t>
       </w:r>
       <w:r>
@@ -5096,7 +5110,6 @@
     </w:p>
     <w:p>
       <w:r>
-        <w:lastRenderedPageBreak/>
         <w:t xml:space="preserve">The extracted release folder (from §3) contains </w:t>
       </w:r>
       <w:r>
@@ -5422,7 +5435,7 @@
       <w:pPr>
         <w:pStyle w:val="Heading2"/>
       </w:pPr>
-      <w:bookmarkStart w:id="15" w:name="_Toc230444937"/>
+      <w:bookmarkStart w:id="15" w:name="_Toc230445933"/>
       <w:r>
         <w:t>4. First-run checklist</w:t>
       </w:r>
@@ -5535,7 +5548,7 @@
       <w:pPr>
         <w:pStyle w:val="Heading3"/>
       </w:pPr>
-      <w:bookmarkStart w:id="16" w:name="_Toc230444938"/>
+      <w:bookmarkStart w:id="16" w:name="_Toc230445934"/>
       <w:r>
         <w:t>Recommended one-time VOLK tuning</w:t>
       </w:r>
@@ -5678,7 +5691,7 @@
       <w:pPr>
         <w:pStyle w:val="Heading2"/>
       </w:pPr>
-      <w:bookmarkStart w:id="17" w:name="_Toc230444939"/>
+      <w:bookmarkStart w:id="17" w:name="_Toc230445935"/>
       <w:r>
         <w:t>5. Updating to a new version</w:t>
       </w:r>
@@ -5688,7 +5701,7 @@
       <w:pPr>
         <w:pStyle w:val="Heading3"/>
       </w:pPr>
-      <w:bookmarkStart w:id="18" w:name="_Toc230444940"/>
+      <w:bookmarkStart w:id="18" w:name="_Toc230445936"/>
       <w:r>
         <w:t>Auto-update notifications</w:t>
       </w:r>
@@ -5779,7 +5792,7 @@
       <w:pPr>
         <w:pStyle w:val="Heading3"/>
       </w:pPr>
-      <w:bookmarkStart w:id="19" w:name="_Toc230444941"/>
+      <w:bookmarkStart w:id="19" w:name="_Toc230445937"/>
       <w:r>
         <w:lastRenderedPageBreak/>
         <w:t>Performing the update</w:t>
@@ -5876,7 +5889,7 @@
       <w:pPr>
         <w:pStyle w:val="Heading3"/>
       </w:pPr>
-      <w:bookmarkStart w:id="20" w:name="_Toc230444942"/>
+      <w:bookmarkStart w:id="20" w:name="_Toc230445938"/>
       <w:r>
         <w:t>What is preserved across versions</w:t>
       </w:r>
@@ -6059,7 +6072,7 @@
       <w:pPr>
         <w:pStyle w:val="Heading3"/>
       </w:pPr>
-      <w:bookmarkStart w:id="21" w:name="_Toc230444943"/>
+      <w:bookmarkStart w:id="21" w:name="_Toc230445939"/>
       <w:r>
         <w:t>Backing up your settings</w:t>
       </w:r>
@@ -6118,7 +6131,7 @@
       <w:pPr>
         <w:pStyle w:val="Heading2"/>
       </w:pPr>
-      <w:bookmarkStart w:id="22" w:name="_Toc230444944"/>
+      <w:bookmarkStart w:id="22" w:name="_Toc230445940"/>
       <w:r>
         <w:t>6. Troubleshooting</w:t>
       </w:r>
@@ -6128,7 +6141,7 @@
       <w:pPr>
         <w:pStyle w:val="Heading3"/>
       </w:pPr>
-      <w:bookmarkStart w:id="23" w:name="_Toc230444945"/>
+      <w:bookmarkStart w:id="23" w:name="_Toc230445941"/>
       <w:r>
         <w:t>“Radioconda not found in standard locations”</w:t>
       </w:r>
@@ -6189,7 +6202,7 @@
       <w:pPr>
         <w:pStyle w:val="Heading3"/>
       </w:pPr>
-      <w:bookmarkStart w:id="24" w:name="_Toc230444946"/>
+      <w:bookmarkStart w:id="24" w:name="_Toc230445942"/>
       <w:r>
         <w:lastRenderedPageBreak/>
         <w:t>“No UHD Devices Found”</w:t>
@@ -6288,7 +6301,7 @@
       <w:pPr>
         <w:pStyle w:val="Heading3"/>
       </w:pPr>
-      <w:bookmarkStart w:id="25" w:name="_Toc230444947"/>
+      <w:bookmarkStart w:id="25" w:name="_Toc230445943"/>
       <w:r>
         <w:t>Persistent “O” overflows at high sample rates</w:t>
       </w:r>
@@ -6332,7 +6345,7 @@
       <w:pPr>
         <w:pStyle w:val="Heading3"/>
       </w:pPr>
-      <w:bookmarkStart w:id="26" w:name="_Toc230444948"/>
+      <w:bookmarkStart w:id="26" w:name="_Toc230445944"/>
       <w:r>
         <w:t>Spectrum looks flat at −140 dB</w:t>
       </w:r>
@@ -6371,7 +6384,7 @@
       <w:pPr>
         <w:pStyle w:val="Heading3"/>
       </w:pPr>
-      <w:bookmarkStart w:id="27" w:name="_Toc230444949"/>
+      <w:bookmarkStart w:id="27" w:name="_Toc230445945"/>
       <w:r>
         <w:t>macOS: “developer cannot be verified”</w:t>
       </w:r>
@@ -6407,7 +6420,7 @@
       <w:pPr>
         <w:pStyle w:val="Heading3"/>
       </w:pPr>
-      <w:bookmarkStart w:id="28" w:name="_Toc230444950"/>
+      <w:bookmarkStart w:id="28" w:name="_Toc230445946"/>
       <w:r>
         <w:t>Settings won’t persist</w:t>
       </w:r>
@@ -6460,7 +6473,7 @@
       <w:pPr>
         <w:pStyle w:val="Heading2"/>
       </w:pPr>
-      <w:bookmarkStart w:id="29" w:name="_Toc230444951"/>
+      <w:bookmarkStart w:id="29" w:name="_Toc230445947"/>
       <w:r>
         <w:t>7. Appendix A — Settings file reference</w:t>
       </w:r>
@@ -6669,7 +6682,7 @@
       <w:pPr>
         <w:pStyle w:val="Heading2"/>
       </w:pPr>
-      <w:bookmarkStart w:id="30" w:name="_Toc230444952"/>
+      <w:bookmarkStart w:id="30" w:name="_Toc230445948"/>
       <w:r>
         <w:t>8. Appendix B — Device selection and SigMF playback</w:t>
       </w:r>
@@ -6679,7 +6692,7 @@
       <w:pPr>
         <w:pStyle w:val="Heading3"/>
       </w:pPr>
-      <w:bookmarkStart w:id="31" w:name="_Toc230444953"/>
+      <w:bookmarkStart w:id="31" w:name="_Toc230445949"/>
       <w:r>
         <w:t>Choosing among multiple radios</w:t>
       </w:r>
@@ -6857,7 +6870,7 @@
       <w:pPr>
         <w:pStyle w:val="Heading3"/>
       </w:pPr>
-      <w:bookmarkStart w:id="32" w:name="_Toc230444954"/>
+      <w:bookmarkStart w:id="32" w:name="_Toc230445950"/>
       <w:r>
         <w:t>SigMF playback mode (no-device fallback)</w:t>
       </w:r>
@@ -7058,7 +7071,7 @@
       <w:pPr>
         <w:pStyle w:val="Heading2"/>
       </w:pPr>
-      <w:bookmarkStart w:id="33" w:name="_Toc230444955"/>
+      <w:bookmarkStart w:id="33" w:name="_Toc230445951"/>
       <w:r>
         <w:t>9. Appendix C — Operating Guide</w:t>
       </w:r>
@@ -7087,7 +7100,7 @@
       <w:pPr>
         <w:pStyle w:val="Heading3"/>
       </w:pPr>
-      <w:bookmarkStart w:id="34" w:name="_Toc230444956"/>
+      <w:bookmarkStart w:id="34" w:name="_Toc230445952"/>
       <w:r>
         <w:t>Starting up — device selection</w:t>
       </w:r>
@@ -7192,7 +7205,7 @@
       <w:pPr>
         <w:pStyle w:val="Heading3"/>
       </w:pPr>
-      <w:bookmarkStart w:id="35" w:name="_Toc230444957"/>
+      <w:bookmarkStart w:id="35" w:name="_Toc230445953"/>
       <w:r>
         <w:t>Playback mode</w:t>
       </w:r>
@@ -7318,7 +7331,7 @@
       <w:pPr>
         <w:pStyle w:val="Heading3"/>
       </w:pPr>
-      <w:bookmarkStart w:id="36" w:name="_Toc230444958"/>
+      <w:bookmarkStart w:id="36" w:name="_Toc230445954"/>
       <w:r>
         <w:t>Sidebar controls (right side)</w:t>
       </w:r>
@@ -7599,7 +7612,7 @@
       <w:pPr>
         <w:pStyle w:val="Heading3"/>
       </w:pPr>
-      <w:bookmarkStart w:id="37" w:name="_Toc230444959"/>
+      <w:bookmarkStart w:id="37" w:name="_Toc230445955"/>
       <w:r>
         <w:t>Spectrum (top plot)</w:t>
       </w:r>
@@ -7732,17 +7745,14 @@
         <w:t>Trace</w:t>
       </w:r>
       <w:r>
-        <w:t xml:space="preserve">: color, line width, alpha, </w:t>
-      </w:r>
-      <w:r>
-        <w:t>label.</w:t>
+        <w:t>: color, line width, alpha, label.</w:t>
       </w:r>
     </w:p>
     <w:p>
       <w:pPr>
         <w:pStyle w:val="Heading3"/>
       </w:pPr>
-      <w:bookmarkStart w:id="38" w:name="_Toc230444960"/>
+      <w:bookmarkStart w:id="38" w:name="_Toc230445956"/>
       <w:r>
         <w:t>Waterfall (bottom plot)</w:t>
       </w:r>
@@ -7809,7 +7819,7 @@
       <w:pPr>
         <w:pStyle w:val="Heading3"/>
       </w:pPr>
-      <w:bookmarkStart w:id="39" w:name="_Toc230444961"/>
+      <w:bookmarkStart w:id="39" w:name="_Toc230445957"/>
       <w:r>
         <w:t>Persistence</w:t>
       </w:r>
@@ -7856,7 +7866,7 @@
       <w:pPr>
         <w:pStyle w:val="Heading3"/>
       </w:pPr>
-      <w:bookmarkStart w:id="40" w:name="_Toc230444962"/>
+      <w:bookmarkStart w:id="40" w:name="_Toc230445958"/>
       <w:r>
         <w:t>Update checks</w:t>
       </w:r>
@@ -7914,7 +7924,7 @@
       <w:pPr>
         <w:pStyle w:val="Heading3"/>
       </w:pPr>
-      <w:bookmarkStart w:id="41" w:name="_Toc230444963"/>
+      <w:bookmarkStart w:id="41" w:name="_Toc230445959"/>
       <w:r>
         <w:t>Tips for pulsar work</w:t>
       </w:r>
@@ -8293,31 +8303,31 @@
       </w:rPr>
     </w:lvl>
   </w:abstractNum>
-  <w:num w:numId="1" w16cid:durableId="238096582">
+  <w:num w:numId="1" w16cid:durableId="1653024499">
     <w:abstractNumId w:val="8"/>
   </w:num>
-  <w:num w:numId="2" w16cid:durableId="189993513">
+  <w:num w:numId="2" w16cid:durableId="577134643">
     <w:abstractNumId w:val="6"/>
   </w:num>
-  <w:num w:numId="3" w16cid:durableId="705717964">
+  <w:num w:numId="3" w16cid:durableId="561719666">
     <w:abstractNumId w:val="5"/>
   </w:num>
-  <w:num w:numId="4" w16cid:durableId="1595362466">
+  <w:num w:numId="4" w16cid:durableId="44261398">
     <w:abstractNumId w:val="4"/>
   </w:num>
-  <w:num w:numId="5" w16cid:durableId="1037581104">
+  <w:num w:numId="5" w16cid:durableId="1708137434">
     <w:abstractNumId w:val="7"/>
   </w:num>
-  <w:num w:numId="6" w16cid:durableId="976763883">
+  <w:num w:numId="6" w16cid:durableId="501629799">
     <w:abstractNumId w:val="3"/>
   </w:num>
-  <w:num w:numId="7" w16cid:durableId="1439716899">
+  <w:num w:numId="7" w16cid:durableId="839465270">
     <w:abstractNumId w:val="2"/>
   </w:num>
-  <w:num w:numId="8" w16cid:durableId="1071192319">
+  <w:num w:numId="8" w16cid:durableId="864711615">
     <w:abstractNumId w:val="1"/>
   </w:num>
-  <w:num w:numId="9" w16cid:durableId="1876851047">
+  <w:num w:numId="9" w16cid:durableId="968317401">
     <w:abstractNumId w:val="0"/>
   </w:num>
 </w:numbering>
@@ -19712,7 +19722,7 @@
     <w:autoRedefine/>
     <w:uiPriority w:val="39"/>
     <w:unhideWhenUsed/>
-    <w:rsid w:val="00B931F4"/>
+    <w:rsid w:val="00096EF5"/>
     <w:pPr>
       <w:spacing w:after="100"/>
     </w:pPr>
@@ -19724,7 +19734,7 @@
     <w:autoRedefine/>
     <w:uiPriority w:val="39"/>
     <w:unhideWhenUsed/>
-    <w:rsid w:val="00B931F4"/>
+    <w:rsid w:val="00096EF5"/>
     <w:pPr>
       <w:spacing w:after="100"/>
       <w:ind w:left="220"/>
@@ -19737,7 +19747,7 @@
     <w:autoRedefine/>
     <w:uiPriority w:val="39"/>
     <w:unhideWhenUsed/>
-    <w:rsid w:val="00B931F4"/>
+    <w:rsid w:val="00096EF5"/>
     <w:pPr>
       <w:spacing w:after="100"/>
       <w:ind w:left="440"/>
@@ -19748,7 +19758,7 @@
     <w:basedOn w:val="DefaultParagraphFont"/>
     <w:uiPriority w:val="99"/>
     <w:unhideWhenUsed/>
-    <w:rsid w:val="00B931F4"/>
+    <w:rsid w:val="00096EF5"/>
     <w:rPr>
       <w:color w:val="0000FF" w:themeColor="hyperlink"/>
       <w:u w:val="single"/>

</xml_diff>

<commit_message>
Note folder is browsable now that .htaccess enables indexing
Directory listing is enabled on the distribution folder via an .htaccess
(Options +Indexes). Update install guide §3 to say users can either use the
direct link or browse the folder, drop the "Forbidden" caveat, and record
the .htaccess in Release_Workflow §3 plus soften the §4.3 link-bump note.
Regenerated PDF/DOCX.
</commit_message>
<xml_diff>
--- a/DSES_RFI_Spectrum_Analyzer_Installation.docx
+++ b/DSES_RFI_Spectrum_Analyzer_Installation.docx
@@ -41,7 +41,7 @@
           <w:noProof/>
         </w:rPr>
         <w:drawing>
-          <wp:inline distT="0" distB="0" distL="0" distR="0" wp14:anchorId="432C1891" wp14:editId="0DB73FA1">
+          <wp:inline distT="0" distB="0" distL="0" distR="0" wp14:anchorId="5B6F7F52" wp14:editId="5F7449EC">
             <wp:extent cx="1371600" cy="1371600"/>
             <wp:effectExtent l="0" t="0" r="0" b="0"/>
             <wp:docPr id="1" name="Picture 1"/>
@@ -138,7 +138,7 @@
         <w:pStyle w:val="Heading1"/>
         <w:shd w:val="clear" w:color="auto" w:fill="156082"/>
       </w:pPr>
-      <w:bookmarkStart w:id="0" w:name="_Toc230445918"/>
+      <w:bookmarkStart w:id="0" w:name="_Toc230446313"/>
       <w:r>
         <w:lastRenderedPageBreak/>
         <w:t>Contents</w:t>
@@ -169,7 +169,7 @@
       <w:r>
         <w:fldChar w:fldCharType="separate"/>
       </w:r>
-      <w:hyperlink w:anchor="_Toc230445918" w:history="1">
+      <w:hyperlink w:anchor="_Toc230446313" w:history="1">
         <w:r>
           <w:rPr>
             <w:rStyle w:val="Hyperlink"/>
@@ -196,7 +196,7 @@
             <w:noProof/>
             <w:webHidden/>
           </w:rPr>
-          <w:instrText xml:space="preserve"> PAGEREF _Toc230445918 \h </w:instrText>
+          <w:instrText xml:space="preserve"> PAGEREF _Toc230446313 \h </w:instrText>
         </w:r>
         <w:r>
           <w:rPr>
@@ -242,7 +242,7 @@
           <w14:ligatures w14:val="standardContextual"/>
         </w:rPr>
       </w:pPr>
-      <w:hyperlink w:anchor="_Toc230445919" w:history="1">
+      <w:hyperlink w:anchor="_Toc230446314" w:history="1">
         <w:r>
           <w:rPr>
             <w:rStyle w:val="Hyperlink"/>
@@ -269,7 +269,7 @@
             <w:noProof/>
             <w:webHidden/>
           </w:rPr>
-          <w:instrText xml:space="preserve"> PAGEREF _Toc230445919 \h </w:instrText>
+          <w:instrText xml:space="preserve"> PAGEREF _Toc230446314 \h </w:instrText>
         </w:r>
         <w:r>
           <w:rPr>
@@ -315,7 +315,7 @@
           <w14:ligatures w14:val="standardContextual"/>
         </w:rPr>
       </w:pPr>
-      <w:hyperlink w:anchor="_Toc230445920" w:history="1">
+      <w:hyperlink w:anchor="_Toc230446315" w:history="1">
         <w:r>
           <w:rPr>
             <w:rStyle w:val="Hyperlink"/>
@@ -342,7 +342,7 @@
             <w:noProof/>
             <w:webHidden/>
           </w:rPr>
-          <w:instrText xml:space="preserve"> PAGEREF _Toc230445920 \h </w:instrText>
+          <w:instrText xml:space="preserve"> PAGEREF _Toc230446315 \h </w:instrText>
         </w:r>
         <w:r>
           <w:rPr>
@@ -388,7 +388,7 @@
           <w14:ligatures w14:val="standardContextual"/>
         </w:rPr>
       </w:pPr>
-      <w:hyperlink w:anchor="_Toc230445921" w:history="1">
+      <w:hyperlink w:anchor="_Toc230446316" w:history="1">
         <w:r>
           <w:rPr>
             <w:rStyle w:val="Hyperlink"/>
@@ -415,7 +415,7 @@
             <w:noProof/>
             <w:webHidden/>
           </w:rPr>
-          <w:instrText xml:space="preserve"> PAGEREF _Toc230445921 \h </w:instrText>
+          <w:instrText xml:space="preserve"> PAGEREF _Toc230446316 \h </w:instrText>
         </w:r>
         <w:r>
           <w:rPr>
@@ -461,7 +461,7 @@
           <w14:ligatures w14:val="standardContextual"/>
         </w:rPr>
       </w:pPr>
-      <w:hyperlink w:anchor="_Toc230445922" w:history="1">
+      <w:hyperlink w:anchor="_Toc230446317" w:history="1">
         <w:r>
           <w:rPr>
             <w:rStyle w:val="Hyperlink"/>
@@ -488,7 +488,7 @@
             <w:noProof/>
             <w:webHidden/>
           </w:rPr>
-          <w:instrText xml:space="preserve"> PAGEREF _Toc230445922 \h </w:instrText>
+          <w:instrText xml:space="preserve"> PAGEREF _Toc230446317 \h </w:instrText>
         </w:r>
         <w:r>
           <w:rPr>
@@ -534,7 +534,7 @@
           <w14:ligatures w14:val="standardContextual"/>
         </w:rPr>
       </w:pPr>
-      <w:hyperlink w:anchor="_Toc230445923" w:history="1">
+      <w:hyperlink w:anchor="_Toc230446318" w:history="1">
         <w:r>
           <w:rPr>
             <w:rStyle w:val="Hyperlink"/>
@@ -561,7 +561,7 @@
             <w:noProof/>
             <w:webHidden/>
           </w:rPr>
-          <w:instrText xml:space="preserve"> PAGEREF _Toc230445923 \h </w:instrText>
+          <w:instrText xml:space="preserve"> PAGEREF _Toc230446318 \h </w:instrText>
         </w:r>
         <w:r>
           <w:rPr>
@@ -607,7 +607,7 @@
           <w14:ligatures w14:val="standardContextual"/>
         </w:rPr>
       </w:pPr>
-      <w:hyperlink w:anchor="_Toc230445924" w:history="1">
+      <w:hyperlink w:anchor="_Toc230446319" w:history="1">
         <w:r>
           <w:rPr>
             <w:rStyle w:val="Hyperlink"/>
@@ -634,7 +634,7 @@
             <w:noProof/>
             <w:webHidden/>
           </w:rPr>
-          <w:instrText xml:space="preserve"> PAGEREF _Toc230445924 \h </w:instrText>
+          <w:instrText xml:space="preserve"> PAGEREF _Toc230446319 \h </w:instrText>
         </w:r>
         <w:r>
           <w:rPr>
@@ -680,7 +680,7 @@
           <w14:ligatures w14:val="standardContextual"/>
         </w:rPr>
       </w:pPr>
-      <w:hyperlink w:anchor="_Toc230445925" w:history="1">
+      <w:hyperlink w:anchor="_Toc230446320" w:history="1">
         <w:r>
           <w:rPr>
             <w:rStyle w:val="Hyperlink"/>
@@ -707,7 +707,7 @@
             <w:noProof/>
             <w:webHidden/>
           </w:rPr>
-          <w:instrText xml:space="preserve"> PAGEREF _Toc230445925 \h </w:instrText>
+          <w:instrText xml:space="preserve"> PAGEREF _Toc230446320 \h </w:instrText>
         </w:r>
         <w:r>
           <w:rPr>
@@ -753,7 +753,7 @@
           <w14:ligatures w14:val="standardContextual"/>
         </w:rPr>
       </w:pPr>
-      <w:hyperlink w:anchor="_Toc230445926" w:history="1">
+      <w:hyperlink w:anchor="_Toc230446321" w:history="1">
         <w:r>
           <w:rPr>
             <w:rStyle w:val="Hyperlink"/>
@@ -780,7 +780,7 @@
             <w:noProof/>
             <w:webHidden/>
           </w:rPr>
-          <w:instrText xml:space="preserve"> PAGEREF _Toc230445926 \h </w:instrText>
+          <w:instrText xml:space="preserve"> PAGEREF _Toc230446321 \h </w:instrText>
         </w:r>
         <w:r>
           <w:rPr>
@@ -826,7 +826,7 @@
           <w14:ligatures w14:val="standardContextual"/>
         </w:rPr>
       </w:pPr>
-      <w:hyperlink w:anchor="_Toc230445927" w:history="1">
+      <w:hyperlink w:anchor="_Toc230446322" w:history="1">
         <w:r>
           <w:rPr>
             <w:rStyle w:val="Hyperlink"/>
@@ -853,7 +853,7 @@
             <w:noProof/>
             <w:webHidden/>
           </w:rPr>
-          <w:instrText xml:space="preserve"> PAGEREF _Toc230445927 \h </w:instrText>
+          <w:instrText xml:space="preserve"> PAGEREF _Toc230446322 \h </w:instrText>
         </w:r>
         <w:r>
           <w:rPr>
@@ -899,7 +899,7 @@
           <w14:ligatures w14:val="standardContextual"/>
         </w:rPr>
       </w:pPr>
-      <w:hyperlink w:anchor="_Toc230445928" w:history="1">
+      <w:hyperlink w:anchor="_Toc230446323" w:history="1">
         <w:r>
           <w:rPr>
             <w:rStyle w:val="Hyperlink"/>
@@ -926,7 +926,7 @@
             <w:noProof/>
             <w:webHidden/>
           </w:rPr>
-          <w:instrText xml:space="preserve"> PAGEREF _Toc230445928 \h </w:instrText>
+          <w:instrText xml:space="preserve"> PAGEREF _Toc230446323 \h </w:instrText>
         </w:r>
         <w:r>
           <w:rPr>
@@ -972,7 +972,7 @@
           <w14:ligatures w14:val="standardContextual"/>
         </w:rPr>
       </w:pPr>
-      <w:hyperlink w:anchor="_Toc230445929" w:history="1">
+      <w:hyperlink w:anchor="_Toc230446324" w:history="1">
         <w:r>
           <w:rPr>
             <w:rStyle w:val="Hyperlink"/>
@@ -999,7 +999,7 @@
             <w:noProof/>
             <w:webHidden/>
           </w:rPr>
-          <w:instrText xml:space="preserve"> PAGEREF _Toc230445929 \h </w:instrText>
+          <w:instrText xml:space="preserve"> PAGEREF _Toc230446324 \h </w:instrText>
         </w:r>
         <w:r>
           <w:rPr>
@@ -1045,7 +1045,7 @@
           <w14:ligatures w14:val="standardContextual"/>
         </w:rPr>
       </w:pPr>
-      <w:hyperlink w:anchor="_Toc230445930" w:history="1">
+      <w:hyperlink w:anchor="_Toc230446325" w:history="1">
         <w:r>
           <w:rPr>
             <w:rStyle w:val="Hyperlink"/>
@@ -1072,7 +1072,7 @@
             <w:noProof/>
             <w:webHidden/>
           </w:rPr>
-          <w:instrText xml:space="preserve"> PAGEREF _Toc230445930 \h </w:instrText>
+          <w:instrText xml:space="preserve"> PAGEREF _Toc230446325 \h </w:instrText>
         </w:r>
         <w:r>
           <w:rPr>
@@ -1118,7 +1118,7 @@
           <w14:ligatures w14:val="standardContextual"/>
         </w:rPr>
       </w:pPr>
-      <w:hyperlink w:anchor="_Toc230445931" w:history="1">
+      <w:hyperlink w:anchor="_Toc230446326" w:history="1">
         <w:r>
           <w:rPr>
             <w:rStyle w:val="Hyperlink"/>
@@ -1145,7 +1145,7 @@
             <w:noProof/>
             <w:webHidden/>
           </w:rPr>
-          <w:instrText xml:space="preserve"> PAGEREF _Toc230445931 \h </w:instrText>
+          <w:instrText xml:space="preserve"> PAGEREF _Toc230446326 \h </w:instrText>
         </w:r>
         <w:r>
           <w:rPr>
@@ -1191,7 +1191,7 @@
           <w14:ligatures w14:val="standardContextual"/>
         </w:rPr>
       </w:pPr>
-      <w:hyperlink w:anchor="_Toc230445932" w:history="1">
+      <w:hyperlink w:anchor="_Toc230446327" w:history="1">
         <w:r>
           <w:rPr>
             <w:rStyle w:val="Hyperlink"/>
@@ -1218,7 +1218,7 @@
             <w:noProof/>
             <w:webHidden/>
           </w:rPr>
-          <w:instrText xml:space="preserve"> PAGEREF _Toc230445932 \h </w:instrText>
+          <w:instrText xml:space="preserve"> PAGEREF _Toc230446327 \h </w:instrText>
         </w:r>
         <w:r>
           <w:rPr>
@@ -1264,7 +1264,7 @@
           <w14:ligatures w14:val="standardContextual"/>
         </w:rPr>
       </w:pPr>
-      <w:hyperlink w:anchor="_Toc230445933" w:history="1">
+      <w:hyperlink w:anchor="_Toc230446328" w:history="1">
         <w:r>
           <w:rPr>
             <w:rStyle w:val="Hyperlink"/>
@@ -1291,7 +1291,7 @@
             <w:noProof/>
             <w:webHidden/>
           </w:rPr>
-          <w:instrText xml:space="preserve"> PAGEREF _Toc230445933 \h </w:instrText>
+          <w:instrText xml:space="preserve"> PAGEREF _Toc230446328 \h </w:instrText>
         </w:r>
         <w:r>
           <w:rPr>
@@ -1337,7 +1337,7 @@
           <w14:ligatures w14:val="standardContextual"/>
         </w:rPr>
       </w:pPr>
-      <w:hyperlink w:anchor="_Toc230445934" w:history="1">
+      <w:hyperlink w:anchor="_Toc230446329" w:history="1">
         <w:r>
           <w:rPr>
             <w:rStyle w:val="Hyperlink"/>
@@ -1364,7 +1364,7 @@
             <w:noProof/>
             <w:webHidden/>
           </w:rPr>
-          <w:instrText xml:space="preserve"> PAGEREF _Toc230445934 \h </w:instrText>
+          <w:instrText xml:space="preserve"> PAGEREF _Toc230446329 \h </w:instrText>
         </w:r>
         <w:r>
           <w:rPr>
@@ -1410,7 +1410,7 @@
           <w14:ligatures w14:val="standardContextual"/>
         </w:rPr>
       </w:pPr>
-      <w:hyperlink w:anchor="_Toc230445935" w:history="1">
+      <w:hyperlink w:anchor="_Toc230446330" w:history="1">
         <w:r>
           <w:rPr>
             <w:rStyle w:val="Hyperlink"/>
@@ -1437,7 +1437,7 @@
             <w:noProof/>
             <w:webHidden/>
           </w:rPr>
-          <w:instrText xml:space="preserve"> PAGEREF _Toc230445935 \h </w:instrText>
+          <w:instrText xml:space="preserve"> PAGEREF _Toc230446330 \h </w:instrText>
         </w:r>
         <w:r>
           <w:rPr>
@@ -1483,7 +1483,7 @@
           <w14:ligatures w14:val="standardContextual"/>
         </w:rPr>
       </w:pPr>
-      <w:hyperlink w:anchor="_Toc230445936" w:history="1">
+      <w:hyperlink w:anchor="_Toc230446331" w:history="1">
         <w:r>
           <w:rPr>
             <w:rStyle w:val="Hyperlink"/>
@@ -1510,7 +1510,7 @@
             <w:noProof/>
             <w:webHidden/>
           </w:rPr>
-          <w:instrText xml:space="preserve"> PAGEREF _Toc230445936 \h </w:instrText>
+          <w:instrText xml:space="preserve"> PAGEREF _Toc230446331 \h </w:instrText>
         </w:r>
         <w:r>
           <w:rPr>
@@ -1556,7 +1556,7 @@
           <w14:ligatures w14:val="standardContextual"/>
         </w:rPr>
       </w:pPr>
-      <w:hyperlink w:anchor="_Toc230445937" w:history="1">
+      <w:hyperlink w:anchor="_Toc230446332" w:history="1">
         <w:r>
           <w:rPr>
             <w:rStyle w:val="Hyperlink"/>
@@ -1583,7 +1583,7 @@
             <w:noProof/>
             <w:webHidden/>
           </w:rPr>
-          <w:instrText xml:space="preserve"> PAGEREF _Toc230445937 \h </w:instrText>
+          <w:instrText xml:space="preserve"> PAGEREF _Toc230446332 \h </w:instrText>
         </w:r>
         <w:r>
           <w:rPr>
@@ -1629,7 +1629,7 @@
           <w14:ligatures w14:val="standardContextual"/>
         </w:rPr>
       </w:pPr>
-      <w:hyperlink w:anchor="_Toc230445938" w:history="1">
+      <w:hyperlink w:anchor="_Toc230446333" w:history="1">
         <w:r>
           <w:rPr>
             <w:rStyle w:val="Hyperlink"/>
@@ -1656,7 +1656,7 @@
             <w:noProof/>
             <w:webHidden/>
           </w:rPr>
-          <w:instrText xml:space="preserve"> PAGEREF _Toc230445938 \h </w:instrText>
+          <w:instrText xml:space="preserve"> PAGEREF _Toc230446333 \h </w:instrText>
         </w:r>
         <w:r>
           <w:rPr>
@@ -1702,7 +1702,7 @@
           <w14:ligatures w14:val="standardContextual"/>
         </w:rPr>
       </w:pPr>
-      <w:hyperlink w:anchor="_Toc230445939" w:history="1">
+      <w:hyperlink w:anchor="_Toc230446334" w:history="1">
         <w:r>
           <w:rPr>
             <w:rStyle w:val="Hyperlink"/>
@@ -1729,7 +1729,7 @@
             <w:noProof/>
             <w:webHidden/>
           </w:rPr>
-          <w:instrText xml:space="preserve"> PAGEREF _Toc230445939 \h </w:instrText>
+          <w:instrText xml:space="preserve"> PAGEREF _Toc230446334 \h </w:instrText>
         </w:r>
         <w:r>
           <w:rPr>
@@ -1775,7 +1775,7 @@
           <w14:ligatures w14:val="standardContextual"/>
         </w:rPr>
       </w:pPr>
-      <w:hyperlink w:anchor="_Toc230445940" w:history="1">
+      <w:hyperlink w:anchor="_Toc230446335" w:history="1">
         <w:r>
           <w:rPr>
             <w:rStyle w:val="Hyperlink"/>
@@ -1802,7 +1802,7 @@
             <w:noProof/>
             <w:webHidden/>
           </w:rPr>
-          <w:instrText xml:space="preserve"> PAGEREF _Toc230445940 \h </w:instrText>
+          <w:instrText xml:space="preserve"> PAGEREF _Toc230446335 \h </w:instrText>
         </w:r>
         <w:r>
           <w:rPr>
@@ -1848,7 +1848,7 @@
           <w14:ligatures w14:val="standardContextual"/>
         </w:rPr>
       </w:pPr>
-      <w:hyperlink w:anchor="_Toc230445941" w:history="1">
+      <w:hyperlink w:anchor="_Toc230446336" w:history="1">
         <w:r>
           <w:rPr>
             <w:rStyle w:val="Hyperlink"/>
@@ -1875,7 +1875,7 @@
             <w:noProof/>
             <w:webHidden/>
           </w:rPr>
-          <w:instrText xml:space="preserve"> PAGEREF _Toc230445941 \h </w:instrText>
+          <w:instrText xml:space="preserve"> PAGEREF _Toc230446336 \h </w:instrText>
         </w:r>
         <w:r>
           <w:rPr>
@@ -1921,7 +1921,7 @@
           <w14:ligatures w14:val="standardContextual"/>
         </w:rPr>
       </w:pPr>
-      <w:hyperlink w:anchor="_Toc230445942" w:history="1">
+      <w:hyperlink w:anchor="_Toc230446337" w:history="1">
         <w:r>
           <w:rPr>
             <w:rStyle w:val="Hyperlink"/>
@@ -1948,7 +1948,7 @@
             <w:noProof/>
             <w:webHidden/>
           </w:rPr>
-          <w:instrText xml:space="preserve"> PAGEREF _Toc230445942 \h </w:instrText>
+          <w:instrText xml:space="preserve"> PAGEREF _Toc230446337 \h </w:instrText>
         </w:r>
         <w:r>
           <w:rPr>
@@ -1994,7 +1994,7 @@
           <w14:ligatures w14:val="standardContextual"/>
         </w:rPr>
       </w:pPr>
-      <w:hyperlink w:anchor="_Toc230445943" w:history="1">
+      <w:hyperlink w:anchor="_Toc230446338" w:history="1">
         <w:r>
           <w:rPr>
             <w:rStyle w:val="Hyperlink"/>
@@ -2021,7 +2021,7 @@
             <w:noProof/>
             <w:webHidden/>
           </w:rPr>
-          <w:instrText xml:space="preserve"> PAGEREF _Toc230445943 \h </w:instrText>
+          <w:instrText xml:space="preserve"> PAGEREF _Toc230446338 \h </w:instrText>
         </w:r>
         <w:r>
           <w:rPr>
@@ -2067,7 +2067,7 @@
           <w14:ligatures w14:val="standardContextual"/>
         </w:rPr>
       </w:pPr>
-      <w:hyperlink w:anchor="_Toc230445944" w:history="1">
+      <w:hyperlink w:anchor="_Toc230446339" w:history="1">
         <w:r>
           <w:rPr>
             <w:rStyle w:val="Hyperlink"/>
@@ -2094,7 +2094,7 @@
             <w:noProof/>
             <w:webHidden/>
           </w:rPr>
-          <w:instrText xml:space="preserve"> PAGEREF _Toc230445944 \h </w:instrText>
+          <w:instrText xml:space="preserve"> PAGEREF _Toc230446339 \h </w:instrText>
         </w:r>
         <w:r>
           <w:rPr>
@@ -2140,7 +2140,7 @@
           <w14:ligatures w14:val="standardContextual"/>
         </w:rPr>
       </w:pPr>
-      <w:hyperlink w:anchor="_Toc230445945" w:history="1">
+      <w:hyperlink w:anchor="_Toc230446340" w:history="1">
         <w:r>
           <w:rPr>
             <w:rStyle w:val="Hyperlink"/>
@@ -2167,7 +2167,7 @@
             <w:noProof/>
             <w:webHidden/>
           </w:rPr>
-          <w:instrText xml:space="preserve"> PAGEREF _Toc230445945 \h </w:instrText>
+          <w:instrText xml:space="preserve"> PAGEREF _Toc230446340 \h </w:instrText>
         </w:r>
         <w:r>
           <w:rPr>
@@ -2213,7 +2213,7 @@
           <w14:ligatures w14:val="standardContextual"/>
         </w:rPr>
       </w:pPr>
-      <w:hyperlink w:anchor="_Toc230445946" w:history="1">
+      <w:hyperlink w:anchor="_Toc230446341" w:history="1">
         <w:r>
           <w:rPr>
             <w:rStyle w:val="Hyperlink"/>
@@ -2240,7 +2240,7 @@
             <w:noProof/>
             <w:webHidden/>
           </w:rPr>
-          <w:instrText xml:space="preserve"> PAGEREF _Toc230445946 \h </w:instrText>
+          <w:instrText xml:space="preserve"> PAGEREF _Toc230446341 \h </w:instrText>
         </w:r>
         <w:r>
           <w:rPr>
@@ -2286,7 +2286,7 @@
           <w14:ligatures w14:val="standardContextual"/>
         </w:rPr>
       </w:pPr>
-      <w:hyperlink w:anchor="_Toc230445947" w:history="1">
+      <w:hyperlink w:anchor="_Toc230446342" w:history="1">
         <w:r>
           <w:rPr>
             <w:rStyle w:val="Hyperlink"/>
@@ -2313,7 +2313,7 @@
             <w:noProof/>
             <w:webHidden/>
           </w:rPr>
-          <w:instrText xml:space="preserve"> PAGEREF _Toc230445947 \h </w:instrText>
+          <w:instrText xml:space="preserve"> PAGEREF _Toc230446342 \h </w:instrText>
         </w:r>
         <w:r>
           <w:rPr>
@@ -2359,7 +2359,7 @@
           <w14:ligatures w14:val="standardContextual"/>
         </w:rPr>
       </w:pPr>
-      <w:hyperlink w:anchor="_Toc230445948" w:history="1">
+      <w:hyperlink w:anchor="_Toc230446343" w:history="1">
         <w:r>
           <w:rPr>
             <w:rStyle w:val="Hyperlink"/>
@@ -2386,7 +2386,7 @@
             <w:noProof/>
             <w:webHidden/>
           </w:rPr>
-          <w:instrText xml:space="preserve"> PAGEREF _Toc230445948 \h </w:instrText>
+          <w:instrText xml:space="preserve"> PAGEREF _Toc230446343 \h </w:instrText>
         </w:r>
         <w:r>
           <w:rPr>
@@ -2432,7 +2432,7 @@
           <w14:ligatures w14:val="standardContextual"/>
         </w:rPr>
       </w:pPr>
-      <w:hyperlink w:anchor="_Toc230445949" w:history="1">
+      <w:hyperlink w:anchor="_Toc230446344" w:history="1">
         <w:r>
           <w:rPr>
             <w:rStyle w:val="Hyperlink"/>
@@ -2459,7 +2459,7 @@
             <w:noProof/>
             <w:webHidden/>
           </w:rPr>
-          <w:instrText xml:space="preserve"> PAGEREF _Toc230445949 \h </w:instrText>
+          <w:instrText xml:space="preserve"> PAGEREF _Toc230446344 \h </w:instrText>
         </w:r>
         <w:r>
           <w:rPr>
@@ -2505,7 +2505,7 @@
           <w14:ligatures w14:val="standardContextual"/>
         </w:rPr>
       </w:pPr>
-      <w:hyperlink w:anchor="_Toc230445950" w:history="1">
+      <w:hyperlink w:anchor="_Toc230446345" w:history="1">
         <w:r>
           <w:rPr>
             <w:rStyle w:val="Hyperlink"/>
@@ -2532,7 +2532,7 @@
             <w:noProof/>
             <w:webHidden/>
           </w:rPr>
-          <w:instrText xml:space="preserve"> PAGEREF _Toc230445950 \h </w:instrText>
+          <w:instrText xml:space="preserve"> PAGEREF _Toc230446345 \h </w:instrText>
         </w:r>
         <w:r>
           <w:rPr>
@@ -2578,7 +2578,7 @@
           <w14:ligatures w14:val="standardContextual"/>
         </w:rPr>
       </w:pPr>
-      <w:hyperlink w:anchor="_Toc230445951" w:history="1">
+      <w:hyperlink w:anchor="_Toc230446346" w:history="1">
         <w:r>
           <w:rPr>
             <w:rStyle w:val="Hyperlink"/>
@@ -2605,7 +2605,7 @@
             <w:noProof/>
             <w:webHidden/>
           </w:rPr>
-          <w:instrText xml:space="preserve"> PAGEREF _Toc230445951 \h </w:instrText>
+          <w:instrText xml:space="preserve"> PAGEREF _Toc230446346 \h </w:instrText>
         </w:r>
         <w:r>
           <w:rPr>
@@ -2651,7 +2651,7 @@
           <w14:ligatures w14:val="standardContextual"/>
         </w:rPr>
       </w:pPr>
-      <w:hyperlink w:anchor="_Toc230445952" w:history="1">
+      <w:hyperlink w:anchor="_Toc230446347" w:history="1">
         <w:r>
           <w:rPr>
             <w:rStyle w:val="Hyperlink"/>
@@ -2678,7 +2678,7 @@
             <w:noProof/>
             <w:webHidden/>
           </w:rPr>
-          <w:instrText xml:space="preserve"> PAGEREF _Toc230445952 \h </w:instrText>
+          <w:instrText xml:space="preserve"> PAGEREF _Toc230446347 \h </w:instrText>
         </w:r>
         <w:r>
           <w:rPr>
@@ -2724,7 +2724,7 @@
           <w14:ligatures w14:val="standardContextual"/>
         </w:rPr>
       </w:pPr>
-      <w:hyperlink w:anchor="_Toc230445953" w:history="1">
+      <w:hyperlink w:anchor="_Toc230446348" w:history="1">
         <w:r>
           <w:rPr>
             <w:rStyle w:val="Hyperlink"/>
@@ -2751,7 +2751,7 @@
             <w:noProof/>
             <w:webHidden/>
           </w:rPr>
-          <w:instrText xml:space="preserve"> PAGEREF _Toc230445953 \h </w:instrText>
+          <w:instrText xml:space="preserve"> PAGEREF _Toc230446348 \h </w:instrText>
         </w:r>
         <w:r>
           <w:rPr>
@@ -2797,7 +2797,7 @@
           <w14:ligatures w14:val="standardContextual"/>
         </w:rPr>
       </w:pPr>
-      <w:hyperlink w:anchor="_Toc230445954" w:history="1">
+      <w:hyperlink w:anchor="_Toc230446349" w:history="1">
         <w:r>
           <w:rPr>
             <w:rStyle w:val="Hyperlink"/>
@@ -2824,7 +2824,7 @@
             <w:noProof/>
             <w:webHidden/>
           </w:rPr>
-          <w:instrText xml:space="preserve"> PAGEREF _Toc230445954 \h </w:instrText>
+          <w:instrText xml:space="preserve"> PAGEREF _Toc230446349 \h </w:instrText>
         </w:r>
         <w:r>
           <w:rPr>
@@ -2870,7 +2870,7 @@
           <w14:ligatures w14:val="standardContextual"/>
         </w:rPr>
       </w:pPr>
-      <w:hyperlink w:anchor="_Toc230445955" w:history="1">
+      <w:hyperlink w:anchor="_Toc230446350" w:history="1">
         <w:r>
           <w:rPr>
             <w:rStyle w:val="Hyperlink"/>
@@ -2897,7 +2897,7 @@
             <w:noProof/>
             <w:webHidden/>
           </w:rPr>
-          <w:instrText xml:space="preserve"> PAGEREF _Toc230445955 \h </w:instrText>
+          <w:instrText xml:space="preserve"> PAGEREF _Toc230446350 \h </w:instrText>
         </w:r>
         <w:r>
           <w:rPr>
@@ -2943,7 +2943,7 @@
           <w14:ligatures w14:val="standardContextual"/>
         </w:rPr>
       </w:pPr>
-      <w:hyperlink w:anchor="_Toc230445956" w:history="1">
+      <w:hyperlink w:anchor="_Toc230446351" w:history="1">
         <w:r>
           <w:rPr>
             <w:rStyle w:val="Hyperlink"/>
@@ -2970,7 +2970,7 @@
             <w:noProof/>
             <w:webHidden/>
           </w:rPr>
-          <w:instrText xml:space="preserve"> PAGEREF _Toc230445956 \h </w:instrText>
+          <w:instrText xml:space="preserve"> PAGEREF _Toc230446351 \h </w:instrText>
         </w:r>
         <w:r>
           <w:rPr>
@@ -3016,7 +3016,7 @@
           <w14:ligatures w14:val="standardContextual"/>
         </w:rPr>
       </w:pPr>
-      <w:hyperlink w:anchor="_Toc230445957" w:history="1">
+      <w:hyperlink w:anchor="_Toc230446352" w:history="1">
         <w:r>
           <w:rPr>
             <w:rStyle w:val="Hyperlink"/>
@@ -3043,7 +3043,7 @@
             <w:noProof/>
             <w:webHidden/>
           </w:rPr>
-          <w:instrText xml:space="preserve"> PAGEREF _Toc230445957 \h </w:instrText>
+          <w:instrText xml:space="preserve"> PAGEREF _Toc230446352 \h </w:instrText>
         </w:r>
         <w:r>
           <w:rPr>
@@ -3089,7 +3089,7 @@
           <w14:ligatures w14:val="standardContextual"/>
         </w:rPr>
       </w:pPr>
-      <w:hyperlink w:anchor="_Toc230445958" w:history="1">
+      <w:hyperlink w:anchor="_Toc230446353" w:history="1">
         <w:r>
           <w:rPr>
             <w:rStyle w:val="Hyperlink"/>
@@ -3116,7 +3116,7 @@
             <w:noProof/>
             <w:webHidden/>
           </w:rPr>
-          <w:instrText xml:space="preserve"> PAGEREF _Toc230445958 \h </w:instrText>
+          <w:instrText xml:space="preserve"> PAGEREF _Toc230446353 \h </w:instrText>
         </w:r>
         <w:r>
           <w:rPr>
@@ -3162,7 +3162,7 @@
           <w14:ligatures w14:val="standardContextual"/>
         </w:rPr>
       </w:pPr>
-      <w:hyperlink w:anchor="_Toc230445959" w:history="1">
+      <w:hyperlink w:anchor="_Toc230446354" w:history="1">
         <w:r>
           <w:rPr>
             <w:rStyle w:val="Hyperlink"/>
@@ -3189,7 +3189,7 @@
             <w:noProof/>
             <w:webHidden/>
           </w:rPr>
-          <w:instrText xml:space="preserve"> PAGEREF _Toc230445959 \h </w:instrText>
+          <w:instrText xml:space="preserve"> PAGEREF _Toc230446354 \h </w:instrText>
         </w:r>
         <w:r>
           <w:rPr>
@@ -3235,7 +3235,7 @@
         <w:pStyle w:val="Heading1"/>
         <w:shd w:val="clear" w:color="auto" w:fill="156082"/>
       </w:pPr>
-      <w:bookmarkStart w:id="1" w:name="_Toc230445919"/>
+      <w:bookmarkStart w:id="1" w:name="_Toc230446314"/>
       <w:r>
         <w:lastRenderedPageBreak/>
         <w:t xml:space="preserve">DSES Spectrum Analyzer — </w:t>
@@ -3314,7 +3314,7 @@
       <w:pPr>
         <w:pStyle w:val="Heading2"/>
       </w:pPr>
-      <w:bookmarkStart w:id="2" w:name="_Toc230445920"/>
+      <w:bookmarkStart w:id="2" w:name="_Toc230446315"/>
       <w:r>
         <w:t>1. What the recipient needs to know first</w:t>
       </w:r>
@@ -3388,7 +3388,7 @@
       <w:pPr>
         <w:pStyle w:val="Heading3"/>
       </w:pPr>
-      <w:bookmarkStart w:id="3" w:name="_Toc230445921"/>
+      <w:bookmarkStart w:id="3" w:name="_Toc230446316"/>
       <w:r>
         <w:t>System requirements</w:t>
       </w:r>
@@ -3667,7 +3667,7 @@
       <w:pPr>
         <w:pStyle w:val="Heading2"/>
       </w:pPr>
-      <w:bookmarkStart w:id="4" w:name="_Toc230445922"/>
+      <w:bookmarkStart w:id="4" w:name="_Toc230446317"/>
       <w:r>
         <w:t>2. Installing Radioconda</w:t>
       </w:r>
@@ -3677,7 +3677,7 @@
       <w:pPr>
         <w:pStyle w:val="Heading3"/>
       </w:pPr>
-      <w:bookmarkStart w:id="5" w:name="_Toc230445923"/>
+      <w:bookmarkStart w:id="5" w:name="_Toc230446318"/>
       <w:r>
         <w:t>2.1 Windows 11</w:t>
       </w:r>
@@ -3854,7 +3854,7 @@
       <w:pPr>
         <w:pStyle w:val="Heading3"/>
       </w:pPr>
-      <w:bookmarkStart w:id="6" w:name="_Toc230445924"/>
+      <w:bookmarkStart w:id="6" w:name="_Toc230446319"/>
       <w:r>
         <w:t>2.2 Linux</w:t>
       </w:r>
@@ -4059,7 +4059,7 @@
       <w:pPr>
         <w:pStyle w:val="Heading3"/>
       </w:pPr>
-      <w:bookmarkStart w:id="7" w:name="_Toc230445925"/>
+      <w:bookmarkStart w:id="7" w:name="_Toc230446320"/>
       <w:r>
         <w:t>2.3 macOS (Intel and Apple Silicon)</w:t>
       </w:r>
@@ -4296,7 +4296,7 @@
       <w:pPr>
         <w:pStyle w:val="Heading2"/>
       </w:pPr>
-      <w:bookmarkStart w:id="8" w:name="_Toc230445926"/>
+      <w:bookmarkStart w:id="8" w:name="_Toc230446321"/>
       <w:r>
         <w:t>3. Installing the DSES Spectrum Analyzer</w:t>
       </w:r>
@@ -4304,17 +4304,17 @@
     </w:p>
     <w:p>
       <w:r>
-        <w:t xml:space="preserve">Download the application from the distribution site using the direct links below. (The folder itself is not browsable — opening </w:t>
+        <w:t xml:space="preserve">Download the application from the distribution site. You can either use the direct links below, or browse the folder &lt;https://gpstime.com/sw_distribution/b210_sa/&gt; and pick the newest </w:t>
       </w:r>
       <w:r>
         <w:rPr>
           <w:rFonts w:ascii="Consolas" w:hAnsi="Consolas"/>
           <w:sz w:val="20"/>
         </w:rPr>
-        <w:t>https://gpstime.com/sw_distribution/b210_sa/</w:t>
-      </w:r>
-      <w:r>
-        <w:t xml:space="preserve"> in a browser returns “Forbidden”, which is normal; use the file links directly.)</w:t>
+        <w:t>dses-spectrum-analyzer-*.zip</w:t>
+      </w:r>
+      <w:r>
+        <w:t>:</w:t>
       </w:r>
     </w:p>
     <w:p>
@@ -4365,7 +4365,7 @@
       <w:pPr>
         <w:pStyle w:val="Heading3"/>
       </w:pPr>
-      <w:bookmarkStart w:id="9" w:name="_Toc230445927"/>
+      <w:bookmarkStart w:id="9" w:name="_Toc230446322"/>
       <w:r>
         <w:t>3.1 Windows 11</w:t>
       </w:r>
@@ -4570,7 +4570,7 @@
       <w:pPr>
         <w:pStyle w:val="Heading3"/>
       </w:pPr>
-      <w:bookmarkStart w:id="10" w:name="_Toc230445928"/>
+      <w:bookmarkStart w:id="10" w:name="_Toc230446323"/>
       <w:r>
         <w:t>3.2 Linux</w:t>
       </w:r>
@@ -4763,7 +4763,7 @@
       <w:pPr>
         <w:pStyle w:val="Heading3"/>
       </w:pPr>
-      <w:bookmarkStart w:id="11" w:name="_Toc230445929"/>
+      <w:bookmarkStart w:id="11" w:name="_Toc230446324"/>
       <w:r>
         <w:t>3.3 macOS</w:t>
       </w:r>
@@ -4916,7 +4916,7 @@
       <w:pPr>
         <w:pStyle w:val="Heading2"/>
       </w:pPr>
-      <w:bookmarkStart w:id="12" w:name="_Toc230445930"/>
+      <w:bookmarkStart w:id="12" w:name="_Toc230446325"/>
       <w:r>
         <w:t xml:space="preserve">3A. Extra setup for </w:t>
       </w:r>
@@ -4954,7 +4954,7 @@
       <w:pPr>
         <w:pStyle w:val="Heading3"/>
       </w:pPr>
-      <w:bookmarkStart w:id="13" w:name="_Toc230445931"/>
+      <w:bookmarkStart w:id="13" w:name="_Toc230446326"/>
       <w:r>
         <w:t>3A.1 Install the SDRplay API</w:t>
       </w:r>
@@ -5066,7 +5066,7 @@
       <w:pPr>
         <w:pStyle w:val="Heading3"/>
       </w:pPr>
-      <w:bookmarkStart w:id="14" w:name="_Toc230445932"/>
+      <w:bookmarkStart w:id="14" w:name="_Toc230446327"/>
       <w:r>
         <w:t>3A.2 Install the SoapySDRPlay module</w:t>
       </w:r>
@@ -5435,7 +5435,7 @@
       <w:pPr>
         <w:pStyle w:val="Heading2"/>
       </w:pPr>
-      <w:bookmarkStart w:id="15" w:name="_Toc230445933"/>
+      <w:bookmarkStart w:id="15" w:name="_Toc230446328"/>
       <w:r>
         <w:t>4. First-run checklist</w:t>
       </w:r>
@@ -5548,7 +5548,7 @@
       <w:pPr>
         <w:pStyle w:val="Heading3"/>
       </w:pPr>
-      <w:bookmarkStart w:id="16" w:name="_Toc230445934"/>
+      <w:bookmarkStart w:id="16" w:name="_Toc230446329"/>
       <w:r>
         <w:t>Recommended one-time VOLK tuning</w:t>
       </w:r>
@@ -5691,7 +5691,7 @@
       <w:pPr>
         <w:pStyle w:val="Heading2"/>
       </w:pPr>
-      <w:bookmarkStart w:id="17" w:name="_Toc230445935"/>
+      <w:bookmarkStart w:id="17" w:name="_Toc230446330"/>
       <w:r>
         <w:t>5. Updating to a new version</w:t>
       </w:r>
@@ -5701,7 +5701,7 @@
       <w:pPr>
         <w:pStyle w:val="Heading3"/>
       </w:pPr>
-      <w:bookmarkStart w:id="18" w:name="_Toc230445936"/>
+      <w:bookmarkStart w:id="18" w:name="_Toc230446331"/>
       <w:r>
         <w:t>Auto-update notifications</w:t>
       </w:r>
@@ -5792,7 +5792,7 @@
       <w:pPr>
         <w:pStyle w:val="Heading3"/>
       </w:pPr>
-      <w:bookmarkStart w:id="19" w:name="_Toc230445937"/>
+      <w:bookmarkStart w:id="19" w:name="_Toc230446332"/>
       <w:r>
         <w:lastRenderedPageBreak/>
         <w:t>Performing the update</w:t>
@@ -5889,7 +5889,7 @@
       <w:pPr>
         <w:pStyle w:val="Heading3"/>
       </w:pPr>
-      <w:bookmarkStart w:id="20" w:name="_Toc230445938"/>
+      <w:bookmarkStart w:id="20" w:name="_Toc230446333"/>
       <w:r>
         <w:t>What is preserved across versions</w:t>
       </w:r>
@@ -6072,7 +6072,7 @@
       <w:pPr>
         <w:pStyle w:val="Heading3"/>
       </w:pPr>
-      <w:bookmarkStart w:id="21" w:name="_Toc230445939"/>
+      <w:bookmarkStart w:id="21" w:name="_Toc230446334"/>
       <w:r>
         <w:t>Backing up your settings</w:t>
       </w:r>
@@ -6131,7 +6131,7 @@
       <w:pPr>
         <w:pStyle w:val="Heading2"/>
       </w:pPr>
-      <w:bookmarkStart w:id="22" w:name="_Toc230445940"/>
+      <w:bookmarkStart w:id="22" w:name="_Toc230446335"/>
       <w:r>
         <w:t>6. Troubleshooting</w:t>
       </w:r>
@@ -6141,7 +6141,7 @@
       <w:pPr>
         <w:pStyle w:val="Heading3"/>
       </w:pPr>
-      <w:bookmarkStart w:id="23" w:name="_Toc230445941"/>
+      <w:bookmarkStart w:id="23" w:name="_Toc230446336"/>
       <w:r>
         <w:t>“Radioconda not found in standard locations”</w:t>
       </w:r>
@@ -6202,7 +6202,7 @@
       <w:pPr>
         <w:pStyle w:val="Heading3"/>
       </w:pPr>
-      <w:bookmarkStart w:id="24" w:name="_Toc230445942"/>
+      <w:bookmarkStart w:id="24" w:name="_Toc230446337"/>
       <w:r>
         <w:lastRenderedPageBreak/>
         <w:t>“No UHD Devices Found”</w:t>
@@ -6301,7 +6301,7 @@
       <w:pPr>
         <w:pStyle w:val="Heading3"/>
       </w:pPr>
-      <w:bookmarkStart w:id="25" w:name="_Toc230445943"/>
+      <w:bookmarkStart w:id="25" w:name="_Toc230446338"/>
       <w:r>
         <w:t>Persistent “O” overflows at high sample rates</w:t>
       </w:r>
@@ -6345,7 +6345,7 @@
       <w:pPr>
         <w:pStyle w:val="Heading3"/>
       </w:pPr>
-      <w:bookmarkStart w:id="26" w:name="_Toc230445944"/>
+      <w:bookmarkStart w:id="26" w:name="_Toc230446339"/>
       <w:r>
         <w:t>Spectrum looks flat at −140 dB</w:t>
       </w:r>
@@ -6384,7 +6384,7 @@
       <w:pPr>
         <w:pStyle w:val="Heading3"/>
       </w:pPr>
-      <w:bookmarkStart w:id="27" w:name="_Toc230445945"/>
+      <w:bookmarkStart w:id="27" w:name="_Toc230446340"/>
       <w:r>
         <w:t>macOS: “developer cannot be verified”</w:t>
       </w:r>
@@ -6420,7 +6420,7 @@
       <w:pPr>
         <w:pStyle w:val="Heading3"/>
       </w:pPr>
-      <w:bookmarkStart w:id="28" w:name="_Toc230445946"/>
+      <w:bookmarkStart w:id="28" w:name="_Toc230446341"/>
       <w:r>
         <w:t>Settings won’t persist</w:t>
       </w:r>
@@ -6473,7 +6473,7 @@
       <w:pPr>
         <w:pStyle w:val="Heading2"/>
       </w:pPr>
-      <w:bookmarkStart w:id="29" w:name="_Toc230445947"/>
+      <w:bookmarkStart w:id="29" w:name="_Toc230446342"/>
       <w:r>
         <w:t>7. Appendix A — Settings file reference</w:t>
       </w:r>
@@ -6682,7 +6682,7 @@
       <w:pPr>
         <w:pStyle w:val="Heading2"/>
       </w:pPr>
-      <w:bookmarkStart w:id="30" w:name="_Toc230445948"/>
+      <w:bookmarkStart w:id="30" w:name="_Toc230446343"/>
       <w:r>
         <w:t>8. Appendix B — Device selection and SigMF playback</w:t>
       </w:r>
@@ -6692,7 +6692,7 @@
       <w:pPr>
         <w:pStyle w:val="Heading3"/>
       </w:pPr>
-      <w:bookmarkStart w:id="31" w:name="_Toc230445949"/>
+      <w:bookmarkStart w:id="31" w:name="_Toc230446344"/>
       <w:r>
         <w:t>Choosing among multiple radios</w:t>
       </w:r>
@@ -6870,7 +6870,7 @@
       <w:pPr>
         <w:pStyle w:val="Heading3"/>
       </w:pPr>
-      <w:bookmarkStart w:id="32" w:name="_Toc230445950"/>
+      <w:bookmarkStart w:id="32" w:name="_Toc230446345"/>
       <w:r>
         <w:t>SigMF playback mode (no-device fallback)</w:t>
       </w:r>
@@ -7071,7 +7071,7 @@
       <w:pPr>
         <w:pStyle w:val="Heading2"/>
       </w:pPr>
-      <w:bookmarkStart w:id="33" w:name="_Toc230445951"/>
+      <w:bookmarkStart w:id="33" w:name="_Toc230446346"/>
       <w:r>
         <w:t>9. Appendix C — Operating Guide</w:t>
       </w:r>
@@ -7100,7 +7100,7 @@
       <w:pPr>
         <w:pStyle w:val="Heading3"/>
       </w:pPr>
-      <w:bookmarkStart w:id="34" w:name="_Toc230445952"/>
+      <w:bookmarkStart w:id="34" w:name="_Toc230446347"/>
       <w:r>
         <w:t>Starting up — device selection</w:t>
       </w:r>
@@ -7205,7 +7205,7 @@
       <w:pPr>
         <w:pStyle w:val="Heading3"/>
       </w:pPr>
-      <w:bookmarkStart w:id="35" w:name="_Toc230445953"/>
+      <w:bookmarkStart w:id="35" w:name="_Toc230446348"/>
       <w:r>
         <w:t>Playback mode</w:t>
       </w:r>
@@ -7331,7 +7331,7 @@
       <w:pPr>
         <w:pStyle w:val="Heading3"/>
       </w:pPr>
-      <w:bookmarkStart w:id="36" w:name="_Toc230445954"/>
+      <w:bookmarkStart w:id="36" w:name="_Toc230446349"/>
       <w:r>
         <w:t>Sidebar controls (right side)</w:t>
       </w:r>
@@ -7612,7 +7612,7 @@
       <w:pPr>
         <w:pStyle w:val="Heading3"/>
       </w:pPr>
-      <w:bookmarkStart w:id="37" w:name="_Toc230445955"/>
+      <w:bookmarkStart w:id="37" w:name="_Toc230446350"/>
       <w:r>
         <w:t>Spectrum (top plot)</w:t>
       </w:r>
@@ -7752,7 +7752,7 @@
       <w:pPr>
         <w:pStyle w:val="Heading3"/>
       </w:pPr>
-      <w:bookmarkStart w:id="38" w:name="_Toc230445956"/>
+      <w:bookmarkStart w:id="38" w:name="_Toc230446351"/>
       <w:r>
         <w:t>Waterfall (bottom plot)</w:t>
       </w:r>
@@ -7819,7 +7819,7 @@
       <w:pPr>
         <w:pStyle w:val="Heading3"/>
       </w:pPr>
-      <w:bookmarkStart w:id="39" w:name="_Toc230445957"/>
+      <w:bookmarkStart w:id="39" w:name="_Toc230446352"/>
       <w:r>
         <w:t>Persistence</w:t>
       </w:r>
@@ -7866,7 +7866,7 @@
       <w:pPr>
         <w:pStyle w:val="Heading3"/>
       </w:pPr>
-      <w:bookmarkStart w:id="40" w:name="_Toc230445958"/>
+      <w:bookmarkStart w:id="40" w:name="_Toc230446353"/>
       <w:r>
         <w:t>Update checks</w:t>
       </w:r>
@@ -7924,7 +7924,7 @@
       <w:pPr>
         <w:pStyle w:val="Heading3"/>
       </w:pPr>
-      <w:bookmarkStart w:id="41" w:name="_Toc230445959"/>
+      <w:bookmarkStart w:id="41" w:name="_Toc230446354"/>
       <w:r>
         <w:t>Tips for pulsar work</w:t>
       </w:r>
@@ -8303,31 +8303,31 @@
       </w:rPr>
     </w:lvl>
   </w:abstractNum>
-  <w:num w:numId="1" w16cid:durableId="1653024499">
+  <w:num w:numId="1" w16cid:durableId="1723140276">
     <w:abstractNumId w:val="8"/>
   </w:num>
-  <w:num w:numId="2" w16cid:durableId="577134643">
+  <w:num w:numId="2" w16cid:durableId="1139149697">
     <w:abstractNumId w:val="6"/>
   </w:num>
-  <w:num w:numId="3" w16cid:durableId="561719666">
+  <w:num w:numId="3" w16cid:durableId="693117552">
     <w:abstractNumId w:val="5"/>
   </w:num>
-  <w:num w:numId="4" w16cid:durableId="44261398">
+  <w:num w:numId="4" w16cid:durableId="73089687">
     <w:abstractNumId w:val="4"/>
   </w:num>
-  <w:num w:numId="5" w16cid:durableId="1708137434">
+  <w:num w:numId="5" w16cid:durableId="1946963579">
     <w:abstractNumId w:val="7"/>
   </w:num>
-  <w:num w:numId="6" w16cid:durableId="501629799">
+  <w:num w:numId="6" w16cid:durableId="352270452">
     <w:abstractNumId w:val="3"/>
   </w:num>
-  <w:num w:numId="7" w16cid:durableId="839465270">
+  <w:num w:numId="7" w16cid:durableId="307517435">
     <w:abstractNumId w:val="2"/>
   </w:num>
-  <w:num w:numId="8" w16cid:durableId="864711615">
+  <w:num w:numId="8" w16cid:durableId="80303220">
     <w:abstractNumId w:val="1"/>
   </w:num>
-  <w:num w:numId="9" w16cid:durableId="968317401">
+  <w:num w:numId="9" w16cid:durableId="332034432">
     <w:abstractNumId w:val="0"/>
   </w:num>
 </w:numbering>
@@ -19722,7 +19722,7 @@
     <w:autoRedefine/>
     <w:uiPriority w:val="39"/>
     <w:unhideWhenUsed/>
-    <w:rsid w:val="00096EF5"/>
+    <w:rsid w:val="00C06F55"/>
     <w:pPr>
       <w:spacing w:after="100"/>
     </w:pPr>
@@ -19734,7 +19734,7 @@
     <w:autoRedefine/>
     <w:uiPriority w:val="39"/>
     <w:unhideWhenUsed/>
-    <w:rsid w:val="00096EF5"/>
+    <w:rsid w:val="00C06F55"/>
     <w:pPr>
       <w:spacing w:after="100"/>
       <w:ind w:left="220"/>
@@ -19747,7 +19747,7 @@
     <w:autoRedefine/>
     <w:uiPriority w:val="39"/>
     <w:unhideWhenUsed/>
-    <w:rsid w:val="00096EF5"/>
+    <w:rsid w:val="00C06F55"/>
     <w:pPr>
       <w:spacing w:after="100"/>
       <w:ind w:left="440"/>
@@ -19758,7 +19758,7 @@
     <w:basedOn w:val="DefaultParagraphFont"/>
     <w:uiPriority w:val="99"/>
     <w:unhideWhenUsed/>
-    <w:rsid w:val="00096EF5"/>
+    <w:rsid w:val="00C06F55"/>
     <w:rPr>
       <w:color w:val="0000FF" w:themeColor="hyperlink"/>
       <w:u w:val="single"/>

</xml_diff>

<commit_message>
Give execution-policy-safe shortcut command in install guide §3.1
"Run with PowerShell" silently does nothing under a Restricted execution
policy (the shortcut never gets created). Document the reliable invocation
(powershell -NoProfile -ExecutionPolicy Bypass -File .\install-shortcut.ps1)
and note the shortcut uses the app's pulsar icon. Regenerated PDF/DOCX.
</commit_message>
<xml_diff>
--- a/DSES_RFI_Spectrum_Analyzer_Installation.docx
+++ b/DSES_RFI_Spectrum_Analyzer_Installation.docx
@@ -41,7 +41,7 @@
           <w:noProof/>
         </w:rPr>
         <w:drawing>
-          <wp:inline distT="0" distB="0" distL="0" distR="0" wp14:anchorId="5B6F7F52" wp14:editId="5F7449EC">
+          <wp:inline distT="0" distB="0" distL="0" distR="0" wp14:anchorId="485D428A" wp14:editId="3CCE777B">
             <wp:extent cx="1371600" cy="1371600"/>
             <wp:effectExtent l="0" t="0" r="0" b="0"/>
             <wp:docPr id="1" name="Picture 1"/>
@@ -138,7 +138,7 @@
         <w:pStyle w:val="Heading1"/>
         <w:shd w:val="clear" w:color="auto" w:fill="156082"/>
       </w:pPr>
-      <w:bookmarkStart w:id="0" w:name="_Toc230446313"/>
+      <w:bookmarkStart w:id="0" w:name="_Toc230448871"/>
       <w:r>
         <w:lastRenderedPageBreak/>
         <w:t>Contents</w:t>
@@ -169,7 +169,7 @@
       <w:r>
         <w:fldChar w:fldCharType="separate"/>
       </w:r>
-      <w:hyperlink w:anchor="_Toc230446313" w:history="1">
+      <w:hyperlink w:anchor="_Toc230448871" w:history="1">
         <w:r>
           <w:rPr>
             <w:rStyle w:val="Hyperlink"/>
@@ -196,7 +196,7 @@
             <w:noProof/>
             <w:webHidden/>
           </w:rPr>
-          <w:instrText xml:space="preserve"> PAGEREF _Toc230446313 \h </w:instrText>
+          <w:instrText xml:space="preserve"> PAGEREF _Toc230448871 \h </w:instrText>
         </w:r>
         <w:r>
           <w:rPr>
@@ -242,7 +242,7 @@
           <w14:ligatures w14:val="standardContextual"/>
         </w:rPr>
       </w:pPr>
-      <w:hyperlink w:anchor="_Toc230446314" w:history="1">
+      <w:hyperlink w:anchor="_Toc230448872" w:history="1">
         <w:r>
           <w:rPr>
             <w:rStyle w:val="Hyperlink"/>
@@ -269,7 +269,7 @@
             <w:noProof/>
             <w:webHidden/>
           </w:rPr>
-          <w:instrText xml:space="preserve"> PAGEREF _Toc230446314 \h </w:instrText>
+          <w:instrText xml:space="preserve"> PAGEREF _Toc230448872 \h </w:instrText>
         </w:r>
         <w:r>
           <w:rPr>
@@ -315,7 +315,7 @@
           <w14:ligatures w14:val="standardContextual"/>
         </w:rPr>
       </w:pPr>
-      <w:hyperlink w:anchor="_Toc230446315" w:history="1">
+      <w:hyperlink w:anchor="_Toc230448873" w:history="1">
         <w:r>
           <w:rPr>
             <w:rStyle w:val="Hyperlink"/>
@@ -342,7 +342,7 @@
             <w:noProof/>
             <w:webHidden/>
           </w:rPr>
-          <w:instrText xml:space="preserve"> PAGEREF _Toc230446315 \h </w:instrText>
+          <w:instrText xml:space="preserve"> PAGEREF _Toc230448873 \h </w:instrText>
         </w:r>
         <w:r>
           <w:rPr>
@@ -388,7 +388,7 @@
           <w14:ligatures w14:val="standardContextual"/>
         </w:rPr>
       </w:pPr>
-      <w:hyperlink w:anchor="_Toc230446316" w:history="1">
+      <w:hyperlink w:anchor="_Toc230448874" w:history="1">
         <w:r>
           <w:rPr>
             <w:rStyle w:val="Hyperlink"/>
@@ -415,7 +415,7 @@
             <w:noProof/>
             <w:webHidden/>
           </w:rPr>
-          <w:instrText xml:space="preserve"> PAGEREF _Toc230446316 \h </w:instrText>
+          <w:instrText xml:space="preserve"> PAGEREF _Toc230448874 \h </w:instrText>
         </w:r>
         <w:r>
           <w:rPr>
@@ -461,7 +461,7 @@
           <w14:ligatures w14:val="standardContextual"/>
         </w:rPr>
       </w:pPr>
-      <w:hyperlink w:anchor="_Toc230446317" w:history="1">
+      <w:hyperlink w:anchor="_Toc230448875" w:history="1">
         <w:r>
           <w:rPr>
             <w:rStyle w:val="Hyperlink"/>
@@ -488,7 +488,7 @@
             <w:noProof/>
             <w:webHidden/>
           </w:rPr>
-          <w:instrText xml:space="preserve"> PAGEREF _Toc230446317 \h </w:instrText>
+          <w:instrText xml:space="preserve"> PAGEREF _Toc230448875 \h </w:instrText>
         </w:r>
         <w:r>
           <w:rPr>
@@ -534,7 +534,7 @@
           <w14:ligatures w14:val="standardContextual"/>
         </w:rPr>
       </w:pPr>
-      <w:hyperlink w:anchor="_Toc230446318" w:history="1">
+      <w:hyperlink w:anchor="_Toc230448876" w:history="1">
         <w:r>
           <w:rPr>
             <w:rStyle w:val="Hyperlink"/>
@@ -561,7 +561,7 @@
             <w:noProof/>
             <w:webHidden/>
           </w:rPr>
-          <w:instrText xml:space="preserve"> PAGEREF _Toc230446318 \h </w:instrText>
+          <w:instrText xml:space="preserve"> PAGEREF _Toc230448876 \h </w:instrText>
         </w:r>
         <w:r>
           <w:rPr>
@@ -607,7 +607,7 @@
           <w14:ligatures w14:val="standardContextual"/>
         </w:rPr>
       </w:pPr>
-      <w:hyperlink w:anchor="_Toc230446319" w:history="1">
+      <w:hyperlink w:anchor="_Toc230448877" w:history="1">
         <w:r>
           <w:rPr>
             <w:rStyle w:val="Hyperlink"/>
@@ -634,7 +634,7 @@
             <w:noProof/>
             <w:webHidden/>
           </w:rPr>
-          <w:instrText xml:space="preserve"> PAGEREF _Toc230446319 \h </w:instrText>
+          <w:instrText xml:space="preserve"> PAGEREF _Toc230448877 \h </w:instrText>
         </w:r>
         <w:r>
           <w:rPr>
@@ -680,7 +680,7 @@
           <w14:ligatures w14:val="standardContextual"/>
         </w:rPr>
       </w:pPr>
-      <w:hyperlink w:anchor="_Toc230446320" w:history="1">
+      <w:hyperlink w:anchor="_Toc230448878" w:history="1">
         <w:r>
           <w:rPr>
             <w:rStyle w:val="Hyperlink"/>
@@ -707,7 +707,7 @@
             <w:noProof/>
             <w:webHidden/>
           </w:rPr>
-          <w:instrText xml:space="preserve"> PAGEREF _Toc230446320 \h </w:instrText>
+          <w:instrText xml:space="preserve"> PAGEREF _Toc230448878 \h </w:instrText>
         </w:r>
         <w:r>
           <w:rPr>
@@ -753,7 +753,7 @@
           <w14:ligatures w14:val="standardContextual"/>
         </w:rPr>
       </w:pPr>
-      <w:hyperlink w:anchor="_Toc230446321" w:history="1">
+      <w:hyperlink w:anchor="_Toc230448879" w:history="1">
         <w:r>
           <w:rPr>
             <w:rStyle w:val="Hyperlink"/>
@@ -780,7 +780,7 @@
             <w:noProof/>
             <w:webHidden/>
           </w:rPr>
-          <w:instrText xml:space="preserve"> PAGEREF _Toc230446321 \h </w:instrText>
+          <w:instrText xml:space="preserve"> PAGEREF _Toc230448879 \h </w:instrText>
         </w:r>
         <w:r>
           <w:rPr>
@@ -826,7 +826,7 @@
           <w14:ligatures w14:val="standardContextual"/>
         </w:rPr>
       </w:pPr>
-      <w:hyperlink w:anchor="_Toc230446322" w:history="1">
+      <w:hyperlink w:anchor="_Toc230448880" w:history="1">
         <w:r>
           <w:rPr>
             <w:rStyle w:val="Hyperlink"/>
@@ -853,7 +853,7 @@
             <w:noProof/>
             <w:webHidden/>
           </w:rPr>
-          <w:instrText xml:space="preserve"> PAGEREF _Toc230446322 \h </w:instrText>
+          <w:instrText xml:space="preserve"> PAGEREF _Toc230448880 \h </w:instrText>
         </w:r>
         <w:r>
           <w:rPr>
@@ -899,7 +899,7 @@
           <w14:ligatures w14:val="standardContextual"/>
         </w:rPr>
       </w:pPr>
-      <w:hyperlink w:anchor="_Toc230446323" w:history="1">
+      <w:hyperlink w:anchor="_Toc230448881" w:history="1">
         <w:r>
           <w:rPr>
             <w:rStyle w:val="Hyperlink"/>
@@ -926,7 +926,7 @@
             <w:noProof/>
             <w:webHidden/>
           </w:rPr>
-          <w:instrText xml:space="preserve"> PAGEREF _Toc230446323 \h </w:instrText>
+          <w:instrText xml:space="preserve"> PAGEREF _Toc230448881 \h </w:instrText>
         </w:r>
         <w:r>
           <w:rPr>
@@ -972,7 +972,7 @@
           <w14:ligatures w14:val="standardContextual"/>
         </w:rPr>
       </w:pPr>
-      <w:hyperlink w:anchor="_Toc230446324" w:history="1">
+      <w:hyperlink w:anchor="_Toc230448882" w:history="1">
         <w:r>
           <w:rPr>
             <w:rStyle w:val="Hyperlink"/>
@@ -999,7 +999,7 @@
             <w:noProof/>
             <w:webHidden/>
           </w:rPr>
-          <w:instrText xml:space="preserve"> PAGEREF _Toc230446324 \h </w:instrText>
+          <w:instrText xml:space="preserve"> PAGEREF _Toc230448882 \h </w:instrText>
         </w:r>
         <w:r>
           <w:rPr>
@@ -1045,7 +1045,7 @@
           <w14:ligatures w14:val="standardContextual"/>
         </w:rPr>
       </w:pPr>
-      <w:hyperlink w:anchor="_Toc230446325" w:history="1">
+      <w:hyperlink w:anchor="_Toc230448883" w:history="1">
         <w:r>
           <w:rPr>
             <w:rStyle w:val="Hyperlink"/>
@@ -1072,7 +1072,7 @@
             <w:noProof/>
             <w:webHidden/>
           </w:rPr>
-          <w:instrText xml:space="preserve"> PAGEREF _Toc230446325 \h </w:instrText>
+          <w:instrText xml:space="preserve"> PAGEREF _Toc230448883 \h </w:instrText>
         </w:r>
         <w:r>
           <w:rPr>
@@ -1118,7 +1118,7 @@
           <w14:ligatures w14:val="standardContextual"/>
         </w:rPr>
       </w:pPr>
-      <w:hyperlink w:anchor="_Toc230446326" w:history="1">
+      <w:hyperlink w:anchor="_Toc230448884" w:history="1">
         <w:r>
           <w:rPr>
             <w:rStyle w:val="Hyperlink"/>
@@ -1145,7 +1145,7 @@
             <w:noProof/>
             <w:webHidden/>
           </w:rPr>
-          <w:instrText xml:space="preserve"> PAGEREF _Toc230446326 \h </w:instrText>
+          <w:instrText xml:space="preserve"> PAGEREF _Toc230448884 \h </w:instrText>
         </w:r>
         <w:r>
           <w:rPr>
@@ -1191,7 +1191,7 @@
           <w14:ligatures w14:val="standardContextual"/>
         </w:rPr>
       </w:pPr>
-      <w:hyperlink w:anchor="_Toc230446327" w:history="1">
+      <w:hyperlink w:anchor="_Toc230448885" w:history="1">
         <w:r>
           <w:rPr>
             <w:rStyle w:val="Hyperlink"/>
@@ -1218,7 +1218,7 @@
             <w:noProof/>
             <w:webHidden/>
           </w:rPr>
-          <w:instrText xml:space="preserve"> PAGEREF _Toc230446327 \h </w:instrText>
+          <w:instrText xml:space="preserve"> PAGEREF _Toc230448885 \h </w:instrText>
         </w:r>
         <w:r>
           <w:rPr>
@@ -1238,7 +1238,7 @@
             <w:noProof/>
             <w:webHidden/>
           </w:rPr>
-          <w:t>8</w:t>
+          <w:t>9</w:t>
         </w:r>
         <w:r>
           <w:rPr>
@@ -1264,7 +1264,7 @@
           <w14:ligatures w14:val="standardContextual"/>
         </w:rPr>
       </w:pPr>
-      <w:hyperlink w:anchor="_Toc230446328" w:history="1">
+      <w:hyperlink w:anchor="_Toc230448886" w:history="1">
         <w:r>
           <w:rPr>
             <w:rStyle w:val="Hyperlink"/>
@@ -1291,7 +1291,7 @@
             <w:noProof/>
             <w:webHidden/>
           </w:rPr>
-          <w:instrText xml:space="preserve"> PAGEREF _Toc230446328 \h </w:instrText>
+          <w:instrText xml:space="preserve"> PAGEREF _Toc230448886 \h </w:instrText>
         </w:r>
         <w:r>
           <w:rPr>
@@ -1311,7 +1311,7 @@
             <w:noProof/>
             <w:webHidden/>
           </w:rPr>
-          <w:t>9</w:t>
+          <w:t>10</w:t>
         </w:r>
         <w:r>
           <w:rPr>
@@ -1337,7 +1337,7 @@
           <w14:ligatures w14:val="standardContextual"/>
         </w:rPr>
       </w:pPr>
-      <w:hyperlink w:anchor="_Toc230446329" w:history="1">
+      <w:hyperlink w:anchor="_Toc230448887" w:history="1">
         <w:r>
           <w:rPr>
             <w:rStyle w:val="Hyperlink"/>
@@ -1364,7 +1364,7 @@
             <w:noProof/>
             <w:webHidden/>
           </w:rPr>
-          <w:instrText xml:space="preserve"> PAGEREF _Toc230446329 \h </w:instrText>
+          <w:instrText xml:space="preserve"> PAGEREF _Toc230448887 \h </w:instrText>
         </w:r>
         <w:r>
           <w:rPr>
@@ -1410,7 +1410,7 @@
           <w14:ligatures w14:val="standardContextual"/>
         </w:rPr>
       </w:pPr>
-      <w:hyperlink w:anchor="_Toc230446330" w:history="1">
+      <w:hyperlink w:anchor="_Toc230448888" w:history="1">
         <w:r>
           <w:rPr>
             <w:rStyle w:val="Hyperlink"/>
@@ -1437,7 +1437,7 @@
             <w:noProof/>
             <w:webHidden/>
           </w:rPr>
-          <w:instrText xml:space="preserve"> PAGEREF _Toc230446330 \h </w:instrText>
+          <w:instrText xml:space="preserve"> PAGEREF _Toc230448888 \h </w:instrText>
         </w:r>
         <w:r>
           <w:rPr>
@@ -1457,7 +1457,7 @@
             <w:noProof/>
             <w:webHidden/>
           </w:rPr>
-          <w:t>10</w:t>
+          <w:t>11</w:t>
         </w:r>
         <w:r>
           <w:rPr>
@@ -1483,7 +1483,7 @@
           <w14:ligatures w14:val="standardContextual"/>
         </w:rPr>
       </w:pPr>
-      <w:hyperlink w:anchor="_Toc230446331" w:history="1">
+      <w:hyperlink w:anchor="_Toc230448889" w:history="1">
         <w:r>
           <w:rPr>
             <w:rStyle w:val="Hyperlink"/>
@@ -1510,7 +1510,7 @@
             <w:noProof/>
             <w:webHidden/>
           </w:rPr>
-          <w:instrText xml:space="preserve"> PAGEREF _Toc230446331 \h </w:instrText>
+          <w:instrText xml:space="preserve"> PAGEREF _Toc230448889 \h </w:instrText>
         </w:r>
         <w:r>
           <w:rPr>
@@ -1530,7 +1530,7 @@
             <w:noProof/>
             <w:webHidden/>
           </w:rPr>
-          <w:t>10</w:t>
+          <w:t>11</w:t>
         </w:r>
         <w:r>
           <w:rPr>
@@ -1556,7 +1556,7 @@
           <w14:ligatures w14:val="standardContextual"/>
         </w:rPr>
       </w:pPr>
-      <w:hyperlink w:anchor="_Toc230446332" w:history="1">
+      <w:hyperlink w:anchor="_Toc230448890" w:history="1">
         <w:r>
           <w:rPr>
             <w:rStyle w:val="Hyperlink"/>
@@ -1583,7 +1583,7 @@
             <w:noProof/>
             <w:webHidden/>
           </w:rPr>
-          <w:instrText xml:space="preserve"> PAGEREF _Toc230446332 \h </w:instrText>
+          <w:instrText xml:space="preserve"> PAGEREF _Toc230448890 \h </w:instrText>
         </w:r>
         <w:r>
           <w:rPr>
@@ -1629,7 +1629,7 @@
           <w14:ligatures w14:val="standardContextual"/>
         </w:rPr>
       </w:pPr>
-      <w:hyperlink w:anchor="_Toc230446333" w:history="1">
+      <w:hyperlink w:anchor="_Toc230448891" w:history="1">
         <w:r>
           <w:rPr>
             <w:rStyle w:val="Hyperlink"/>
@@ -1656,7 +1656,7 @@
             <w:noProof/>
             <w:webHidden/>
           </w:rPr>
-          <w:instrText xml:space="preserve"> PAGEREF _Toc230446333 \h </w:instrText>
+          <w:instrText xml:space="preserve"> PAGEREF _Toc230448891 \h </w:instrText>
         </w:r>
         <w:r>
           <w:rPr>
@@ -1702,7 +1702,7 @@
           <w14:ligatures w14:val="standardContextual"/>
         </w:rPr>
       </w:pPr>
-      <w:hyperlink w:anchor="_Toc230446334" w:history="1">
+      <w:hyperlink w:anchor="_Toc230448892" w:history="1">
         <w:r>
           <w:rPr>
             <w:rStyle w:val="Hyperlink"/>
@@ -1729,7 +1729,7 @@
             <w:noProof/>
             <w:webHidden/>
           </w:rPr>
-          <w:instrText xml:space="preserve"> PAGEREF _Toc230446334 \h </w:instrText>
+          <w:instrText xml:space="preserve"> PAGEREF _Toc230448892 \h </w:instrText>
         </w:r>
         <w:r>
           <w:rPr>
@@ -1775,7 +1775,7 @@
           <w14:ligatures w14:val="standardContextual"/>
         </w:rPr>
       </w:pPr>
-      <w:hyperlink w:anchor="_Toc230446335" w:history="1">
+      <w:hyperlink w:anchor="_Toc230448893" w:history="1">
         <w:r>
           <w:rPr>
             <w:rStyle w:val="Hyperlink"/>
@@ -1802,7 +1802,7 @@
             <w:noProof/>
             <w:webHidden/>
           </w:rPr>
-          <w:instrText xml:space="preserve"> PAGEREF _Toc230446335 \h </w:instrText>
+          <w:instrText xml:space="preserve"> PAGEREF _Toc230448893 \h </w:instrText>
         </w:r>
         <w:r>
           <w:rPr>
@@ -1822,7 +1822,7 @@
             <w:noProof/>
             <w:webHidden/>
           </w:rPr>
-          <w:t>11</w:t>
+          <w:t>12</w:t>
         </w:r>
         <w:r>
           <w:rPr>
@@ -1848,7 +1848,7 @@
           <w14:ligatures w14:val="standardContextual"/>
         </w:rPr>
       </w:pPr>
-      <w:hyperlink w:anchor="_Toc230446336" w:history="1">
+      <w:hyperlink w:anchor="_Toc230448894" w:history="1">
         <w:r>
           <w:rPr>
             <w:rStyle w:val="Hyperlink"/>
@@ -1875,7 +1875,7 @@
             <w:noProof/>
             <w:webHidden/>
           </w:rPr>
-          <w:instrText xml:space="preserve"> PAGEREF _Toc230446336 \h </w:instrText>
+          <w:instrText xml:space="preserve"> PAGEREF _Toc230448894 \h </w:instrText>
         </w:r>
         <w:r>
           <w:rPr>
@@ -1895,7 +1895,7 @@
             <w:noProof/>
             <w:webHidden/>
           </w:rPr>
-          <w:t>11</w:t>
+          <w:t>12</w:t>
         </w:r>
         <w:r>
           <w:rPr>
@@ -1921,7 +1921,7 @@
           <w14:ligatures w14:val="standardContextual"/>
         </w:rPr>
       </w:pPr>
-      <w:hyperlink w:anchor="_Toc230446337" w:history="1">
+      <w:hyperlink w:anchor="_Toc230448895" w:history="1">
         <w:r>
           <w:rPr>
             <w:rStyle w:val="Hyperlink"/>
@@ -1948,7 +1948,7 @@
             <w:noProof/>
             <w:webHidden/>
           </w:rPr>
-          <w:instrText xml:space="preserve"> PAGEREF _Toc230446337 \h </w:instrText>
+          <w:instrText xml:space="preserve"> PAGEREF _Toc230448895 \h </w:instrText>
         </w:r>
         <w:r>
           <w:rPr>
@@ -1994,7 +1994,7 @@
           <w14:ligatures w14:val="standardContextual"/>
         </w:rPr>
       </w:pPr>
-      <w:hyperlink w:anchor="_Toc230446338" w:history="1">
+      <w:hyperlink w:anchor="_Toc230448896" w:history="1">
         <w:r>
           <w:rPr>
             <w:rStyle w:val="Hyperlink"/>
@@ -2021,7 +2021,7 @@
             <w:noProof/>
             <w:webHidden/>
           </w:rPr>
-          <w:instrText xml:space="preserve"> PAGEREF _Toc230446338 \h </w:instrText>
+          <w:instrText xml:space="preserve"> PAGEREF _Toc230448896 \h </w:instrText>
         </w:r>
         <w:r>
           <w:rPr>
@@ -2067,7 +2067,7 @@
           <w14:ligatures w14:val="standardContextual"/>
         </w:rPr>
       </w:pPr>
-      <w:hyperlink w:anchor="_Toc230446339" w:history="1">
+      <w:hyperlink w:anchor="_Toc230448897" w:history="1">
         <w:r>
           <w:rPr>
             <w:rStyle w:val="Hyperlink"/>
@@ -2094,7 +2094,7 @@
             <w:noProof/>
             <w:webHidden/>
           </w:rPr>
-          <w:instrText xml:space="preserve"> PAGEREF _Toc230446339 \h </w:instrText>
+          <w:instrText xml:space="preserve"> PAGEREF _Toc230448897 \h </w:instrText>
         </w:r>
         <w:r>
           <w:rPr>
@@ -2140,7 +2140,7 @@
           <w14:ligatures w14:val="standardContextual"/>
         </w:rPr>
       </w:pPr>
-      <w:hyperlink w:anchor="_Toc230446340" w:history="1">
+      <w:hyperlink w:anchor="_Toc230448898" w:history="1">
         <w:r>
           <w:rPr>
             <w:rStyle w:val="Hyperlink"/>
@@ -2167,7 +2167,7 @@
             <w:noProof/>
             <w:webHidden/>
           </w:rPr>
-          <w:instrText xml:space="preserve"> PAGEREF _Toc230446340 \h </w:instrText>
+          <w:instrText xml:space="preserve"> PAGEREF _Toc230448898 \h </w:instrText>
         </w:r>
         <w:r>
           <w:rPr>
@@ -2187,7 +2187,7 @@
             <w:noProof/>
             <w:webHidden/>
           </w:rPr>
-          <w:t>12</w:t>
+          <w:t>13</w:t>
         </w:r>
         <w:r>
           <w:rPr>
@@ -2213,7 +2213,7 @@
           <w14:ligatures w14:val="standardContextual"/>
         </w:rPr>
       </w:pPr>
-      <w:hyperlink w:anchor="_Toc230446341" w:history="1">
+      <w:hyperlink w:anchor="_Toc230448899" w:history="1">
         <w:r>
           <w:rPr>
             <w:rStyle w:val="Hyperlink"/>
@@ -2240,7 +2240,7 @@
             <w:noProof/>
             <w:webHidden/>
           </w:rPr>
-          <w:instrText xml:space="preserve"> PAGEREF _Toc230446341 \h </w:instrText>
+          <w:instrText xml:space="preserve"> PAGEREF _Toc230448899 \h </w:instrText>
         </w:r>
         <w:r>
           <w:rPr>
@@ -2260,7 +2260,7 @@
             <w:noProof/>
             <w:webHidden/>
           </w:rPr>
-          <w:t>12</w:t>
+          <w:t>13</w:t>
         </w:r>
         <w:r>
           <w:rPr>
@@ -2286,7 +2286,7 @@
           <w14:ligatures w14:val="standardContextual"/>
         </w:rPr>
       </w:pPr>
-      <w:hyperlink w:anchor="_Toc230446342" w:history="1">
+      <w:hyperlink w:anchor="_Toc230448900" w:history="1">
         <w:r>
           <w:rPr>
             <w:rStyle w:val="Hyperlink"/>
@@ -2313,7 +2313,7 @@
             <w:noProof/>
             <w:webHidden/>
           </w:rPr>
-          <w:instrText xml:space="preserve"> PAGEREF _Toc230446342 \h </w:instrText>
+          <w:instrText xml:space="preserve"> PAGEREF _Toc230448900 \h </w:instrText>
         </w:r>
         <w:r>
           <w:rPr>
@@ -2359,7 +2359,7 @@
           <w14:ligatures w14:val="standardContextual"/>
         </w:rPr>
       </w:pPr>
-      <w:hyperlink w:anchor="_Toc230446343" w:history="1">
+      <w:hyperlink w:anchor="_Toc230448901" w:history="1">
         <w:r>
           <w:rPr>
             <w:rStyle w:val="Hyperlink"/>
@@ -2386,7 +2386,7 @@
             <w:noProof/>
             <w:webHidden/>
           </w:rPr>
-          <w:instrText xml:space="preserve"> PAGEREF _Toc230446343 \h </w:instrText>
+          <w:instrText xml:space="preserve"> PAGEREF _Toc230448901 \h </w:instrText>
         </w:r>
         <w:r>
           <w:rPr>
@@ -2432,7 +2432,7 @@
           <w14:ligatures w14:val="standardContextual"/>
         </w:rPr>
       </w:pPr>
-      <w:hyperlink w:anchor="_Toc230446344" w:history="1">
+      <w:hyperlink w:anchor="_Toc230448902" w:history="1">
         <w:r>
           <w:rPr>
             <w:rStyle w:val="Hyperlink"/>
@@ -2459,7 +2459,7 @@
             <w:noProof/>
             <w:webHidden/>
           </w:rPr>
-          <w:instrText xml:space="preserve"> PAGEREF _Toc230446344 \h </w:instrText>
+          <w:instrText xml:space="preserve"> PAGEREF _Toc230448902 \h </w:instrText>
         </w:r>
         <w:r>
           <w:rPr>
@@ -2505,7 +2505,7 @@
           <w14:ligatures w14:val="standardContextual"/>
         </w:rPr>
       </w:pPr>
-      <w:hyperlink w:anchor="_Toc230446345" w:history="1">
+      <w:hyperlink w:anchor="_Toc230448903" w:history="1">
         <w:r>
           <w:rPr>
             <w:rStyle w:val="Hyperlink"/>
@@ -2532,7 +2532,7 @@
             <w:noProof/>
             <w:webHidden/>
           </w:rPr>
-          <w:instrText xml:space="preserve"> PAGEREF _Toc230446345 \h </w:instrText>
+          <w:instrText xml:space="preserve"> PAGEREF _Toc230448903 \h </w:instrText>
         </w:r>
         <w:r>
           <w:rPr>
@@ -2578,7 +2578,7 @@
           <w14:ligatures w14:val="standardContextual"/>
         </w:rPr>
       </w:pPr>
-      <w:hyperlink w:anchor="_Toc230446346" w:history="1">
+      <w:hyperlink w:anchor="_Toc230448904" w:history="1">
         <w:r>
           <w:rPr>
             <w:rStyle w:val="Hyperlink"/>
@@ -2605,7 +2605,7 @@
             <w:noProof/>
             <w:webHidden/>
           </w:rPr>
-          <w:instrText xml:space="preserve"> PAGEREF _Toc230446346 \h </w:instrText>
+          <w:instrText xml:space="preserve"> PAGEREF _Toc230448904 \h </w:instrText>
         </w:r>
         <w:r>
           <w:rPr>
@@ -2625,7 +2625,7 @@
             <w:noProof/>
             <w:webHidden/>
           </w:rPr>
-          <w:t>14</w:t>
+          <w:t>15</w:t>
         </w:r>
         <w:r>
           <w:rPr>
@@ -2651,7 +2651,7 @@
           <w14:ligatures w14:val="standardContextual"/>
         </w:rPr>
       </w:pPr>
-      <w:hyperlink w:anchor="_Toc230446347" w:history="1">
+      <w:hyperlink w:anchor="_Toc230448905" w:history="1">
         <w:r>
           <w:rPr>
             <w:rStyle w:val="Hyperlink"/>
@@ -2678,7 +2678,7 @@
             <w:noProof/>
             <w:webHidden/>
           </w:rPr>
-          <w:instrText xml:space="preserve"> PAGEREF _Toc230446347 \h </w:instrText>
+          <w:instrText xml:space="preserve"> PAGEREF _Toc230448905 \h </w:instrText>
         </w:r>
         <w:r>
           <w:rPr>
@@ -2698,7 +2698,7 @@
             <w:noProof/>
             <w:webHidden/>
           </w:rPr>
-          <w:t>14</w:t>
+          <w:t>15</w:t>
         </w:r>
         <w:r>
           <w:rPr>
@@ -2724,7 +2724,7 @@
           <w14:ligatures w14:val="standardContextual"/>
         </w:rPr>
       </w:pPr>
-      <w:hyperlink w:anchor="_Toc230446348" w:history="1">
+      <w:hyperlink w:anchor="_Toc230448906" w:history="1">
         <w:r>
           <w:rPr>
             <w:rStyle w:val="Hyperlink"/>
@@ -2751,7 +2751,7 @@
             <w:noProof/>
             <w:webHidden/>
           </w:rPr>
-          <w:instrText xml:space="preserve"> PAGEREF _Toc230446348 \h </w:instrText>
+          <w:instrText xml:space="preserve"> PAGEREF _Toc230448906 \h </w:instrText>
         </w:r>
         <w:r>
           <w:rPr>
@@ -2797,7 +2797,7 @@
           <w14:ligatures w14:val="standardContextual"/>
         </w:rPr>
       </w:pPr>
-      <w:hyperlink w:anchor="_Toc230446349" w:history="1">
+      <w:hyperlink w:anchor="_Toc230448907" w:history="1">
         <w:r>
           <w:rPr>
             <w:rStyle w:val="Hyperlink"/>
@@ -2824,7 +2824,7 @@
             <w:noProof/>
             <w:webHidden/>
           </w:rPr>
-          <w:instrText xml:space="preserve"> PAGEREF _Toc230446349 \h </w:instrText>
+          <w:instrText xml:space="preserve"> PAGEREF _Toc230448907 \h </w:instrText>
         </w:r>
         <w:r>
           <w:rPr>
@@ -2844,7 +2844,7 @@
             <w:noProof/>
             <w:webHidden/>
           </w:rPr>
-          <w:t>15</w:t>
+          <w:t>16</w:t>
         </w:r>
         <w:r>
           <w:rPr>
@@ -2870,7 +2870,7 @@
           <w14:ligatures w14:val="standardContextual"/>
         </w:rPr>
       </w:pPr>
-      <w:hyperlink w:anchor="_Toc230446350" w:history="1">
+      <w:hyperlink w:anchor="_Toc230448908" w:history="1">
         <w:r>
           <w:rPr>
             <w:rStyle w:val="Hyperlink"/>
@@ -2897,7 +2897,7 @@
             <w:noProof/>
             <w:webHidden/>
           </w:rPr>
-          <w:instrText xml:space="preserve"> PAGEREF _Toc230446350 \h </w:instrText>
+          <w:instrText xml:space="preserve"> PAGEREF _Toc230448908 \h </w:instrText>
         </w:r>
         <w:r>
           <w:rPr>
@@ -2943,7 +2943,7 @@
           <w14:ligatures w14:val="standardContextual"/>
         </w:rPr>
       </w:pPr>
-      <w:hyperlink w:anchor="_Toc230446351" w:history="1">
+      <w:hyperlink w:anchor="_Toc230448909" w:history="1">
         <w:r>
           <w:rPr>
             <w:rStyle w:val="Hyperlink"/>
@@ -2970,7 +2970,7 @@
             <w:noProof/>
             <w:webHidden/>
           </w:rPr>
-          <w:instrText xml:space="preserve"> PAGEREF _Toc230446351 \h </w:instrText>
+          <w:instrText xml:space="preserve"> PAGEREF _Toc230448909 \h </w:instrText>
         </w:r>
         <w:r>
           <w:rPr>
@@ -2990,7 +2990,7 @@
             <w:noProof/>
             <w:webHidden/>
           </w:rPr>
-          <w:t>16</w:t>
+          <w:t>17</w:t>
         </w:r>
         <w:r>
           <w:rPr>
@@ -3016,7 +3016,7 @@
           <w14:ligatures w14:val="standardContextual"/>
         </w:rPr>
       </w:pPr>
-      <w:hyperlink w:anchor="_Toc230446352" w:history="1">
+      <w:hyperlink w:anchor="_Toc230448910" w:history="1">
         <w:r>
           <w:rPr>
             <w:rStyle w:val="Hyperlink"/>
@@ -3043,7 +3043,7 @@
             <w:noProof/>
             <w:webHidden/>
           </w:rPr>
-          <w:instrText xml:space="preserve"> PAGEREF _Toc230446352 \h </w:instrText>
+          <w:instrText xml:space="preserve"> PAGEREF _Toc230448910 \h </w:instrText>
         </w:r>
         <w:r>
           <w:rPr>
@@ -3089,7 +3089,7 @@
           <w14:ligatures w14:val="standardContextual"/>
         </w:rPr>
       </w:pPr>
-      <w:hyperlink w:anchor="_Toc230446353" w:history="1">
+      <w:hyperlink w:anchor="_Toc230448911" w:history="1">
         <w:r>
           <w:rPr>
             <w:rStyle w:val="Hyperlink"/>
@@ -3116,7 +3116,7 @@
             <w:noProof/>
             <w:webHidden/>
           </w:rPr>
-          <w:instrText xml:space="preserve"> PAGEREF _Toc230446353 \h </w:instrText>
+          <w:instrText xml:space="preserve"> PAGEREF _Toc230448911 \h </w:instrText>
         </w:r>
         <w:r>
           <w:rPr>
@@ -3162,7 +3162,7 @@
           <w14:ligatures w14:val="standardContextual"/>
         </w:rPr>
       </w:pPr>
-      <w:hyperlink w:anchor="_Toc230446354" w:history="1">
+      <w:hyperlink w:anchor="_Toc230448912" w:history="1">
         <w:r>
           <w:rPr>
             <w:rStyle w:val="Hyperlink"/>
@@ -3189,7 +3189,7 @@
             <w:noProof/>
             <w:webHidden/>
           </w:rPr>
-          <w:instrText xml:space="preserve"> PAGEREF _Toc230446354 \h </w:instrText>
+          <w:instrText xml:space="preserve"> PAGEREF _Toc230448912 \h </w:instrText>
         </w:r>
         <w:r>
           <w:rPr>
@@ -3235,7 +3235,7 @@
         <w:pStyle w:val="Heading1"/>
         <w:shd w:val="clear" w:color="auto" w:fill="156082"/>
       </w:pPr>
-      <w:bookmarkStart w:id="1" w:name="_Toc230446314"/>
+      <w:bookmarkStart w:id="1" w:name="_Toc230448872"/>
       <w:r>
         <w:lastRenderedPageBreak/>
         <w:t xml:space="preserve">DSES Spectrum Analyzer — </w:t>
@@ -3314,7 +3314,7 @@
       <w:pPr>
         <w:pStyle w:val="Heading2"/>
       </w:pPr>
-      <w:bookmarkStart w:id="2" w:name="_Toc230446315"/>
+      <w:bookmarkStart w:id="2" w:name="_Toc230448873"/>
       <w:r>
         <w:t>1. What the recipient needs to know first</w:t>
       </w:r>
@@ -3388,7 +3388,7 @@
       <w:pPr>
         <w:pStyle w:val="Heading3"/>
       </w:pPr>
-      <w:bookmarkStart w:id="3" w:name="_Toc230446316"/>
+      <w:bookmarkStart w:id="3" w:name="_Toc230448874"/>
       <w:r>
         <w:t>System requirements</w:t>
       </w:r>
@@ -3667,7 +3667,7 @@
       <w:pPr>
         <w:pStyle w:val="Heading2"/>
       </w:pPr>
-      <w:bookmarkStart w:id="4" w:name="_Toc230446317"/>
+      <w:bookmarkStart w:id="4" w:name="_Toc230448875"/>
       <w:r>
         <w:t>2. Installing Radioconda</w:t>
       </w:r>
@@ -3677,7 +3677,7 @@
       <w:pPr>
         <w:pStyle w:val="Heading3"/>
       </w:pPr>
-      <w:bookmarkStart w:id="5" w:name="_Toc230446318"/>
+      <w:bookmarkStart w:id="5" w:name="_Toc230448876"/>
       <w:r>
         <w:t>2.1 Windows 11</w:t>
       </w:r>
@@ -3854,7 +3854,7 @@
       <w:pPr>
         <w:pStyle w:val="Heading3"/>
       </w:pPr>
-      <w:bookmarkStart w:id="6" w:name="_Toc230446319"/>
+      <w:bookmarkStart w:id="6" w:name="_Toc230448877"/>
       <w:r>
         <w:t>2.2 Linux</w:t>
       </w:r>
@@ -4059,7 +4059,7 @@
       <w:pPr>
         <w:pStyle w:val="Heading3"/>
       </w:pPr>
-      <w:bookmarkStart w:id="7" w:name="_Toc230446320"/>
+      <w:bookmarkStart w:id="7" w:name="_Toc230448878"/>
       <w:r>
         <w:t>2.3 macOS (Intel and Apple Silicon)</w:t>
       </w:r>
@@ -4296,7 +4296,7 @@
       <w:pPr>
         <w:pStyle w:val="Heading2"/>
       </w:pPr>
-      <w:bookmarkStart w:id="8" w:name="_Toc230446321"/>
+      <w:bookmarkStart w:id="8" w:name="_Toc230448879"/>
       <w:r>
         <w:t>3. Installing the DSES Spectrum Analyzer</w:t>
       </w:r>
@@ -4365,7 +4365,7 @@
       <w:pPr>
         <w:pStyle w:val="Heading3"/>
       </w:pPr>
-      <w:bookmarkStart w:id="9" w:name="_Toc230446322"/>
+      <w:bookmarkStart w:id="9" w:name="_Toc230448880"/>
       <w:r>
         <w:t>3.1 Windows 11</w:t>
       </w:r>
@@ -4549,7 +4549,7 @@
         <w:pStyle w:val="ListNumber"/>
       </w:pPr>
       <w:r>
-        <w:t xml:space="preserve">(Optional) Right-click </w:t>
+        <w:t xml:space="preserve">(Optional) Create a desktop shortcut (with the app’s pulsar icon) by running </w:t>
       </w:r>
       <w:r>
         <w:rPr>
@@ -4558,7 +4558,76 @@
         <w:t>`install-shortcut.ps1`</w:t>
       </w:r>
       <w:r>
-        <w:t xml:space="preserve"> → “Run with PowerShell” to put a “DSES Spectrum Analyzer” shortcut on your desktop and Start menu.</w:t>
+        <w:t>. The reliable way — which works regardless of your PowerShell execution policy — is to open PowerShell in the extracted folder and run:</w:t>
+      </w:r>
+    </w:p>
+    <w:tbl>
+      <w:tblPr>
+        <w:tblW w:w="0" w:type="auto"/>
+        <w:tblLook w:val="04A0" w:firstRow="1" w:lastRow="0" w:firstColumn="1" w:lastColumn="0" w:noHBand="0" w:noVBand="1"/>
+      </w:tblPr>
+      <w:tblGrid>
+        <w:gridCol w:w="9634"/>
+      </w:tblGrid>
+      <w:tr>
+        <w:tc>
+          <w:tcPr>
+            <w:tcW w:w="9634" w:type="dxa"/>
+            <w:shd w:val="clear" w:color="auto" w:fill="F2F2F2"/>
+          </w:tcPr>
+          <w:p>
+            <w:r>
+              <w:rPr>
+                <w:rFonts w:ascii="Consolas" w:hAnsi="Consolas"/>
+                <w:sz w:val="18"/>
+              </w:rPr>
+              <w:t xml:space="preserve">   powershell -NoProfile -ExecutionPolicy Bypass -File .\install-shortcut.ps1</w:t>
+            </w:r>
+          </w:p>
+        </w:tc>
+      </w:tr>
+    </w:tbl>
+    <w:p>
+      <w:r>
+        <w:t xml:space="preserve">It prints </w:t>
+      </w:r>
+      <w:r>
+        <w:rPr>
+          <w:rFonts w:ascii="Consolas" w:hAnsi="Consolas"/>
+          <w:sz w:val="20"/>
+        </w:rPr>
+        <w:t>Created: …\DSES Spectrum Analyzer.lnk</w:t>
+      </w:r>
+      <w:r>
+        <w:t xml:space="preserve">. (Right-clicking the script → “Run with PowerShell” also works </w:t>
+      </w:r>
+      <w:r>
+        <w:rPr>
+          <w:i/>
+        </w:rPr>
+        <w:t>if</w:t>
+      </w:r>
+      <w:r>
+        <w:t xml:space="preserve"> your machine’s execution policy allows local scripts; if nothing appears, the policy blocked it — use the command above instead.) The shortcut is named </w:t>
+      </w:r>
+      <w:r>
+        <w:rPr>
+          <w:b/>
+        </w:rPr>
+        <w:t>DSES Spectrum Analyzer</w:t>
+      </w:r>
+      <w:r>
+        <w:t xml:space="preserve"> and launches the app via </w:t>
+      </w:r>
+      <w:r>
+        <w:rPr>
+          <w:rFonts w:ascii="Consolas" w:hAnsi="Consolas"/>
+          <w:sz w:val="20"/>
+        </w:rPr>
+        <w:t>launcher.ps1</w:t>
+      </w:r>
+      <w:r>
+        <w:t>.</w:t>
       </w:r>
     </w:p>
     <w:p>
@@ -4570,7 +4639,7 @@
       <w:pPr>
         <w:pStyle w:val="Heading3"/>
       </w:pPr>
-      <w:bookmarkStart w:id="10" w:name="_Toc230446323"/>
+      <w:bookmarkStart w:id="10" w:name="_Toc230448881"/>
       <w:r>
         <w:t>3.2 Linux</w:t>
       </w:r>
@@ -4667,6 +4736,7 @@
         <w:pStyle w:val="ListNumber"/>
       </w:pPr>
       <w:r>
+        <w:lastRenderedPageBreak/>
         <w:t>(Optional) Install a desktop entry so the app appears in your application menu:</w:t>
       </w:r>
     </w:p>
@@ -4725,7 +4795,6 @@
     </w:tbl>
     <w:p>
       <w:r>
-        <w:lastRenderedPageBreak/>
         <w:t xml:space="preserve">(The </w:t>
       </w:r>
       <w:r>
@@ -4763,7 +4832,7 @@
       <w:pPr>
         <w:pStyle w:val="Heading3"/>
       </w:pPr>
-      <w:bookmarkStart w:id="11" w:name="_Toc230446324"/>
+      <w:bookmarkStart w:id="11" w:name="_Toc230448882"/>
       <w:r>
         <w:t>3.3 macOS</w:t>
       </w:r>
@@ -4916,12 +4985,12 @@
       <w:pPr>
         <w:pStyle w:val="Heading2"/>
       </w:pPr>
-      <w:bookmarkStart w:id="12" w:name="_Toc230446325"/>
-      <w:r>
-        <w:t xml:space="preserve">3A. Extra setup for </w:t>
-      </w:r>
-      <w:r>
-        <w:t>SDRPlay receivers (RSP1A / RSP1B / RSPduo / RSPdx)</w:t>
+      <w:bookmarkStart w:id="12" w:name="_Toc230448883"/>
+      <w:r>
+        <w:t xml:space="preserve">3A. Extra setup for SDRPlay receivers </w:t>
+      </w:r>
+      <w:r>
+        <w:t>(RSP1A / RSP1B / RSPduo / RSPdx)</w:t>
       </w:r>
       <w:bookmarkEnd w:id="12"/>
     </w:p>
@@ -4954,7 +5023,7 @@
       <w:pPr>
         <w:pStyle w:val="Heading3"/>
       </w:pPr>
-      <w:bookmarkStart w:id="13" w:name="_Toc230446326"/>
+      <w:bookmarkStart w:id="13" w:name="_Toc230448884"/>
       <w:r>
         <w:t>3A.1 Install the SDRplay API</w:t>
       </w:r>
@@ -5031,6 +5100,7 @@
         <w:rPr>
           <w:b/>
         </w:rPr>
+        <w:lastRenderedPageBreak/>
         <w:t>macOS:</w:t>
       </w:r>
       <w:r>
@@ -5066,7 +5136,7 @@
       <w:pPr>
         <w:pStyle w:val="Heading3"/>
       </w:pPr>
-      <w:bookmarkStart w:id="14" w:name="_Toc230446327"/>
+      <w:bookmarkStart w:id="14" w:name="_Toc230448885"/>
       <w:r>
         <w:t>3A.2 Install the SoapySDRPlay module</w:t>
       </w:r>
@@ -5101,7 +5171,6 @@
         <w:rPr>
           <w:b/>
         </w:rPr>
-        <w:lastRenderedPageBreak/>
         <w:t>Windows</w:t>
       </w:r>
       <w:r>
@@ -5418,6 +5487,7 @@
     </w:p>
     <w:p>
       <w:r>
+        <w:lastRenderedPageBreak/>
         <w:t xml:space="preserve">When you launch the spectrum analyzer with an RSP attached, it appears in the device picker as e.g. </w:t>
       </w:r>
       <w:r>
@@ -5435,7 +5505,7 @@
       <w:pPr>
         <w:pStyle w:val="Heading2"/>
       </w:pPr>
-      <w:bookmarkStart w:id="15" w:name="_Toc230446328"/>
+      <w:bookmarkStart w:id="15" w:name="_Toc230448886"/>
       <w:r>
         <w:t>4. First-run checklist</w:t>
       </w:r>
@@ -5443,7 +5513,10 @@
     </w:p>
     <w:p>
       <w:r>
-        <w:t>Regardless of OS, before declaring the install good:</w:t>
+        <w:t xml:space="preserve">Regardless of OS, </w:t>
+      </w:r>
+      <w:r>
+        <w:t>before declaring the install good:</w:t>
       </w:r>
     </w:p>
     <w:p>
@@ -5451,7 +5524,6 @@
         <w:pStyle w:val="ListBullet"/>
       </w:pPr>
       <w:r>
-        <w:lastRenderedPageBreak/>
         <w:t xml:space="preserve">The window title bar reads </w:t>
       </w:r>
       <w:r>
@@ -5548,7 +5620,7 @@
       <w:pPr>
         <w:pStyle w:val="Heading3"/>
       </w:pPr>
-      <w:bookmarkStart w:id="16" w:name="_Toc230446329"/>
+      <w:bookmarkStart w:id="16" w:name="_Toc230448887"/>
       <w:r>
         <w:t>Recommended one-time VOLK tuning</w:t>
       </w:r>
@@ -5691,8 +5763,9 @@
       <w:pPr>
         <w:pStyle w:val="Heading2"/>
       </w:pPr>
-      <w:bookmarkStart w:id="17" w:name="_Toc230446330"/>
-      <w:r>
+      <w:bookmarkStart w:id="17" w:name="_Toc230448888"/>
+      <w:r>
+        <w:lastRenderedPageBreak/>
         <w:t>5. Updating to a new version</w:t>
       </w:r>
       <w:bookmarkEnd w:id="17"/>
@@ -5701,7 +5774,7 @@
       <w:pPr>
         <w:pStyle w:val="Heading3"/>
       </w:pPr>
-      <w:bookmarkStart w:id="18" w:name="_Toc230446331"/>
+      <w:bookmarkStart w:id="18" w:name="_Toc230448889"/>
       <w:r>
         <w:t>Auto-update notifications</w:t>
       </w:r>
@@ -5792,9 +5865,8 @@
       <w:pPr>
         <w:pStyle w:val="Heading3"/>
       </w:pPr>
-      <w:bookmarkStart w:id="19" w:name="_Toc230446332"/>
-      <w:r>
-        <w:lastRenderedPageBreak/>
+      <w:bookmarkStart w:id="19" w:name="_Toc230448890"/>
+      <w:r>
         <w:t>Performing the update</w:t>
       </w:r>
       <w:bookmarkEnd w:id="19"/>
@@ -5889,7 +5961,7 @@
       <w:pPr>
         <w:pStyle w:val="Heading3"/>
       </w:pPr>
-      <w:bookmarkStart w:id="20" w:name="_Toc230446333"/>
+      <w:bookmarkStart w:id="20" w:name="_Toc230448891"/>
       <w:r>
         <w:t>What is preserved across versions</w:t>
       </w:r>
@@ -5897,7 +5969,10 @@
     </w:p>
     <w:p>
       <w:r>
-        <w:t>Your settings and window geometry are kept outside the app folder, so updates never wipe them. The on-disk locations are:</w:t>
+        <w:t xml:space="preserve">Your </w:t>
+      </w:r>
+      <w:r>
+        <w:t>settings and window geometry are kept outside the app folder, so updates never wipe them. The on-disk locations are:</w:t>
       </w:r>
     </w:p>
     <w:tbl>
@@ -6072,7 +6147,7 @@
       <w:pPr>
         <w:pStyle w:val="Heading3"/>
       </w:pPr>
-      <w:bookmarkStart w:id="21" w:name="_Toc230446334"/>
+      <w:bookmarkStart w:id="21" w:name="_Toc230448892"/>
       <w:r>
         <w:t>Backing up your settings</w:t>
       </w:r>
@@ -6121,6 +6196,7 @@
                 <w:rFonts w:ascii="Consolas" w:hAnsi="Consolas"/>
                 <w:sz w:val="18"/>
               </w:rPr>
+              <w:lastRenderedPageBreak/>
               <w:t>Linux:    cp ~/.local/share/DSES_Analyzer/settings.ini ~/Desktop/settings.ini.bak</w:t>
             </w:r>
           </w:p>
@@ -6131,8 +6207,9 @@
       <w:pPr>
         <w:pStyle w:val="Heading2"/>
       </w:pPr>
-      <w:bookmarkStart w:id="22" w:name="_Toc230446335"/>
-      <w:r>
+      <w:bookmarkStart w:id="22" w:name="_Toc230448893"/>
+      <w:r>
+        <w:lastRenderedPageBreak/>
         <w:t>6. Troubleshooting</w:t>
       </w:r>
       <w:bookmarkEnd w:id="22"/>
@@ -6141,7 +6218,7 @@
       <w:pPr>
         <w:pStyle w:val="Heading3"/>
       </w:pPr>
-      <w:bookmarkStart w:id="23" w:name="_Toc230446336"/>
+      <w:bookmarkStart w:id="23" w:name="_Toc230448894"/>
       <w:r>
         <w:t>“Radioconda not found in standard locations”</w:t>
       </w:r>
@@ -6202,9 +6279,8 @@
       <w:pPr>
         <w:pStyle w:val="Heading3"/>
       </w:pPr>
-      <w:bookmarkStart w:id="24" w:name="_Toc230446337"/>
-      <w:r>
-        <w:lastRenderedPageBreak/>
+      <w:bookmarkStart w:id="24" w:name="_Toc230448895"/>
+      <w:r>
         <w:t>“No UHD Devices Found”</w:t>
       </w:r>
       <w:bookmarkEnd w:id="24"/>
@@ -6301,7 +6377,7 @@
       <w:pPr>
         <w:pStyle w:val="Heading3"/>
       </w:pPr>
-      <w:bookmarkStart w:id="25" w:name="_Toc230446338"/>
+      <w:bookmarkStart w:id="25" w:name="_Toc230448896"/>
       <w:r>
         <w:t>Persistent “O” overflows at high sample rates</w:t>
       </w:r>
@@ -6345,7 +6421,7 @@
       <w:pPr>
         <w:pStyle w:val="Heading3"/>
       </w:pPr>
-      <w:bookmarkStart w:id="26" w:name="_Toc230446339"/>
+      <w:bookmarkStart w:id="26" w:name="_Toc230448897"/>
       <w:r>
         <w:t>Spectrum looks flat at −140 dB</w:t>
       </w:r>
@@ -6369,7 +6445,11 @@
         <w:pStyle w:val="ListBullet"/>
       </w:pPr>
       <w:r>
-        <w:t>Antenna is disconnected (this app uses RX2 by default). Confirm a cable is on RX2.</w:t>
+        <w:lastRenderedPageBreak/>
+        <w:t xml:space="preserve">Antenna is disconnected (this app uses RX2 by default). Confirm a cable is on </w:t>
+      </w:r>
+      <w:r>
+        <w:t>RX2.</w:t>
       </w:r>
     </w:p>
     <w:p>
@@ -6384,7 +6464,7 @@
       <w:pPr>
         <w:pStyle w:val="Heading3"/>
       </w:pPr>
-      <w:bookmarkStart w:id="27" w:name="_Toc230446340"/>
+      <w:bookmarkStart w:id="27" w:name="_Toc230448898"/>
       <w:r>
         <w:t>macOS: “developer cannot be verified”</w:t>
       </w:r>
@@ -6420,7 +6500,7 @@
       <w:pPr>
         <w:pStyle w:val="Heading3"/>
       </w:pPr>
-      <w:bookmarkStart w:id="28" w:name="_Toc230446341"/>
+      <w:bookmarkStart w:id="28" w:name="_Toc230448899"/>
       <w:r>
         <w:t>Settings won’t persist</w:t>
       </w:r>
@@ -6428,10 +6508,7 @@
     </w:p>
     <w:p>
       <w:r>
-        <w:t xml:space="preserve">Settings should be saved automatically on every </w:t>
-      </w:r>
-      <w:r>
-        <w:t>change and on app close. If they aren’t:</w:t>
+        <w:t>Settings should be saved automatically on every change and on app close. If they aren’t:</w:t>
       </w:r>
     </w:p>
     <w:p>
@@ -6456,7 +6533,6 @@
         <w:pStyle w:val="ListBullet"/>
       </w:pPr>
       <w:r>
-        <w:lastRenderedPageBreak/>
         <w:t xml:space="preserve">If the directory’s parent doesn’t exist, the app will fail to create it silently. On first run after install, click </w:t>
       </w:r>
       <w:r>
@@ -6473,7 +6549,7 @@
       <w:pPr>
         <w:pStyle w:val="Heading2"/>
       </w:pPr>
-      <w:bookmarkStart w:id="29" w:name="_Toc230446342"/>
+      <w:bookmarkStart w:id="29" w:name="_Toc230448900"/>
       <w:r>
         <w:t>7. Appendix A — Settings file reference</w:t>
       </w:r>
@@ -6682,7 +6758,7 @@
       <w:pPr>
         <w:pStyle w:val="Heading2"/>
       </w:pPr>
-      <w:bookmarkStart w:id="30" w:name="_Toc230446343"/>
+      <w:bookmarkStart w:id="30" w:name="_Toc230448901"/>
       <w:r>
         <w:t>8. Appendix B — Device selection and SigMF playback</w:t>
       </w:r>
@@ -6692,7 +6768,7 @@
       <w:pPr>
         <w:pStyle w:val="Heading3"/>
       </w:pPr>
-      <w:bookmarkStart w:id="31" w:name="_Toc230446344"/>
+      <w:bookmarkStart w:id="31" w:name="_Toc230448902"/>
       <w:r>
         <w:t>Choosing among multiple radios</w:t>
       </w:r>
@@ -6728,6 +6804,7 @@
         <w:rPr>
           <w:b/>
         </w:rPr>
+        <w:lastRenderedPageBreak/>
         <w:t>No radio attached, but `sample.sigmf-data` + `sample.sigmf-meta` are present next to the program:</w:t>
       </w:r>
       <w:r>
@@ -6807,7 +6884,6 @@
     </w:p>
     <w:p>
       <w:r>
-        <w:lastRenderedPageBreak/>
         <w:t>The sample-rate combo and gain-slider range adapt automatically to whichever radio is open. SDRPlay caps at 10 MHz; RTL-SDR maxes around 3.2 MHz; HackRF goes to 20 MHz; the B210 to 25 MHz. Saved gain is clamped to the new device’s range if you switch to a narrower one.</w:t>
       </w:r>
     </w:p>
@@ -6870,7 +6946,7 @@
       <w:pPr>
         <w:pStyle w:val="Heading3"/>
       </w:pPr>
-      <w:bookmarkStart w:id="32" w:name="_Toc230446345"/>
+      <w:bookmarkStart w:id="32" w:name="_Toc230448903"/>
       <w:r>
         <w:t>SigMF playback mode (no-device fallback)</w:t>
       </w:r>
@@ -6878,10 +6954,7 @@
     </w:p>
     <w:p>
       <w:r>
-        <w:t xml:space="preserve">The distribution bundle includes a short SigMF recording so that </w:t>
-      </w:r>
-      <w:r>
-        <w:t>users without any SDR attached can still launch the program, see live spectrum, and try the controls.</w:t>
+        <w:t>The distribution bundle includes a short SigMF recording so that users without any SDR attached can still launch the program, see live spectrum, and try the controls.</w:t>
       </w:r>
     </w:p>
     <w:p>
@@ -7054,6 +7127,7 @@
         <w:pStyle w:val="ListBullet"/>
       </w:pPr>
       <w:r>
+        <w:lastRenderedPageBreak/>
         <w:t xml:space="preserve">To skip playback mode and force an error exit when no SDR is attached, delete or rename either of the two </w:t>
       </w:r>
       <w:r>
@@ -7071,7 +7145,7 @@
       <w:pPr>
         <w:pStyle w:val="Heading2"/>
       </w:pPr>
-      <w:bookmarkStart w:id="33" w:name="_Toc230446346"/>
+      <w:bookmarkStart w:id="33" w:name="_Toc230448904"/>
       <w:r>
         <w:t>9. Appendix C — Operating Guide</w:t>
       </w:r>
@@ -7100,7 +7174,7 @@
       <w:pPr>
         <w:pStyle w:val="Heading3"/>
       </w:pPr>
-      <w:bookmarkStart w:id="34" w:name="_Toc230446347"/>
+      <w:bookmarkStart w:id="34" w:name="_Toc230448905"/>
       <w:r>
         <w:t>Starting up — device selection</w:t>
       </w:r>
@@ -7119,7 +7193,6 @@
         <w:rPr>
           <w:b/>
         </w:rPr>
-        <w:lastRenderedPageBreak/>
         <w:t>One supported SDR attached</w:t>
       </w:r>
       <w:r>
@@ -7205,7 +7278,7 @@
       <w:pPr>
         <w:pStyle w:val="Heading3"/>
       </w:pPr>
-      <w:bookmarkStart w:id="35" w:name="_Toc230446348"/>
+      <w:bookmarkStart w:id="35" w:name="_Toc230448906"/>
       <w:r>
         <w:t>Playback mode</w:t>
       </w:r>
@@ -7331,8 +7404,9 @@
       <w:pPr>
         <w:pStyle w:val="Heading3"/>
       </w:pPr>
-      <w:bookmarkStart w:id="36" w:name="_Toc230446349"/>
-      <w:r>
+      <w:bookmarkStart w:id="36" w:name="_Toc230448907"/>
+      <w:r>
+        <w:lastRenderedPageBreak/>
         <w:t>Sidebar controls (right side)</w:t>
       </w:r>
       <w:bookmarkEnd w:id="36"/>
@@ -7449,7 +7523,6 @@
         <w:rPr>
           <w:b/>
         </w:rPr>
-        <w:lastRenderedPageBreak/>
         <w:t>Sample Rate</w:t>
       </w:r>
       <w:r>
@@ -7612,7 +7685,7 @@
       <w:pPr>
         <w:pStyle w:val="Heading3"/>
       </w:pPr>
-      <w:bookmarkStart w:id="37" w:name="_Toc230446350"/>
+      <w:bookmarkStart w:id="37" w:name="_Toc230448908"/>
       <w:r>
         <w:t>Spectrum (top plot)</w:t>
       </w:r>
@@ -7662,7 +7735,10 @@
         <w:t>Avg α</w:t>
       </w:r>
       <w:r>
-        <w:t>: exponential averaging. 1.0 = no smoothing (every frame is a fresh measurement). Smaller = more smoothing.</w:t>
+        <w:t xml:space="preserve">: exponential averaging. 1.0 = no </w:t>
+      </w:r>
+      <w:r>
+        <w:t>smoothing (every frame is a fresh measurement). Smaller = more smoothing.</w:t>
       </w:r>
     </w:p>
     <w:p>
@@ -7673,6 +7749,7 @@
         <w:rPr>
           <w:b/>
         </w:rPr>
+        <w:lastRenderedPageBreak/>
         <w:t>Max / Min hold</w:t>
       </w:r>
       <w:r>
@@ -7752,7 +7829,7 @@
       <w:pPr>
         <w:pStyle w:val="Heading3"/>
       </w:pPr>
-      <w:bookmarkStart w:id="38" w:name="_Toc230446351"/>
+      <w:bookmarkStart w:id="38" w:name="_Toc230448909"/>
       <w:r>
         <w:t>Waterfall (bottom plot)</w:t>
       </w:r>
@@ -7771,7 +7848,6 @@
         <w:rPr>
           <w:b/>
         </w:rPr>
-        <w:lastRenderedPageBreak/>
         <w:t>Intensity Min/Max</w:t>
       </w:r>
       <w:r>
@@ -7819,7 +7895,7 @@
       <w:pPr>
         <w:pStyle w:val="Heading3"/>
       </w:pPr>
-      <w:bookmarkStart w:id="39" w:name="_Toc230446352"/>
+      <w:bookmarkStart w:id="39" w:name="_Toc230448910"/>
       <w:r>
         <w:t>Persistence</w:t>
       </w:r>
@@ -7866,7 +7942,7 @@
       <w:pPr>
         <w:pStyle w:val="Heading3"/>
       </w:pPr>
-      <w:bookmarkStart w:id="40" w:name="_Toc230446353"/>
+      <w:bookmarkStart w:id="40" w:name="_Toc230448911"/>
       <w:r>
         <w:t>Update checks</w:t>
       </w:r>
@@ -7924,7 +8000,7 @@
       <w:pPr>
         <w:pStyle w:val="Heading3"/>
       </w:pPr>
-      <w:bookmarkStart w:id="41" w:name="_Toc230446354"/>
+      <w:bookmarkStart w:id="41" w:name="_Toc230448912"/>
       <w:r>
         <w:t>Tips for pulsar work</w:t>
       </w:r>
@@ -8303,31 +8379,31 @@
       </w:rPr>
     </w:lvl>
   </w:abstractNum>
-  <w:num w:numId="1" w16cid:durableId="1723140276">
+  <w:num w:numId="1" w16cid:durableId="443503920">
     <w:abstractNumId w:val="8"/>
   </w:num>
-  <w:num w:numId="2" w16cid:durableId="1139149697">
+  <w:num w:numId="2" w16cid:durableId="2136679569">
     <w:abstractNumId w:val="6"/>
   </w:num>
-  <w:num w:numId="3" w16cid:durableId="693117552">
+  <w:num w:numId="3" w16cid:durableId="944313190">
     <w:abstractNumId w:val="5"/>
   </w:num>
-  <w:num w:numId="4" w16cid:durableId="73089687">
+  <w:num w:numId="4" w16cid:durableId="1456682235">
     <w:abstractNumId w:val="4"/>
   </w:num>
-  <w:num w:numId="5" w16cid:durableId="1946963579">
+  <w:num w:numId="5" w16cid:durableId="480853054">
     <w:abstractNumId w:val="7"/>
   </w:num>
-  <w:num w:numId="6" w16cid:durableId="352270452">
+  <w:num w:numId="6" w16cid:durableId="1912228535">
     <w:abstractNumId w:val="3"/>
   </w:num>
-  <w:num w:numId="7" w16cid:durableId="307517435">
+  <w:num w:numId="7" w16cid:durableId="625164970">
     <w:abstractNumId w:val="2"/>
   </w:num>
-  <w:num w:numId="8" w16cid:durableId="80303220">
+  <w:num w:numId="8" w16cid:durableId="949355945">
     <w:abstractNumId w:val="1"/>
   </w:num>
-  <w:num w:numId="9" w16cid:durableId="332034432">
+  <w:num w:numId="9" w16cid:durableId="181017552">
     <w:abstractNumId w:val="0"/>
   </w:num>
 </w:numbering>
@@ -19722,7 +19798,7 @@
     <w:autoRedefine/>
     <w:uiPriority w:val="39"/>
     <w:unhideWhenUsed/>
-    <w:rsid w:val="00C06F55"/>
+    <w:rsid w:val="009136E9"/>
     <w:pPr>
       <w:spacing w:after="100"/>
     </w:pPr>
@@ -19734,7 +19810,7 @@
     <w:autoRedefine/>
     <w:uiPriority w:val="39"/>
     <w:unhideWhenUsed/>
-    <w:rsid w:val="00C06F55"/>
+    <w:rsid w:val="009136E9"/>
     <w:pPr>
       <w:spacing w:after="100"/>
       <w:ind w:left="220"/>
@@ -19747,7 +19823,7 @@
     <w:autoRedefine/>
     <w:uiPriority w:val="39"/>
     <w:unhideWhenUsed/>
-    <w:rsid w:val="00C06F55"/>
+    <w:rsid w:val="009136E9"/>
     <w:pPr>
       <w:spacing w:after="100"/>
       <w:ind w:left="440"/>
@@ -19758,7 +19834,7 @@
     <w:basedOn w:val="DefaultParagraphFont"/>
     <w:uiPriority w:val="99"/>
     <w:unhideWhenUsed/>
-    <w:rsid w:val="00C06F55"/>
+    <w:rsid w:val="009136E9"/>
     <w:rPr>
       <w:color w:val="0000FF" w:themeColor="hyperlink"/>
       <w:u w:val="single"/>

</xml_diff>

<commit_message>
Rename icon files to dses_sa.*; add zip retry to make-release.ps1
- Rename icons/b210.{ico,png} -> icons/dses_sa.{ico,png} (git mv, history
  preserved) and update every reference: install-shortcut.ps1,
  build_install_docx.py (cover image), make-release.ps1 / .sh,
  generate-icon.py, Release_Workflow.md. Nothing internal says "b210" now.
- Fix the .desktop Icon line, which pointed at a non-existent icons/icon.png,
  to icons/dses_sa.png (Linux menu icon now actually shows).
- make-release.ps1: retry Compress-Archive up to 5x with a 3s backoff so a
  transient AV/file lock on a freshly-staged file self-recovers instead of
  failing the build.
Regenerated PDF/DOCX and the desktop shortcut now point at dses_sa.ico.
</commit_message>
<xml_diff>
--- a/DSES_RFI_Spectrum_Analyzer_Installation.docx
+++ b/DSES_RFI_Spectrum_Analyzer_Installation.docx
@@ -41,7 +41,7 @@
           <w:noProof/>
         </w:rPr>
         <w:drawing>
-          <wp:inline distT="0" distB="0" distL="0" distR="0" wp14:anchorId="485D428A" wp14:editId="3CCE777B">
+          <wp:inline distT="0" distB="0" distL="0" distR="0" wp14:anchorId="496579A7" wp14:editId="54F8E3E4">
             <wp:extent cx="1371600" cy="1371600"/>
             <wp:effectExtent l="0" t="0" r="0" b="0"/>
             <wp:docPr id="1" name="Picture 1"/>
@@ -52,7 +52,7 @@
               <a:graphicData uri="http://schemas.openxmlformats.org/drawingml/2006/picture">
                 <pic:pic xmlns:pic="http://schemas.openxmlformats.org/drawingml/2006/picture">
                   <pic:nvPicPr>
-                    <pic:cNvPr id="0" name="b210.png"/>
+                    <pic:cNvPr id="0" name="dses_sa.png"/>
                     <pic:cNvPicPr/>
                   </pic:nvPicPr>
                   <pic:blipFill>
@@ -138,7 +138,7 @@
         <w:pStyle w:val="Heading1"/>
         <w:shd w:val="clear" w:color="auto" w:fill="156082"/>
       </w:pPr>
-      <w:bookmarkStart w:id="0" w:name="_Toc230448871"/>
+      <w:bookmarkStart w:id="0" w:name="_Toc230449194"/>
       <w:r>
         <w:lastRenderedPageBreak/>
         <w:t>Contents</w:t>
@@ -169,7 +169,7 @@
       <w:r>
         <w:fldChar w:fldCharType="separate"/>
       </w:r>
-      <w:hyperlink w:anchor="_Toc230448871" w:history="1">
+      <w:hyperlink w:anchor="_Toc230449194" w:history="1">
         <w:r>
           <w:rPr>
             <w:rStyle w:val="Hyperlink"/>
@@ -196,7 +196,7 @@
             <w:noProof/>
             <w:webHidden/>
           </w:rPr>
-          <w:instrText xml:space="preserve"> PAGEREF _Toc230448871 \h </w:instrText>
+          <w:instrText xml:space="preserve"> PAGEREF _Toc230449194 \h </w:instrText>
         </w:r>
         <w:r>
           <w:rPr>
@@ -242,7 +242,7 @@
           <w14:ligatures w14:val="standardContextual"/>
         </w:rPr>
       </w:pPr>
-      <w:hyperlink w:anchor="_Toc230448872" w:history="1">
+      <w:hyperlink w:anchor="_Toc230449195" w:history="1">
         <w:r>
           <w:rPr>
             <w:rStyle w:val="Hyperlink"/>
@@ -269,7 +269,7 @@
             <w:noProof/>
             <w:webHidden/>
           </w:rPr>
-          <w:instrText xml:space="preserve"> PAGEREF _Toc230448872 \h </w:instrText>
+          <w:instrText xml:space="preserve"> PAGEREF _Toc230449195 \h </w:instrText>
         </w:r>
         <w:r>
           <w:rPr>
@@ -315,7 +315,7 @@
           <w14:ligatures w14:val="standardContextual"/>
         </w:rPr>
       </w:pPr>
-      <w:hyperlink w:anchor="_Toc230448873" w:history="1">
+      <w:hyperlink w:anchor="_Toc230449196" w:history="1">
         <w:r>
           <w:rPr>
             <w:rStyle w:val="Hyperlink"/>
@@ -342,7 +342,7 @@
             <w:noProof/>
             <w:webHidden/>
           </w:rPr>
-          <w:instrText xml:space="preserve"> PAGEREF _Toc230448873 \h </w:instrText>
+          <w:instrText xml:space="preserve"> PAGEREF _Toc230449196 \h </w:instrText>
         </w:r>
         <w:r>
           <w:rPr>
@@ -388,7 +388,7 @@
           <w14:ligatures w14:val="standardContextual"/>
         </w:rPr>
       </w:pPr>
-      <w:hyperlink w:anchor="_Toc230448874" w:history="1">
+      <w:hyperlink w:anchor="_Toc230449197" w:history="1">
         <w:r>
           <w:rPr>
             <w:rStyle w:val="Hyperlink"/>
@@ -415,7 +415,7 @@
             <w:noProof/>
             <w:webHidden/>
           </w:rPr>
-          <w:instrText xml:space="preserve"> PAGEREF _Toc230448874 \h </w:instrText>
+          <w:instrText xml:space="preserve"> PAGEREF _Toc230449197 \h </w:instrText>
         </w:r>
         <w:r>
           <w:rPr>
@@ -461,7 +461,7 @@
           <w14:ligatures w14:val="standardContextual"/>
         </w:rPr>
       </w:pPr>
-      <w:hyperlink w:anchor="_Toc230448875" w:history="1">
+      <w:hyperlink w:anchor="_Toc230449198" w:history="1">
         <w:r>
           <w:rPr>
             <w:rStyle w:val="Hyperlink"/>
@@ -488,7 +488,7 @@
             <w:noProof/>
             <w:webHidden/>
           </w:rPr>
-          <w:instrText xml:space="preserve"> PAGEREF _Toc230448875 \h </w:instrText>
+          <w:instrText xml:space="preserve"> PAGEREF _Toc230449198 \h </w:instrText>
         </w:r>
         <w:r>
           <w:rPr>
@@ -534,7 +534,7 @@
           <w14:ligatures w14:val="standardContextual"/>
         </w:rPr>
       </w:pPr>
-      <w:hyperlink w:anchor="_Toc230448876" w:history="1">
+      <w:hyperlink w:anchor="_Toc230449199" w:history="1">
         <w:r>
           <w:rPr>
             <w:rStyle w:val="Hyperlink"/>
@@ -561,7 +561,7 @@
             <w:noProof/>
             <w:webHidden/>
           </w:rPr>
-          <w:instrText xml:space="preserve"> PAGEREF _Toc230448876 \h </w:instrText>
+          <w:instrText xml:space="preserve"> PAGEREF _Toc230449199 \h </w:instrText>
         </w:r>
         <w:r>
           <w:rPr>
@@ -607,7 +607,7 @@
           <w14:ligatures w14:val="standardContextual"/>
         </w:rPr>
       </w:pPr>
-      <w:hyperlink w:anchor="_Toc230448877" w:history="1">
+      <w:hyperlink w:anchor="_Toc230449200" w:history="1">
         <w:r>
           <w:rPr>
             <w:rStyle w:val="Hyperlink"/>
@@ -634,7 +634,7 @@
             <w:noProof/>
             <w:webHidden/>
           </w:rPr>
-          <w:instrText xml:space="preserve"> PAGEREF _Toc230448877 \h </w:instrText>
+          <w:instrText xml:space="preserve"> PAGEREF _Toc230449200 \h </w:instrText>
         </w:r>
         <w:r>
           <w:rPr>
@@ -680,7 +680,7 @@
           <w14:ligatures w14:val="standardContextual"/>
         </w:rPr>
       </w:pPr>
-      <w:hyperlink w:anchor="_Toc230448878" w:history="1">
+      <w:hyperlink w:anchor="_Toc230449201" w:history="1">
         <w:r>
           <w:rPr>
             <w:rStyle w:val="Hyperlink"/>
@@ -707,7 +707,7 @@
             <w:noProof/>
             <w:webHidden/>
           </w:rPr>
-          <w:instrText xml:space="preserve"> PAGEREF _Toc230448878 \h </w:instrText>
+          <w:instrText xml:space="preserve"> PAGEREF _Toc230449201 \h </w:instrText>
         </w:r>
         <w:r>
           <w:rPr>
@@ -753,7 +753,7 @@
           <w14:ligatures w14:val="standardContextual"/>
         </w:rPr>
       </w:pPr>
-      <w:hyperlink w:anchor="_Toc230448879" w:history="1">
+      <w:hyperlink w:anchor="_Toc230449202" w:history="1">
         <w:r>
           <w:rPr>
             <w:rStyle w:val="Hyperlink"/>
@@ -780,7 +780,7 @@
             <w:noProof/>
             <w:webHidden/>
           </w:rPr>
-          <w:instrText xml:space="preserve"> PAGEREF _Toc230448879 \h </w:instrText>
+          <w:instrText xml:space="preserve"> PAGEREF _Toc230449202 \h </w:instrText>
         </w:r>
         <w:r>
           <w:rPr>
@@ -826,7 +826,7 @@
           <w14:ligatures w14:val="standardContextual"/>
         </w:rPr>
       </w:pPr>
-      <w:hyperlink w:anchor="_Toc230448880" w:history="1">
+      <w:hyperlink w:anchor="_Toc230449203" w:history="1">
         <w:r>
           <w:rPr>
             <w:rStyle w:val="Hyperlink"/>
@@ -853,7 +853,7 @@
             <w:noProof/>
             <w:webHidden/>
           </w:rPr>
-          <w:instrText xml:space="preserve"> PAGEREF _Toc230448880 \h </w:instrText>
+          <w:instrText xml:space="preserve"> PAGEREF _Toc230449203 \h </w:instrText>
         </w:r>
         <w:r>
           <w:rPr>
@@ -899,7 +899,7 @@
           <w14:ligatures w14:val="standardContextual"/>
         </w:rPr>
       </w:pPr>
-      <w:hyperlink w:anchor="_Toc230448881" w:history="1">
+      <w:hyperlink w:anchor="_Toc230449204" w:history="1">
         <w:r>
           <w:rPr>
             <w:rStyle w:val="Hyperlink"/>
@@ -926,7 +926,7 @@
             <w:noProof/>
             <w:webHidden/>
           </w:rPr>
-          <w:instrText xml:space="preserve"> PAGEREF _Toc230448881 \h </w:instrText>
+          <w:instrText xml:space="preserve"> PAGEREF _Toc230449204 \h </w:instrText>
         </w:r>
         <w:r>
           <w:rPr>
@@ -972,7 +972,7 @@
           <w14:ligatures w14:val="standardContextual"/>
         </w:rPr>
       </w:pPr>
-      <w:hyperlink w:anchor="_Toc230448882" w:history="1">
+      <w:hyperlink w:anchor="_Toc230449205" w:history="1">
         <w:r>
           <w:rPr>
             <w:rStyle w:val="Hyperlink"/>
@@ -999,7 +999,7 @@
             <w:noProof/>
             <w:webHidden/>
           </w:rPr>
-          <w:instrText xml:space="preserve"> PAGEREF _Toc230448882 \h </w:instrText>
+          <w:instrText xml:space="preserve"> PAGEREF _Toc230449205 \h </w:instrText>
         </w:r>
         <w:r>
           <w:rPr>
@@ -1045,7 +1045,7 @@
           <w14:ligatures w14:val="standardContextual"/>
         </w:rPr>
       </w:pPr>
-      <w:hyperlink w:anchor="_Toc230448883" w:history="1">
+      <w:hyperlink w:anchor="_Toc230449206" w:history="1">
         <w:r>
           <w:rPr>
             <w:rStyle w:val="Hyperlink"/>
@@ -1072,7 +1072,7 @@
             <w:noProof/>
             <w:webHidden/>
           </w:rPr>
-          <w:instrText xml:space="preserve"> PAGEREF _Toc230448883 \h </w:instrText>
+          <w:instrText xml:space="preserve"> PAGEREF _Toc230449206 \h </w:instrText>
         </w:r>
         <w:r>
           <w:rPr>
@@ -1118,7 +1118,7 @@
           <w14:ligatures w14:val="standardContextual"/>
         </w:rPr>
       </w:pPr>
-      <w:hyperlink w:anchor="_Toc230448884" w:history="1">
+      <w:hyperlink w:anchor="_Toc230449207" w:history="1">
         <w:r>
           <w:rPr>
             <w:rStyle w:val="Hyperlink"/>
@@ -1145,7 +1145,7 @@
             <w:noProof/>
             <w:webHidden/>
           </w:rPr>
-          <w:instrText xml:space="preserve"> PAGEREF _Toc230448884 \h </w:instrText>
+          <w:instrText xml:space="preserve"> PAGEREF _Toc230449207 \h </w:instrText>
         </w:r>
         <w:r>
           <w:rPr>
@@ -1191,7 +1191,7 @@
           <w14:ligatures w14:val="standardContextual"/>
         </w:rPr>
       </w:pPr>
-      <w:hyperlink w:anchor="_Toc230448885" w:history="1">
+      <w:hyperlink w:anchor="_Toc230449208" w:history="1">
         <w:r>
           <w:rPr>
             <w:rStyle w:val="Hyperlink"/>
@@ -1218,7 +1218,7 @@
             <w:noProof/>
             <w:webHidden/>
           </w:rPr>
-          <w:instrText xml:space="preserve"> PAGEREF _Toc230448885 \h </w:instrText>
+          <w:instrText xml:space="preserve"> PAGEREF _Toc230449208 \h </w:instrText>
         </w:r>
         <w:r>
           <w:rPr>
@@ -1264,7 +1264,7 @@
           <w14:ligatures w14:val="standardContextual"/>
         </w:rPr>
       </w:pPr>
-      <w:hyperlink w:anchor="_Toc230448886" w:history="1">
+      <w:hyperlink w:anchor="_Toc230449209" w:history="1">
         <w:r>
           <w:rPr>
             <w:rStyle w:val="Hyperlink"/>
@@ -1291,7 +1291,7 @@
             <w:noProof/>
             <w:webHidden/>
           </w:rPr>
-          <w:instrText xml:space="preserve"> PAGEREF _Toc230448886 \h </w:instrText>
+          <w:instrText xml:space="preserve"> PAGEREF _Toc230449209 \h </w:instrText>
         </w:r>
         <w:r>
           <w:rPr>
@@ -1337,7 +1337,7 @@
           <w14:ligatures w14:val="standardContextual"/>
         </w:rPr>
       </w:pPr>
-      <w:hyperlink w:anchor="_Toc230448887" w:history="1">
+      <w:hyperlink w:anchor="_Toc230449210" w:history="1">
         <w:r>
           <w:rPr>
             <w:rStyle w:val="Hyperlink"/>
@@ -1364,7 +1364,7 @@
             <w:noProof/>
             <w:webHidden/>
           </w:rPr>
-          <w:instrText xml:space="preserve"> PAGEREF _Toc230448887 \h </w:instrText>
+          <w:instrText xml:space="preserve"> PAGEREF _Toc230449210 \h </w:instrText>
         </w:r>
         <w:r>
           <w:rPr>
@@ -1410,7 +1410,7 @@
           <w14:ligatures w14:val="standardContextual"/>
         </w:rPr>
       </w:pPr>
-      <w:hyperlink w:anchor="_Toc230448888" w:history="1">
+      <w:hyperlink w:anchor="_Toc230449211" w:history="1">
         <w:r>
           <w:rPr>
             <w:rStyle w:val="Hyperlink"/>
@@ -1437,7 +1437,7 @@
             <w:noProof/>
             <w:webHidden/>
           </w:rPr>
-          <w:instrText xml:space="preserve"> PAGEREF _Toc230448888 \h </w:instrText>
+          <w:instrText xml:space="preserve"> PAGEREF _Toc230449211 \h </w:instrText>
         </w:r>
         <w:r>
           <w:rPr>
@@ -1483,7 +1483,7 @@
           <w14:ligatures w14:val="standardContextual"/>
         </w:rPr>
       </w:pPr>
-      <w:hyperlink w:anchor="_Toc230448889" w:history="1">
+      <w:hyperlink w:anchor="_Toc230449212" w:history="1">
         <w:r>
           <w:rPr>
             <w:rStyle w:val="Hyperlink"/>
@@ -1510,7 +1510,7 @@
             <w:noProof/>
             <w:webHidden/>
           </w:rPr>
-          <w:instrText xml:space="preserve"> PAGEREF _Toc230448889 \h </w:instrText>
+          <w:instrText xml:space="preserve"> PAGEREF _Toc230449212 \h </w:instrText>
         </w:r>
         <w:r>
           <w:rPr>
@@ -1556,7 +1556,7 @@
           <w14:ligatures w14:val="standardContextual"/>
         </w:rPr>
       </w:pPr>
-      <w:hyperlink w:anchor="_Toc230448890" w:history="1">
+      <w:hyperlink w:anchor="_Toc230449213" w:history="1">
         <w:r>
           <w:rPr>
             <w:rStyle w:val="Hyperlink"/>
@@ -1583,7 +1583,7 @@
             <w:noProof/>
             <w:webHidden/>
           </w:rPr>
-          <w:instrText xml:space="preserve"> PAGEREF _Toc230448890 \h </w:instrText>
+          <w:instrText xml:space="preserve"> PAGEREF _Toc230449213 \h </w:instrText>
         </w:r>
         <w:r>
           <w:rPr>
@@ -1629,7 +1629,7 @@
           <w14:ligatures w14:val="standardContextual"/>
         </w:rPr>
       </w:pPr>
-      <w:hyperlink w:anchor="_Toc230448891" w:history="1">
+      <w:hyperlink w:anchor="_Toc230449214" w:history="1">
         <w:r>
           <w:rPr>
             <w:rStyle w:val="Hyperlink"/>
@@ -1656,7 +1656,7 @@
             <w:noProof/>
             <w:webHidden/>
           </w:rPr>
-          <w:instrText xml:space="preserve"> PAGEREF _Toc230448891 \h </w:instrText>
+          <w:instrText xml:space="preserve"> PAGEREF _Toc230449214 \h </w:instrText>
         </w:r>
         <w:r>
           <w:rPr>
@@ -1702,7 +1702,7 @@
           <w14:ligatures w14:val="standardContextual"/>
         </w:rPr>
       </w:pPr>
-      <w:hyperlink w:anchor="_Toc230448892" w:history="1">
+      <w:hyperlink w:anchor="_Toc230449215" w:history="1">
         <w:r>
           <w:rPr>
             <w:rStyle w:val="Hyperlink"/>
@@ -1729,7 +1729,7 @@
             <w:noProof/>
             <w:webHidden/>
           </w:rPr>
-          <w:instrText xml:space="preserve"> PAGEREF _Toc230448892 \h </w:instrText>
+          <w:instrText xml:space="preserve"> PAGEREF _Toc230449215 \h </w:instrText>
         </w:r>
         <w:r>
           <w:rPr>
@@ -1775,7 +1775,7 @@
           <w14:ligatures w14:val="standardContextual"/>
         </w:rPr>
       </w:pPr>
-      <w:hyperlink w:anchor="_Toc230448893" w:history="1">
+      <w:hyperlink w:anchor="_Toc230449216" w:history="1">
         <w:r>
           <w:rPr>
             <w:rStyle w:val="Hyperlink"/>
@@ -1802,7 +1802,7 @@
             <w:noProof/>
             <w:webHidden/>
           </w:rPr>
-          <w:instrText xml:space="preserve"> PAGEREF _Toc230448893 \h </w:instrText>
+          <w:instrText xml:space="preserve"> PAGEREF _Toc230449216 \h </w:instrText>
         </w:r>
         <w:r>
           <w:rPr>
@@ -1848,7 +1848,7 @@
           <w14:ligatures w14:val="standardContextual"/>
         </w:rPr>
       </w:pPr>
-      <w:hyperlink w:anchor="_Toc230448894" w:history="1">
+      <w:hyperlink w:anchor="_Toc230449217" w:history="1">
         <w:r>
           <w:rPr>
             <w:rStyle w:val="Hyperlink"/>
@@ -1875,7 +1875,7 @@
             <w:noProof/>
             <w:webHidden/>
           </w:rPr>
-          <w:instrText xml:space="preserve"> PAGEREF _Toc230448894 \h </w:instrText>
+          <w:instrText xml:space="preserve"> PAGEREF _Toc230449217 \h </w:instrText>
         </w:r>
         <w:r>
           <w:rPr>
@@ -1921,7 +1921,7 @@
           <w14:ligatures w14:val="standardContextual"/>
         </w:rPr>
       </w:pPr>
-      <w:hyperlink w:anchor="_Toc230448895" w:history="1">
+      <w:hyperlink w:anchor="_Toc230449218" w:history="1">
         <w:r>
           <w:rPr>
             <w:rStyle w:val="Hyperlink"/>
@@ -1948,7 +1948,7 @@
             <w:noProof/>
             <w:webHidden/>
           </w:rPr>
-          <w:instrText xml:space="preserve"> PAGEREF _Toc230448895 \h </w:instrText>
+          <w:instrText xml:space="preserve"> PAGEREF _Toc230449218 \h </w:instrText>
         </w:r>
         <w:r>
           <w:rPr>
@@ -1994,7 +1994,7 @@
           <w14:ligatures w14:val="standardContextual"/>
         </w:rPr>
       </w:pPr>
-      <w:hyperlink w:anchor="_Toc230448896" w:history="1">
+      <w:hyperlink w:anchor="_Toc230449219" w:history="1">
         <w:r>
           <w:rPr>
             <w:rStyle w:val="Hyperlink"/>
@@ -2021,7 +2021,7 @@
             <w:noProof/>
             <w:webHidden/>
           </w:rPr>
-          <w:instrText xml:space="preserve"> PAGEREF _Toc230448896 \h </w:instrText>
+          <w:instrText xml:space="preserve"> PAGEREF _Toc230449219 \h </w:instrText>
         </w:r>
         <w:r>
           <w:rPr>
@@ -2067,7 +2067,7 @@
           <w14:ligatures w14:val="standardContextual"/>
         </w:rPr>
       </w:pPr>
-      <w:hyperlink w:anchor="_Toc230448897" w:history="1">
+      <w:hyperlink w:anchor="_Toc230449220" w:history="1">
         <w:r>
           <w:rPr>
             <w:rStyle w:val="Hyperlink"/>
@@ -2094,7 +2094,7 @@
             <w:noProof/>
             <w:webHidden/>
           </w:rPr>
-          <w:instrText xml:space="preserve"> PAGEREF _Toc230448897 \h </w:instrText>
+          <w:instrText xml:space="preserve"> PAGEREF _Toc230449220 \h </w:instrText>
         </w:r>
         <w:r>
           <w:rPr>
@@ -2140,7 +2140,7 @@
           <w14:ligatures w14:val="standardContextual"/>
         </w:rPr>
       </w:pPr>
-      <w:hyperlink w:anchor="_Toc230448898" w:history="1">
+      <w:hyperlink w:anchor="_Toc230449221" w:history="1">
         <w:r>
           <w:rPr>
             <w:rStyle w:val="Hyperlink"/>
@@ -2167,7 +2167,7 @@
             <w:noProof/>
             <w:webHidden/>
           </w:rPr>
-          <w:instrText xml:space="preserve"> PAGEREF _Toc230448898 \h </w:instrText>
+          <w:instrText xml:space="preserve"> PAGEREF _Toc230449221 \h </w:instrText>
         </w:r>
         <w:r>
           <w:rPr>
@@ -2213,7 +2213,7 @@
           <w14:ligatures w14:val="standardContextual"/>
         </w:rPr>
       </w:pPr>
-      <w:hyperlink w:anchor="_Toc230448899" w:history="1">
+      <w:hyperlink w:anchor="_Toc230449222" w:history="1">
         <w:r>
           <w:rPr>
             <w:rStyle w:val="Hyperlink"/>
@@ -2240,7 +2240,7 @@
             <w:noProof/>
             <w:webHidden/>
           </w:rPr>
-          <w:instrText xml:space="preserve"> PAGEREF _Toc230448899 \h </w:instrText>
+          <w:instrText xml:space="preserve"> PAGEREF _Toc230449222 \h </w:instrText>
         </w:r>
         <w:r>
           <w:rPr>
@@ -2286,7 +2286,7 @@
           <w14:ligatures w14:val="standardContextual"/>
         </w:rPr>
       </w:pPr>
-      <w:hyperlink w:anchor="_Toc230448900" w:history="1">
+      <w:hyperlink w:anchor="_Toc230449223" w:history="1">
         <w:r>
           <w:rPr>
             <w:rStyle w:val="Hyperlink"/>
@@ -2313,7 +2313,7 @@
             <w:noProof/>
             <w:webHidden/>
           </w:rPr>
-          <w:instrText xml:space="preserve"> PAGEREF _Toc230448900 \h </w:instrText>
+          <w:instrText xml:space="preserve"> PAGEREF _Toc230449223 \h </w:instrText>
         </w:r>
         <w:r>
           <w:rPr>
@@ -2359,7 +2359,7 @@
           <w14:ligatures w14:val="standardContextual"/>
         </w:rPr>
       </w:pPr>
-      <w:hyperlink w:anchor="_Toc230448901" w:history="1">
+      <w:hyperlink w:anchor="_Toc230449224" w:history="1">
         <w:r>
           <w:rPr>
             <w:rStyle w:val="Hyperlink"/>
@@ -2386,7 +2386,7 @@
             <w:noProof/>
             <w:webHidden/>
           </w:rPr>
-          <w:instrText xml:space="preserve"> PAGEREF _Toc230448901 \h </w:instrText>
+          <w:instrText xml:space="preserve"> PAGEREF _Toc230449224 \h </w:instrText>
         </w:r>
         <w:r>
           <w:rPr>
@@ -2432,7 +2432,7 @@
           <w14:ligatures w14:val="standardContextual"/>
         </w:rPr>
       </w:pPr>
-      <w:hyperlink w:anchor="_Toc230448902" w:history="1">
+      <w:hyperlink w:anchor="_Toc230449225" w:history="1">
         <w:r>
           <w:rPr>
             <w:rStyle w:val="Hyperlink"/>
@@ -2459,7 +2459,7 @@
             <w:noProof/>
             <w:webHidden/>
           </w:rPr>
-          <w:instrText xml:space="preserve"> PAGEREF _Toc230448902 \h </w:instrText>
+          <w:instrText xml:space="preserve"> PAGEREF _Toc230449225 \h </w:instrText>
         </w:r>
         <w:r>
           <w:rPr>
@@ -2505,7 +2505,7 @@
           <w14:ligatures w14:val="standardContextual"/>
         </w:rPr>
       </w:pPr>
-      <w:hyperlink w:anchor="_Toc230448903" w:history="1">
+      <w:hyperlink w:anchor="_Toc230449226" w:history="1">
         <w:r>
           <w:rPr>
             <w:rStyle w:val="Hyperlink"/>
@@ -2532,7 +2532,7 @@
             <w:noProof/>
             <w:webHidden/>
           </w:rPr>
-          <w:instrText xml:space="preserve"> PAGEREF _Toc230448903 \h </w:instrText>
+          <w:instrText xml:space="preserve"> PAGEREF _Toc230449226 \h </w:instrText>
         </w:r>
         <w:r>
           <w:rPr>
@@ -2578,7 +2578,7 @@
           <w14:ligatures w14:val="standardContextual"/>
         </w:rPr>
       </w:pPr>
-      <w:hyperlink w:anchor="_Toc230448904" w:history="1">
+      <w:hyperlink w:anchor="_Toc230449227" w:history="1">
         <w:r>
           <w:rPr>
             <w:rStyle w:val="Hyperlink"/>
@@ -2605,7 +2605,7 @@
             <w:noProof/>
             <w:webHidden/>
           </w:rPr>
-          <w:instrText xml:space="preserve"> PAGEREF _Toc230448904 \h </w:instrText>
+          <w:instrText xml:space="preserve"> PAGEREF _Toc230449227 \h </w:instrText>
         </w:r>
         <w:r>
           <w:rPr>
@@ -2651,7 +2651,7 @@
           <w14:ligatures w14:val="standardContextual"/>
         </w:rPr>
       </w:pPr>
-      <w:hyperlink w:anchor="_Toc230448905" w:history="1">
+      <w:hyperlink w:anchor="_Toc230449228" w:history="1">
         <w:r>
           <w:rPr>
             <w:rStyle w:val="Hyperlink"/>
@@ -2678,7 +2678,7 @@
             <w:noProof/>
             <w:webHidden/>
           </w:rPr>
-          <w:instrText xml:space="preserve"> PAGEREF _Toc230448905 \h </w:instrText>
+          <w:instrText xml:space="preserve"> PAGEREF _Toc230449228 \h </w:instrText>
         </w:r>
         <w:r>
           <w:rPr>
@@ -2724,7 +2724,7 @@
           <w14:ligatures w14:val="standardContextual"/>
         </w:rPr>
       </w:pPr>
-      <w:hyperlink w:anchor="_Toc230448906" w:history="1">
+      <w:hyperlink w:anchor="_Toc230449229" w:history="1">
         <w:r>
           <w:rPr>
             <w:rStyle w:val="Hyperlink"/>
@@ -2751,7 +2751,7 @@
             <w:noProof/>
             <w:webHidden/>
           </w:rPr>
-          <w:instrText xml:space="preserve"> PAGEREF _Toc230448906 \h </w:instrText>
+          <w:instrText xml:space="preserve"> PAGEREF _Toc230449229 \h </w:instrText>
         </w:r>
         <w:r>
           <w:rPr>
@@ -2797,7 +2797,7 @@
           <w14:ligatures w14:val="standardContextual"/>
         </w:rPr>
       </w:pPr>
-      <w:hyperlink w:anchor="_Toc230448907" w:history="1">
+      <w:hyperlink w:anchor="_Toc230449230" w:history="1">
         <w:r>
           <w:rPr>
             <w:rStyle w:val="Hyperlink"/>
@@ -2824,7 +2824,7 @@
             <w:noProof/>
             <w:webHidden/>
           </w:rPr>
-          <w:instrText xml:space="preserve"> PAGEREF _Toc230448907 \h </w:instrText>
+          <w:instrText xml:space="preserve"> PAGEREF _Toc230449230 \h </w:instrText>
         </w:r>
         <w:r>
           <w:rPr>
@@ -2870,7 +2870,7 @@
           <w14:ligatures w14:val="standardContextual"/>
         </w:rPr>
       </w:pPr>
-      <w:hyperlink w:anchor="_Toc230448908" w:history="1">
+      <w:hyperlink w:anchor="_Toc230449231" w:history="1">
         <w:r>
           <w:rPr>
             <w:rStyle w:val="Hyperlink"/>
@@ -2897,7 +2897,7 @@
             <w:noProof/>
             <w:webHidden/>
           </w:rPr>
-          <w:instrText xml:space="preserve"> PAGEREF _Toc230448908 \h </w:instrText>
+          <w:instrText xml:space="preserve"> PAGEREF _Toc230449231 \h </w:instrText>
         </w:r>
         <w:r>
           <w:rPr>
@@ -2943,7 +2943,7 @@
           <w14:ligatures w14:val="standardContextual"/>
         </w:rPr>
       </w:pPr>
-      <w:hyperlink w:anchor="_Toc230448909" w:history="1">
+      <w:hyperlink w:anchor="_Toc230449232" w:history="1">
         <w:r>
           <w:rPr>
             <w:rStyle w:val="Hyperlink"/>
@@ -2970,7 +2970,7 @@
             <w:noProof/>
             <w:webHidden/>
           </w:rPr>
-          <w:instrText xml:space="preserve"> PAGEREF _Toc230448909 \h </w:instrText>
+          <w:instrText xml:space="preserve"> PAGEREF _Toc230449232 \h </w:instrText>
         </w:r>
         <w:r>
           <w:rPr>
@@ -3016,7 +3016,7 @@
           <w14:ligatures w14:val="standardContextual"/>
         </w:rPr>
       </w:pPr>
-      <w:hyperlink w:anchor="_Toc230448910" w:history="1">
+      <w:hyperlink w:anchor="_Toc230449233" w:history="1">
         <w:r>
           <w:rPr>
             <w:rStyle w:val="Hyperlink"/>
@@ -3043,7 +3043,7 @@
             <w:noProof/>
             <w:webHidden/>
           </w:rPr>
-          <w:instrText xml:space="preserve"> PAGEREF _Toc230448910 \h </w:instrText>
+          <w:instrText xml:space="preserve"> PAGEREF _Toc230449233 \h </w:instrText>
         </w:r>
         <w:r>
           <w:rPr>
@@ -3089,7 +3089,7 @@
           <w14:ligatures w14:val="standardContextual"/>
         </w:rPr>
       </w:pPr>
-      <w:hyperlink w:anchor="_Toc230448911" w:history="1">
+      <w:hyperlink w:anchor="_Toc230449234" w:history="1">
         <w:r>
           <w:rPr>
             <w:rStyle w:val="Hyperlink"/>
@@ -3116,7 +3116,7 @@
             <w:noProof/>
             <w:webHidden/>
           </w:rPr>
-          <w:instrText xml:space="preserve"> PAGEREF _Toc230448911 \h </w:instrText>
+          <w:instrText xml:space="preserve"> PAGEREF _Toc230449234 \h </w:instrText>
         </w:r>
         <w:r>
           <w:rPr>
@@ -3162,7 +3162,7 @@
           <w14:ligatures w14:val="standardContextual"/>
         </w:rPr>
       </w:pPr>
-      <w:hyperlink w:anchor="_Toc230448912" w:history="1">
+      <w:hyperlink w:anchor="_Toc230449235" w:history="1">
         <w:r>
           <w:rPr>
             <w:rStyle w:val="Hyperlink"/>
@@ -3189,7 +3189,7 @@
             <w:noProof/>
             <w:webHidden/>
           </w:rPr>
-          <w:instrText xml:space="preserve"> PAGEREF _Toc230448912 \h </w:instrText>
+          <w:instrText xml:space="preserve"> PAGEREF _Toc230449235 \h </w:instrText>
         </w:r>
         <w:r>
           <w:rPr>
@@ -3235,7 +3235,7 @@
         <w:pStyle w:val="Heading1"/>
         <w:shd w:val="clear" w:color="auto" w:fill="156082"/>
       </w:pPr>
-      <w:bookmarkStart w:id="1" w:name="_Toc230448872"/>
+      <w:bookmarkStart w:id="1" w:name="_Toc230449195"/>
       <w:r>
         <w:lastRenderedPageBreak/>
         <w:t xml:space="preserve">DSES Spectrum Analyzer — </w:t>
@@ -3314,7 +3314,7 @@
       <w:pPr>
         <w:pStyle w:val="Heading2"/>
       </w:pPr>
-      <w:bookmarkStart w:id="2" w:name="_Toc230448873"/>
+      <w:bookmarkStart w:id="2" w:name="_Toc230449196"/>
       <w:r>
         <w:t>1. What the recipient needs to know first</w:t>
       </w:r>
@@ -3388,7 +3388,7 @@
       <w:pPr>
         <w:pStyle w:val="Heading3"/>
       </w:pPr>
-      <w:bookmarkStart w:id="3" w:name="_Toc230448874"/>
+      <w:bookmarkStart w:id="3" w:name="_Toc230449197"/>
       <w:r>
         <w:t>System requirements</w:t>
       </w:r>
@@ -3667,7 +3667,7 @@
       <w:pPr>
         <w:pStyle w:val="Heading2"/>
       </w:pPr>
-      <w:bookmarkStart w:id="4" w:name="_Toc230448875"/>
+      <w:bookmarkStart w:id="4" w:name="_Toc230449198"/>
       <w:r>
         <w:t>2. Installing Radioconda</w:t>
       </w:r>
@@ -3677,7 +3677,7 @@
       <w:pPr>
         <w:pStyle w:val="Heading3"/>
       </w:pPr>
-      <w:bookmarkStart w:id="5" w:name="_Toc230448876"/>
+      <w:bookmarkStart w:id="5" w:name="_Toc230449199"/>
       <w:r>
         <w:t>2.1 Windows 11</w:t>
       </w:r>
@@ -3854,7 +3854,7 @@
       <w:pPr>
         <w:pStyle w:val="Heading3"/>
       </w:pPr>
-      <w:bookmarkStart w:id="6" w:name="_Toc230448877"/>
+      <w:bookmarkStart w:id="6" w:name="_Toc230449200"/>
       <w:r>
         <w:t>2.2 Linux</w:t>
       </w:r>
@@ -4059,7 +4059,7 @@
       <w:pPr>
         <w:pStyle w:val="Heading3"/>
       </w:pPr>
-      <w:bookmarkStart w:id="7" w:name="_Toc230448878"/>
+      <w:bookmarkStart w:id="7" w:name="_Toc230449201"/>
       <w:r>
         <w:t>2.3 macOS (Intel and Apple Silicon)</w:t>
       </w:r>
@@ -4296,7 +4296,7 @@
       <w:pPr>
         <w:pStyle w:val="Heading2"/>
       </w:pPr>
-      <w:bookmarkStart w:id="8" w:name="_Toc230448879"/>
+      <w:bookmarkStart w:id="8" w:name="_Toc230449202"/>
       <w:r>
         <w:t>3. Installing the DSES Spectrum Analyzer</w:t>
       </w:r>
@@ -4365,7 +4365,7 @@
       <w:pPr>
         <w:pStyle w:val="Heading3"/>
       </w:pPr>
-      <w:bookmarkStart w:id="9" w:name="_Toc230448880"/>
+      <w:bookmarkStart w:id="9" w:name="_Toc230449203"/>
       <w:r>
         <w:t>3.1 Windows 11</w:t>
       </w:r>
@@ -4639,7 +4639,7 @@
       <w:pPr>
         <w:pStyle w:val="Heading3"/>
       </w:pPr>
-      <w:bookmarkStart w:id="10" w:name="_Toc230448881"/>
+      <w:bookmarkStart w:id="10" w:name="_Toc230449204"/>
       <w:r>
         <w:t>3.2 Linux</w:t>
       </w:r>
@@ -4832,7 +4832,7 @@
       <w:pPr>
         <w:pStyle w:val="Heading3"/>
       </w:pPr>
-      <w:bookmarkStart w:id="11" w:name="_Toc230448882"/>
+      <w:bookmarkStart w:id="11" w:name="_Toc230449205"/>
       <w:r>
         <w:t>3.3 macOS</w:t>
       </w:r>
@@ -4985,7 +4985,7 @@
       <w:pPr>
         <w:pStyle w:val="Heading2"/>
       </w:pPr>
-      <w:bookmarkStart w:id="12" w:name="_Toc230448883"/>
+      <w:bookmarkStart w:id="12" w:name="_Toc230449206"/>
       <w:r>
         <w:t xml:space="preserve">3A. Extra setup for SDRPlay receivers </w:t>
       </w:r>
@@ -5023,7 +5023,7 @@
       <w:pPr>
         <w:pStyle w:val="Heading3"/>
       </w:pPr>
-      <w:bookmarkStart w:id="13" w:name="_Toc230448884"/>
+      <w:bookmarkStart w:id="13" w:name="_Toc230449207"/>
       <w:r>
         <w:t>3A.1 Install the SDRplay API</w:t>
       </w:r>
@@ -5136,7 +5136,7 @@
       <w:pPr>
         <w:pStyle w:val="Heading3"/>
       </w:pPr>
-      <w:bookmarkStart w:id="14" w:name="_Toc230448885"/>
+      <w:bookmarkStart w:id="14" w:name="_Toc230449208"/>
       <w:r>
         <w:t>3A.2 Install the SoapySDRPlay module</w:t>
       </w:r>
@@ -5505,7 +5505,7 @@
       <w:pPr>
         <w:pStyle w:val="Heading2"/>
       </w:pPr>
-      <w:bookmarkStart w:id="15" w:name="_Toc230448886"/>
+      <w:bookmarkStart w:id="15" w:name="_Toc230449209"/>
       <w:r>
         <w:t>4. First-run checklist</w:t>
       </w:r>
@@ -5620,7 +5620,7 @@
       <w:pPr>
         <w:pStyle w:val="Heading3"/>
       </w:pPr>
-      <w:bookmarkStart w:id="16" w:name="_Toc230448887"/>
+      <w:bookmarkStart w:id="16" w:name="_Toc230449210"/>
       <w:r>
         <w:t>Recommended one-time VOLK tuning</w:t>
       </w:r>
@@ -5763,7 +5763,7 @@
       <w:pPr>
         <w:pStyle w:val="Heading2"/>
       </w:pPr>
-      <w:bookmarkStart w:id="17" w:name="_Toc230448888"/>
+      <w:bookmarkStart w:id="17" w:name="_Toc230449211"/>
       <w:r>
         <w:lastRenderedPageBreak/>
         <w:t>5. Updating to a new version</w:t>
@@ -5774,7 +5774,7 @@
       <w:pPr>
         <w:pStyle w:val="Heading3"/>
       </w:pPr>
-      <w:bookmarkStart w:id="18" w:name="_Toc230448889"/>
+      <w:bookmarkStart w:id="18" w:name="_Toc230449212"/>
       <w:r>
         <w:t>Auto-update notifications</w:t>
       </w:r>
@@ -5865,7 +5865,7 @@
       <w:pPr>
         <w:pStyle w:val="Heading3"/>
       </w:pPr>
-      <w:bookmarkStart w:id="19" w:name="_Toc230448890"/>
+      <w:bookmarkStart w:id="19" w:name="_Toc230449213"/>
       <w:r>
         <w:t>Performing the update</w:t>
       </w:r>
@@ -5961,7 +5961,7 @@
       <w:pPr>
         <w:pStyle w:val="Heading3"/>
       </w:pPr>
-      <w:bookmarkStart w:id="20" w:name="_Toc230448891"/>
+      <w:bookmarkStart w:id="20" w:name="_Toc230449214"/>
       <w:r>
         <w:t>What is preserved across versions</w:t>
       </w:r>
@@ -6147,7 +6147,7 @@
       <w:pPr>
         <w:pStyle w:val="Heading3"/>
       </w:pPr>
-      <w:bookmarkStart w:id="21" w:name="_Toc230448892"/>
+      <w:bookmarkStart w:id="21" w:name="_Toc230449215"/>
       <w:r>
         <w:t>Backing up your settings</w:t>
       </w:r>
@@ -6207,7 +6207,7 @@
       <w:pPr>
         <w:pStyle w:val="Heading2"/>
       </w:pPr>
-      <w:bookmarkStart w:id="22" w:name="_Toc230448893"/>
+      <w:bookmarkStart w:id="22" w:name="_Toc230449216"/>
       <w:r>
         <w:lastRenderedPageBreak/>
         <w:t>6. Troubleshooting</w:t>
@@ -6218,7 +6218,7 @@
       <w:pPr>
         <w:pStyle w:val="Heading3"/>
       </w:pPr>
-      <w:bookmarkStart w:id="23" w:name="_Toc230448894"/>
+      <w:bookmarkStart w:id="23" w:name="_Toc230449217"/>
       <w:r>
         <w:t>“Radioconda not found in standard locations”</w:t>
       </w:r>
@@ -6279,7 +6279,7 @@
       <w:pPr>
         <w:pStyle w:val="Heading3"/>
       </w:pPr>
-      <w:bookmarkStart w:id="24" w:name="_Toc230448895"/>
+      <w:bookmarkStart w:id="24" w:name="_Toc230449218"/>
       <w:r>
         <w:t>“No UHD Devices Found”</w:t>
       </w:r>
@@ -6377,7 +6377,7 @@
       <w:pPr>
         <w:pStyle w:val="Heading3"/>
       </w:pPr>
-      <w:bookmarkStart w:id="25" w:name="_Toc230448896"/>
+      <w:bookmarkStart w:id="25" w:name="_Toc230449219"/>
       <w:r>
         <w:t>Persistent “O” overflows at high sample rates</w:t>
       </w:r>
@@ -6421,7 +6421,7 @@
       <w:pPr>
         <w:pStyle w:val="Heading3"/>
       </w:pPr>
-      <w:bookmarkStart w:id="26" w:name="_Toc230448897"/>
+      <w:bookmarkStart w:id="26" w:name="_Toc230449220"/>
       <w:r>
         <w:t>Spectrum looks flat at −140 dB</w:t>
       </w:r>
@@ -6464,7 +6464,7 @@
       <w:pPr>
         <w:pStyle w:val="Heading3"/>
       </w:pPr>
-      <w:bookmarkStart w:id="27" w:name="_Toc230448898"/>
+      <w:bookmarkStart w:id="27" w:name="_Toc230449221"/>
       <w:r>
         <w:t>macOS: “developer cannot be verified”</w:t>
       </w:r>
@@ -6500,7 +6500,7 @@
       <w:pPr>
         <w:pStyle w:val="Heading3"/>
       </w:pPr>
-      <w:bookmarkStart w:id="28" w:name="_Toc230448899"/>
+      <w:bookmarkStart w:id="28" w:name="_Toc230449222"/>
       <w:r>
         <w:t>Settings won’t persist</w:t>
       </w:r>
@@ -6549,7 +6549,7 @@
       <w:pPr>
         <w:pStyle w:val="Heading2"/>
       </w:pPr>
-      <w:bookmarkStart w:id="29" w:name="_Toc230448900"/>
+      <w:bookmarkStart w:id="29" w:name="_Toc230449223"/>
       <w:r>
         <w:t>7. Appendix A — Settings file reference</w:t>
       </w:r>
@@ -6758,7 +6758,7 @@
       <w:pPr>
         <w:pStyle w:val="Heading2"/>
       </w:pPr>
-      <w:bookmarkStart w:id="30" w:name="_Toc230448901"/>
+      <w:bookmarkStart w:id="30" w:name="_Toc230449224"/>
       <w:r>
         <w:t>8. Appendix B — Device selection and SigMF playback</w:t>
       </w:r>
@@ -6768,7 +6768,7 @@
       <w:pPr>
         <w:pStyle w:val="Heading3"/>
       </w:pPr>
-      <w:bookmarkStart w:id="31" w:name="_Toc230448902"/>
+      <w:bookmarkStart w:id="31" w:name="_Toc230449225"/>
       <w:r>
         <w:t>Choosing among multiple radios</w:t>
       </w:r>
@@ -6946,7 +6946,7 @@
       <w:pPr>
         <w:pStyle w:val="Heading3"/>
       </w:pPr>
-      <w:bookmarkStart w:id="32" w:name="_Toc230448903"/>
+      <w:bookmarkStart w:id="32" w:name="_Toc230449226"/>
       <w:r>
         <w:t>SigMF playback mode (no-device fallback)</w:t>
       </w:r>
@@ -7145,7 +7145,7 @@
       <w:pPr>
         <w:pStyle w:val="Heading2"/>
       </w:pPr>
-      <w:bookmarkStart w:id="33" w:name="_Toc230448904"/>
+      <w:bookmarkStart w:id="33" w:name="_Toc230449227"/>
       <w:r>
         <w:t>9. Appendix C — Operating Guide</w:t>
       </w:r>
@@ -7174,7 +7174,7 @@
       <w:pPr>
         <w:pStyle w:val="Heading3"/>
       </w:pPr>
-      <w:bookmarkStart w:id="34" w:name="_Toc230448905"/>
+      <w:bookmarkStart w:id="34" w:name="_Toc230449228"/>
       <w:r>
         <w:t>Starting up — device selection</w:t>
       </w:r>
@@ -7278,7 +7278,7 @@
       <w:pPr>
         <w:pStyle w:val="Heading3"/>
       </w:pPr>
-      <w:bookmarkStart w:id="35" w:name="_Toc230448906"/>
+      <w:bookmarkStart w:id="35" w:name="_Toc230449229"/>
       <w:r>
         <w:t>Playback mode</w:t>
       </w:r>
@@ -7404,7 +7404,7 @@
       <w:pPr>
         <w:pStyle w:val="Heading3"/>
       </w:pPr>
-      <w:bookmarkStart w:id="36" w:name="_Toc230448907"/>
+      <w:bookmarkStart w:id="36" w:name="_Toc230449230"/>
       <w:r>
         <w:lastRenderedPageBreak/>
         <w:t>Sidebar controls (right side)</w:t>
@@ -7685,7 +7685,7 @@
       <w:pPr>
         <w:pStyle w:val="Heading3"/>
       </w:pPr>
-      <w:bookmarkStart w:id="37" w:name="_Toc230448908"/>
+      <w:bookmarkStart w:id="37" w:name="_Toc230449231"/>
       <w:r>
         <w:t>Spectrum (top plot)</w:t>
       </w:r>
@@ -7829,7 +7829,7 @@
       <w:pPr>
         <w:pStyle w:val="Heading3"/>
       </w:pPr>
-      <w:bookmarkStart w:id="38" w:name="_Toc230448909"/>
+      <w:bookmarkStart w:id="38" w:name="_Toc230449232"/>
       <w:r>
         <w:t>Waterfall (bottom plot)</w:t>
       </w:r>
@@ -7895,7 +7895,7 @@
       <w:pPr>
         <w:pStyle w:val="Heading3"/>
       </w:pPr>
-      <w:bookmarkStart w:id="39" w:name="_Toc230448910"/>
+      <w:bookmarkStart w:id="39" w:name="_Toc230449233"/>
       <w:r>
         <w:t>Persistence</w:t>
       </w:r>
@@ -7942,7 +7942,7 @@
       <w:pPr>
         <w:pStyle w:val="Heading3"/>
       </w:pPr>
-      <w:bookmarkStart w:id="40" w:name="_Toc230448911"/>
+      <w:bookmarkStart w:id="40" w:name="_Toc230449234"/>
       <w:r>
         <w:t>Update checks</w:t>
       </w:r>
@@ -8000,7 +8000,7 @@
       <w:pPr>
         <w:pStyle w:val="Heading3"/>
       </w:pPr>
-      <w:bookmarkStart w:id="41" w:name="_Toc230448912"/>
+      <w:bookmarkStart w:id="41" w:name="_Toc230449235"/>
       <w:r>
         <w:t>Tips for pulsar work</w:t>
       </w:r>
@@ -8379,31 +8379,31 @@
       </w:rPr>
     </w:lvl>
   </w:abstractNum>
-  <w:num w:numId="1" w16cid:durableId="443503920">
+  <w:num w:numId="1" w16cid:durableId="1626154184">
     <w:abstractNumId w:val="8"/>
   </w:num>
-  <w:num w:numId="2" w16cid:durableId="2136679569">
+  <w:num w:numId="2" w16cid:durableId="1586719499">
     <w:abstractNumId w:val="6"/>
   </w:num>
-  <w:num w:numId="3" w16cid:durableId="944313190">
+  <w:num w:numId="3" w16cid:durableId="510219461">
     <w:abstractNumId w:val="5"/>
   </w:num>
-  <w:num w:numId="4" w16cid:durableId="1456682235">
+  <w:num w:numId="4" w16cid:durableId="1346708173">
     <w:abstractNumId w:val="4"/>
   </w:num>
-  <w:num w:numId="5" w16cid:durableId="480853054">
+  <w:num w:numId="5" w16cid:durableId="2075010384">
     <w:abstractNumId w:val="7"/>
   </w:num>
-  <w:num w:numId="6" w16cid:durableId="1912228535">
+  <w:num w:numId="6" w16cid:durableId="950207859">
     <w:abstractNumId w:val="3"/>
   </w:num>
-  <w:num w:numId="7" w16cid:durableId="625164970">
+  <w:num w:numId="7" w16cid:durableId="603265187">
     <w:abstractNumId w:val="2"/>
   </w:num>
-  <w:num w:numId="8" w16cid:durableId="949355945">
+  <w:num w:numId="8" w16cid:durableId="522131948">
     <w:abstractNumId w:val="1"/>
   </w:num>
-  <w:num w:numId="9" w16cid:durableId="181017552">
+  <w:num w:numId="9" w16cid:durableId="643513034">
     <w:abstractNumId w:val="0"/>
   </w:num>
 </w:numbering>
@@ -19798,7 +19798,7 @@
     <w:autoRedefine/>
     <w:uiPriority w:val="39"/>
     <w:unhideWhenUsed/>
-    <w:rsid w:val="009136E9"/>
+    <w:rsid w:val="00752511"/>
     <w:pPr>
       <w:spacing w:after="100"/>
     </w:pPr>
@@ -19810,7 +19810,7 @@
     <w:autoRedefine/>
     <w:uiPriority w:val="39"/>
     <w:unhideWhenUsed/>
-    <w:rsid w:val="009136E9"/>
+    <w:rsid w:val="00752511"/>
     <w:pPr>
       <w:spacing w:after="100"/>
       <w:ind w:left="220"/>
@@ -19823,7 +19823,7 @@
     <w:autoRedefine/>
     <w:uiPriority w:val="39"/>
     <w:unhideWhenUsed/>
-    <w:rsid w:val="009136E9"/>
+    <w:rsid w:val="00752511"/>
     <w:pPr>
       <w:spacing w:after="100"/>
       <w:ind w:left="440"/>
@@ -19834,7 +19834,7 @@
     <w:basedOn w:val="DefaultParagraphFont"/>
     <w:uiPriority w:val="99"/>
     <w:unhideWhenUsed/>
-    <w:rsid w:val="009136E9"/>
+    <w:rsid w:val="00752511"/>
     <w:rPr>
       <w:color w:val="0000FF" w:themeColor="hyperlink"/>
       <w:u w:val="single"/>

</xml_diff>

<commit_message>
Update Radioconda download URL + per-OS installer instructions
The repo moved: ryanvolz/radioconda now redirects to
radioconda/radioconda-installer. Point the primary link at the new repo and
keep the old one as a documented backup that redirects. Give each OS its
own self-contained download block in §2 with the exact version-stamped
asset name (radioconda-<version>-Windows-x86_64.exe, -Linux-x86_64.sh,
-MacOSX-x86_64/arm64.sh, plus the .pkg option on macOS) and both URLs.
Also update the new-repo URL in the launchers' "not found" messages.
Regenerated PDF/DOCX.
</commit_message>
<xml_diff>
--- a/DSES_RFI_Spectrum_Analyzer_Installation.docx
+++ b/DSES_RFI_Spectrum_Analyzer_Installation.docx
@@ -41,7 +41,7 @@
           <w:noProof/>
         </w:rPr>
         <w:drawing>
-          <wp:inline distT="0" distB="0" distL="0" distR="0" wp14:anchorId="496579A7" wp14:editId="54F8E3E4">
+          <wp:inline distT="0" distB="0" distL="0" distR="0" wp14:anchorId="0DB6A22C" wp14:editId="3278278F">
             <wp:extent cx="1371600" cy="1371600"/>
             <wp:effectExtent l="0" t="0" r="0" b="0"/>
             <wp:docPr id="1" name="Picture 1"/>
@@ -138,7 +138,7 @@
         <w:pStyle w:val="Heading1"/>
         <w:shd w:val="clear" w:color="auto" w:fill="156082"/>
       </w:pPr>
-      <w:bookmarkStart w:id="0" w:name="_Toc230449194"/>
+      <w:bookmarkStart w:id="0" w:name="_Toc230451321"/>
       <w:r>
         <w:lastRenderedPageBreak/>
         <w:t>Contents</w:t>
@@ -169,7 +169,7 @@
       <w:r>
         <w:fldChar w:fldCharType="separate"/>
       </w:r>
-      <w:hyperlink w:anchor="_Toc230449194" w:history="1">
+      <w:hyperlink w:anchor="_Toc230451321" w:history="1">
         <w:r>
           <w:rPr>
             <w:rStyle w:val="Hyperlink"/>
@@ -196,7 +196,7 @@
             <w:noProof/>
             <w:webHidden/>
           </w:rPr>
-          <w:instrText xml:space="preserve"> PAGEREF _Toc230449194 \h </w:instrText>
+          <w:instrText xml:space="preserve"> PAGEREF _Toc230451321 \h </w:instrText>
         </w:r>
         <w:r>
           <w:rPr>
@@ -242,7 +242,7 @@
           <w14:ligatures w14:val="standardContextual"/>
         </w:rPr>
       </w:pPr>
-      <w:hyperlink w:anchor="_Toc230449195" w:history="1">
+      <w:hyperlink w:anchor="_Toc230451322" w:history="1">
         <w:r>
           <w:rPr>
             <w:rStyle w:val="Hyperlink"/>
@@ -269,7 +269,7 @@
             <w:noProof/>
             <w:webHidden/>
           </w:rPr>
-          <w:instrText xml:space="preserve"> PAGEREF _Toc230449195 \h </w:instrText>
+          <w:instrText xml:space="preserve"> PAGEREF _Toc230451322 \h </w:instrText>
         </w:r>
         <w:r>
           <w:rPr>
@@ -315,7 +315,7 @@
           <w14:ligatures w14:val="standardContextual"/>
         </w:rPr>
       </w:pPr>
-      <w:hyperlink w:anchor="_Toc230449196" w:history="1">
+      <w:hyperlink w:anchor="_Toc230451323" w:history="1">
         <w:r>
           <w:rPr>
             <w:rStyle w:val="Hyperlink"/>
@@ -342,7 +342,7 @@
             <w:noProof/>
             <w:webHidden/>
           </w:rPr>
-          <w:instrText xml:space="preserve"> PAGEREF _Toc230449196 \h </w:instrText>
+          <w:instrText xml:space="preserve"> PAGEREF _Toc230451323 \h </w:instrText>
         </w:r>
         <w:r>
           <w:rPr>
@@ -388,7 +388,7 @@
           <w14:ligatures w14:val="standardContextual"/>
         </w:rPr>
       </w:pPr>
-      <w:hyperlink w:anchor="_Toc230449197" w:history="1">
+      <w:hyperlink w:anchor="_Toc230451324" w:history="1">
         <w:r>
           <w:rPr>
             <w:rStyle w:val="Hyperlink"/>
@@ -415,7 +415,7 @@
             <w:noProof/>
             <w:webHidden/>
           </w:rPr>
-          <w:instrText xml:space="preserve"> PAGEREF _Toc230449197 \h </w:instrText>
+          <w:instrText xml:space="preserve"> PAGEREF _Toc230451324 \h </w:instrText>
         </w:r>
         <w:r>
           <w:rPr>
@@ -461,7 +461,7 @@
           <w14:ligatures w14:val="standardContextual"/>
         </w:rPr>
       </w:pPr>
-      <w:hyperlink w:anchor="_Toc230449198" w:history="1">
+      <w:hyperlink w:anchor="_Toc230451325" w:history="1">
         <w:r>
           <w:rPr>
             <w:rStyle w:val="Hyperlink"/>
@@ -488,7 +488,7 @@
             <w:noProof/>
             <w:webHidden/>
           </w:rPr>
-          <w:instrText xml:space="preserve"> PAGEREF _Toc230449198 \h </w:instrText>
+          <w:instrText xml:space="preserve"> PAGEREF _Toc230451325 \h </w:instrText>
         </w:r>
         <w:r>
           <w:rPr>
@@ -534,7 +534,7 @@
           <w14:ligatures w14:val="standardContextual"/>
         </w:rPr>
       </w:pPr>
-      <w:hyperlink w:anchor="_Toc230449199" w:history="1">
+      <w:hyperlink w:anchor="_Toc230451326" w:history="1">
         <w:r>
           <w:rPr>
             <w:rStyle w:val="Hyperlink"/>
@@ -561,7 +561,7 @@
             <w:noProof/>
             <w:webHidden/>
           </w:rPr>
-          <w:instrText xml:space="preserve"> PAGEREF _Toc230449199 \h </w:instrText>
+          <w:instrText xml:space="preserve"> PAGEREF _Toc230451326 \h </w:instrText>
         </w:r>
         <w:r>
           <w:rPr>
@@ -607,7 +607,7 @@
           <w14:ligatures w14:val="standardContextual"/>
         </w:rPr>
       </w:pPr>
-      <w:hyperlink w:anchor="_Toc230449200" w:history="1">
+      <w:hyperlink w:anchor="_Toc230451327" w:history="1">
         <w:r>
           <w:rPr>
             <w:rStyle w:val="Hyperlink"/>
@@ -634,7 +634,7 @@
             <w:noProof/>
             <w:webHidden/>
           </w:rPr>
-          <w:instrText xml:space="preserve"> PAGEREF _Toc230449200 \h </w:instrText>
+          <w:instrText xml:space="preserve"> PAGEREF _Toc230451327 \h </w:instrText>
         </w:r>
         <w:r>
           <w:rPr>
@@ -680,7 +680,7 @@
           <w14:ligatures w14:val="standardContextual"/>
         </w:rPr>
       </w:pPr>
-      <w:hyperlink w:anchor="_Toc230449201" w:history="1">
+      <w:hyperlink w:anchor="_Toc230451328" w:history="1">
         <w:r>
           <w:rPr>
             <w:rStyle w:val="Hyperlink"/>
@@ -707,7 +707,7 @@
             <w:noProof/>
             <w:webHidden/>
           </w:rPr>
-          <w:instrText xml:space="preserve"> PAGEREF _Toc230449201 \h </w:instrText>
+          <w:instrText xml:space="preserve"> PAGEREF _Toc230451328 \h </w:instrText>
         </w:r>
         <w:r>
           <w:rPr>
@@ -753,7 +753,7 @@
           <w14:ligatures w14:val="standardContextual"/>
         </w:rPr>
       </w:pPr>
-      <w:hyperlink w:anchor="_Toc230449202" w:history="1">
+      <w:hyperlink w:anchor="_Toc230451329" w:history="1">
         <w:r>
           <w:rPr>
             <w:rStyle w:val="Hyperlink"/>
@@ -780,7 +780,7 @@
             <w:noProof/>
             <w:webHidden/>
           </w:rPr>
-          <w:instrText xml:space="preserve"> PAGEREF _Toc230449202 \h </w:instrText>
+          <w:instrText xml:space="preserve"> PAGEREF _Toc230451329 \h </w:instrText>
         </w:r>
         <w:r>
           <w:rPr>
@@ -800,7 +800,7 @@
             <w:noProof/>
             <w:webHidden/>
           </w:rPr>
-          <w:t>6</w:t>
+          <w:t>7</w:t>
         </w:r>
         <w:r>
           <w:rPr>
@@ -826,7 +826,7 @@
           <w14:ligatures w14:val="standardContextual"/>
         </w:rPr>
       </w:pPr>
-      <w:hyperlink w:anchor="_Toc230449203" w:history="1">
+      <w:hyperlink w:anchor="_Toc230451330" w:history="1">
         <w:r>
           <w:rPr>
             <w:rStyle w:val="Hyperlink"/>
@@ -853,7 +853,7 @@
             <w:noProof/>
             <w:webHidden/>
           </w:rPr>
-          <w:instrText xml:space="preserve"> PAGEREF _Toc230449203 \h </w:instrText>
+          <w:instrText xml:space="preserve"> PAGEREF _Toc230451330 \h </w:instrText>
         </w:r>
         <w:r>
           <w:rPr>
@@ -899,7 +899,7 @@
           <w14:ligatures w14:val="standardContextual"/>
         </w:rPr>
       </w:pPr>
-      <w:hyperlink w:anchor="_Toc230449204" w:history="1">
+      <w:hyperlink w:anchor="_Toc230451331" w:history="1">
         <w:r>
           <w:rPr>
             <w:rStyle w:val="Hyperlink"/>
@@ -926,7 +926,7 @@
             <w:noProof/>
             <w:webHidden/>
           </w:rPr>
-          <w:instrText xml:space="preserve"> PAGEREF _Toc230449204 \h </w:instrText>
+          <w:instrText xml:space="preserve"> PAGEREF _Toc230451331 \h </w:instrText>
         </w:r>
         <w:r>
           <w:rPr>
@@ -946,7 +946,7 @@
             <w:noProof/>
             <w:webHidden/>
           </w:rPr>
-          <w:t>7</w:t>
+          <w:t>8</w:t>
         </w:r>
         <w:r>
           <w:rPr>
@@ -972,7 +972,7 @@
           <w14:ligatures w14:val="standardContextual"/>
         </w:rPr>
       </w:pPr>
-      <w:hyperlink w:anchor="_Toc230449205" w:history="1">
+      <w:hyperlink w:anchor="_Toc230451332" w:history="1">
         <w:r>
           <w:rPr>
             <w:rStyle w:val="Hyperlink"/>
@@ -999,7 +999,7 @@
             <w:noProof/>
             <w:webHidden/>
           </w:rPr>
-          <w:instrText xml:space="preserve"> PAGEREF _Toc230449205 \h </w:instrText>
+          <w:instrText xml:space="preserve"> PAGEREF _Toc230451332 \h </w:instrText>
         </w:r>
         <w:r>
           <w:rPr>
@@ -1045,7 +1045,7 @@
           <w14:ligatures w14:val="standardContextual"/>
         </w:rPr>
       </w:pPr>
-      <w:hyperlink w:anchor="_Toc230449206" w:history="1">
+      <w:hyperlink w:anchor="_Toc230451333" w:history="1">
         <w:r>
           <w:rPr>
             <w:rStyle w:val="Hyperlink"/>
@@ -1072,7 +1072,7 @@
             <w:noProof/>
             <w:webHidden/>
           </w:rPr>
-          <w:instrText xml:space="preserve"> PAGEREF _Toc230449206 \h </w:instrText>
+          <w:instrText xml:space="preserve"> PAGEREF _Toc230451333 \h </w:instrText>
         </w:r>
         <w:r>
           <w:rPr>
@@ -1092,7 +1092,7 @@
             <w:noProof/>
             <w:webHidden/>
           </w:rPr>
-          <w:t>8</w:t>
+          <w:t>9</w:t>
         </w:r>
         <w:r>
           <w:rPr>
@@ -1118,7 +1118,7 @@
           <w14:ligatures w14:val="standardContextual"/>
         </w:rPr>
       </w:pPr>
-      <w:hyperlink w:anchor="_Toc230449207" w:history="1">
+      <w:hyperlink w:anchor="_Toc230451334" w:history="1">
         <w:r>
           <w:rPr>
             <w:rStyle w:val="Hyperlink"/>
@@ -1145,7 +1145,7 @@
             <w:noProof/>
             <w:webHidden/>
           </w:rPr>
-          <w:instrText xml:space="preserve"> PAGEREF _Toc230449207 \h </w:instrText>
+          <w:instrText xml:space="preserve"> PAGEREF _Toc230451334 \h </w:instrText>
         </w:r>
         <w:r>
           <w:rPr>
@@ -1165,7 +1165,7 @@
             <w:noProof/>
             <w:webHidden/>
           </w:rPr>
-          <w:t>8</w:t>
+          <w:t>9</w:t>
         </w:r>
         <w:r>
           <w:rPr>
@@ -1191,7 +1191,7 @@
           <w14:ligatures w14:val="standardContextual"/>
         </w:rPr>
       </w:pPr>
-      <w:hyperlink w:anchor="_Toc230449208" w:history="1">
+      <w:hyperlink w:anchor="_Toc230451335" w:history="1">
         <w:r>
           <w:rPr>
             <w:rStyle w:val="Hyperlink"/>
@@ -1218,7 +1218,7 @@
             <w:noProof/>
             <w:webHidden/>
           </w:rPr>
-          <w:instrText xml:space="preserve"> PAGEREF _Toc230449208 \h </w:instrText>
+          <w:instrText xml:space="preserve"> PAGEREF _Toc230451335 \h </w:instrText>
         </w:r>
         <w:r>
           <w:rPr>
@@ -1264,7 +1264,7 @@
           <w14:ligatures w14:val="standardContextual"/>
         </w:rPr>
       </w:pPr>
-      <w:hyperlink w:anchor="_Toc230449209" w:history="1">
+      <w:hyperlink w:anchor="_Toc230451336" w:history="1">
         <w:r>
           <w:rPr>
             <w:rStyle w:val="Hyperlink"/>
@@ -1291,7 +1291,7 @@
             <w:noProof/>
             <w:webHidden/>
           </w:rPr>
-          <w:instrText xml:space="preserve"> PAGEREF _Toc230449209 \h </w:instrText>
+          <w:instrText xml:space="preserve"> PAGEREF _Toc230451336 \h </w:instrText>
         </w:r>
         <w:r>
           <w:rPr>
@@ -1337,7 +1337,7 @@
           <w14:ligatures w14:val="standardContextual"/>
         </w:rPr>
       </w:pPr>
-      <w:hyperlink w:anchor="_Toc230449210" w:history="1">
+      <w:hyperlink w:anchor="_Toc230451337" w:history="1">
         <w:r>
           <w:rPr>
             <w:rStyle w:val="Hyperlink"/>
@@ -1364,7 +1364,7 @@
             <w:noProof/>
             <w:webHidden/>
           </w:rPr>
-          <w:instrText xml:space="preserve"> PAGEREF _Toc230449210 \h </w:instrText>
+          <w:instrText xml:space="preserve"> PAGEREF _Toc230451337 \h </w:instrText>
         </w:r>
         <w:r>
           <w:rPr>
@@ -1384,7 +1384,7 @@
             <w:noProof/>
             <w:webHidden/>
           </w:rPr>
-          <w:t>10</w:t>
+          <w:t>11</w:t>
         </w:r>
         <w:r>
           <w:rPr>
@@ -1410,7 +1410,7 @@
           <w14:ligatures w14:val="standardContextual"/>
         </w:rPr>
       </w:pPr>
-      <w:hyperlink w:anchor="_Toc230449211" w:history="1">
+      <w:hyperlink w:anchor="_Toc230451338" w:history="1">
         <w:r>
           <w:rPr>
             <w:rStyle w:val="Hyperlink"/>
@@ -1437,7 +1437,7 @@
             <w:noProof/>
             <w:webHidden/>
           </w:rPr>
-          <w:instrText xml:space="preserve"> PAGEREF _Toc230449211 \h </w:instrText>
+          <w:instrText xml:space="preserve"> PAGEREF _Toc230451338 \h </w:instrText>
         </w:r>
         <w:r>
           <w:rPr>
@@ -1483,7 +1483,7 @@
           <w14:ligatures w14:val="standardContextual"/>
         </w:rPr>
       </w:pPr>
-      <w:hyperlink w:anchor="_Toc230449212" w:history="1">
+      <w:hyperlink w:anchor="_Toc230451339" w:history="1">
         <w:r>
           <w:rPr>
             <w:rStyle w:val="Hyperlink"/>
@@ -1510,7 +1510,7 @@
             <w:noProof/>
             <w:webHidden/>
           </w:rPr>
-          <w:instrText xml:space="preserve"> PAGEREF _Toc230449212 \h </w:instrText>
+          <w:instrText xml:space="preserve"> PAGEREF _Toc230451339 \h </w:instrText>
         </w:r>
         <w:r>
           <w:rPr>
@@ -1556,7 +1556,7 @@
           <w14:ligatures w14:val="standardContextual"/>
         </w:rPr>
       </w:pPr>
-      <w:hyperlink w:anchor="_Toc230449213" w:history="1">
+      <w:hyperlink w:anchor="_Toc230451340" w:history="1">
         <w:r>
           <w:rPr>
             <w:rStyle w:val="Hyperlink"/>
@@ -1583,7 +1583,7 @@
             <w:noProof/>
             <w:webHidden/>
           </w:rPr>
-          <w:instrText xml:space="preserve"> PAGEREF _Toc230449213 \h </w:instrText>
+          <w:instrText xml:space="preserve"> PAGEREF _Toc230451340 \h </w:instrText>
         </w:r>
         <w:r>
           <w:rPr>
@@ -1629,7 +1629,7 @@
           <w14:ligatures w14:val="standardContextual"/>
         </w:rPr>
       </w:pPr>
-      <w:hyperlink w:anchor="_Toc230449214" w:history="1">
+      <w:hyperlink w:anchor="_Toc230451341" w:history="1">
         <w:r>
           <w:rPr>
             <w:rStyle w:val="Hyperlink"/>
@@ -1656,7 +1656,7 @@
             <w:noProof/>
             <w:webHidden/>
           </w:rPr>
-          <w:instrText xml:space="preserve"> PAGEREF _Toc230449214 \h </w:instrText>
+          <w:instrText xml:space="preserve"> PAGEREF _Toc230451341 \h </w:instrText>
         </w:r>
         <w:r>
           <w:rPr>
@@ -1676,7 +1676,7 @@
             <w:noProof/>
             <w:webHidden/>
           </w:rPr>
-          <w:t>11</w:t>
+          <w:t>12</w:t>
         </w:r>
         <w:r>
           <w:rPr>
@@ -1702,7 +1702,7 @@
           <w14:ligatures w14:val="standardContextual"/>
         </w:rPr>
       </w:pPr>
-      <w:hyperlink w:anchor="_Toc230449215" w:history="1">
+      <w:hyperlink w:anchor="_Toc230451342" w:history="1">
         <w:r>
           <w:rPr>
             <w:rStyle w:val="Hyperlink"/>
@@ -1729,7 +1729,7 @@
             <w:noProof/>
             <w:webHidden/>
           </w:rPr>
-          <w:instrText xml:space="preserve"> PAGEREF _Toc230449215 \h </w:instrText>
+          <w:instrText xml:space="preserve"> PAGEREF _Toc230451342 \h </w:instrText>
         </w:r>
         <w:r>
           <w:rPr>
@@ -1749,7 +1749,7 @@
             <w:noProof/>
             <w:webHidden/>
           </w:rPr>
-          <w:t>11</w:t>
+          <w:t>12</w:t>
         </w:r>
         <w:r>
           <w:rPr>
@@ -1775,7 +1775,7 @@
           <w14:ligatures w14:val="standardContextual"/>
         </w:rPr>
       </w:pPr>
-      <w:hyperlink w:anchor="_Toc230449216" w:history="1">
+      <w:hyperlink w:anchor="_Toc230451343" w:history="1">
         <w:r>
           <w:rPr>
             <w:rStyle w:val="Hyperlink"/>
@@ -1802,7 +1802,7 @@
             <w:noProof/>
             <w:webHidden/>
           </w:rPr>
-          <w:instrText xml:space="preserve"> PAGEREF _Toc230449216 \h </w:instrText>
+          <w:instrText xml:space="preserve"> PAGEREF _Toc230451343 \h </w:instrText>
         </w:r>
         <w:r>
           <w:rPr>
@@ -1848,7 +1848,7 @@
           <w14:ligatures w14:val="standardContextual"/>
         </w:rPr>
       </w:pPr>
-      <w:hyperlink w:anchor="_Toc230449217" w:history="1">
+      <w:hyperlink w:anchor="_Toc230451344" w:history="1">
         <w:r>
           <w:rPr>
             <w:rStyle w:val="Hyperlink"/>
@@ -1875,7 +1875,7 @@
             <w:noProof/>
             <w:webHidden/>
           </w:rPr>
-          <w:instrText xml:space="preserve"> PAGEREF _Toc230449217 \h </w:instrText>
+          <w:instrText xml:space="preserve"> PAGEREF _Toc230451344 \h </w:instrText>
         </w:r>
         <w:r>
           <w:rPr>
@@ -1921,7 +1921,7 @@
           <w14:ligatures w14:val="standardContextual"/>
         </w:rPr>
       </w:pPr>
-      <w:hyperlink w:anchor="_Toc230449218" w:history="1">
+      <w:hyperlink w:anchor="_Toc230451345" w:history="1">
         <w:r>
           <w:rPr>
             <w:rStyle w:val="Hyperlink"/>
@@ -1948,7 +1948,7 @@
             <w:noProof/>
             <w:webHidden/>
           </w:rPr>
-          <w:instrText xml:space="preserve"> PAGEREF _Toc230449218 \h </w:instrText>
+          <w:instrText xml:space="preserve"> PAGEREF _Toc230451345 \h </w:instrText>
         </w:r>
         <w:r>
           <w:rPr>
@@ -1994,7 +1994,7 @@
           <w14:ligatures w14:val="standardContextual"/>
         </w:rPr>
       </w:pPr>
-      <w:hyperlink w:anchor="_Toc230449219" w:history="1">
+      <w:hyperlink w:anchor="_Toc230451346" w:history="1">
         <w:r>
           <w:rPr>
             <w:rStyle w:val="Hyperlink"/>
@@ -2021,7 +2021,7 @@
             <w:noProof/>
             <w:webHidden/>
           </w:rPr>
-          <w:instrText xml:space="preserve"> PAGEREF _Toc230449219 \h </w:instrText>
+          <w:instrText xml:space="preserve"> PAGEREF _Toc230451346 \h </w:instrText>
         </w:r>
         <w:r>
           <w:rPr>
@@ -2041,7 +2041,7 @@
             <w:noProof/>
             <w:webHidden/>
           </w:rPr>
-          <w:t>12</w:t>
+          <w:t>13</w:t>
         </w:r>
         <w:r>
           <w:rPr>
@@ -2067,7 +2067,7 @@
           <w14:ligatures w14:val="standardContextual"/>
         </w:rPr>
       </w:pPr>
-      <w:hyperlink w:anchor="_Toc230449220" w:history="1">
+      <w:hyperlink w:anchor="_Toc230451347" w:history="1">
         <w:r>
           <w:rPr>
             <w:rStyle w:val="Hyperlink"/>
@@ -2094,7 +2094,7 @@
             <w:noProof/>
             <w:webHidden/>
           </w:rPr>
-          <w:instrText xml:space="preserve"> PAGEREF _Toc230449220 \h </w:instrText>
+          <w:instrText xml:space="preserve"> PAGEREF _Toc230451347 \h </w:instrText>
         </w:r>
         <w:r>
           <w:rPr>
@@ -2114,7 +2114,7 @@
             <w:noProof/>
             <w:webHidden/>
           </w:rPr>
-          <w:t>12</w:t>
+          <w:t>13</w:t>
         </w:r>
         <w:r>
           <w:rPr>
@@ -2140,7 +2140,7 @@
           <w14:ligatures w14:val="standardContextual"/>
         </w:rPr>
       </w:pPr>
-      <w:hyperlink w:anchor="_Toc230449221" w:history="1">
+      <w:hyperlink w:anchor="_Toc230451348" w:history="1">
         <w:r>
           <w:rPr>
             <w:rStyle w:val="Hyperlink"/>
@@ -2167,7 +2167,7 @@
             <w:noProof/>
             <w:webHidden/>
           </w:rPr>
-          <w:instrText xml:space="preserve"> PAGEREF _Toc230449221 \h </w:instrText>
+          <w:instrText xml:space="preserve"> PAGEREF _Toc230451348 \h </w:instrText>
         </w:r>
         <w:r>
           <w:rPr>
@@ -2213,7 +2213,7 @@
           <w14:ligatures w14:val="standardContextual"/>
         </w:rPr>
       </w:pPr>
-      <w:hyperlink w:anchor="_Toc230449222" w:history="1">
+      <w:hyperlink w:anchor="_Toc230451349" w:history="1">
         <w:r>
           <w:rPr>
             <w:rStyle w:val="Hyperlink"/>
@@ -2240,7 +2240,7 @@
             <w:noProof/>
             <w:webHidden/>
           </w:rPr>
-          <w:instrText xml:space="preserve"> PAGEREF _Toc230449222 \h </w:instrText>
+          <w:instrText xml:space="preserve"> PAGEREF _Toc230451349 \h </w:instrText>
         </w:r>
         <w:r>
           <w:rPr>
@@ -2286,7 +2286,7 @@
           <w14:ligatures w14:val="standardContextual"/>
         </w:rPr>
       </w:pPr>
-      <w:hyperlink w:anchor="_Toc230449223" w:history="1">
+      <w:hyperlink w:anchor="_Toc230451350" w:history="1">
         <w:r>
           <w:rPr>
             <w:rStyle w:val="Hyperlink"/>
@@ -2313,7 +2313,7 @@
             <w:noProof/>
             <w:webHidden/>
           </w:rPr>
-          <w:instrText xml:space="preserve"> PAGEREF _Toc230449223 \h </w:instrText>
+          <w:instrText xml:space="preserve"> PAGEREF _Toc230451350 \h </w:instrText>
         </w:r>
         <w:r>
           <w:rPr>
@@ -2359,7 +2359,7 @@
           <w14:ligatures w14:val="standardContextual"/>
         </w:rPr>
       </w:pPr>
-      <w:hyperlink w:anchor="_Toc230449224" w:history="1">
+      <w:hyperlink w:anchor="_Toc230451351" w:history="1">
         <w:r>
           <w:rPr>
             <w:rStyle w:val="Hyperlink"/>
@@ -2386,7 +2386,7 @@
             <w:noProof/>
             <w:webHidden/>
           </w:rPr>
-          <w:instrText xml:space="preserve"> PAGEREF _Toc230449224 \h </w:instrText>
+          <w:instrText xml:space="preserve"> PAGEREF _Toc230451351 \h </w:instrText>
         </w:r>
         <w:r>
           <w:rPr>
@@ -2406,7 +2406,7 @@
             <w:noProof/>
             <w:webHidden/>
           </w:rPr>
-          <w:t>13</w:t>
+          <w:t>14</w:t>
         </w:r>
         <w:r>
           <w:rPr>
@@ -2432,7 +2432,7 @@
           <w14:ligatures w14:val="standardContextual"/>
         </w:rPr>
       </w:pPr>
-      <w:hyperlink w:anchor="_Toc230449225" w:history="1">
+      <w:hyperlink w:anchor="_Toc230451352" w:history="1">
         <w:r>
           <w:rPr>
             <w:rStyle w:val="Hyperlink"/>
@@ -2459,7 +2459,7 @@
             <w:noProof/>
             <w:webHidden/>
           </w:rPr>
-          <w:instrText xml:space="preserve"> PAGEREF _Toc230449225 \h </w:instrText>
+          <w:instrText xml:space="preserve"> PAGEREF _Toc230451352 \h </w:instrText>
         </w:r>
         <w:r>
           <w:rPr>
@@ -2479,7 +2479,7 @@
             <w:noProof/>
             <w:webHidden/>
           </w:rPr>
-          <w:t>13</w:t>
+          <w:t>14</w:t>
         </w:r>
         <w:r>
           <w:rPr>
@@ -2505,7 +2505,7 @@
           <w14:ligatures w14:val="standardContextual"/>
         </w:rPr>
       </w:pPr>
-      <w:hyperlink w:anchor="_Toc230449226" w:history="1">
+      <w:hyperlink w:anchor="_Toc230451353" w:history="1">
         <w:r>
           <w:rPr>
             <w:rStyle w:val="Hyperlink"/>
@@ -2532,7 +2532,7 @@
             <w:noProof/>
             <w:webHidden/>
           </w:rPr>
-          <w:instrText xml:space="preserve"> PAGEREF _Toc230449226 \h </w:instrText>
+          <w:instrText xml:space="preserve"> PAGEREF _Toc230451353 \h </w:instrText>
         </w:r>
         <w:r>
           <w:rPr>
@@ -2552,7 +2552,7 @@
             <w:noProof/>
             <w:webHidden/>
           </w:rPr>
-          <w:t>14</w:t>
+          <w:t>15</w:t>
         </w:r>
         <w:r>
           <w:rPr>
@@ -2578,7 +2578,7 @@
           <w14:ligatures w14:val="standardContextual"/>
         </w:rPr>
       </w:pPr>
-      <w:hyperlink w:anchor="_Toc230449227" w:history="1">
+      <w:hyperlink w:anchor="_Toc230451354" w:history="1">
         <w:r>
           <w:rPr>
             <w:rStyle w:val="Hyperlink"/>
@@ -2605,7 +2605,7 @@
             <w:noProof/>
             <w:webHidden/>
           </w:rPr>
-          <w:instrText xml:space="preserve"> PAGEREF _Toc230449227 \h </w:instrText>
+          <w:instrText xml:space="preserve"> PAGEREF _Toc230451354 \h </w:instrText>
         </w:r>
         <w:r>
           <w:rPr>
@@ -2651,7 +2651,7 @@
           <w14:ligatures w14:val="standardContextual"/>
         </w:rPr>
       </w:pPr>
-      <w:hyperlink w:anchor="_Toc230449228" w:history="1">
+      <w:hyperlink w:anchor="_Toc230451355" w:history="1">
         <w:r>
           <w:rPr>
             <w:rStyle w:val="Hyperlink"/>
@@ -2678,7 +2678,7 @@
             <w:noProof/>
             <w:webHidden/>
           </w:rPr>
-          <w:instrText xml:space="preserve"> PAGEREF _Toc230449228 \h </w:instrText>
+          <w:instrText xml:space="preserve"> PAGEREF _Toc230451355 \h </w:instrText>
         </w:r>
         <w:r>
           <w:rPr>
@@ -2724,7 +2724,7 @@
           <w14:ligatures w14:val="standardContextual"/>
         </w:rPr>
       </w:pPr>
-      <w:hyperlink w:anchor="_Toc230449229" w:history="1">
+      <w:hyperlink w:anchor="_Toc230451356" w:history="1">
         <w:r>
           <w:rPr>
             <w:rStyle w:val="Hyperlink"/>
@@ -2751,7 +2751,7 @@
             <w:noProof/>
             <w:webHidden/>
           </w:rPr>
-          <w:instrText xml:space="preserve"> PAGEREF _Toc230449229 \h </w:instrText>
+          <w:instrText xml:space="preserve"> PAGEREF _Toc230451356 \h </w:instrText>
         </w:r>
         <w:r>
           <w:rPr>
@@ -2771,7 +2771,7 @@
             <w:noProof/>
             <w:webHidden/>
           </w:rPr>
-          <w:t>15</w:t>
+          <w:t>16</w:t>
         </w:r>
         <w:r>
           <w:rPr>
@@ -2797,7 +2797,7 @@
           <w14:ligatures w14:val="standardContextual"/>
         </w:rPr>
       </w:pPr>
-      <w:hyperlink w:anchor="_Toc230449230" w:history="1">
+      <w:hyperlink w:anchor="_Toc230451357" w:history="1">
         <w:r>
           <w:rPr>
             <w:rStyle w:val="Hyperlink"/>
@@ -2824,7 +2824,7 @@
             <w:noProof/>
             <w:webHidden/>
           </w:rPr>
-          <w:instrText xml:space="preserve"> PAGEREF _Toc230449230 \h </w:instrText>
+          <w:instrText xml:space="preserve"> PAGEREF _Toc230451357 \h </w:instrText>
         </w:r>
         <w:r>
           <w:rPr>
@@ -2870,7 +2870,7 @@
           <w14:ligatures w14:val="standardContextual"/>
         </w:rPr>
       </w:pPr>
-      <w:hyperlink w:anchor="_Toc230449231" w:history="1">
+      <w:hyperlink w:anchor="_Toc230451358" w:history="1">
         <w:r>
           <w:rPr>
             <w:rStyle w:val="Hyperlink"/>
@@ -2897,7 +2897,7 @@
             <w:noProof/>
             <w:webHidden/>
           </w:rPr>
-          <w:instrText xml:space="preserve"> PAGEREF _Toc230449231 \h </w:instrText>
+          <w:instrText xml:space="preserve"> PAGEREF _Toc230451358 \h </w:instrText>
         </w:r>
         <w:r>
           <w:rPr>
@@ -2917,7 +2917,7 @@
             <w:noProof/>
             <w:webHidden/>
           </w:rPr>
-          <w:t>16</w:t>
+          <w:t>17</w:t>
         </w:r>
         <w:r>
           <w:rPr>
@@ -2943,7 +2943,7 @@
           <w14:ligatures w14:val="standardContextual"/>
         </w:rPr>
       </w:pPr>
-      <w:hyperlink w:anchor="_Toc230449232" w:history="1">
+      <w:hyperlink w:anchor="_Toc230451359" w:history="1">
         <w:r>
           <w:rPr>
             <w:rStyle w:val="Hyperlink"/>
@@ -2970,7 +2970,7 @@
             <w:noProof/>
             <w:webHidden/>
           </w:rPr>
-          <w:instrText xml:space="preserve"> PAGEREF _Toc230449232 \h </w:instrText>
+          <w:instrText xml:space="preserve"> PAGEREF _Toc230451359 \h </w:instrText>
         </w:r>
         <w:r>
           <w:rPr>
@@ -3016,7 +3016,7 @@
           <w14:ligatures w14:val="standardContextual"/>
         </w:rPr>
       </w:pPr>
-      <w:hyperlink w:anchor="_Toc230449233" w:history="1">
+      <w:hyperlink w:anchor="_Toc230451360" w:history="1">
         <w:r>
           <w:rPr>
             <w:rStyle w:val="Hyperlink"/>
@@ -3043,7 +3043,7 @@
             <w:noProof/>
             <w:webHidden/>
           </w:rPr>
-          <w:instrText xml:space="preserve"> PAGEREF _Toc230449233 \h </w:instrText>
+          <w:instrText xml:space="preserve"> PAGEREF _Toc230451360 \h </w:instrText>
         </w:r>
         <w:r>
           <w:rPr>
@@ -3063,7 +3063,7 @@
             <w:noProof/>
             <w:webHidden/>
           </w:rPr>
-          <w:t>17</w:t>
+          <w:t>18</w:t>
         </w:r>
         <w:r>
           <w:rPr>
@@ -3089,7 +3089,7 @@
           <w14:ligatures w14:val="standardContextual"/>
         </w:rPr>
       </w:pPr>
-      <w:hyperlink w:anchor="_Toc230449234" w:history="1">
+      <w:hyperlink w:anchor="_Toc230451361" w:history="1">
         <w:r>
           <w:rPr>
             <w:rStyle w:val="Hyperlink"/>
@@ -3116,7 +3116,7 @@
             <w:noProof/>
             <w:webHidden/>
           </w:rPr>
-          <w:instrText xml:space="preserve"> PAGEREF _Toc230449234 \h </w:instrText>
+          <w:instrText xml:space="preserve"> PAGEREF _Toc230451361 \h </w:instrText>
         </w:r>
         <w:r>
           <w:rPr>
@@ -3136,7 +3136,7 @@
             <w:noProof/>
             <w:webHidden/>
           </w:rPr>
-          <w:t>17</w:t>
+          <w:t>18</w:t>
         </w:r>
         <w:r>
           <w:rPr>
@@ -3162,7 +3162,7 @@
           <w14:ligatures w14:val="standardContextual"/>
         </w:rPr>
       </w:pPr>
-      <w:hyperlink w:anchor="_Toc230449235" w:history="1">
+      <w:hyperlink w:anchor="_Toc230451362" w:history="1">
         <w:r>
           <w:rPr>
             <w:rStyle w:val="Hyperlink"/>
@@ -3189,7 +3189,7 @@
             <w:noProof/>
             <w:webHidden/>
           </w:rPr>
-          <w:instrText xml:space="preserve"> PAGEREF _Toc230449235 \h </w:instrText>
+          <w:instrText xml:space="preserve"> PAGEREF _Toc230451362 \h </w:instrText>
         </w:r>
         <w:r>
           <w:rPr>
@@ -3209,7 +3209,7 @@
             <w:noProof/>
             <w:webHidden/>
           </w:rPr>
-          <w:t>17</w:t>
+          <w:t>18</w:t>
         </w:r>
         <w:r>
           <w:rPr>
@@ -3235,7 +3235,7 @@
         <w:pStyle w:val="Heading1"/>
         <w:shd w:val="clear" w:color="auto" w:fill="156082"/>
       </w:pPr>
-      <w:bookmarkStart w:id="1" w:name="_Toc230449195"/>
+      <w:bookmarkStart w:id="1" w:name="_Toc230451322"/>
       <w:r>
         <w:lastRenderedPageBreak/>
         <w:t xml:space="preserve">DSES Spectrum Analyzer — </w:t>
@@ -3314,7 +3314,7 @@
       <w:pPr>
         <w:pStyle w:val="Heading2"/>
       </w:pPr>
-      <w:bookmarkStart w:id="2" w:name="_Toc230449196"/>
+      <w:bookmarkStart w:id="2" w:name="_Toc230451323"/>
       <w:r>
         <w:t>1. What the recipient needs to know first</w:t>
       </w:r>
@@ -3348,7 +3348,50 @@
         <w:t>Install Radioconda</w:t>
       </w:r>
       <w:r>
-        <w:t xml:space="preserve"> (one-time). Radioconda is a curated conda distribution that bundles GNU Radio, UHD, SoapySDR, and the surrounding scientific Python stack for software-defined radio. We require version 4.8 or newer (it ships with UHD ≥ 4.8). Download: &lt;https://github.com/ryanvolz/radioconda/releases&gt;. (§2)</w:t>
+        <w:t xml:space="preserve"> (one-time). Radioconda is a curated conda distribution that bundles GNU Radio, UHD, SoapySDR, and the surrounding scientific Python stack for software-defined radio. Use a current build — releases are date-stamped (e.g. </w:t>
+      </w:r>
+      <w:r>
+        <w:rPr>
+          <w:rFonts w:ascii="Consolas" w:hAnsi="Consolas"/>
+          <w:sz w:val="20"/>
+        </w:rPr>
+        <w:t>2025.03.14</w:t>
+      </w:r>
+      <w:r>
+        <w:t>) and any recent one ships UHD ≥ 4.8, which the B210 needs. Download from the releases page:</w:t>
+      </w:r>
+    </w:p>
+    <w:p>
+      <w:pPr>
+        <w:pStyle w:val="ListBullet"/>
+      </w:pPr>
+      <w:r>
+        <w:rPr>
+          <w:b/>
+        </w:rPr>
+        <w:t>Primary:</w:t>
+      </w:r>
+      <w:r>
+        <w:t xml:space="preserve"> &lt;https://github.com/radioconda/radioconda-installer/releases&gt;</w:t>
+      </w:r>
+    </w:p>
+    <w:p>
+      <w:pPr>
+        <w:pStyle w:val="ListBullet"/>
+      </w:pPr>
+      <w:r>
+        <w:rPr>
+          <w:b/>
+        </w:rPr>
+        <w:t>Backup:</w:t>
+      </w:r>
+      <w:r>
+        <w:t xml:space="preserve"> &lt;https://github.com/ryanvolz/radioconda/releases&gt; (redirects to the primary)</w:t>
+      </w:r>
+    </w:p>
+    <w:p>
+      <w:r>
+        <w:t>Per-OS file names and steps are in §2 below. (§2)</w:t>
       </w:r>
     </w:p>
     <w:p>
@@ -3388,7 +3431,7 @@
       <w:pPr>
         <w:pStyle w:val="Heading3"/>
       </w:pPr>
-      <w:bookmarkStart w:id="3" w:name="_Toc230449197"/>
+      <w:bookmarkStart w:id="3" w:name="_Toc230451324"/>
       <w:r>
         <w:t>System requirements</w:t>
       </w:r>
@@ -3473,6 +3516,7 @@
           </w:tcPr>
           <w:p>
             <w:r>
+              <w:lastRenderedPageBreak/>
               <w:t>CPU</w:t>
             </w:r>
           </w:p>
@@ -3553,10 +3597,10 @@
               <w:cnfStyle w:val="000000010000" w:firstRow="0" w:lastRow="0" w:firstColumn="0" w:lastColumn="0" w:oddVBand="0" w:evenVBand="0" w:oddHBand="0" w:evenHBand="1" w:firstRowFirstColumn="0" w:firstRowLastColumn="0" w:lastRowFirstColumn="0" w:lastRowLastColumn="0"/>
             </w:pPr>
             <w:r>
-              <w:t>One</w:t>
+              <w:t xml:space="preserve">One USB 3.0 port (5 </w:t>
             </w:r>
             <w:r>
-              <w:t xml:space="preserve"> USB 3.0 port (5 Gbps) for the B210</w:t>
+              <w:t>Gbps) for the B210</w:t>
             </w:r>
           </w:p>
         </w:tc>
@@ -3594,11 +3638,7 @@
               <w:t>or</w:t>
             </w:r>
             <w:r>
-              <w:t xml:space="preserve"> any SoapySDR-supported receiver (SDRPlay RSPx, RTL-SDR, HackRF, Airspy, BladeRF, LimeSDR, PlutoSDR). With one radio </w:t>
-            </w:r>
-            <w:r>
-              <w:lastRenderedPageBreak/>
-              <w:t>attached the app uses it silently; with several, a picker appears. See §8 for details.</w:t>
+              <w:t xml:space="preserve"> any SoapySDR-supported receiver (SDRPlay RSPx, RTL-SDR, HackRF, Airspy, BladeRF, LimeSDR, PlutoSDR). With one radio attached the app uses it silently; with several, a picker appears. See §8 for details.</w:t>
             </w:r>
           </w:p>
         </w:tc>
@@ -3614,7 +3654,6 @@
           </w:tcPr>
           <w:p>
             <w:r>
-              <w:lastRenderedPageBreak/>
               <w:t>Disk</w:t>
             </w:r>
           </w:p>
@@ -3667,7 +3706,7 @@
       <w:pPr>
         <w:pStyle w:val="Heading2"/>
       </w:pPr>
-      <w:bookmarkStart w:id="4" w:name="_Toc230449198"/>
+      <w:bookmarkStart w:id="4" w:name="_Toc230451325"/>
       <w:r>
         <w:t>2. Installing Radioconda</w:t>
       </w:r>
@@ -3677,7 +3716,7 @@
       <w:pPr>
         <w:pStyle w:val="Heading3"/>
       </w:pPr>
-      <w:bookmarkStart w:id="5" w:name="_Toc230449199"/>
+      <w:bookmarkStart w:id="5" w:name="_Toc230451326"/>
       <w:r>
         <w:t>2.1 Windows 11</w:t>
       </w:r>
@@ -3688,94 +3727,117 @@
         <w:pStyle w:val="ListNumber"/>
       </w:pPr>
       <w:r>
-        <w:t xml:space="preserve">Download </w:t>
+        <w:t xml:space="preserve">Download the Windows installer — the asset named </w:t>
+      </w:r>
+      <w:r>
+        <w:rPr>
+          <w:b/>
+        </w:rPr>
+        <w:t>`radioconda-&lt;version&gt;-Windows-x86_64.exe`</w:t>
+      </w:r>
+      <w:r>
+        <w:t xml:space="preserve"> (e.g. </w:t>
       </w:r>
       <w:r>
         <w:rPr>
           <w:rFonts w:ascii="Consolas" w:hAnsi="Consolas"/>
           <w:sz w:val="20"/>
         </w:rPr>
-        <w:t>radioconda-Windows-x86_64.exe</w:t>
-      </w:r>
-      <w:r>
-        <w:t xml:space="preserve"> from the Radioconda releases page.</w:t>
-      </w:r>
-    </w:p>
-    <w:p>
-      <w:pPr>
-        <w:pStyle w:val="ListNumber"/>
-      </w:pPr>
-      <w:r>
-        <w:t xml:space="preserve">Double-click the installer. Accept defaults; the installer offers to put Radioconda under </w:t>
+        <w:t>radioconda-2025.03.14-Windows-x86_64.exe</w:t>
+      </w:r>
+      <w:r>
+        <w:t xml:space="preserve">) — from the Radioconda releases page. Pick the newest release and grab the </w:t>
       </w:r>
       <w:r>
         <w:rPr>
           <w:rFonts w:ascii="Consolas" w:hAnsi="Consolas"/>
           <w:sz w:val="20"/>
         </w:rPr>
-        <w:t>C:\ProgramData\radioconda</w:t>
-      </w:r>
-      <w:r>
-        <w:t xml:space="preserve"> (system-wide) or </w:t>
+        <w:t>…-Windows-x86_64.exe</w:t>
+      </w:r>
+      <w:r>
+        <w:t xml:space="preserve"> file.</w:t>
+      </w:r>
+    </w:p>
+    <w:p>
+      <w:pPr>
+        <w:pStyle w:val="ListBullet"/>
+      </w:pPr>
+      <w:r>
+        <w:rPr>
+          <w:b/>
+        </w:rPr>
+        <w:t>Primary:</w:t>
+      </w:r>
+      <w:r>
+        <w:t xml:space="preserve"> &lt;https://github.com/radioconda/radioconda-installer/releases&gt;</w:t>
+      </w:r>
+    </w:p>
+    <w:p>
+      <w:pPr>
+        <w:pStyle w:val="ListBullet"/>
+      </w:pPr>
+      <w:r>
+        <w:rPr>
+          <w:b/>
+        </w:rPr>
+        <w:t>Backup:</w:t>
+      </w:r>
+      <w:r>
+        <w:t xml:space="preserve"> &lt;https://github.com/ryanvolz/radioconda/releases&gt; (redirects to the primary)</w:t>
+      </w:r>
+    </w:p>
+    <w:p>
+      <w:pPr>
+        <w:pStyle w:val="ListNumber"/>
+      </w:pPr>
+      <w:r>
+        <w:t xml:space="preserve">Double-click the installer. Accept defaults; the installer offers to put Radioconda under </w:t>
       </w:r>
       <w:r>
         <w:rPr>
           <w:rFonts w:ascii="Consolas" w:hAnsi="Consolas"/>
           <w:sz w:val="20"/>
         </w:rPr>
-        <w:t>%LOCALAPPDATA%\radioconda</w:t>
-      </w:r>
-      <w:r>
-        <w:t xml:space="preserve"> (per-user). Either works; the app’s launcher checks both.</w:t>
-      </w:r>
-    </w:p>
-    <w:p>
-      <w:pPr>
-        <w:pStyle w:val="ListNumber"/>
-      </w:pPr>
-      <w:r>
-        <w:t>If you have a radio, plug it into a USB 3 port. A B210 silently installs its UHD driver from Radioconda the first time it’s connected (no prompt).</w:t>
-      </w:r>
-    </w:p>
-    <w:p>
-      <w:pPr>
-        <w:pStyle w:val="ListNumber"/>
-      </w:pPr>
-      <w:r>
-        <w:t xml:space="preserve">(Optional) Confirm your radio is detected — open the </w:t>
-      </w:r>
-      <w:r>
-        <w:rPr>
-          <w:b/>
-        </w:rPr>
-        <w:t>Anaconda Prompt (Radioconda)</w:t>
-      </w:r>
-      <w:r>
-        <w:t xml:space="preserve"> shortcut from the Start menu and run the command for your device:</w:t>
-      </w:r>
-    </w:p>
-    <w:p>
-      <w:pPr>
-        <w:pStyle w:val="ListBullet"/>
-      </w:pPr>
-      <w:r>
-        <w:rPr>
-          <w:b/>
-        </w:rPr>
-        <w:t>B210 / USRP:</w:t>
-      </w:r>
-      <w:r>
-        <w:t xml:space="preserve"> </w:t>
+        <w:t>C:\ProgramData\radioconda</w:t>
+      </w:r>
+      <w:r>
+        <w:t xml:space="preserve"> (system-wide) or </w:t>
       </w:r>
       <w:r>
         <w:rPr>
           <w:rFonts w:ascii="Consolas" w:hAnsi="Consolas"/>
           <w:sz w:val="20"/>
         </w:rPr>
-        <w:t>uhd_find_devices</w:t>
-      </w:r>
-      <w:r>
-        <w:t xml:space="preserve"> — lists the unit with its own serial number.</w:t>
+        <w:t>%LOCALAPPDATA%\radioconda</w:t>
+      </w:r>
+      <w:r>
+        <w:t xml:space="preserve"> (per-user). Either works; the app’s launcher checks both.</w:t>
+      </w:r>
+    </w:p>
+    <w:p>
+      <w:pPr>
+        <w:pStyle w:val="ListNumber"/>
+      </w:pPr>
+      <w:r>
+        <w:t>If you have a radio, plug it into a USB 3 port. A B210 silently installs its UHD driver from Radioconda the first time it’s connected (no prompt).</w:t>
+      </w:r>
+    </w:p>
+    <w:p>
+      <w:pPr>
+        <w:pStyle w:val="ListNumber"/>
+      </w:pPr>
+      <w:r>
+        <w:t xml:space="preserve">(Optional) Confirm your radio is detected — open the </w:t>
+      </w:r>
+      <w:r>
+        <w:rPr>
+          <w:b/>
+        </w:rPr>
+        <w:t>Anaconda Prompt (Radioconda)</w:t>
+      </w:r>
+      <w:r>
+        <w:t xml:space="preserve"> shortcut from the Start menu and run the command for your device:</w:t>
       </w:r>
     </w:p>
     <w:p>
@@ -3786,7 +3848,7 @@
         <w:rPr>
           <w:b/>
         </w:rPr>
-        <w:t>RTL-SDR, HackRF, Airspy, BladeRF, LimeSDR, PlutoSDR:</w:t>
+        <w:t>B210 / USRP:</w:t>
       </w:r>
       <w:r>
         <w:t xml:space="preserve"> </w:t>
@@ -3796,10 +3858,10 @@
           <w:rFonts w:ascii="Consolas" w:hAnsi="Consolas"/>
           <w:sz w:val="20"/>
         </w:rPr>
-        <w:t>SoapySDRUtil --find</w:t>
-      </w:r>
-      <w:r>
-        <w:t xml:space="preserve"> — lists the device under its driver name.</w:t>
+        <w:t>uhd_find_devices</w:t>
+      </w:r>
+      <w:r>
+        <w:t xml:space="preserve"> — lists the unit with its own serial number.</w:t>
       </w:r>
     </w:p>
     <w:p>
@@ -3810,10 +3872,10 @@
         <w:rPr>
           <w:b/>
         </w:rPr>
-        <w:t>SDRPlay (RSPx):</w:t>
-      </w:r>
-      <w:r>
-        <w:t xml:space="preserve"> do §3A first, then </w:t>
+        <w:t>RTL-SDR, HackRF, Airspy, BladeRF, LimeSDR, PlutoSDR:</w:t>
+      </w:r>
+      <w:r>
+        <w:t xml:space="preserve"> </w:t>
       </w:r>
       <w:r>
         <w:rPr>
@@ -3823,67 +3885,157 @@
         <w:t>SoapySDRUtil --find</w:t>
       </w:r>
       <w:r>
-        <w:t xml:space="preserve"> shows it as </w:t>
+        <w:t xml:space="preserve"> — lists the device under its driver name.</w:t>
+      </w:r>
+    </w:p>
+    <w:p>
+      <w:pPr>
+        <w:pStyle w:val="ListBullet"/>
+      </w:pPr>
+      <w:r>
+        <w:rPr>
+          <w:b/>
+        </w:rPr>
+        <w:t>SDRPlay (RSPx):</w:t>
+      </w:r>
+      <w:r>
+        <w:t xml:space="preserve"> do §3A first, then </w:t>
       </w:r>
       <w:r>
         <w:rPr>
           <w:rFonts w:ascii="Consolas" w:hAnsi="Consolas"/>
           <w:sz w:val="20"/>
         </w:rPr>
-        <w:t>driver = sdrplay</w:t>
-      </w:r>
-      <w:r>
-        <w:t>.</w:t>
-      </w:r>
-    </w:p>
-    <w:p>
-      <w:pPr>
-        <w:pStyle w:val="ListBullet"/>
-      </w:pPr>
-      <w:r>
-        <w:rPr>
-          <w:b/>
-        </w:rPr>
-        <w:t>No radio yet:</w:t>
-      </w:r>
-      <w:r>
-        <w:t xml:space="preserve"> skip this — the app starts in playback mode using the bundled sample file (see §8), which is ideal for training.</w:t>
-      </w:r>
-    </w:p>
-    <w:p>
-      <w:pPr>
-        <w:pStyle w:val="Heading3"/>
-      </w:pPr>
-      <w:bookmarkStart w:id="6" w:name="_Toc230449200"/>
-      <w:r>
-        <w:t>2.2 Linux</w:t>
-      </w:r>
-      <w:bookmarkEnd w:id="6"/>
-    </w:p>
-    <w:p>
-      <w:pPr>
-        <w:pStyle w:val="ListNumber"/>
-      </w:pPr>
-      <w:r>
-        <w:t xml:space="preserve">Download </w:t>
+        <w:t>SoapySDRUtil --find</w:t>
+      </w:r>
+      <w:r>
+        <w:t xml:space="preserve"> shows it as </w:t>
       </w:r>
       <w:r>
         <w:rPr>
           <w:rFonts w:ascii="Consolas" w:hAnsi="Consolas"/>
           <w:sz w:val="20"/>
         </w:rPr>
-        <w:t>radioconda-Linux-x86_64.sh</w:t>
-      </w:r>
-      <w:r>
-        <w:t xml:space="preserve"> from the releases page.</w:t>
-      </w:r>
+        <w:t>driver = sdrplay</w:t>
+      </w:r>
+      <w:r>
+        <w:t>.</w:t>
+      </w:r>
+    </w:p>
+    <w:p>
+      <w:pPr>
+        <w:pStyle w:val="ListBullet"/>
+      </w:pPr>
+      <w:r>
+        <w:rPr>
+          <w:b/>
+        </w:rPr>
+        <w:t>No radio yet:</w:t>
+      </w:r>
+      <w:r>
+        <w:t xml:space="preserve"> skip this — the app starts in playback mode using the bundled sample file (see §8), which is ideal for training.</w:t>
+      </w:r>
+    </w:p>
+    <w:p>
+      <w:pPr>
+        <w:pStyle w:val="Heading3"/>
+      </w:pPr>
+      <w:bookmarkStart w:id="6" w:name="_Toc230451327"/>
+      <w:r>
+        <w:t>2.2 Linux</w:t>
+      </w:r>
+      <w:bookmarkEnd w:id="6"/>
     </w:p>
     <w:p>
       <w:pPr>
         <w:pStyle w:val="ListNumber"/>
       </w:pPr>
       <w:r>
-        <w:t>From a terminal:</w:t>
+        <w:t xml:space="preserve">Download the Linux installer — the asset named </w:t>
+      </w:r>
+      <w:r>
+        <w:rPr>
+          <w:b/>
+        </w:rPr>
+        <w:t>`radioconda-&lt;version&gt;-Linux-x86_64.sh`</w:t>
+      </w:r>
+      <w:r>
+        <w:t xml:space="preserve"> (e.g. </w:t>
+      </w:r>
+      <w:r>
+        <w:rPr>
+          <w:rFonts w:ascii="Consolas" w:hAnsi="Consolas"/>
+          <w:sz w:val="20"/>
+        </w:rPr>
+        <w:t>radioconda-2025.03.14-Linux-x86_64.sh</w:t>
+      </w:r>
+      <w:r>
+        <w:t>) — from the releases page:</w:t>
+      </w:r>
+    </w:p>
+    <w:p>
+      <w:pPr>
+        <w:pStyle w:val="ListBullet"/>
+      </w:pPr>
+      <w:r>
+        <w:rPr>
+          <w:b/>
+        </w:rPr>
+        <w:t>Primary:</w:t>
+      </w:r>
+      <w:r>
+        <w:t xml:space="preserve"> &lt;https://github.com/radioconda/radioconda-installer/releases&gt;</w:t>
+      </w:r>
+    </w:p>
+    <w:p>
+      <w:pPr>
+        <w:pStyle w:val="ListBullet"/>
+      </w:pPr>
+      <w:r>
+        <w:rPr>
+          <w:b/>
+        </w:rPr>
+        <w:t>Backup:</w:t>
+      </w:r>
+      <w:r>
+        <w:t xml:space="preserve"> &lt;https://github.com/ryanvolz/radioconda/releases&gt; (redirects to the primary)</w:t>
+      </w:r>
+    </w:p>
+    <w:p>
+      <w:r>
+        <w:lastRenderedPageBreak/>
+        <w:t xml:space="preserve">(ARM and POWER builds — </w:t>
+      </w:r>
+      <w:r>
+        <w:rPr>
+          <w:rFonts w:ascii="Consolas" w:hAnsi="Consolas"/>
+          <w:sz w:val="20"/>
+        </w:rPr>
+        <w:t>…-Linux-aarch64.sh</w:t>
+      </w:r>
+      <w:r>
+        <w:t xml:space="preserve">, </w:t>
+      </w:r>
+      <w:r>
+        <w:rPr>
+          <w:rFonts w:ascii="Consolas" w:hAnsi="Consolas"/>
+          <w:sz w:val="20"/>
+        </w:rPr>
+        <w:t>…-Linux-ppc64le.sh</w:t>
+      </w:r>
+      <w:r>
+        <w:t xml:space="preserve"> — are published too if you’re on one of those.)</w:t>
+      </w:r>
+    </w:p>
+    <w:p>
+      <w:pPr>
+        <w:pStyle w:val="ListNumber"/>
+      </w:pPr>
+      <w:r>
+        <w:t xml:space="preserve">From a terminal, run the file you downloaded (substitute the </w:t>
+      </w:r>
+      <w:r>
+        <w:t>real version):</w:t>
       </w:r>
     </w:p>
     <w:tbl>
@@ -3906,7 +4058,7 @@
                 <w:rFonts w:ascii="Consolas" w:hAnsi="Consolas"/>
                 <w:sz w:val="18"/>
               </w:rPr>
-              <w:t xml:space="preserve">   bash radioconda-Linux-x86_64.sh</w:t>
+              <w:t xml:space="preserve">   bash radioconda-&lt;version&gt;-Linux-x86_64.sh</w:t>
             </w:r>
           </w:p>
         </w:tc>
@@ -4003,7 +4155,6 @@
     </w:p>
     <w:p>
       <w:r>
-        <w:lastRenderedPageBreak/>
         <w:t>Other USB SDRs (RTL-SDR, HackRF, Airspy, etc.) have their own udev rules, usually installed with the device’s own package. SDRPlay uses its API service (see §3A) and needs no udev rules.</w:t>
       </w:r>
     </w:p>
@@ -4059,7 +4210,7 @@
       <w:pPr>
         <w:pStyle w:val="Heading3"/>
       </w:pPr>
-      <w:bookmarkStart w:id="7" w:name="_Toc230449201"/>
+      <w:bookmarkStart w:id="7" w:name="_Toc230451328"/>
       <w:r>
         <w:t>2.3 macOS (Intel and Apple Silicon)</w:t>
       </w:r>
@@ -4067,81 +4218,160 @@
     </w:p>
     <w:p>
       <w:r>
-        <w:t>Radioconda publishes builds for both architectures:</w:t>
+        <w:t>Download from the releases page:</w:t>
       </w:r>
     </w:p>
     <w:p>
       <w:pPr>
         <w:pStyle w:val="ListBullet"/>
       </w:pPr>
+      <w:r>
+        <w:rPr>
+          <w:b/>
+        </w:rPr>
+        <w:t>Primary:</w:t>
+      </w:r>
+      <w:r>
+        <w:t xml:space="preserve"> &lt;https://github.com/radioconda/radioconda-installer/releases&gt;</w:t>
+      </w:r>
+    </w:p>
+    <w:p>
+      <w:pPr>
+        <w:pStyle w:val="ListBullet"/>
+      </w:pPr>
+      <w:r>
+        <w:rPr>
+          <w:b/>
+        </w:rPr>
+        <w:t>Backup:</w:t>
+      </w:r>
+      <w:r>
+        <w:t xml:space="preserve"> &lt;https://github.com/ryanvolz/radioconda/releases&gt; (redirects to the primary)</w:t>
+      </w:r>
+    </w:p>
+    <w:p>
+      <w:r>
+        <w:t>Radioconda publishes builds for both Mac architectures — pick the one matching your CPU (</w:t>
+      </w:r>
       <w:r>
         <w:rPr>
           <w:rFonts w:ascii="Consolas" w:hAnsi="Consolas"/>
           <w:sz w:val="20"/>
         </w:rPr>
-        <w:t>radioconda-MacOSX-x86_64.sh</w:t>
-      </w:r>
-      <w:r>
-        <w:t xml:space="preserve"> — Intel Macs.</w:t>
-      </w:r>
-    </w:p>
-    <w:p>
-      <w:pPr>
-        <w:pStyle w:val="ListBullet"/>
-      </w:pPr>
+        <w:t>uname -m</w:t>
+      </w:r>
+      <w:r>
+        <w:t xml:space="preserve"> prints </w:t>
+      </w:r>
       <w:r>
         <w:rPr>
           <w:rFonts w:ascii="Consolas" w:hAnsi="Consolas"/>
           <w:sz w:val="20"/>
         </w:rPr>
-        <w:t>radioconda-MacOSX-arm64.sh</w:t>
-      </w:r>
-      <w:r>
-        <w:t xml:space="preserve"> — Apple Silicon Macs (M1/M2/M3/M4).</w:t>
-      </w:r>
-    </w:p>
-    <w:p>
-      <w:r>
-        <w:t xml:space="preserve">There is </w:t>
-      </w:r>
-      <w:r>
-        <w:rPr>
-          <w:b/>
-        </w:rPr>
-        <w:t>no functional difference</w:t>
-      </w:r>
-      <w:r>
-        <w:t xml:space="preserve"> between the two for our purposes. Pick the file that matches your CPU (</w:t>
+        <w:t>x86_64</w:t>
+      </w:r>
+      <w:r>
+        <w:t xml:space="preserve"> or </w:t>
       </w:r>
       <w:r>
         <w:rPr>
           <w:rFonts w:ascii="Consolas" w:hAnsi="Consolas"/>
           <w:sz w:val="20"/>
         </w:rPr>
-        <w:t>uname -m</w:t>
-      </w:r>
-      <w:r>
-        <w:t xml:space="preserve"> prints </w:t>
+        <w:t>arm64</w:t>
+      </w:r>
+      <w:r>
+        <w:t>):</w:t>
+      </w:r>
+    </w:p>
+    <w:p>
+      <w:pPr>
+        <w:pStyle w:val="ListBullet"/>
+      </w:pPr>
+      <w:r>
+        <w:rPr>
+          <w:b/>
+        </w:rPr>
+        <w:t>Intel:</w:t>
+      </w:r>
+      <w:r>
+        <w:t xml:space="preserve"> </w:t>
       </w:r>
       <w:r>
         <w:rPr>
           <w:rFonts w:ascii="Consolas" w:hAnsi="Consolas"/>
           <w:sz w:val="20"/>
         </w:rPr>
-        <w:t>x86_64</w:t>
-      </w:r>
-      <w:r>
-        <w:t xml:space="preserve"> or </w:t>
+        <w:t>radioconda-&lt;version&gt;-MacOSX-x86_64.sh</w:t>
+      </w:r>
+      <w:r>
+        <w:t xml:space="preserve"> (e.g. </w:t>
       </w:r>
       <w:r>
         <w:rPr>
           <w:rFonts w:ascii="Consolas" w:hAnsi="Consolas"/>
           <w:sz w:val="20"/>
         </w:rPr>
-        <w:t>arm64</w:t>
-      </w:r>
-      <w:r>
-        <w:t>).</w:t>
+        <w:t>radioconda-2025.03.14-MacOSX-x86_64.sh</w:t>
+      </w:r>
+      <w:r>
+        <w:t>)</w:t>
+      </w:r>
+    </w:p>
+    <w:p>
+      <w:pPr>
+        <w:pStyle w:val="ListBullet"/>
+      </w:pPr>
+      <w:r>
+        <w:rPr>
+          <w:b/>
+        </w:rPr>
+        <w:t>Apple Silicon (M1/M2/M3/M4):</w:t>
+      </w:r>
+      <w:r>
+        <w:t xml:space="preserve"> </w:t>
+      </w:r>
+      <w:r>
+        <w:rPr>
+          <w:rFonts w:ascii="Consolas" w:hAnsi="Consolas"/>
+          <w:sz w:val="20"/>
+        </w:rPr>
+        <w:t>radioconda-&lt;version&gt;-MacOSX-arm64.sh</w:t>
+      </w:r>
+    </w:p>
+    <w:p>
+      <w:r>
+        <w:t xml:space="preserve">(Each Mac build also comes as a double-click </w:t>
+      </w:r>
+      <w:r>
+        <w:rPr>
+          <w:rFonts w:ascii="Consolas" w:hAnsi="Consolas"/>
+          <w:sz w:val="20"/>
+        </w:rPr>
+        <w:t>.pkg</w:t>
+      </w:r>
+      <w:r>
+        <w:t xml:space="preserve"> graphical installer — </w:t>
+      </w:r>
+      <w:r>
+        <w:rPr>
+          <w:rFonts w:ascii="Consolas" w:hAnsi="Consolas"/>
+          <w:sz w:val="20"/>
+        </w:rPr>
+        <w:t>…-MacOSX-x86_64.pkg</w:t>
+      </w:r>
+      <w:r>
+        <w:t xml:space="preserve"> / </w:t>
+      </w:r>
+      <w:r>
+        <w:rPr>
+          <w:rFonts w:ascii="Consolas" w:hAnsi="Consolas"/>
+          <w:sz w:val="20"/>
+        </w:rPr>
+        <w:t>…-MacOSX-arm64.pkg</w:t>
+      </w:r>
+      <w:r>
+        <w:t xml:space="preserve"> — if you prefer that over the shell script.)</w:t>
       </w:r>
     </w:p>
     <w:p>
@@ -4149,7 +4379,7 @@
         <w:pStyle w:val="ListNumber"/>
       </w:pPr>
       <w:r>
-        <w:t>From a terminal:</w:t>
+        <w:t>From a terminal, run the file you downloaded (substitute the real version + arch):</w:t>
       </w:r>
     </w:p>
     <w:tbl>
@@ -4172,7 +4402,8 @@
                 <w:rFonts w:ascii="Consolas" w:hAnsi="Consolas"/>
                 <w:sz w:val="18"/>
               </w:rPr>
-              <w:t xml:space="preserve">   bash radioconda-MacOSX-&lt;arch&gt;.sh</w:t>
+              <w:lastRenderedPageBreak/>
+              <w:t xml:space="preserve">   bash radioconda-&lt;version&gt;-MacOSX-&lt;arch&gt;.sh</w:t>
             </w:r>
           </w:p>
         </w:tc>
@@ -4296,9 +4527,12 @@
       <w:pPr>
         <w:pStyle w:val="Heading2"/>
       </w:pPr>
-      <w:bookmarkStart w:id="8" w:name="_Toc230449202"/>
-      <w:r>
-        <w:t>3. Installing the DSES Spectrum Analyzer</w:t>
+      <w:bookmarkStart w:id="8" w:name="_Toc230451329"/>
+      <w:r>
+        <w:t xml:space="preserve">3. Installing the DSES </w:t>
+      </w:r>
+      <w:r>
+        <w:t>Spectrum Analyzer</w:t>
       </w:r>
       <w:bookmarkEnd w:id="8"/>
     </w:p>
@@ -4339,7 +4573,6 @@
         <w:rPr>
           <w:b/>
         </w:rPr>
-        <w:lastRenderedPageBreak/>
         <w:t>This guide (PDF):</w:t>
       </w:r>
       <w:r>
@@ -4365,7 +4598,7 @@
       <w:pPr>
         <w:pStyle w:val="Heading3"/>
       </w:pPr>
-      <w:bookmarkStart w:id="9" w:name="_Toc230449203"/>
+      <w:bookmarkStart w:id="9" w:name="_Toc230451330"/>
       <w:r>
         <w:t>3.1 Windows 11</w:t>
       </w:r>
@@ -4549,6 +4782,7 @@
         <w:pStyle w:val="ListNumber"/>
       </w:pPr>
       <w:r>
+        <w:lastRenderedPageBreak/>
         <w:t xml:space="preserve">(Optional) Create a desktop shortcut (with the app’s pulsar icon) by running </w:t>
       </w:r>
       <w:r>
@@ -4639,7 +4873,7 @@
       <w:pPr>
         <w:pStyle w:val="Heading3"/>
       </w:pPr>
-      <w:bookmarkStart w:id="10" w:name="_Toc230449204"/>
+      <w:bookmarkStart w:id="10" w:name="_Toc230451331"/>
       <w:r>
         <w:t>3.2 Linux</w:t>
       </w:r>
@@ -4736,7 +4970,6 @@
         <w:pStyle w:val="ListNumber"/>
       </w:pPr>
       <w:r>
-        <w:lastRenderedPageBreak/>
         <w:t>(Optional) Install a desktop entry so the app appears in your application menu:</w:t>
       </w:r>
     </w:p>
@@ -4832,7 +5065,7 @@
       <w:pPr>
         <w:pStyle w:val="Heading3"/>
       </w:pPr>
-      <w:bookmarkStart w:id="11" w:name="_Toc230449205"/>
+      <w:bookmarkStart w:id="11" w:name="_Toc230451332"/>
       <w:r>
         <w:t>3.3 macOS</w:t>
       </w:r>
@@ -4890,6 +5123,7 @@
                 <w:rFonts w:ascii="Consolas" w:hAnsi="Consolas"/>
                 <w:sz w:val="18"/>
               </w:rPr>
+              <w:lastRenderedPageBreak/>
               <w:t>./launcher.sh</w:t>
             </w:r>
           </w:p>
@@ -4898,6 +5132,7 @@
     </w:tbl>
     <w:p>
       <w:r>
+        <w:lastRenderedPageBreak/>
         <w:t xml:space="preserve">On Apple Silicon, </w:t>
       </w:r>
       <w:r>
@@ -4985,12 +5220,9 @@
       <w:pPr>
         <w:pStyle w:val="Heading2"/>
       </w:pPr>
-      <w:bookmarkStart w:id="12" w:name="_Toc230449206"/>
-      <w:r>
-        <w:t xml:space="preserve">3A. Extra setup for SDRPlay receivers </w:t>
-      </w:r>
-      <w:r>
-        <w:t>(RSP1A / RSP1B / RSPduo / RSPdx)</w:t>
+      <w:bookmarkStart w:id="12" w:name="_Toc230451333"/>
+      <w:r>
+        <w:t>3A. Extra setup for SDRPlay receivers (RSP1A / RSP1B / RSPduo / RSPdx)</w:t>
       </w:r>
       <w:bookmarkEnd w:id="12"/>
     </w:p>
@@ -5023,7 +5255,7 @@
       <w:pPr>
         <w:pStyle w:val="Heading3"/>
       </w:pPr>
-      <w:bookmarkStart w:id="13" w:name="_Toc230449207"/>
+      <w:bookmarkStart w:id="13" w:name="_Toc230451334"/>
       <w:r>
         <w:t>3A.1 Install the SDRplay API</w:t>
       </w:r>
@@ -5100,7 +5332,6 @@
         <w:rPr>
           <w:b/>
         </w:rPr>
-        <w:lastRenderedPageBreak/>
         <w:t>macOS:</w:t>
       </w:r>
       <w:r>
@@ -5136,7 +5367,7 @@
       <w:pPr>
         <w:pStyle w:val="Heading3"/>
       </w:pPr>
-      <w:bookmarkStart w:id="14" w:name="_Toc230449208"/>
+      <w:bookmarkStart w:id="14" w:name="_Toc230451335"/>
       <w:r>
         <w:t>3A.2 Install the SoapySDRPlay module</w:t>
       </w:r>
@@ -5231,7 +5462,14 @@
                 <w:rFonts w:ascii="Consolas" w:hAnsi="Consolas"/>
                 <w:sz w:val="18"/>
               </w:rPr>
-              <w:t>Copy-Item ".\sdrplay\sdrPlaySupport.dll" `</w:t>
+              <w:t xml:space="preserve">Copy-Item </w:t>
+            </w:r>
+            <w:r>
+              <w:rPr>
+                <w:rFonts w:ascii="Consolas" w:hAnsi="Consolas"/>
+                <w:sz w:val="18"/>
+              </w:rPr>
+              <w:t>".\sdrplay\sdrPlaySupport.dll" `</w:t>
             </w:r>
           </w:p>
           <w:p>
@@ -5263,6 +5501,7 @@
     </w:p>
     <w:p>
       <w:r>
+        <w:lastRenderedPageBreak/>
         <w:t>Then start the SDRplay API service (also from the Administrator PowerShell — the installer leaves it stopped):</w:t>
       </w:r>
     </w:p>
@@ -5487,7 +5726,6 @@
     </w:p>
     <w:p>
       <w:r>
-        <w:lastRenderedPageBreak/>
         <w:t xml:space="preserve">When you launch the spectrum analyzer with an RSP attached, it appears in the device picker as e.g. </w:t>
       </w:r>
       <w:r>
@@ -5505,7 +5743,7 @@
       <w:pPr>
         <w:pStyle w:val="Heading2"/>
       </w:pPr>
-      <w:bookmarkStart w:id="15" w:name="_Toc230449209"/>
+      <w:bookmarkStart w:id="15" w:name="_Toc230451336"/>
       <w:r>
         <w:t>4. First-run checklist</w:t>
       </w:r>
@@ -5513,10 +5751,7 @@
     </w:p>
     <w:p>
       <w:r>
-        <w:t xml:space="preserve">Regardless of OS, </w:t>
-      </w:r>
-      <w:r>
-        <w:t>before declaring the install good:</w:t>
+        <w:t>Regardless of OS, before declaring the install good:</w:t>
       </w:r>
     </w:p>
     <w:p>
@@ -5620,8 +5855,9 @@
       <w:pPr>
         <w:pStyle w:val="Heading3"/>
       </w:pPr>
-      <w:bookmarkStart w:id="16" w:name="_Toc230449210"/>
-      <w:r>
+      <w:bookmarkStart w:id="16" w:name="_Toc230451337"/>
+      <w:r>
+        <w:lastRenderedPageBreak/>
         <w:t>Recommended one-time VOLK tuning</w:t>
       </w:r>
       <w:bookmarkEnd w:id="16"/>
@@ -5763,9 +5999,8 @@
       <w:pPr>
         <w:pStyle w:val="Heading2"/>
       </w:pPr>
-      <w:bookmarkStart w:id="17" w:name="_Toc230449211"/>
-      <w:r>
-        <w:lastRenderedPageBreak/>
+      <w:bookmarkStart w:id="17" w:name="_Toc230451338"/>
+      <w:r>
         <w:t>5. Updating to a new version</w:t>
       </w:r>
       <w:bookmarkEnd w:id="17"/>
@@ -5774,7 +6009,7 @@
       <w:pPr>
         <w:pStyle w:val="Heading3"/>
       </w:pPr>
-      <w:bookmarkStart w:id="18" w:name="_Toc230449212"/>
+      <w:bookmarkStart w:id="18" w:name="_Toc230451339"/>
       <w:r>
         <w:t>Auto-update notifications</w:t>
       </w:r>
@@ -5865,7 +6100,7 @@
       <w:pPr>
         <w:pStyle w:val="Heading3"/>
       </w:pPr>
-      <w:bookmarkStart w:id="19" w:name="_Toc230449213"/>
+      <w:bookmarkStart w:id="19" w:name="_Toc230451340"/>
       <w:r>
         <w:t>Performing the update</w:t>
       </w:r>
@@ -5961,18 +6196,16 @@
       <w:pPr>
         <w:pStyle w:val="Heading3"/>
       </w:pPr>
-      <w:bookmarkStart w:id="20" w:name="_Toc230449214"/>
-      <w:r>
+      <w:bookmarkStart w:id="20" w:name="_Toc230451341"/>
+      <w:r>
+        <w:lastRenderedPageBreak/>
         <w:t>What is preserved across versions</w:t>
       </w:r>
       <w:bookmarkEnd w:id="20"/>
     </w:p>
     <w:p>
       <w:r>
-        <w:t xml:space="preserve">Your </w:t>
-      </w:r>
-      <w:r>
-        <w:t>settings and window geometry are kept outside the app folder, so updates never wipe them. The on-disk locations are:</w:t>
+        <w:t>Your settings and window geometry are kept outside the app folder, so updates never wipe them. The on-disk locations are:</w:t>
       </w:r>
     </w:p>
     <w:tbl>
@@ -6147,7 +6380,7 @@
       <w:pPr>
         <w:pStyle w:val="Heading3"/>
       </w:pPr>
-      <w:bookmarkStart w:id="21" w:name="_Toc230449215"/>
+      <w:bookmarkStart w:id="21" w:name="_Toc230451342"/>
       <w:r>
         <w:t>Backing up your settings</w:t>
       </w:r>
@@ -6178,7 +6411,14 @@
                 <w:rFonts w:ascii="Consolas" w:hAnsi="Consolas"/>
                 <w:sz w:val="18"/>
               </w:rPr>
-              <w:t>Windows:  copy "%APPDATA%\DSES_Analyzer\settings.ini" "%USERPROFILE%\Desktop\settings.ini.bak"</w:t>
+              <w:t xml:space="preserve">Windows:  copy </w:t>
+            </w:r>
+            <w:r>
+              <w:rPr>
+                <w:rFonts w:ascii="Consolas" w:hAnsi="Consolas"/>
+                <w:sz w:val="18"/>
+              </w:rPr>
+              <w:t>"%APPDATA%\DSES_Analyzer\settings.ini" "%USERPROFILE%\Desktop\settings.ini.bak"</w:t>
             </w:r>
           </w:p>
           <w:p>
@@ -6196,7 +6436,6 @@
                 <w:rFonts w:ascii="Consolas" w:hAnsi="Consolas"/>
                 <w:sz w:val="18"/>
               </w:rPr>
-              <w:lastRenderedPageBreak/>
               <w:t>Linux:    cp ~/.local/share/DSES_Analyzer/settings.ini ~/Desktop/settings.ini.bak</w:t>
             </w:r>
           </w:p>
@@ -6207,9 +6446,8 @@
       <w:pPr>
         <w:pStyle w:val="Heading2"/>
       </w:pPr>
-      <w:bookmarkStart w:id="22" w:name="_Toc230449216"/>
-      <w:r>
-        <w:lastRenderedPageBreak/>
+      <w:bookmarkStart w:id="22" w:name="_Toc230451343"/>
+      <w:r>
         <w:t>6. Troubleshooting</w:t>
       </w:r>
       <w:bookmarkEnd w:id="22"/>
@@ -6218,7 +6456,7 @@
       <w:pPr>
         <w:pStyle w:val="Heading3"/>
       </w:pPr>
-      <w:bookmarkStart w:id="23" w:name="_Toc230449217"/>
+      <w:bookmarkStart w:id="23" w:name="_Toc230451344"/>
       <w:r>
         <w:t>“Radioconda not found in standard locations”</w:t>
       </w:r>
@@ -6279,7 +6517,7 @@
       <w:pPr>
         <w:pStyle w:val="Heading3"/>
       </w:pPr>
-      <w:bookmarkStart w:id="24" w:name="_Toc230449218"/>
+      <w:bookmarkStart w:id="24" w:name="_Toc230451345"/>
       <w:r>
         <w:t>“No UHD Devices Found”</w:t>
       </w:r>
@@ -6334,6 +6572,7 @@
                 <w:rFonts w:ascii="Consolas" w:hAnsi="Consolas"/>
                 <w:sz w:val="18"/>
               </w:rPr>
+              <w:lastRenderedPageBreak/>
               <w:t xml:space="preserve">   Windows:  C:\ProgramData\radioconda\Library\bin\uhd_find_devices.exe</w:t>
             </w:r>
           </w:p>
@@ -6377,7 +6616,7 @@
       <w:pPr>
         <w:pStyle w:val="Heading3"/>
       </w:pPr>
-      <w:bookmarkStart w:id="25" w:name="_Toc230449219"/>
+      <w:bookmarkStart w:id="25" w:name="_Toc230451346"/>
       <w:r>
         <w:t>Persistent “O” overflows at high sample rates</w:t>
       </w:r>
@@ -6385,7 +6624,10 @@
     </w:p>
     <w:p>
       <w:r>
-        <w:t>Some “O” characters in the Overflow box on the right sidebar at startup are normal as the USB pipe warms up. A continuous stream during steady-state operation usually means the host can’t keep up with the sample rate:</w:t>
+        <w:t xml:space="preserve">Some “O” characters in the Overflow box on the right sidebar at startup are normal as the USB pipe warms up. A </w:t>
+      </w:r>
+      <w:r>
+        <w:t>continuous stream during steady-state operation usually means the host can’t keep up with the sample rate:</w:t>
       </w:r>
     </w:p>
     <w:p>
@@ -6421,7 +6663,7 @@
       <w:pPr>
         <w:pStyle w:val="Heading3"/>
       </w:pPr>
-      <w:bookmarkStart w:id="26" w:name="_Toc230449220"/>
+      <w:bookmarkStart w:id="26" w:name="_Toc230451347"/>
       <w:r>
         <w:t>Spectrum looks flat at −140 dB</w:t>
       </w:r>
@@ -6445,11 +6687,7 @@
         <w:pStyle w:val="ListBullet"/>
       </w:pPr>
       <w:r>
-        <w:lastRenderedPageBreak/>
-        <w:t xml:space="preserve">Antenna is disconnected (this app uses RX2 by default). Confirm a cable is on </w:t>
-      </w:r>
-      <w:r>
-        <w:t>RX2.</w:t>
+        <w:t>Antenna is disconnected (this app uses RX2 by default). Confirm a cable is on RX2.</w:t>
       </w:r>
     </w:p>
     <w:p>
@@ -6464,7 +6702,7 @@
       <w:pPr>
         <w:pStyle w:val="Heading3"/>
       </w:pPr>
-      <w:bookmarkStart w:id="27" w:name="_Toc230449221"/>
+      <w:bookmarkStart w:id="27" w:name="_Toc230451348"/>
       <w:r>
         <w:t>macOS: “developer cannot be verified”</w:t>
       </w:r>
@@ -6500,7 +6738,7 @@
       <w:pPr>
         <w:pStyle w:val="Heading3"/>
       </w:pPr>
-      <w:bookmarkStart w:id="28" w:name="_Toc230449222"/>
+      <w:bookmarkStart w:id="28" w:name="_Toc230451349"/>
       <w:r>
         <w:t>Settings won’t persist</w:t>
       </w:r>
@@ -6549,7 +6787,7 @@
       <w:pPr>
         <w:pStyle w:val="Heading2"/>
       </w:pPr>
-      <w:bookmarkStart w:id="29" w:name="_Toc230449223"/>
+      <w:bookmarkStart w:id="29" w:name="_Toc230451350"/>
       <w:r>
         <w:t>7. Appendix A — Settings file reference</w:t>
       </w:r>
@@ -6584,6 +6822,7 @@
           <w:rFonts w:ascii="Consolas" w:hAnsi="Consolas"/>
           <w:sz w:val="20"/>
         </w:rPr>
+        <w:lastRenderedPageBreak/>
         <w:t>[rx]</w:t>
       </w:r>
       <w:r>
@@ -6758,7 +6997,7 @@
       <w:pPr>
         <w:pStyle w:val="Heading2"/>
       </w:pPr>
-      <w:bookmarkStart w:id="30" w:name="_Toc230449224"/>
+      <w:bookmarkStart w:id="30" w:name="_Toc230451351"/>
       <w:r>
         <w:t>8. Appendix B — Device selection and SigMF playback</w:t>
       </w:r>
@@ -6768,7 +7007,7 @@
       <w:pPr>
         <w:pStyle w:val="Heading3"/>
       </w:pPr>
-      <w:bookmarkStart w:id="31" w:name="_Toc230449225"/>
+      <w:bookmarkStart w:id="31" w:name="_Toc230451352"/>
       <w:r>
         <w:t>Choosing among multiple radios</w:t>
       </w:r>
@@ -6776,10 +7015,7 @@
     </w:p>
     <w:p>
       <w:r>
-        <w:t xml:space="preserve">The program enumerates everything supported at launch — Ettus B210s via UHD, plus any SoapySDR-recognised receiver (SDRPlay, RTL-SDR, HackRF, Airspy, </w:t>
-      </w:r>
-      <w:r>
-        <w:t>Airspy HF+, BladeRF, LimeSDR, PlutoSDR). Behavior:</w:t>
+        <w:t>The program enumerates everything supported at launch — Ettus B210s via UHD, plus any SoapySDR-recognised receiver (SDRPlay, RTL-SDR, HackRF, Airspy, Airspy HF+, BladeRF, LimeSDR, PlutoSDR). Behavior:</w:t>
       </w:r>
     </w:p>
     <w:p>
@@ -6804,7 +7040,6 @@
         <w:rPr>
           <w:b/>
         </w:rPr>
-        <w:lastRenderedPageBreak/>
         <w:t>No radio attached, but `sample.sigmf-data` + `sample.sigmf-meta` are present next to the program:</w:t>
       </w:r>
       <w:r>
@@ -6946,8 +7181,9 @@
       <w:pPr>
         <w:pStyle w:val="Heading3"/>
       </w:pPr>
-      <w:bookmarkStart w:id="32" w:name="_Toc230449226"/>
-      <w:r>
+      <w:bookmarkStart w:id="32" w:name="_Toc230451353"/>
+      <w:r>
+        <w:lastRenderedPageBreak/>
         <w:t>SigMF playback mode (no-device fallback)</w:t>
       </w:r>
       <w:bookmarkEnd w:id="32"/>
@@ -7127,7 +7363,6 @@
         <w:pStyle w:val="ListBullet"/>
       </w:pPr>
       <w:r>
-        <w:lastRenderedPageBreak/>
         <w:t xml:space="preserve">To skip playback mode and force an error exit when no SDR is attached, delete or rename either of the two </w:t>
       </w:r>
       <w:r>
@@ -7145,7 +7380,7 @@
       <w:pPr>
         <w:pStyle w:val="Heading2"/>
       </w:pPr>
-      <w:bookmarkStart w:id="33" w:name="_Toc230449227"/>
+      <w:bookmarkStart w:id="33" w:name="_Toc230451354"/>
       <w:r>
         <w:t>9. Appendix C — Operating Guide</w:t>
       </w:r>
@@ -7174,7 +7409,7 @@
       <w:pPr>
         <w:pStyle w:val="Heading3"/>
       </w:pPr>
-      <w:bookmarkStart w:id="34" w:name="_Toc230449228"/>
+      <w:bookmarkStart w:id="34" w:name="_Toc230451355"/>
       <w:r>
         <w:t>Starting up — device selection</w:t>
       </w:r>
@@ -7196,7 +7431,10 @@
         <w:t>One supported SDR attached</w:t>
       </w:r>
       <w:r>
-        <w:t>: opens it silently and remembers the driver and serial in the settings file.</w:t>
+        <w:t xml:space="preserve">: opens it </w:t>
+      </w:r>
+      <w:r>
+        <w:t>silently and remembers the driver and serial in the settings file.</w:t>
       </w:r>
     </w:p>
     <w:p>
@@ -7221,6 +7459,7 @@
         <w:rPr>
           <w:b/>
         </w:rPr>
+        <w:lastRenderedPageBreak/>
         <w:t>No SDR attached, but a bundled SigMF sample is present</w:t>
       </w:r>
       <w:r>
@@ -7278,7 +7517,7 @@
       <w:pPr>
         <w:pStyle w:val="Heading3"/>
       </w:pPr>
-      <w:bookmarkStart w:id="35" w:name="_Toc230449229"/>
+      <w:bookmarkStart w:id="35" w:name="_Toc230451356"/>
       <w:r>
         <w:t>Playback mode</w:t>
       </w:r>
@@ -7404,9 +7643,8 @@
       <w:pPr>
         <w:pStyle w:val="Heading3"/>
       </w:pPr>
-      <w:bookmarkStart w:id="36" w:name="_Toc230449230"/>
-      <w:r>
-        <w:lastRenderedPageBreak/>
+      <w:bookmarkStart w:id="36" w:name="_Toc230451357"/>
+      <w:r>
         <w:t>Sidebar controls (right side)</w:t>
       </w:r>
       <w:bookmarkEnd w:id="36"/>
@@ -7540,7 +7778,11 @@
         <w:t>RX Gain</w:t>
       </w:r>
       <w:r>
-        <w:t>: per-radio range and meaning. The slider’s min/max matches what the driver reports (e.g. B210: 0–76 dB on the AD9361 gain table; SDRPlay: 0–48 dB, internally inverted so higher = stronger signal; RTL-SDR: 0–49.6 dB). AGC, if the driver defaults it on, is disabled at startup so the slider always takes effect.</w:t>
+        <w:t xml:space="preserve">: per-radio range and meaning. The slider’s min/max matches what the driver reports (e.g. B210: 0–76 dB on the AD9361 gain table; SDRPlay: 0–48 dB, internally inverted so higher = stronger </w:t>
+      </w:r>
+      <w:r>
+        <w:lastRenderedPageBreak/>
+        <w:t>signal; RTL-SDR: 0–49.6 dB). AGC, if the driver defaults it on, is disabled at startup so the slider always takes effect.</w:t>
       </w:r>
     </w:p>
     <w:p>
@@ -7685,7 +7927,7 @@
       <w:pPr>
         <w:pStyle w:val="Heading3"/>
       </w:pPr>
-      <w:bookmarkStart w:id="37" w:name="_Toc230449231"/>
+      <w:bookmarkStart w:id="37" w:name="_Toc230451358"/>
       <w:r>
         <w:t>Spectrum (top plot)</w:t>
       </w:r>
@@ -7721,7 +7963,10 @@
         <w:t>Window</w:t>
       </w:r>
       <w:r>
-        <w:t>: Blackman-Harris is the default — low sidelobes, good for RFI hunting. Hann/Hamming have narrower main lobes; Rectangular has the sharpest peak but the worst sidelobes.</w:t>
+        <w:t xml:space="preserve">: </w:t>
+      </w:r>
+      <w:r>
+        <w:t>Blackman-Harris is the default — low sidelobes, good for RFI hunting. Hann/Hamming have narrower main lobes; Rectangular has the sharpest peak but the worst sidelobes.</w:t>
       </w:r>
     </w:p>
     <w:p>
@@ -7735,10 +7980,7 @@
         <w:t>Avg α</w:t>
       </w:r>
       <w:r>
-        <w:t xml:space="preserve">: exponential averaging. 1.0 = no </w:t>
-      </w:r>
-      <w:r>
-        <w:t>smoothing (every frame is a fresh measurement). Smaller = more smoothing.</w:t>
+        <w:t>: exponential averaging. 1.0 = no smoothing (every frame is a fresh measurement). Smaller = more smoothing.</w:t>
       </w:r>
     </w:p>
     <w:p>
@@ -7749,200 +7991,200 @@
         <w:rPr>
           <w:b/>
         </w:rPr>
+        <w:t>Max / Min hold</w:t>
+      </w:r>
+      <w:r>
+        <w:t xml:space="preserve">: overlay traces showing the highest/lowest value ever seen at each bin. Use </w:t>
+      </w:r>
+      <w:r>
+        <w:rPr>
+          <w:b/>
+        </w:rPr>
+        <w:t>Reset</w:t>
+      </w:r>
+      <w:r>
+        <w:t xml:space="preserve"> to clear.</w:t>
+      </w:r>
+    </w:p>
+    <w:p>
+      <w:pPr>
+        <w:pStyle w:val="ListBullet"/>
+      </w:pPr>
+      <w:r>
+        <w:rPr>
+          <w:b/>
+        </w:rPr>
+        <w:t>Y-Axis</w:t>
+      </w:r>
+      <w:r>
+        <w:t xml:space="preserve">: dB min/max, or click </w:t>
+      </w:r>
+      <w:r>
+        <w:rPr>
+          <w:b/>
+        </w:rPr>
+        <w:t>Autoscale</w:t>
+      </w:r>
+      <w:r>
+        <w:t xml:space="preserve"> to fit the current data. </w:t>
+      </w:r>
+      <w:r>
+        <w:rPr>
+          <w:b/>
+        </w:rPr>
+        <w:t>Reset Axes</w:t>
+      </w:r>
+      <w:r>
+        <w:t xml:space="preserve"> snaps the plot back to the default dB range and full-span frequency view — handy after you’ve zoomed/panned with the mouse or nudged the min/max and want to get un-lost. It leaves FFT size, window, traces, and colors untouched.</w:t>
+      </w:r>
+    </w:p>
+    <w:p>
+      <w:pPr>
+        <w:pStyle w:val="ListBullet"/>
+      </w:pPr>
+      <w:r>
+        <w:rPr>
+          <w:b/>
+        </w:rPr>
+        <w:t>Linear scale</w:t>
+      </w:r>
+      <w:r>
+        <w:t>: plots linear magnitude instead of dB (the default log scale). In linear mode the Y axis auto-fits and the dB Min/Max boxes are disabled. Affects the spectrum plot only — the waterfall stays in dB.</w:t>
+      </w:r>
+    </w:p>
+    <w:p>
+      <w:pPr>
+        <w:pStyle w:val="ListBullet"/>
+      </w:pPr>
+      <w:r>
+        <w:rPr>
+          <w:b/>
+        </w:rPr>
+        <w:t>Trace</w:t>
+      </w:r>
+      <w:r>
+        <w:t>: color, line width, alpha, label.</w:t>
+      </w:r>
+    </w:p>
+    <w:p>
+      <w:pPr>
+        <w:pStyle w:val="Heading3"/>
+      </w:pPr>
+      <w:bookmarkStart w:id="38" w:name="_Toc230451359"/>
+      <w:r>
+        <w:t>Waterfall (bottom plot)</w:t>
+      </w:r>
+      <w:bookmarkEnd w:id="38"/>
+    </w:p>
+    <w:p>
+      <w:r>
+        <w:t>Scrolling 2-D image of FFT vs. time. Newest row at the bottom.</w:t>
+      </w:r>
+    </w:p>
+    <w:p>
+      <w:pPr>
+        <w:pStyle w:val="ListBullet"/>
+      </w:pPr>
+      <w:r>
+        <w:rPr>
+          <w:b/>
+        </w:rPr>
+        <w:t>Intensity Min/Max</w:t>
+      </w:r>
+      <w:r>
+        <w:t xml:space="preserve">: dB range that maps to the colormap. </w:t>
+      </w:r>
+      <w:r>
+        <w:rPr>
+          <w:b/>
+        </w:rPr>
+        <w:t>Autoscale intensity</w:t>
+      </w:r>
+      <w:r>
+        <w:t xml:space="preserve"> picks the 5%–99% percentile of the current data.</w:t>
+      </w:r>
+    </w:p>
+    <w:p>
+      <w:pPr>
+        <w:pStyle w:val="ListBullet"/>
+      </w:pPr>
+      <w:r>
+        <w:rPr>
+          <w:b/>
+        </w:rPr>
+        <w:t>Colormap</w:t>
+      </w:r>
+      <w:r>
+        <w:t>: viridis (default), plasma, inferno, magma, turbo, cividis, gray.</w:t>
+      </w:r>
+    </w:p>
+    <w:p>
+      <w:pPr>
+        <w:pStyle w:val="ListBullet"/>
+      </w:pPr>
+      <w:r>
+        <w:rPr>
+          <w:b/>
+        </w:rPr>
+        <w:t>Rows</w:t>
+      </w:r>
+      <w:r>
+        <w:t>: how many history rows to display (default 256).</w:t>
+      </w:r>
+    </w:p>
+    <w:p>
+      <w:pPr>
+        <w:pStyle w:val="Heading3"/>
+      </w:pPr>
+      <w:bookmarkStart w:id="39" w:name="_Toc230451360"/>
+      <w:r>
         <w:lastRenderedPageBreak/>
-        <w:t>Max / Min hold</w:t>
-      </w:r>
-      <w:r>
-        <w:t xml:space="preserve">: overlay traces showing the highest/lowest value ever seen at each bin. Use </w:t>
+        <w:t>Persistence</w:t>
+      </w:r>
+      <w:bookmarkEnd w:id="39"/>
+    </w:p>
+    <w:p>
+      <w:r>
+        <w:t xml:space="preserve">All selections are saved to a plain-text INI file and restored on next launch. The file location is shown in </w:t>
       </w:r>
       <w:r>
         <w:rPr>
           <w:b/>
         </w:rPr>
-        <w:t>Reset</w:t>
-      </w:r>
-      <w:r>
-        <w:t xml:space="preserve"> to clear.</w:t>
-      </w:r>
-    </w:p>
-    <w:p>
-      <w:pPr>
-        <w:pStyle w:val="ListBullet"/>
-      </w:pPr>
+        <w:t>Help → About</w:t>
+      </w:r>
+      <w:r>
+        <w:t xml:space="preserve">; you can open the folder directly with the </w:t>
+      </w:r>
       <w:r>
         <w:rPr>
           <w:b/>
         </w:rPr>
-        <w:t>Y-Axis</w:t>
-      </w:r>
-      <w:r>
-        <w:t xml:space="preserve">: dB min/max, or click </w:t>
+        <w:t>Open Settings Folder</w:t>
+      </w:r>
+      <w:r>
+        <w:t xml:space="preserve"> button.</w:t>
+      </w:r>
+    </w:p>
+    <w:p>
+      <w:r>
+        <w:t xml:space="preserve">To revert everything to factory defaults, use </w:t>
       </w:r>
       <w:r>
         <w:rPr>
           <w:b/>
         </w:rPr>
-        <w:t>Autoscale</w:t>
-      </w:r>
-      <w:r>
-        <w:t xml:space="preserve"> to fit the current data. </w:t>
-      </w:r>
-      <w:r>
-        <w:rPr>
-          <w:b/>
-        </w:rPr>
-        <w:t>Reset Axes</w:t>
-      </w:r>
-      <w:r>
-        <w:t xml:space="preserve"> snaps the plot back to the default dB range and full-span frequency view — handy after you’ve zoomed/panned with the mouse or nudged the min/max and want to get un-lost. It leaves FFT size, window, traces, and colors untouched.</w:t>
-      </w:r>
-    </w:p>
-    <w:p>
-      <w:pPr>
-        <w:pStyle w:val="ListBullet"/>
-      </w:pPr>
-      <w:r>
-        <w:rPr>
-          <w:b/>
-        </w:rPr>
-        <w:t>Linear scale</w:t>
-      </w:r>
-      <w:r>
-        <w:t>: plots linear magnitude instead of dB (the default log scale). In linear mode the Y axis auto-fits and the dB Min/Max boxes are disabled. Affects the spectrum plot only — the waterfall stays in dB.</w:t>
-      </w:r>
-    </w:p>
-    <w:p>
-      <w:pPr>
-        <w:pStyle w:val="ListBullet"/>
-      </w:pPr>
-      <w:r>
-        <w:rPr>
-          <w:b/>
-        </w:rPr>
-        <w:t>Trace</w:t>
-      </w:r>
-      <w:r>
-        <w:t>: color, line width, alpha, label.</w:t>
+        <w:t>Restore Defaults</w:t>
+      </w:r>
+      <w:r>
+        <w:t xml:space="preserve"> in the About dialog.</w:t>
       </w:r>
     </w:p>
     <w:p>
       <w:pPr>
         <w:pStyle w:val="Heading3"/>
       </w:pPr>
-      <w:bookmarkStart w:id="38" w:name="_Toc230449232"/>
-      <w:r>
-        <w:t>Waterfall (bottom plot)</w:t>
-      </w:r>
-      <w:bookmarkEnd w:id="38"/>
-    </w:p>
-    <w:p>
-      <w:r>
-        <w:t>Scrolling 2-D image of FFT vs. time. Newest row at the bottom.</w:t>
-      </w:r>
-    </w:p>
-    <w:p>
-      <w:pPr>
-        <w:pStyle w:val="ListBullet"/>
-      </w:pPr>
-      <w:r>
-        <w:rPr>
-          <w:b/>
-        </w:rPr>
-        <w:t>Intensity Min/Max</w:t>
-      </w:r>
-      <w:r>
-        <w:t xml:space="preserve">: dB range that maps to the colormap. </w:t>
-      </w:r>
-      <w:r>
-        <w:rPr>
-          <w:b/>
-        </w:rPr>
-        <w:t>Autoscale intensity</w:t>
-      </w:r>
-      <w:r>
-        <w:t xml:space="preserve"> picks the 5%–99% percentile of the current data.</w:t>
-      </w:r>
-    </w:p>
-    <w:p>
-      <w:pPr>
-        <w:pStyle w:val="ListBullet"/>
-      </w:pPr>
-      <w:r>
-        <w:rPr>
-          <w:b/>
-        </w:rPr>
-        <w:t>Colormap</w:t>
-      </w:r>
-      <w:r>
-        <w:t>: viridis (default), plasma, inferno, magma, turbo, cividis, gray.</w:t>
-      </w:r>
-    </w:p>
-    <w:p>
-      <w:pPr>
-        <w:pStyle w:val="ListBullet"/>
-      </w:pPr>
-      <w:r>
-        <w:rPr>
-          <w:b/>
-        </w:rPr>
-        <w:t>Rows</w:t>
-      </w:r>
-      <w:r>
-        <w:t>: how many history rows to display (default 256).</w:t>
-      </w:r>
-    </w:p>
-    <w:p>
-      <w:pPr>
-        <w:pStyle w:val="Heading3"/>
-      </w:pPr>
-      <w:bookmarkStart w:id="39" w:name="_Toc230449233"/>
-      <w:r>
-        <w:t>Persistence</w:t>
-      </w:r>
-      <w:bookmarkEnd w:id="39"/>
-    </w:p>
-    <w:p>
-      <w:r>
-        <w:t xml:space="preserve">All selections are saved to a plain-text INI file and restored on next launch. The file location is shown in </w:t>
-      </w:r>
-      <w:r>
-        <w:rPr>
-          <w:b/>
-        </w:rPr>
-        <w:t>Help → About</w:t>
-      </w:r>
-      <w:r>
-        <w:t xml:space="preserve">; you can open the folder directly with the </w:t>
-      </w:r>
-      <w:r>
-        <w:rPr>
-          <w:b/>
-        </w:rPr>
-        <w:t>Open Settings Folder</w:t>
-      </w:r>
-      <w:r>
-        <w:t xml:space="preserve"> button.</w:t>
-      </w:r>
-    </w:p>
-    <w:p>
-      <w:r>
-        <w:t xml:space="preserve">To revert everything to factory defaults, use </w:t>
-      </w:r>
-      <w:r>
-        <w:rPr>
-          <w:b/>
-        </w:rPr>
-        <w:t>Restore Defaults</w:t>
-      </w:r>
-      <w:r>
-        <w:t xml:space="preserve"> in the About dialog.</w:t>
-      </w:r>
-    </w:p>
-    <w:p>
-      <w:pPr>
-        <w:pStyle w:val="Heading3"/>
-      </w:pPr>
-      <w:bookmarkStart w:id="40" w:name="_Toc230449234"/>
+      <w:bookmarkStart w:id="40" w:name="_Toc230451361"/>
       <w:r>
         <w:t>Update checks</w:t>
       </w:r>
@@ -8000,7 +8242,7 @@
       <w:pPr>
         <w:pStyle w:val="Heading3"/>
       </w:pPr>
-      <w:bookmarkStart w:id="41" w:name="_Toc230449235"/>
+      <w:bookmarkStart w:id="41" w:name="_Toc230451362"/>
       <w:r>
         <w:t>Tips for pulsar work</w:t>
       </w:r>
@@ -8379,31 +8621,31 @@
       </w:rPr>
     </w:lvl>
   </w:abstractNum>
-  <w:num w:numId="1" w16cid:durableId="1626154184">
+  <w:num w:numId="1" w16cid:durableId="519587881">
     <w:abstractNumId w:val="8"/>
   </w:num>
-  <w:num w:numId="2" w16cid:durableId="1586719499">
+  <w:num w:numId="2" w16cid:durableId="967129140">
     <w:abstractNumId w:val="6"/>
   </w:num>
-  <w:num w:numId="3" w16cid:durableId="510219461">
+  <w:num w:numId="3" w16cid:durableId="1166245620">
     <w:abstractNumId w:val="5"/>
   </w:num>
-  <w:num w:numId="4" w16cid:durableId="1346708173">
+  <w:num w:numId="4" w16cid:durableId="769544233">
     <w:abstractNumId w:val="4"/>
   </w:num>
-  <w:num w:numId="5" w16cid:durableId="2075010384">
+  <w:num w:numId="5" w16cid:durableId="1100640688">
     <w:abstractNumId w:val="7"/>
   </w:num>
-  <w:num w:numId="6" w16cid:durableId="950207859">
+  <w:num w:numId="6" w16cid:durableId="1845780266">
     <w:abstractNumId w:val="3"/>
   </w:num>
-  <w:num w:numId="7" w16cid:durableId="603265187">
+  <w:num w:numId="7" w16cid:durableId="1084454054">
     <w:abstractNumId w:val="2"/>
   </w:num>
-  <w:num w:numId="8" w16cid:durableId="522131948">
+  <w:num w:numId="8" w16cid:durableId="775566763">
     <w:abstractNumId w:val="1"/>
   </w:num>
-  <w:num w:numId="9" w16cid:durableId="643513034">
+  <w:num w:numId="9" w16cid:durableId="1319654243">
     <w:abstractNumId w:val="0"/>
   </w:num>
 </w:numbering>
@@ -19798,7 +20040,7 @@
     <w:autoRedefine/>
     <w:uiPriority w:val="39"/>
     <w:unhideWhenUsed/>
-    <w:rsid w:val="00752511"/>
+    <w:rsid w:val="00816560"/>
     <w:pPr>
       <w:spacing w:after="100"/>
     </w:pPr>
@@ -19810,7 +20052,7 @@
     <w:autoRedefine/>
     <w:uiPriority w:val="39"/>
     <w:unhideWhenUsed/>
-    <w:rsid w:val="00752511"/>
+    <w:rsid w:val="00816560"/>
     <w:pPr>
       <w:spacing w:after="100"/>
       <w:ind w:left="220"/>
@@ -19823,7 +20065,7 @@
     <w:autoRedefine/>
     <w:uiPriority w:val="39"/>
     <w:unhideWhenUsed/>
-    <w:rsid w:val="00752511"/>
+    <w:rsid w:val="00816560"/>
     <w:pPr>
       <w:spacing w:after="100"/>
       <w:ind w:left="440"/>
@@ -19834,7 +20076,7 @@
     <w:basedOn w:val="DefaultParagraphFont"/>
     <w:uiPriority w:val="99"/>
     <w:unhideWhenUsed/>
-    <w:rsid w:val="00752511"/>
+    <w:rsid w:val="00816560"/>
     <w:rPr>
       <w:color w:val="0000FF" w:themeColor="hyperlink"/>
       <w:u w:val="single"/>

</xml_diff>

<commit_message>
Suggest install locations for Linux/macOS in guide §3.2/§3.3
Mirror the Windows §3.1 guidance: recommend extracting under ~/Applications
(per-user, write-permission-friendly) on both Linux and macOS, with example
unzip-from-~/Downloads commands, and note to avoid system locations like
/opt or /Applications to dodge permission/Gatekeeper friction. Regenerated
PDF/DOCX.
</commit_message>
<xml_diff>
--- a/DSES_RFI_Spectrum_Analyzer_Installation.docx
+++ b/DSES_RFI_Spectrum_Analyzer_Installation.docx
@@ -41,7 +41,7 @@
           <w:noProof/>
         </w:rPr>
         <w:drawing>
-          <wp:inline distT="0" distB="0" distL="0" distR="0" wp14:anchorId="0DB6A22C" wp14:editId="3278278F">
+          <wp:inline distT="0" distB="0" distL="0" distR="0" wp14:anchorId="65E5EAFA" wp14:editId="40745834">
             <wp:extent cx="1371600" cy="1371600"/>
             <wp:effectExtent l="0" t="0" r="0" b="0"/>
             <wp:docPr id="1" name="Picture 1"/>
@@ -138,7 +138,7 @@
         <w:pStyle w:val="Heading1"/>
         <w:shd w:val="clear" w:color="auto" w:fill="156082"/>
       </w:pPr>
-      <w:bookmarkStart w:id="0" w:name="_Toc230451321"/>
+      <w:bookmarkStart w:id="0" w:name="_Toc230451671"/>
       <w:r>
         <w:lastRenderedPageBreak/>
         <w:t>Contents</w:t>
@@ -169,7 +169,7 @@
       <w:r>
         <w:fldChar w:fldCharType="separate"/>
       </w:r>
-      <w:hyperlink w:anchor="_Toc230451321" w:history="1">
+      <w:hyperlink w:anchor="_Toc230451671" w:history="1">
         <w:r>
           <w:rPr>
             <w:rStyle w:val="Hyperlink"/>
@@ -196,7 +196,7 @@
             <w:noProof/>
             <w:webHidden/>
           </w:rPr>
-          <w:instrText xml:space="preserve"> PAGEREF _Toc230451321 \h </w:instrText>
+          <w:instrText xml:space="preserve"> PAGEREF _Toc230451671 \h </w:instrText>
         </w:r>
         <w:r>
           <w:rPr>
@@ -242,7 +242,7 @@
           <w14:ligatures w14:val="standardContextual"/>
         </w:rPr>
       </w:pPr>
-      <w:hyperlink w:anchor="_Toc230451322" w:history="1">
+      <w:hyperlink w:anchor="_Toc230451672" w:history="1">
         <w:r>
           <w:rPr>
             <w:rStyle w:val="Hyperlink"/>
@@ -269,7 +269,7 @@
             <w:noProof/>
             <w:webHidden/>
           </w:rPr>
-          <w:instrText xml:space="preserve"> PAGEREF _Toc230451322 \h </w:instrText>
+          <w:instrText xml:space="preserve"> PAGEREF _Toc230451672 \h </w:instrText>
         </w:r>
         <w:r>
           <w:rPr>
@@ -315,7 +315,7 @@
           <w14:ligatures w14:val="standardContextual"/>
         </w:rPr>
       </w:pPr>
-      <w:hyperlink w:anchor="_Toc230451323" w:history="1">
+      <w:hyperlink w:anchor="_Toc230451673" w:history="1">
         <w:r>
           <w:rPr>
             <w:rStyle w:val="Hyperlink"/>
@@ -342,7 +342,7 @@
             <w:noProof/>
             <w:webHidden/>
           </w:rPr>
-          <w:instrText xml:space="preserve"> PAGEREF _Toc230451323 \h </w:instrText>
+          <w:instrText xml:space="preserve"> PAGEREF _Toc230451673 \h </w:instrText>
         </w:r>
         <w:r>
           <w:rPr>
@@ -388,7 +388,7 @@
           <w14:ligatures w14:val="standardContextual"/>
         </w:rPr>
       </w:pPr>
-      <w:hyperlink w:anchor="_Toc230451324" w:history="1">
+      <w:hyperlink w:anchor="_Toc230451674" w:history="1">
         <w:r>
           <w:rPr>
             <w:rStyle w:val="Hyperlink"/>
@@ -415,7 +415,7 @@
             <w:noProof/>
             <w:webHidden/>
           </w:rPr>
-          <w:instrText xml:space="preserve"> PAGEREF _Toc230451324 \h </w:instrText>
+          <w:instrText xml:space="preserve"> PAGEREF _Toc230451674 \h </w:instrText>
         </w:r>
         <w:r>
           <w:rPr>
@@ -461,7 +461,7 @@
           <w14:ligatures w14:val="standardContextual"/>
         </w:rPr>
       </w:pPr>
-      <w:hyperlink w:anchor="_Toc230451325" w:history="1">
+      <w:hyperlink w:anchor="_Toc230451675" w:history="1">
         <w:r>
           <w:rPr>
             <w:rStyle w:val="Hyperlink"/>
@@ -488,7 +488,7 @@
             <w:noProof/>
             <w:webHidden/>
           </w:rPr>
-          <w:instrText xml:space="preserve"> PAGEREF _Toc230451325 \h </w:instrText>
+          <w:instrText xml:space="preserve"> PAGEREF _Toc230451675 \h </w:instrText>
         </w:r>
         <w:r>
           <w:rPr>
@@ -534,7 +534,7 @@
           <w14:ligatures w14:val="standardContextual"/>
         </w:rPr>
       </w:pPr>
-      <w:hyperlink w:anchor="_Toc230451326" w:history="1">
+      <w:hyperlink w:anchor="_Toc230451676" w:history="1">
         <w:r>
           <w:rPr>
             <w:rStyle w:val="Hyperlink"/>
@@ -561,7 +561,7 @@
             <w:noProof/>
             <w:webHidden/>
           </w:rPr>
-          <w:instrText xml:space="preserve"> PAGEREF _Toc230451326 \h </w:instrText>
+          <w:instrText xml:space="preserve"> PAGEREF _Toc230451676 \h </w:instrText>
         </w:r>
         <w:r>
           <w:rPr>
@@ -607,7 +607,7 @@
           <w14:ligatures w14:val="standardContextual"/>
         </w:rPr>
       </w:pPr>
-      <w:hyperlink w:anchor="_Toc230451327" w:history="1">
+      <w:hyperlink w:anchor="_Toc230451677" w:history="1">
         <w:r>
           <w:rPr>
             <w:rStyle w:val="Hyperlink"/>
@@ -634,7 +634,7 @@
             <w:noProof/>
             <w:webHidden/>
           </w:rPr>
-          <w:instrText xml:space="preserve"> PAGEREF _Toc230451327 \h </w:instrText>
+          <w:instrText xml:space="preserve"> PAGEREF _Toc230451677 \h </w:instrText>
         </w:r>
         <w:r>
           <w:rPr>
@@ -680,7 +680,7 @@
           <w14:ligatures w14:val="standardContextual"/>
         </w:rPr>
       </w:pPr>
-      <w:hyperlink w:anchor="_Toc230451328" w:history="1">
+      <w:hyperlink w:anchor="_Toc230451678" w:history="1">
         <w:r>
           <w:rPr>
             <w:rStyle w:val="Hyperlink"/>
@@ -707,7 +707,7 @@
             <w:noProof/>
             <w:webHidden/>
           </w:rPr>
-          <w:instrText xml:space="preserve"> PAGEREF _Toc230451328 \h </w:instrText>
+          <w:instrText xml:space="preserve"> PAGEREF _Toc230451678 \h </w:instrText>
         </w:r>
         <w:r>
           <w:rPr>
@@ -753,7 +753,7 @@
           <w14:ligatures w14:val="standardContextual"/>
         </w:rPr>
       </w:pPr>
-      <w:hyperlink w:anchor="_Toc230451329" w:history="1">
+      <w:hyperlink w:anchor="_Toc230451679" w:history="1">
         <w:r>
           <w:rPr>
             <w:rStyle w:val="Hyperlink"/>
@@ -780,7 +780,7 @@
             <w:noProof/>
             <w:webHidden/>
           </w:rPr>
-          <w:instrText xml:space="preserve"> PAGEREF _Toc230451329 \h </w:instrText>
+          <w:instrText xml:space="preserve"> PAGEREF _Toc230451679 \h </w:instrText>
         </w:r>
         <w:r>
           <w:rPr>
@@ -826,7 +826,7 @@
           <w14:ligatures w14:val="standardContextual"/>
         </w:rPr>
       </w:pPr>
-      <w:hyperlink w:anchor="_Toc230451330" w:history="1">
+      <w:hyperlink w:anchor="_Toc230451680" w:history="1">
         <w:r>
           <w:rPr>
             <w:rStyle w:val="Hyperlink"/>
@@ -853,7 +853,7 @@
             <w:noProof/>
             <w:webHidden/>
           </w:rPr>
-          <w:instrText xml:space="preserve"> PAGEREF _Toc230451330 \h </w:instrText>
+          <w:instrText xml:space="preserve"> PAGEREF _Toc230451680 \h </w:instrText>
         </w:r>
         <w:r>
           <w:rPr>
@@ -899,7 +899,7 @@
           <w14:ligatures w14:val="standardContextual"/>
         </w:rPr>
       </w:pPr>
-      <w:hyperlink w:anchor="_Toc230451331" w:history="1">
+      <w:hyperlink w:anchor="_Toc230451681" w:history="1">
         <w:r>
           <w:rPr>
             <w:rStyle w:val="Hyperlink"/>
@@ -926,7 +926,7 @@
             <w:noProof/>
             <w:webHidden/>
           </w:rPr>
-          <w:instrText xml:space="preserve"> PAGEREF _Toc230451331 \h </w:instrText>
+          <w:instrText xml:space="preserve"> PAGEREF _Toc230451681 \h </w:instrText>
         </w:r>
         <w:r>
           <w:rPr>
@@ -972,7 +972,7 @@
           <w14:ligatures w14:val="standardContextual"/>
         </w:rPr>
       </w:pPr>
-      <w:hyperlink w:anchor="_Toc230451332" w:history="1">
+      <w:hyperlink w:anchor="_Toc230451682" w:history="1">
         <w:r>
           <w:rPr>
             <w:rStyle w:val="Hyperlink"/>
@@ -999,7 +999,7 @@
             <w:noProof/>
             <w:webHidden/>
           </w:rPr>
-          <w:instrText xml:space="preserve"> PAGEREF _Toc230451332 \h </w:instrText>
+          <w:instrText xml:space="preserve"> PAGEREF _Toc230451682 \h </w:instrText>
         </w:r>
         <w:r>
           <w:rPr>
@@ -1019,7 +1019,7 @@
             <w:noProof/>
             <w:webHidden/>
           </w:rPr>
-          <w:t>8</w:t>
+          <w:t>9</w:t>
         </w:r>
         <w:r>
           <w:rPr>
@@ -1045,7 +1045,7 @@
           <w14:ligatures w14:val="standardContextual"/>
         </w:rPr>
       </w:pPr>
-      <w:hyperlink w:anchor="_Toc230451333" w:history="1">
+      <w:hyperlink w:anchor="_Toc230451683" w:history="1">
         <w:r>
           <w:rPr>
             <w:rStyle w:val="Hyperlink"/>
@@ -1072,7 +1072,7 @@
             <w:noProof/>
             <w:webHidden/>
           </w:rPr>
-          <w:instrText xml:space="preserve"> PAGEREF _Toc230451333 \h </w:instrText>
+          <w:instrText xml:space="preserve"> PAGEREF _Toc230451683 \h </w:instrText>
         </w:r>
         <w:r>
           <w:rPr>
@@ -1118,7 +1118,7 @@
           <w14:ligatures w14:val="standardContextual"/>
         </w:rPr>
       </w:pPr>
-      <w:hyperlink w:anchor="_Toc230451334" w:history="1">
+      <w:hyperlink w:anchor="_Toc230451684" w:history="1">
         <w:r>
           <w:rPr>
             <w:rStyle w:val="Hyperlink"/>
@@ -1145,7 +1145,7 @@
             <w:noProof/>
             <w:webHidden/>
           </w:rPr>
-          <w:instrText xml:space="preserve"> PAGEREF _Toc230451334 \h </w:instrText>
+          <w:instrText xml:space="preserve"> PAGEREF _Toc230451684 \h </w:instrText>
         </w:r>
         <w:r>
           <w:rPr>
@@ -1191,7 +1191,7 @@
           <w14:ligatures w14:val="standardContextual"/>
         </w:rPr>
       </w:pPr>
-      <w:hyperlink w:anchor="_Toc230451335" w:history="1">
+      <w:hyperlink w:anchor="_Toc230451685" w:history="1">
         <w:r>
           <w:rPr>
             <w:rStyle w:val="Hyperlink"/>
@@ -1218,7 +1218,7 @@
             <w:noProof/>
             <w:webHidden/>
           </w:rPr>
-          <w:instrText xml:space="preserve"> PAGEREF _Toc230451335 \h </w:instrText>
+          <w:instrText xml:space="preserve"> PAGEREF _Toc230451685 \h </w:instrText>
         </w:r>
         <w:r>
           <w:rPr>
@@ -1238,7 +1238,7 @@
             <w:noProof/>
             <w:webHidden/>
           </w:rPr>
-          <w:t>9</w:t>
+          <w:t>10</w:t>
         </w:r>
         <w:r>
           <w:rPr>
@@ -1264,7 +1264,7 @@
           <w14:ligatures w14:val="standardContextual"/>
         </w:rPr>
       </w:pPr>
-      <w:hyperlink w:anchor="_Toc230451336" w:history="1">
+      <w:hyperlink w:anchor="_Toc230451686" w:history="1">
         <w:r>
           <w:rPr>
             <w:rStyle w:val="Hyperlink"/>
@@ -1291,7 +1291,7 @@
             <w:noProof/>
             <w:webHidden/>
           </w:rPr>
-          <w:instrText xml:space="preserve"> PAGEREF _Toc230451336 \h </w:instrText>
+          <w:instrText xml:space="preserve"> PAGEREF _Toc230451686 \h </w:instrText>
         </w:r>
         <w:r>
           <w:rPr>
@@ -1311,7 +1311,7 @@
             <w:noProof/>
             <w:webHidden/>
           </w:rPr>
-          <w:t>10</w:t>
+          <w:t>11</w:t>
         </w:r>
         <w:r>
           <w:rPr>
@@ -1337,7 +1337,7 @@
           <w14:ligatures w14:val="standardContextual"/>
         </w:rPr>
       </w:pPr>
-      <w:hyperlink w:anchor="_Toc230451337" w:history="1">
+      <w:hyperlink w:anchor="_Toc230451687" w:history="1">
         <w:r>
           <w:rPr>
             <w:rStyle w:val="Hyperlink"/>
@@ -1364,7 +1364,7 @@
             <w:noProof/>
             <w:webHidden/>
           </w:rPr>
-          <w:instrText xml:space="preserve"> PAGEREF _Toc230451337 \h </w:instrText>
+          <w:instrText xml:space="preserve"> PAGEREF _Toc230451687 \h </w:instrText>
         </w:r>
         <w:r>
           <w:rPr>
@@ -1410,7 +1410,7 @@
           <w14:ligatures w14:val="standardContextual"/>
         </w:rPr>
       </w:pPr>
-      <w:hyperlink w:anchor="_Toc230451338" w:history="1">
+      <w:hyperlink w:anchor="_Toc230451688" w:history="1">
         <w:r>
           <w:rPr>
             <w:rStyle w:val="Hyperlink"/>
@@ -1437,7 +1437,7 @@
             <w:noProof/>
             <w:webHidden/>
           </w:rPr>
-          <w:instrText xml:space="preserve"> PAGEREF _Toc230451338 \h </w:instrText>
+          <w:instrText xml:space="preserve"> PAGEREF _Toc230451688 \h </w:instrText>
         </w:r>
         <w:r>
           <w:rPr>
@@ -1483,7 +1483,7 @@
           <w14:ligatures w14:val="standardContextual"/>
         </w:rPr>
       </w:pPr>
-      <w:hyperlink w:anchor="_Toc230451339" w:history="1">
+      <w:hyperlink w:anchor="_Toc230451689" w:history="1">
         <w:r>
           <w:rPr>
             <w:rStyle w:val="Hyperlink"/>
@@ -1510,7 +1510,7 @@
             <w:noProof/>
             <w:webHidden/>
           </w:rPr>
-          <w:instrText xml:space="preserve"> PAGEREF _Toc230451339 \h </w:instrText>
+          <w:instrText xml:space="preserve"> PAGEREF _Toc230451689 \h </w:instrText>
         </w:r>
         <w:r>
           <w:rPr>
@@ -1556,7 +1556,7 @@
           <w14:ligatures w14:val="standardContextual"/>
         </w:rPr>
       </w:pPr>
-      <w:hyperlink w:anchor="_Toc230451340" w:history="1">
+      <w:hyperlink w:anchor="_Toc230451690" w:history="1">
         <w:r>
           <w:rPr>
             <w:rStyle w:val="Hyperlink"/>
@@ -1583,7 +1583,7 @@
             <w:noProof/>
             <w:webHidden/>
           </w:rPr>
-          <w:instrText xml:space="preserve"> PAGEREF _Toc230451340 \h </w:instrText>
+          <w:instrText xml:space="preserve"> PAGEREF _Toc230451690 \h </w:instrText>
         </w:r>
         <w:r>
           <w:rPr>
@@ -1603,7 +1603,7 @@
             <w:noProof/>
             <w:webHidden/>
           </w:rPr>
-          <w:t>11</w:t>
+          <w:t>12</w:t>
         </w:r>
         <w:r>
           <w:rPr>
@@ -1629,7 +1629,7 @@
           <w14:ligatures w14:val="standardContextual"/>
         </w:rPr>
       </w:pPr>
-      <w:hyperlink w:anchor="_Toc230451341" w:history="1">
+      <w:hyperlink w:anchor="_Toc230451691" w:history="1">
         <w:r>
           <w:rPr>
             <w:rStyle w:val="Hyperlink"/>
@@ -1656,7 +1656,7 @@
             <w:noProof/>
             <w:webHidden/>
           </w:rPr>
-          <w:instrText xml:space="preserve"> PAGEREF _Toc230451341 \h </w:instrText>
+          <w:instrText xml:space="preserve"> PAGEREF _Toc230451691 \h </w:instrText>
         </w:r>
         <w:r>
           <w:rPr>
@@ -1702,7 +1702,7 @@
           <w14:ligatures w14:val="standardContextual"/>
         </w:rPr>
       </w:pPr>
-      <w:hyperlink w:anchor="_Toc230451342" w:history="1">
+      <w:hyperlink w:anchor="_Toc230451692" w:history="1">
         <w:r>
           <w:rPr>
             <w:rStyle w:val="Hyperlink"/>
@@ -1729,7 +1729,7 @@
             <w:noProof/>
             <w:webHidden/>
           </w:rPr>
-          <w:instrText xml:space="preserve"> PAGEREF _Toc230451342 \h </w:instrText>
+          <w:instrText xml:space="preserve"> PAGEREF _Toc230451692 \h </w:instrText>
         </w:r>
         <w:r>
           <w:rPr>
@@ -1775,7 +1775,7 @@
           <w14:ligatures w14:val="standardContextual"/>
         </w:rPr>
       </w:pPr>
-      <w:hyperlink w:anchor="_Toc230451343" w:history="1">
+      <w:hyperlink w:anchor="_Toc230451693" w:history="1">
         <w:r>
           <w:rPr>
             <w:rStyle w:val="Hyperlink"/>
@@ -1802,7 +1802,7 @@
             <w:noProof/>
             <w:webHidden/>
           </w:rPr>
-          <w:instrText xml:space="preserve"> PAGEREF _Toc230451343 \h </w:instrText>
+          <w:instrText xml:space="preserve"> PAGEREF _Toc230451693 \h </w:instrText>
         </w:r>
         <w:r>
           <w:rPr>
@@ -1848,7 +1848,7 @@
           <w14:ligatures w14:val="standardContextual"/>
         </w:rPr>
       </w:pPr>
-      <w:hyperlink w:anchor="_Toc230451344" w:history="1">
+      <w:hyperlink w:anchor="_Toc230451694" w:history="1">
         <w:r>
           <w:rPr>
             <w:rStyle w:val="Hyperlink"/>
@@ -1875,7 +1875,7 @@
             <w:noProof/>
             <w:webHidden/>
           </w:rPr>
-          <w:instrText xml:space="preserve"> PAGEREF _Toc230451344 \h </w:instrText>
+          <w:instrText xml:space="preserve"> PAGEREF _Toc230451694 \h </w:instrText>
         </w:r>
         <w:r>
           <w:rPr>
@@ -1921,7 +1921,7 @@
           <w14:ligatures w14:val="standardContextual"/>
         </w:rPr>
       </w:pPr>
-      <w:hyperlink w:anchor="_Toc230451345" w:history="1">
+      <w:hyperlink w:anchor="_Toc230451695" w:history="1">
         <w:r>
           <w:rPr>
             <w:rStyle w:val="Hyperlink"/>
@@ -1948,7 +1948,7 @@
             <w:noProof/>
             <w:webHidden/>
           </w:rPr>
-          <w:instrText xml:space="preserve"> PAGEREF _Toc230451345 \h </w:instrText>
+          <w:instrText xml:space="preserve"> PAGEREF _Toc230451695 \h </w:instrText>
         </w:r>
         <w:r>
           <w:rPr>
@@ -1968,7 +1968,7 @@
             <w:noProof/>
             <w:webHidden/>
           </w:rPr>
-          <w:t>12</w:t>
+          <w:t>13</w:t>
         </w:r>
         <w:r>
           <w:rPr>
@@ -1994,7 +1994,7 @@
           <w14:ligatures w14:val="standardContextual"/>
         </w:rPr>
       </w:pPr>
-      <w:hyperlink w:anchor="_Toc230451346" w:history="1">
+      <w:hyperlink w:anchor="_Toc230451696" w:history="1">
         <w:r>
           <w:rPr>
             <w:rStyle w:val="Hyperlink"/>
@@ -2021,7 +2021,7 @@
             <w:noProof/>
             <w:webHidden/>
           </w:rPr>
-          <w:instrText xml:space="preserve"> PAGEREF _Toc230451346 \h </w:instrText>
+          <w:instrText xml:space="preserve"> PAGEREF _Toc230451696 \h </w:instrText>
         </w:r>
         <w:r>
           <w:rPr>
@@ -2067,7 +2067,7 @@
           <w14:ligatures w14:val="standardContextual"/>
         </w:rPr>
       </w:pPr>
-      <w:hyperlink w:anchor="_Toc230451347" w:history="1">
+      <w:hyperlink w:anchor="_Toc230451697" w:history="1">
         <w:r>
           <w:rPr>
             <w:rStyle w:val="Hyperlink"/>
@@ -2094,7 +2094,7 @@
             <w:noProof/>
             <w:webHidden/>
           </w:rPr>
-          <w:instrText xml:space="preserve"> PAGEREF _Toc230451347 \h </w:instrText>
+          <w:instrText xml:space="preserve"> PAGEREF _Toc230451697 \h </w:instrText>
         </w:r>
         <w:r>
           <w:rPr>
@@ -2140,7 +2140,7 @@
           <w14:ligatures w14:val="standardContextual"/>
         </w:rPr>
       </w:pPr>
-      <w:hyperlink w:anchor="_Toc230451348" w:history="1">
+      <w:hyperlink w:anchor="_Toc230451698" w:history="1">
         <w:r>
           <w:rPr>
             <w:rStyle w:val="Hyperlink"/>
@@ -2167,7 +2167,7 @@
             <w:noProof/>
             <w:webHidden/>
           </w:rPr>
-          <w:instrText xml:space="preserve"> PAGEREF _Toc230451348 \h </w:instrText>
+          <w:instrText xml:space="preserve"> PAGEREF _Toc230451698 \h </w:instrText>
         </w:r>
         <w:r>
           <w:rPr>
@@ -2213,7 +2213,7 @@
           <w14:ligatures w14:val="standardContextual"/>
         </w:rPr>
       </w:pPr>
-      <w:hyperlink w:anchor="_Toc230451349" w:history="1">
+      <w:hyperlink w:anchor="_Toc230451699" w:history="1">
         <w:r>
           <w:rPr>
             <w:rStyle w:val="Hyperlink"/>
@@ -2240,7 +2240,7 @@
             <w:noProof/>
             <w:webHidden/>
           </w:rPr>
-          <w:instrText xml:space="preserve"> PAGEREF _Toc230451349 \h </w:instrText>
+          <w:instrText xml:space="preserve"> PAGEREF _Toc230451699 \h </w:instrText>
         </w:r>
         <w:r>
           <w:rPr>
@@ -2286,7 +2286,7 @@
           <w14:ligatures w14:val="standardContextual"/>
         </w:rPr>
       </w:pPr>
-      <w:hyperlink w:anchor="_Toc230451350" w:history="1">
+      <w:hyperlink w:anchor="_Toc230451700" w:history="1">
         <w:r>
           <w:rPr>
             <w:rStyle w:val="Hyperlink"/>
@@ -2313,7 +2313,7 @@
             <w:noProof/>
             <w:webHidden/>
           </w:rPr>
-          <w:instrText xml:space="preserve"> PAGEREF _Toc230451350 \h </w:instrText>
+          <w:instrText xml:space="preserve"> PAGEREF _Toc230451700 \h </w:instrText>
         </w:r>
         <w:r>
           <w:rPr>
@@ -2333,7 +2333,7 @@
             <w:noProof/>
             <w:webHidden/>
           </w:rPr>
-          <w:t>13</w:t>
+          <w:t>14</w:t>
         </w:r>
         <w:r>
           <w:rPr>
@@ -2359,7 +2359,7 @@
           <w14:ligatures w14:val="standardContextual"/>
         </w:rPr>
       </w:pPr>
-      <w:hyperlink w:anchor="_Toc230451351" w:history="1">
+      <w:hyperlink w:anchor="_Toc230451701" w:history="1">
         <w:r>
           <w:rPr>
             <w:rStyle w:val="Hyperlink"/>
@@ -2386,7 +2386,7 @@
             <w:noProof/>
             <w:webHidden/>
           </w:rPr>
-          <w:instrText xml:space="preserve"> PAGEREF _Toc230451351 \h </w:instrText>
+          <w:instrText xml:space="preserve"> PAGEREF _Toc230451701 \h </w:instrText>
         </w:r>
         <w:r>
           <w:rPr>
@@ -2432,7 +2432,7 @@
           <w14:ligatures w14:val="standardContextual"/>
         </w:rPr>
       </w:pPr>
-      <w:hyperlink w:anchor="_Toc230451352" w:history="1">
+      <w:hyperlink w:anchor="_Toc230451702" w:history="1">
         <w:r>
           <w:rPr>
             <w:rStyle w:val="Hyperlink"/>
@@ -2459,7 +2459,7 @@
             <w:noProof/>
             <w:webHidden/>
           </w:rPr>
-          <w:instrText xml:space="preserve"> PAGEREF _Toc230451352 \h </w:instrText>
+          <w:instrText xml:space="preserve"> PAGEREF _Toc230451702 \h </w:instrText>
         </w:r>
         <w:r>
           <w:rPr>
@@ -2505,7 +2505,7 @@
           <w14:ligatures w14:val="standardContextual"/>
         </w:rPr>
       </w:pPr>
-      <w:hyperlink w:anchor="_Toc230451353" w:history="1">
+      <w:hyperlink w:anchor="_Toc230451703" w:history="1">
         <w:r>
           <w:rPr>
             <w:rStyle w:val="Hyperlink"/>
@@ -2532,7 +2532,7 @@
             <w:noProof/>
             <w:webHidden/>
           </w:rPr>
-          <w:instrText xml:space="preserve"> PAGEREF _Toc230451353 \h </w:instrText>
+          <w:instrText xml:space="preserve"> PAGEREF _Toc230451703 \h </w:instrText>
         </w:r>
         <w:r>
           <w:rPr>
@@ -2578,7 +2578,7 @@
           <w14:ligatures w14:val="standardContextual"/>
         </w:rPr>
       </w:pPr>
-      <w:hyperlink w:anchor="_Toc230451354" w:history="1">
+      <w:hyperlink w:anchor="_Toc230451704" w:history="1">
         <w:r>
           <w:rPr>
             <w:rStyle w:val="Hyperlink"/>
@@ -2605,7 +2605,7 @@
             <w:noProof/>
             <w:webHidden/>
           </w:rPr>
-          <w:instrText xml:space="preserve"> PAGEREF _Toc230451354 \h </w:instrText>
+          <w:instrText xml:space="preserve"> PAGEREF _Toc230451704 \h </w:instrText>
         </w:r>
         <w:r>
           <w:rPr>
@@ -2651,7 +2651,7 @@
           <w14:ligatures w14:val="standardContextual"/>
         </w:rPr>
       </w:pPr>
-      <w:hyperlink w:anchor="_Toc230451355" w:history="1">
+      <w:hyperlink w:anchor="_Toc230451705" w:history="1">
         <w:r>
           <w:rPr>
             <w:rStyle w:val="Hyperlink"/>
@@ -2678,7 +2678,7 @@
             <w:noProof/>
             <w:webHidden/>
           </w:rPr>
-          <w:instrText xml:space="preserve"> PAGEREF _Toc230451355 \h </w:instrText>
+          <w:instrText xml:space="preserve"> PAGEREF _Toc230451705 \h </w:instrText>
         </w:r>
         <w:r>
           <w:rPr>
@@ -2698,7 +2698,7 @@
             <w:noProof/>
             <w:webHidden/>
           </w:rPr>
-          <w:t>15</w:t>
+          <w:t>16</w:t>
         </w:r>
         <w:r>
           <w:rPr>
@@ -2724,7 +2724,7 @@
           <w14:ligatures w14:val="standardContextual"/>
         </w:rPr>
       </w:pPr>
-      <w:hyperlink w:anchor="_Toc230451356" w:history="1">
+      <w:hyperlink w:anchor="_Toc230451706" w:history="1">
         <w:r>
           <w:rPr>
             <w:rStyle w:val="Hyperlink"/>
@@ -2751,7 +2751,7 @@
             <w:noProof/>
             <w:webHidden/>
           </w:rPr>
-          <w:instrText xml:space="preserve"> PAGEREF _Toc230451356 \h </w:instrText>
+          <w:instrText xml:space="preserve"> PAGEREF _Toc230451706 \h </w:instrText>
         </w:r>
         <w:r>
           <w:rPr>
@@ -2797,7 +2797,7 @@
           <w14:ligatures w14:val="standardContextual"/>
         </w:rPr>
       </w:pPr>
-      <w:hyperlink w:anchor="_Toc230451357" w:history="1">
+      <w:hyperlink w:anchor="_Toc230451707" w:history="1">
         <w:r>
           <w:rPr>
             <w:rStyle w:val="Hyperlink"/>
@@ -2824,7 +2824,7 @@
             <w:noProof/>
             <w:webHidden/>
           </w:rPr>
-          <w:instrText xml:space="preserve"> PAGEREF _Toc230451357 \h </w:instrText>
+          <w:instrText xml:space="preserve"> PAGEREF _Toc230451707 \h </w:instrText>
         </w:r>
         <w:r>
           <w:rPr>
@@ -2870,7 +2870,7 @@
           <w14:ligatures w14:val="standardContextual"/>
         </w:rPr>
       </w:pPr>
-      <w:hyperlink w:anchor="_Toc230451358" w:history="1">
+      <w:hyperlink w:anchor="_Toc230451708" w:history="1">
         <w:r>
           <w:rPr>
             <w:rStyle w:val="Hyperlink"/>
@@ -2897,7 +2897,7 @@
             <w:noProof/>
             <w:webHidden/>
           </w:rPr>
-          <w:instrText xml:space="preserve"> PAGEREF _Toc230451358 \h </w:instrText>
+          <w:instrText xml:space="preserve"> PAGEREF _Toc230451708 \h </w:instrText>
         </w:r>
         <w:r>
           <w:rPr>
@@ -2943,7 +2943,7 @@
           <w14:ligatures w14:val="standardContextual"/>
         </w:rPr>
       </w:pPr>
-      <w:hyperlink w:anchor="_Toc230451359" w:history="1">
+      <w:hyperlink w:anchor="_Toc230451709" w:history="1">
         <w:r>
           <w:rPr>
             <w:rStyle w:val="Hyperlink"/>
@@ -2970,7 +2970,7 @@
             <w:noProof/>
             <w:webHidden/>
           </w:rPr>
-          <w:instrText xml:space="preserve"> PAGEREF _Toc230451359 \h </w:instrText>
+          <w:instrText xml:space="preserve"> PAGEREF _Toc230451709 \h </w:instrText>
         </w:r>
         <w:r>
           <w:rPr>
@@ -2990,7 +2990,7 @@
             <w:noProof/>
             <w:webHidden/>
           </w:rPr>
-          <w:t>17</w:t>
+          <w:t>18</w:t>
         </w:r>
         <w:r>
           <w:rPr>
@@ -3016,7 +3016,7 @@
           <w14:ligatures w14:val="standardContextual"/>
         </w:rPr>
       </w:pPr>
-      <w:hyperlink w:anchor="_Toc230451360" w:history="1">
+      <w:hyperlink w:anchor="_Toc230451710" w:history="1">
         <w:r>
           <w:rPr>
             <w:rStyle w:val="Hyperlink"/>
@@ -3043,7 +3043,7 @@
             <w:noProof/>
             <w:webHidden/>
           </w:rPr>
-          <w:instrText xml:space="preserve"> PAGEREF _Toc230451360 \h </w:instrText>
+          <w:instrText xml:space="preserve"> PAGEREF _Toc230451710 \h </w:instrText>
         </w:r>
         <w:r>
           <w:rPr>
@@ -3089,7 +3089,7 @@
           <w14:ligatures w14:val="standardContextual"/>
         </w:rPr>
       </w:pPr>
-      <w:hyperlink w:anchor="_Toc230451361" w:history="1">
+      <w:hyperlink w:anchor="_Toc230451711" w:history="1">
         <w:r>
           <w:rPr>
             <w:rStyle w:val="Hyperlink"/>
@@ -3116,7 +3116,7 @@
             <w:noProof/>
             <w:webHidden/>
           </w:rPr>
-          <w:instrText xml:space="preserve"> PAGEREF _Toc230451361 \h </w:instrText>
+          <w:instrText xml:space="preserve"> PAGEREF _Toc230451711 \h </w:instrText>
         </w:r>
         <w:r>
           <w:rPr>
@@ -3162,7 +3162,7 @@
           <w14:ligatures w14:val="standardContextual"/>
         </w:rPr>
       </w:pPr>
-      <w:hyperlink w:anchor="_Toc230451362" w:history="1">
+      <w:hyperlink w:anchor="_Toc230451712" w:history="1">
         <w:r>
           <w:rPr>
             <w:rStyle w:val="Hyperlink"/>
@@ -3189,7 +3189,7 @@
             <w:noProof/>
             <w:webHidden/>
           </w:rPr>
-          <w:instrText xml:space="preserve"> PAGEREF _Toc230451362 \h </w:instrText>
+          <w:instrText xml:space="preserve"> PAGEREF _Toc230451712 \h </w:instrText>
         </w:r>
         <w:r>
           <w:rPr>
@@ -3235,7 +3235,7 @@
         <w:pStyle w:val="Heading1"/>
         <w:shd w:val="clear" w:color="auto" w:fill="156082"/>
       </w:pPr>
-      <w:bookmarkStart w:id="1" w:name="_Toc230451322"/>
+      <w:bookmarkStart w:id="1" w:name="_Toc230451672"/>
       <w:r>
         <w:lastRenderedPageBreak/>
         <w:t xml:space="preserve">DSES Spectrum Analyzer — </w:t>
@@ -3314,7 +3314,7 @@
       <w:pPr>
         <w:pStyle w:val="Heading2"/>
       </w:pPr>
-      <w:bookmarkStart w:id="2" w:name="_Toc230451323"/>
+      <w:bookmarkStart w:id="2" w:name="_Toc230451673"/>
       <w:r>
         <w:t>1. What the recipient needs to know first</w:t>
       </w:r>
@@ -3431,7 +3431,7 @@
       <w:pPr>
         <w:pStyle w:val="Heading3"/>
       </w:pPr>
-      <w:bookmarkStart w:id="3" w:name="_Toc230451324"/>
+      <w:bookmarkStart w:id="3" w:name="_Toc230451674"/>
       <w:r>
         <w:t>System requirements</w:t>
       </w:r>
@@ -3706,7 +3706,7 @@
       <w:pPr>
         <w:pStyle w:val="Heading2"/>
       </w:pPr>
-      <w:bookmarkStart w:id="4" w:name="_Toc230451325"/>
+      <w:bookmarkStart w:id="4" w:name="_Toc230451675"/>
       <w:r>
         <w:t>2. Installing Radioconda</w:t>
       </w:r>
@@ -3716,7 +3716,7 @@
       <w:pPr>
         <w:pStyle w:val="Heading3"/>
       </w:pPr>
-      <w:bookmarkStart w:id="5" w:name="_Toc230451326"/>
+      <w:bookmarkStart w:id="5" w:name="_Toc230451676"/>
       <w:r>
         <w:t>2.1 Windows 11</w:t>
       </w:r>
@@ -3940,7 +3940,7 @@
       <w:pPr>
         <w:pStyle w:val="Heading3"/>
       </w:pPr>
-      <w:bookmarkStart w:id="6" w:name="_Toc230451327"/>
+      <w:bookmarkStart w:id="6" w:name="_Toc230451677"/>
       <w:r>
         <w:t>2.2 Linux</w:t>
       </w:r>
@@ -4210,7 +4210,7 @@
       <w:pPr>
         <w:pStyle w:val="Heading3"/>
       </w:pPr>
-      <w:bookmarkStart w:id="7" w:name="_Toc230451328"/>
+      <w:bookmarkStart w:id="7" w:name="_Toc230451678"/>
       <w:r>
         <w:t>2.3 macOS (Intel and Apple Silicon)</w:t>
       </w:r>
@@ -4527,7 +4527,7 @@
       <w:pPr>
         <w:pStyle w:val="Heading2"/>
       </w:pPr>
-      <w:bookmarkStart w:id="8" w:name="_Toc230451329"/>
+      <w:bookmarkStart w:id="8" w:name="_Toc230451679"/>
       <w:r>
         <w:t xml:space="preserve">3. Installing the DSES </w:t>
       </w:r>
@@ -4598,7 +4598,7 @@
       <w:pPr>
         <w:pStyle w:val="Heading3"/>
       </w:pPr>
-      <w:bookmarkStart w:id="9" w:name="_Toc230451330"/>
+      <w:bookmarkStart w:id="9" w:name="_Toc230451680"/>
       <w:r>
         <w:t>3.1 Windows 11</w:t>
       </w:r>
@@ -4873,7 +4873,7 @@
       <w:pPr>
         <w:pStyle w:val="Heading3"/>
       </w:pPr>
-      <w:bookmarkStart w:id="10" w:name="_Toc230451331"/>
+      <w:bookmarkStart w:id="10" w:name="_Toc230451681"/>
       <w:r>
         <w:t>3.2 Linux</w:t>
       </w:r>
@@ -4884,7 +4884,17 @@
         <w:pStyle w:val="ListNumber"/>
       </w:pPr>
       <w:r>
-        <w:t>Extract the zip:</w:t>
+        <w:t xml:space="preserve">Extract the zip somewhere under your home directory where you have write permission — a conventional spot for a per-user app is </w:t>
+      </w:r>
+      <w:r>
+        <w:rPr>
+          <w:rFonts w:ascii="Consolas" w:hAnsi="Consolas"/>
+          <w:sz w:val="20"/>
+        </w:rPr>
+        <w:t>~/Applications</w:t>
+      </w:r>
+      <w:r>
+        <w:t>. For example:</w:t>
       </w:r>
     </w:p>
     <w:tbl>
@@ -4907,7 +4917,16 @@
                 <w:rFonts w:ascii="Consolas" w:hAnsi="Consolas"/>
                 <w:sz w:val="18"/>
               </w:rPr>
-              <w:t xml:space="preserve">   unzip dses-spectrum-analyzer-1.0.0.zip</w:t>
+              <w:t xml:space="preserve">   mkdir -p ~/Applications &amp;&amp; cd ~/Applications</w:t>
+            </w:r>
+          </w:p>
+          <w:p>
+            <w:r>
+              <w:rPr>
+                <w:rFonts w:ascii="Consolas" w:hAnsi="Consolas"/>
+                <w:sz w:val="18"/>
+              </w:rPr>
+              <w:t xml:space="preserve">   unzip ~/Downloads/dses-spectrum-analyzer-1.0.0.zip</w:t>
             </w:r>
           </w:p>
           <w:p>
@@ -4931,6 +4950,91 @@
         </w:tc>
       </w:tr>
     </w:tbl>
+    <w:p>
+      <w:r>
+        <w:t xml:space="preserve">The extracted </w:t>
+      </w:r>
+      <w:r>
+        <w:rPr>
+          <w:rFonts w:ascii="Consolas" w:hAnsi="Consolas"/>
+          <w:sz w:val="20"/>
+        </w:rPr>
+        <w:t>dses-spectrum-analyzer-1.0.0/</w:t>
+      </w:r>
+      <w:r>
+        <w:t xml:space="preserve"> folder contains </w:t>
+      </w:r>
+      <w:r>
+        <w:rPr>
+          <w:rFonts w:ascii="Consolas" w:hAnsi="Consolas"/>
+          <w:sz w:val="20"/>
+        </w:rPr>
+        <w:t>dses_spectrum_analyzer.py</w:t>
+      </w:r>
+      <w:r>
+        <w:t xml:space="preserve">, </w:t>
+      </w:r>
+      <w:r>
+        <w:rPr>
+          <w:rFonts w:ascii="Consolas" w:hAnsi="Consolas"/>
+          <w:sz w:val="20"/>
+        </w:rPr>
+        <w:t>launcher.sh</w:t>
+      </w:r>
+      <w:r>
+        <w:t xml:space="preserve">, </w:t>
+      </w:r>
+      <w:r>
+        <w:rPr>
+          <w:rFonts w:ascii="Consolas" w:hAnsi="Consolas"/>
+          <w:sz w:val="20"/>
+        </w:rPr>
+        <w:t>dses-spectrum-analyzer.desktop</w:t>
+      </w:r>
+      <w:r>
+        <w:t xml:space="preserve">, </w:t>
+      </w:r>
+      <w:r>
+        <w:rPr>
+          <w:rFonts w:ascii="Consolas" w:hAnsi="Consolas"/>
+          <w:sz w:val="20"/>
+        </w:rPr>
+        <w:t>LICENSE</w:t>
+      </w:r>
+      <w:r>
+        <w:t xml:space="preserve">, the </w:t>
+      </w:r>
+      <w:r>
+        <w:rPr>
+          <w:rFonts w:ascii="Consolas" w:hAnsi="Consolas"/>
+          <w:sz w:val="20"/>
+        </w:rPr>
+        <w:t>icons/</w:t>
+      </w:r>
+      <w:r>
+        <w:t xml:space="preserve"> folder, and this guide. (Avoid system locations like </w:t>
+      </w:r>
+      <w:r>
+        <w:rPr>
+          <w:rFonts w:ascii="Consolas" w:hAnsi="Consolas"/>
+          <w:sz w:val="20"/>
+        </w:rPr>
+        <w:t>/opt</w:t>
+      </w:r>
+      <w:r>
+        <w:t xml:space="preserve"> unless you extract with </w:t>
+      </w:r>
+      <w:r>
+        <w:rPr>
+          <w:rFonts w:ascii="Consolas" w:hAnsi="Consolas"/>
+          <w:sz w:val="20"/>
+        </w:rPr>
+        <w:t>sudo</w:t>
+      </w:r>
+      <w:r>
+        <w:t xml:space="preserve"> — keeping it in your home directory avoids permission issues.)</w:t>
+      </w:r>
+    </w:p>
     <w:p>
       <w:pPr>
         <w:pStyle w:val="ListNumber"/>
@@ -5065,15 +5169,35 @@
       <w:pPr>
         <w:pStyle w:val="Heading3"/>
       </w:pPr>
-      <w:bookmarkStart w:id="11" w:name="_Toc230451332"/>
-      <w:r>
+      <w:bookmarkStart w:id="11" w:name="_Toc230451682"/>
+      <w:r>
+        <w:lastRenderedPageBreak/>
         <w:t>3.3 macOS</w:t>
       </w:r>
       <w:bookmarkEnd w:id="11"/>
     </w:p>
     <w:p>
       <w:r>
-        <w:t>The steps are the same as Linux:</w:t>
+        <w:t xml:space="preserve">The steps are the same as Linux. Extract it into your personal </w:t>
+      </w:r>
+      <w:r>
+        <w:rPr>
+          <w:b/>
+        </w:rPr>
+        <w:t>`~/Applications`</w:t>
+      </w:r>
+      <w:r>
+        <w:t xml:space="preserve"> folder (Finder shows it as your own Applications folder, separate from the system </w:t>
+      </w:r>
+      <w:r>
+        <w:rPr>
+          <w:rFonts w:ascii="Consolas" w:hAnsi="Consolas"/>
+          <w:sz w:val="20"/>
+        </w:rPr>
+        <w:t>/Applications</w:t>
+      </w:r>
+      <w:r>
+        <w:t>):</w:t>
       </w:r>
     </w:p>
     <w:tbl>
@@ -5096,7 +5220,16 @@
                 <w:rFonts w:ascii="Consolas" w:hAnsi="Consolas"/>
                 <w:sz w:val="18"/>
               </w:rPr>
-              <w:t>unzip dses-spectrum-analyzer-1.0.0.zip</w:t>
+              <w:t>mkdir -p ~/Applications &amp;&amp; cd ~/Applications</w:t>
+            </w:r>
+          </w:p>
+          <w:p>
+            <w:r>
+              <w:rPr>
+                <w:rFonts w:ascii="Consolas" w:hAnsi="Consolas"/>
+                <w:sz w:val="18"/>
+              </w:rPr>
+              <w:t>unzip ~/Downloads/dses-spectrum-analyzer-1.0.0.zip</w:t>
             </w:r>
           </w:p>
           <w:p>
@@ -5123,7 +5256,6 @@
                 <w:rFonts w:ascii="Consolas" w:hAnsi="Consolas"/>
                 <w:sz w:val="18"/>
               </w:rPr>
-              <w:lastRenderedPageBreak/>
               <w:t>./launcher.sh</w:t>
             </w:r>
           </w:p>
@@ -5132,7 +5264,21 @@
     </w:tbl>
     <w:p>
       <w:r>
-        <w:lastRenderedPageBreak/>
+        <w:t xml:space="preserve">Keeping it under your home directory (rather than the system </w:t>
+      </w:r>
+      <w:r>
+        <w:rPr>
+          <w:rFonts w:ascii="Consolas" w:hAnsi="Consolas"/>
+          <w:sz w:val="20"/>
+        </w:rPr>
+        <w:t>/Applications</w:t>
+      </w:r>
+      <w:r>
+        <w:t>) avoids permission prompts and Gatekeeper friction.</w:t>
+      </w:r>
+    </w:p>
+    <w:p>
+      <w:r>
         <w:t xml:space="preserve">On Apple Silicon, </w:t>
       </w:r>
       <w:r>
@@ -5220,7 +5366,7 @@
       <w:pPr>
         <w:pStyle w:val="Heading2"/>
       </w:pPr>
-      <w:bookmarkStart w:id="12" w:name="_Toc230451333"/>
+      <w:bookmarkStart w:id="12" w:name="_Toc230451683"/>
       <w:r>
         <w:t>3A. Extra setup for SDRPlay receivers (RSP1A / RSP1B / RSPduo / RSPdx)</w:t>
       </w:r>
@@ -5255,7 +5401,7 @@
       <w:pPr>
         <w:pStyle w:val="Heading3"/>
       </w:pPr>
-      <w:bookmarkStart w:id="13" w:name="_Toc230451334"/>
+      <w:bookmarkStart w:id="13" w:name="_Toc230451684"/>
       <w:r>
         <w:t>3A.1 Install the SDRplay API</w:t>
       </w:r>
@@ -5367,8 +5513,9 @@
       <w:pPr>
         <w:pStyle w:val="Heading3"/>
       </w:pPr>
-      <w:bookmarkStart w:id="14" w:name="_Toc230451335"/>
-      <w:r>
+      <w:bookmarkStart w:id="14" w:name="_Toc230451685"/>
+      <w:r>
+        <w:lastRenderedPageBreak/>
         <w:t>3A.2 Install the SoapySDRPlay module</w:t>
       </w:r>
       <w:bookmarkEnd w:id="14"/>
@@ -5462,14 +5609,7 @@
                 <w:rFonts w:ascii="Consolas" w:hAnsi="Consolas"/>
                 <w:sz w:val="18"/>
               </w:rPr>
-              <w:t xml:space="preserve">Copy-Item </w:t>
-            </w:r>
-            <w:r>
-              <w:rPr>
-                <w:rFonts w:ascii="Consolas" w:hAnsi="Consolas"/>
-                <w:sz w:val="18"/>
-              </w:rPr>
-              <w:t>".\sdrplay\sdrPlaySupport.dll" `</w:t>
+              <w:t>Copy-Item ".\sdrplay\sdrPlaySupport.dll" `</w:t>
             </w:r>
           </w:p>
           <w:p>
@@ -5501,7 +5641,6 @@
     </w:p>
     <w:p>
       <w:r>
-        <w:lastRenderedPageBreak/>
         <w:t>Then start the SDRplay API service (also from the Administrator PowerShell — the installer leaves it stopped):</w:t>
       </w:r>
     </w:p>
@@ -5743,8 +5882,9 @@
       <w:pPr>
         <w:pStyle w:val="Heading2"/>
       </w:pPr>
-      <w:bookmarkStart w:id="15" w:name="_Toc230451336"/>
-      <w:r>
+      <w:bookmarkStart w:id="15" w:name="_Toc230451686"/>
+      <w:r>
+        <w:lastRenderedPageBreak/>
         <w:t>4. First-run checklist</w:t>
       </w:r>
       <w:bookmarkEnd w:id="15"/>
@@ -5855,9 +5995,8 @@
       <w:pPr>
         <w:pStyle w:val="Heading3"/>
       </w:pPr>
-      <w:bookmarkStart w:id="16" w:name="_Toc230451337"/>
-      <w:r>
-        <w:lastRenderedPageBreak/>
+      <w:bookmarkStart w:id="16" w:name="_Toc230451687"/>
+      <w:r>
         <w:t>Recommended one-time VOLK tuning</w:t>
       </w:r>
       <w:bookmarkEnd w:id="16"/>
@@ -5999,7 +6138,7 @@
       <w:pPr>
         <w:pStyle w:val="Heading2"/>
       </w:pPr>
-      <w:bookmarkStart w:id="17" w:name="_Toc230451338"/>
+      <w:bookmarkStart w:id="17" w:name="_Toc230451688"/>
       <w:r>
         <w:t>5. Updating to a new version</w:t>
       </w:r>
@@ -6009,7 +6148,7 @@
       <w:pPr>
         <w:pStyle w:val="Heading3"/>
       </w:pPr>
-      <w:bookmarkStart w:id="18" w:name="_Toc230451339"/>
+      <w:bookmarkStart w:id="18" w:name="_Toc230451689"/>
       <w:r>
         <w:t>Auto-update notifications</w:t>
       </w:r>
@@ -6063,6 +6202,7 @@
     </w:p>
     <w:p>
       <w:r>
+        <w:lastRenderedPageBreak/>
         <w:t xml:space="preserve">The check is read-only — the program never auto-downloads or auto-installs anything. To disable the auto-check entirely, edit your </w:t>
       </w:r>
       <w:r>
@@ -6100,7 +6240,7 @@
       <w:pPr>
         <w:pStyle w:val="Heading3"/>
       </w:pPr>
-      <w:bookmarkStart w:id="19" w:name="_Toc230451340"/>
+      <w:bookmarkStart w:id="19" w:name="_Toc230451690"/>
       <w:r>
         <w:t>Performing the update</w:t>
       </w:r>
@@ -6196,9 +6336,8 @@
       <w:pPr>
         <w:pStyle w:val="Heading3"/>
       </w:pPr>
-      <w:bookmarkStart w:id="20" w:name="_Toc230451341"/>
-      <w:r>
-        <w:lastRenderedPageBreak/>
+      <w:bookmarkStart w:id="20" w:name="_Toc230451691"/>
+      <w:r>
         <w:t>What is preserved across versions</w:t>
       </w:r>
       <w:bookmarkEnd w:id="20"/>
@@ -6380,7 +6519,7 @@
       <w:pPr>
         <w:pStyle w:val="Heading3"/>
       </w:pPr>
-      <w:bookmarkStart w:id="21" w:name="_Toc230451342"/>
+      <w:bookmarkStart w:id="21" w:name="_Toc230451692"/>
       <w:r>
         <w:t>Backing up your settings</w:t>
       </w:r>
@@ -6411,14 +6550,7 @@
                 <w:rFonts w:ascii="Consolas" w:hAnsi="Consolas"/>
                 <w:sz w:val="18"/>
               </w:rPr>
-              <w:t xml:space="preserve">Windows:  copy </w:t>
-            </w:r>
-            <w:r>
-              <w:rPr>
-                <w:rFonts w:ascii="Consolas" w:hAnsi="Consolas"/>
-                <w:sz w:val="18"/>
-              </w:rPr>
-              <w:t>"%APPDATA%\DSES_Analyzer\settings.ini" "%USERPROFILE%\Desktop\settings.ini.bak"</w:t>
+              <w:t>Windows:  copy "%APPDATA%\DSES_Analyzer\settings.ini" "%USERPROFILE%\Desktop\settings.ini.bak"</w:t>
             </w:r>
           </w:p>
           <w:p>
@@ -6446,7 +6578,7 @@
       <w:pPr>
         <w:pStyle w:val="Heading2"/>
       </w:pPr>
-      <w:bookmarkStart w:id="22" w:name="_Toc230451343"/>
+      <w:bookmarkStart w:id="22" w:name="_Toc230451693"/>
       <w:r>
         <w:t>6. Troubleshooting</w:t>
       </w:r>
@@ -6456,7 +6588,7 @@
       <w:pPr>
         <w:pStyle w:val="Heading3"/>
       </w:pPr>
-      <w:bookmarkStart w:id="23" w:name="_Toc230451344"/>
+      <w:bookmarkStart w:id="23" w:name="_Toc230451694"/>
       <w:r>
         <w:t>“Radioconda not found in standard locations”</w:t>
       </w:r>
@@ -6500,6 +6632,7 @@
         <w:pStyle w:val="ListBullet"/>
       </w:pPr>
       <w:r>
+        <w:lastRenderedPageBreak/>
         <w:t xml:space="preserve">Set the </w:t>
       </w:r>
       <w:r>
@@ -6517,7 +6650,7 @@
       <w:pPr>
         <w:pStyle w:val="Heading3"/>
       </w:pPr>
-      <w:bookmarkStart w:id="24" w:name="_Toc230451345"/>
+      <w:bookmarkStart w:id="24" w:name="_Toc230451695"/>
       <w:r>
         <w:t>“No UHD Devices Found”</w:t>
       </w:r>
@@ -6572,7 +6705,6 @@
                 <w:rFonts w:ascii="Consolas" w:hAnsi="Consolas"/>
                 <w:sz w:val="18"/>
               </w:rPr>
-              <w:lastRenderedPageBreak/>
               <w:t xml:space="preserve">   Windows:  C:\ProgramData\radioconda\Library\bin\uhd_find_devices.exe</w:t>
             </w:r>
           </w:p>
@@ -6616,7 +6748,7 @@
       <w:pPr>
         <w:pStyle w:val="Heading3"/>
       </w:pPr>
-      <w:bookmarkStart w:id="25" w:name="_Toc230451346"/>
+      <w:bookmarkStart w:id="25" w:name="_Toc230451696"/>
       <w:r>
         <w:t>Persistent “O” overflows at high sample rates</w:t>
       </w:r>
@@ -6624,10 +6756,7 @@
     </w:p>
     <w:p>
       <w:r>
-        <w:t xml:space="preserve">Some “O” characters in the Overflow box on the right sidebar at startup are normal as the USB pipe warms up. A </w:t>
-      </w:r>
-      <w:r>
-        <w:t>continuous stream during steady-state operation usually means the host can’t keep up with the sample rate:</w:t>
+        <w:t>Some “O” characters in the Overflow box on the right sidebar at startup are normal as the USB pipe warms up. A continuous stream during steady-state operation usually means the host can’t keep up with the sample rate:</w:t>
       </w:r>
     </w:p>
     <w:p>
@@ -6663,7 +6792,7 @@
       <w:pPr>
         <w:pStyle w:val="Heading3"/>
       </w:pPr>
-      <w:bookmarkStart w:id="26" w:name="_Toc230451347"/>
+      <w:bookmarkStart w:id="26" w:name="_Toc230451697"/>
       <w:r>
         <w:t>Spectrum looks flat at −140 dB</w:t>
       </w:r>
@@ -6702,7 +6831,7 @@
       <w:pPr>
         <w:pStyle w:val="Heading3"/>
       </w:pPr>
-      <w:bookmarkStart w:id="27" w:name="_Toc230451348"/>
+      <w:bookmarkStart w:id="27" w:name="_Toc230451698"/>
       <w:r>
         <w:t>macOS: “developer cannot be verified”</w:t>
       </w:r>
@@ -6738,7 +6867,7 @@
       <w:pPr>
         <w:pStyle w:val="Heading3"/>
       </w:pPr>
-      <w:bookmarkStart w:id="28" w:name="_Toc230451349"/>
+      <w:bookmarkStart w:id="28" w:name="_Toc230451699"/>
       <w:r>
         <w:t>Settings won’t persist</w:t>
       </w:r>
@@ -6746,7 +6875,10 @@
     </w:p>
     <w:p>
       <w:r>
-        <w:t>Settings should be saved automatically on every change and on app close. If they aren’t:</w:t>
+        <w:t xml:space="preserve">Settings should be saved </w:t>
+      </w:r>
+      <w:r>
+        <w:t>automatically on every change and on app close. If they aren’t:</w:t>
       </w:r>
     </w:p>
     <w:p>
@@ -6754,6 +6886,7 @@
         <w:pStyle w:val="ListBullet"/>
       </w:pPr>
       <w:r>
+        <w:lastRenderedPageBreak/>
         <w:t xml:space="preserve">Check the path printed in </w:t>
       </w:r>
       <w:r>
@@ -6787,7 +6920,7 @@
       <w:pPr>
         <w:pStyle w:val="Heading2"/>
       </w:pPr>
-      <w:bookmarkStart w:id="29" w:name="_Toc230451350"/>
+      <w:bookmarkStart w:id="29" w:name="_Toc230451700"/>
       <w:r>
         <w:t>7. Appendix A — Settings file reference</w:t>
       </w:r>
@@ -6822,7 +6955,6 @@
           <w:rFonts w:ascii="Consolas" w:hAnsi="Consolas"/>
           <w:sz w:val="20"/>
         </w:rPr>
-        <w:lastRenderedPageBreak/>
         <w:t>[rx]</w:t>
       </w:r>
       <w:r>
@@ -6997,7 +7129,7 @@
       <w:pPr>
         <w:pStyle w:val="Heading2"/>
       </w:pPr>
-      <w:bookmarkStart w:id="30" w:name="_Toc230451351"/>
+      <w:bookmarkStart w:id="30" w:name="_Toc230451701"/>
       <w:r>
         <w:t>8. Appendix B — Device selection and SigMF playback</w:t>
       </w:r>
@@ -7007,7 +7139,7 @@
       <w:pPr>
         <w:pStyle w:val="Heading3"/>
       </w:pPr>
-      <w:bookmarkStart w:id="31" w:name="_Toc230451352"/>
+      <w:bookmarkStart w:id="31" w:name="_Toc230451702"/>
       <w:r>
         <w:t>Choosing among multiple radios</w:t>
       </w:r>
@@ -7040,7 +7172,13 @@
         <w:rPr>
           <w:b/>
         </w:rPr>
-        <w:t>No radio attached, but `sample.sigmf-data` + `sample.sigmf-meta` are present next to the program:</w:t>
+        <w:t xml:space="preserve">No radio attached, but </w:t>
+      </w:r>
+      <w:r>
+        <w:rPr>
+          <w:b/>
+        </w:rPr>
+        <w:t>`sample.sigmf-data` + `sample.sigmf-meta` are present next to the program:</w:t>
       </w:r>
       <w:r>
         <w:t xml:space="preserve"> the app falls back to </w:t>
@@ -7095,6 +7233,7 @@
     </w:p>
     <w:p>
       <w:r>
+        <w:lastRenderedPageBreak/>
         <w:t xml:space="preserve">The </w:t>
       </w:r>
       <w:r>
@@ -7181,16 +7320,18 @@
       <w:pPr>
         <w:pStyle w:val="Heading3"/>
       </w:pPr>
-      <w:bookmarkStart w:id="32" w:name="_Toc230451353"/>
-      <w:r>
-        <w:lastRenderedPageBreak/>
+      <w:bookmarkStart w:id="32" w:name="_Toc230451703"/>
+      <w:r>
         <w:t>SigMF playback mode (no-device fallback)</w:t>
       </w:r>
       <w:bookmarkEnd w:id="32"/>
     </w:p>
     <w:p>
       <w:r>
-        <w:t>The distribution bundle includes a short SigMF recording so that users without any SDR attached can still launch the program, see live spectrum, and try the controls.</w:t>
+        <w:t xml:space="preserve">The distribution bundle </w:t>
+      </w:r>
+      <w:r>
+        <w:t>includes a short SigMF recording so that users without any SDR attached can still launch the program, see live spectrum, and try the controls.</w:t>
       </w:r>
     </w:p>
     <w:p>
@@ -7380,7 +7521,7 @@
       <w:pPr>
         <w:pStyle w:val="Heading2"/>
       </w:pPr>
-      <w:bookmarkStart w:id="33" w:name="_Toc230451354"/>
+      <w:bookmarkStart w:id="33" w:name="_Toc230451704"/>
       <w:r>
         <w:t>9. Appendix C — Operating Guide</w:t>
       </w:r>
@@ -7402,6 +7543,7 @@
     </w:p>
     <w:p>
       <w:r>
+        <w:lastRenderedPageBreak/>
         <w:t>This is a live spectrum analyzer and waterfall display for the Ettus USRP B210 and other software-defined radios (SDRPlay RSP1A/RSP1B/RSPduo/RSPdx, RTL-SDR, HackRF, Airspy, BladeRF, LimeSDR, PlutoSDR via SoapySDR), designed for pulsar RFI investigation but useful for general-purpose spectrum monitoring.</w:t>
       </w:r>
     </w:p>
@@ -7409,7 +7551,7 @@
       <w:pPr>
         <w:pStyle w:val="Heading3"/>
       </w:pPr>
-      <w:bookmarkStart w:id="34" w:name="_Toc230451355"/>
+      <w:bookmarkStart w:id="34" w:name="_Toc230451705"/>
       <w:r>
         <w:t>Starting up — device selection</w:t>
       </w:r>
@@ -7431,10 +7573,7 @@
         <w:t>One supported SDR attached</w:t>
       </w:r>
       <w:r>
-        <w:t xml:space="preserve">: opens it </w:t>
-      </w:r>
-      <w:r>
-        <w:t>silently and remembers the driver and serial in the settings file.</w:t>
+        <w:t>: opens it silently and remembers the driver and serial in the settings file.</w:t>
       </w:r>
     </w:p>
     <w:p>
@@ -7459,7 +7598,6 @@
         <w:rPr>
           <w:b/>
         </w:rPr>
-        <w:lastRenderedPageBreak/>
         <w:t>No SDR attached, but a bundled SigMF sample is present</w:t>
       </w:r>
       <w:r>
@@ -7517,7 +7655,7 @@
       <w:pPr>
         <w:pStyle w:val="Heading3"/>
       </w:pPr>
-      <w:bookmarkStart w:id="35" w:name="_Toc230451356"/>
+      <w:bookmarkStart w:id="35" w:name="_Toc230451706"/>
       <w:r>
         <w:t>Playback mode</w:t>
       </w:r>
@@ -7643,7 +7781,7 @@
       <w:pPr>
         <w:pStyle w:val="Heading3"/>
       </w:pPr>
-      <w:bookmarkStart w:id="36" w:name="_Toc230451357"/>
+      <w:bookmarkStart w:id="36" w:name="_Toc230451707"/>
       <w:r>
         <w:t>Sidebar controls (right side)</w:t>
       </w:r>
@@ -7713,6 +7851,7 @@
         <w:rPr>
           <w:b/>
         </w:rPr>
+        <w:lastRenderedPageBreak/>
         <w:t>Manual Frequency</w:t>
       </w:r>
       <w:r>
@@ -7778,11 +7917,7 @@
         <w:t>RX Gain</w:t>
       </w:r>
       <w:r>
-        <w:t xml:space="preserve">: per-radio range and meaning. The slider’s min/max matches what the driver reports (e.g. B210: 0–76 dB on the AD9361 gain table; SDRPlay: 0–48 dB, internally inverted so higher = stronger </w:t>
-      </w:r>
-      <w:r>
-        <w:lastRenderedPageBreak/>
-        <w:t>signal; RTL-SDR: 0–49.6 dB). AGC, if the driver defaults it on, is disabled at startup so the slider always takes effect.</w:t>
+        <w:t>: per-radio range and meaning. The slider’s min/max matches what the driver reports (e.g. B210: 0–76 dB on the AD9361 gain table; SDRPlay: 0–48 dB, internally inverted so higher = stronger signal; RTL-SDR: 0–49.6 dB). AGC, if the driver defaults it on, is disabled at startup so the slider always takes effect.</w:t>
       </w:r>
     </w:p>
     <w:p>
@@ -7927,7 +8062,7 @@
       <w:pPr>
         <w:pStyle w:val="Heading3"/>
       </w:pPr>
-      <w:bookmarkStart w:id="37" w:name="_Toc230451358"/>
+      <w:bookmarkStart w:id="37" w:name="_Toc230451708"/>
       <w:r>
         <w:t>Spectrum (top plot)</w:t>
       </w:r>
@@ -7963,10 +8098,7 @@
         <w:t>Window</w:t>
       </w:r>
       <w:r>
-        <w:t xml:space="preserve">: </w:t>
-      </w:r>
-      <w:r>
-        <w:t>Blackman-Harris is the default — low sidelobes, good for RFI hunting. Hann/Hamming have narrower main lobes; Rectangular has the sharpest peak but the worst sidelobes.</w:t>
+        <w:t>: Blackman-Harris is the default — low sidelobes, good for RFI hunting. Hann/Hamming have narrower main lobes; Rectangular has the sharpest peak but the worst sidelobes.</w:t>
       </w:r>
     </w:p>
     <w:p>
@@ -8060,6 +8192,7 @@
         <w:rPr>
           <w:b/>
         </w:rPr>
+        <w:lastRenderedPageBreak/>
         <w:t>Trace</w:t>
       </w:r>
       <w:r>
@@ -8070,7 +8203,7 @@
       <w:pPr>
         <w:pStyle w:val="Heading3"/>
       </w:pPr>
-      <w:bookmarkStart w:id="38" w:name="_Toc230451359"/>
+      <w:bookmarkStart w:id="38" w:name="_Toc230451709"/>
       <w:r>
         <w:t>Waterfall (bottom plot)</w:t>
       </w:r>
@@ -8136,9 +8269,8 @@
       <w:pPr>
         <w:pStyle w:val="Heading3"/>
       </w:pPr>
-      <w:bookmarkStart w:id="39" w:name="_Toc230451360"/>
-      <w:r>
-        <w:lastRenderedPageBreak/>
+      <w:bookmarkStart w:id="39" w:name="_Toc230451710"/>
+      <w:r>
         <w:t>Persistence</w:t>
       </w:r>
       <w:bookmarkEnd w:id="39"/>
@@ -8184,7 +8316,7 @@
       <w:pPr>
         <w:pStyle w:val="Heading3"/>
       </w:pPr>
-      <w:bookmarkStart w:id="40" w:name="_Toc230451361"/>
+      <w:bookmarkStart w:id="40" w:name="_Toc230451711"/>
       <w:r>
         <w:t>Update checks</w:t>
       </w:r>
@@ -8242,7 +8374,7 @@
       <w:pPr>
         <w:pStyle w:val="Heading3"/>
       </w:pPr>
-      <w:bookmarkStart w:id="41" w:name="_Toc230451362"/>
+      <w:bookmarkStart w:id="41" w:name="_Toc230451712"/>
       <w:r>
         <w:t>Tips for pulsar work</w:t>
       </w:r>
@@ -8621,31 +8753,31 @@
       </w:rPr>
     </w:lvl>
   </w:abstractNum>
-  <w:num w:numId="1" w16cid:durableId="519587881">
+  <w:num w:numId="1" w16cid:durableId="95709717">
     <w:abstractNumId w:val="8"/>
   </w:num>
-  <w:num w:numId="2" w16cid:durableId="967129140">
+  <w:num w:numId="2" w16cid:durableId="228881065">
     <w:abstractNumId w:val="6"/>
   </w:num>
-  <w:num w:numId="3" w16cid:durableId="1166245620">
+  <w:num w:numId="3" w16cid:durableId="144904670">
     <w:abstractNumId w:val="5"/>
   </w:num>
-  <w:num w:numId="4" w16cid:durableId="769544233">
+  <w:num w:numId="4" w16cid:durableId="1441291088">
     <w:abstractNumId w:val="4"/>
   </w:num>
-  <w:num w:numId="5" w16cid:durableId="1100640688">
+  <w:num w:numId="5" w16cid:durableId="1541235944">
     <w:abstractNumId w:val="7"/>
   </w:num>
-  <w:num w:numId="6" w16cid:durableId="1845780266">
+  <w:num w:numId="6" w16cid:durableId="1758360602">
     <w:abstractNumId w:val="3"/>
   </w:num>
-  <w:num w:numId="7" w16cid:durableId="1084454054">
+  <w:num w:numId="7" w16cid:durableId="332804065">
     <w:abstractNumId w:val="2"/>
   </w:num>
-  <w:num w:numId="8" w16cid:durableId="775566763">
+  <w:num w:numId="8" w16cid:durableId="821770572">
     <w:abstractNumId w:val="1"/>
   </w:num>
-  <w:num w:numId="9" w16cid:durableId="1319654243">
+  <w:num w:numId="9" w16cid:durableId="402995368">
     <w:abstractNumId w:val="0"/>
   </w:num>
 </w:numbering>
@@ -20040,7 +20172,7 @@
     <w:autoRedefine/>
     <w:uiPriority w:val="39"/>
     <w:unhideWhenUsed/>
-    <w:rsid w:val="00816560"/>
+    <w:rsid w:val="00761DEC"/>
     <w:pPr>
       <w:spacing w:after="100"/>
     </w:pPr>
@@ -20052,7 +20184,7 @@
     <w:autoRedefine/>
     <w:uiPriority w:val="39"/>
     <w:unhideWhenUsed/>
-    <w:rsid w:val="00816560"/>
+    <w:rsid w:val="00761DEC"/>
     <w:pPr>
       <w:spacing w:after="100"/>
       <w:ind w:left="220"/>
@@ -20065,7 +20197,7 @@
     <w:autoRedefine/>
     <w:uiPriority w:val="39"/>
     <w:unhideWhenUsed/>
-    <w:rsid w:val="00816560"/>
+    <w:rsid w:val="00761DEC"/>
     <w:pPr>
       <w:spacing w:after="100"/>
       <w:ind w:left="440"/>
@@ -20076,7 +20208,7 @@
     <w:basedOn w:val="DefaultParagraphFont"/>
     <w:uiPriority w:val="99"/>
     <w:unhideWhenUsed/>
-    <w:rsid w:val="00816560"/>
+    <w:rsid w:val="00761DEC"/>
     <w:rPr>
       <w:color w:val="0000FF" w:themeColor="hyperlink"/>
       <w:u w:val="single"/>

</xml_diff>

<commit_message>
Detect Radioconda by GNU Radio import, not the B210 FPGA image
The launchers only accepted a Radioconda containing the B210 UHD FPGA
image (share/uhd/images/usrp_b210_fpga.bin). That broke on installs that
don't ship the images (e.g. macOS) even when Radioconda was present and
fully usable — and it's wrong for a multi-radio app (SDRPlay/RTL-SDR/etc.
need no UHD images). Both launchers now treat any prefix whose python can
"import gnuradio" as valid.

Also: launcher.sh now expands a leading ~ in the typed path ('read' does
not), and both prompts/messages are clearer. Guide §6 explains to enter the
install root (the folder with bin/python), that ~ works, and that an active
(base) Radioconda shell is auto-detected. Regenerated PDF/DOCX.
</commit_message>
<xml_diff>
--- a/DSES_RFI_Spectrum_Analyzer_Installation.docx
+++ b/DSES_RFI_Spectrum_Analyzer_Installation.docx
@@ -41,7 +41,7 @@
           <w:noProof/>
         </w:rPr>
         <w:drawing>
-          <wp:inline distT="0" distB="0" distL="0" distR="0" wp14:anchorId="65E5EAFA" wp14:editId="40745834">
+          <wp:inline distT="0" distB="0" distL="0" distR="0" wp14:anchorId="51052DEC" wp14:editId="4EBFA7F3">
             <wp:extent cx="1371600" cy="1371600"/>
             <wp:effectExtent l="0" t="0" r="0" b="0"/>
             <wp:docPr id="1" name="Picture 1"/>
@@ -138,7 +138,7 @@
         <w:pStyle w:val="Heading1"/>
         <w:shd w:val="clear" w:color="auto" w:fill="156082"/>
       </w:pPr>
-      <w:bookmarkStart w:id="0" w:name="_Toc230451671"/>
+      <w:bookmarkStart w:id="0" w:name="_Toc230454419"/>
       <w:r>
         <w:lastRenderedPageBreak/>
         <w:t>Contents</w:t>
@@ -169,7 +169,7 @@
       <w:r>
         <w:fldChar w:fldCharType="separate"/>
       </w:r>
-      <w:hyperlink w:anchor="_Toc230451671" w:history="1">
+      <w:hyperlink w:anchor="_Toc230454419" w:history="1">
         <w:r>
           <w:rPr>
             <w:rStyle w:val="Hyperlink"/>
@@ -196,7 +196,7 @@
             <w:noProof/>
             <w:webHidden/>
           </w:rPr>
-          <w:instrText xml:space="preserve"> PAGEREF _Toc230451671 \h </w:instrText>
+          <w:instrText xml:space="preserve"> PAGEREF _Toc230454419 \h </w:instrText>
         </w:r>
         <w:r>
           <w:rPr>
@@ -242,7 +242,7 @@
           <w14:ligatures w14:val="standardContextual"/>
         </w:rPr>
       </w:pPr>
-      <w:hyperlink w:anchor="_Toc230451672" w:history="1">
+      <w:hyperlink w:anchor="_Toc230454420" w:history="1">
         <w:r>
           <w:rPr>
             <w:rStyle w:val="Hyperlink"/>
@@ -269,7 +269,7 @@
             <w:noProof/>
             <w:webHidden/>
           </w:rPr>
-          <w:instrText xml:space="preserve"> PAGEREF _Toc230451672 \h </w:instrText>
+          <w:instrText xml:space="preserve"> PAGEREF _Toc230454420 \h </w:instrText>
         </w:r>
         <w:r>
           <w:rPr>
@@ -315,7 +315,7 @@
           <w14:ligatures w14:val="standardContextual"/>
         </w:rPr>
       </w:pPr>
-      <w:hyperlink w:anchor="_Toc230451673" w:history="1">
+      <w:hyperlink w:anchor="_Toc230454421" w:history="1">
         <w:r>
           <w:rPr>
             <w:rStyle w:val="Hyperlink"/>
@@ -342,7 +342,7 @@
             <w:noProof/>
             <w:webHidden/>
           </w:rPr>
-          <w:instrText xml:space="preserve"> PAGEREF _Toc230451673 \h </w:instrText>
+          <w:instrText xml:space="preserve"> PAGEREF _Toc230454421 \h </w:instrText>
         </w:r>
         <w:r>
           <w:rPr>
@@ -388,7 +388,7 @@
           <w14:ligatures w14:val="standardContextual"/>
         </w:rPr>
       </w:pPr>
-      <w:hyperlink w:anchor="_Toc230451674" w:history="1">
+      <w:hyperlink w:anchor="_Toc230454422" w:history="1">
         <w:r>
           <w:rPr>
             <w:rStyle w:val="Hyperlink"/>
@@ -415,7 +415,7 @@
             <w:noProof/>
             <w:webHidden/>
           </w:rPr>
-          <w:instrText xml:space="preserve"> PAGEREF _Toc230451674 \h </w:instrText>
+          <w:instrText xml:space="preserve"> PAGEREF _Toc230454422 \h </w:instrText>
         </w:r>
         <w:r>
           <w:rPr>
@@ -461,7 +461,7 @@
           <w14:ligatures w14:val="standardContextual"/>
         </w:rPr>
       </w:pPr>
-      <w:hyperlink w:anchor="_Toc230451675" w:history="1">
+      <w:hyperlink w:anchor="_Toc230454423" w:history="1">
         <w:r>
           <w:rPr>
             <w:rStyle w:val="Hyperlink"/>
@@ -488,7 +488,7 @@
             <w:noProof/>
             <w:webHidden/>
           </w:rPr>
-          <w:instrText xml:space="preserve"> PAGEREF _Toc230451675 \h </w:instrText>
+          <w:instrText xml:space="preserve"> PAGEREF _Toc230454423 \h </w:instrText>
         </w:r>
         <w:r>
           <w:rPr>
@@ -534,7 +534,7 @@
           <w14:ligatures w14:val="standardContextual"/>
         </w:rPr>
       </w:pPr>
-      <w:hyperlink w:anchor="_Toc230451676" w:history="1">
+      <w:hyperlink w:anchor="_Toc230454424" w:history="1">
         <w:r>
           <w:rPr>
             <w:rStyle w:val="Hyperlink"/>
@@ -561,7 +561,7 @@
             <w:noProof/>
             <w:webHidden/>
           </w:rPr>
-          <w:instrText xml:space="preserve"> PAGEREF _Toc230451676 \h </w:instrText>
+          <w:instrText xml:space="preserve"> PAGEREF _Toc230454424 \h </w:instrText>
         </w:r>
         <w:r>
           <w:rPr>
@@ -607,7 +607,7 @@
           <w14:ligatures w14:val="standardContextual"/>
         </w:rPr>
       </w:pPr>
-      <w:hyperlink w:anchor="_Toc230451677" w:history="1">
+      <w:hyperlink w:anchor="_Toc230454425" w:history="1">
         <w:r>
           <w:rPr>
             <w:rStyle w:val="Hyperlink"/>
@@ -634,7 +634,7 @@
             <w:noProof/>
             <w:webHidden/>
           </w:rPr>
-          <w:instrText xml:space="preserve"> PAGEREF _Toc230451677 \h </w:instrText>
+          <w:instrText xml:space="preserve"> PAGEREF _Toc230454425 \h </w:instrText>
         </w:r>
         <w:r>
           <w:rPr>
@@ -680,7 +680,7 @@
           <w14:ligatures w14:val="standardContextual"/>
         </w:rPr>
       </w:pPr>
-      <w:hyperlink w:anchor="_Toc230451678" w:history="1">
+      <w:hyperlink w:anchor="_Toc230454426" w:history="1">
         <w:r>
           <w:rPr>
             <w:rStyle w:val="Hyperlink"/>
@@ -707,7 +707,7 @@
             <w:noProof/>
             <w:webHidden/>
           </w:rPr>
-          <w:instrText xml:space="preserve"> PAGEREF _Toc230451678 \h </w:instrText>
+          <w:instrText xml:space="preserve"> PAGEREF _Toc230454426 \h </w:instrText>
         </w:r>
         <w:r>
           <w:rPr>
@@ -753,7 +753,7 @@
           <w14:ligatures w14:val="standardContextual"/>
         </w:rPr>
       </w:pPr>
-      <w:hyperlink w:anchor="_Toc230451679" w:history="1">
+      <w:hyperlink w:anchor="_Toc230454427" w:history="1">
         <w:r>
           <w:rPr>
             <w:rStyle w:val="Hyperlink"/>
@@ -780,7 +780,7 @@
             <w:noProof/>
             <w:webHidden/>
           </w:rPr>
-          <w:instrText xml:space="preserve"> PAGEREF _Toc230451679 \h </w:instrText>
+          <w:instrText xml:space="preserve"> PAGEREF _Toc230454427 \h </w:instrText>
         </w:r>
         <w:r>
           <w:rPr>
@@ -826,7 +826,7 @@
           <w14:ligatures w14:val="standardContextual"/>
         </w:rPr>
       </w:pPr>
-      <w:hyperlink w:anchor="_Toc230451680" w:history="1">
+      <w:hyperlink w:anchor="_Toc230454428" w:history="1">
         <w:r>
           <w:rPr>
             <w:rStyle w:val="Hyperlink"/>
@@ -853,7 +853,7 @@
             <w:noProof/>
             <w:webHidden/>
           </w:rPr>
-          <w:instrText xml:space="preserve"> PAGEREF _Toc230451680 \h </w:instrText>
+          <w:instrText xml:space="preserve"> PAGEREF _Toc230454428 \h </w:instrText>
         </w:r>
         <w:r>
           <w:rPr>
@@ -899,7 +899,7 @@
           <w14:ligatures w14:val="standardContextual"/>
         </w:rPr>
       </w:pPr>
-      <w:hyperlink w:anchor="_Toc230451681" w:history="1">
+      <w:hyperlink w:anchor="_Toc230454429" w:history="1">
         <w:r>
           <w:rPr>
             <w:rStyle w:val="Hyperlink"/>
@@ -926,7 +926,7 @@
             <w:noProof/>
             <w:webHidden/>
           </w:rPr>
-          <w:instrText xml:space="preserve"> PAGEREF _Toc230451681 \h </w:instrText>
+          <w:instrText xml:space="preserve"> PAGEREF _Toc230454429 \h </w:instrText>
         </w:r>
         <w:r>
           <w:rPr>
@@ -972,7 +972,7 @@
           <w14:ligatures w14:val="standardContextual"/>
         </w:rPr>
       </w:pPr>
-      <w:hyperlink w:anchor="_Toc230451682" w:history="1">
+      <w:hyperlink w:anchor="_Toc230454430" w:history="1">
         <w:r>
           <w:rPr>
             <w:rStyle w:val="Hyperlink"/>
@@ -999,7 +999,7 @@
             <w:noProof/>
             <w:webHidden/>
           </w:rPr>
-          <w:instrText xml:space="preserve"> PAGEREF _Toc230451682 \h </w:instrText>
+          <w:instrText xml:space="preserve"> PAGEREF _Toc230454430 \h </w:instrText>
         </w:r>
         <w:r>
           <w:rPr>
@@ -1045,7 +1045,7 @@
           <w14:ligatures w14:val="standardContextual"/>
         </w:rPr>
       </w:pPr>
-      <w:hyperlink w:anchor="_Toc230451683" w:history="1">
+      <w:hyperlink w:anchor="_Toc230454431" w:history="1">
         <w:r>
           <w:rPr>
             <w:rStyle w:val="Hyperlink"/>
@@ -1072,7 +1072,7 @@
             <w:noProof/>
             <w:webHidden/>
           </w:rPr>
-          <w:instrText xml:space="preserve"> PAGEREF _Toc230451683 \h </w:instrText>
+          <w:instrText xml:space="preserve"> PAGEREF _Toc230454431 \h </w:instrText>
         </w:r>
         <w:r>
           <w:rPr>
@@ -1118,7 +1118,7 @@
           <w14:ligatures w14:val="standardContextual"/>
         </w:rPr>
       </w:pPr>
-      <w:hyperlink w:anchor="_Toc230451684" w:history="1">
+      <w:hyperlink w:anchor="_Toc230454432" w:history="1">
         <w:r>
           <w:rPr>
             <w:rStyle w:val="Hyperlink"/>
@@ -1145,7 +1145,7 @@
             <w:noProof/>
             <w:webHidden/>
           </w:rPr>
-          <w:instrText xml:space="preserve"> PAGEREF _Toc230451684 \h </w:instrText>
+          <w:instrText xml:space="preserve"> PAGEREF _Toc230454432 \h </w:instrText>
         </w:r>
         <w:r>
           <w:rPr>
@@ -1191,7 +1191,7 @@
           <w14:ligatures w14:val="standardContextual"/>
         </w:rPr>
       </w:pPr>
-      <w:hyperlink w:anchor="_Toc230451685" w:history="1">
+      <w:hyperlink w:anchor="_Toc230454433" w:history="1">
         <w:r>
           <w:rPr>
             <w:rStyle w:val="Hyperlink"/>
@@ -1218,7 +1218,7 @@
             <w:noProof/>
             <w:webHidden/>
           </w:rPr>
-          <w:instrText xml:space="preserve"> PAGEREF _Toc230451685 \h </w:instrText>
+          <w:instrText xml:space="preserve"> PAGEREF _Toc230454433 \h </w:instrText>
         </w:r>
         <w:r>
           <w:rPr>
@@ -1264,7 +1264,7 @@
           <w14:ligatures w14:val="standardContextual"/>
         </w:rPr>
       </w:pPr>
-      <w:hyperlink w:anchor="_Toc230451686" w:history="1">
+      <w:hyperlink w:anchor="_Toc230454434" w:history="1">
         <w:r>
           <w:rPr>
             <w:rStyle w:val="Hyperlink"/>
@@ -1291,7 +1291,7 @@
             <w:noProof/>
             <w:webHidden/>
           </w:rPr>
-          <w:instrText xml:space="preserve"> PAGEREF _Toc230451686 \h </w:instrText>
+          <w:instrText xml:space="preserve"> PAGEREF _Toc230454434 \h </w:instrText>
         </w:r>
         <w:r>
           <w:rPr>
@@ -1337,7 +1337,7 @@
           <w14:ligatures w14:val="standardContextual"/>
         </w:rPr>
       </w:pPr>
-      <w:hyperlink w:anchor="_Toc230451687" w:history="1">
+      <w:hyperlink w:anchor="_Toc230454435" w:history="1">
         <w:r>
           <w:rPr>
             <w:rStyle w:val="Hyperlink"/>
@@ -1364,7 +1364,7 @@
             <w:noProof/>
             <w:webHidden/>
           </w:rPr>
-          <w:instrText xml:space="preserve"> PAGEREF _Toc230451687 \h </w:instrText>
+          <w:instrText xml:space="preserve"> PAGEREF _Toc230454435 \h </w:instrText>
         </w:r>
         <w:r>
           <w:rPr>
@@ -1410,7 +1410,7 @@
           <w14:ligatures w14:val="standardContextual"/>
         </w:rPr>
       </w:pPr>
-      <w:hyperlink w:anchor="_Toc230451688" w:history="1">
+      <w:hyperlink w:anchor="_Toc230454436" w:history="1">
         <w:r>
           <w:rPr>
             <w:rStyle w:val="Hyperlink"/>
@@ -1437,7 +1437,7 @@
             <w:noProof/>
             <w:webHidden/>
           </w:rPr>
-          <w:instrText xml:space="preserve"> PAGEREF _Toc230451688 \h </w:instrText>
+          <w:instrText xml:space="preserve"> PAGEREF _Toc230454436 \h </w:instrText>
         </w:r>
         <w:r>
           <w:rPr>
@@ -1483,7 +1483,7 @@
           <w14:ligatures w14:val="standardContextual"/>
         </w:rPr>
       </w:pPr>
-      <w:hyperlink w:anchor="_Toc230451689" w:history="1">
+      <w:hyperlink w:anchor="_Toc230454437" w:history="1">
         <w:r>
           <w:rPr>
             <w:rStyle w:val="Hyperlink"/>
@@ -1510,7 +1510,7 @@
             <w:noProof/>
             <w:webHidden/>
           </w:rPr>
-          <w:instrText xml:space="preserve"> PAGEREF _Toc230451689 \h </w:instrText>
+          <w:instrText xml:space="preserve"> PAGEREF _Toc230454437 \h </w:instrText>
         </w:r>
         <w:r>
           <w:rPr>
@@ -1556,7 +1556,7 @@
           <w14:ligatures w14:val="standardContextual"/>
         </w:rPr>
       </w:pPr>
-      <w:hyperlink w:anchor="_Toc230451690" w:history="1">
+      <w:hyperlink w:anchor="_Toc230454438" w:history="1">
         <w:r>
           <w:rPr>
             <w:rStyle w:val="Hyperlink"/>
@@ -1583,7 +1583,7 @@
             <w:noProof/>
             <w:webHidden/>
           </w:rPr>
-          <w:instrText xml:space="preserve"> PAGEREF _Toc230451690 \h </w:instrText>
+          <w:instrText xml:space="preserve"> PAGEREF _Toc230454438 \h </w:instrText>
         </w:r>
         <w:r>
           <w:rPr>
@@ -1629,7 +1629,7 @@
           <w14:ligatures w14:val="standardContextual"/>
         </w:rPr>
       </w:pPr>
-      <w:hyperlink w:anchor="_Toc230451691" w:history="1">
+      <w:hyperlink w:anchor="_Toc230454439" w:history="1">
         <w:r>
           <w:rPr>
             <w:rStyle w:val="Hyperlink"/>
@@ -1656,7 +1656,7 @@
             <w:noProof/>
             <w:webHidden/>
           </w:rPr>
-          <w:instrText xml:space="preserve"> PAGEREF _Toc230451691 \h </w:instrText>
+          <w:instrText xml:space="preserve"> PAGEREF _Toc230454439 \h </w:instrText>
         </w:r>
         <w:r>
           <w:rPr>
@@ -1702,7 +1702,7 @@
           <w14:ligatures w14:val="standardContextual"/>
         </w:rPr>
       </w:pPr>
-      <w:hyperlink w:anchor="_Toc230451692" w:history="1">
+      <w:hyperlink w:anchor="_Toc230454440" w:history="1">
         <w:r>
           <w:rPr>
             <w:rStyle w:val="Hyperlink"/>
@@ -1729,7 +1729,7 @@
             <w:noProof/>
             <w:webHidden/>
           </w:rPr>
-          <w:instrText xml:space="preserve"> PAGEREF _Toc230451692 \h </w:instrText>
+          <w:instrText xml:space="preserve"> PAGEREF _Toc230454440 \h </w:instrText>
         </w:r>
         <w:r>
           <w:rPr>
@@ -1775,7 +1775,7 @@
           <w14:ligatures w14:val="standardContextual"/>
         </w:rPr>
       </w:pPr>
-      <w:hyperlink w:anchor="_Toc230451693" w:history="1">
+      <w:hyperlink w:anchor="_Toc230454441" w:history="1">
         <w:r>
           <w:rPr>
             <w:rStyle w:val="Hyperlink"/>
@@ -1802,7 +1802,7 @@
             <w:noProof/>
             <w:webHidden/>
           </w:rPr>
-          <w:instrText xml:space="preserve"> PAGEREF _Toc230451693 \h </w:instrText>
+          <w:instrText xml:space="preserve"> PAGEREF _Toc230454441 \h </w:instrText>
         </w:r>
         <w:r>
           <w:rPr>
@@ -1848,7 +1848,7 @@
           <w14:ligatures w14:val="standardContextual"/>
         </w:rPr>
       </w:pPr>
-      <w:hyperlink w:anchor="_Toc230451694" w:history="1">
+      <w:hyperlink w:anchor="_Toc230454442" w:history="1">
         <w:r>
           <w:rPr>
             <w:rStyle w:val="Hyperlink"/>
@@ -1875,7 +1875,7 @@
             <w:noProof/>
             <w:webHidden/>
           </w:rPr>
-          <w:instrText xml:space="preserve"> PAGEREF _Toc230451694 \h </w:instrText>
+          <w:instrText xml:space="preserve"> PAGEREF _Toc230454442 \h </w:instrText>
         </w:r>
         <w:r>
           <w:rPr>
@@ -1921,7 +1921,7 @@
           <w14:ligatures w14:val="standardContextual"/>
         </w:rPr>
       </w:pPr>
-      <w:hyperlink w:anchor="_Toc230451695" w:history="1">
+      <w:hyperlink w:anchor="_Toc230454443" w:history="1">
         <w:r>
           <w:rPr>
             <w:rStyle w:val="Hyperlink"/>
@@ -1948,7 +1948,7 @@
             <w:noProof/>
             <w:webHidden/>
           </w:rPr>
-          <w:instrText xml:space="preserve"> PAGEREF _Toc230451695 \h </w:instrText>
+          <w:instrText xml:space="preserve"> PAGEREF _Toc230454443 \h </w:instrText>
         </w:r>
         <w:r>
           <w:rPr>
@@ -1994,7 +1994,7 @@
           <w14:ligatures w14:val="standardContextual"/>
         </w:rPr>
       </w:pPr>
-      <w:hyperlink w:anchor="_Toc230451696" w:history="1">
+      <w:hyperlink w:anchor="_Toc230454444" w:history="1">
         <w:r>
           <w:rPr>
             <w:rStyle w:val="Hyperlink"/>
@@ -2021,7 +2021,7 @@
             <w:noProof/>
             <w:webHidden/>
           </w:rPr>
-          <w:instrText xml:space="preserve"> PAGEREF _Toc230451696 \h </w:instrText>
+          <w:instrText xml:space="preserve"> PAGEREF _Toc230454444 \h </w:instrText>
         </w:r>
         <w:r>
           <w:rPr>
@@ -2067,7 +2067,7 @@
           <w14:ligatures w14:val="standardContextual"/>
         </w:rPr>
       </w:pPr>
-      <w:hyperlink w:anchor="_Toc230451697" w:history="1">
+      <w:hyperlink w:anchor="_Toc230454445" w:history="1">
         <w:r>
           <w:rPr>
             <w:rStyle w:val="Hyperlink"/>
@@ -2094,7 +2094,7 @@
             <w:noProof/>
             <w:webHidden/>
           </w:rPr>
-          <w:instrText xml:space="preserve"> PAGEREF _Toc230451697 \h </w:instrText>
+          <w:instrText xml:space="preserve"> PAGEREF _Toc230454445 \h </w:instrText>
         </w:r>
         <w:r>
           <w:rPr>
@@ -2140,7 +2140,7 @@
           <w14:ligatures w14:val="standardContextual"/>
         </w:rPr>
       </w:pPr>
-      <w:hyperlink w:anchor="_Toc230451698" w:history="1">
+      <w:hyperlink w:anchor="_Toc230454446" w:history="1">
         <w:r>
           <w:rPr>
             <w:rStyle w:val="Hyperlink"/>
@@ -2167,7 +2167,7 @@
             <w:noProof/>
             <w:webHidden/>
           </w:rPr>
-          <w:instrText xml:space="preserve"> PAGEREF _Toc230451698 \h </w:instrText>
+          <w:instrText xml:space="preserve"> PAGEREF _Toc230454446 \h </w:instrText>
         </w:r>
         <w:r>
           <w:rPr>
@@ -2187,7 +2187,7 @@
             <w:noProof/>
             <w:webHidden/>
           </w:rPr>
-          <w:t>13</w:t>
+          <w:t>14</w:t>
         </w:r>
         <w:r>
           <w:rPr>
@@ -2213,7 +2213,7 @@
           <w14:ligatures w14:val="standardContextual"/>
         </w:rPr>
       </w:pPr>
-      <w:hyperlink w:anchor="_Toc230451699" w:history="1">
+      <w:hyperlink w:anchor="_Toc230454447" w:history="1">
         <w:r>
           <w:rPr>
             <w:rStyle w:val="Hyperlink"/>
@@ -2240,7 +2240,7 @@
             <w:noProof/>
             <w:webHidden/>
           </w:rPr>
-          <w:instrText xml:space="preserve"> PAGEREF _Toc230451699 \h </w:instrText>
+          <w:instrText xml:space="preserve"> PAGEREF _Toc230454447 \h </w:instrText>
         </w:r>
         <w:r>
           <w:rPr>
@@ -2260,7 +2260,7 @@
             <w:noProof/>
             <w:webHidden/>
           </w:rPr>
-          <w:t>13</w:t>
+          <w:t>14</w:t>
         </w:r>
         <w:r>
           <w:rPr>
@@ -2286,7 +2286,7 @@
           <w14:ligatures w14:val="standardContextual"/>
         </w:rPr>
       </w:pPr>
-      <w:hyperlink w:anchor="_Toc230451700" w:history="1">
+      <w:hyperlink w:anchor="_Toc230454448" w:history="1">
         <w:r>
           <w:rPr>
             <w:rStyle w:val="Hyperlink"/>
@@ -2313,7 +2313,7 @@
             <w:noProof/>
             <w:webHidden/>
           </w:rPr>
-          <w:instrText xml:space="preserve"> PAGEREF _Toc230451700 \h </w:instrText>
+          <w:instrText xml:space="preserve"> PAGEREF _Toc230454448 \h </w:instrText>
         </w:r>
         <w:r>
           <w:rPr>
@@ -2359,7 +2359,7 @@
           <w14:ligatures w14:val="standardContextual"/>
         </w:rPr>
       </w:pPr>
-      <w:hyperlink w:anchor="_Toc230451701" w:history="1">
+      <w:hyperlink w:anchor="_Toc230454449" w:history="1">
         <w:r>
           <w:rPr>
             <w:rStyle w:val="Hyperlink"/>
@@ -2386,7 +2386,7 @@
             <w:noProof/>
             <w:webHidden/>
           </w:rPr>
-          <w:instrText xml:space="preserve"> PAGEREF _Toc230451701 \h </w:instrText>
+          <w:instrText xml:space="preserve"> PAGEREF _Toc230454449 \h </w:instrText>
         </w:r>
         <w:r>
           <w:rPr>
@@ -2432,7 +2432,7 @@
           <w14:ligatures w14:val="standardContextual"/>
         </w:rPr>
       </w:pPr>
-      <w:hyperlink w:anchor="_Toc230451702" w:history="1">
+      <w:hyperlink w:anchor="_Toc230454450" w:history="1">
         <w:r>
           <w:rPr>
             <w:rStyle w:val="Hyperlink"/>
@@ -2459,7 +2459,7 @@
             <w:noProof/>
             <w:webHidden/>
           </w:rPr>
-          <w:instrText xml:space="preserve"> PAGEREF _Toc230451702 \h </w:instrText>
+          <w:instrText xml:space="preserve"> PAGEREF _Toc230454450 \h </w:instrText>
         </w:r>
         <w:r>
           <w:rPr>
@@ -2505,7 +2505,7 @@
           <w14:ligatures w14:val="standardContextual"/>
         </w:rPr>
       </w:pPr>
-      <w:hyperlink w:anchor="_Toc230451703" w:history="1">
+      <w:hyperlink w:anchor="_Toc230454451" w:history="1">
         <w:r>
           <w:rPr>
             <w:rStyle w:val="Hyperlink"/>
@@ -2532,7 +2532,7 @@
             <w:noProof/>
             <w:webHidden/>
           </w:rPr>
-          <w:instrText xml:space="preserve"> PAGEREF _Toc230451703 \h </w:instrText>
+          <w:instrText xml:space="preserve"> PAGEREF _Toc230454451 \h </w:instrText>
         </w:r>
         <w:r>
           <w:rPr>
@@ -2578,7 +2578,7 @@
           <w14:ligatures w14:val="standardContextual"/>
         </w:rPr>
       </w:pPr>
-      <w:hyperlink w:anchor="_Toc230451704" w:history="1">
+      <w:hyperlink w:anchor="_Toc230454452" w:history="1">
         <w:r>
           <w:rPr>
             <w:rStyle w:val="Hyperlink"/>
@@ -2605,7 +2605,7 @@
             <w:noProof/>
             <w:webHidden/>
           </w:rPr>
-          <w:instrText xml:space="preserve"> PAGEREF _Toc230451704 \h </w:instrText>
+          <w:instrText xml:space="preserve"> PAGEREF _Toc230454452 \h </w:instrText>
         </w:r>
         <w:r>
           <w:rPr>
@@ -2625,7 +2625,7 @@
             <w:noProof/>
             <w:webHidden/>
           </w:rPr>
-          <w:t>15</w:t>
+          <w:t>16</w:t>
         </w:r>
         <w:r>
           <w:rPr>
@@ -2651,7 +2651,7 @@
           <w14:ligatures w14:val="standardContextual"/>
         </w:rPr>
       </w:pPr>
-      <w:hyperlink w:anchor="_Toc230451705" w:history="1">
+      <w:hyperlink w:anchor="_Toc230454453" w:history="1">
         <w:r>
           <w:rPr>
             <w:rStyle w:val="Hyperlink"/>
@@ -2678,7 +2678,7 @@
             <w:noProof/>
             <w:webHidden/>
           </w:rPr>
-          <w:instrText xml:space="preserve"> PAGEREF _Toc230451705 \h </w:instrText>
+          <w:instrText xml:space="preserve"> PAGEREF _Toc230454453 \h </w:instrText>
         </w:r>
         <w:r>
           <w:rPr>
@@ -2724,7 +2724,7 @@
           <w14:ligatures w14:val="standardContextual"/>
         </w:rPr>
       </w:pPr>
-      <w:hyperlink w:anchor="_Toc230451706" w:history="1">
+      <w:hyperlink w:anchor="_Toc230454454" w:history="1">
         <w:r>
           <w:rPr>
             <w:rStyle w:val="Hyperlink"/>
@@ -2751,7 +2751,7 @@
             <w:noProof/>
             <w:webHidden/>
           </w:rPr>
-          <w:instrText xml:space="preserve"> PAGEREF _Toc230451706 \h </w:instrText>
+          <w:instrText xml:space="preserve"> PAGEREF _Toc230454454 \h </w:instrText>
         </w:r>
         <w:r>
           <w:rPr>
@@ -2797,7 +2797,7 @@
           <w14:ligatures w14:val="standardContextual"/>
         </w:rPr>
       </w:pPr>
-      <w:hyperlink w:anchor="_Toc230451707" w:history="1">
+      <w:hyperlink w:anchor="_Toc230454455" w:history="1">
         <w:r>
           <w:rPr>
             <w:rStyle w:val="Hyperlink"/>
@@ -2824,7 +2824,7 @@
             <w:noProof/>
             <w:webHidden/>
           </w:rPr>
-          <w:instrText xml:space="preserve"> PAGEREF _Toc230451707 \h </w:instrText>
+          <w:instrText xml:space="preserve"> PAGEREF _Toc230454455 \h </w:instrText>
         </w:r>
         <w:r>
           <w:rPr>
@@ -2870,7 +2870,7 @@
           <w14:ligatures w14:val="standardContextual"/>
         </w:rPr>
       </w:pPr>
-      <w:hyperlink w:anchor="_Toc230451708" w:history="1">
+      <w:hyperlink w:anchor="_Toc230454456" w:history="1">
         <w:r>
           <w:rPr>
             <w:rStyle w:val="Hyperlink"/>
@@ -2897,7 +2897,7 @@
             <w:noProof/>
             <w:webHidden/>
           </w:rPr>
-          <w:instrText xml:space="preserve"> PAGEREF _Toc230451708 \h </w:instrText>
+          <w:instrText xml:space="preserve"> PAGEREF _Toc230454456 \h </w:instrText>
         </w:r>
         <w:r>
           <w:rPr>
@@ -2943,7 +2943,7 @@
           <w14:ligatures w14:val="standardContextual"/>
         </w:rPr>
       </w:pPr>
-      <w:hyperlink w:anchor="_Toc230451709" w:history="1">
+      <w:hyperlink w:anchor="_Toc230454457" w:history="1">
         <w:r>
           <w:rPr>
             <w:rStyle w:val="Hyperlink"/>
@@ -2970,7 +2970,7 @@
             <w:noProof/>
             <w:webHidden/>
           </w:rPr>
-          <w:instrText xml:space="preserve"> PAGEREF _Toc230451709 \h </w:instrText>
+          <w:instrText xml:space="preserve"> PAGEREF _Toc230454457 \h </w:instrText>
         </w:r>
         <w:r>
           <w:rPr>
@@ -3016,7 +3016,7 @@
           <w14:ligatures w14:val="standardContextual"/>
         </w:rPr>
       </w:pPr>
-      <w:hyperlink w:anchor="_Toc230451710" w:history="1">
+      <w:hyperlink w:anchor="_Toc230454458" w:history="1">
         <w:r>
           <w:rPr>
             <w:rStyle w:val="Hyperlink"/>
@@ -3043,7 +3043,7 @@
             <w:noProof/>
             <w:webHidden/>
           </w:rPr>
-          <w:instrText xml:space="preserve"> PAGEREF _Toc230451710 \h </w:instrText>
+          <w:instrText xml:space="preserve"> PAGEREF _Toc230454458 \h </w:instrText>
         </w:r>
         <w:r>
           <w:rPr>
@@ -3089,7 +3089,7 @@
           <w14:ligatures w14:val="standardContextual"/>
         </w:rPr>
       </w:pPr>
-      <w:hyperlink w:anchor="_Toc230451711" w:history="1">
+      <w:hyperlink w:anchor="_Toc230454459" w:history="1">
         <w:r>
           <w:rPr>
             <w:rStyle w:val="Hyperlink"/>
@@ -3116,7 +3116,7 @@
             <w:noProof/>
             <w:webHidden/>
           </w:rPr>
-          <w:instrText xml:space="preserve"> PAGEREF _Toc230451711 \h </w:instrText>
+          <w:instrText xml:space="preserve"> PAGEREF _Toc230454459 \h </w:instrText>
         </w:r>
         <w:r>
           <w:rPr>
@@ -3162,7 +3162,7 @@
           <w14:ligatures w14:val="standardContextual"/>
         </w:rPr>
       </w:pPr>
-      <w:hyperlink w:anchor="_Toc230451712" w:history="1">
+      <w:hyperlink w:anchor="_Toc230454460" w:history="1">
         <w:r>
           <w:rPr>
             <w:rStyle w:val="Hyperlink"/>
@@ -3189,7 +3189,7 @@
             <w:noProof/>
             <w:webHidden/>
           </w:rPr>
-          <w:instrText xml:space="preserve"> PAGEREF _Toc230451712 \h </w:instrText>
+          <w:instrText xml:space="preserve"> PAGEREF _Toc230454460 \h </w:instrText>
         </w:r>
         <w:r>
           <w:rPr>
@@ -3235,7 +3235,7 @@
         <w:pStyle w:val="Heading1"/>
         <w:shd w:val="clear" w:color="auto" w:fill="156082"/>
       </w:pPr>
-      <w:bookmarkStart w:id="1" w:name="_Toc230451672"/>
+      <w:bookmarkStart w:id="1" w:name="_Toc230454420"/>
       <w:r>
         <w:lastRenderedPageBreak/>
         <w:t xml:space="preserve">DSES Spectrum Analyzer — </w:t>
@@ -3314,7 +3314,7 @@
       <w:pPr>
         <w:pStyle w:val="Heading2"/>
       </w:pPr>
-      <w:bookmarkStart w:id="2" w:name="_Toc230451673"/>
+      <w:bookmarkStart w:id="2" w:name="_Toc230454421"/>
       <w:r>
         <w:t>1. What the recipient needs to know first</w:t>
       </w:r>
@@ -3431,7 +3431,7 @@
       <w:pPr>
         <w:pStyle w:val="Heading3"/>
       </w:pPr>
-      <w:bookmarkStart w:id="3" w:name="_Toc230451674"/>
+      <w:bookmarkStart w:id="3" w:name="_Toc230454422"/>
       <w:r>
         <w:t>System requirements</w:t>
       </w:r>
@@ -3706,7 +3706,7 @@
       <w:pPr>
         <w:pStyle w:val="Heading2"/>
       </w:pPr>
-      <w:bookmarkStart w:id="4" w:name="_Toc230451675"/>
+      <w:bookmarkStart w:id="4" w:name="_Toc230454423"/>
       <w:r>
         <w:t>2. Installing Radioconda</w:t>
       </w:r>
@@ -3716,7 +3716,7 @@
       <w:pPr>
         <w:pStyle w:val="Heading3"/>
       </w:pPr>
-      <w:bookmarkStart w:id="5" w:name="_Toc230451676"/>
+      <w:bookmarkStart w:id="5" w:name="_Toc230454424"/>
       <w:r>
         <w:t>2.1 Windows 11</w:t>
       </w:r>
@@ -3940,7 +3940,7 @@
       <w:pPr>
         <w:pStyle w:val="Heading3"/>
       </w:pPr>
-      <w:bookmarkStart w:id="6" w:name="_Toc230451677"/>
+      <w:bookmarkStart w:id="6" w:name="_Toc230454425"/>
       <w:r>
         <w:t>2.2 Linux</w:t>
       </w:r>
@@ -4210,7 +4210,7 @@
       <w:pPr>
         <w:pStyle w:val="Heading3"/>
       </w:pPr>
-      <w:bookmarkStart w:id="7" w:name="_Toc230451678"/>
+      <w:bookmarkStart w:id="7" w:name="_Toc230454426"/>
       <w:r>
         <w:t>2.3 macOS (Intel and Apple Silicon)</w:t>
       </w:r>
@@ -4527,7 +4527,7 @@
       <w:pPr>
         <w:pStyle w:val="Heading2"/>
       </w:pPr>
-      <w:bookmarkStart w:id="8" w:name="_Toc230451679"/>
+      <w:bookmarkStart w:id="8" w:name="_Toc230454427"/>
       <w:r>
         <w:t xml:space="preserve">3. Installing the DSES </w:t>
       </w:r>
@@ -4598,7 +4598,7 @@
       <w:pPr>
         <w:pStyle w:val="Heading3"/>
       </w:pPr>
-      <w:bookmarkStart w:id="9" w:name="_Toc230451680"/>
+      <w:bookmarkStart w:id="9" w:name="_Toc230454428"/>
       <w:r>
         <w:t>3.1 Windows 11</w:t>
       </w:r>
@@ -4873,7 +4873,7 @@
       <w:pPr>
         <w:pStyle w:val="Heading3"/>
       </w:pPr>
-      <w:bookmarkStart w:id="10" w:name="_Toc230451681"/>
+      <w:bookmarkStart w:id="10" w:name="_Toc230454429"/>
       <w:r>
         <w:t>3.2 Linux</w:t>
       </w:r>
@@ -5169,7 +5169,7 @@
       <w:pPr>
         <w:pStyle w:val="Heading3"/>
       </w:pPr>
-      <w:bookmarkStart w:id="11" w:name="_Toc230451682"/>
+      <w:bookmarkStart w:id="11" w:name="_Toc230454430"/>
       <w:r>
         <w:lastRenderedPageBreak/>
         <w:t>3.3 macOS</w:t>
@@ -5366,7 +5366,7 @@
       <w:pPr>
         <w:pStyle w:val="Heading2"/>
       </w:pPr>
-      <w:bookmarkStart w:id="12" w:name="_Toc230451683"/>
+      <w:bookmarkStart w:id="12" w:name="_Toc230454431"/>
       <w:r>
         <w:t>3A. Extra setup for SDRPlay receivers (RSP1A / RSP1B / RSPduo / RSPdx)</w:t>
       </w:r>
@@ -5401,7 +5401,7 @@
       <w:pPr>
         <w:pStyle w:val="Heading3"/>
       </w:pPr>
-      <w:bookmarkStart w:id="13" w:name="_Toc230451684"/>
+      <w:bookmarkStart w:id="13" w:name="_Toc230454432"/>
       <w:r>
         <w:t>3A.1 Install the SDRplay API</w:t>
       </w:r>
@@ -5513,7 +5513,7 @@
       <w:pPr>
         <w:pStyle w:val="Heading3"/>
       </w:pPr>
-      <w:bookmarkStart w:id="14" w:name="_Toc230451685"/>
+      <w:bookmarkStart w:id="14" w:name="_Toc230454433"/>
       <w:r>
         <w:lastRenderedPageBreak/>
         <w:t>3A.2 Install the SoapySDRPlay module</w:t>
@@ -5882,7 +5882,7 @@
       <w:pPr>
         <w:pStyle w:val="Heading2"/>
       </w:pPr>
-      <w:bookmarkStart w:id="15" w:name="_Toc230451686"/>
+      <w:bookmarkStart w:id="15" w:name="_Toc230454434"/>
       <w:r>
         <w:lastRenderedPageBreak/>
         <w:t>4. First-run checklist</w:t>
@@ -5995,7 +5995,7 @@
       <w:pPr>
         <w:pStyle w:val="Heading3"/>
       </w:pPr>
-      <w:bookmarkStart w:id="16" w:name="_Toc230451687"/>
+      <w:bookmarkStart w:id="16" w:name="_Toc230454435"/>
       <w:r>
         <w:t>Recommended one-time VOLK tuning</w:t>
       </w:r>
@@ -6138,7 +6138,7 @@
       <w:pPr>
         <w:pStyle w:val="Heading2"/>
       </w:pPr>
-      <w:bookmarkStart w:id="17" w:name="_Toc230451688"/>
+      <w:bookmarkStart w:id="17" w:name="_Toc230454436"/>
       <w:r>
         <w:t>5. Updating to a new version</w:t>
       </w:r>
@@ -6148,7 +6148,7 @@
       <w:pPr>
         <w:pStyle w:val="Heading3"/>
       </w:pPr>
-      <w:bookmarkStart w:id="18" w:name="_Toc230451689"/>
+      <w:bookmarkStart w:id="18" w:name="_Toc230454437"/>
       <w:r>
         <w:t>Auto-update notifications</w:t>
       </w:r>
@@ -6240,7 +6240,7 @@
       <w:pPr>
         <w:pStyle w:val="Heading3"/>
       </w:pPr>
-      <w:bookmarkStart w:id="19" w:name="_Toc230451690"/>
+      <w:bookmarkStart w:id="19" w:name="_Toc230454438"/>
       <w:r>
         <w:t>Performing the update</w:t>
       </w:r>
@@ -6336,7 +6336,7 @@
       <w:pPr>
         <w:pStyle w:val="Heading3"/>
       </w:pPr>
-      <w:bookmarkStart w:id="20" w:name="_Toc230451691"/>
+      <w:bookmarkStart w:id="20" w:name="_Toc230454439"/>
       <w:r>
         <w:t>What is preserved across versions</w:t>
       </w:r>
@@ -6519,7 +6519,7 @@
       <w:pPr>
         <w:pStyle w:val="Heading3"/>
       </w:pPr>
-      <w:bookmarkStart w:id="21" w:name="_Toc230451692"/>
+      <w:bookmarkStart w:id="21" w:name="_Toc230454440"/>
       <w:r>
         <w:t>Backing up your settings</w:t>
       </w:r>
@@ -6578,7 +6578,7 @@
       <w:pPr>
         <w:pStyle w:val="Heading2"/>
       </w:pPr>
-      <w:bookmarkStart w:id="22" w:name="_Toc230451693"/>
+      <w:bookmarkStart w:id="22" w:name="_Toc230454441"/>
       <w:r>
         <w:t>6. Troubleshooting</w:t>
       </w:r>
@@ -6588,7 +6588,7 @@
       <w:pPr>
         <w:pStyle w:val="Heading3"/>
       </w:pPr>
-      <w:bookmarkStart w:id="23" w:name="_Toc230451694"/>
+      <w:bookmarkStart w:id="23" w:name="_Toc230454442"/>
       <w:r>
         <w:t>“Radioconda not found in standard locations”</w:t>
       </w:r>
@@ -6647,10 +6647,93 @@
       </w:r>
     </w:p>
     <w:p>
+      <w:r>
+        <w:t xml:space="preserve">When you type the path, give the </w:t>
+      </w:r>
+      <w:r>
+        <w:rPr>
+          <w:b/>
+        </w:rPr>
+        <w:t>install root</w:t>
+      </w:r>
+      <w:r>
+        <w:t xml:space="preserve"> — the folder that contains </w:t>
+      </w:r>
+      <w:r>
+        <w:rPr>
+          <w:rFonts w:ascii="Consolas" w:hAnsi="Consolas"/>
+          <w:sz w:val="20"/>
+        </w:rPr>
+        <w:t>bin/python</w:t>
+      </w:r>
+      <w:r>
+        <w:t xml:space="preserve"> (macOS/Linux) or </w:t>
+      </w:r>
+      <w:r>
+        <w:rPr>
+          <w:rFonts w:ascii="Consolas" w:hAnsi="Consolas"/>
+          <w:sz w:val="20"/>
+        </w:rPr>
+        <w:t>python.exe</w:t>
+      </w:r>
+      <w:r>
+        <w:t xml:space="preserve"> (Windows), e.g. </w:t>
+      </w:r>
+      <w:r>
+        <w:rPr>
+          <w:rFonts w:ascii="Consolas" w:hAnsi="Consolas"/>
+          <w:sz w:val="20"/>
+        </w:rPr>
+        <w:t>~/radioconda</w:t>
+      </w:r>
+      <w:r>
+        <w:t xml:space="preserve"> — </w:t>
+      </w:r>
+      <w:r>
+        <w:rPr>
+          <w:b/>
+        </w:rPr>
+        <w:t>not</w:t>
+      </w:r>
+      <w:r>
+        <w:t xml:space="preserve"> its </w:t>
+      </w:r>
+      <w:r>
+        <w:rPr>
+          <w:rFonts w:ascii="Consolas" w:hAnsi="Consolas"/>
+          <w:sz w:val="20"/>
+        </w:rPr>
+        <w:t>bin/</w:t>
+      </w:r>
+      <w:r>
+        <w:t xml:space="preserve"> subfolder. A leading </w:t>
+      </w:r>
+      <w:r>
+        <w:rPr>
+          <w:rFonts w:ascii="Consolas" w:hAnsi="Consolas"/>
+          <w:sz w:val="20"/>
+        </w:rPr>
+        <w:t>~</w:t>
+      </w:r>
+      <w:r>
+        <w:t xml:space="preserve"> is expanded to your home directory. On macOS/Linux, the launcher also accepts an already-activated conda environment, so if your shell prompt shows </w:t>
+      </w:r>
+      <w:r>
+        <w:rPr>
+          <w:rFonts w:ascii="Consolas" w:hAnsi="Consolas"/>
+          <w:sz w:val="20"/>
+        </w:rPr>
+        <w:t>(base)</w:t>
+      </w:r>
+      <w:r>
+        <w:t xml:space="preserve"> for a Radioconda base env, just running the launcher from that shell is enough.</w:t>
+      </w:r>
+    </w:p>
+    <w:p>
       <w:pPr>
         <w:pStyle w:val="Heading3"/>
       </w:pPr>
-      <w:bookmarkStart w:id="24" w:name="_Toc230451695"/>
+      <w:bookmarkStart w:id="24" w:name="_Toc230454443"/>
       <w:r>
         <w:t>“No UHD Devices Found”</w:t>
       </w:r>
@@ -6748,7 +6831,7 @@
       <w:pPr>
         <w:pStyle w:val="Heading3"/>
       </w:pPr>
-      <w:bookmarkStart w:id="25" w:name="_Toc230451696"/>
+      <w:bookmarkStart w:id="25" w:name="_Toc230454444"/>
       <w:r>
         <w:t>Persistent “O” overflows at high sample rates</w:t>
       </w:r>
@@ -6792,7 +6875,7 @@
       <w:pPr>
         <w:pStyle w:val="Heading3"/>
       </w:pPr>
-      <w:bookmarkStart w:id="26" w:name="_Toc230451697"/>
+      <w:bookmarkStart w:id="26" w:name="_Toc230454445"/>
       <w:r>
         <w:t>Spectrum looks flat at −140 dB</w:t>
       </w:r>
@@ -6831,9 +6914,13 @@
       <w:pPr>
         <w:pStyle w:val="Heading3"/>
       </w:pPr>
-      <w:bookmarkStart w:id="27" w:name="_Toc230451698"/>
-      <w:r>
-        <w:t>macOS: “developer cannot be verified”</w:t>
+      <w:bookmarkStart w:id="27" w:name="_Toc230454446"/>
+      <w:r>
+        <w:lastRenderedPageBreak/>
+        <w:t xml:space="preserve">macOS: </w:t>
+      </w:r>
+      <w:r>
+        <w:t>“developer cannot be verified”</w:t>
       </w:r>
       <w:bookmarkEnd w:id="27"/>
     </w:p>
@@ -6867,7 +6954,7 @@
       <w:pPr>
         <w:pStyle w:val="Heading3"/>
       </w:pPr>
-      <w:bookmarkStart w:id="28" w:name="_Toc230451699"/>
+      <w:bookmarkStart w:id="28" w:name="_Toc230454447"/>
       <w:r>
         <w:t>Settings won’t persist</w:t>
       </w:r>
@@ -6875,10 +6962,7 @@
     </w:p>
     <w:p>
       <w:r>
-        <w:t xml:space="preserve">Settings should be saved </w:t>
-      </w:r>
-      <w:r>
-        <w:t>automatically on every change and on app close. If they aren’t:</w:t>
+        <w:t>Settings should be saved automatically on every change and on app close. If they aren’t:</w:t>
       </w:r>
     </w:p>
     <w:p>
@@ -6886,7 +6970,6 @@
         <w:pStyle w:val="ListBullet"/>
       </w:pPr>
       <w:r>
-        <w:lastRenderedPageBreak/>
         <w:t xml:space="preserve">Check the path printed in </w:t>
       </w:r>
       <w:r>
@@ -6920,7 +7003,7 @@
       <w:pPr>
         <w:pStyle w:val="Heading2"/>
       </w:pPr>
-      <w:bookmarkStart w:id="29" w:name="_Toc230451700"/>
+      <w:bookmarkStart w:id="29" w:name="_Toc230454448"/>
       <w:r>
         <w:t>7. Appendix A — Settings file reference</w:t>
       </w:r>
@@ -7129,7 +7212,7 @@
       <w:pPr>
         <w:pStyle w:val="Heading2"/>
       </w:pPr>
-      <w:bookmarkStart w:id="30" w:name="_Toc230451701"/>
+      <w:bookmarkStart w:id="30" w:name="_Toc230454449"/>
       <w:r>
         <w:t>8. Appendix B — Device selection and SigMF playback</w:t>
       </w:r>
@@ -7139,7 +7222,7 @@
       <w:pPr>
         <w:pStyle w:val="Heading3"/>
       </w:pPr>
-      <w:bookmarkStart w:id="31" w:name="_Toc230451702"/>
+      <w:bookmarkStart w:id="31" w:name="_Toc230454450"/>
       <w:r>
         <w:t>Choosing among multiple radios</w:t>
       </w:r>
@@ -7158,7 +7241,13 @@
         <w:rPr>
           <w:b/>
         </w:rPr>
-        <w:t>No radio attached, no playback sample:</w:t>
+        <w:t xml:space="preserve">No radio attached, no playback </w:t>
+      </w:r>
+      <w:r>
+        <w:rPr>
+          <w:b/>
+        </w:rPr>
+        <w:t>sample:</w:t>
       </w:r>
       <w:r>
         <w:t xml:space="preserve"> an error dialog says “No radio found” and explains how to enable playback (see below). The app exits.</w:t>
@@ -7172,13 +7261,7 @@
         <w:rPr>
           <w:b/>
         </w:rPr>
-        <w:t xml:space="preserve">No radio attached, but </w:t>
-      </w:r>
-      <w:r>
-        <w:rPr>
-          <w:b/>
-        </w:rPr>
-        <w:t>`sample.sigmf-data` + `sample.sigmf-meta` are present next to the program:</w:t>
+        <w:t>No radio attached, but `sample.sigmf-data` + `sample.sigmf-meta` are present next to the program:</w:t>
       </w:r>
       <w:r>
         <w:t xml:space="preserve"> the app falls back to </w:t>
@@ -7225,6 +7308,7 @@
         <w:rPr>
           <w:b/>
         </w:rPr>
+        <w:lastRenderedPageBreak/>
         <w:t>Two or more radios attached</w:t>
       </w:r>
       <w:r>
@@ -7233,7 +7317,6 @@
     </w:p>
     <w:p>
       <w:r>
-        <w:lastRenderedPageBreak/>
         <w:t xml:space="preserve">The </w:t>
       </w:r>
       <w:r>
@@ -7320,7 +7403,7 @@
       <w:pPr>
         <w:pStyle w:val="Heading3"/>
       </w:pPr>
-      <w:bookmarkStart w:id="32" w:name="_Toc230451703"/>
+      <w:bookmarkStart w:id="32" w:name="_Toc230454451"/>
       <w:r>
         <w:t>SigMF playback mode (no-device fallback)</w:t>
       </w:r>
@@ -7328,10 +7411,7 @@
     </w:p>
     <w:p>
       <w:r>
-        <w:t xml:space="preserve">The distribution bundle </w:t>
-      </w:r>
-      <w:r>
-        <w:t>includes a short SigMF recording so that users without any SDR attached can still launch the program, see live spectrum, and try the controls.</w:t>
+        <w:t>The distribution bundle includes a short SigMF recording so that users without any SDR attached can still launch the program, see live spectrum, and try the controls.</w:t>
       </w:r>
     </w:p>
     <w:p>
@@ -7521,8 +7601,9 @@
       <w:pPr>
         <w:pStyle w:val="Heading2"/>
       </w:pPr>
-      <w:bookmarkStart w:id="33" w:name="_Toc230451704"/>
-      <w:r>
+      <w:bookmarkStart w:id="33" w:name="_Toc230454452"/>
+      <w:r>
+        <w:lastRenderedPageBreak/>
         <w:t>9. Appendix C — Operating Guide</w:t>
       </w:r>
       <w:bookmarkEnd w:id="33"/>
@@ -7543,7 +7624,6 @@
     </w:p>
     <w:p>
       <w:r>
-        <w:lastRenderedPageBreak/>
         <w:t>This is a live spectrum analyzer and waterfall display for the Ettus USRP B210 and other software-defined radios (SDRPlay RSP1A/RSP1B/RSPduo/RSPdx, RTL-SDR, HackRF, Airspy, BladeRF, LimeSDR, PlutoSDR via SoapySDR), designed for pulsar RFI investigation but useful for general-purpose spectrum monitoring.</w:t>
       </w:r>
     </w:p>
@@ -7551,7 +7631,7 @@
       <w:pPr>
         <w:pStyle w:val="Heading3"/>
       </w:pPr>
-      <w:bookmarkStart w:id="34" w:name="_Toc230451705"/>
+      <w:bookmarkStart w:id="34" w:name="_Toc230454453"/>
       <w:r>
         <w:t>Starting up — device selection</w:t>
       </w:r>
@@ -7655,7 +7735,7 @@
       <w:pPr>
         <w:pStyle w:val="Heading3"/>
       </w:pPr>
-      <w:bookmarkStart w:id="35" w:name="_Toc230451706"/>
+      <w:bookmarkStart w:id="35" w:name="_Toc230454454"/>
       <w:r>
         <w:t>Playback mode</w:t>
       </w:r>
@@ -7781,7 +7861,7 @@
       <w:pPr>
         <w:pStyle w:val="Heading3"/>
       </w:pPr>
-      <w:bookmarkStart w:id="36" w:name="_Toc230451707"/>
+      <w:bookmarkStart w:id="36" w:name="_Toc230454455"/>
       <w:r>
         <w:t>Sidebar controls (right side)</w:t>
       </w:r>
@@ -7800,6 +7880,7 @@
         <w:rPr>
           <w:b/>
         </w:rPr>
+        <w:lastRenderedPageBreak/>
         <w:t>Pulsar Band</w:t>
       </w:r>
       <w:r>
@@ -7851,7 +7932,6 @@
         <w:rPr>
           <w:b/>
         </w:rPr>
-        <w:lastRenderedPageBreak/>
         <w:t>Manual Frequency</w:t>
       </w:r>
       <w:r>
@@ -8062,7 +8142,7 @@
       <w:pPr>
         <w:pStyle w:val="Heading3"/>
       </w:pPr>
-      <w:bookmarkStart w:id="37" w:name="_Toc230451708"/>
+      <w:bookmarkStart w:id="37" w:name="_Toc230454456"/>
       <w:r>
         <w:t>Spectrum (top plot)</w:t>
       </w:r>
@@ -8098,7 +8178,10 @@
         <w:t>Window</w:t>
       </w:r>
       <w:r>
-        <w:t>: Blackman-Harris is the default — low sidelobes, good for RFI hunting. Hann/Hamming have narrower main lobes; Rectangular has the sharpest peak but the worst sidelobes.</w:t>
+        <w:t xml:space="preserve">: </w:t>
+      </w:r>
+      <w:r>
+        <w:t>Blackman-Harris is the default — low sidelobes, good for RFI hunting. Hann/Hamming have narrower main lobes; Rectangular has the sharpest peak but the worst sidelobes.</w:t>
       </w:r>
     </w:p>
     <w:p>
@@ -8146,6 +8229,7 @@
         <w:rPr>
           <w:b/>
         </w:rPr>
+        <w:lastRenderedPageBreak/>
         <w:t>Y-Axis</w:t>
       </w:r>
       <w:r>
@@ -8192,7 +8276,6 @@
         <w:rPr>
           <w:b/>
         </w:rPr>
-        <w:lastRenderedPageBreak/>
         <w:t>Trace</w:t>
       </w:r>
       <w:r>
@@ -8203,7 +8286,7 @@
       <w:pPr>
         <w:pStyle w:val="Heading3"/>
       </w:pPr>
-      <w:bookmarkStart w:id="38" w:name="_Toc230451709"/>
+      <w:bookmarkStart w:id="38" w:name="_Toc230454457"/>
       <w:r>
         <w:t>Waterfall (bottom plot)</w:t>
       </w:r>
@@ -8262,14 +8345,17 @@
         <w:t>Rows</w:t>
       </w:r>
       <w:r>
-        <w:t>: how many history rows to display (default 256).</w:t>
+        <w:t xml:space="preserve">: how many history rows to display </w:t>
+      </w:r>
+      <w:r>
+        <w:t>(default 256).</w:t>
       </w:r>
     </w:p>
     <w:p>
       <w:pPr>
         <w:pStyle w:val="Heading3"/>
       </w:pPr>
-      <w:bookmarkStart w:id="39" w:name="_Toc230451710"/>
+      <w:bookmarkStart w:id="39" w:name="_Toc230454458"/>
       <w:r>
         <w:t>Persistence</w:t>
       </w:r>
@@ -8316,7 +8402,7 @@
       <w:pPr>
         <w:pStyle w:val="Heading3"/>
       </w:pPr>
-      <w:bookmarkStart w:id="40" w:name="_Toc230451711"/>
+      <w:bookmarkStart w:id="40" w:name="_Toc230454459"/>
       <w:r>
         <w:t>Update checks</w:t>
       </w:r>
@@ -8374,7 +8460,7 @@
       <w:pPr>
         <w:pStyle w:val="Heading3"/>
       </w:pPr>
-      <w:bookmarkStart w:id="41" w:name="_Toc230451712"/>
+      <w:bookmarkStart w:id="41" w:name="_Toc230454460"/>
       <w:r>
         <w:t>Tips for pulsar work</w:t>
       </w:r>
@@ -8753,31 +8839,31 @@
       </w:rPr>
     </w:lvl>
   </w:abstractNum>
-  <w:num w:numId="1" w16cid:durableId="95709717">
+  <w:num w:numId="1" w16cid:durableId="1606617535">
     <w:abstractNumId w:val="8"/>
   </w:num>
-  <w:num w:numId="2" w16cid:durableId="228881065">
+  <w:num w:numId="2" w16cid:durableId="1455173630">
     <w:abstractNumId w:val="6"/>
   </w:num>
-  <w:num w:numId="3" w16cid:durableId="144904670">
+  <w:num w:numId="3" w16cid:durableId="480998165">
     <w:abstractNumId w:val="5"/>
   </w:num>
-  <w:num w:numId="4" w16cid:durableId="1441291088">
+  <w:num w:numId="4" w16cid:durableId="1057389728">
     <w:abstractNumId w:val="4"/>
   </w:num>
-  <w:num w:numId="5" w16cid:durableId="1541235944">
+  <w:num w:numId="5" w16cid:durableId="818808137">
     <w:abstractNumId w:val="7"/>
   </w:num>
-  <w:num w:numId="6" w16cid:durableId="1758360602">
+  <w:num w:numId="6" w16cid:durableId="1604413248">
     <w:abstractNumId w:val="3"/>
   </w:num>
-  <w:num w:numId="7" w16cid:durableId="332804065">
+  <w:num w:numId="7" w16cid:durableId="1726028531">
     <w:abstractNumId w:val="2"/>
   </w:num>
-  <w:num w:numId="8" w16cid:durableId="821770572">
+  <w:num w:numId="8" w16cid:durableId="430855003">
     <w:abstractNumId w:val="1"/>
   </w:num>
-  <w:num w:numId="9" w16cid:durableId="402995368">
+  <w:num w:numId="9" w16cid:durableId="1446122076">
     <w:abstractNumId w:val="0"/>
   </w:num>
 </w:numbering>
@@ -20172,7 +20258,7 @@
     <w:autoRedefine/>
     <w:uiPriority w:val="39"/>
     <w:unhideWhenUsed/>
-    <w:rsid w:val="00761DEC"/>
+    <w:rsid w:val="008B6FAC"/>
     <w:pPr>
       <w:spacing w:after="100"/>
     </w:pPr>
@@ -20184,7 +20270,7 @@
     <w:autoRedefine/>
     <w:uiPriority w:val="39"/>
     <w:unhideWhenUsed/>
-    <w:rsid w:val="00761DEC"/>
+    <w:rsid w:val="008B6FAC"/>
     <w:pPr>
       <w:spacing w:after="100"/>
       <w:ind w:left="220"/>
@@ -20197,7 +20283,7 @@
     <w:autoRedefine/>
     <w:uiPriority w:val="39"/>
     <w:unhideWhenUsed/>
-    <w:rsid w:val="00761DEC"/>
+    <w:rsid w:val="008B6FAC"/>
     <w:pPr>
       <w:spacing w:after="100"/>
       <w:ind w:left="440"/>
@@ -20208,7 +20294,7 @@
     <w:basedOn w:val="DefaultParagraphFont"/>
     <w:uiPriority w:val="99"/>
     <w:unhideWhenUsed/>
-    <w:rsid w:val="00761DEC"/>
+    <w:rsid w:val="008B6FAC"/>
     <w:rPr>
       <w:color w:val="0000FF" w:themeColor="hyperlink"/>
       <w:u w:val="single"/>

</xml_diff>

<commit_message>
Document + preflight the app's extra runtime packages
PySide6, pyqtgraph, and scipy are not bundled with stock Radioconda (it
ships PyQt5 for GNU Radio's own qtgui), so a fresh Radioconda hits
ModuleNotFoundError: No module named 'PySide6'. They were only present on
the Windows dev machine because they'd been conda-installed there earlier.

- Install guide: new §2.4 (all platforms) — one-time
  'conda install -c conda-forge pyside6 pyqtgraph scipy' from an activated
  Radioconda shell; mentioned in the §1 overview; added a §6 troubleshooting
  entry for the missing-package / PySide6 error.
- Launchers: preflight-check the three imports and print the install command
  instead of letting Python throw a traceback.
- Release_Workflow §1: record these runtime deps and where to update the
  list if another third-party import is added.
Regenerated PDF/DOCX.
</commit_message>
<xml_diff>
--- a/DSES_RFI_Spectrum_Analyzer_Installation.docx
+++ b/DSES_RFI_Spectrum_Analyzer_Installation.docx
@@ -41,7 +41,7 @@
           <w:noProof/>
         </w:rPr>
         <w:drawing>
-          <wp:inline distT="0" distB="0" distL="0" distR="0" wp14:anchorId="51052DEC" wp14:editId="4EBFA7F3">
+          <wp:inline distT="0" distB="0" distL="0" distR="0" wp14:anchorId="40F9A9E7" wp14:editId="44F7CAC6">
             <wp:extent cx="1371600" cy="1371600"/>
             <wp:effectExtent l="0" t="0" r="0" b="0"/>
             <wp:docPr id="1" name="Picture 1"/>
@@ -138,7 +138,7 @@
         <w:pStyle w:val="Heading1"/>
         <w:shd w:val="clear" w:color="auto" w:fill="156082"/>
       </w:pPr>
-      <w:bookmarkStart w:id="0" w:name="_Toc230454419"/>
+      <w:bookmarkStart w:id="0" w:name="_Toc230455005"/>
       <w:r>
         <w:lastRenderedPageBreak/>
         <w:t>Contents</w:t>
@@ -169,7 +169,7 @@
       <w:r>
         <w:fldChar w:fldCharType="separate"/>
       </w:r>
-      <w:hyperlink w:anchor="_Toc230454419" w:history="1">
+      <w:hyperlink w:anchor="_Toc230455005" w:history="1">
         <w:r>
           <w:rPr>
             <w:rStyle w:val="Hyperlink"/>
@@ -196,7 +196,7 @@
             <w:noProof/>
             <w:webHidden/>
           </w:rPr>
-          <w:instrText xml:space="preserve"> PAGEREF _Toc230454419 \h </w:instrText>
+          <w:instrText xml:space="preserve"> PAGEREF _Toc230455005 \h </w:instrText>
         </w:r>
         <w:r>
           <w:rPr>
@@ -242,7 +242,7 @@
           <w14:ligatures w14:val="standardContextual"/>
         </w:rPr>
       </w:pPr>
-      <w:hyperlink w:anchor="_Toc230454420" w:history="1">
+      <w:hyperlink w:anchor="_Toc230455006" w:history="1">
         <w:r>
           <w:rPr>
             <w:rStyle w:val="Hyperlink"/>
@@ -269,7 +269,7 @@
             <w:noProof/>
             <w:webHidden/>
           </w:rPr>
-          <w:instrText xml:space="preserve"> PAGEREF _Toc230454420 \h </w:instrText>
+          <w:instrText xml:space="preserve"> PAGEREF _Toc230455006 \h </w:instrText>
         </w:r>
         <w:r>
           <w:rPr>
@@ -315,7 +315,7 @@
           <w14:ligatures w14:val="standardContextual"/>
         </w:rPr>
       </w:pPr>
-      <w:hyperlink w:anchor="_Toc230454421" w:history="1">
+      <w:hyperlink w:anchor="_Toc230455007" w:history="1">
         <w:r>
           <w:rPr>
             <w:rStyle w:val="Hyperlink"/>
@@ -342,7 +342,7 @@
             <w:noProof/>
             <w:webHidden/>
           </w:rPr>
-          <w:instrText xml:space="preserve"> PAGEREF _Toc230454421 \h </w:instrText>
+          <w:instrText xml:space="preserve"> PAGEREF _Toc230455007 \h </w:instrText>
         </w:r>
         <w:r>
           <w:rPr>
@@ -388,7 +388,7 @@
           <w14:ligatures w14:val="standardContextual"/>
         </w:rPr>
       </w:pPr>
-      <w:hyperlink w:anchor="_Toc230454422" w:history="1">
+      <w:hyperlink w:anchor="_Toc230455008" w:history="1">
         <w:r>
           <w:rPr>
             <w:rStyle w:val="Hyperlink"/>
@@ -415,7 +415,7 @@
             <w:noProof/>
             <w:webHidden/>
           </w:rPr>
-          <w:instrText xml:space="preserve"> PAGEREF _Toc230454422 \h </w:instrText>
+          <w:instrText xml:space="preserve"> PAGEREF _Toc230455008 \h </w:instrText>
         </w:r>
         <w:r>
           <w:rPr>
@@ -461,7 +461,7 @@
           <w14:ligatures w14:val="standardContextual"/>
         </w:rPr>
       </w:pPr>
-      <w:hyperlink w:anchor="_Toc230454423" w:history="1">
+      <w:hyperlink w:anchor="_Toc230455009" w:history="1">
         <w:r>
           <w:rPr>
             <w:rStyle w:val="Hyperlink"/>
@@ -488,7 +488,7 @@
             <w:noProof/>
             <w:webHidden/>
           </w:rPr>
-          <w:instrText xml:space="preserve"> PAGEREF _Toc230454423 \h </w:instrText>
+          <w:instrText xml:space="preserve"> PAGEREF _Toc230455009 \h </w:instrText>
         </w:r>
         <w:r>
           <w:rPr>
@@ -534,7 +534,7 @@
           <w14:ligatures w14:val="standardContextual"/>
         </w:rPr>
       </w:pPr>
-      <w:hyperlink w:anchor="_Toc230454424" w:history="1">
+      <w:hyperlink w:anchor="_Toc230455010" w:history="1">
         <w:r>
           <w:rPr>
             <w:rStyle w:val="Hyperlink"/>
@@ -561,7 +561,7 @@
             <w:noProof/>
             <w:webHidden/>
           </w:rPr>
-          <w:instrText xml:space="preserve"> PAGEREF _Toc230454424 \h </w:instrText>
+          <w:instrText xml:space="preserve"> PAGEREF _Toc230455010 \h </w:instrText>
         </w:r>
         <w:r>
           <w:rPr>
@@ -607,7 +607,7 @@
           <w14:ligatures w14:val="standardContextual"/>
         </w:rPr>
       </w:pPr>
-      <w:hyperlink w:anchor="_Toc230454425" w:history="1">
+      <w:hyperlink w:anchor="_Toc230455011" w:history="1">
         <w:r>
           <w:rPr>
             <w:rStyle w:val="Hyperlink"/>
@@ -634,7 +634,7 @@
             <w:noProof/>
             <w:webHidden/>
           </w:rPr>
-          <w:instrText xml:space="preserve"> PAGEREF _Toc230454425 \h </w:instrText>
+          <w:instrText xml:space="preserve"> PAGEREF _Toc230455011 \h </w:instrText>
         </w:r>
         <w:r>
           <w:rPr>
@@ -680,7 +680,7 @@
           <w14:ligatures w14:val="standardContextual"/>
         </w:rPr>
       </w:pPr>
-      <w:hyperlink w:anchor="_Toc230454426" w:history="1">
+      <w:hyperlink w:anchor="_Toc230455012" w:history="1">
         <w:r>
           <w:rPr>
             <w:rStyle w:val="Hyperlink"/>
@@ -707,7 +707,7 @@
             <w:noProof/>
             <w:webHidden/>
           </w:rPr>
-          <w:instrText xml:space="preserve"> PAGEREF _Toc230454426 \h </w:instrText>
+          <w:instrText xml:space="preserve"> PAGEREF _Toc230455012 \h </w:instrText>
         </w:r>
         <w:r>
           <w:rPr>
@@ -740,7 +740,7 @@
     </w:p>
     <w:p>
       <w:pPr>
-        <w:pStyle w:val="TOC2"/>
+        <w:pStyle w:val="TOC3"/>
         <w:tabs>
           <w:tab w:val="right" w:leader="dot" w:pos="9624"/>
         </w:tabs>
@@ -753,13 +753,13 @@
           <w14:ligatures w14:val="standardContextual"/>
         </w:rPr>
       </w:pPr>
-      <w:hyperlink w:anchor="_Toc230454427" w:history="1">
+      <w:hyperlink w:anchor="_Toc230455013" w:history="1">
         <w:r>
           <w:rPr>
             <w:rStyle w:val="Hyperlink"/>
             <w:noProof/>
           </w:rPr>
-          <w:t>3. Installing the DSES Spectrum Analyzer</w:t>
+          <w:t>2.4 Add the packages the analyzer needs (all platforms)</w:t>
         </w:r>
         <w:r>
           <w:rPr>
@@ -780,7 +780,7 @@
             <w:noProof/>
             <w:webHidden/>
           </w:rPr>
-          <w:instrText xml:space="preserve"> PAGEREF _Toc230454427 \h </w:instrText>
+          <w:instrText xml:space="preserve"> PAGEREF _Toc230455013 \h </w:instrText>
         </w:r>
         <w:r>
           <w:rPr>
@@ -813,7 +813,7 @@
     </w:p>
     <w:p>
       <w:pPr>
-        <w:pStyle w:val="TOC3"/>
+        <w:pStyle w:val="TOC2"/>
         <w:tabs>
           <w:tab w:val="right" w:leader="dot" w:pos="9624"/>
         </w:tabs>
@@ -826,13 +826,13 @@
           <w14:ligatures w14:val="standardContextual"/>
         </w:rPr>
       </w:pPr>
-      <w:hyperlink w:anchor="_Toc230454428" w:history="1">
+      <w:hyperlink w:anchor="_Toc230455014" w:history="1">
         <w:r>
           <w:rPr>
             <w:rStyle w:val="Hyperlink"/>
             <w:noProof/>
           </w:rPr>
-          <w:t>3.1 Windows 11</w:t>
+          <w:t>3. Installing the DSES Spectrum Analyzer</w:t>
         </w:r>
         <w:r>
           <w:rPr>
@@ -853,7 +853,7 @@
             <w:noProof/>
             <w:webHidden/>
           </w:rPr>
-          <w:instrText xml:space="preserve"> PAGEREF _Toc230454428 \h </w:instrText>
+          <w:instrText xml:space="preserve"> PAGEREF _Toc230455014 \h </w:instrText>
         </w:r>
         <w:r>
           <w:rPr>
@@ -899,13 +899,13 @@
           <w14:ligatures w14:val="standardContextual"/>
         </w:rPr>
       </w:pPr>
-      <w:hyperlink w:anchor="_Toc230454429" w:history="1">
+      <w:hyperlink w:anchor="_Toc230455015" w:history="1">
         <w:r>
           <w:rPr>
             <w:rStyle w:val="Hyperlink"/>
             <w:noProof/>
           </w:rPr>
-          <w:t>3.2 Linux</w:t>
+          <w:t>3.1 Windows 11</w:t>
         </w:r>
         <w:r>
           <w:rPr>
@@ -926,7 +926,7 @@
             <w:noProof/>
             <w:webHidden/>
           </w:rPr>
-          <w:instrText xml:space="preserve"> PAGEREF _Toc230454429 \h </w:instrText>
+          <w:instrText xml:space="preserve"> PAGEREF _Toc230455015 \h </w:instrText>
         </w:r>
         <w:r>
           <w:rPr>
@@ -972,13 +972,13 @@
           <w14:ligatures w14:val="standardContextual"/>
         </w:rPr>
       </w:pPr>
-      <w:hyperlink w:anchor="_Toc230454430" w:history="1">
+      <w:hyperlink w:anchor="_Toc230455016" w:history="1">
         <w:r>
           <w:rPr>
             <w:rStyle w:val="Hyperlink"/>
             <w:noProof/>
           </w:rPr>
-          <w:t>3.3 macOS</w:t>
+          <w:t>3.2 Linux</w:t>
         </w:r>
         <w:r>
           <w:rPr>
@@ -999,7 +999,7 @@
             <w:noProof/>
             <w:webHidden/>
           </w:rPr>
-          <w:instrText xml:space="preserve"> PAGEREF _Toc230454430 \h </w:instrText>
+          <w:instrText xml:space="preserve"> PAGEREF _Toc230455016 \h </w:instrText>
         </w:r>
         <w:r>
           <w:rPr>
@@ -1019,7 +1019,7 @@
             <w:noProof/>
             <w:webHidden/>
           </w:rPr>
-          <w:t>9</w:t>
+          <w:t>8</w:t>
         </w:r>
         <w:r>
           <w:rPr>
@@ -1032,7 +1032,7 @@
     </w:p>
     <w:p>
       <w:pPr>
-        <w:pStyle w:val="TOC2"/>
+        <w:pStyle w:val="TOC3"/>
         <w:tabs>
           <w:tab w:val="right" w:leader="dot" w:pos="9624"/>
         </w:tabs>
@@ -1045,13 +1045,13 @@
           <w14:ligatures w14:val="standardContextual"/>
         </w:rPr>
       </w:pPr>
-      <w:hyperlink w:anchor="_Toc230454431" w:history="1">
+      <w:hyperlink w:anchor="_Toc230455017" w:history="1">
         <w:r>
           <w:rPr>
             <w:rStyle w:val="Hyperlink"/>
             <w:noProof/>
           </w:rPr>
-          <w:t>3A. Extra setup for SDRPlay receivers (RSP1A / RSP1B / RSPduo / RSPdx)</w:t>
+          <w:t>3.3 macOS</w:t>
         </w:r>
         <w:r>
           <w:rPr>
@@ -1072,7 +1072,7 @@
             <w:noProof/>
             <w:webHidden/>
           </w:rPr>
-          <w:instrText xml:space="preserve"> PAGEREF _Toc230454431 \h </w:instrText>
+          <w:instrText xml:space="preserve"> PAGEREF _Toc230455017 \h </w:instrText>
         </w:r>
         <w:r>
           <w:rPr>
@@ -1105,7 +1105,7 @@
     </w:p>
     <w:p>
       <w:pPr>
-        <w:pStyle w:val="TOC3"/>
+        <w:pStyle w:val="TOC2"/>
         <w:tabs>
           <w:tab w:val="right" w:leader="dot" w:pos="9624"/>
         </w:tabs>
@@ -1118,13 +1118,13 @@
           <w14:ligatures w14:val="standardContextual"/>
         </w:rPr>
       </w:pPr>
-      <w:hyperlink w:anchor="_Toc230454432" w:history="1">
+      <w:hyperlink w:anchor="_Toc230455018" w:history="1">
         <w:r>
           <w:rPr>
             <w:rStyle w:val="Hyperlink"/>
             <w:noProof/>
           </w:rPr>
-          <w:t>3A.1 Install the SDRplay API</w:t>
+          <w:t>3A. Extra setup for SDRPlay receivers (RSP1A / RSP1B / RSPduo / RSPdx)</w:t>
         </w:r>
         <w:r>
           <w:rPr>
@@ -1145,7 +1145,7 @@
             <w:noProof/>
             <w:webHidden/>
           </w:rPr>
-          <w:instrText xml:space="preserve"> PAGEREF _Toc230454432 \h </w:instrText>
+          <w:instrText xml:space="preserve"> PAGEREF _Toc230455018 \h </w:instrText>
         </w:r>
         <w:r>
           <w:rPr>
@@ -1191,13 +1191,13 @@
           <w14:ligatures w14:val="standardContextual"/>
         </w:rPr>
       </w:pPr>
-      <w:hyperlink w:anchor="_Toc230454433" w:history="1">
+      <w:hyperlink w:anchor="_Toc230455019" w:history="1">
         <w:r>
           <w:rPr>
             <w:rStyle w:val="Hyperlink"/>
             <w:noProof/>
           </w:rPr>
-          <w:t>3A.2 Install the SoapySDRPlay module</w:t>
+          <w:t>3A.1 Install the SDRplay API</w:t>
         </w:r>
         <w:r>
           <w:rPr>
@@ -1218,7 +1218,7 @@
             <w:noProof/>
             <w:webHidden/>
           </w:rPr>
-          <w:instrText xml:space="preserve"> PAGEREF _Toc230454433 \h </w:instrText>
+          <w:instrText xml:space="preserve"> PAGEREF _Toc230455019 \h </w:instrText>
         </w:r>
         <w:r>
           <w:rPr>
@@ -1251,7 +1251,7 @@
     </w:p>
     <w:p>
       <w:pPr>
-        <w:pStyle w:val="TOC2"/>
+        <w:pStyle w:val="TOC3"/>
         <w:tabs>
           <w:tab w:val="right" w:leader="dot" w:pos="9624"/>
         </w:tabs>
@@ -1264,13 +1264,13 @@
           <w14:ligatures w14:val="standardContextual"/>
         </w:rPr>
       </w:pPr>
-      <w:hyperlink w:anchor="_Toc230454434" w:history="1">
+      <w:hyperlink w:anchor="_Toc230455020" w:history="1">
         <w:r>
           <w:rPr>
             <w:rStyle w:val="Hyperlink"/>
             <w:noProof/>
           </w:rPr>
-          <w:t>4. First-run checklist</w:t>
+          <w:t>3A.2 Install the SoapySDRPlay module</w:t>
         </w:r>
         <w:r>
           <w:rPr>
@@ -1291,7 +1291,7 @@
             <w:noProof/>
             <w:webHidden/>
           </w:rPr>
-          <w:instrText xml:space="preserve"> PAGEREF _Toc230454434 \h </w:instrText>
+          <w:instrText xml:space="preserve"> PAGEREF _Toc230455020 \h </w:instrText>
         </w:r>
         <w:r>
           <w:rPr>
@@ -1311,7 +1311,7 @@
             <w:noProof/>
             <w:webHidden/>
           </w:rPr>
-          <w:t>11</w:t>
+          <w:t>10</w:t>
         </w:r>
         <w:r>
           <w:rPr>
@@ -1324,7 +1324,7 @@
     </w:p>
     <w:p>
       <w:pPr>
-        <w:pStyle w:val="TOC3"/>
+        <w:pStyle w:val="TOC2"/>
         <w:tabs>
           <w:tab w:val="right" w:leader="dot" w:pos="9624"/>
         </w:tabs>
@@ -1337,13 +1337,13 @@
           <w14:ligatures w14:val="standardContextual"/>
         </w:rPr>
       </w:pPr>
-      <w:hyperlink w:anchor="_Toc230454435" w:history="1">
+      <w:hyperlink w:anchor="_Toc230455021" w:history="1">
         <w:r>
           <w:rPr>
             <w:rStyle w:val="Hyperlink"/>
             <w:noProof/>
           </w:rPr>
-          <w:t>Recommended one-time VOLK tuning</w:t>
+          <w:t>4. First-run checklist</w:t>
         </w:r>
         <w:r>
           <w:rPr>
@@ -1364,7 +1364,7 @@
             <w:noProof/>
             <w:webHidden/>
           </w:rPr>
-          <w:instrText xml:space="preserve"> PAGEREF _Toc230454435 \h </w:instrText>
+          <w:instrText xml:space="preserve"> PAGEREF _Toc230455021 \h </w:instrText>
         </w:r>
         <w:r>
           <w:rPr>
@@ -1397,7 +1397,7 @@
     </w:p>
     <w:p>
       <w:pPr>
-        <w:pStyle w:val="TOC2"/>
+        <w:pStyle w:val="TOC3"/>
         <w:tabs>
           <w:tab w:val="right" w:leader="dot" w:pos="9624"/>
         </w:tabs>
@@ -1410,13 +1410,13 @@
           <w14:ligatures w14:val="standardContextual"/>
         </w:rPr>
       </w:pPr>
-      <w:hyperlink w:anchor="_Toc230454436" w:history="1">
+      <w:hyperlink w:anchor="_Toc230455022" w:history="1">
         <w:r>
           <w:rPr>
             <w:rStyle w:val="Hyperlink"/>
             <w:noProof/>
           </w:rPr>
-          <w:t>5. Updating to a new version</w:t>
+          <w:t>Recommended one-time VOLK tuning</w:t>
         </w:r>
         <w:r>
           <w:rPr>
@@ -1437,7 +1437,7 @@
             <w:noProof/>
             <w:webHidden/>
           </w:rPr>
-          <w:instrText xml:space="preserve"> PAGEREF _Toc230454436 \h </w:instrText>
+          <w:instrText xml:space="preserve"> PAGEREF _Toc230455022 \h </w:instrText>
         </w:r>
         <w:r>
           <w:rPr>
@@ -1470,7 +1470,7 @@
     </w:p>
     <w:p>
       <w:pPr>
-        <w:pStyle w:val="TOC3"/>
+        <w:pStyle w:val="TOC2"/>
         <w:tabs>
           <w:tab w:val="right" w:leader="dot" w:pos="9624"/>
         </w:tabs>
@@ -1483,13 +1483,13 @@
           <w14:ligatures w14:val="standardContextual"/>
         </w:rPr>
       </w:pPr>
-      <w:hyperlink w:anchor="_Toc230454437" w:history="1">
+      <w:hyperlink w:anchor="_Toc230455023" w:history="1">
         <w:r>
           <w:rPr>
             <w:rStyle w:val="Hyperlink"/>
             <w:noProof/>
           </w:rPr>
-          <w:t>Auto-update notifications</w:t>
+          <w:t>5. Updating to a new version</w:t>
         </w:r>
         <w:r>
           <w:rPr>
@@ -1510,7 +1510,7 @@
             <w:noProof/>
             <w:webHidden/>
           </w:rPr>
-          <w:instrText xml:space="preserve"> PAGEREF _Toc230454437 \h </w:instrText>
+          <w:instrText xml:space="preserve"> PAGEREF _Toc230455023 \h </w:instrText>
         </w:r>
         <w:r>
           <w:rPr>
@@ -1530,7 +1530,7 @@
             <w:noProof/>
             <w:webHidden/>
           </w:rPr>
-          <w:t>11</w:t>
+          <w:t>12</w:t>
         </w:r>
         <w:r>
           <w:rPr>
@@ -1556,13 +1556,13 @@
           <w14:ligatures w14:val="standardContextual"/>
         </w:rPr>
       </w:pPr>
-      <w:hyperlink w:anchor="_Toc230454438" w:history="1">
+      <w:hyperlink w:anchor="_Toc230455024" w:history="1">
         <w:r>
           <w:rPr>
             <w:rStyle w:val="Hyperlink"/>
             <w:noProof/>
           </w:rPr>
-          <w:t>Performing the update</w:t>
+          <w:t>Auto-update notifications</w:t>
         </w:r>
         <w:r>
           <w:rPr>
@@ -1583,7 +1583,7 @@
             <w:noProof/>
             <w:webHidden/>
           </w:rPr>
-          <w:instrText xml:space="preserve"> PAGEREF _Toc230454438 \h </w:instrText>
+          <w:instrText xml:space="preserve"> PAGEREF _Toc230455024 \h </w:instrText>
         </w:r>
         <w:r>
           <w:rPr>
@@ -1629,13 +1629,13 @@
           <w14:ligatures w14:val="standardContextual"/>
         </w:rPr>
       </w:pPr>
-      <w:hyperlink w:anchor="_Toc230454439" w:history="1">
+      <w:hyperlink w:anchor="_Toc230455025" w:history="1">
         <w:r>
           <w:rPr>
             <w:rStyle w:val="Hyperlink"/>
             <w:noProof/>
           </w:rPr>
-          <w:t>What is preserved across versions</w:t>
+          <w:t>Performing the update</w:t>
         </w:r>
         <w:r>
           <w:rPr>
@@ -1656,7 +1656,7 @@
             <w:noProof/>
             <w:webHidden/>
           </w:rPr>
-          <w:instrText xml:space="preserve"> PAGEREF _Toc230454439 \h </w:instrText>
+          <w:instrText xml:space="preserve"> PAGEREF _Toc230455025 \h </w:instrText>
         </w:r>
         <w:r>
           <w:rPr>
@@ -1702,13 +1702,13 @@
           <w14:ligatures w14:val="standardContextual"/>
         </w:rPr>
       </w:pPr>
-      <w:hyperlink w:anchor="_Toc230454440" w:history="1">
+      <w:hyperlink w:anchor="_Toc230455026" w:history="1">
         <w:r>
           <w:rPr>
             <w:rStyle w:val="Hyperlink"/>
             <w:noProof/>
           </w:rPr>
-          <w:t>Backing up your settings</w:t>
+          <w:t>What is preserved across versions</w:t>
         </w:r>
         <w:r>
           <w:rPr>
@@ -1729,7 +1729,7 @@
             <w:noProof/>
             <w:webHidden/>
           </w:rPr>
-          <w:instrText xml:space="preserve"> PAGEREF _Toc230454440 \h </w:instrText>
+          <w:instrText xml:space="preserve"> PAGEREF _Toc230455026 \h </w:instrText>
         </w:r>
         <w:r>
           <w:rPr>
@@ -1762,7 +1762,7 @@
     </w:p>
     <w:p>
       <w:pPr>
-        <w:pStyle w:val="TOC2"/>
+        <w:pStyle w:val="TOC3"/>
         <w:tabs>
           <w:tab w:val="right" w:leader="dot" w:pos="9624"/>
         </w:tabs>
@@ -1775,13 +1775,13 @@
           <w14:ligatures w14:val="standardContextual"/>
         </w:rPr>
       </w:pPr>
-      <w:hyperlink w:anchor="_Toc230454441" w:history="1">
+      <w:hyperlink w:anchor="_Toc230455027" w:history="1">
         <w:r>
           <w:rPr>
             <w:rStyle w:val="Hyperlink"/>
             <w:noProof/>
           </w:rPr>
-          <w:t>6. Troubleshooting</w:t>
+          <w:t>Backing up your settings</w:t>
         </w:r>
         <w:r>
           <w:rPr>
@@ -1802,7 +1802,7 @@
             <w:noProof/>
             <w:webHidden/>
           </w:rPr>
-          <w:instrText xml:space="preserve"> PAGEREF _Toc230454441 \h </w:instrText>
+          <w:instrText xml:space="preserve"> PAGEREF _Toc230455027 \h </w:instrText>
         </w:r>
         <w:r>
           <w:rPr>
@@ -1822,7 +1822,7 @@
             <w:noProof/>
             <w:webHidden/>
           </w:rPr>
-          <w:t>12</w:t>
+          <w:t>13</w:t>
         </w:r>
         <w:r>
           <w:rPr>
@@ -1835,7 +1835,7 @@
     </w:p>
     <w:p>
       <w:pPr>
-        <w:pStyle w:val="TOC3"/>
+        <w:pStyle w:val="TOC2"/>
         <w:tabs>
           <w:tab w:val="right" w:leader="dot" w:pos="9624"/>
         </w:tabs>
@@ -1848,13 +1848,13 @@
           <w14:ligatures w14:val="standardContextual"/>
         </w:rPr>
       </w:pPr>
-      <w:hyperlink w:anchor="_Toc230454442" w:history="1">
+      <w:hyperlink w:anchor="_Toc230455028" w:history="1">
         <w:r>
           <w:rPr>
             <w:rStyle w:val="Hyperlink"/>
             <w:noProof/>
           </w:rPr>
-          <w:t>“Radioconda not found in standard locations”</w:t>
+          <w:t>6. Troubleshooting</w:t>
         </w:r>
         <w:r>
           <w:rPr>
@@ -1875,7 +1875,7 @@
             <w:noProof/>
             <w:webHidden/>
           </w:rPr>
-          <w:instrText xml:space="preserve"> PAGEREF _Toc230454442 \h </w:instrText>
+          <w:instrText xml:space="preserve"> PAGEREF _Toc230455028 \h </w:instrText>
         </w:r>
         <w:r>
           <w:rPr>
@@ -1895,7 +1895,7 @@
             <w:noProof/>
             <w:webHidden/>
           </w:rPr>
-          <w:t>12</w:t>
+          <w:t>13</w:t>
         </w:r>
         <w:r>
           <w:rPr>
@@ -1921,13 +1921,13 @@
           <w14:ligatures w14:val="standardContextual"/>
         </w:rPr>
       </w:pPr>
-      <w:hyperlink w:anchor="_Toc230454443" w:history="1">
+      <w:hyperlink w:anchor="_Toc230455029" w:history="1">
         <w:r>
           <w:rPr>
             <w:rStyle w:val="Hyperlink"/>
             <w:noProof/>
           </w:rPr>
-          <w:t>“No UHD Devices Found”</w:t>
+          <w:t>“Radioconda not found in standard locations”</w:t>
         </w:r>
         <w:r>
           <w:rPr>
@@ -1948,7 +1948,7 @@
             <w:noProof/>
             <w:webHidden/>
           </w:rPr>
-          <w:instrText xml:space="preserve"> PAGEREF _Toc230454443 \h </w:instrText>
+          <w:instrText xml:space="preserve"> PAGEREF _Toc230455029 \h </w:instrText>
         </w:r>
         <w:r>
           <w:rPr>
@@ -1994,13 +1994,13 @@
           <w14:ligatures w14:val="standardContextual"/>
         </w:rPr>
       </w:pPr>
-      <w:hyperlink w:anchor="_Toc230454444" w:history="1">
+      <w:hyperlink w:anchor="_Toc230455030" w:history="1">
         <w:r>
           <w:rPr>
             <w:rStyle w:val="Hyperlink"/>
             <w:noProof/>
           </w:rPr>
-          <w:t>Persistent “O” overflows at high sample rates</w:t>
+          <w:t>“Missing required packages (PySide6, pyqtgraph, and/or scipy)” — or `ModuleNotFoundError: No module named 'PySide6'`</w:t>
         </w:r>
         <w:r>
           <w:rPr>
@@ -2021,7 +2021,7 @@
             <w:noProof/>
             <w:webHidden/>
           </w:rPr>
-          <w:instrText xml:space="preserve"> PAGEREF _Toc230454444 \h </w:instrText>
+          <w:instrText xml:space="preserve"> PAGEREF _Toc230455030 \h </w:instrText>
         </w:r>
         <w:r>
           <w:rPr>
@@ -2067,13 +2067,13 @@
           <w14:ligatures w14:val="standardContextual"/>
         </w:rPr>
       </w:pPr>
-      <w:hyperlink w:anchor="_Toc230454445" w:history="1">
+      <w:hyperlink w:anchor="_Toc230455031" w:history="1">
         <w:r>
           <w:rPr>
             <w:rStyle w:val="Hyperlink"/>
             <w:noProof/>
           </w:rPr>
-          <w:t>Spectrum looks flat at −140 dB</w:t>
+          <w:t>“No UHD Devices Found”</w:t>
         </w:r>
         <w:r>
           <w:rPr>
@@ -2094,7 +2094,7 @@
             <w:noProof/>
             <w:webHidden/>
           </w:rPr>
-          <w:instrText xml:space="preserve"> PAGEREF _Toc230454445 \h </w:instrText>
+          <w:instrText xml:space="preserve"> PAGEREF _Toc230455031 \h </w:instrText>
         </w:r>
         <w:r>
           <w:rPr>
@@ -2140,13 +2140,13 @@
           <w14:ligatures w14:val="standardContextual"/>
         </w:rPr>
       </w:pPr>
-      <w:hyperlink w:anchor="_Toc230454446" w:history="1">
+      <w:hyperlink w:anchor="_Toc230455032" w:history="1">
         <w:r>
           <w:rPr>
             <w:rStyle w:val="Hyperlink"/>
             <w:noProof/>
           </w:rPr>
-          <w:t>macOS: “developer cannot be verified”</w:t>
+          <w:t>Persistent “O” overflows at high sample rates</w:t>
         </w:r>
         <w:r>
           <w:rPr>
@@ -2167,7 +2167,7 @@
             <w:noProof/>
             <w:webHidden/>
           </w:rPr>
-          <w:instrText xml:space="preserve"> PAGEREF _Toc230454446 \h </w:instrText>
+          <w:instrText xml:space="preserve"> PAGEREF _Toc230455032 \h </w:instrText>
         </w:r>
         <w:r>
           <w:rPr>
@@ -2213,13 +2213,13 @@
           <w14:ligatures w14:val="standardContextual"/>
         </w:rPr>
       </w:pPr>
-      <w:hyperlink w:anchor="_Toc230454447" w:history="1">
+      <w:hyperlink w:anchor="_Toc230455033" w:history="1">
         <w:r>
           <w:rPr>
             <w:rStyle w:val="Hyperlink"/>
             <w:noProof/>
           </w:rPr>
-          <w:t>Settings won’t persist</w:t>
+          <w:t>Spectrum looks flat at −140 dB</w:t>
         </w:r>
         <w:r>
           <w:rPr>
@@ -2240,7 +2240,7 @@
             <w:noProof/>
             <w:webHidden/>
           </w:rPr>
-          <w:instrText xml:space="preserve"> PAGEREF _Toc230454447 \h </w:instrText>
+          <w:instrText xml:space="preserve"> PAGEREF _Toc230455033 \h </w:instrText>
         </w:r>
         <w:r>
           <w:rPr>
@@ -2273,7 +2273,7 @@
     </w:p>
     <w:p>
       <w:pPr>
-        <w:pStyle w:val="TOC2"/>
+        <w:pStyle w:val="TOC3"/>
         <w:tabs>
           <w:tab w:val="right" w:leader="dot" w:pos="9624"/>
         </w:tabs>
@@ -2286,13 +2286,13 @@
           <w14:ligatures w14:val="standardContextual"/>
         </w:rPr>
       </w:pPr>
-      <w:hyperlink w:anchor="_Toc230454448" w:history="1">
+      <w:hyperlink w:anchor="_Toc230455034" w:history="1">
         <w:r>
           <w:rPr>
             <w:rStyle w:val="Hyperlink"/>
             <w:noProof/>
           </w:rPr>
-          <w:t>7. Appendix A — Settings file reference</w:t>
+          <w:t>macOS: “developer cannot be verified”</w:t>
         </w:r>
         <w:r>
           <w:rPr>
@@ -2313,7 +2313,7 @@
             <w:noProof/>
             <w:webHidden/>
           </w:rPr>
-          <w:instrText xml:space="preserve"> PAGEREF _Toc230454448 \h </w:instrText>
+          <w:instrText xml:space="preserve"> PAGEREF _Toc230455034 \h </w:instrText>
         </w:r>
         <w:r>
           <w:rPr>
@@ -2346,7 +2346,7 @@
     </w:p>
     <w:p>
       <w:pPr>
-        <w:pStyle w:val="TOC2"/>
+        <w:pStyle w:val="TOC3"/>
         <w:tabs>
           <w:tab w:val="right" w:leader="dot" w:pos="9624"/>
         </w:tabs>
@@ -2359,13 +2359,13 @@
           <w14:ligatures w14:val="standardContextual"/>
         </w:rPr>
       </w:pPr>
-      <w:hyperlink w:anchor="_Toc230454449" w:history="1">
+      <w:hyperlink w:anchor="_Toc230455035" w:history="1">
         <w:r>
           <w:rPr>
             <w:rStyle w:val="Hyperlink"/>
             <w:noProof/>
           </w:rPr>
-          <w:t>8. Appendix B — Device selection and SigMF playback</w:t>
+          <w:t>Settings won’t persist</w:t>
         </w:r>
         <w:r>
           <w:rPr>
@@ -2386,7 +2386,7 @@
             <w:noProof/>
             <w:webHidden/>
           </w:rPr>
-          <w:instrText xml:space="preserve"> PAGEREF _Toc230454449 \h </w:instrText>
+          <w:instrText xml:space="preserve"> PAGEREF _Toc230455035 \h </w:instrText>
         </w:r>
         <w:r>
           <w:rPr>
@@ -2419,7 +2419,7 @@
     </w:p>
     <w:p>
       <w:pPr>
-        <w:pStyle w:val="TOC3"/>
+        <w:pStyle w:val="TOC2"/>
         <w:tabs>
           <w:tab w:val="right" w:leader="dot" w:pos="9624"/>
         </w:tabs>
@@ -2432,13 +2432,13 @@
           <w14:ligatures w14:val="standardContextual"/>
         </w:rPr>
       </w:pPr>
-      <w:hyperlink w:anchor="_Toc230454450" w:history="1">
+      <w:hyperlink w:anchor="_Toc230455036" w:history="1">
         <w:r>
           <w:rPr>
             <w:rStyle w:val="Hyperlink"/>
             <w:noProof/>
           </w:rPr>
-          <w:t>Choosing among multiple radios</w:t>
+          <w:t>7. Appendix A — Settings file reference</w:t>
         </w:r>
         <w:r>
           <w:rPr>
@@ -2459,7 +2459,7 @@
             <w:noProof/>
             <w:webHidden/>
           </w:rPr>
-          <w:instrText xml:space="preserve"> PAGEREF _Toc230454450 \h </w:instrText>
+          <w:instrText xml:space="preserve"> PAGEREF _Toc230455036 \h </w:instrText>
         </w:r>
         <w:r>
           <w:rPr>
@@ -2492,7 +2492,7 @@
     </w:p>
     <w:p>
       <w:pPr>
-        <w:pStyle w:val="TOC3"/>
+        <w:pStyle w:val="TOC2"/>
         <w:tabs>
           <w:tab w:val="right" w:leader="dot" w:pos="9624"/>
         </w:tabs>
@@ -2505,13 +2505,13 @@
           <w14:ligatures w14:val="standardContextual"/>
         </w:rPr>
       </w:pPr>
-      <w:hyperlink w:anchor="_Toc230454451" w:history="1">
+      <w:hyperlink w:anchor="_Toc230455037" w:history="1">
         <w:r>
           <w:rPr>
             <w:rStyle w:val="Hyperlink"/>
             <w:noProof/>
           </w:rPr>
-          <w:t>SigMF playback mode (no-device fallback)</w:t>
+          <w:t>8. Appendix B — Device selection and SigMF playback</w:t>
         </w:r>
         <w:r>
           <w:rPr>
@@ -2532,7 +2532,7 @@
             <w:noProof/>
             <w:webHidden/>
           </w:rPr>
-          <w:instrText xml:space="preserve"> PAGEREF _Toc230454451 \h </w:instrText>
+          <w:instrText xml:space="preserve"> PAGEREF _Toc230455037 \h </w:instrText>
         </w:r>
         <w:r>
           <w:rPr>
@@ -2565,7 +2565,7 @@
     </w:p>
     <w:p>
       <w:pPr>
-        <w:pStyle w:val="TOC2"/>
+        <w:pStyle w:val="TOC3"/>
         <w:tabs>
           <w:tab w:val="right" w:leader="dot" w:pos="9624"/>
         </w:tabs>
@@ -2578,13 +2578,13 @@
           <w14:ligatures w14:val="standardContextual"/>
         </w:rPr>
       </w:pPr>
-      <w:hyperlink w:anchor="_Toc230454452" w:history="1">
+      <w:hyperlink w:anchor="_Toc230455038" w:history="1">
         <w:r>
           <w:rPr>
             <w:rStyle w:val="Hyperlink"/>
             <w:noProof/>
           </w:rPr>
-          <w:t>9. Appendix C — Operating Guide</w:t>
+          <w:t>Choosing among multiple radios</w:t>
         </w:r>
         <w:r>
           <w:rPr>
@@ -2605,7 +2605,7 @@
             <w:noProof/>
             <w:webHidden/>
           </w:rPr>
-          <w:instrText xml:space="preserve"> PAGEREF _Toc230454452 \h </w:instrText>
+          <w:instrText xml:space="preserve"> PAGEREF _Toc230455038 \h </w:instrText>
         </w:r>
         <w:r>
           <w:rPr>
@@ -2625,7 +2625,7 @@
             <w:noProof/>
             <w:webHidden/>
           </w:rPr>
-          <w:t>16</w:t>
+          <w:t>15</w:t>
         </w:r>
         <w:r>
           <w:rPr>
@@ -2651,13 +2651,13 @@
           <w14:ligatures w14:val="standardContextual"/>
         </w:rPr>
       </w:pPr>
-      <w:hyperlink w:anchor="_Toc230454453" w:history="1">
+      <w:hyperlink w:anchor="_Toc230455039" w:history="1">
         <w:r>
           <w:rPr>
             <w:rStyle w:val="Hyperlink"/>
             <w:noProof/>
           </w:rPr>
-          <w:t>Starting up — device selection</w:t>
+          <w:t>SigMF playback mode (no-device fallback)</w:t>
         </w:r>
         <w:r>
           <w:rPr>
@@ -2678,7 +2678,7 @@
             <w:noProof/>
             <w:webHidden/>
           </w:rPr>
-          <w:instrText xml:space="preserve"> PAGEREF _Toc230454453 \h </w:instrText>
+          <w:instrText xml:space="preserve"> PAGEREF _Toc230455039 \h </w:instrText>
         </w:r>
         <w:r>
           <w:rPr>
@@ -2698,7 +2698,7 @@
             <w:noProof/>
             <w:webHidden/>
           </w:rPr>
-          <w:t>16</w:t>
+          <w:t>15</w:t>
         </w:r>
         <w:r>
           <w:rPr>
@@ -2711,7 +2711,7 @@
     </w:p>
     <w:p>
       <w:pPr>
-        <w:pStyle w:val="TOC3"/>
+        <w:pStyle w:val="TOC2"/>
         <w:tabs>
           <w:tab w:val="right" w:leader="dot" w:pos="9624"/>
         </w:tabs>
@@ -2724,13 +2724,13 @@
           <w14:ligatures w14:val="standardContextual"/>
         </w:rPr>
       </w:pPr>
-      <w:hyperlink w:anchor="_Toc230454454" w:history="1">
+      <w:hyperlink w:anchor="_Toc230455040" w:history="1">
         <w:r>
           <w:rPr>
             <w:rStyle w:val="Hyperlink"/>
             <w:noProof/>
           </w:rPr>
-          <w:t>Playback mode</w:t>
+          <w:t>9. Appendix C — Operating Guide</w:t>
         </w:r>
         <w:r>
           <w:rPr>
@@ -2751,7 +2751,7 @@
             <w:noProof/>
             <w:webHidden/>
           </w:rPr>
-          <w:instrText xml:space="preserve"> PAGEREF _Toc230454454 \h </w:instrText>
+          <w:instrText xml:space="preserve"> PAGEREF _Toc230455040 \h </w:instrText>
         </w:r>
         <w:r>
           <w:rPr>
@@ -2797,13 +2797,13 @@
           <w14:ligatures w14:val="standardContextual"/>
         </w:rPr>
       </w:pPr>
-      <w:hyperlink w:anchor="_Toc230454455" w:history="1">
+      <w:hyperlink w:anchor="_Toc230455041" w:history="1">
         <w:r>
           <w:rPr>
             <w:rStyle w:val="Hyperlink"/>
             <w:noProof/>
           </w:rPr>
-          <w:t>Sidebar controls (right side)</w:t>
+          <w:t>Starting up — device selection</w:t>
         </w:r>
         <w:r>
           <w:rPr>
@@ -2824,7 +2824,7 @@
             <w:noProof/>
             <w:webHidden/>
           </w:rPr>
-          <w:instrText xml:space="preserve"> PAGEREF _Toc230454455 \h </w:instrText>
+          <w:instrText xml:space="preserve"> PAGEREF _Toc230455041 \h </w:instrText>
         </w:r>
         <w:r>
           <w:rPr>
@@ -2870,13 +2870,13 @@
           <w14:ligatures w14:val="standardContextual"/>
         </w:rPr>
       </w:pPr>
-      <w:hyperlink w:anchor="_Toc230454456" w:history="1">
+      <w:hyperlink w:anchor="_Toc230455042" w:history="1">
         <w:r>
           <w:rPr>
             <w:rStyle w:val="Hyperlink"/>
             <w:noProof/>
           </w:rPr>
-          <w:t>Spectrum (top plot)</w:t>
+          <w:t>Playback mode</w:t>
         </w:r>
         <w:r>
           <w:rPr>
@@ -2897,7 +2897,7 @@
             <w:noProof/>
             <w:webHidden/>
           </w:rPr>
-          <w:instrText xml:space="preserve"> PAGEREF _Toc230454456 \h </w:instrText>
+          <w:instrText xml:space="preserve"> PAGEREF _Toc230455042 \h </w:instrText>
         </w:r>
         <w:r>
           <w:rPr>
@@ -2943,13 +2943,13 @@
           <w14:ligatures w14:val="standardContextual"/>
         </w:rPr>
       </w:pPr>
-      <w:hyperlink w:anchor="_Toc230454457" w:history="1">
+      <w:hyperlink w:anchor="_Toc230455043" w:history="1">
         <w:r>
           <w:rPr>
             <w:rStyle w:val="Hyperlink"/>
             <w:noProof/>
           </w:rPr>
-          <w:t>Waterfall (bottom plot)</w:t>
+          <w:t>Sidebar controls (right side)</w:t>
         </w:r>
         <w:r>
           <w:rPr>
@@ -2970,7 +2970,7 @@
             <w:noProof/>
             <w:webHidden/>
           </w:rPr>
-          <w:instrText xml:space="preserve"> PAGEREF _Toc230454457 \h </w:instrText>
+          <w:instrText xml:space="preserve"> PAGEREF _Toc230455043 \h </w:instrText>
         </w:r>
         <w:r>
           <w:rPr>
@@ -2990,7 +2990,7 @@
             <w:noProof/>
             <w:webHidden/>
           </w:rPr>
-          <w:t>18</w:t>
+          <w:t>17</w:t>
         </w:r>
         <w:r>
           <w:rPr>
@@ -3016,13 +3016,13 @@
           <w14:ligatures w14:val="standardContextual"/>
         </w:rPr>
       </w:pPr>
-      <w:hyperlink w:anchor="_Toc230454458" w:history="1">
+      <w:hyperlink w:anchor="_Toc230455044" w:history="1">
         <w:r>
           <w:rPr>
             <w:rStyle w:val="Hyperlink"/>
             <w:noProof/>
           </w:rPr>
-          <w:t>Persistence</w:t>
+          <w:t>Spectrum (top plot)</w:t>
         </w:r>
         <w:r>
           <w:rPr>
@@ -3043,7 +3043,7 @@
             <w:noProof/>
             <w:webHidden/>
           </w:rPr>
-          <w:instrText xml:space="preserve"> PAGEREF _Toc230454458 \h </w:instrText>
+          <w:instrText xml:space="preserve"> PAGEREF _Toc230455044 \h </w:instrText>
         </w:r>
         <w:r>
           <w:rPr>
@@ -3089,13 +3089,13 @@
           <w14:ligatures w14:val="standardContextual"/>
         </w:rPr>
       </w:pPr>
-      <w:hyperlink w:anchor="_Toc230454459" w:history="1">
+      <w:hyperlink w:anchor="_Toc230455045" w:history="1">
         <w:r>
           <w:rPr>
             <w:rStyle w:val="Hyperlink"/>
             <w:noProof/>
           </w:rPr>
-          <w:t>Update checks</w:t>
+          <w:t>Waterfall (bottom plot)</w:t>
         </w:r>
         <w:r>
           <w:rPr>
@@ -3116,7 +3116,7 @@
             <w:noProof/>
             <w:webHidden/>
           </w:rPr>
-          <w:instrText xml:space="preserve"> PAGEREF _Toc230454459 \h </w:instrText>
+          <w:instrText xml:space="preserve"> PAGEREF _Toc230455045 \h </w:instrText>
         </w:r>
         <w:r>
           <w:rPr>
@@ -3162,12 +3162,158 @@
           <w14:ligatures w14:val="standardContextual"/>
         </w:rPr>
       </w:pPr>
-      <w:hyperlink w:anchor="_Toc230454460" w:history="1">
+      <w:hyperlink w:anchor="_Toc230455046" w:history="1">
         <w:r>
           <w:rPr>
             <w:rStyle w:val="Hyperlink"/>
             <w:noProof/>
           </w:rPr>
+          <w:t>Persistence</w:t>
+        </w:r>
+        <w:r>
+          <w:rPr>
+            <w:noProof/>
+            <w:webHidden/>
+          </w:rPr>
+          <w:tab/>
+        </w:r>
+        <w:r>
+          <w:rPr>
+            <w:noProof/>
+            <w:webHidden/>
+          </w:rPr>
+          <w:fldChar w:fldCharType="begin"/>
+        </w:r>
+        <w:r>
+          <w:rPr>
+            <w:noProof/>
+            <w:webHidden/>
+          </w:rPr>
+          <w:instrText xml:space="preserve"> PAGEREF _Toc230455046 \h </w:instrText>
+        </w:r>
+        <w:r>
+          <w:rPr>
+            <w:noProof/>
+            <w:webHidden/>
+          </w:rPr>
+        </w:r>
+        <w:r>
+          <w:rPr>
+            <w:noProof/>
+            <w:webHidden/>
+          </w:rPr>
+          <w:fldChar w:fldCharType="separate"/>
+        </w:r>
+        <w:r>
+          <w:rPr>
+            <w:noProof/>
+            <w:webHidden/>
+          </w:rPr>
+          <w:t>18</w:t>
+        </w:r>
+        <w:r>
+          <w:rPr>
+            <w:noProof/>
+            <w:webHidden/>
+          </w:rPr>
+          <w:fldChar w:fldCharType="end"/>
+        </w:r>
+      </w:hyperlink>
+    </w:p>
+    <w:p>
+      <w:pPr>
+        <w:pStyle w:val="TOC3"/>
+        <w:tabs>
+          <w:tab w:val="right" w:leader="dot" w:pos="9624"/>
+        </w:tabs>
+        <w:rPr>
+          <w:rFonts w:asciiTheme="minorHAnsi" w:hAnsiTheme="minorHAnsi"/>
+          <w:noProof/>
+          <w:kern w:val="2"/>
+          <w:sz w:val="24"/>
+          <w:szCs w:val="24"/>
+          <w14:ligatures w14:val="standardContextual"/>
+        </w:rPr>
+      </w:pPr>
+      <w:hyperlink w:anchor="_Toc230455047" w:history="1">
+        <w:r>
+          <w:rPr>
+            <w:rStyle w:val="Hyperlink"/>
+            <w:noProof/>
+          </w:rPr>
+          <w:t>Update checks</w:t>
+        </w:r>
+        <w:r>
+          <w:rPr>
+            <w:noProof/>
+            <w:webHidden/>
+          </w:rPr>
+          <w:tab/>
+        </w:r>
+        <w:r>
+          <w:rPr>
+            <w:noProof/>
+            <w:webHidden/>
+          </w:rPr>
+          <w:fldChar w:fldCharType="begin"/>
+        </w:r>
+        <w:r>
+          <w:rPr>
+            <w:noProof/>
+            <w:webHidden/>
+          </w:rPr>
+          <w:instrText xml:space="preserve"> PAGEREF _Toc230455047 \h </w:instrText>
+        </w:r>
+        <w:r>
+          <w:rPr>
+            <w:noProof/>
+            <w:webHidden/>
+          </w:rPr>
+        </w:r>
+        <w:r>
+          <w:rPr>
+            <w:noProof/>
+            <w:webHidden/>
+          </w:rPr>
+          <w:fldChar w:fldCharType="separate"/>
+        </w:r>
+        <w:r>
+          <w:rPr>
+            <w:noProof/>
+            <w:webHidden/>
+          </w:rPr>
+          <w:t>19</w:t>
+        </w:r>
+        <w:r>
+          <w:rPr>
+            <w:noProof/>
+            <w:webHidden/>
+          </w:rPr>
+          <w:fldChar w:fldCharType="end"/>
+        </w:r>
+      </w:hyperlink>
+    </w:p>
+    <w:p>
+      <w:pPr>
+        <w:pStyle w:val="TOC3"/>
+        <w:tabs>
+          <w:tab w:val="right" w:leader="dot" w:pos="9624"/>
+        </w:tabs>
+        <w:rPr>
+          <w:rFonts w:asciiTheme="minorHAnsi" w:hAnsiTheme="minorHAnsi"/>
+          <w:noProof/>
+          <w:kern w:val="2"/>
+          <w:sz w:val="24"/>
+          <w:szCs w:val="24"/>
+          <w14:ligatures w14:val="standardContextual"/>
+        </w:rPr>
+      </w:pPr>
+      <w:hyperlink w:anchor="_Toc230455048" w:history="1">
+        <w:r>
+          <w:rPr>
+            <w:rStyle w:val="Hyperlink"/>
+            <w:noProof/>
+          </w:rPr>
           <w:t>Tips for pulsar work</w:t>
         </w:r>
         <w:r>
@@ -3189,7 +3335,7 @@
             <w:noProof/>
             <w:webHidden/>
           </w:rPr>
-          <w:instrText xml:space="preserve"> PAGEREF _Toc230454460 \h </w:instrText>
+          <w:instrText xml:space="preserve"> PAGEREF _Toc230455048 \h </w:instrText>
         </w:r>
         <w:r>
           <w:rPr>
@@ -3209,7 +3355,7 @@
             <w:noProof/>
             <w:webHidden/>
           </w:rPr>
-          <w:t>18</w:t>
+          <w:t>19</w:t>
         </w:r>
         <w:r>
           <w:rPr>
@@ -3235,7 +3381,7 @@
         <w:pStyle w:val="Heading1"/>
         <w:shd w:val="clear" w:color="auto" w:fill="156082"/>
       </w:pPr>
-      <w:bookmarkStart w:id="1" w:name="_Toc230454420"/>
+      <w:bookmarkStart w:id="1" w:name="_Toc230455006"/>
       <w:r>
         <w:lastRenderedPageBreak/>
         <w:t xml:space="preserve">DSES Spectrum Analyzer — </w:t>
@@ -3314,7 +3460,7 @@
       <w:pPr>
         <w:pStyle w:val="Heading2"/>
       </w:pPr>
-      <w:bookmarkStart w:id="2" w:name="_Toc230454421"/>
+      <w:bookmarkStart w:id="2" w:name="_Toc230455007"/>
       <w:r>
         <w:t>1. What the recipient needs to know first</w:t>
       </w:r>
@@ -3391,7 +3537,47 @@
     </w:p>
     <w:p>
       <w:r>
-        <w:t>Per-OS file names and steps are in §2 below. (§2)</w:t>
+        <w:t xml:space="preserve">Per-OS file names and steps are in §2 below. Then add three packages the app needs that Radioconda doesn’t bundle — </w:t>
+      </w:r>
+      <w:r>
+        <w:rPr>
+          <w:rFonts w:ascii="Consolas" w:hAnsi="Consolas"/>
+          <w:sz w:val="20"/>
+        </w:rPr>
+        <w:t>pyside6</w:t>
+      </w:r>
+      <w:r>
+        <w:t xml:space="preserve">, </w:t>
+      </w:r>
+      <w:r>
+        <w:rPr>
+          <w:rFonts w:ascii="Consolas" w:hAnsi="Consolas"/>
+          <w:sz w:val="20"/>
+        </w:rPr>
+        <w:t>pyqtgraph</w:t>
+      </w:r>
+      <w:r>
+        <w:t xml:space="preserve">, </w:t>
+      </w:r>
+      <w:r>
+        <w:rPr>
+          <w:rFonts w:ascii="Consolas" w:hAnsi="Consolas"/>
+          <w:sz w:val="20"/>
+        </w:rPr>
+        <w:t>scipy</w:t>
+      </w:r>
+      <w:r>
+        <w:t xml:space="preserve"> — with one </w:t>
+      </w:r>
+      <w:r>
+        <w:rPr>
+          <w:rFonts w:ascii="Consolas" w:hAnsi="Consolas"/>
+          <w:sz w:val="20"/>
+        </w:rPr>
+        <w:t>conda install</w:t>
+      </w:r>
+      <w:r>
+        <w:t xml:space="preserve"> (§2.4). (§2)</w:t>
       </w:r>
     </w:p>
     <w:p>
@@ -3431,7 +3617,7 @@
       <w:pPr>
         <w:pStyle w:val="Heading3"/>
       </w:pPr>
-      <w:bookmarkStart w:id="3" w:name="_Toc230454422"/>
+      <w:bookmarkStart w:id="3" w:name="_Toc230455008"/>
       <w:r>
         <w:t>System requirements</w:t>
       </w:r>
@@ -3500,7 +3686,14 @@
               <w:cnfStyle w:val="000000100000" w:firstRow="0" w:lastRow="0" w:firstColumn="0" w:lastColumn="0" w:oddVBand="0" w:evenVBand="0" w:oddHBand="1" w:evenHBand="0" w:firstRowFirstColumn="0" w:firstRowLastColumn="0" w:lastRowFirstColumn="0" w:lastRowLastColumn="0"/>
             </w:pPr>
             <w:r>
-              <w:t>Windows 11; Ubuntu/Debian/Fedora/Arch (current); macOS 11 Big Sur or newer</w:t>
+              <w:t xml:space="preserve">Windows 11; </w:t>
+            </w:r>
+            <w:r>
+              <w:t xml:space="preserve">Ubuntu/Debian/Fedora/Arch </w:t>
+            </w:r>
+            <w:r>
+              <w:lastRenderedPageBreak/>
+              <w:t>(current); macOS 11 Big Sur or newer</w:t>
             </w:r>
           </w:p>
         </w:tc>
@@ -3597,10 +3790,7 @@
               <w:cnfStyle w:val="000000010000" w:firstRow="0" w:lastRow="0" w:firstColumn="0" w:lastColumn="0" w:oddVBand="0" w:evenVBand="0" w:oddHBand="0" w:evenHBand="1" w:firstRowFirstColumn="0" w:firstRowLastColumn="0" w:lastRowFirstColumn="0" w:lastRowLastColumn="0"/>
             </w:pPr>
             <w:r>
-              <w:t xml:space="preserve">One USB 3.0 port (5 </w:t>
-            </w:r>
-            <w:r>
-              <w:t>Gbps) for the B210</w:t>
+              <w:t>One USB 3.0 port (5 Gbps) for the B210</w:t>
             </w:r>
           </w:p>
         </w:tc>
@@ -3706,7 +3896,7 @@
       <w:pPr>
         <w:pStyle w:val="Heading2"/>
       </w:pPr>
-      <w:bookmarkStart w:id="4" w:name="_Toc230454423"/>
+      <w:bookmarkStart w:id="4" w:name="_Toc230455009"/>
       <w:r>
         <w:t>2. Installing Radioconda</w:t>
       </w:r>
@@ -3716,7 +3906,7 @@
       <w:pPr>
         <w:pStyle w:val="Heading3"/>
       </w:pPr>
-      <w:bookmarkStart w:id="5" w:name="_Toc230454424"/>
+      <w:bookmarkStart w:id="5" w:name="_Toc230455010"/>
       <w:r>
         <w:t>2.1 Windows 11</w:t>
       </w:r>
@@ -3940,7 +4130,7 @@
       <w:pPr>
         <w:pStyle w:val="Heading3"/>
       </w:pPr>
-      <w:bookmarkStart w:id="6" w:name="_Toc230454425"/>
+      <w:bookmarkStart w:id="6" w:name="_Toc230455011"/>
       <w:r>
         <w:t>2.2 Linux</w:t>
       </w:r>
@@ -3995,6 +4185,7 @@
         <w:rPr>
           <w:b/>
         </w:rPr>
+        <w:lastRenderedPageBreak/>
         <w:t>Backup:</w:t>
       </w:r>
       <w:r>
@@ -4003,7 +4194,6 @@
     </w:p>
     <w:p>
       <w:r>
-        <w:lastRenderedPageBreak/>
         <w:t xml:space="preserve">(ARM and POWER builds — </w:t>
       </w:r>
       <w:r>
@@ -4032,10 +4222,7 @@
         <w:pStyle w:val="ListNumber"/>
       </w:pPr>
       <w:r>
-        <w:t xml:space="preserve">From a terminal, run the file you downloaded (substitute the </w:t>
-      </w:r>
-      <w:r>
-        <w:t>real version):</w:t>
+        <w:t>From a terminal, run the file you downloaded (substitute the real version):</w:t>
       </w:r>
     </w:p>
     <w:tbl>
@@ -4210,7 +4397,7 @@
       <w:pPr>
         <w:pStyle w:val="Heading3"/>
       </w:pPr>
-      <w:bookmarkStart w:id="7" w:name="_Toc230454426"/>
+      <w:bookmarkStart w:id="7" w:name="_Toc230455012"/>
       <w:r>
         <w:t>2.3 macOS (Intel and Apple Silicon)</w:t>
       </w:r>
@@ -4379,6 +4566,7 @@
         <w:pStyle w:val="ListNumber"/>
       </w:pPr>
       <w:r>
+        <w:lastRenderedPageBreak/>
         <w:t>From a terminal, run the file you downloaded (substitute the real version + arch):</w:t>
       </w:r>
     </w:p>
@@ -4402,7 +4590,6 @@
                 <w:rFonts w:ascii="Consolas" w:hAnsi="Consolas"/>
                 <w:sz w:val="18"/>
               </w:rPr>
-              <w:lastRenderedPageBreak/>
               <w:t xml:space="preserve">   bash radioconda-&lt;version&gt;-MacOSX-&lt;arch&gt;.sh</w:t>
             </w:r>
           </w:p>
@@ -4480,7 +4667,10 @@
     </w:tbl>
     <w:p>
       <w:r>
-        <w:t>No radio yet? Skip this — the app starts in playback mode from the bundled sample (see §8).</w:t>
+        <w:t xml:space="preserve">No radio yet? </w:t>
+      </w:r>
+      <w:r>
+        <w:t>Skip this — the app starts in playback mode from the bundled sample (see §8).</w:t>
       </w:r>
     </w:p>
     <w:p>
@@ -4525,213 +4715,297 @@
     </w:tbl>
     <w:p>
       <w:pPr>
-        <w:pStyle w:val="Heading2"/>
-      </w:pPr>
-      <w:bookmarkStart w:id="8" w:name="_Toc230454427"/>
-      <w:r>
-        <w:t xml:space="preserve">3. Installing the DSES </w:t>
-      </w:r>
-      <w:r>
-        <w:t>Spectrum Analyzer</w:t>
+        <w:pStyle w:val="Heading3"/>
+      </w:pPr>
+      <w:bookmarkStart w:id="8" w:name="_Toc230455013"/>
+      <w:r>
+        <w:t>2.4 Add the packages the analyzer needs (all platforms)</w:t>
       </w:r>
       <w:bookmarkEnd w:id="8"/>
     </w:p>
     <w:p>
       <w:r>
-        <w:t xml:space="preserve">Download the application from the distribution site. You can either use the direct links below, or browse the folder &lt;https://gpstime.com/sw_distribution/b210_sa/&gt; and pick the newest </w:t>
+        <w:t xml:space="preserve">Stock Radioconda bundles GNU Radio, UHD, and SoapySDR, but </w:t>
+      </w:r>
+      <w:r>
+        <w:rPr>
+          <w:b/>
+        </w:rPr>
+        <w:t>not</w:t>
+      </w:r>
+      <w:r>
+        <w:t xml:space="preserve"> the GUI and plotting packages this app uses (</w:t>
       </w:r>
       <w:r>
         <w:rPr>
           <w:rFonts w:ascii="Consolas" w:hAnsi="Consolas"/>
           <w:sz w:val="20"/>
         </w:rPr>
-        <w:t>dses-spectrum-analyzer-*.zip</w:t>
-      </w:r>
-      <w:r>
-        <w:t>:</w:t>
-      </w:r>
-    </w:p>
-    <w:p>
-      <w:pPr>
-        <w:pStyle w:val="ListBullet"/>
-      </w:pPr>
-      <w:r>
-        <w:rPr>
-          <w:b/>
-        </w:rPr>
-        <w:t>Application (zip):</w:t>
-      </w:r>
-      <w:r>
-        <w:t xml:space="preserve"> &lt;https://gpstime.com/sw_distribution/b210_sa/dses-spectrum-analyzer-1.0.0.zip&gt;</w:t>
-      </w:r>
-    </w:p>
-    <w:p>
-      <w:pPr>
-        <w:pStyle w:val="ListBullet"/>
-      </w:pPr>
-      <w:r>
-        <w:rPr>
-          <w:b/>
-        </w:rPr>
-        <w:t>This guide (PDF):</w:t>
-      </w:r>
-      <w:r>
-        <w:t xml:space="preserve"> &lt;https://gpstime.com/sw_distribution/b210_sa/DSES_RFI_Spectrum_Analyzer_Installation.pdf&gt;</w:t>
-      </w:r>
-    </w:p>
-    <w:p>
-      <w:r>
-        <w:t xml:space="preserve">The zip is roughly 60 MB — it includes a short sample recording so the program can run in playback mode when no radio is attached. (Replace </w:t>
+        <w:t>pyside6</w:t>
+      </w:r>
+      <w:r>
+        <w:t xml:space="preserve">, </w:t>
       </w:r>
       <w:r>
         <w:rPr>
           <w:rFonts w:ascii="Consolas" w:hAnsi="Consolas"/>
           <w:sz w:val="20"/>
         </w:rPr>
-        <w:t>1.0.0</w:t>
-      </w:r>
-      <w:r>
-        <w:t xml:space="preserve"> in the link with a newer version number if a later release has been published.)</w:t>
-      </w:r>
-    </w:p>
-    <w:p>
-      <w:pPr>
-        <w:pStyle w:val="Heading3"/>
-      </w:pPr>
-      <w:bookmarkStart w:id="9" w:name="_Toc230454428"/>
-      <w:r>
-        <w:t>3.1 Windows 11</w:t>
-      </w:r>
-      <w:bookmarkEnd w:id="9"/>
-    </w:p>
-    <w:p>
-      <w:pPr>
-        <w:pStyle w:val="ListNumber"/>
-      </w:pPr>
-      <w:r>
-        <w:t xml:space="preserve">Extract the zip anywhere you have write permission. A common choice is </w:t>
+        <w:t>pyqtgraph</w:t>
+      </w:r>
+      <w:r>
+        <w:t xml:space="preserve">, </w:t>
       </w:r>
       <w:r>
         <w:rPr>
           <w:rFonts w:ascii="Consolas" w:hAnsi="Consolas"/>
           <w:sz w:val="20"/>
         </w:rPr>
-        <w:t>Documents\DSES-Spectrum-Analyzer</w:t>
-      </w:r>
-      <w:r>
-        <w:t xml:space="preserve">. The extracted folder will be </w:t>
+        <w:t>scipy</w:t>
+      </w:r>
+      <w:r>
+        <w:t>). Install them once into Radioconda — this is a one-time step; future app updates don’t repeat it.</w:t>
+      </w:r>
+    </w:p>
+    <w:p>
+      <w:r>
+        <w:t xml:space="preserve">Open an </w:t>
+      </w:r>
+      <w:r>
+        <w:rPr>
+          <w:b/>
+        </w:rPr>
+        <w:t>activated Radioconda shell</w:t>
+      </w:r>
+      <w:r>
+        <w:t>:</w:t>
+      </w:r>
+    </w:p>
+    <w:p>
+      <w:pPr>
+        <w:pStyle w:val="ListBullet"/>
+      </w:pPr>
+      <w:r>
+        <w:rPr>
+          <w:b/>
+        </w:rPr>
+        <w:t>Windows:</w:t>
+      </w:r>
+      <w:r>
+        <w:t xml:space="preserve"> the </w:t>
+      </w:r>
+      <w:r>
+        <w:rPr>
+          <w:b/>
+        </w:rPr>
+        <w:t>Anaconda Prompt (Radioconda)</w:t>
+      </w:r>
+      <w:r>
+        <w:t xml:space="preserve"> shortcut in the Start menu.</w:t>
+      </w:r>
+    </w:p>
+    <w:p>
+      <w:pPr>
+        <w:pStyle w:val="ListBullet"/>
+      </w:pPr>
+      <w:r>
+        <w:rPr>
+          <w:b/>
+        </w:rPr>
+        <w:t>Linux / macOS:</w:t>
+      </w:r>
+      <w:r>
+        <w:t xml:space="preserve"> any terminal whose prompt shows </w:t>
       </w:r>
       <w:r>
         <w:rPr>
           <w:rFonts w:ascii="Consolas" w:hAnsi="Consolas"/>
           <w:sz w:val="20"/>
         </w:rPr>
-        <w:t>dses-spectrum-analyzer-1.0.0\</w:t>
-      </w:r>
-      <w:r>
-        <w:t xml:space="preserve"> and will contain </w:t>
+        <w:t>(base)</w:t>
+      </w:r>
+      <w:r>
+        <w:t xml:space="preserve"> (or run </w:t>
       </w:r>
       <w:r>
         <w:rPr>
           <w:rFonts w:ascii="Consolas" w:hAnsi="Consolas"/>
           <w:sz w:val="20"/>
         </w:rPr>
-        <w:t>dses_spectrum_analyzer.py</w:t>
-      </w:r>
-      <w:r>
-        <w:t xml:space="preserve">, </w:t>
+        <w:t>source ~/radioconda/bin/activate</w:t>
+      </w:r>
+      <w:r>
+        <w:t>).</w:t>
+      </w:r>
+    </w:p>
+    <w:p>
+      <w:r>
+        <w:t>Then run:</w:t>
+      </w:r>
+    </w:p>
+    <w:tbl>
+      <w:tblPr>
+        <w:tblW w:w="0" w:type="auto"/>
+        <w:tblLook w:val="04A0" w:firstRow="1" w:lastRow="0" w:firstColumn="1" w:lastColumn="0" w:noHBand="0" w:noVBand="1"/>
+      </w:tblPr>
+      <w:tblGrid>
+        <w:gridCol w:w="9634"/>
+      </w:tblGrid>
+      <w:tr>
+        <w:tc>
+          <w:tcPr>
+            <w:tcW w:w="9634" w:type="dxa"/>
+            <w:shd w:val="clear" w:color="auto" w:fill="F2F2F2"/>
+          </w:tcPr>
+          <w:p>
+            <w:r>
+              <w:rPr>
+                <w:rFonts w:ascii="Consolas" w:hAnsi="Consolas"/>
+                <w:sz w:val="18"/>
+              </w:rPr>
+              <w:t>conda install -c conda-forge pyside6 pyqtgraph scipy</w:t>
+            </w:r>
+          </w:p>
+        </w:tc>
+      </w:tr>
+    </w:tbl>
+    <w:p>
+      <w:r>
+        <w:t>Accept the prompt; conda downloads and installs the three packages. If the launcher later reports “Missing required packages,” this is the step that was skipped.</w:t>
+      </w:r>
+    </w:p>
+    <w:p>
+      <w:pPr>
+        <w:pStyle w:val="Heading2"/>
+      </w:pPr>
+      <w:bookmarkStart w:id="9" w:name="_Toc230455014"/>
+      <w:r>
+        <w:t>3. Installing the DSES Spectrum Analyzer</w:t>
+      </w:r>
+      <w:bookmarkEnd w:id="9"/>
+    </w:p>
+    <w:p>
+      <w:r>
+        <w:t xml:space="preserve">Download the application from the distribution site. You can either use the direct links below, or browse the folder &lt;https://gpstime.com/sw_distribution/b210_sa/&gt; and pick the newest </w:t>
       </w:r>
       <w:r>
         <w:rPr>
           <w:rFonts w:ascii="Consolas" w:hAnsi="Consolas"/>
           <w:sz w:val="20"/>
         </w:rPr>
-        <w:t>launcher.bat</w:t>
-      </w:r>
-      <w:r>
-        <w:t xml:space="preserve">, </w:t>
+        <w:t>dses-spectrum-analyzer-*.zip</w:t>
+      </w:r>
+      <w:r>
+        <w:t>:</w:t>
+      </w:r>
+    </w:p>
+    <w:p>
+      <w:pPr>
+        <w:pStyle w:val="ListBullet"/>
+      </w:pPr>
+      <w:r>
+        <w:rPr>
+          <w:b/>
+        </w:rPr>
+        <w:t>Application (zip):</w:t>
+      </w:r>
+      <w:r>
+        <w:t xml:space="preserve"> &lt;https://gpstime.com/sw_distribution/b210_sa/dses-spectrum-analyzer-1.0.0.zip&gt;</w:t>
+      </w:r>
+    </w:p>
+    <w:p>
+      <w:pPr>
+        <w:pStyle w:val="ListBullet"/>
+      </w:pPr>
+      <w:r>
+        <w:rPr>
+          <w:b/>
+        </w:rPr>
+        <w:t>This guide (PDF):</w:t>
+      </w:r>
+      <w:r>
+        <w:t xml:space="preserve"> &lt;https://gpstime.com/sw_distribution/b210_sa/DSES_RFI_Spectrum_Analyzer_Installation.pdf&gt;</w:t>
+      </w:r>
+    </w:p>
+    <w:p>
+      <w:r>
+        <w:lastRenderedPageBreak/>
+        <w:t xml:space="preserve">The zip is roughly 60 MB — it includes a short sample recording so the program can run in playback mode when no radio is attached. (Replace </w:t>
       </w:r>
       <w:r>
         <w:rPr>
           <w:rFonts w:ascii="Consolas" w:hAnsi="Consolas"/>
           <w:sz w:val="20"/>
         </w:rPr>
-        <w:t>launcher.ps1</w:t>
-      </w:r>
-      <w:r>
-        <w:t xml:space="preserve">, </w:t>
+        <w:t>1.0.0</w:t>
+      </w:r>
+      <w:r>
+        <w:t xml:space="preserve"> in the link with a newer version number if a later release has been published.)</w:t>
+      </w:r>
+    </w:p>
+    <w:p>
+      <w:pPr>
+        <w:pStyle w:val="Heading3"/>
+      </w:pPr>
+      <w:bookmarkStart w:id="10" w:name="_Toc230455015"/>
+      <w:r>
+        <w:t>3.1 Windows 11</w:t>
+      </w:r>
+      <w:bookmarkEnd w:id="10"/>
+    </w:p>
+    <w:p>
+      <w:pPr>
+        <w:pStyle w:val="ListNumber"/>
+      </w:pPr>
+      <w:r>
+        <w:t xml:space="preserve">Extract the zip anywhere you have write permission. A common choice is </w:t>
       </w:r>
       <w:r>
         <w:rPr>
           <w:rFonts w:ascii="Consolas" w:hAnsi="Consolas"/>
           <w:sz w:val="20"/>
         </w:rPr>
-        <w:t>install-shortcut.ps1</w:t>
-      </w:r>
-      <w:r>
-        <w:t xml:space="preserve">, </w:t>
+        <w:t>Documents\DSES-Spectrum-Analyzer</w:t>
+      </w:r>
+      <w:r>
+        <w:t xml:space="preserve">. The extracted folder will be </w:t>
       </w:r>
       <w:r>
         <w:rPr>
           <w:rFonts w:ascii="Consolas" w:hAnsi="Consolas"/>
           <w:sz w:val="20"/>
         </w:rPr>
-        <w:t>LICENSE</w:t>
-      </w:r>
-      <w:r>
-        <w:t xml:space="preserve">, the </w:t>
+        <w:t>dses-spectrum-analyzer-1.0.0\</w:t>
+      </w:r>
+      <w:r>
+        <w:t xml:space="preserve"> and will contain </w:t>
       </w:r>
       <w:r>
         <w:rPr>
           <w:rFonts w:ascii="Consolas" w:hAnsi="Consolas"/>
           <w:sz w:val="20"/>
         </w:rPr>
-        <w:t>icons\</w:t>
-      </w:r>
-      <w:r>
-        <w:t xml:space="preserve"> folder, and this guide.</w:t>
-      </w:r>
-    </w:p>
-    <w:p>
-      <w:pPr>
-        <w:pStyle w:val="ListNumber"/>
-      </w:pPr>
-      <w:r>
-        <w:t xml:space="preserve">Double-click </w:t>
-      </w:r>
-      <w:r>
-        <w:rPr>
-          <w:b/>
-        </w:rPr>
-        <w:t>`launcher.bat`</w:t>
-      </w:r>
-      <w:r>
-        <w:t xml:space="preserve"> to start the application.</w:t>
-      </w:r>
-    </w:p>
-    <w:p>
-      <w:pPr>
-        <w:pStyle w:val="ListNumber"/>
-      </w:pPr>
-      <w:r>
-        <w:t xml:space="preserve">The first time you run it, the launcher searches for Radioconda in this order: the </w:t>
+        <w:t>dses_spectrum_analyzer.py</w:t>
+      </w:r>
+      <w:r>
+        <w:t xml:space="preserve">, </w:t>
       </w:r>
       <w:r>
         <w:rPr>
           <w:rFonts w:ascii="Consolas" w:hAnsi="Consolas"/>
           <w:sz w:val="20"/>
         </w:rPr>
-        <w:t>RADIOCONDA_ROOT</w:t>
-      </w:r>
-      <w:r>
-        <w:t xml:space="preserve"> environment variable, any currently-activated conda env, </w:t>
+        <w:t>launcher.bat</w:t>
+      </w:r>
+      <w:r>
+        <w:t xml:space="preserve">, </w:t>
       </w:r>
       <w:r>
         <w:rPr>
           <w:rFonts w:ascii="Consolas" w:hAnsi="Consolas"/>
           <w:sz w:val="20"/>
         </w:rPr>
-        <w:t>%LOCALAPPDATA%\radioconda</w:t>
+        <w:t>launcher.ps1</w:t>
       </w:r>
       <w:r>
         <w:t xml:space="preserve">, </w:t>
@@ -4741,7 +5015,7 @@
           <w:rFonts w:ascii="Consolas" w:hAnsi="Consolas"/>
           <w:sz w:val="20"/>
         </w:rPr>
-        <w:t>C:\ProgramData\radioconda</w:t>
+        <w:t>install-shortcut.ps1</w:t>
       </w:r>
       <w:r>
         <w:t xml:space="preserve">, </w:t>
@@ -4751,26 +5025,101 @@
           <w:rFonts w:ascii="Consolas" w:hAnsi="Consolas"/>
           <w:sz w:val="20"/>
         </w:rPr>
-        <w:t>%USERPROFILE%\radioconda</w:t>
-      </w:r>
-      <w:r>
-        <w:t xml:space="preserve">, a cached config file, then </w:t>
+        <w:t>LICENSE</w:t>
+      </w:r>
+      <w:r>
+        <w:t xml:space="preserve">, the </w:t>
       </w:r>
       <w:r>
         <w:rPr>
           <w:rFonts w:ascii="Consolas" w:hAnsi="Consolas"/>
           <w:sz w:val="20"/>
         </w:rPr>
-        <w:t>conda info --base</w:t>
-      </w:r>
-      <w:r>
-        <w:t xml:space="preserve"> if </w:t>
+        <w:t>icons\</w:t>
+      </w:r>
+      <w:r>
+        <w:t xml:space="preserve"> folder, and this guide.</w:t>
+      </w:r>
+    </w:p>
+    <w:p>
+      <w:pPr>
+        <w:pStyle w:val="ListNumber"/>
+      </w:pPr>
+      <w:r>
+        <w:t xml:space="preserve">Double-click </w:t>
+      </w:r>
+      <w:r>
+        <w:rPr>
+          <w:b/>
+        </w:rPr>
+        <w:t>`launcher.bat`</w:t>
+      </w:r>
+      <w:r>
+        <w:t xml:space="preserve"> to start the application.</w:t>
+      </w:r>
+    </w:p>
+    <w:p>
+      <w:pPr>
+        <w:pStyle w:val="ListNumber"/>
+      </w:pPr>
+      <w:r>
+        <w:t xml:space="preserve">The first time you run it, the launcher searches for Radioconda in this order: the </w:t>
       </w:r>
       <w:r>
         <w:rPr>
           <w:rFonts w:ascii="Consolas" w:hAnsi="Consolas"/>
           <w:sz w:val="20"/>
         </w:rPr>
+        <w:t>RADIOCONDA_ROOT</w:t>
+      </w:r>
+      <w:r>
+        <w:t xml:space="preserve"> environment variable, any currently-activated conda env, </w:t>
+      </w:r>
+      <w:r>
+        <w:rPr>
+          <w:rFonts w:ascii="Consolas" w:hAnsi="Consolas"/>
+          <w:sz w:val="20"/>
+        </w:rPr>
+        <w:t>%LOCALAPPDATA%\radioconda</w:t>
+      </w:r>
+      <w:r>
+        <w:t xml:space="preserve">, </w:t>
+      </w:r>
+      <w:r>
+        <w:rPr>
+          <w:rFonts w:ascii="Consolas" w:hAnsi="Consolas"/>
+          <w:sz w:val="20"/>
+        </w:rPr>
+        <w:t>C:\ProgramData\radioconda</w:t>
+      </w:r>
+      <w:r>
+        <w:t xml:space="preserve">, </w:t>
+      </w:r>
+      <w:r>
+        <w:rPr>
+          <w:rFonts w:ascii="Consolas" w:hAnsi="Consolas"/>
+          <w:sz w:val="20"/>
+        </w:rPr>
+        <w:t>%USERPROFILE%\radioconda</w:t>
+      </w:r>
+      <w:r>
+        <w:t xml:space="preserve">, a cached config file, then </w:t>
+      </w:r>
+      <w:r>
+        <w:rPr>
+          <w:rFonts w:ascii="Consolas" w:hAnsi="Consolas"/>
+          <w:sz w:val="20"/>
+        </w:rPr>
+        <w:t>conda info --base</w:t>
+      </w:r>
+      <w:r>
+        <w:t xml:space="preserve"> if </w:t>
+      </w:r>
+      <w:r>
+        <w:rPr>
+          <w:rFonts w:ascii="Consolas" w:hAnsi="Consolas"/>
+          <w:sz w:val="20"/>
+        </w:rPr>
         <w:t>conda</w:t>
       </w:r>
       <w:r>
@@ -4782,7 +5131,6 @@
         <w:pStyle w:val="ListNumber"/>
       </w:pPr>
       <w:r>
-        <w:lastRenderedPageBreak/>
         <w:t xml:space="preserve">(Optional) Create a desktop shortcut (with the app’s pulsar icon) by running </w:t>
       </w:r>
       <w:r>
@@ -4873,11 +5221,11 @@
       <w:pPr>
         <w:pStyle w:val="Heading3"/>
       </w:pPr>
-      <w:bookmarkStart w:id="10" w:name="_Toc230454429"/>
+      <w:bookmarkStart w:id="11" w:name="_Toc230455016"/>
       <w:r>
         <w:t>3.2 Linux</w:t>
       </w:r>
-      <w:bookmarkEnd w:id="10"/>
+      <w:bookmarkEnd w:id="11"/>
     </w:p>
     <w:p>
       <w:pPr>
@@ -5040,6 +5388,7 @@
         <w:pStyle w:val="ListNumber"/>
       </w:pPr>
       <w:r>
+        <w:lastRenderedPageBreak/>
         <w:t>Launch:</w:t>
       </w:r>
     </w:p>
@@ -5169,12 +5518,11 @@
       <w:pPr>
         <w:pStyle w:val="Heading3"/>
       </w:pPr>
-      <w:bookmarkStart w:id="11" w:name="_Toc230454430"/>
-      <w:r>
-        <w:lastRenderedPageBreak/>
+      <w:bookmarkStart w:id="12" w:name="_Toc230455017"/>
+      <w:r>
         <w:t>3.3 macOS</w:t>
       </w:r>
-      <w:bookmarkEnd w:id="11"/>
+      <w:bookmarkEnd w:id="12"/>
     </w:p>
     <w:p>
       <w:r>
@@ -5366,18 +5714,24 @@
       <w:pPr>
         <w:pStyle w:val="Heading2"/>
       </w:pPr>
-      <w:bookmarkStart w:id="12" w:name="_Toc230454431"/>
+      <w:bookmarkStart w:id="13" w:name="_Toc230455018"/>
       <w:r>
         <w:t>3A. Extra setup for SDRPlay receivers (RSP1A / RSP1B / RSPduo / RSPdx)</w:t>
       </w:r>
-      <w:bookmarkEnd w:id="12"/>
+      <w:bookmarkEnd w:id="13"/>
     </w:p>
     <w:p>
       <w:r>
         <w:rPr>
           <w:b/>
         </w:rPr>
-        <w:t>Do this only if you’re using an SDRPlay receiver</w:t>
+        <w:t xml:space="preserve">Do this only if you’re using an SDRPlay </w:t>
+      </w:r>
+      <w:r>
+        <w:rPr>
+          <w:b/>
+        </w:rPr>
+        <w:t>receiver</w:t>
       </w:r>
       <w:r>
         <w:t xml:space="preserve"> — and only </w:t>
@@ -5394,6 +5748,7 @@
     </w:p>
     <w:p>
       <w:r>
+        <w:lastRenderedPageBreak/>
         <w:t>SDRPlay needs two extra pieces: the manufacturer’s API driver, and the SoapySDRPlay module that bridges that driver to the SoapySDR layer the program uses.</w:t>
       </w:r>
     </w:p>
@@ -5401,11 +5756,11 @@
       <w:pPr>
         <w:pStyle w:val="Heading3"/>
       </w:pPr>
-      <w:bookmarkStart w:id="13" w:name="_Toc230454432"/>
+      <w:bookmarkStart w:id="14" w:name="_Toc230455019"/>
       <w:r>
         <w:t>3A.1 Install the SDRplay API</w:t>
       </w:r>
-      <w:bookmarkEnd w:id="13"/>
+      <w:bookmarkEnd w:id="14"/>
     </w:p>
     <w:p>
       <w:r>
@@ -5513,12 +5868,11 @@
       <w:pPr>
         <w:pStyle w:val="Heading3"/>
       </w:pPr>
-      <w:bookmarkStart w:id="14" w:name="_Toc230454433"/>
-      <w:r>
-        <w:lastRenderedPageBreak/>
+      <w:bookmarkStart w:id="15" w:name="_Toc230455020"/>
+      <w:r>
         <w:t>3A.2 Install the SoapySDRPlay module</w:t>
       </w:r>
-      <w:bookmarkEnd w:id="14"/>
+      <w:bookmarkEnd w:id="15"/>
     </w:p>
     <w:p>
       <w:r>
@@ -5773,6 +6127,7 @@
     </w:tbl>
     <w:p>
       <w:r>
+        <w:lastRenderedPageBreak/>
         <w:t>Verify it loaded (any OS, from a Radioconda prompt):</w:t>
       </w:r>
     </w:p>
@@ -5882,12 +6237,11 @@
       <w:pPr>
         <w:pStyle w:val="Heading2"/>
       </w:pPr>
-      <w:bookmarkStart w:id="15" w:name="_Toc230454434"/>
-      <w:r>
-        <w:lastRenderedPageBreak/>
+      <w:bookmarkStart w:id="16" w:name="_Toc230455021"/>
+      <w:r>
         <w:t>4. First-run checklist</w:t>
       </w:r>
-      <w:bookmarkEnd w:id="15"/>
+      <w:bookmarkEnd w:id="16"/>
     </w:p>
     <w:p>
       <w:r>
@@ -5995,11 +6349,11 @@
       <w:pPr>
         <w:pStyle w:val="Heading3"/>
       </w:pPr>
-      <w:bookmarkStart w:id="16" w:name="_Toc230454435"/>
+      <w:bookmarkStart w:id="17" w:name="_Toc230455022"/>
       <w:r>
         <w:t>Recommended one-time VOLK tuning</w:t>
       </w:r>
-      <w:bookmarkEnd w:id="16"/>
+      <w:bookmarkEnd w:id="17"/>
     </w:p>
     <w:p>
       <w:r>
@@ -6075,7 +6429,14 @@
                 <w:rFonts w:ascii="Consolas" w:hAnsi="Consolas"/>
                 <w:sz w:val="18"/>
               </w:rPr>
-              <w:t>Windows: open the "Anaconda Prompt (Radioconda)" shortcut, then:</w:t>
+              <w:t xml:space="preserve">Windows: open the "Anaconda Prompt </w:t>
+            </w:r>
+            <w:r>
+              <w:rPr>
+                <w:rFonts w:ascii="Consolas" w:hAnsi="Consolas"/>
+                <w:sz w:val="18"/>
+              </w:rPr>
+              <w:t>(Radioconda)" shortcut, then:</w:t>
             </w:r>
           </w:p>
           <w:p>
@@ -6103,6 +6464,7 @@
                 <w:rFonts w:ascii="Consolas" w:hAnsi="Consolas"/>
                 <w:sz w:val="18"/>
               </w:rPr>
+              <w:lastRenderedPageBreak/>
               <w:t xml:space="preserve">  volk_profile</w:t>
             </w:r>
           </w:p>
@@ -6111,6 +6473,7 @@
     </w:tbl>
     <w:p>
       <w:r>
+        <w:lastRenderedPageBreak/>
         <w:t xml:space="preserve">Takes about 30 seconds. Writes the chosen kernels to </w:t>
       </w:r>
       <w:r>
@@ -6138,21 +6501,21 @@
       <w:pPr>
         <w:pStyle w:val="Heading2"/>
       </w:pPr>
-      <w:bookmarkStart w:id="17" w:name="_Toc230454436"/>
+      <w:bookmarkStart w:id="18" w:name="_Toc230455023"/>
       <w:r>
         <w:t>5. Updating to a new version</w:t>
       </w:r>
-      <w:bookmarkEnd w:id="17"/>
+      <w:bookmarkEnd w:id="18"/>
     </w:p>
     <w:p>
       <w:pPr>
         <w:pStyle w:val="Heading3"/>
       </w:pPr>
-      <w:bookmarkStart w:id="18" w:name="_Toc230454437"/>
+      <w:bookmarkStart w:id="19" w:name="_Toc230455024"/>
       <w:r>
         <w:t>Auto-update notifications</w:t>
       </w:r>
-      <w:bookmarkEnd w:id="18"/>
+      <w:bookmarkEnd w:id="19"/>
     </w:p>
     <w:p>
       <w:r>
@@ -6202,7 +6565,6 @@
     </w:p>
     <w:p>
       <w:r>
-        <w:lastRenderedPageBreak/>
         <w:t xml:space="preserve">The check is read-only — the program never auto-downloads or auto-installs anything. To disable the auto-check entirely, edit your </w:t>
       </w:r>
       <w:r>
@@ -6240,11 +6602,11 @@
       <w:pPr>
         <w:pStyle w:val="Heading3"/>
       </w:pPr>
-      <w:bookmarkStart w:id="19" w:name="_Toc230454438"/>
+      <w:bookmarkStart w:id="20" w:name="_Toc230455025"/>
       <w:r>
         <w:t>Performing the update</w:t>
       </w:r>
-      <w:bookmarkEnd w:id="19"/>
+      <w:bookmarkEnd w:id="20"/>
     </w:p>
     <w:p>
       <w:r>
@@ -6336,11 +6698,11 @@
       <w:pPr>
         <w:pStyle w:val="Heading3"/>
       </w:pPr>
-      <w:bookmarkStart w:id="20" w:name="_Toc230454439"/>
+      <w:bookmarkStart w:id="21" w:name="_Toc230455026"/>
       <w:r>
         <w:t>What is preserved across versions</w:t>
       </w:r>
-      <w:bookmarkEnd w:id="20"/>
+      <w:bookmarkEnd w:id="21"/>
     </w:p>
     <w:p>
       <w:r>
@@ -6519,11 +6881,12 @@
       <w:pPr>
         <w:pStyle w:val="Heading3"/>
       </w:pPr>
-      <w:bookmarkStart w:id="21" w:name="_Toc230454440"/>
-      <w:r>
+      <w:bookmarkStart w:id="22" w:name="_Toc230455027"/>
+      <w:r>
+        <w:lastRenderedPageBreak/>
         <w:t>Backing up your settings</w:t>
       </w:r>
-      <w:bookmarkEnd w:id="21"/>
+      <w:bookmarkEnd w:id="22"/>
     </w:p>
     <w:p>
       <w:r>
@@ -6578,21 +6941,24 @@
       <w:pPr>
         <w:pStyle w:val="Heading2"/>
       </w:pPr>
-      <w:bookmarkStart w:id="22" w:name="_Toc230454441"/>
+      <w:bookmarkStart w:id="23" w:name="_Toc230455028"/>
       <w:r>
         <w:t>6. Troubleshooting</w:t>
       </w:r>
-      <w:bookmarkEnd w:id="22"/>
+      <w:bookmarkEnd w:id="23"/>
     </w:p>
     <w:p>
       <w:pPr>
         <w:pStyle w:val="Heading3"/>
       </w:pPr>
-      <w:bookmarkStart w:id="23" w:name="_Toc230454442"/>
-      <w:r>
-        <w:t>“Radioconda not found in standard locations”</w:t>
-      </w:r>
-      <w:bookmarkEnd w:id="23"/>
+      <w:bookmarkStart w:id="24" w:name="_Toc230455029"/>
+      <w:r>
+        <w:t xml:space="preserve">“Radioconda not found in </w:t>
+      </w:r>
+      <w:r>
+        <w:t>standard locations”</w:t>
+      </w:r>
+      <w:bookmarkEnd w:id="24"/>
     </w:p>
     <w:p>
       <w:r>
@@ -6632,7 +6998,6 @@
         <w:pStyle w:val="ListBullet"/>
       </w:pPr>
       <w:r>
-        <w:lastRenderedPageBreak/>
         <w:t xml:space="preserve">Set the </w:t>
       </w:r>
       <w:r>
@@ -6733,11 +7098,57 @@
       <w:pPr>
         <w:pStyle w:val="Heading3"/>
       </w:pPr>
-      <w:bookmarkStart w:id="24" w:name="_Toc230454443"/>
+      <w:bookmarkStart w:id="25" w:name="_Toc230455030"/>
+      <w:r>
+        <w:t>“Missing required packages (PySide6, pyqtgraph, and/or scipy)” — or `ModuleNotFoundError: No module named 'PySide6'`</w:t>
+      </w:r>
+      <w:bookmarkEnd w:id="25"/>
+    </w:p>
+    <w:p>
+      <w:r>
+        <w:t>Radioconda was found, but the app’s GUI/plotting packages aren’t installed in it. Do the one-time install from §2.4 — open an activated Radioconda shell and run:</w:t>
+      </w:r>
+    </w:p>
+    <w:tbl>
+      <w:tblPr>
+        <w:tblW w:w="0" w:type="auto"/>
+        <w:tblLook w:val="04A0" w:firstRow="1" w:lastRow="0" w:firstColumn="1" w:lastColumn="0" w:noHBand="0" w:noVBand="1"/>
+      </w:tblPr>
+      <w:tblGrid>
+        <w:gridCol w:w="9634"/>
+      </w:tblGrid>
+      <w:tr>
+        <w:tc>
+          <w:tcPr>
+            <w:tcW w:w="9634" w:type="dxa"/>
+            <w:shd w:val="clear" w:color="auto" w:fill="F2F2F2"/>
+          </w:tcPr>
+          <w:p>
+            <w:r>
+              <w:rPr>
+                <w:rFonts w:ascii="Consolas" w:hAnsi="Consolas"/>
+                <w:sz w:val="18"/>
+              </w:rPr>
+              <w:t>conda install -c conda-forge pyside6 pyqtgraph scipy</w:t>
+            </w:r>
+          </w:p>
+        </w:tc>
+      </w:tr>
+    </w:tbl>
+    <w:p>
+      <w:r>
+        <w:t>Then launch again.</w:t>
+      </w:r>
+    </w:p>
+    <w:p>
+      <w:pPr>
+        <w:pStyle w:val="Heading3"/>
+      </w:pPr>
+      <w:bookmarkStart w:id="26" w:name="_Toc230455031"/>
       <w:r>
         <w:t>“No UHD Devices Found”</w:t>
       </w:r>
-      <w:bookmarkEnd w:id="24"/>
+      <w:bookmarkEnd w:id="26"/>
     </w:p>
     <w:p>
       <w:r>
@@ -6797,6 +7208,7 @@
                 <w:rFonts w:ascii="Consolas" w:hAnsi="Consolas"/>
                 <w:sz w:val="18"/>
               </w:rPr>
+              <w:lastRenderedPageBreak/>
               <w:t xml:space="preserve">   Linux:    ~/radioconda/bin/uhd_find_devices</w:t>
             </w:r>
           </w:p>
@@ -6814,6 +7226,7 @@
     </w:tbl>
     <w:p>
       <w:r>
+        <w:lastRenderedPageBreak/>
         <w:t xml:space="preserve">If </w:t>
       </w:r>
       <w:r>
@@ -6831,11 +7244,11 @@
       <w:pPr>
         <w:pStyle w:val="Heading3"/>
       </w:pPr>
-      <w:bookmarkStart w:id="25" w:name="_Toc230454444"/>
+      <w:bookmarkStart w:id="27" w:name="_Toc230455032"/>
       <w:r>
         <w:t>Persistent “O” overflows at high sample rates</w:t>
       </w:r>
-      <w:bookmarkEnd w:id="25"/>
+      <w:bookmarkEnd w:id="27"/>
     </w:p>
     <w:p>
       <w:r>
@@ -6875,11 +7288,11 @@
       <w:pPr>
         <w:pStyle w:val="Heading3"/>
       </w:pPr>
-      <w:bookmarkStart w:id="26" w:name="_Toc230454445"/>
+      <w:bookmarkStart w:id="28" w:name="_Toc230455033"/>
       <w:r>
         <w:t>Spectrum looks flat at −140 dB</w:t>
       </w:r>
-      <w:bookmarkEnd w:id="26"/>
+      <w:bookmarkEnd w:id="28"/>
     </w:p>
     <w:p>
       <w:r>
@@ -6914,15 +7327,11 @@
       <w:pPr>
         <w:pStyle w:val="Heading3"/>
       </w:pPr>
-      <w:bookmarkStart w:id="27" w:name="_Toc230454446"/>
-      <w:r>
-        <w:lastRenderedPageBreak/>
-        <w:t xml:space="preserve">macOS: </w:t>
-      </w:r>
-      <w:r>
-        <w:t>“developer cannot be verified”</w:t>
-      </w:r>
-      <w:bookmarkEnd w:id="27"/>
+      <w:bookmarkStart w:id="29" w:name="_Toc230455034"/>
+      <w:r>
+        <w:t>macOS: “developer cannot be verified”</w:t>
+      </w:r>
+      <w:bookmarkEnd w:id="29"/>
     </w:p>
     <w:tbl>
       <w:tblPr>
@@ -6954,11 +7363,11 @@
       <w:pPr>
         <w:pStyle w:val="Heading3"/>
       </w:pPr>
-      <w:bookmarkStart w:id="28" w:name="_Toc230454447"/>
+      <w:bookmarkStart w:id="30" w:name="_Toc230455035"/>
       <w:r>
         <w:t>Settings won’t persist</w:t>
       </w:r>
-      <w:bookmarkEnd w:id="28"/>
+      <w:bookmarkEnd w:id="30"/>
     </w:p>
     <w:p>
       <w:r>
@@ -7003,11 +7412,11 @@
       <w:pPr>
         <w:pStyle w:val="Heading2"/>
       </w:pPr>
-      <w:bookmarkStart w:id="29" w:name="_Toc230454448"/>
+      <w:bookmarkStart w:id="31" w:name="_Toc230455036"/>
       <w:r>
         <w:t>7. Appendix A — Settings file reference</w:t>
       </w:r>
-      <w:bookmarkEnd w:id="29"/>
+      <w:bookmarkEnd w:id="31"/>
     </w:p>
     <w:p>
       <w:r>
@@ -7118,6 +7527,7 @@
           <w:rFonts w:ascii="Consolas" w:hAnsi="Consolas"/>
           <w:sz w:val="20"/>
         </w:rPr>
+        <w:lastRenderedPageBreak/>
         <w:t>[spectrum]</w:t>
       </w:r>
       <w:r>
@@ -7212,21 +7622,21 @@
       <w:pPr>
         <w:pStyle w:val="Heading2"/>
       </w:pPr>
-      <w:bookmarkStart w:id="30" w:name="_Toc230454449"/>
+      <w:bookmarkStart w:id="32" w:name="_Toc230455037"/>
       <w:r>
         <w:t>8. Appendix B — Device selection and SigMF playback</w:t>
       </w:r>
-      <w:bookmarkEnd w:id="30"/>
+      <w:bookmarkEnd w:id="32"/>
     </w:p>
     <w:p>
       <w:pPr>
         <w:pStyle w:val="Heading3"/>
       </w:pPr>
-      <w:bookmarkStart w:id="31" w:name="_Toc230454450"/>
+      <w:bookmarkStart w:id="33" w:name="_Toc230455038"/>
       <w:r>
         <w:t>Choosing among multiple radios</w:t>
       </w:r>
-      <w:bookmarkEnd w:id="31"/>
+      <w:bookmarkEnd w:id="33"/>
     </w:p>
     <w:p>
       <w:r>
@@ -7241,13 +7651,7 @@
         <w:rPr>
           <w:b/>
         </w:rPr>
-        <w:t xml:space="preserve">No radio attached, no playback </w:t>
-      </w:r>
-      <w:r>
-        <w:rPr>
-          <w:b/>
-        </w:rPr>
-        <w:t>sample:</w:t>
+        <w:t>No radio attached, no playback sample:</w:t>
       </w:r>
       <w:r>
         <w:t xml:space="preserve"> an error dialog says “No radio found” and explains how to enable playback (see below). The app exits.</w:t>
@@ -7308,7 +7712,6 @@
         <w:rPr>
           <w:b/>
         </w:rPr>
-        <w:lastRenderedPageBreak/>
         <w:t>Two or more radios attached</w:t>
       </w:r>
       <w:r>
@@ -7403,11 +7806,11 @@
       <w:pPr>
         <w:pStyle w:val="Heading3"/>
       </w:pPr>
-      <w:bookmarkStart w:id="32" w:name="_Toc230454451"/>
+      <w:bookmarkStart w:id="34" w:name="_Toc230455039"/>
       <w:r>
         <w:t>SigMF playback mode (no-device fallback)</w:t>
       </w:r>
-      <w:bookmarkEnd w:id="32"/>
+      <w:bookmarkEnd w:id="34"/>
     </w:p>
     <w:p>
       <w:r>
@@ -7419,6 +7822,7 @@
         <w:pStyle w:val="ListBullet"/>
       </w:pPr>
       <w:r>
+        <w:lastRenderedPageBreak/>
         <w:t xml:space="preserve">Filenames: </w:t>
       </w:r>
       <w:r>
@@ -7601,114 +8005,117 @@
       <w:pPr>
         <w:pStyle w:val="Heading2"/>
       </w:pPr>
-      <w:bookmarkStart w:id="33" w:name="_Toc230454452"/>
+      <w:bookmarkStart w:id="35" w:name="_Toc230455040"/>
+      <w:r>
+        <w:t>9. Appendix C — Operating Guide</w:t>
+      </w:r>
+      <w:bookmarkEnd w:id="35"/>
+    </w:p>
+    <w:p>
+      <w:r>
+        <w:t xml:space="preserve">&gt; This appendix is a copy of the program’s built-in </w:t>
+      </w:r>
+      <w:r>
+        <w:rPr>
+          <w:b/>
+        </w:rPr>
+        <w:t>Help → User Guide</w:t>
+      </w:r>
+      <w:r>
+        <w:t>. If the two ever differ, the in-app Help is authoritative for the version you’re actually running (it ships inside the application).</w:t>
+      </w:r>
+    </w:p>
+    <w:p>
+      <w:r>
+        <w:t>This is a live spectrum analyzer and waterfall display for the Ettus USRP B210 and other software-defined radios (SDRPlay RSP1A/RSP1B/RSPduo/RSPdx, RTL-SDR, HackRF, Airspy, BladeRF, LimeSDR, PlutoSDR via SoapySDR), designed for pulsar RFI investigation but useful for general-purpose spectrum monitoring.</w:t>
+      </w:r>
+    </w:p>
+    <w:p>
+      <w:pPr>
+        <w:pStyle w:val="Heading3"/>
+      </w:pPr>
+      <w:bookmarkStart w:id="36" w:name="_Toc230455041"/>
+      <w:r>
+        <w:t>Starting up — device selection</w:t>
+      </w:r>
+      <w:bookmarkEnd w:id="36"/>
+    </w:p>
+    <w:p>
+      <w:r>
+        <w:t xml:space="preserve">At launch the program </w:t>
+      </w:r>
+      <w:r>
+        <w:t>enumerates attached SDRs (UHD + SoapySDR) and decides what to use:</w:t>
+      </w:r>
+    </w:p>
+    <w:p>
+      <w:pPr>
+        <w:pStyle w:val="ListBullet"/>
+      </w:pPr>
+      <w:r>
+        <w:rPr>
+          <w:b/>
+        </w:rPr>
+        <w:t>One supported SDR attached</w:t>
+      </w:r>
+      <w:r>
+        <w:t>: opens it silently and remembers the driver and serial in the settings file.</w:t>
+      </w:r>
+    </w:p>
+    <w:p>
+      <w:pPr>
+        <w:pStyle w:val="ListBullet"/>
+      </w:pPr>
+      <w:r>
+        <w:rPr>
+          <w:b/>
+        </w:rPr>
+        <w:t>Two or more radios attached</w:t>
+      </w:r>
+      <w:r>
+        <w:t>: a picker dialog always appears so you can choose which one to use. Your previous choice is pre-selected, so you can just press Enter to use the same radio as last time. Your selection is remembered for next launch.</w:t>
+      </w:r>
+    </w:p>
+    <w:p>
+      <w:pPr>
+        <w:pStyle w:val="ListBullet"/>
+      </w:pPr>
+      <w:r>
+        <w:rPr>
+          <w:b/>
+        </w:rPr>
+        <w:t>No SDR attached, but a bundled SigMF sample is present</w:t>
+      </w:r>
+      <w:r>
+        <w:t xml:space="preserve">: the program falls back to </w:t>
+      </w:r>
+      <w:r>
+        <w:rPr>
+          <w:b/>
+        </w:rPr>
+        <w:t>playback mode</w:t>
+      </w:r>
+      <w:r>
+        <w:t xml:space="preserve"> — see below.</w:t>
+      </w:r>
+    </w:p>
+    <w:p>
+      <w:pPr>
+        <w:pStyle w:val="ListBullet"/>
+      </w:pPr>
+      <w:r>
+        <w:rPr>
+          <w:b/>
+        </w:rPr>
+        <w:t>No SDR and no sample</w:t>
+      </w:r>
+      <w:r>
+        <w:t>: an error dialog explains how to fix it and the program exits.</w:t>
+      </w:r>
+    </w:p>
+    <w:p>
       <w:r>
         <w:lastRenderedPageBreak/>
-        <w:t>9. Appendix C — Operating Guide</w:t>
-      </w:r>
-      <w:bookmarkEnd w:id="33"/>
-    </w:p>
-    <w:p>
-      <w:r>
-        <w:t xml:space="preserve">&gt; This appendix is a copy of the program’s built-in </w:t>
-      </w:r>
-      <w:r>
-        <w:rPr>
-          <w:b/>
-        </w:rPr>
-        <w:t>Help → User Guide</w:t>
-      </w:r>
-      <w:r>
-        <w:t>. If the two ever differ, the in-app Help is authoritative for the version you’re actually running (it ships inside the application).</w:t>
-      </w:r>
-    </w:p>
-    <w:p>
-      <w:r>
-        <w:t>This is a live spectrum analyzer and waterfall display for the Ettus USRP B210 and other software-defined radios (SDRPlay RSP1A/RSP1B/RSPduo/RSPdx, RTL-SDR, HackRF, Airspy, BladeRF, LimeSDR, PlutoSDR via SoapySDR), designed for pulsar RFI investigation but useful for general-purpose spectrum monitoring.</w:t>
-      </w:r>
-    </w:p>
-    <w:p>
-      <w:pPr>
-        <w:pStyle w:val="Heading3"/>
-      </w:pPr>
-      <w:bookmarkStart w:id="34" w:name="_Toc230454453"/>
-      <w:r>
-        <w:t>Starting up — device selection</w:t>
-      </w:r>
-      <w:bookmarkEnd w:id="34"/>
-    </w:p>
-    <w:p>
-      <w:r>
-        <w:t>At launch the program enumerates attached SDRs (UHD + SoapySDR) and decides what to use:</w:t>
-      </w:r>
-    </w:p>
-    <w:p>
-      <w:pPr>
-        <w:pStyle w:val="ListBullet"/>
-      </w:pPr>
-      <w:r>
-        <w:rPr>
-          <w:b/>
-        </w:rPr>
-        <w:t>One supported SDR attached</w:t>
-      </w:r>
-      <w:r>
-        <w:t>: opens it silently and remembers the driver and serial in the settings file.</w:t>
-      </w:r>
-    </w:p>
-    <w:p>
-      <w:pPr>
-        <w:pStyle w:val="ListBullet"/>
-      </w:pPr>
-      <w:r>
-        <w:rPr>
-          <w:b/>
-        </w:rPr>
-        <w:t>Two or more radios attached</w:t>
-      </w:r>
-      <w:r>
-        <w:t>: a picker dialog always appears so you can choose which one to use. Your previous choice is pre-selected, so you can just press Enter to use the same radio as last time. Your selection is remembered for next launch.</w:t>
-      </w:r>
-    </w:p>
-    <w:p>
-      <w:pPr>
-        <w:pStyle w:val="ListBullet"/>
-      </w:pPr>
-      <w:r>
-        <w:rPr>
-          <w:b/>
-        </w:rPr>
-        <w:t>No SDR attached, but a bundled SigMF sample is present</w:t>
-      </w:r>
-      <w:r>
-        <w:t xml:space="preserve">: the program falls back to </w:t>
-      </w:r>
-      <w:r>
-        <w:rPr>
-          <w:b/>
-        </w:rPr>
-        <w:t>playback mode</w:t>
-      </w:r>
-      <w:r>
-        <w:t xml:space="preserve"> — see below.</w:t>
-      </w:r>
-    </w:p>
-    <w:p>
-      <w:pPr>
-        <w:pStyle w:val="ListBullet"/>
-      </w:pPr>
-      <w:r>
-        <w:rPr>
-          <w:b/>
-        </w:rPr>
-        <w:t>No SDR and no sample</w:t>
-      </w:r>
-      <w:r>
-        <w:t>: an error dialog explains how to fix it and the program exits.</w:t>
-      </w:r>
-    </w:p>
-    <w:p>
-      <w:r>
         <w:t xml:space="preserve">The window title always shows which radio is feeding the display, and the </w:t>
       </w:r>
       <w:r>
@@ -7735,11 +8142,11 @@
       <w:pPr>
         <w:pStyle w:val="Heading3"/>
       </w:pPr>
-      <w:bookmarkStart w:id="35" w:name="_Toc230454454"/>
+      <w:bookmarkStart w:id="37" w:name="_Toc230455042"/>
       <w:r>
         <w:t>Playback mode</w:t>
       </w:r>
-      <w:bookmarkEnd w:id="35"/>
+      <w:bookmarkEnd w:id="37"/>
     </w:p>
     <w:p>
       <w:r>
@@ -7861,11 +8268,11 @@
       <w:pPr>
         <w:pStyle w:val="Heading3"/>
       </w:pPr>
-      <w:bookmarkStart w:id="36" w:name="_Toc230454455"/>
+      <w:bookmarkStart w:id="38" w:name="_Toc230455043"/>
       <w:r>
         <w:t>Sidebar controls (right side)</w:t>
       </w:r>
-      <w:bookmarkEnd w:id="36"/>
+      <w:bookmarkEnd w:id="38"/>
     </w:p>
     <w:p>
       <w:r>
@@ -7880,7 +8287,6 @@
         <w:rPr>
           <w:b/>
         </w:rPr>
-        <w:lastRenderedPageBreak/>
         <w:t>Pulsar Band</w:t>
       </w:r>
       <w:r>
@@ -7921,7 +8327,10 @@
         <w:t>Fine Tune</w:t>
       </w:r>
       <w:r>
-        <w:t>: ±10 MHz offset, layered on top of Coarse Tune.</w:t>
+        <w:t xml:space="preserve">: ±10 MHz offset, layered on top of </w:t>
+      </w:r>
+      <w:r>
+        <w:t>Coarse Tune.</w:t>
       </w:r>
     </w:p>
     <w:p>
@@ -8051,7 +8460,11 @@
         <w:t>B : TX/RX</w:t>
       </w:r>
       <w:r>
-        <w:t xml:space="preserve"> — receiver A and receiver B, each with its two SMA ports — and switching includes hopping between the two receivers. An RSPduo lists its two tuners. Pick the connector your cable is actually plugged into; the choice is remembered per radio. Single-port radios (most RTL dongles, the RSP1B) don’t show this control.</w:t>
+        <w:t xml:space="preserve"> — receiver A and receiver B, each with its two SMA ports — and switching includes hopping between the two receivers. An RSPduo lists </w:t>
+      </w:r>
+      <w:r>
+        <w:lastRenderedPageBreak/>
+        <w:t>its two tuners. Pick the connector your cable is actually plugged into; the choice is remembered per radio. Single-port radios (most RTL dongles, the RSP1B) don’t show this control.</w:t>
       </w:r>
     </w:p>
     <w:p>
@@ -8142,11 +8555,11 @@
       <w:pPr>
         <w:pStyle w:val="Heading3"/>
       </w:pPr>
-      <w:bookmarkStart w:id="37" w:name="_Toc230454456"/>
+      <w:bookmarkStart w:id="39" w:name="_Toc230455044"/>
       <w:r>
         <w:t>Spectrum (top plot)</w:t>
       </w:r>
-      <w:bookmarkEnd w:id="37"/>
+      <w:bookmarkEnd w:id="39"/>
     </w:p>
     <w:p>
       <w:r>
@@ -8164,7 +8577,10 @@
         <w:t>FFT Size</w:t>
       </w:r>
       <w:r>
-        <w:t>: 256–8192. Larger = finer frequency resolution but slower response and more averaging-window flicker.</w:t>
+        <w:t xml:space="preserve">: </w:t>
+      </w:r>
+      <w:r>
+        <w:t>256–8192. Larger = finer frequency resolution but slower response and more averaging-window flicker.</w:t>
       </w:r>
     </w:p>
     <w:p>
@@ -8178,10 +8594,7 @@
         <w:t>Window</w:t>
       </w:r>
       <w:r>
-        <w:t xml:space="preserve">: </w:t>
-      </w:r>
-      <w:r>
-        <w:t>Blackman-Harris is the default — low sidelobes, good for RFI hunting. Hann/Hamming have narrower main lobes; Rectangular has the sharpest peak but the worst sidelobes.</w:t>
+        <w:t>: Blackman-Harris is the default — low sidelobes, good for RFI hunting. Hann/Hamming have narrower main lobes; Rectangular has the sharpest peak but the worst sidelobes.</w:t>
       </w:r>
     </w:p>
     <w:p>
@@ -8229,184 +8642,181 @@
         <w:rPr>
           <w:b/>
         </w:rPr>
+        <w:t>Y-Axis</w:t>
+      </w:r>
+      <w:r>
+        <w:t xml:space="preserve">: dB min/max, or click </w:t>
+      </w:r>
+      <w:r>
+        <w:rPr>
+          <w:b/>
+        </w:rPr>
+        <w:t>Autoscale</w:t>
+      </w:r>
+      <w:r>
+        <w:t xml:space="preserve"> to fit the current data. </w:t>
+      </w:r>
+      <w:r>
+        <w:rPr>
+          <w:b/>
+        </w:rPr>
+        <w:t>Reset Axes</w:t>
+      </w:r>
+      <w:r>
+        <w:t xml:space="preserve"> snaps the plot back to the default dB range and full-span frequency view — handy after you’ve zoomed/panned with the mouse or nudged the min/max and want to get un-lost. It leaves FFT size, window, traces, and colors untouched.</w:t>
+      </w:r>
+    </w:p>
+    <w:p>
+      <w:pPr>
+        <w:pStyle w:val="ListBullet"/>
+      </w:pPr>
+      <w:r>
+        <w:rPr>
+          <w:b/>
+        </w:rPr>
+        <w:t>Linear scale</w:t>
+      </w:r>
+      <w:r>
+        <w:t>: plots linear magnitude instead of dB (the default log scale). In linear mode the Y axis auto-fits and the dB Min/Max boxes are disabled. Affects the spectrum plot only — the waterfall stays in dB.</w:t>
+      </w:r>
+    </w:p>
+    <w:p>
+      <w:pPr>
+        <w:pStyle w:val="ListBullet"/>
+      </w:pPr>
+      <w:r>
+        <w:rPr>
+          <w:b/>
+        </w:rPr>
+        <w:t>Trace</w:t>
+      </w:r>
+      <w:r>
+        <w:t>: color, line width, alpha, label.</w:t>
+      </w:r>
+    </w:p>
+    <w:p>
+      <w:pPr>
+        <w:pStyle w:val="Heading3"/>
+      </w:pPr>
+      <w:bookmarkStart w:id="40" w:name="_Toc230455045"/>
+      <w:r>
+        <w:t>Waterfall (bottom plot)</w:t>
+      </w:r>
+      <w:bookmarkEnd w:id="40"/>
+    </w:p>
+    <w:p>
+      <w:r>
+        <w:t>Scrolling 2-D image of FFT vs. time. Newest row at the bottom.</w:t>
+      </w:r>
+    </w:p>
+    <w:p>
+      <w:pPr>
+        <w:pStyle w:val="ListBullet"/>
+      </w:pPr>
+      <w:r>
+        <w:rPr>
+          <w:b/>
+        </w:rPr>
+        <w:t>Intensity Min/Max</w:t>
+      </w:r>
+      <w:r>
+        <w:t xml:space="preserve">: dB range that maps to the colormap. </w:t>
+      </w:r>
+      <w:r>
+        <w:rPr>
+          <w:b/>
+        </w:rPr>
+        <w:t>Autoscale intensity</w:t>
+      </w:r>
+      <w:r>
+        <w:t xml:space="preserve"> picks the 5%–99% percentile of the current data.</w:t>
+      </w:r>
+    </w:p>
+    <w:p>
+      <w:pPr>
+        <w:pStyle w:val="ListBullet"/>
+      </w:pPr>
+      <w:r>
+        <w:rPr>
+          <w:b/>
+        </w:rPr>
+        <w:t>Colormap</w:t>
+      </w:r>
+      <w:r>
+        <w:t>: viridis (default), plasma, inferno, magma, turbo, cividis, gray.</w:t>
+      </w:r>
+    </w:p>
+    <w:p>
+      <w:pPr>
+        <w:pStyle w:val="ListBullet"/>
+      </w:pPr>
+      <w:r>
+        <w:rPr>
+          <w:b/>
+        </w:rPr>
+        <w:t>Rows</w:t>
+      </w:r>
+      <w:r>
+        <w:t>: how many history rows to display (default 256).</w:t>
+      </w:r>
+    </w:p>
+    <w:p>
+      <w:pPr>
+        <w:pStyle w:val="Heading3"/>
+      </w:pPr>
+      <w:bookmarkStart w:id="41" w:name="_Toc230455046"/>
+      <w:r>
+        <w:t>Persistence</w:t>
+      </w:r>
+      <w:bookmarkEnd w:id="41"/>
+    </w:p>
+    <w:p>
+      <w:r>
+        <w:t xml:space="preserve">All selections are saved to a plain-text INI file and restored on next launch. The file location is shown in </w:t>
+      </w:r>
+      <w:r>
+        <w:rPr>
+          <w:b/>
+        </w:rPr>
+        <w:t>Help → About</w:t>
+      </w:r>
+      <w:r>
+        <w:t xml:space="preserve">; you can open the folder directly with the </w:t>
+      </w:r>
+      <w:r>
+        <w:rPr>
+          <w:b/>
+        </w:rPr>
+        <w:t>Open Settings Folder</w:t>
+      </w:r>
+      <w:r>
+        <w:t xml:space="preserve"> button.</w:t>
+      </w:r>
+    </w:p>
+    <w:p>
+      <w:r>
+        <w:t xml:space="preserve">To revert everything to factory defaults, use </w:t>
+      </w:r>
+      <w:r>
+        <w:rPr>
+          <w:b/>
+        </w:rPr>
+        <w:t>Restore Defaults</w:t>
+      </w:r>
+      <w:r>
+        <w:t xml:space="preserve"> in the About dialog.</w:t>
+      </w:r>
+    </w:p>
+    <w:p>
+      <w:pPr>
+        <w:pStyle w:val="Heading3"/>
+      </w:pPr>
+      <w:bookmarkStart w:id="42" w:name="_Toc230455047"/>
+      <w:r>
         <w:lastRenderedPageBreak/>
-        <w:t>Y-Axis</w:t>
-      </w:r>
-      <w:r>
-        <w:t xml:space="preserve">: dB min/max, or click </w:t>
-      </w:r>
-      <w:r>
-        <w:rPr>
-          <w:b/>
-        </w:rPr>
-        <w:t>Autoscale</w:t>
-      </w:r>
-      <w:r>
-        <w:t xml:space="preserve"> to fit the current data. </w:t>
-      </w:r>
-      <w:r>
-        <w:rPr>
-          <w:b/>
-        </w:rPr>
-        <w:t>Reset Axes</w:t>
-      </w:r>
-      <w:r>
-        <w:t xml:space="preserve"> snaps the plot back to the default dB range and full-span frequency view — handy after you’ve zoomed/panned with the mouse or nudged the min/max and want to get un-lost. It leaves FFT size, window, traces, and colors untouched.</w:t>
-      </w:r>
-    </w:p>
-    <w:p>
-      <w:pPr>
-        <w:pStyle w:val="ListBullet"/>
-      </w:pPr>
-      <w:r>
-        <w:rPr>
-          <w:b/>
-        </w:rPr>
-        <w:t>Linear scale</w:t>
-      </w:r>
-      <w:r>
-        <w:t>: plots linear magnitude instead of dB (the default log scale). In linear mode the Y axis auto-fits and the dB Min/Max boxes are disabled. Affects the spectrum plot only — the waterfall stays in dB.</w:t>
-      </w:r>
-    </w:p>
-    <w:p>
-      <w:pPr>
-        <w:pStyle w:val="ListBullet"/>
-      </w:pPr>
-      <w:r>
-        <w:rPr>
-          <w:b/>
-        </w:rPr>
-        <w:t>Trace</w:t>
-      </w:r>
-      <w:r>
-        <w:t>: color, line width, alpha, label.</w:t>
-      </w:r>
-    </w:p>
-    <w:p>
-      <w:pPr>
-        <w:pStyle w:val="Heading3"/>
-      </w:pPr>
-      <w:bookmarkStart w:id="38" w:name="_Toc230454457"/>
-      <w:r>
-        <w:t>Waterfall (bottom plot)</w:t>
-      </w:r>
-      <w:bookmarkEnd w:id="38"/>
-    </w:p>
-    <w:p>
-      <w:r>
-        <w:t>Scrolling 2-D image of FFT vs. time. Newest row at the bottom.</w:t>
-      </w:r>
-    </w:p>
-    <w:p>
-      <w:pPr>
-        <w:pStyle w:val="ListBullet"/>
-      </w:pPr>
-      <w:r>
-        <w:rPr>
-          <w:b/>
-        </w:rPr>
-        <w:t>Intensity Min/Max</w:t>
-      </w:r>
-      <w:r>
-        <w:t xml:space="preserve">: dB range that maps to the colormap. </w:t>
-      </w:r>
-      <w:r>
-        <w:rPr>
-          <w:b/>
-        </w:rPr>
-        <w:t>Autoscale intensity</w:t>
-      </w:r>
-      <w:r>
-        <w:t xml:space="preserve"> picks the 5%–99% percentile of the current data.</w:t>
-      </w:r>
-    </w:p>
-    <w:p>
-      <w:pPr>
-        <w:pStyle w:val="ListBullet"/>
-      </w:pPr>
-      <w:r>
-        <w:rPr>
-          <w:b/>
-        </w:rPr>
-        <w:t>Colormap</w:t>
-      </w:r>
-      <w:r>
-        <w:t>: viridis (default), plasma, inferno, magma, turbo, cividis, gray.</w:t>
-      </w:r>
-    </w:p>
-    <w:p>
-      <w:pPr>
-        <w:pStyle w:val="ListBullet"/>
-      </w:pPr>
-      <w:r>
-        <w:rPr>
-          <w:b/>
-        </w:rPr>
-        <w:t>Rows</w:t>
-      </w:r>
-      <w:r>
-        <w:t xml:space="preserve">: how many history rows to display </w:t>
-      </w:r>
-      <w:r>
-        <w:t>(default 256).</w:t>
-      </w:r>
-    </w:p>
-    <w:p>
-      <w:pPr>
-        <w:pStyle w:val="Heading3"/>
-      </w:pPr>
-      <w:bookmarkStart w:id="39" w:name="_Toc230454458"/>
-      <w:r>
-        <w:t>Persistence</w:t>
-      </w:r>
-      <w:bookmarkEnd w:id="39"/>
-    </w:p>
-    <w:p>
-      <w:r>
-        <w:t xml:space="preserve">All selections are saved to a plain-text INI file and restored on next launch. The file location is shown in </w:t>
-      </w:r>
-      <w:r>
-        <w:rPr>
-          <w:b/>
-        </w:rPr>
-        <w:t>Help → About</w:t>
-      </w:r>
-      <w:r>
-        <w:t xml:space="preserve">; you can open the folder directly with the </w:t>
-      </w:r>
-      <w:r>
-        <w:rPr>
-          <w:b/>
-        </w:rPr>
-        <w:t>Open Settings Folder</w:t>
-      </w:r>
-      <w:r>
-        <w:t xml:space="preserve"> button.</w:t>
-      </w:r>
-    </w:p>
-    <w:p>
-      <w:r>
-        <w:t xml:space="preserve">To revert everything to factory defaults, use </w:t>
-      </w:r>
-      <w:r>
-        <w:rPr>
-          <w:b/>
-        </w:rPr>
-        <w:t>Restore Defaults</w:t>
-      </w:r>
-      <w:r>
-        <w:t xml:space="preserve"> in the About dialog.</w:t>
-      </w:r>
-    </w:p>
-    <w:p>
-      <w:pPr>
-        <w:pStyle w:val="Heading3"/>
-      </w:pPr>
-      <w:bookmarkStart w:id="40" w:name="_Toc230454459"/>
-      <w:r>
         <w:t>Update checks</w:t>
       </w:r>
-      <w:bookmarkEnd w:id="40"/>
+      <w:bookmarkEnd w:id="42"/>
     </w:p>
     <w:p>
       <w:r>
@@ -8460,11 +8870,11 @@
       <w:pPr>
         <w:pStyle w:val="Heading3"/>
       </w:pPr>
-      <w:bookmarkStart w:id="41" w:name="_Toc230454460"/>
+      <w:bookmarkStart w:id="43" w:name="_Toc230455048"/>
       <w:r>
         <w:t>Tips for pulsar work</w:t>
       </w:r>
-      <w:bookmarkEnd w:id="41"/>
+      <w:bookmarkEnd w:id="43"/>
     </w:p>
     <w:p>
       <w:pPr>
@@ -8839,31 +9249,31 @@
       </w:rPr>
     </w:lvl>
   </w:abstractNum>
-  <w:num w:numId="1" w16cid:durableId="1606617535">
+  <w:num w:numId="1" w16cid:durableId="924992125">
     <w:abstractNumId w:val="8"/>
   </w:num>
-  <w:num w:numId="2" w16cid:durableId="1455173630">
+  <w:num w:numId="2" w16cid:durableId="1012686574">
     <w:abstractNumId w:val="6"/>
   </w:num>
-  <w:num w:numId="3" w16cid:durableId="480998165">
+  <w:num w:numId="3" w16cid:durableId="600920557">
     <w:abstractNumId w:val="5"/>
   </w:num>
-  <w:num w:numId="4" w16cid:durableId="1057389728">
+  <w:num w:numId="4" w16cid:durableId="407390094">
     <w:abstractNumId w:val="4"/>
   </w:num>
-  <w:num w:numId="5" w16cid:durableId="818808137">
+  <w:num w:numId="5" w16cid:durableId="1530559664">
     <w:abstractNumId w:val="7"/>
   </w:num>
-  <w:num w:numId="6" w16cid:durableId="1604413248">
+  <w:num w:numId="6" w16cid:durableId="1074354974">
     <w:abstractNumId w:val="3"/>
   </w:num>
-  <w:num w:numId="7" w16cid:durableId="1726028531">
+  <w:num w:numId="7" w16cid:durableId="601227978">
     <w:abstractNumId w:val="2"/>
   </w:num>
-  <w:num w:numId="8" w16cid:durableId="430855003">
+  <w:num w:numId="8" w16cid:durableId="875778055">
     <w:abstractNumId w:val="1"/>
   </w:num>
-  <w:num w:numId="9" w16cid:durableId="1446122076">
+  <w:num w:numId="9" w16cid:durableId="364405975">
     <w:abstractNumId w:val="0"/>
   </w:num>
 </w:numbering>
@@ -20258,7 +20668,7 @@
     <w:autoRedefine/>
     <w:uiPriority w:val="39"/>
     <w:unhideWhenUsed/>
-    <w:rsid w:val="008B6FAC"/>
+    <w:rsid w:val="00497544"/>
     <w:pPr>
       <w:spacing w:after="100"/>
     </w:pPr>
@@ -20270,7 +20680,7 @@
     <w:autoRedefine/>
     <w:uiPriority w:val="39"/>
     <w:unhideWhenUsed/>
-    <w:rsid w:val="008B6FAC"/>
+    <w:rsid w:val="00497544"/>
     <w:pPr>
       <w:spacing w:after="100"/>
       <w:ind w:left="220"/>
@@ -20283,7 +20693,7 @@
     <w:autoRedefine/>
     <w:uiPriority w:val="39"/>
     <w:unhideWhenUsed/>
-    <w:rsid w:val="008B6FAC"/>
+    <w:rsid w:val="00497544"/>
     <w:pPr>
       <w:spacing w:after="100"/>
       <w:ind w:left="440"/>
@@ -20294,7 +20704,7 @@
     <w:basedOn w:val="DefaultParagraphFont"/>
     <w:uiPriority w:val="99"/>
     <w:unhideWhenUsed/>
-    <w:rsid w:val="008B6FAC"/>
+    <w:rsid w:val="00497544"/>
     <w:rPr>
       <w:color w:val="0000FF" w:themeColor="hyperlink"/>
       <w:u w:val="single"/>

</xml_diff>

<commit_message>
Store window geometry in the INI instead of QSettings (macOS persistence)
Even with a clean QSettings org name, window size/position still didn't
persist on macOS (Qt's CFPreferences-backed store via cfprefsd is
unreliable for a terminal-launched, non-bundled app). Controls always
persisted because they use the plain-file INI. So move geometry there too:
a base64 geometry_b64 value in a new [window] section, saved in closeEvent
and the signal handler, restored at startup. Drops QSettings entirely.
Verified the base64 saveGeometry/restoreGeometry round-trip. Updated the
install guide's settings reference (§5 + Appendix A).
</commit_message>
<xml_diff>
--- a/DSES_RFI_Spectrum_Analyzer_Installation.docx
+++ b/DSES_RFI_Spectrum_Analyzer_Installation.docx
@@ -41,7 +41,7 @@
           <w:noProof/>
         </w:rPr>
         <w:drawing>
-          <wp:inline distT="0" distB="0" distL="0" distR="0" wp14:anchorId="40F9A9E7" wp14:editId="44F7CAC6">
+          <wp:inline distT="0" distB="0" distL="0" distR="0" wp14:anchorId="02F7E94C" wp14:editId="7BBDAAA0">
             <wp:extent cx="1371600" cy="1371600"/>
             <wp:effectExtent l="0" t="0" r="0" b="0"/>
             <wp:docPr id="1" name="Picture 1"/>
@@ -138,7 +138,7 @@
         <w:pStyle w:val="Heading1"/>
         <w:shd w:val="clear" w:color="auto" w:fill="156082"/>
       </w:pPr>
-      <w:bookmarkStart w:id="0" w:name="_Toc230455005"/>
+      <w:bookmarkStart w:id="0" w:name="_Toc230524758"/>
       <w:r>
         <w:lastRenderedPageBreak/>
         <w:t>Contents</w:t>
@@ -169,7 +169,7 @@
       <w:r>
         <w:fldChar w:fldCharType="separate"/>
       </w:r>
-      <w:hyperlink w:anchor="_Toc230455005" w:history="1">
+      <w:hyperlink w:anchor="_Toc230524758" w:history="1">
         <w:r>
           <w:rPr>
             <w:rStyle w:val="Hyperlink"/>
@@ -196,7 +196,7 @@
             <w:noProof/>
             <w:webHidden/>
           </w:rPr>
-          <w:instrText xml:space="preserve"> PAGEREF _Toc230455005 \h </w:instrText>
+          <w:instrText xml:space="preserve"> PAGEREF _Toc230524758 \h </w:instrText>
         </w:r>
         <w:r>
           <w:rPr>
@@ -242,7 +242,7 @@
           <w14:ligatures w14:val="standardContextual"/>
         </w:rPr>
       </w:pPr>
-      <w:hyperlink w:anchor="_Toc230455006" w:history="1">
+      <w:hyperlink w:anchor="_Toc230524759" w:history="1">
         <w:r>
           <w:rPr>
             <w:rStyle w:val="Hyperlink"/>
@@ -269,7 +269,7 @@
             <w:noProof/>
             <w:webHidden/>
           </w:rPr>
-          <w:instrText xml:space="preserve"> PAGEREF _Toc230455006 \h </w:instrText>
+          <w:instrText xml:space="preserve"> PAGEREF _Toc230524759 \h </w:instrText>
         </w:r>
         <w:r>
           <w:rPr>
@@ -315,7 +315,7 @@
           <w14:ligatures w14:val="standardContextual"/>
         </w:rPr>
       </w:pPr>
-      <w:hyperlink w:anchor="_Toc230455007" w:history="1">
+      <w:hyperlink w:anchor="_Toc230524760" w:history="1">
         <w:r>
           <w:rPr>
             <w:rStyle w:val="Hyperlink"/>
@@ -342,7 +342,7 @@
             <w:noProof/>
             <w:webHidden/>
           </w:rPr>
-          <w:instrText xml:space="preserve"> PAGEREF _Toc230455007 \h </w:instrText>
+          <w:instrText xml:space="preserve"> PAGEREF _Toc230524760 \h </w:instrText>
         </w:r>
         <w:r>
           <w:rPr>
@@ -388,7 +388,7 @@
           <w14:ligatures w14:val="standardContextual"/>
         </w:rPr>
       </w:pPr>
-      <w:hyperlink w:anchor="_Toc230455008" w:history="1">
+      <w:hyperlink w:anchor="_Toc230524761" w:history="1">
         <w:r>
           <w:rPr>
             <w:rStyle w:val="Hyperlink"/>
@@ -415,7 +415,7 @@
             <w:noProof/>
             <w:webHidden/>
           </w:rPr>
-          <w:instrText xml:space="preserve"> PAGEREF _Toc230455008 \h </w:instrText>
+          <w:instrText xml:space="preserve"> PAGEREF _Toc230524761 \h </w:instrText>
         </w:r>
         <w:r>
           <w:rPr>
@@ -461,7 +461,7 @@
           <w14:ligatures w14:val="standardContextual"/>
         </w:rPr>
       </w:pPr>
-      <w:hyperlink w:anchor="_Toc230455009" w:history="1">
+      <w:hyperlink w:anchor="_Toc230524762" w:history="1">
         <w:r>
           <w:rPr>
             <w:rStyle w:val="Hyperlink"/>
@@ -488,7 +488,7 @@
             <w:noProof/>
             <w:webHidden/>
           </w:rPr>
-          <w:instrText xml:space="preserve"> PAGEREF _Toc230455009 \h </w:instrText>
+          <w:instrText xml:space="preserve"> PAGEREF _Toc230524762 \h </w:instrText>
         </w:r>
         <w:r>
           <w:rPr>
@@ -534,7 +534,7 @@
           <w14:ligatures w14:val="standardContextual"/>
         </w:rPr>
       </w:pPr>
-      <w:hyperlink w:anchor="_Toc230455010" w:history="1">
+      <w:hyperlink w:anchor="_Toc230524763" w:history="1">
         <w:r>
           <w:rPr>
             <w:rStyle w:val="Hyperlink"/>
@@ -561,7 +561,7 @@
             <w:noProof/>
             <w:webHidden/>
           </w:rPr>
-          <w:instrText xml:space="preserve"> PAGEREF _Toc230455010 \h </w:instrText>
+          <w:instrText xml:space="preserve"> PAGEREF _Toc230524763 \h </w:instrText>
         </w:r>
         <w:r>
           <w:rPr>
@@ -607,7 +607,7 @@
           <w14:ligatures w14:val="standardContextual"/>
         </w:rPr>
       </w:pPr>
-      <w:hyperlink w:anchor="_Toc230455011" w:history="1">
+      <w:hyperlink w:anchor="_Toc230524764" w:history="1">
         <w:r>
           <w:rPr>
             <w:rStyle w:val="Hyperlink"/>
@@ -634,7 +634,7 @@
             <w:noProof/>
             <w:webHidden/>
           </w:rPr>
-          <w:instrText xml:space="preserve"> PAGEREF _Toc230455011 \h </w:instrText>
+          <w:instrText xml:space="preserve"> PAGEREF _Toc230524764 \h </w:instrText>
         </w:r>
         <w:r>
           <w:rPr>
@@ -680,7 +680,7 @@
           <w14:ligatures w14:val="standardContextual"/>
         </w:rPr>
       </w:pPr>
-      <w:hyperlink w:anchor="_Toc230455012" w:history="1">
+      <w:hyperlink w:anchor="_Toc230524765" w:history="1">
         <w:r>
           <w:rPr>
             <w:rStyle w:val="Hyperlink"/>
@@ -707,7 +707,7 @@
             <w:noProof/>
             <w:webHidden/>
           </w:rPr>
-          <w:instrText xml:space="preserve"> PAGEREF _Toc230455012 \h </w:instrText>
+          <w:instrText xml:space="preserve"> PAGEREF _Toc230524765 \h </w:instrText>
         </w:r>
         <w:r>
           <w:rPr>
@@ -753,7 +753,7 @@
           <w14:ligatures w14:val="standardContextual"/>
         </w:rPr>
       </w:pPr>
-      <w:hyperlink w:anchor="_Toc230455013" w:history="1">
+      <w:hyperlink w:anchor="_Toc230524766" w:history="1">
         <w:r>
           <w:rPr>
             <w:rStyle w:val="Hyperlink"/>
@@ -780,7 +780,7 @@
             <w:noProof/>
             <w:webHidden/>
           </w:rPr>
-          <w:instrText xml:space="preserve"> PAGEREF _Toc230455013 \h </w:instrText>
+          <w:instrText xml:space="preserve"> PAGEREF _Toc230524766 \h </w:instrText>
         </w:r>
         <w:r>
           <w:rPr>
@@ -826,7 +826,7 @@
           <w14:ligatures w14:val="standardContextual"/>
         </w:rPr>
       </w:pPr>
-      <w:hyperlink w:anchor="_Toc230455014" w:history="1">
+      <w:hyperlink w:anchor="_Toc230524767" w:history="1">
         <w:r>
           <w:rPr>
             <w:rStyle w:val="Hyperlink"/>
@@ -853,7 +853,7 @@
             <w:noProof/>
             <w:webHidden/>
           </w:rPr>
-          <w:instrText xml:space="preserve"> PAGEREF _Toc230455014 \h </w:instrText>
+          <w:instrText xml:space="preserve"> PAGEREF _Toc230524767 \h </w:instrText>
         </w:r>
         <w:r>
           <w:rPr>
@@ -899,7 +899,7 @@
           <w14:ligatures w14:val="standardContextual"/>
         </w:rPr>
       </w:pPr>
-      <w:hyperlink w:anchor="_Toc230455015" w:history="1">
+      <w:hyperlink w:anchor="_Toc230524768" w:history="1">
         <w:r>
           <w:rPr>
             <w:rStyle w:val="Hyperlink"/>
@@ -926,7 +926,7 @@
             <w:noProof/>
             <w:webHidden/>
           </w:rPr>
-          <w:instrText xml:space="preserve"> PAGEREF _Toc230455015 \h </w:instrText>
+          <w:instrText xml:space="preserve"> PAGEREF _Toc230524768 \h </w:instrText>
         </w:r>
         <w:r>
           <w:rPr>
@@ -972,7 +972,7 @@
           <w14:ligatures w14:val="standardContextual"/>
         </w:rPr>
       </w:pPr>
-      <w:hyperlink w:anchor="_Toc230455016" w:history="1">
+      <w:hyperlink w:anchor="_Toc230524769" w:history="1">
         <w:r>
           <w:rPr>
             <w:rStyle w:val="Hyperlink"/>
@@ -999,7 +999,7 @@
             <w:noProof/>
             <w:webHidden/>
           </w:rPr>
-          <w:instrText xml:space="preserve"> PAGEREF _Toc230455016 \h </w:instrText>
+          <w:instrText xml:space="preserve"> PAGEREF _Toc230524769 \h </w:instrText>
         </w:r>
         <w:r>
           <w:rPr>
@@ -1045,7 +1045,7 @@
           <w14:ligatures w14:val="standardContextual"/>
         </w:rPr>
       </w:pPr>
-      <w:hyperlink w:anchor="_Toc230455017" w:history="1">
+      <w:hyperlink w:anchor="_Toc230524770" w:history="1">
         <w:r>
           <w:rPr>
             <w:rStyle w:val="Hyperlink"/>
@@ -1072,7 +1072,7 @@
             <w:noProof/>
             <w:webHidden/>
           </w:rPr>
-          <w:instrText xml:space="preserve"> PAGEREF _Toc230455017 \h </w:instrText>
+          <w:instrText xml:space="preserve"> PAGEREF _Toc230524770 \h </w:instrText>
         </w:r>
         <w:r>
           <w:rPr>
@@ -1118,7 +1118,7 @@
           <w14:ligatures w14:val="standardContextual"/>
         </w:rPr>
       </w:pPr>
-      <w:hyperlink w:anchor="_Toc230455018" w:history="1">
+      <w:hyperlink w:anchor="_Toc230524771" w:history="1">
         <w:r>
           <w:rPr>
             <w:rStyle w:val="Hyperlink"/>
@@ -1145,7 +1145,7 @@
             <w:noProof/>
             <w:webHidden/>
           </w:rPr>
-          <w:instrText xml:space="preserve"> PAGEREF _Toc230455018 \h </w:instrText>
+          <w:instrText xml:space="preserve"> PAGEREF _Toc230524771 \h </w:instrText>
         </w:r>
         <w:r>
           <w:rPr>
@@ -1191,7 +1191,7 @@
           <w14:ligatures w14:val="standardContextual"/>
         </w:rPr>
       </w:pPr>
-      <w:hyperlink w:anchor="_Toc230455019" w:history="1">
+      <w:hyperlink w:anchor="_Toc230524772" w:history="1">
         <w:r>
           <w:rPr>
             <w:rStyle w:val="Hyperlink"/>
@@ -1218,7 +1218,7 @@
             <w:noProof/>
             <w:webHidden/>
           </w:rPr>
-          <w:instrText xml:space="preserve"> PAGEREF _Toc230455019 \h </w:instrText>
+          <w:instrText xml:space="preserve"> PAGEREF _Toc230524772 \h </w:instrText>
         </w:r>
         <w:r>
           <w:rPr>
@@ -1264,7 +1264,7 @@
           <w14:ligatures w14:val="standardContextual"/>
         </w:rPr>
       </w:pPr>
-      <w:hyperlink w:anchor="_Toc230455020" w:history="1">
+      <w:hyperlink w:anchor="_Toc230524773" w:history="1">
         <w:r>
           <w:rPr>
             <w:rStyle w:val="Hyperlink"/>
@@ -1291,7 +1291,7 @@
             <w:noProof/>
             <w:webHidden/>
           </w:rPr>
-          <w:instrText xml:space="preserve"> PAGEREF _Toc230455020 \h </w:instrText>
+          <w:instrText xml:space="preserve"> PAGEREF _Toc230524773 \h </w:instrText>
         </w:r>
         <w:r>
           <w:rPr>
@@ -1337,7 +1337,7 @@
           <w14:ligatures w14:val="standardContextual"/>
         </w:rPr>
       </w:pPr>
-      <w:hyperlink w:anchor="_Toc230455021" w:history="1">
+      <w:hyperlink w:anchor="_Toc230524774" w:history="1">
         <w:r>
           <w:rPr>
             <w:rStyle w:val="Hyperlink"/>
@@ -1364,7 +1364,7 @@
             <w:noProof/>
             <w:webHidden/>
           </w:rPr>
-          <w:instrText xml:space="preserve"> PAGEREF _Toc230455021 \h </w:instrText>
+          <w:instrText xml:space="preserve"> PAGEREF _Toc230524774 \h </w:instrText>
         </w:r>
         <w:r>
           <w:rPr>
@@ -1410,7 +1410,7 @@
           <w14:ligatures w14:val="standardContextual"/>
         </w:rPr>
       </w:pPr>
-      <w:hyperlink w:anchor="_Toc230455022" w:history="1">
+      <w:hyperlink w:anchor="_Toc230524775" w:history="1">
         <w:r>
           <w:rPr>
             <w:rStyle w:val="Hyperlink"/>
@@ -1437,7 +1437,7 @@
             <w:noProof/>
             <w:webHidden/>
           </w:rPr>
-          <w:instrText xml:space="preserve"> PAGEREF _Toc230455022 \h </w:instrText>
+          <w:instrText xml:space="preserve"> PAGEREF _Toc230524775 \h </w:instrText>
         </w:r>
         <w:r>
           <w:rPr>
@@ -1483,7 +1483,7 @@
           <w14:ligatures w14:val="standardContextual"/>
         </w:rPr>
       </w:pPr>
-      <w:hyperlink w:anchor="_Toc230455023" w:history="1">
+      <w:hyperlink w:anchor="_Toc230524776" w:history="1">
         <w:r>
           <w:rPr>
             <w:rStyle w:val="Hyperlink"/>
@@ -1510,7 +1510,7 @@
             <w:noProof/>
             <w:webHidden/>
           </w:rPr>
-          <w:instrText xml:space="preserve"> PAGEREF _Toc230455023 \h </w:instrText>
+          <w:instrText xml:space="preserve"> PAGEREF _Toc230524776 \h </w:instrText>
         </w:r>
         <w:r>
           <w:rPr>
@@ -1556,7 +1556,7 @@
           <w14:ligatures w14:val="standardContextual"/>
         </w:rPr>
       </w:pPr>
-      <w:hyperlink w:anchor="_Toc230455024" w:history="1">
+      <w:hyperlink w:anchor="_Toc230524777" w:history="1">
         <w:r>
           <w:rPr>
             <w:rStyle w:val="Hyperlink"/>
@@ -1583,7 +1583,7 @@
             <w:noProof/>
             <w:webHidden/>
           </w:rPr>
-          <w:instrText xml:space="preserve"> PAGEREF _Toc230455024 \h </w:instrText>
+          <w:instrText xml:space="preserve"> PAGEREF _Toc230524777 \h </w:instrText>
         </w:r>
         <w:r>
           <w:rPr>
@@ -1629,7 +1629,7 @@
           <w14:ligatures w14:val="standardContextual"/>
         </w:rPr>
       </w:pPr>
-      <w:hyperlink w:anchor="_Toc230455025" w:history="1">
+      <w:hyperlink w:anchor="_Toc230524778" w:history="1">
         <w:r>
           <w:rPr>
             <w:rStyle w:val="Hyperlink"/>
@@ -1656,7 +1656,7 @@
             <w:noProof/>
             <w:webHidden/>
           </w:rPr>
-          <w:instrText xml:space="preserve"> PAGEREF _Toc230455025 \h </w:instrText>
+          <w:instrText xml:space="preserve"> PAGEREF _Toc230524778 \h </w:instrText>
         </w:r>
         <w:r>
           <w:rPr>
@@ -1702,7 +1702,7 @@
           <w14:ligatures w14:val="standardContextual"/>
         </w:rPr>
       </w:pPr>
-      <w:hyperlink w:anchor="_Toc230455026" w:history="1">
+      <w:hyperlink w:anchor="_Toc230524779" w:history="1">
         <w:r>
           <w:rPr>
             <w:rStyle w:val="Hyperlink"/>
@@ -1729,7 +1729,7 @@
             <w:noProof/>
             <w:webHidden/>
           </w:rPr>
-          <w:instrText xml:space="preserve"> PAGEREF _Toc230455026 \h </w:instrText>
+          <w:instrText xml:space="preserve"> PAGEREF _Toc230524779 \h </w:instrText>
         </w:r>
         <w:r>
           <w:rPr>
@@ -1775,7 +1775,7 @@
           <w14:ligatures w14:val="standardContextual"/>
         </w:rPr>
       </w:pPr>
-      <w:hyperlink w:anchor="_Toc230455027" w:history="1">
+      <w:hyperlink w:anchor="_Toc230524780" w:history="1">
         <w:r>
           <w:rPr>
             <w:rStyle w:val="Hyperlink"/>
@@ -1802,7 +1802,7 @@
             <w:noProof/>
             <w:webHidden/>
           </w:rPr>
-          <w:instrText xml:space="preserve"> PAGEREF _Toc230455027 \h </w:instrText>
+          <w:instrText xml:space="preserve"> PAGEREF _Toc230524780 \h </w:instrText>
         </w:r>
         <w:r>
           <w:rPr>
@@ -1848,7 +1848,7 @@
           <w14:ligatures w14:val="standardContextual"/>
         </w:rPr>
       </w:pPr>
-      <w:hyperlink w:anchor="_Toc230455028" w:history="1">
+      <w:hyperlink w:anchor="_Toc230524781" w:history="1">
         <w:r>
           <w:rPr>
             <w:rStyle w:val="Hyperlink"/>
@@ -1875,7 +1875,7 @@
             <w:noProof/>
             <w:webHidden/>
           </w:rPr>
-          <w:instrText xml:space="preserve"> PAGEREF _Toc230455028 \h </w:instrText>
+          <w:instrText xml:space="preserve"> PAGEREF _Toc230524781 \h </w:instrText>
         </w:r>
         <w:r>
           <w:rPr>
@@ -1921,7 +1921,7 @@
           <w14:ligatures w14:val="standardContextual"/>
         </w:rPr>
       </w:pPr>
-      <w:hyperlink w:anchor="_Toc230455029" w:history="1">
+      <w:hyperlink w:anchor="_Toc230524782" w:history="1">
         <w:r>
           <w:rPr>
             <w:rStyle w:val="Hyperlink"/>
@@ -1948,7 +1948,7 @@
             <w:noProof/>
             <w:webHidden/>
           </w:rPr>
-          <w:instrText xml:space="preserve"> PAGEREF _Toc230455029 \h </w:instrText>
+          <w:instrText xml:space="preserve"> PAGEREF _Toc230524782 \h </w:instrText>
         </w:r>
         <w:r>
           <w:rPr>
@@ -1994,7 +1994,7 @@
           <w14:ligatures w14:val="standardContextual"/>
         </w:rPr>
       </w:pPr>
-      <w:hyperlink w:anchor="_Toc230455030" w:history="1">
+      <w:hyperlink w:anchor="_Toc230524783" w:history="1">
         <w:r>
           <w:rPr>
             <w:rStyle w:val="Hyperlink"/>
@@ -2021,7 +2021,7 @@
             <w:noProof/>
             <w:webHidden/>
           </w:rPr>
-          <w:instrText xml:space="preserve"> PAGEREF _Toc230455030 \h </w:instrText>
+          <w:instrText xml:space="preserve"> PAGEREF _Toc230524783 \h </w:instrText>
         </w:r>
         <w:r>
           <w:rPr>
@@ -2067,7 +2067,7 @@
           <w14:ligatures w14:val="standardContextual"/>
         </w:rPr>
       </w:pPr>
-      <w:hyperlink w:anchor="_Toc230455031" w:history="1">
+      <w:hyperlink w:anchor="_Toc230524784" w:history="1">
         <w:r>
           <w:rPr>
             <w:rStyle w:val="Hyperlink"/>
@@ -2094,7 +2094,7 @@
             <w:noProof/>
             <w:webHidden/>
           </w:rPr>
-          <w:instrText xml:space="preserve"> PAGEREF _Toc230455031 \h </w:instrText>
+          <w:instrText xml:space="preserve"> PAGEREF _Toc230524784 \h </w:instrText>
         </w:r>
         <w:r>
           <w:rPr>
@@ -2140,7 +2140,7 @@
           <w14:ligatures w14:val="standardContextual"/>
         </w:rPr>
       </w:pPr>
-      <w:hyperlink w:anchor="_Toc230455032" w:history="1">
+      <w:hyperlink w:anchor="_Toc230524785" w:history="1">
         <w:r>
           <w:rPr>
             <w:rStyle w:val="Hyperlink"/>
@@ -2167,7 +2167,7 @@
             <w:noProof/>
             <w:webHidden/>
           </w:rPr>
-          <w:instrText xml:space="preserve"> PAGEREF _Toc230455032 \h </w:instrText>
+          <w:instrText xml:space="preserve"> PAGEREF _Toc230524785 \h </w:instrText>
         </w:r>
         <w:r>
           <w:rPr>
@@ -2213,7 +2213,7 @@
           <w14:ligatures w14:val="standardContextual"/>
         </w:rPr>
       </w:pPr>
-      <w:hyperlink w:anchor="_Toc230455033" w:history="1">
+      <w:hyperlink w:anchor="_Toc230524786" w:history="1">
         <w:r>
           <w:rPr>
             <w:rStyle w:val="Hyperlink"/>
@@ -2240,7 +2240,7 @@
             <w:noProof/>
             <w:webHidden/>
           </w:rPr>
-          <w:instrText xml:space="preserve"> PAGEREF _Toc230455033 \h </w:instrText>
+          <w:instrText xml:space="preserve"> PAGEREF _Toc230524786 \h </w:instrText>
         </w:r>
         <w:r>
           <w:rPr>
@@ -2286,7 +2286,7 @@
           <w14:ligatures w14:val="standardContextual"/>
         </w:rPr>
       </w:pPr>
-      <w:hyperlink w:anchor="_Toc230455034" w:history="1">
+      <w:hyperlink w:anchor="_Toc230524787" w:history="1">
         <w:r>
           <w:rPr>
             <w:rStyle w:val="Hyperlink"/>
@@ -2313,7 +2313,7 @@
             <w:noProof/>
             <w:webHidden/>
           </w:rPr>
-          <w:instrText xml:space="preserve"> PAGEREF _Toc230455034 \h </w:instrText>
+          <w:instrText xml:space="preserve"> PAGEREF _Toc230524787 \h </w:instrText>
         </w:r>
         <w:r>
           <w:rPr>
@@ -2359,7 +2359,7 @@
           <w14:ligatures w14:val="standardContextual"/>
         </w:rPr>
       </w:pPr>
-      <w:hyperlink w:anchor="_Toc230455035" w:history="1">
+      <w:hyperlink w:anchor="_Toc230524788" w:history="1">
         <w:r>
           <w:rPr>
             <w:rStyle w:val="Hyperlink"/>
@@ -2386,7 +2386,7 @@
             <w:noProof/>
             <w:webHidden/>
           </w:rPr>
-          <w:instrText xml:space="preserve"> PAGEREF _Toc230455035 \h </w:instrText>
+          <w:instrText xml:space="preserve"> PAGEREF _Toc230524788 \h </w:instrText>
         </w:r>
         <w:r>
           <w:rPr>
@@ -2432,7 +2432,7 @@
           <w14:ligatures w14:val="standardContextual"/>
         </w:rPr>
       </w:pPr>
-      <w:hyperlink w:anchor="_Toc230455036" w:history="1">
+      <w:hyperlink w:anchor="_Toc230524789" w:history="1">
         <w:r>
           <w:rPr>
             <w:rStyle w:val="Hyperlink"/>
@@ -2459,7 +2459,7 @@
             <w:noProof/>
             <w:webHidden/>
           </w:rPr>
-          <w:instrText xml:space="preserve"> PAGEREF _Toc230455036 \h </w:instrText>
+          <w:instrText xml:space="preserve"> PAGEREF _Toc230524789 \h </w:instrText>
         </w:r>
         <w:r>
           <w:rPr>
@@ -2505,7 +2505,7 @@
           <w14:ligatures w14:val="standardContextual"/>
         </w:rPr>
       </w:pPr>
-      <w:hyperlink w:anchor="_Toc230455037" w:history="1">
+      <w:hyperlink w:anchor="_Toc230524790" w:history="1">
         <w:r>
           <w:rPr>
             <w:rStyle w:val="Hyperlink"/>
@@ -2532,7 +2532,7 @@
             <w:noProof/>
             <w:webHidden/>
           </w:rPr>
-          <w:instrText xml:space="preserve"> PAGEREF _Toc230455037 \h </w:instrText>
+          <w:instrText xml:space="preserve"> PAGEREF _Toc230524790 \h </w:instrText>
         </w:r>
         <w:r>
           <w:rPr>
@@ -2578,7 +2578,7 @@
           <w14:ligatures w14:val="standardContextual"/>
         </w:rPr>
       </w:pPr>
-      <w:hyperlink w:anchor="_Toc230455038" w:history="1">
+      <w:hyperlink w:anchor="_Toc230524791" w:history="1">
         <w:r>
           <w:rPr>
             <w:rStyle w:val="Hyperlink"/>
@@ -2605,7 +2605,7 @@
             <w:noProof/>
             <w:webHidden/>
           </w:rPr>
-          <w:instrText xml:space="preserve"> PAGEREF _Toc230455038 \h </w:instrText>
+          <w:instrText xml:space="preserve"> PAGEREF _Toc230524791 \h </w:instrText>
         </w:r>
         <w:r>
           <w:rPr>
@@ -2651,7 +2651,7 @@
           <w14:ligatures w14:val="standardContextual"/>
         </w:rPr>
       </w:pPr>
-      <w:hyperlink w:anchor="_Toc230455039" w:history="1">
+      <w:hyperlink w:anchor="_Toc230524792" w:history="1">
         <w:r>
           <w:rPr>
             <w:rStyle w:val="Hyperlink"/>
@@ -2678,7 +2678,7 @@
             <w:noProof/>
             <w:webHidden/>
           </w:rPr>
-          <w:instrText xml:space="preserve"> PAGEREF _Toc230455039 \h </w:instrText>
+          <w:instrText xml:space="preserve"> PAGEREF _Toc230524792 \h </w:instrText>
         </w:r>
         <w:r>
           <w:rPr>
@@ -2698,7 +2698,7 @@
             <w:noProof/>
             <w:webHidden/>
           </w:rPr>
-          <w:t>15</w:t>
+          <w:t>16</w:t>
         </w:r>
         <w:r>
           <w:rPr>
@@ -2724,7 +2724,7 @@
           <w14:ligatures w14:val="standardContextual"/>
         </w:rPr>
       </w:pPr>
-      <w:hyperlink w:anchor="_Toc230455040" w:history="1">
+      <w:hyperlink w:anchor="_Toc230524793" w:history="1">
         <w:r>
           <w:rPr>
             <w:rStyle w:val="Hyperlink"/>
@@ -2751,7 +2751,7 @@
             <w:noProof/>
             <w:webHidden/>
           </w:rPr>
-          <w:instrText xml:space="preserve"> PAGEREF _Toc230455040 \h </w:instrText>
+          <w:instrText xml:space="preserve"> PAGEREF _Toc230524793 \h </w:instrText>
         </w:r>
         <w:r>
           <w:rPr>
@@ -2797,7 +2797,7 @@
           <w14:ligatures w14:val="standardContextual"/>
         </w:rPr>
       </w:pPr>
-      <w:hyperlink w:anchor="_Toc230455041" w:history="1">
+      <w:hyperlink w:anchor="_Toc230524794" w:history="1">
         <w:r>
           <w:rPr>
             <w:rStyle w:val="Hyperlink"/>
@@ -2824,7 +2824,7 @@
             <w:noProof/>
             <w:webHidden/>
           </w:rPr>
-          <w:instrText xml:space="preserve"> PAGEREF _Toc230455041 \h </w:instrText>
+          <w:instrText xml:space="preserve"> PAGEREF _Toc230524794 \h </w:instrText>
         </w:r>
         <w:r>
           <w:rPr>
@@ -2870,7 +2870,7 @@
           <w14:ligatures w14:val="standardContextual"/>
         </w:rPr>
       </w:pPr>
-      <w:hyperlink w:anchor="_Toc230455042" w:history="1">
+      <w:hyperlink w:anchor="_Toc230524795" w:history="1">
         <w:r>
           <w:rPr>
             <w:rStyle w:val="Hyperlink"/>
@@ -2897,7 +2897,7 @@
             <w:noProof/>
             <w:webHidden/>
           </w:rPr>
-          <w:instrText xml:space="preserve"> PAGEREF _Toc230455042 \h </w:instrText>
+          <w:instrText xml:space="preserve"> PAGEREF _Toc230524795 \h </w:instrText>
         </w:r>
         <w:r>
           <w:rPr>
@@ -2943,7 +2943,7 @@
           <w14:ligatures w14:val="standardContextual"/>
         </w:rPr>
       </w:pPr>
-      <w:hyperlink w:anchor="_Toc230455043" w:history="1">
+      <w:hyperlink w:anchor="_Toc230524796" w:history="1">
         <w:r>
           <w:rPr>
             <w:rStyle w:val="Hyperlink"/>
@@ -2970,7 +2970,7 @@
             <w:noProof/>
             <w:webHidden/>
           </w:rPr>
-          <w:instrText xml:space="preserve"> PAGEREF _Toc230455043 \h </w:instrText>
+          <w:instrText xml:space="preserve"> PAGEREF _Toc230524796 \h </w:instrText>
         </w:r>
         <w:r>
           <w:rPr>
@@ -3016,7 +3016,7 @@
           <w14:ligatures w14:val="standardContextual"/>
         </w:rPr>
       </w:pPr>
-      <w:hyperlink w:anchor="_Toc230455044" w:history="1">
+      <w:hyperlink w:anchor="_Toc230524797" w:history="1">
         <w:r>
           <w:rPr>
             <w:rStyle w:val="Hyperlink"/>
@@ -3043,7 +3043,7 @@
             <w:noProof/>
             <w:webHidden/>
           </w:rPr>
-          <w:instrText xml:space="preserve"> PAGEREF _Toc230455044 \h </w:instrText>
+          <w:instrText xml:space="preserve"> PAGEREF _Toc230524797 \h </w:instrText>
         </w:r>
         <w:r>
           <w:rPr>
@@ -3089,7 +3089,7 @@
           <w14:ligatures w14:val="standardContextual"/>
         </w:rPr>
       </w:pPr>
-      <w:hyperlink w:anchor="_Toc230455045" w:history="1">
+      <w:hyperlink w:anchor="_Toc230524798" w:history="1">
         <w:r>
           <w:rPr>
             <w:rStyle w:val="Hyperlink"/>
@@ -3116,7 +3116,7 @@
             <w:noProof/>
             <w:webHidden/>
           </w:rPr>
-          <w:instrText xml:space="preserve"> PAGEREF _Toc230455045 \h </w:instrText>
+          <w:instrText xml:space="preserve"> PAGEREF _Toc230524798 \h </w:instrText>
         </w:r>
         <w:r>
           <w:rPr>
@@ -3162,7 +3162,7 @@
           <w14:ligatures w14:val="standardContextual"/>
         </w:rPr>
       </w:pPr>
-      <w:hyperlink w:anchor="_Toc230455046" w:history="1">
+      <w:hyperlink w:anchor="_Toc230524799" w:history="1">
         <w:r>
           <w:rPr>
             <w:rStyle w:val="Hyperlink"/>
@@ -3189,7 +3189,7 @@
             <w:noProof/>
             <w:webHidden/>
           </w:rPr>
-          <w:instrText xml:space="preserve"> PAGEREF _Toc230455046 \h </w:instrText>
+          <w:instrText xml:space="preserve"> PAGEREF _Toc230524799 \h </w:instrText>
         </w:r>
         <w:r>
           <w:rPr>
@@ -3209,7 +3209,7 @@
             <w:noProof/>
             <w:webHidden/>
           </w:rPr>
-          <w:t>18</w:t>
+          <w:t>19</w:t>
         </w:r>
         <w:r>
           <w:rPr>
@@ -3235,7 +3235,7 @@
           <w14:ligatures w14:val="standardContextual"/>
         </w:rPr>
       </w:pPr>
-      <w:hyperlink w:anchor="_Toc230455047" w:history="1">
+      <w:hyperlink w:anchor="_Toc230524800" w:history="1">
         <w:r>
           <w:rPr>
             <w:rStyle w:val="Hyperlink"/>
@@ -3262,7 +3262,7 @@
             <w:noProof/>
             <w:webHidden/>
           </w:rPr>
-          <w:instrText xml:space="preserve"> PAGEREF _Toc230455047 \h </w:instrText>
+          <w:instrText xml:space="preserve"> PAGEREF _Toc230524800 \h </w:instrText>
         </w:r>
         <w:r>
           <w:rPr>
@@ -3308,7 +3308,7 @@
           <w14:ligatures w14:val="standardContextual"/>
         </w:rPr>
       </w:pPr>
-      <w:hyperlink w:anchor="_Toc230455048" w:history="1">
+      <w:hyperlink w:anchor="_Toc230524801" w:history="1">
         <w:r>
           <w:rPr>
             <w:rStyle w:val="Hyperlink"/>
@@ -3335,7 +3335,7 @@
             <w:noProof/>
             <w:webHidden/>
           </w:rPr>
-          <w:instrText xml:space="preserve"> PAGEREF _Toc230455048 \h </w:instrText>
+          <w:instrText xml:space="preserve"> PAGEREF _Toc230524801 \h </w:instrText>
         </w:r>
         <w:r>
           <w:rPr>
@@ -3381,7 +3381,7 @@
         <w:pStyle w:val="Heading1"/>
         <w:shd w:val="clear" w:color="auto" w:fill="156082"/>
       </w:pPr>
-      <w:bookmarkStart w:id="1" w:name="_Toc230455006"/>
+      <w:bookmarkStart w:id="1" w:name="_Toc230524759"/>
       <w:r>
         <w:lastRenderedPageBreak/>
         <w:t xml:space="preserve">DSES Spectrum Analyzer — </w:t>
@@ -3460,7 +3460,7 @@
       <w:pPr>
         <w:pStyle w:val="Heading2"/>
       </w:pPr>
-      <w:bookmarkStart w:id="2" w:name="_Toc230455007"/>
+      <w:bookmarkStart w:id="2" w:name="_Toc230524760"/>
       <w:r>
         <w:t>1. What the recipient needs to know first</w:t>
       </w:r>
@@ -3617,7 +3617,7 @@
       <w:pPr>
         <w:pStyle w:val="Heading3"/>
       </w:pPr>
-      <w:bookmarkStart w:id="3" w:name="_Toc230455008"/>
+      <w:bookmarkStart w:id="3" w:name="_Toc230524761"/>
       <w:r>
         <w:t>System requirements</w:t>
       </w:r>
@@ -3896,7 +3896,7 @@
       <w:pPr>
         <w:pStyle w:val="Heading2"/>
       </w:pPr>
-      <w:bookmarkStart w:id="4" w:name="_Toc230455009"/>
+      <w:bookmarkStart w:id="4" w:name="_Toc230524762"/>
       <w:r>
         <w:t>2. Installing Radioconda</w:t>
       </w:r>
@@ -3906,7 +3906,7 @@
       <w:pPr>
         <w:pStyle w:val="Heading3"/>
       </w:pPr>
-      <w:bookmarkStart w:id="5" w:name="_Toc230455010"/>
+      <w:bookmarkStart w:id="5" w:name="_Toc230524763"/>
       <w:r>
         <w:t>2.1 Windows 11</w:t>
       </w:r>
@@ -4130,7 +4130,7 @@
       <w:pPr>
         <w:pStyle w:val="Heading3"/>
       </w:pPr>
-      <w:bookmarkStart w:id="6" w:name="_Toc230455011"/>
+      <w:bookmarkStart w:id="6" w:name="_Toc230524764"/>
       <w:r>
         <w:t>2.2 Linux</w:t>
       </w:r>
@@ -4397,7 +4397,7 @@
       <w:pPr>
         <w:pStyle w:val="Heading3"/>
       </w:pPr>
-      <w:bookmarkStart w:id="7" w:name="_Toc230455012"/>
+      <w:bookmarkStart w:id="7" w:name="_Toc230524765"/>
       <w:r>
         <w:t>2.3 macOS (Intel and Apple Silicon)</w:t>
       </w:r>
@@ -4717,7 +4717,7 @@
       <w:pPr>
         <w:pStyle w:val="Heading3"/>
       </w:pPr>
-      <w:bookmarkStart w:id="8" w:name="_Toc230455013"/>
+      <w:bookmarkStart w:id="8" w:name="_Toc230524766"/>
       <w:r>
         <w:t>2.4 Add the packages the analyzer needs (all platforms)</w:t>
       </w:r>
@@ -4878,7 +4878,7 @@
       <w:pPr>
         <w:pStyle w:val="Heading2"/>
       </w:pPr>
-      <w:bookmarkStart w:id="9" w:name="_Toc230455014"/>
+      <w:bookmarkStart w:id="9" w:name="_Toc230524767"/>
       <w:r>
         <w:t>3. Installing the DSES Spectrum Analyzer</w:t>
       </w:r>
@@ -4947,7 +4947,7 @@
       <w:pPr>
         <w:pStyle w:val="Heading3"/>
       </w:pPr>
-      <w:bookmarkStart w:id="10" w:name="_Toc230455015"/>
+      <w:bookmarkStart w:id="10" w:name="_Toc230524768"/>
       <w:r>
         <w:t>3.1 Windows 11</w:t>
       </w:r>
@@ -5221,7 +5221,7 @@
       <w:pPr>
         <w:pStyle w:val="Heading3"/>
       </w:pPr>
-      <w:bookmarkStart w:id="11" w:name="_Toc230455016"/>
+      <w:bookmarkStart w:id="11" w:name="_Toc230524769"/>
       <w:r>
         <w:t>3.2 Linux</w:t>
       </w:r>
@@ -5518,7 +5518,7 @@
       <w:pPr>
         <w:pStyle w:val="Heading3"/>
       </w:pPr>
-      <w:bookmarkStart w:id="12" w:name="_Toc230455017"/>
+      <w:bookmarkStart w:id="12" w:name="_Toc230524770"/>
       <w:r>
         <w:t>3.3 macOS</w:t>
       </w:r>
@@ -5714,7 +5714,7 @@
       <w:pPr>
         <w:pStyle w:val="Heading2"/>
       </w:pPr>
-      <w:bookmarkStart w:id="13" w:name="_Toc230455018"/>
+      <w:bookmarkStart w:id="13" w:name="_Toc230524771"/>
       <w:r>
         <w:t>3A. Extra setup for SDRPlay receivers (RSP1A / RSP1B / RSPduo / RSPdx)</w:t>
       </w:r>
@@ -5756,7 +5756,7 @@
       <w:pPr>
         <w:pStyle w:val="Heading3"/>
       </w:pPr>
-      <w:bookmarkStart w:id="14" w:name="_Toc230455019"/>
+      <w:bookmarkStart w:id="14" w:name="_Toc230524772"/>
       <w:r>
         <w:t>3A.1 Install the SDRplay API</w:t>
       </w:r>
@@ -5868,7 +5868,7 @@
       <w:pPr>
         <w:pStyle w:val="Heading3"/>
       </w:pPr>
-      <w:bookmarkStart w:id="15" w:name="_Toc230455020"/>
+      <w:bookmarkStart w:id="15" w:name="_Toc230524773"/>
       <w:r>
         <w:t>3A.2 Install the SoapySDRPlay module</w:t>
       </w:r>
@@ -6237,7 +6237,7 @@
       <w:pPr>
         <w:pStyle w:val="Heading2"/>
       </w:pPr>
-      <w:bookmarkStart w:id="16" w:name="_Toc230455021"/>
+      <w:bookmarkStart w:id="16" w:name="_Toc230524774"/>
       <w:r>
         <w:t>4. First-run checklist</w:t>
       </w:r>
@@ -6349,7 +6349,7 @@
       <w:pPr>
         <w:pStyle w:val="Heading3"/>
       </w:pPr>
-      <w:bookmarkStart w:id="17" w:name="_Toc230455022"/>
+      <w:bookmarkStart w:id="17" w:name="_Toc230524775"/>
       <w:r>
         <w:t>Recommended one-time VOLK tuning</w:t>
       </w:r>
@@ -6501,7 +6501,7 @@
       <w:pPr>
         <w:pStyle w:val="Heading2"/>
       </w:pPr>
-      <w:bookmarkStart w:id="18" w:name="_Toc230455023"/>
+      <w:bookmarkStart w:id="18" w:name="_Toc230524776"/>
       <w:r>
         <w:t>5. Updating to a new version</w:t>
       </w:r>
@@ -6511,7 +6511,7 @@
       <w:pPr>
         <w:pStyle w:val="Heading3"/>
       </w:pPr>
-      <w:bookmarkStart w:id="19" w:name="_Toc230455024"/>
+      <w:bookmarkStart w:id="19" w:name="_Toc230524777"/>
       <w:r>
         <w:t>Auto-update notifications</w:t>
       </w:r>
@@ -6602,7 +6602,7 @@
       <w:pPr>
         <w:pStyle w:val="Heading3"/>
       </w:pPr>
-      <w:bookmarkStart w:id="20" w:name="_Toc230455025"/>
+      <w:bookmarkStart w:id="20" w:name="_Toc230524778"/>
       <w:r>
         <w:t>Performing the update</w:t>
       </w:r>
@@ -6698,7 +6698,7 @@
       <w:pPr>
         <w:pStyle w:val="Heading3"/>
       </w:pPr>
-      <w:bookmarkStart w:id="21" w:name="_Toc230455026"/>
+      <w:bookmarkStart w:id="21" w:name="_Toc230524779"/>
       <w:r>
         <w:t>What is preserved across versions</w:t>
       </w:r>
@@ -6864,24 +6864,44 @@
     </w:p>
     <w:p>
       <w:r>
-        <w:t>Window geometry is stored separately by Qt (</w:t>
+        <w:t xml:space="preserve">Window size and position are saved in the same </w:t>
       </w:r>
       <w:r>
         <w:rPr>
           <w:rFonts w:ascii="Consolas" w:hAnsi="Consolas"/>
           <w:sz w:val="20"/>
         </w:rPr>
-        <w:t>HKEY_CURRENT_USER\Software\gnuradio\flowgraphs\dses_spectrum_analyzer</w:t>
-      </w:r>
-      <w:r>
-        <w:t xml:space="preserve"> on Windows; the equivalent QSettings storage on Mac/Linux). You don’t need to touch it.</w:t>
+        <w:t>settings.ini</w:t>
+      </w:r>
+      <w:r>
+        <w:t xml:space="preserve">, in the </w:t>
+      </w:r>
+      <w:r>
+        <w:rPr>
+          <w:rFonts w:ascii="Consolas" w:hAnsi="Consolas"/>
+          <w:sz w:val="20"/>
+        </w:rPr>
+        <w:t>[window]</w:t>
+      </w:r>
+      <w:r>
+        <w:t xml:space="preserve"> section (a base64 </w:t>
+      </w:r>
+      <w:r>
+        <w:rPr>
+          <w:rFonts w:ascii="Consolas" w:hAnsi="Consolas"/>
+          <w:sz w:val="20"/>
+        </w:rPr>
+        <w:t>geometry_b64</w:t>
+      </w:r>
+      <w:r>
+        <w:t xml:space="preserve"> value). You don’t need to touch it; deleting that line just makes the window open at its default size next time.</w:t>
       </w:r>
     </w:p>
     <w:p>
       <w:pPr>
         <w:pStyle w:val="Heading3"/>
       </w:pPr>
-      <w:bookmarkStart w:id="22" w:name="_Toc230455027"/>
+      <w:bookmarkStart w:id="22" w:name="_Toc230524780"/>
       <w:r>
         <w:lastRenderedPageBreak/>
         <w:t>Backing up your settings</w:t>
@@ -6941,7 +6961,7 @@
       <w:pPr>
         <w:pStyle w:val="Heading2"/>
       </w:pPr>
-      <w:bookmarkStart w:id="23" w:name="_Toc230455028"/>
+      <w:bookmarkStart w:id="23" w:name="_Toc230524781"/>
       <w:r>
         <w:t>6. Troubleshooting</w:t>
       </w:r>
@@ -6951,12 +6971,9 @@
       <w:pPr>
         <w:pStyle w:val="Heading3"/>
       </w:pPr>
-      <w:bookmarkStart w:id="24" w:name="_Toc230455029"/>
-      <w:r>
-        <w:t xml:space="preserve">“Radioconda not found in </w:t>
-      </w:r>
-      <w:r>
-        <w:t>standard locations”</w:t>
+      <w:bookmarkStart w:id="24" w:name="_Toc230524782"/>
+      <w:r>
+        <w:t>“Radioconda not found in standard locations”</w:t>
       </w:r>
       <w:bookmarkEnd w:id="24"/>
     </w:p>
@@ -7098,7 +7115,7 @@
       <w:pPr>
         <w:pStyle w:val="Heading3"/>
       </w:pPr>
-      <w:bookmarkStart w:id="25" w:name="_Toc230455030"/>
+      <w:bookmarkStart w:id="25" w:name="_Toc230524783"/>
       <w:r>
         <w:t>“Missing required packages (PySide6, pyqtgraph, and/or scipy)” — or `ModuleNotFoundError: No module named 'PySide6'`</w:t>
       </w:r>
@@ -7144,7 +7161,7 @@
       <w:pPr>
         <w:pStyle w:val="Heading3"/>
       </w:pPr>
-      <w:bookmarkStart w:id="26" w:name="_Toc230455031"/>
+      <w:bookmarkStart w:id="26" w:name="_Toc230524784"/>
       <w:r>
         <w:t>“No UHD Devices Found”</w:t>
       </w:r>
@@ -7244,7 +7261,7 @@
       <w:pPr>
         <w:pStyle w:val="Heading3"/>
       </w:pPr>
-      <w:bookmarkStart w:id="27" w:name="_Toc230455032"/>
+      <w:bookmarkStart w:id="27" w:name="_Toc230524785"/>
       <w:r>
         <w:t>Persistent “O” overflows at high sample rates</w:t>
       </w:r>
@@ -7288,7 +7305,7 @@
       <w:pPr>
         <w:pStyle w:val="Heading3"/>
       </w:pPr>
-      <w:bookmarkStart w:id="28" w:name="_Toc230455033"/>
+      <w:bookmarkStart w:id="28" w:name="_Toc230524786"/>
       <w:r>
         <w:t>Spectrum looks flat at −140 dB</w:t>
       </w:r>
@@ -7327,7 +7344,7 @@
       <w:pPr>
         <w:pStyle w:val="Heading3"/>
       </w:pPr>
-      <w:bookmarkStart w:id="29" w:name="_Toc230455034"/>
+      <w:bookmarkStart w:id="29" w:name="_Toc230524787"/>
       <w:r>
         <w:t>macOS: “developer cannot be verified”</w:t>
       </w:r>
@@ -7363,7 +7380,7 @@
       <w:pPr>
         <w:pStyle w:val="Heading3"/>
       </w:pPr>
-      <w:bookmarkStart w:id="30" w:name="_Toc230455035"/>
+      <w:bookmarkStart w:id="30" w:name="_Toc230524788"/>
       <w:r>
         <w:t>Settings won’t persist</w:t>
       </w:r>
@@ -7412,7 +7429,7 @@
       <w:pPr>
         <w:pStyle w:val="Heading2"/>
       </w:pPr>
-      <w:bookmarkStart w:id="31" w:name="_Toc230455036"/>
+      <w:bookmarkStart w:id="31" w:name="_Toc230524789"/>
       <w:r>
         <w:t>7. Appendix A — Settings file reference</w:t>
       </w:r>
@@ -7573,7 +7590,7 @@
           <w:rFonts w:ascii="Consolas" w:hAnsi="Consolas"/>
           <w:sz w:val="20"/>
         </w:rPr>
-        <w:t>[updates]</w:t>
+        <w:t>[window]</w:t>
       </w:r>
       <w:r>
         <w:t xml:space="preserve"> — </w:t>
@@ -7583,173 +7600,140 @@
           <w:rFonts w:ascii="Consolas" w:hAnsi="Consolas"/>
           <w:sz w:val="20"/>
         </w:rPr>
-        <w:t>auto_check</w:t>
-      </w:r>
-      <w:r>
-        <w:t xml:space="preserve"> (set to </w:t>
-      </w:r>
+        <w:t>geometry_b64</w:t>
+      </w:r>
+      <w:r>
+        <w:t>, the saved window size/position (base64). Delete the line to reset to the default window size.</w:t>
+      </w:r>
+    </w:p>
+    <w:p>
+      <w:pPr>
+        <w:pStyle w:val="ListBullet"/>
+      </w:pPr>
       <w:r>
         <w:rPr>
           <w:rFonts w:ascii="Consolas" w:hAnsi="Consolas"/>
           <w:sz w:val="20"/>
         </w:rPr>
-        <w:t>false</w:t>
-      </w:r>
-      <w:r>
-        <w:t xml:space="preserve"> to disable update notifications), plus internal book-keeping fields the program manages on its own.</w:t>
-      </w:r>
-    </w:p>
-    <w:p>
-      <w:r>
-        <w:t>Missing keys are filled in from built-in defaults on next launch. The file is rewritten on close with a header comment explaining what it is.</w:t>
-      </w:r>
-    </w:p>
-    <w:p>
-      <w:r>
-        <w:t xml:space="preserve">To reset every value to its default: use </w:t>
-      </w:r>
-      <w:r>
-        <w:rPr>
-          <w:b/>
-        </w:rPr>
-        <w:t>Help → About → Restore Defaults…</w:t>
-      </w:r>
-      <w:r>
-        <w:t>, or just delete the file and launch the app.</w:t>
-      </w:r>
-    </w:p>
-    <w:p>
-      <w:pPr>
-        <w:pStyle w:val="Heading2"/>
-      </w:pPr>
-      <w:bookmarkStart w:id="32" w:name="_Toc230455037"/>
-      <w:r>
-        <w:t>8. Appendix B — Device selection and SigMF playback</w:t>
-      </w:r>
-      <w:bookmarkEnd w:id="32"/>
-    </w:p>
-    <w:p>
-      <w:pPr>
-        <w:pStyle w:val="Heading3"/>
-      </w:pPr>
-      <w:bookmarkStart w:id="33" w:name="_Toc230455038"/>
-      <w:r>
-        <w:t>Choosing among multiple radios</w:t>
-      </w:r>
-      <w:bookmarkEnd w:id="33"/>
-    </w:p>
-    <w:p>
-      <w:r>
-        <w:t>The program enumerates everything supported at launch — Ettus B210s via UHD, plus any SoapySDR-recognised receiver (SDRPlay, RTL-SDR, HackRF, Airspy, Airspy HF+, BladeRF, LimeSDR, PlutoSDR). Behavior:</w:t>
-      </w:r>
-    </w:p>
-    <w:p>
-      <w:pPr>
-        <w:pStyle w:val="ListBullet"/>
-      </w:pPr>
-      <w:r>
-        <w:rPr>
-          <w:b/>
-        </w:rPr>
-        <w:t>No radio attached, no playback sample:</w:t>
-      </w:r>
-      <w:r>
-        <w:t xml:space="preserve"> an error dialog says “No radio found” and explains how to enable playback (see below). The app exits.</w:t>
-      </w:r>
-    </w:p>
-    <w:p>
-      <w:pPr>
-        <w:pStyle w:val="ListBullet"/>
-      </w:pPr>
-      <w:r>
-        <w:rPr>
-          <w:b/>
-        </w:rPr>
-        <w:t>No radio attached, but `sample.sigmf-data` + `sample.sigmf-meta` are present next to the program:</w:t>
-      </w:r>
-      <w:r>
-        <w:t xml:space="preserve"> the app falls back to </w:t>
-      </w:r>
-      <w:r>
-        <w:rPr>
-          <w:b/>
-        </w:rPr>
-        <w:t>SigMF playback mode</w:t>
-      </w:r>
-      <w:r>
-        <w:t xml:space="preserve"> (see below). An informational dialog announces the fallback.</w:t>
-      </w:r>
-    </w:p>
-    <w:p>
-      <w:pPr>
-        <w:pStyle w:val="ListBullet"/>
-      </w:pPr>
-      <w:r>
-        <w:rPr>
-          <w:b/>
-        </w:rPr>
-        <w:t>One radio attached:</w:t>
-      </w:r>
-      <w:r>
-        <w:t xml:space="preserve"> the app opens it silently and remembers it in </w:t>
+        <w:t>[updates]</w:t>
+      </w:r>
+      <w:r>
+        <w:t xml:space="preserve"> — </w:t>
       </w:r>
       <w:r>
         <w:rPr>
           <w:rFonts w:ascii="Consolas" w:hAnsi="Consolas"/>
           <w:sz w:val="20"/>
         </w:rPr>
-        <w:t>settings.ini</w:t>
-      </w:r>
-      <w:r>
-        <w:t>.</w:t>
-      </w:r>
-    </w:p>
-    <w:p>
-      <w:pPr>
-        <w:pStyle w:val="ListBullet"/>
-      </w:pPr>
-      <w:r>
-        <w:rPr>
-          <w:b/>
-        </w:rPr>
-        <w:t>Two or more radios attached</w:t>
-      </w:r>
-      <w:r>
-        <w:t xml:space="preserve"> (any mix of B210s and SoapySDR receivers): a picker always appears so you choose which one to use. Your previously-used radio is pre-selected, so pressing Enter reuses the same one. The app remembers your selection for next launch.</w:t>
-      </w:r>
-    </w:p>
-    <w:p>
-      <w:r>
-        <w:t xml:space="preserve">The </w:t>
-      </w:r>
-      <w:r>
-        <w:rPr>
-          <w:b/>
-        </w:rPr>
-        <w:t>RX</w:t>
-      </w:r>
-      <w:r>
-        <w:t xml:space="preserve"> sidebar group has a button labeled </w:t>
+        <w:t>auto_check</w:t>
+      </w:r>
+      <w:r>
+        <w:t xml:space="preserve"> (set to </w:t>
       </w:r>
       <w:r>
         <w:rPr>
           <w:rFonts w:ascii="Consolas" w:hAnsi="Consolas"/>
           <w:sz w:val="20"/>
         </w:rPr>
-        <w:t>Device: &lt;product&gt; — &lt;serial&gt;</w:t>
-      </w:r>
-      <w:r>
-        <w:t xml:space="preserve"> showing which radio the current session is using. Clicking it re-opens the picker; the new choice is saved and takes effect on the next launch.</w:t>
-      </w:r>
-    </w:p>
-    <w:p>
-      <w:r>
-        <w:t>The sample-rate combo and gain-slider range adapt automatically to whichever radio is open. SDRPlay caps at 10 MHz; RTL-SDR maxes around 3.2 MHz; HackRF goes to 20 MHz; the B210 to 25 MHz. Saved gain is clamped to the new device’s range if you switch to a narrower one.</w:t>
-      </w:r>
-    </w:p>
-    <w:p>
-      <w:r>
-        <w:t xml:space="preserve">To pin a specific device permanently without using the picker, edit </w:t>
+        <w:t>false</w:t>
+      </w:r>
+      <w:r>
+        <w:t xml:space="preserve"> to disable update notifications), plus internal book-keeping fields the program manages on its own.</w:t>
+      </w:r>
+    </w:p>
+    <w:p>
+      <w:r>
+        <w:t>Missing keys are filled in from built-in defaults on next launch. The file is rewritten on close with a header comment explaining what it is.</w:t>
+      </w:r>
+    </w:p>
+    <w:p>
+      <w:r>
+        <w:t xml:space="preserve">To reset every value to its default: use </w:t>
+      </w:r>
+      <w:r>
+        <w:rPr>
+          <w:b/>
+        </w:rPr>
+        <w:t>Help → About → Restore Defaults…</w:t>
+      </w:r>
+      <w:r>
+        <w:t>, or just delete the file and launch the app.</w:t>
+      </w:r>
+    </w:p>
+    <w:p>
+      <w:pPr>
+        <w:pStyle w:val="Heading2"/>
+      </w:pPr>
+      <w:bookmarkStart w:id="32" w:name="_Toc230524790"/>
+      <w:r>
+        <w:t>8. Appendix B — Device selection and SigMF playback</w:t>
+      </w:r>
+      <w:bookmarkEnd w:id="32"/>
+    </w:p>
+    <w:p>
+      <w:pPr>
+        <w:pStyle w:val="Heading3"/>
+      </w:pPr>
+      <w:bookmarkStart w:id="33" w:name="_Toc230524791"/>
+      <w:r>
+        <w:t>Choosing among multiple radios</w:t>
+      </w:r>
+      <w:bookmarkEnd w:id="33"/>
+    </w:p>
+    <w:p>
+      <w:r>
+        <w:t>The program enumerates everything supported at launch — Ettus B210s via UHD, plus any SoapySDR-recognised receiver (SDRPlay, RTL-SDR, HackRF, Airspy, Airspy HF+, BladeRF, LimeSDR, PlutoSDR). Behavior:</w:t>
+      </w:r>
+    </w:p>
+    <w:p>
+      <w:pPr>
+        <w:pStyle w:val="ListBullet"/>
+      </w:pPr>
+      <w:r>
+        <w:rPr>
+          <w:b/>
+        </w:rPr>
+        <w:t>No radio attached, no playback sample:</w:t>
+      </w:r>
+      <w:r>
+        <w:t xml:space="preserve"> an error dialog says “No radio found” and explains how to enable playback (see below). The app exits.</w:t>
+      </w:r>
+    </w:p>
+    <w:p>
+      <w:pPr>
+        <w:pStyle w:val="ListBullet"/>
+      </w:pPr>
+      <w:r>
+        <w:rPr>
+          <w:b/>
+        </w:rPr>
+        <w:t>No radio attached, but `sample.sigmf-data` + `sample.sigmf-meta` are present next to the program:</w:t>
+      </w:r>
+      <w:r>
+        <w:t xml:space="preserve"> the app falls back to </w:t>
+      </w:r>
+      <w:r>
+        <w:rPr>
+          <w:b/>
+        </w:rPr>
+        <w:t>SigMF playback mode</w:t>
+      </w:r>
+      <w:r>
+        <w:t xml:space="preserve"> (see below). An informational dialog announces the fallback.</w:t>
+      </w:r>
+    </w:p>
+    <w:p>
+      <w:pPr>
+        <w:pStyle w:val="ListBullet"/>
+      </w:pPr>
+      <w:r>
+        <w:rPr>
+          <w:b/>
+        </w:rPr>
+        <w:t>One radio attached:</w:t>
+      </w:r>
+      <w:r>
+        <w:t xml:space="preserve"> the app opens it silently and remembers it in </w:t>
       </w:r>
       <w:r>
         <w:rPr>
@@ -7759,134 +7743,121 @@
         <w:t>settings.ini</w:t>
       </w:r>
       <w:r>
-        <w:t xml:space="preserve"> and set </w:t>
+        <w:t>.</w:t>
+      </w:r>
+    </w:p>
+    <w:p>
+      <w:pPr>
+        <w:pStyle w:val="ListBullet"/>
+      </w:pPr>
+      <w:r>
+        <w:rPr>
+          <w:b/>
+        </w:rPr>
+        <w:t>Two or more radios attached</w:t>
+      </w:r>
+      <w:r>
+        <w:t xml:space="preserve"> (any mix of B210s and SoapySDR receivers): a picker always appears so you choose which one to use. Your previously-used radio is pre-selected, so pressing Enter reuses the same one. The app remembers your selection for next launch.</w:t>
+      </w:r>
+    </w:p>
+    <w:p>
+      <w:r>
+        <w:t xml:space="preserve">The </w:t>
+      </w:r>
+      <w:r>
+        <w:rPr>
+          <w:b/>
+        </w:rPr>
+        <w:t>RX</w:t>
+      </w:r>
+      <w:r>
+        <w:t xml:space="preserve"> sidebar group has a button labeled </w:t>
       </w:r>
       <w:r>
         <w:rPr>
           <w:rFonts w:ascii="Consolas" w:hAnsi="Consolas"/>
           <w:sz w:val="20"/>
         </w:rPr>
-        <w:t>device_driver</w:t>
-      </w:r>
-      <w:r>
-        <w:t xml:space="preserve"> + </w:t>
+        <w:t>Device: &lt;product&gt; — &lt;serial&gt;</w:t>
+      </w:r>
+      <w:r>
+        <w:t xml:space="preserve"> showing which radio the current session is using. Clicking it re-opens the picker; the new choice is saved and takes effect on the next launch.</w:t>
+      </w:r>
+    </w:p>
+    <w:p>
+      <w:r>
+        <w:t>The sample-rate combo and gain-slider range adapt automatically to whichever radio is open. SDRPlay caps at 10 MHz; RTL-SDR maxes around 3.2 MHz; HackRF goes to 20 MHz; the B210 to 25 MHz. Saved gain is clamped to the new device’s range if you switch to a narrower one.</w:t>
+      </w:r>
+    </w:p>
+    <w:p>
+      <w:r>
+        <w:t xml:space="preserve">To pin a specific device permanently without using the picker, edit </w:t>
       </w:r>
       <w:r>
         <w:rPr>
           <w:rFonts w:ascii="Consolas" w:hAnsi="Consolas"/>
           <w:sz w:val="20"/>
         </w:rPr>
-        <w:t>device_serial</w:t>
-      </w:r>
-      <w:r>
-        <w:t xml:space="preserve"> under </w:t>
+        <w:t>settings.ini</w:t>
+      </w:r>
+      <w:r>
+        <w:t xml:space="preserve"> and set </w:t>
       </w:r>
       <w:r>
         <w:rPr>
           <w:rFonts w:ascii="Consolas" w:hAnsi="Consolas"/>
           <w:sz w:val="20"/>
         </w:rPr>
-        <w:t>[rx]</w:t>
-      </w:r>
-      <w:r>
-        <w:t xml:space="preserve">. Use </w:t>
+        <w:t>device_driver</w:t>
+      </w:r>
+      <w:r>
+        <w:t xml:space="preserve"> + </w:t>
       </w:r>
       <w:r>
         <w:rPr>
           <w:rFonts w:ascii="Consolas" w:hAnsi="Consolas"/>
           <w:sz w:val="20"/>
         </w:rPr>
-        <w:t>device_serial = auto</w:t>
-      </w:r>
-      <w:r>
-        <w:t xml:space="preserve"> to restore the default “first found” behavior.</w:t>
-      </w:r>
-    </w:p>
-    <w:p>
-      <w:pPr>
-        <w:pStyle w:val="Heading3"/>
-      </w:pPr>
-      <w:bookmarkStart w:id="34" w:name="_Toc230455039"/>
-      <w:r>
-        <w:t>SigMF playback mode (no-device fallback)</w:t>
-      </w:r>
-      <w:bookmarkEnd w:id="34"/>
-    </w:p>
-    <w:p>
-      <w:r>
-        <w:t>The distribution bundle includes a short SigMF recording so that users without any SDR attached can still launch the program, see live spectrum, and try the controls.</w:t>
-      </w:r>
-    </w:p>
-    <w:p>
-      <w:pPr>
-        <w:pStyle w:val="ListBullet"/>
-      </w:pPr>
-      <w:r>
-        <w:lastRenderedPageBreak/>
-        <w:t xml:space="preserve">Filenames: </w:t>
-      </w:r>
-      <w:r>
-        <w:rPr>
-          <w:b/>
-        </w:rPr>
-        <w:t>`sample.sigmf-data`</w:t>
-      </w:r>
-      <w:r>
-        <w:t xml:space="preserve"> (raw IQ) and </w:t>
-      </w:r>
-      <w:r>
-        <w:rPr>
-          <w:b/>
-        </w:rPr>
-        <w:t>`sample.sigmf-meta`</w:t>
-      </w:r>
-      <w:r>
-        <w:t xml:space="preserve"> (JSON metadata). Both live next to </w:t>
+        <w:t>device_serial</w:t>
+      </w:r>
+      <w:r>
+        <w:t xml:space="preserve"> under </w:t>
       </w:r>
       <w:r>
         <w:rPr>
           <w:rFonts w:ascii="Consolas" w:hAnsi="Consolas"/>
           <w:sz w:val="20"/>
         </w:rPr>
-        <w:t>dses_spectrum_analyzer.py</w:t>
-      </w:r>
-      <w:r>
-        <w:t xml:space="preserve"> in your install folder.</w:t>
-      </w:r>
-    </w:p>
-    <w:p>
-      <w:pPr>
-        <w:pStyle w:val="ListBullet"/>
-      </w:pPr>
-      <w:r>
-        <w:t>The file is read in a continuous loop, paced to match the original capture’s sample rate.</w:t>
-      </w:r>
-    </w:p>
-    <w:p>
-      <w:pPr>
-        <w:pStyle w:val="ListBullet"/>
-      </w:pPr>
-      <w:r>
-        <w:t xml:space="preserve">The window title shows </w:t>
-      </w:r>
-      <w:r>
-        <w:rPr>
-          <w:b/>
-        </w:rPr>
-        <w:t>[Playback]</w:t>
-      </w:r>
-      <w:r>
-        <w:t xml:space="preserve">, the Device button shows the file name, and the Recording-status label reads </w:t>
+        <w:t>[rx]</w:t>
+      </w:r>
+      <w:r>
+        <w:t xml:space="preserve">. Use </w:t>
       </w:r>
       <w:r>
         <w:rPr>
           <w:rFonts w:ascii="Consolas" w:hAnsi="Consolas"/>
           <w:sz w:val="20"/>
         </w:rPr>
-        <w:t>Playback (looping): sample.sigmf-data</w:t>
-      </w:r>
-      <w:r>
-        <w:t>.</w:t>
+        <w:t>device_serial = auto</w:t>
+      </w:r>
+      <w:r>
+        <w:t xml:space="preserve"> to restore the default “first found” behavior.</w:t>
+      </w:r>
+    </w:p>
+    <w:p>
+      <w:pPr>
+        <w:pStyle w:val="Heading3"/>
+      </w:pPr>
+      <w:bookmarkStart w:id="34" w:name="_Toc230524792"/>
+      <w:r>
+        <w:lastRenderedPageBreak/>
+        <w:t>SigMF playback mode (no-device fallback)</w:t>
+      </w:r>
+      <w:bookmarkEnd w:id="34"/>
+    </w:p>
+    <w:p>
+      <w:r>
+        <w:t>The distribution bundle includes a short SigMF recording so that users without any SDR attached can still launch the program, see live spectrum, and try the controls.</w:t>
       </w:r>
     </w:p>
     <w:p>
@@ -7894,93 +7865,73 @@
         <w:pStyle w:val="ListBullet"/>
       </w:pPr>
       <w:r>
+        <w:t xml:space="preserve">Filenames: </w:t>
+      </w:r>
+      <w:r>
         <w:rPr>
           <w:b/>
         </w:rPr>
-        <w:t>Sample Rate</w:t>
-      </w:r>
-      <w:r>
-        <w:t xml:space="preserve">, </w:t>
+        <w:t>`sample.sigmf-data`</w:t>
+      </w:r>
+      <w:r>
+        <w:t xml:space="preserve"> (raw IQ) and </w:t>
       </w:r>
       <w:r>
         <w:rPr>
           <w:b/>
         </w:rPr>
-        <w:t>RX Gain</w:t>
-      </w:r>
-      <w:r>
-        <w:t xml:space="preserve">, and </w:t>
-      </w:r>
-      <w:r>
-        <w:rPr>
-          <w:b/>
-        </w:rPr>
-        <w:t>Recording</w:t>
-      </w:r>
-      <w:r>
-        <w:t xml:space="preserve"> controls are </w:t>
-      </w:r>
-      <w:r>
-        <w:rPr>
-          <w:b/>
-        </w:rPr>
-        <w:t>disabled</w:t>
-      </w:r>
-      <w:r>
-        <w:t xml:space="preserve"> — they have no meaning for a recorded file. Sample rate comes from the file’s metadata.</w:t>
-      </w:r>
-    </w:p>
-    <w:p>
-      <w:pPr>
-        <w:pStyle w:val="ListBullet"/>
-      </w:pPr>
-      <w:r>
-        <w:rPr>
-          <w:b/>
-        </w:rPr>
-        <w:t>Tuning IS enabled</w:t>
-      </w:r>
-      <w:r>
-        <w:t xml:space="preserve"> in playback mode and works as a digital frequency shift on the file’s baseband. Tuning to the file’s actual center frequency (read from the .sigmf-meta) shows the recording’s true content. Tuning to other frequencies within ±(sample_rate/2) of the file’s center lets you explore the recorded bandwidth — useful for poking around inside the capture. Tune well outside that window and you’ll see noise / wrap-around, since the recording doesn’t contain data at those frequencies. This is the expected behavior for</w:t>
-      </w:r>
-      <w:r>
-        <w:t xml:space="preserve"> true I/Q data, not a bug.</w:t>
-      </w:r>
-    </w:p>
-    <w:p>
-      <w:pPr>
-        <w:pStyle w:val="ListBullet"/>
-      </w:pPr>
-      <w:r>
-        <w:t>All visualization controls (Spectrum panel, Waterfall panel, including the dark/light background toggle, FFT averaging, max/min hold, intensity range, colormap, etc.) work normally.</w:t>
-      </w:r>
-    </w:p>
-    <w:p>
-      <w:pPr>
-        <w:pStyle w:val="ListBullet"/>
-      </w:pPr>
-      <w:r>
-        <w:t xml:space="preserve">To replace the bundled sample with your own recording, do a real recording in live mode, then rename the resulting two files to </w:t>
+        <w:t>`sample.sigmf-meta`</w:t>
+      </w:r>
+      <w:r>
+        <w:t xml:space="preserve"> (JSON metadata). Both live next to </w:t>
       </w:r>
       <w:r>
         <w:rPr>
           <w:rFonts w:ascii="Consolas" w:hAnsi="Consolas"/>
           <w:sz w:val="20"/>
         </w:rPr>
-        <w:t>sample.sigmf-data</w:t>
-      </w:r>
-      <w:r>
-        <w:t xml:space="preserve"> and </w:t>
+        <w:t>dses_spectrum_analyzer.py</w:t>
+      </w:r>
+      <w:r>
+        <w:t xml:space="preserve"> in your install folder.</w:t>
+      </w:r>
+    </w:p>
+    <w:p>
+      <w:pPr>
+        <w:pStyle w:val="ListBullet"/>
+      </w:pPr>
+      <w:r>
+        <w:t xml:space="preserve">The file is </w:t>
+      </w:r>
+      <w:r>
+        <w:t>read in a continuous loop, paced to match the original capture’s sample rate.</w:t>
+      </w:r>
+    </w:p>
+    <w:p>
+      <w:pPr>
+        <w:pStyle w:val="ListBullet"/>
+      </w:pPr>
+      <w:r>
+        <w:t xml:space="preserve">The window title shows </w:t>
+      </w:r>
+      <w:r>
+        <w:rPr>
+          <w:b/>
+        </w:rPr>
+        <w:t>[Playback]</w:t>
+      </w:r>
+      <w:r>
+        <w:t xml:space="preserve">, the Device button shows the file name, and the Recording-status label reads </w:t>
       </w:r>
       <w:r>
         <w:rPr>
           <w:rFonts w:ascii="Consolas" w:hAnsi="Consolas"/>
           <w:sz w:val="20"/>
         </w:rPr>
-        <w:t>sample.sigmf-meta</w:t>
-      </w:r>
-      <w:r>
-        <w:t xml:space="preserve"> and drop them next to the program. No source-code change is required.</w:t>
+        <w:t>Playback (looping): sample.sigmf-data</w:t>
+      </w:r>
+      <w:r>
+        <w:t>.</w:t>
       </w:r>
     </w:p>
     <w:p>
@@ -7988,260 +7939,263 @@
         <w:pStyle w:val="ListBullet"/>
       </w:pPr>
       <w:r>
-        <w:t xml:space="preserve">To skip playback mode and force an error exit when no SDR is attached, delete or rename either of the two </w:t>
+        <w:rPr>
+          <w:b/>
+        </w:rPr>
+        <w:t>Sample Rate</w:t>
+      </w:r>
+      <w:r>
+        <w:t xml:space="preserve">, </w:t>
+      </w:r>
+      <w:r>
+        <w:rPr>
+          <w:b/>
+        </w:rPr>
+        <w:t>RX Gain</w:t>
+      </w:r>
+      <w:r>
+        <w:t xml:space="preserve">, and </w:t>
+      </w:r>
+      <w:r>
+        <w:rPr>
+          <w:b/>
+        </w:rPr>
+        <w:t>Recording</w:t>
+      </w:r>
+      <w:r>
+        <w:t xml:space="preserve"> controls are </w:t>
+      </w:r>
+      <w:r>
+        <w:rPr>
+          <w:b/>
+        </w:rPr>
+        <w:t>disabled</w:t>
+      </w:r>
+      <w:r>
+        <w:t xml:space="preserve"> — they have no meaning for a recorded file. Sample rate comes from the file’s metadata.</w:t>
+      </w:r>
+    </w:p>
+    <w:p>
+      <w:pPr>
+        <w:pStyle w:val="ListBullet"/>
+      </w:pPr>
+      <w:r>
+        <w:rPr>
+          <w:b/>
+        </w:rPr>
+        <w:t>Tuning IS enabled</w:t>
+      </w:r>
+      <w:r>
+        <w:t xml:space="preserve"> in playback mode and works as a digital frequency shift on the file’s baseband. Tuning to the file’s actual center frequency (read from the .sigmf-meta) shows the recording’s true content. Tuning to other frequencies within ±(sample_rate/2) of the file’s center lets you explore the recorded bandwidth — useful for poking around inside the capture. Tune well outside that window and you’ll see noise / wrap-around, since the recording doesn’t contain data at those frequencies. This is the expected behavior for</w:t>
+      </w:r>
+      <w:r>
+        <w:t xml:space="preserve"> true I/Q data, not a bug.</w:t>
+      </w:r>
+    </w:p>
+    <w:p>
+      <w:pPr>
+        <w:pStyle w:val="ListBullet"/>
+      </w:pPr>
+      <w:r>
+        <w:t>All visualization controls (Spectrum panel, Waterfall panel, including the dark/light background toggle, FFT averaging, max/min hold, intensity range, colormap, etc.) work normally.</w:t>
+      </w:r>
+    </w:p>
+    <w:p>
+      <w:pPr>
+        <w:pStyle w:val="ListBullet"/>
+      </w:pPr>
+      <w:r>
+        <w:t xml:space="preserve">To replace the bundled sample with your own recording, do a real recording in live mode, then rename the resulting two files to </w:t>
       </w:r>
       <w:r>
         <w:rPr>
           <w:rFonts w:ascii="Consolas" w:hAnsi="Consolas"/>
           <w:sz w:val="20"/>
         </w:rPr>
-        <w:t>sample.sigmf-*</w:t>
-      </w:r>
-      <w:r>
-        <w:t xml:space="preserve"> files.</w:t>
-      </w:r>
-    </w:p>
-    <w:p>
-      <w:pPr>
-        <w:pStyle w:val="Heading2"/>
-      </w:pPr>
-      <w:bookmarkStart w:id="35" w:name="_Toc230455040"/>
-      <w:r>
-        <w:t>9. Appendix C — Operating Guide</w:t>
-      </w:r>
-      <w:bookmarkEnd w:id="35"/>
-    </w:p>
-    <w:p>
-      <w:r>
-        <w:t xml:space="preserve">&gt; This appendix is a copy of the program’s built-in </w:t>
-      </w:r>
-      <w:r>
-        <w:rPr>
-          <w:b/>
-        </w:rPr>
-        <w:t>Help → User Guide</w:t>
-      </w:r>
-      <w:r>
-        <w:t>. If the two ever differ, the in-app Help is authoritative for the version you’re actually running (it ships inside the application).</w:t>
-      </w:r>
-    </w:p>
-    <w:p>
-      <w:r>
-        <w:t>This is a live spectrum analyzer and waterfall display for the Ettus USRP B210 and other software-defined radios (SDRPlay RSP1A/RSP1B/RSPduo/RSPdx, RTL-SDR, HackRF, Airspy, BladeRF, LimeSDR, PlutoSDR via SoapySDR), designed for pulsar RFI investigation but useful for general-purpose spectrum monitoring.</w:t>
-      </w:r>
-    </w:p>
-    <w:p>
-      <w:pPr>
-        <w:pStyle w:val="Heading3"/>
-      </w:pPr>
-      <w:bookmarkStart w:id="36" w:name="_Toc230455041"/>
-      <w:r>
-        <w:t>Starting up — device selection</w:t>
-      </w:r>
-      <w:bookmarkEnd w:id="36"/>
-    </w:p>
-    <w:p>
-      <w:r>
-        <w:t xml:space="preserve">At launch the program </w:t>
-      </w:r>
-      <w:r>
-        <w:t>enumerates attached SDRs (UHD + SoapySDR) and decides what to use:</w:t>
-      </w:r>
-    </w:p>
-    <w:p>
-      <w:pPr>
-        <w:pStyle w:val="ListBullet"/>
-      </w:pPr>
-      <w:r>
-        <w:rPr>
-          <w:b/>
-        </w:rPr>
-        <w:t>One supported SDR attached</w:t>
-      </w:r>
-      <w:r>
-        <w:t>: opens it silently and remembers the driver and serial in the settings file.</w:t>
-      </w:r>
-    </w:p>
-    <w:p>
-      <w:pPr>
-        <w:pStyle w:val="ListBullet"/>
-      </w:pPr>
-      <w:r>
-        <w:rPr>
-          <w:b/>
-        </w:rPr>
-        <w:t>Two or more radios attached</w:t>
-      </w:r>
-      <w:r>
-        <w:t>: a picker dialog always appears so you can choose which one to use. Your previous choice is pre-selected, so you can just press Enter to use the same radio as last time. Your selection is remembered for next launch.</w:t>
-      </w:r>
-    </w:p>
-    <w:p>
-      <w:pPr>
-        <w:pStyle w:val="ListBullet"/>
-      </w:pPr>
-      <w:r>
-        <w:rPr>
-          <w:b/>
-        </w:rPr>
-        <w:t>No SDR attached, but a bundled SigMF sample is present</w:t>
-      </w:r>
-      <w:r>
-        <w:t xml:space="preserve">: the program falls back to </w:t>
-      </w:r>
-      <w:r>
-        <w:rPr>
-          <w:b/>
-        </w:rPr>
-        <w:t>playback mode</w:t>
-      </w:r>
-      <w:r>
-        <w:t xml:space="preserve"> — see below.</w:t>
-      </w:r>
-    </w:p>
-    <w:p>
-      <w:pPr>
-        <w:pStyle w:val="ListBullet"/>
-      </w:pPr>
-      <w:r>
-        <w:rPr>
-          <w:b/>
-        </w:rPr>
-        <w:t>No SDR and no sample</w:t>
-      </w:r>
-      <w:r>
-        <w:t>: an error dialog explains how to fix it and the program exits.</w:t>
-      </w:r>
-    </w:p>
-    <w:p>
-      <w:r>
-        <w:lastRenderedPageBreak/>
-        <w:t xml:space="preserve">The window title always shows which radio is feeding the display, and the </w:t>
-      </w:r>
-      <w:r>
-        <w:rPr>
-          <w:b/>
-        </w:rPr>
-        <w:t>RX</w:t>
-      </w:r>
-      <w:r>
-        <w:t xml:space="preserve"> group has a </w:t>
+        <w:t>sample.sigmf-data</w:t>
+      </w:r>
+      <w:r>
+        <w:t xml:space="preserve"> and </w:t>
       </w:r>
       <w:r>
         <w:rPr>
           <w:rFonts w:ascii="Consolas" w:hAnsi="Consolas"/>
           <w:sz w:val="20"/>
         </w:rPr>
-        <w:t>Device:</w:t>
-      </w:r>
-      <w:r>
-        <w:t xml:space="preserve"> button you can click to re-open the picker. The new choice takes effect on the next launch.</w:t>
-      </w:r>
-    </w:p>
-    <w:p>
-      <w:pPr>
-        <w:pStyle w:val="Heading3"/>
-      </w:pPr>
-      <w:bookmarkStart w:id="37" w:name="_Toc230455042"/>
-      <w:r>
-        <w:t>Playback mode</w:t>
-      </w:r>
-      <w:bookmarkEnd w:id="37"/>
-    </w:p>
-    <w:p>
-      <w:r>
-        <w:t xml:space="preserve">If no SDR is attached, the program looks next to the application file for </w:t>
+        <w:t>sample.sigmf-meta</w:t>
+      </w:r>
+      <w:r>
+        <w:t xml:space="preserve"> and drop them next to the program. No source-code change is required.</w:t>
+      </w:r>
+    </w:p>
+    <w:p>
+      <w:pPr>
+        <w:pStyle w:val="ListBullet"/>
+      </w:pPr>
+      <w:r>
+        <w:t xml:space="preserve">To skip playback mode and force an error exit when no SDR is attached, delete or rename either of the two </w:t>
       </w:r>
       <w:r>
         <w:rPr>
           <w:rFonts w:ascii="Consolas" w:hAnsi="Consolas"/>
           <w:sz w:val="20"/>
         </w:rPr>
-        <w:t>sample.sigmf-data</w:t>
-      </w:r>
-      <w:r>
-        <w:t xml:space="preserve"> + </w:t>
+        <w:t>sample.sigmf-*</w:t>
+      </w:r>
+      <w:r>
+        <w:t xml:space="preserve"> files.</w:t>
+      </w:r>
+    </w:p>
+    <w:p>
+      <w:pPr>
+        <w:pStyle w:val="Heading2"/>
+      </w:pPr>
+      <w:bookmarkStart w:id="35" w:name="_Toc230524793"/>
+      <w:r>
+        <w:t>9. Appendix C — Operating Guide</w:t>
+      </w:r>
+      <w:bookmarkEnd w:id="35"/>
+    </w:p>
+    <w:p>
+      <w:r>
+        <w:t xml:space="preserve">&gt; This appendix is a copy of the program’s built-in </w:t>
+      </w:r>
+      <w:r>
+        <w:rPr>
+          <w:b/>
+        </w:rPr>
+        <w:t>Help → User Guide</w:t>
+      </w:r>
+      <w:r>
+        <w:t>. If the two ever differ, the in-app Help is authoritative for the version you’re actually running (it ships inside the application).</w:t>
+      </w:r>
+    </w:p>
+    <w:p>
+      <w:r>
+        <w:t xml:space="preserve">This is a live spectrum analyzer and waterfall display for the Ettus USRP </w:t>
+      </w:r>
+      <w:r>
+        <w:t>B210 and other software-defined radios (SDRPlay RSP1A/RSP1B/RSPduo/RSPdx, RTL-SDR, HackRF, Airspy, BladeRF, LimeSDR, PlutoSDR via SoapySDR), designed for pulsar RFI investigation but useful for general-purpose spectrum monitoring.</w:t>
+      </w:r>
+    </w:p>
+    <w:p>
+      <w:pPr>
+        <w:pStyle w:val="Heading3"/>
+      </w:pPr>
+      <w:bookmarkStart w:id="36" w:name="_Toc230524794"/>
+      <w:r>
+        <w:t>Starting up — device selection</w:t>
+      </w:r>
+      <w:bookmarkEnd w:id="36"/>
+    </w:p>
+    <w:p>
+      <w:r>
+        <w:t>At launch the program enumerates attached SDRs (UHD + SoapySDR) and decides what to use:</w:t>
+      </w:r>
+    </w:p>
+    <w:p>
+      <w:pPr>
+        <w:pStyle w:val="ListBullet"/>
+      </w:pPr>
+      <w:r>
+        <w:rPr>
+          <w:b/>
+        </w:rPr>
+        <w:t>One supported SDR attached</w:t>
+      </w:r>
+      <w:r>
+        <w:t>: opens it silently and remembers the driver and serial in the settings file.</w:t>
+      </w:r>
+    </w:p>
+    <w:p>
+      <w:pPr>
+        <w:pStyle w:val="ListBullet"/>
+      </w:pPr>
+      <w:r>
+        <w:rPr>
+          <w:b/>
+        </w:rPr>
+        <w:t>Two or more radios attached</w:t>
+      </w:r>
+      <w:r>
+        <w:t>: a picker dialog always appears so you can choose which one to use. Your previous choice is pre-selected, so you can just press Enter to use the same radio as last time. Your selection is remembered for next launch.</w:t>
+      </w:r>
+    </w:p>
+    <w:p>
+      <w:pPr>
+        <w:pStyle w:val="ListBullet"/>
+      </w:pPr>
+      <w:r>
+        <w:rPr>
+          <w:b/>
+        </w:rPr>
+        <w:lastRenderedPageBreak/>
+        <w:t>No SDR attached, but a bundled SigMF sample is present</w:t>
+      </w:r>
+      <w:r>
+        <w:t xml:space="preserve">: the program falls back to </w:t>
+      </w:r>
+      <w:r>
+        <w:rPr>
+          <w:b/>
+        </w:rPr>
+        <w:t>playback mode</w:t>
+      </w:r>
+      <w:r>
+        <w:t xml:space="preserve"> — see below.</w:t>
+      </w:r>
+    </w:p>
+    <w:p>
+      <w:pPr>
+        <w:pStyle w:val="ListBullet"/>
+      </w:pPr>
+      <w:r>
+        <w:rPr>
+          <w:b/>
+        </w:rPr>
+        <w:t>No SDR and no sample</w:t>
+      </w:r>
+      <w:r>
+        <w:t>: an error dialog explains how to fix it and the program exits.</w:t>
+      </w:r>
+    </w:p>
+    <w:p>
+      <w:r>
+        <w:t xml:space="preserve">The window title always shows which radio is feeding the display, and the </w:t>
+      </w:r>
+      <w:r>
+        <w:rPr>
+          <w:b/>
+        </w:rPr>
+        <w:t>RX</w:t>
+      </w:r>
+      <w:r>
+        <w:t xml:space="preserve"> group has a </w:t>
       </w:r>
       <w:r>
         <w:rPr>
           <w:rFonts w:ascii="Consolas" w:hAnsi="Consolas"/>
           <w:sz w:val="20"/>
         </w:rPr>
-        <w:t>sample.sigmf-meta</w:t>
-      </w:r>
-      <w:r>
-        <w:t xml:space="preserve"> and, if both are found, plays the file back in a continuous loop. The window title shows </w:t>
-      </w:r>
-      <w:r>
-        <w:rPr>
-          <w:b/>
-        </w:rPr>
-        <w:t>[Playback]</w:t>
-      </w:r>
-      <w:r>
-        <w:t>. The data source is the file, paced to the original capture’s sample rate.</w:t>
-      </w:r>
-    </w:p>
-    <w:p>
-      <w:pPr>
-        <w:pStyle w:val="ListBullet"/>
-      </w:pPr>
-      <w:r>
-        <w:rPr>
-          <w:b/>
-        </w:rPr>
-        <w:t>Sample Rate</w:t>
-      </w:r>
-      <w:r>
-        <w:t xml:space="preserve">, </w:t>
-      </w:r>
-      <w:r>
-        <w:rPr>
-          <w:b/>
-        </w:rPr>
-        <w:t>RX Gain</w:t>
-      </w:r>
-      <w:r>
-        <w:t xml:space="preserve">, and </w:t>
-      </w:r>
-      <w:r>
-        <w:rPr>
-          <w:b/>
-        </w:rPr>
-        <w:t>Recording</w:t>
-      </w:r>
-      <w:r>
-        <w:t xml:space="preserve"> controls are disabled — they have no meaning for a recorded file. Sample rate comes from the file’s metadata.</w:t>
-      </w:r>
-    </w:p>
-    <w:p>
-      <w:pPr>
-        <w:pStyle w:val="ListBullet"/>
-      </w:pPr>
-      <w:r>
-        <w:rPr>
-          <w:b/>
-        </w:rPr>
-        <w:t>Tuning is enabled</w:t>
-      </w:r>
-      <w:r>
-        <w:t xml:space="preserve"> and works as a digital frequency shift on the file’s baseband. Tuning to the file’s actual center frequency (read from the .sigmf-meta) shows the recording’s true content; tuning to other frequencies within ±(sample_rate/2) of the file’s center lets you “look around” inside the recorded bandwidth. Tune well outside that window and you’ll just see noise / wrap-around — exactly what you’d expect, since the recording doesn’t contain data at those frequencies.</w:t>
-      </w:r>
-    </w:p>
-    <w:p>
-      <w:pPr>
-        <w:pStyle w:val="ListBullet"/>
-      </w:pPr>
-      <w:r>
-        <w:t>All visualization controls (Spectrum panel, Waterfall panel) work normally.</w:t>
-      </w:r>
-    </w:p>
-    <w:p>
-      <w:pPr>
-        <w:pStyle w:val="ListBullet"/>
-      </w:pPr>
-      <w:r>
-        <w:t xml:space="preserve">To replace the sample with your own, save a SigMF recording, rename the two files to </w:t>
+        <w:t>Device:</w:t>
+      </w:r>
+      <w:r>
+        <w:t xml:space="preserve"> button you can click to re-open the picker. The new choice takes effect on the next launch.</w:t>
+      </w:r>
+    </w:p>
+    <w:p>
+      <w:pPr>
+        <w:pStyle w:val="Heading3"/>
+      </w:pPr>
+      <w:bookmarkStart w:id="37" w:name="_Toc230524795"/>
+      <w:r>
+        <w:t>Playback mode</w:t>
+      </w:r>
+      <w:bookmarkEnd w:id="37"/>
+    </w:p>
+    <w:p>
+      <w:r>
+        <w:t xml:space="preserve">If no SDR is attached, the program looks next to the application file for </w:t>
       </w:r>
       <w:r>
         <w:rPr>
@@ -8251,7 +8205,7 @@
         <w:t>sample.sigmf-data</w:t>
       </w:r>
       <w:r>
-        <w:t xml:space="preserve"> and </w:t>
+        <w:t xml:space="preserve"> + </w:t>
       </w:r>
       <w:r>
         <w:rPr>
@@ -8261,22 +8215,16 @@
         <w:t>sample.sigmf-meta</w:t>
       </w:r>
       <w:r>
-        <w:t>, and drop them next to the program. (You don’t need to change any code.)</w:t>
-      </w:r>
-    </w:p>
-    <w:p>
-      <w:pPr>
-        <w:pStyle w:val="Heading3"/>
-      </w:pPr>
-      <w:bookmarkStart w:id="38" w:name="_Toc230455043"/>
-      <w:r>
-        <w:t>Sidebar controls (right side)</w:t>
-      </w:r>
-      <w:bookmarkEnd w:id="38"/>
-    </w:p>
-    <w:p>
-      <w:r>
-        <w:t>#### Tuning</w:t>
+        <w:t xml:space="preserve"> and, if both are found, plays the file back in a continuous loop. The window title shows </w:t>
+      </w:r>
+      <w:r>
+        <w:rPr>
+          <w:b/>
+        </w:rPr>
+        <w:t>[Playback]</w:t>
+      </w:r>
+      <w:r>
+        <w:t>. The data source is the file, paced to the original capture’s sample rate.</w:t>
       </w:r>
     </w:p>
     <w:p>
@@ -8287,19 +8235,28 @@
         <w:rPr>
           <w:b/>
         </w:rPr>
-        <w:t>Pulsar Band</w:t>
-      </w:r>
-      <w:r>
-        <w:t xml:space="preserve">: preset frequencies for common pulsar observation bands. Choose </w:t>
-      </w:r>
-      <w:r>
-        <w:rPr>
-          <w:i/>
-        </w:rPr>
-        <w:t>Manual</w:t>
-      </w:r>
-      <w:r>
-        <w:t xml:space="preserve"> to use the Manual Frequency field instead.</w:t>
+        <w:t>Sample Rate</w:t>
+      </w:r>
+      <w:r>
+        <w:t xml:space="preserve">, </w:t>
+      </w:r>
+      <w:r>
+        <w:rPr>
+          <w:b/>
+        </w:rPr>
+        <w:t>RX Gain</w:t>
+      </w:r>
+      <w:r>
+        <w:t xml:space="preserve">, and </w:t>
+      </w:r>
+      <w:r>
+        <w:rPr>
+          <w:b/>
+        </w:rPr>
+        <w:t>Recording</w:t>
+      </w:r>
+      <w:r>
+        <w:t xml:space="preserve"> controls are disabled — they have no meaning for a recorded file. Sample rate comes from the file’s metadata.</w:t>
       </w:r>
     </w:p>
     <w:p>
@@ -8310,10 +8267,10 @@
         <w:rPr>
           <w:b/>
         </w:rPr>
-        <w:t>Coarse Tune</w:t>
-      </w:r>
-      <w:r>
-        <w:t>: ±100 MHz offset from the selected preset (or from the manual frequency).</w:t>
+        <w:t>Tuning is enabled</w:t>
+      </w:r>
+      <w:r>
+        <w:t xml:space="preserve"> and works as a digital frequency shift on the file’s baseband. Tuning to the file’s actual center frequency (read from the .sigmf-meta) shows the recording’s true content; tuning to other frequencies within ±(sample_rate/2) of the file’s center lets you “look around” inside the recorded bandwidth. Tune well outside that window and you’ll just see noise / wrap-around — exactly what you’d expect, since the recording doesn’t contain data at those frequencies.</w:t>
       </w:r>
     </w:p>
     <w:p>
@@ -8321,16 +8278,7 @@
         <w:pStyle w:val="ListBullet"/>
       </w:pPr>
       <w:r>
-        <w:rPr>
-          <w:b/>
-        </w:rPr>
-        <w:t>Fine Tune</w:t>
-      </w:r>
-      <w:r>
-        <w:t xml:space="preserve">: ±10 MHz offset, layered on top of </w:t>
-      </w:r>
-      <w:r>
-        <w:t>Coarse Tune.</w:t>
+        <w:t>All visualization controls (Spectrum panel, Waterfall panel) work normally.</w:t>
       </w:r>
     </w:p>
     <w:p>
@@ -8338,47 +8286,42 @@
         <w:pStyle w:val="ListBullet"/>
       </w:pPr>
       <w:r>
-        <w:rPr>
-          <w:b/>
-        </w:rPr>
-        <w:t>Manual Frequency</w:t>
-      </w:r>
-      <w:r>
-        <w:t xml:space="preserve">: used when the </w:t>
-      </w:r>
-      <w:r>
-        <w:rPr>
-          <w:i/>
-        </w:rPr>
-        <w:t>Manual</w:t>
-      </w:r>
-      <w:r>
-        <w:t xml:space="preserve"> preset is selected. Accepts engineering notation, e.g. </w:t>
+        <w:t xml:space="preserve">To replace the sample with your own, save a SigMF recording, rename the two files to </w:t>
       </w:r>
       <w:r>
         <w:rPr>
           <w:rFonts w:ascii="Consolas" w:hAnsi="Consolas"/>
           <w:sz w:val="20"/>
         </w:rPr>
-        <w:t>1.42G</w:t>
-      </w:r>
-      <w:r>
-        <w:t xml:space="preserve"> or </w:t>
+        <w:t>sample.sigmf-data</w:t>
+      </w:r>
+      <w:r>
+        <w:t xml:space="preserve"> and </w:t>
       </w:r>
       <w:r>
         <w:rPr>
           <w:rFonts w:ascii="Consolas" w:hAnsi="Consolas"/>
           <w:sz w:val="20"/>
         </w:rPr>
-        <w:t>408M</w:t>
-      </w:r>
-      <w:r>
-        <w:t>.</w:t>
-      </w:r>
-    </w:p>
-    <w:p>
-      <w:r>
-        <w:t>#### RX</w:t>
+        <w:t>sample.sigmf-meta</w:t>
+      </w:r>
+      <w:r>
+        <w:t>, and drop them next to the program. (You don’t need to change any code.)</w:t>
+      </w:r>
+    </w:p>
+    <w:p>
+      <w:pPr>
+        <w:pStyle w:val="Heading3"/>
+      </w:pPr>
+      <w:bookmarkStart w:id="38" w:name="_Toc230524796"/>
+      <w:r>
+        <w:t>Sidebar controls (right side)</w:t>
+      </w:r>
+      <w:bookmarkEnd w:id="38"/>
+    </w:p>
+    <w:p>
+      <w:r>
+        <w:t>#### Tuning</w:t>
       </w:r>
     </w:p>
     <w:p>
@@ -8389,10 +8332,19 @@
         <w:rPr>
           <w:b/>
         </w:rPr>
-        <w:t>Sample Rate</w:t>
-      </w:r>
-      <w:r>
-        <w:t>: per-radio. The combo shows the rates the connected radio actually supports (e.g. B210: 1–25 MHz; SDRPlay: 2–10 MHz; RTL-SDR: 0.25–3.2 MHz). Higher rate = wider spectrum but more disk usage when recording.</w:t>
+        <w:t>Pulsar Band</w:t>
+      </w:r>
+      <w:r>
+        <w:t xml:space="preserve">: preset frequencies for common pulsar observation bands. Choose </w:t>
+      </w:r>
+      <w:r>
+        <w:rPr>
+          <w:i/>
+        </w:rPr>
+        <w:t>Manual</w:t>
+      </w:r>
+      <w:r>
+        <w:t xml:space="preserve"> to use the Manual Frequency field instead.</w:t>
       </w:r>
     </w:p>
     <w:p>
@@ -8403,10 +8355,10 @@
         <w:rPr>
           <w:b/>
         </w:rPr>
-        <w:t>RX Gain</w:t>
-      </w:r>
-      <w:r>
-        <w:t>: per-radio range and meaning. The slider’s min/max matches what the driver reports (e.g. B210: 0–76 dB on the AD9361 gain table; SDRPlay: 0–48 dB, internally inverted so higher = stronger signal; RTL-SDR: 0–49.6 dB). AGC, if the driver defaults it on, is disabled at startup so the slider always takes effect.</w:t>
+        <w:t>Coarse Tune</w:t>
+      </w:r>
+      <w:r>
+        <w:t>: ±100 MHz offset from the selected preset (or from the manual frequency).</w:t>
       </w:r>
     </w:p>
     <w:p>
@@ -8417,37 +8369,114 @@
         <w:rPr>
           <w:b/>
         </w:rPr>
-        <w:t>Antenna</w:t>
-      </w:r>
-      <w:r>
-        <w:t xml:space="preserve">: appears only when the open radio has more than one RF input. For a B210 this lists all four physical connectors as </w:t>
+        <w:t>Fine Tune</w:t>
+      </w:r>
+      <w:r>
+        <w:t xml:space="preserve">: ±10 MHz </w:t>
+      </w:r>
+      <w:r>
+        <w:t>offset, layered on top of Coarse Tune.</w:t>
+      </w:r>
+    </w:p>
+    <w:p>
+      <w:pPr>
+        <w:pStyle w:val="ListBullet"/>
+      </w:pPr>
+      <w:r>
+        <w:rPr>
+          <w:b/>
+        </w:rPr>
+        <w:t>Manual Frequency</w:t>
+      </w:r>
+      <w:r>
+        <w:t xml:space="preserve">: used when the </w:t>
+      </w:r>
+      <w:r>
+        <w:rPr>
+          <w:i/>
+        </w:rPr>
+        <w:t>Manual</w:t>
+      </w:r>
+      <w:r>
+        <w:t xml:space="preserve"> preset is selected. Accepts engineering notation, e.g. </w:t>
       </w:r>
       <w:r>
         <w:rPr>
           <w:rFonts w:ascii="Consolas" w:hAnsi="Consolas"/>
           <w:sz w:val="20"/>
         </w:rPr>
-        <w:t>A : RX2</w:t>
-      </w:r>
-      <w:r>
-        <w:t xml:space="preserve">, </w:t>
+        <w:t>1.42G</w:t>
+      </w:r>
+      <w:r>
+        <w:t xml:space="preserve"> or </w:t>
       </w:r>
       <w:r>
         <w:rPr>
           <w:rFonts w:ascii="Consolas" w:hAnsi="Consolas"/>
           <w:sz w:val="20"/>
         </w:rPr>
-        <w:t>A : TX/RX</w:t>
-      </w:r>
-      <w:r>
-        <w:t xml:space="preserve">, </w:t>
+        <w:t>408M</w:t>
+      </w:r>
+      <w:r>
+        <w:t>.</w:t>
+      </w:r>
+    </w:p>
+    <w:p>
+      <w:r>
+        <w:t>#### RX</w:t>
+      </w:r>
+    </w:p>
+    <w:p>
+      <w:pPr>
+        <w:pStyle w:val="ListBullet"/>
+      </w:pPr>
+      <w:r>
+        <w:rPr>
+          <w:b/>
+        </w:rPr>
+        <w:t>Sample Rate</w:t>
+      </w:r>
+      <w:r>
+        <w:t>: per-radio. The combo shows the rates the connected radio actually supports (e.g. B210: 1–25 MHz; SDRPlay: 2–10 MHz; RTL-SDR: 0.25–3.2 MHz). Higher rate = wider spectrum but more disk usage when recording.</w:t>
+      </w:r>
+    </w:p>
+    <w:p>
+      <w:pPr>
+        <w:pStyle w:val="ListBullet"/>
+      </w:pPr>
+      <w:r>
+        <w:rPr>
+          <w:b/>
+        </w:rPr>
+        <w:t>RX Gain</w:t>
+      </w:r>
+      <w:r>
+        <w:t xml:space="preserve">: per-radio range and meaning. The slider’s min/max matches what the driver reports (e.g. B210: 0–76 dB on the AD9361 gain table; SDRPlay: 0–48 dB, internally inverted so higher = stronger </w:t>
+      </w:r>
+      <w:r>
+        <w:lastRenderedPageBreak/>
+        <w:t>signal; RTL-SDR: 0–49.6 dB). AGC, if the driver defaults it on, is disabled at startup so the slider always takes effect.</w:t>
+      </w:r>
+    </w:p>
+    <w:p>
+      <w:pPr>
+        <w:pStyle w:val="ListBullet"/>
+      </w:pPr>
+      <w:r>
+        <w:rPr>
+          <w:b/>
+        </w:rPr>
+        <w:t>Antenna</w:t>
+      </w:r>
+      <w:r>
+        <w:t xml:space="preserve">: appears only when the open radio has more than one RF input. For a B210 this lists all four physical connectors as </w:t>
       </w:r>
       <w:r>
         <w:rPr>
           <w:rFonts w:ascii="Consolas" w:hAnsi="Consolas"/>
           <w:sz w:val="20"/>
         </w:rPr>
-        <w:t>B : RX2</w:t>
+        <w:t>A : RX2</w:t>
       </w:r>
       <w:r>
         <w:t xml:space="preserve">, </w:t>
@@ -8457,409 +8486,425 @@
           <w:rFonts w:ascii="Consolas" w:hAnsi="Consolas"/>
           <w:sz w:val="20"/>
         </w:rPr>
-        <w:t>B : TX/RX</w:t>
-      </w:r>
-      <w:r>
-        <w:t xml:space="preserve"> — receiver A and receiver B, each with its two SMA ports — and switching includes hopping between the two receivers. An RSPduo lists </w:t>
-      </w:r>
-      <w:r>
-        <w:lastRenderedPageBreak/>
-        <w:t>its two tuners. Pick the connector your cable is actually plugged into; the choice is remembered per radio. Single-port radios (most RTL dongles, the RSP1B) don’t show this control.</w:t>
-      </w:r>
-    </w:p>
-    <w:p>
-      <w:pPr>
-        <w:pStyle w:val="ListBullet"/>
-      </w:pPr>
-      <w:r>
-        <w:rPr>
-          <w:b/>
-        </w:rPr>
-        <w:t>Device</w:t>
-      </w:r>
-      <w:r>
-        <w:t>: shows the currently-open radio and re-opens the picker on click.</w:t>
-      </w:r>
-    </w:p>
-    <w:p>
-      <w:r>
-        <w:t>#### Recording</w:t>
-      </w:r>
-    </w:p>
-    <w:p>
-      <w:pPr>
-        <w:pStyle w:val="ListBullet"/>
-      </w:pPr>
-      <w:r>
-        <w:rPr>
-          <w:b/>
-        </w:rPr>
-        <w:t>Folder</w:t>
-      </w:r>
-      <w:r>
-        <w:t xml:space="preserve">: where SigMF capture pairs (.sigmf-meta / .sigmf-data) land. Defaults to </w:t>
+        <w:t>A : TX/RX</w:t>
+      </w:r>
+      <w:r>
+        <w:t xml:space="preserve">, </w:t>
       </w:r>
       <w:r>
         <w:rPr>
           <w:rFonts w:ascii="Consolas" w:hAnsi="Consolas"/>
           <w:sz w:val="20"/>
         </w:rPr>
-        <w:t>~/Documents/DSES_SA_Recordings</w:t>
-      </w:r>
-      <w:r>
-        <w:t>.</w:t>
-      </w:r>
-    </w:p>
-    <w:p>
-      <w:pPr>
-        <w:pStyle w:val="ListBullet"/>
-      </w:pPr>
-      <w:r>
-        <w:rPr>
-          <w:b/>
-        </w:rPr>
-        <w:t>Record</w:t>
-      </w:r>
-      <w:r>
-        <w:t xml:space="preserve">: </w:t>
-      </w:r>
-      <w:r>
-        <w:rPr>
-          <w:i/>
-        </w:rPr>
-        <w:t>Stopped</w:t>
-      </w:r>
-      <w:r>
-        <w:t xml:space="preserve"> / </w:t>
-      </w:r>
-      <w:r>
-        <w:rPr>
-          <w:i/>
-        </w:rPr>
-        <w:t>Recording</w:t>
-      </w:r>
-      <w:r>
-        <w:t xml:space="preserve">. Recording always starts </w:t>
-      </w:r>
-      <w:r>
-        <w:rPr>
-          <w:i/>
-        </w:rPr>
-        <w:t>Stopped</w:t>
-      </w:r>
-      <w:r>
-        <w:t xml:space="preserve"> on launch.</w:t>
-      </w:r>
-    </w:p>
-    <w:p>
-      <w:pPr>
-        <w:pStyle w:val="Heading3"/>
-      </w:pPr>
-      <w:bookmarkStart w:id="39" w:name="_Toc230455044"/>
-      <w:r>
-        <w:t>Spectrum (top plot)</w:t>
-      </w:r>
-      <w:bookmarkEnd w:id="39"/>
-    </w:p>
-    <w:p>
-      <w:r>
-        <w:t>Live FFT magnitude in dB. Use the control panel on the right side to adjust:</w:t>
-      </w:r>
-    </w:p>
-    <w:p>
-      <w:pPr>
-        <w:pStyle w:val="ListBullet"/>
-      </w:pPr>
-      <w:r>
-        <w:rPr>
-          <w:b/>
-        </w:rPr>
-        <w:t>FFT Size</w:t>
-      </w:r>
-      <w:r>
-        <w:t xml:space="preserve">: </w:t>
-      </w:r>
-      <w:r>
-        <w:t>256–8192. Larger = finer frequency resolution but slower response and more averaging-window flicker.</w:t>
-      </w:r>
-    </w:p>
-    <w:p>
-      <w:pPr>
-        <w:pStyle w:val="ListBullet"/>
-      </w:pPr>
-      <w:r>
-        <w:rPr>
-          <w:b/>
-        </w:rPr>
-        <w:t>Window</w:t>
-      </w:r>
-      <w:r>
-        <w:t>: Blackman-Harris is the default — low sidelobes, good for RFI hunting. Hann/Hamming have narrower main lobes; Rectangular has the sharpest peak but the worst sidelobes.</w:t>
-      </w:r>
-    </w:p>
-    <w:p>
-      <w:pPr>
-        <w:pStyle w:val="ListBullet"/>
-      </w:pPr>
-      <w:r>
-        <w:rPr>
-          <w:b/>
-        </w:rPr>
-        <w:t>Avg α</w:t>
-      </w:r>
-      <w:r>
-        <w:t>: exponential averaging. 1.0 = no smoothing (every frame is a fresh measurement). Smaller = more smoothing.</w:t>
-      </w:r>
-    </w:p>
-    <w:p>
-      <w:pPr>
-        <w:pStyle w:val="ListBullet"/>
-      </w:pPr>
-      <w:r>
-        <w:rPr>
-          <w:b/>
-        </w:rPr>
-        <w:t>Max / Min hold</w:t>
-      </w:r>
-      <w:r>
-        <w:t xml:space="preserve">: overlay traces showing the highest/lowest value ever seen at each bin. Use </w:t>
-      </w:r>
-      <w:r>
-        <w:rPr>
-          <w:b/>
-        </w:rPr>
-        <w:t>Reset</w:t>
-      </w:r>
-      <w:r>
-        <w:t xml:space="preserve"> to clear.</w:t>
-      </w:r>
-    </w:p>
-    <w:p>
-      <w:pPr>
-        <w:pStyle w:val="ListBullet"/>
-      </w:pPr>
-      <w:r>
-        <w:rPr>
-          <w:b/>
-        </w:rPr>
-        <w:t>Y-Axis</w:t>
-      </w:r>
-      <w:r>
-        <w:t xml:space="preserve">: dB min/max, or click </w:t>
-      </w:r>
-      <w:r>
-        <w:rPr>
-          <w:b/>
-        </w:rPr>
-        <w:t>Autoscale</w:t>
-      </w:r>
-      <w:r>
-        <w:t xml:space="preserve"> to fit the current data. </w:t>
-      </w:r>
-      <w:r>
-        <w:rPr>
-          <w:b/>
-        </w:rPr>
-        <w:t>Reset Axes</w:t>
-      </w:r>
-      <w:r>
-        <w:t xml:space="preserve"> snaps the plot back to the default dB range and full-span frequency view — handy after you’ve zoomed/panned with the mouse or nudged the min/max and want to get un-lost. It leaves FFT size, window, traces, and colors untouched.</w:t>
-      </w:r>
-    </w:p>
-    <w:p>
-      <w:pPr>
-        <w:pStyle w:val="ListBullet"/>
-      </w:pPr>
-      <w:r>
-        <w:rPr>
-          <w:b/>
-        </w:rPr>
-        <w:t>Linear scale</w:t>
-      </w:r>
-      <w:r>
-        <w:t>: plots linear magnitude instead of dB (the default log scale). In linear mode the Y axis auto-fits and the dB Min/Max boxes are disabled. Affects the spectrum plot only — the waterfall stays in dB.</w:t>
-      </w:r>
-    </w:p>
-    <w:p>
-      <w:pPr>
-        <w:pStyle w:val="ListBullet"/>
-      </w:pPr>
-      <w:r>
-        <w:rPr>
-          <w:b/>
-        </w:rPr>
-        <w:t>Trace</w:t>
-      </w:r>
-      <w:r>
-        <w:t>: color, line width, alpha, label.</w:t>
-      </w:r>
-    </w:p>
-    <w:p>
-      <w:pPr>
-        <w:pStyle w:val="Heading3"/>
-      </w:pPr>
-      <w:bookmarkStart w:id="40" w:name="_Toc230455045"/>
-      <w:r>
-        <w:t>Waterfall (bottom plot)</w:t>
-      </w:r>
-      <w:bookmarkEnd w:id="40"/>
-    </w:p>
-    <w:p>
-      <w:r>
-        <w:t>Scrolling 2-D image of FFT vs. time. Newest row at the bottom.</w:t>
-      </w:r>
-    </w:p>
-    <w:p>
-      <w:pPr>
-        <w:pStyle w:val="ListBullet"/>
-      </w:pPr>
-      <w:r>
-        <w:rPr>
-          <w:b/>
-        </w:rPr>
-        <w:t>Intensity Min/Max</w:t>
-      </w:r>
-      <w:r>
-        <w:t xml:space="preserve">: dB range that maps to the colormap. </w:t>
-      </w:r>
-      <w:r>
-        <w:rPr>
-          <w:b/>
-        </w:rPr>
-        <w:t>Autoscale intensity</w:t>
-      </w:r>
-      <w:r>
-        <w:t xml:space="preserve"> picks the 5%–99% percentile of the current data.</w:t>
-      </w:r>
-    </w:p>
-    <w:p>
-      <w:pPr>
-        <w:pStyle w:val="ListBullet"/>
-      </w:pPr>
-      <w:r>
-        <w:rPr>
-          <w:b/>
-        </w:rPr>
-        <w:t>Colormap</w:t>
-      </w:r>
-      <w:r>
-        <w:t>: viridis (default), plasma, inferno, magma, turbo, cividis, gray.</w:t>
-      </w:r>
-    </w:p>
-    <w:p>
-      <w:pPr>
-        <w:pStyle w:val="ListBullet"/>
-      </w:pPr>
-      <w:r>
-        <w:rPr>
-          <w:b/>
-        </w:rPr>
-        <w:t>Rows</w:t>
-      </w:r>
-      <w:r>
-        <w:t>: how many history rows to display (default 256).</w:t>
-      </w:r>
-    </w:p>
-    <w:p>
-      <w:pPr>
-        <w:pStyle w:val="Heading3"/>
-      </w:pPr>
-      <w:bookmarkStart w:id="41" w:name="_Toc230455046"/>
-      <w:r>
-        <w:t>Persistence</w:t>
-      </w:r>
-      <w:bookmarkEnd w:id="41"/>
-    </w:p>
-    <w:p>
-      <w:r>
-        <w:t xml:space="preserve">All selections are saved to a plain-text INI file and restored on next launch. The file location is shown in </w:t>
-      </w:r>
-      <w:r>
-        <w:rPr>
-          <w:b/>
-        </w:rPr>
-        <w:t>Help → About</w:t>
-      </w:r>
-      <w:r>
-        <w:t xml:space="preserve">; you can open the folder directly with the </w:t>
-      </w:r>
-      <w:r>
-        <w:rPr>
-          <w:b/>
-        </w:rPr>
-        <w:t>Open Settings Folder</w:t>
-      </w:r>
-      <w:r>
-        <w:t xml:space="preserve"> button.</w:t>
-      </w:r>
-    </w:p>
-    <w:p>
-      <w:r>
-        <w:t xml:space="preserve">To revert everything to factory defaults, use </w:t>
-      </w:r>
-      <w:r>
-        <w:rPr>
-          <w:b/>
-        </w:rPr>
-        <w:t>Restore Defaults</w:t>
-      </w:r>
-      <w:r>
-        <w:t xml:space="preserve"> in the About dialog.</w:t>
-      </w:r>
-    </w:p>
-    <w:p>
-      <w:pPr>
-        <w:pStyle w:val="Heading3"/>
-      </w:pPr>
-      <w:bookmarkStart w:id="42" w:name="_Toc230455047"/>
-      <w:r>
-        <w:lastRenderedPageBreak/>
-        <w:t>Update checks</w:t>
-      </w:r>
-      <w:bookmarkEnd w:id="42"/>
-    </w:p>
-    <w:p>
-      <w:r>
-        <w:t xml:space="preserve">If the developer has configured a manifest URL, the program checks for a newer release in the background at launch (no more than once every 24 hours). When a newer version is found, a non-modal dialog opens with the release notes and a button that opens the download page in your browser — you can ignore it and keep using the app, or click </w:t>
-      </w:r>
-      <w:r>
-        <w:rPr>
-          <w:b/>
-        </w:rPr>
-        <w:t>Skip this version</w:t>
-      </w:r>
-      <w:r>
-        <w:t xml:space="preserve"> to not be reminded about that particular version again.</w:t>
-      </w:r>
-    </w:p>
-    <w:p>
-      <w:r>
-        <w:t xml:space="preserve">The check is read-only and never auto-downloads or auto-installs. To trigger a check manually, use </w:t>
-      </w:r>
-      <w:r>
-        <w:rPr>
-          <w:b/>
-        </w:rPr>
-        <w:t>Help → Check for Updates…</w:t>
-      </w:r>
-      <w:r>
-        <w:t xml:space="preserve">. To disable auto-checks, set </w:t>
+        <w:t>B : RX2</w:t>
+      </w:r>
+      <w:r>
+        <w:t xml:space="preserve">, </w:t>
       </w:r>
       <w:r>
         <w:rPr>
           <w:rFonts w:ascii="Consolas" w:hAnsi="Consolas"/>
           <w:sz w:val="20"/>
         </w:rPr>
-        <w:t>auto_check = false</w:t>
-      </w:r>
-      <w:r>
-        <w:t xml:space="preserve"> under </w:t>
+        <w:t>B : TX/RX</w:t>
+      </w:r>
+      <w:r>
+        <w:t xml:space="preserve"> — receiver A and receiver B, each with its two SMA ports — and switching includes hopping between the two receivers. An RSPduo lists its two tuners. Pick the connector your cable is actually plugged into; the choice is remembered per radio. Single-port radios (most RTL dongles, the RSP1B) don’t show this control.</w:t>
+      </w:r>
+    </w:p>
+    <w:p>
+      <w:pPr>
+        <w:pStyle w:val="ListBullet"/>
+      </w:pPr>
+      <w:r>
+        <w:rPr>
+          <w:b/>
+        </w:rPr>
+        <w:t>Device</w:t>
+      </w:r>
+      <w:r>
+        <w:t>: shows the currently-open radio and re-opens the picker on click.</w:t>
+      </w:r>
+    </w:p>
+    <w:p>
+      <w:r>
+        <w:t>#### Recording</w:t>
+      </w:r>
+    </w:p>
+    <w:p>
+      <w:pPr>
+        <w:pStyle w:val="ListBullet"/>
+      </w:pPr>
+      <w:r>
+        <w:rPr>
+          <w:b/>
+        </w:rPr>
+        <w:t>Folder</w:t>
+      </w:r>
+      <w:r>
+        <w:t xml:space="preserve">: where SigMF capture pairs (.sigmf-meta / .sigmf-data) land. Defaults to </w:t>
       </w:r>
       <w:r>
         <w:rPr>
           <w:rFonts w:ascii="Consolas" w:hAnsi="Consolas"/>
           <w:sz w:val="20"/>
         </w:rPr>
+        <w:t>~/Documents/DSES_SA_Recordings</w:t>
+      </w:r>
+      <w:r>
+        <w:t>.</w:t>
+      </w:r>
+    </w:p>
+    <w:p>
+      <w:pPr>
+        <w:pStyle w:val="ListBullet"/>
+      </w:pPr>
+      <w:r>
+        <w:rPr>
+          <w:b/>
+        </w:rPr>
+        <w:t>Record</w:t>
+      </w:r>
+      <w:r>
+        <w:t xml:space="preserve">: </w:t>
+      </w:r>
+      <w:r>
+        <w:rPr>
+          <w:i/>
+        </w:rPr>
+        <w:t>Stopped</w:t>
+      </w:r>
+      <w:r>
+        <w:t xml:space="preserve"> / </w:t>
+      </w:r>
+      <w:r>
+        <w:rPr>
+          <w:i/>
+        </w:rPr>
+        <w:t>Recording</w:t>
+      </w:r>
+      <w:r>
+        <w:t xml:space="preserve">. Recording always starts </w:t>
+      </w:r>
+      <w:r>
+        <w:rPr>
+          <w:i/>
+        </w:rPr>
+        <w:t>Stopped</w:t>
+      </w:r>
+      <w:r>
+        <w:t xml:space="preserve"> on launch.</w:t>
+      </w:r>
+    </w:p>
+    <w:p>
+      <w:pPr>
+        <w:pStyle w:val="Heading3"/>
+      </w:pPr>
+      <w:bookmarkStart w:id="39" w:name="_Toc230524797"/>
+      <w:r>
+        <w:t>Spectrum (top plot)</w:t>
+      </w:r>
+      <w:bookmarkEnd w:id="39"/>
+    </w:p>
+    <w:p>
+      <w:r>
+        <w:t xml:space="preserve">Live FFT magnitude in dB. Use the control panel on the right side to </w:t>
+      </w:r>
+      <w:r>
+        <w:t>adjust:</w:t>
+      </w:r>
+    </w:p>
+    <w:p>
+      <w:pPr>
+        <w:pStyle w:val="ListBullet"/>
+      </w:pPr>
+      <w:r>
+        <w:rPr>
+          <w:b/>
+        </w:rPr>
+        <w:t>FFT Size</w:t>
+      </w:r>
+      <w:r>
+        <w:t>: 256–8192. Larger = finer frequency resolution but slower response and more averaging-window flicker.</w:t>
+      </w:r>
+    </w:p>
+    <w:p>
+      <w:pPr>
+        <w:pStyle w:val="ListBullet"/>
+      </w:pPr>
+      <w:r>
+        <w:rPr>
+          <w:b/>
+        </w:rPr>
+        <w:t>Window</w:t>
+      </w:r>
+      <w:r>
+        <w:t>: Blackman-Harris is the default — low sidelobes, good for RFI hunting. Hann/Hamming have narrower main lobes; Rectangular has the sharpest peak but the worst sidelobes.</w:t>
+      </w:r>
+    </w:p>
+    <w:p>
+      <w:pPr>
+        <w:pStyle w:val="ListBullet"/>
+      </w:pPr>
+      <w:r>
+        <w:rPr>
+          <w:b/>
+        </w:rPr>
+        <w:t>Avg α</w:t>
+      </w:r>
+      <w:r>
+        <w:t>: exponential averaging. 1.0 = no smoothing (every frame is a fresh measurement). Smaller = more smoothing.</w:t>
+      </w:r>
+    </w:p>
+    <w:p>
+      <w:pPr>
+        <w:pStyle w:val="ListBullet"/>
+      </w:pPr>
+      <w:r>
+        <w:rPr>
+          <w:b/>
+        </w:rPr>
+        <w:t>Max / Min hold</w:t>
+      </w:r>
+      <w:r>
+        <w:t xml:space="preserve">: overlay traces showing the highest/lowest value ever seen at each bin. Use </w:t>
+      </w:r>
+      <w:r>
+        <w:rPr>
+          <w:b/>
+        </w:rPr>
+        <w:t>Reset</w:t>
+      </w:r>
+      <w:r>
+        <w:t xml:space="preserve"> to clear.</w:t>
+      </w:r>
+    </w:p>
+    <w:p>
+      <w:pPr>
+        <w:pStyle w:val="ListBullet"/>
+      </w:pPr>
+      <w:r>
+        <w:rPr>
+          <w:b/>
+        </w:rPr>
+        <w:t>Y-Axis</w:t>
+      </w:r>
+      <w:r>
+        <w:t xml:space="preserve">: dB min/max, or click </w:t>
+      </w:r>
+      <w:r>
+        <w:rPr>
+          <w:b/>
+        </w:rPr>
+        <w:t>Autoscale</w:t>
+      </w:r>
+      <w:r>
+        <w:t xml:space="preserve"> to fit the current data. </w:t>
+      </w:r>
+      <w:r>
+        <w:rPr>
+          <w:b/>
+        </w:rPr>
+        <w:t>Reset Axes</w:t>
+      </w:r>
+      <w:r>
+        <w:t xml:space="preserve"> snaps the plot back to the default dB range and full-span frequency view — handy after you’ve zoomed/panned with the mouse or nudged the min/max and want to get un-lost. It leaves FFT size, window, traces, and colors untouched.</w:t>
+      </w:r>
+    </w:p>
+    <w:p>
+      <w:pPr>
+        <w:pStyle w:val="ListBullet"/>
+      </w:pPr>
+      <w:r>
+        <w:rPr>
+          <w:b/>
+        </w:rPr>
+        <w:t>Linear scale</w:t>
+      </w:r>
+      <w:r>
+        <w:t>: plots linear magnitude instead of dB (the default log scale). In linear mode the Y axis auto-fits and the dB Min/Max boxes are disabled. Affects the spectrum plot only — the waterfall stays in dB.</w:t>
+      </w:r>
+    </w:p>
+    <w:p>
+      <w:pPr>
+        <w:pStyle w:val="ListBullet"/>
+      </w:pPr>
+      <w:r>
+        <w:rPr>
+          <w:b/>
+        </w:rPr>
+        <w:t>Trace</w:t>
+      </w:r>
+      <w:r>
+        <w:t>: color, line width, alpha, label.</w:t>
+      </w:r>
+    </w:p>
+    <w:p>
+      <w:pPr>
+        <w:pStyle w:val="Heading3"/>
+      </w:pPr>
+      <w:bookmarkStart w:id="40" w:name="_Toc230524798"/>
+      <w:r>
+        <w:t>Waterfall (bottom plot)</w:t>
+      </w:r>
+      <w:bookmarkEnd w:id="40"/>
+    </w:p>
+    <w:p>
+      <w:r>
+        <w:t>Scrolling 2-D image of FFT vs. time. Newest row at the bottom.</w:t>
+      </w:r>
+    </w:p>
+    <w:p>
+      <w:pPr>
+        <w:pStyle w:val="ListBullet"/>
+      </w:pPr>
+      <w:r>
+        <w:rPr>
+          <w:b/>
+        </w:rPr>
+        <w:t>Intensity Min/Max</w:t>
+      </w:r>
+      <w:r>
+        <w:t xml:space="preserve">: dB range that maps to the colormap. </w:t>
+      </w:r>
+      <w:r>
+        <w:rPr>
+          <w:b/>
+        </w:rPr>
+        <w:t>Autoscale intensity</w:t>
+      </w:r>
+      <w:r>
+        <w:t xml:space="preserve"> picks the 5%–99% percentile of the current data.</w:t>
+      </w:r>
+    </w:p>
+    <w:p>
+      <w:pPr>
+        <w:pStyle w:val="ListBullet"/>
+      </w:pPr>
+      <w:r>
+        <w:rPr>
+          <w:b/>
+        </w:rPr>
+        <w:t>Colormap</w:t>
+      </w:r>
+      <w:r>
+        <w:t>: viridis (default), plasma, inferno, magma, turbo, cividis, gray.</w:t>
+      </w:r>
+    </w:p>
+    <w:p>
+      <w:pPr>
+        <w:pStyle w:val="ListBullet"/>
+      </w:pPr>
+      <w:r>
+        <w:rPr>
+          <w:b/>
+        </w:rPr>
+        <w:t>Rows</w:t>
+      </w:r>
+      <w:r>
+        <w:t>: how many history rows to display (default 256).</w:t>
+      </w:r>
+    </w:p>
+    <w:p>
+      <w:pPr>
+        <w:pStyle w:val="Heading3"/>
+      </w:pPr>
+      <w:bookmarkStart w:id="41" w:name="_Toc230524799"/>
+      <w:r>
+        <w:lastRenderedPageBreak/>
+        <w:t>Persistence</w:t>
+      </w:r>
+      <w:bookmarkEnd w:id="41"/>
+    </w:p>
+    <w:p>
+      <w:r>
+        <w:t xml:space="preserve">All selections are saved to a plain-text INI file and restored on next launch. The file location is shown in </w:t>
+      </w:r>
+      <w:r>
+        <w:rPr>
+          <w:b/>
+        </w:rPr>
+        <w:t>Help → About</w:t>
+      </w:r>
+      <w:r>
+        <w:t xml:space="preserve">; you can open the folder directly with the </w:t>
+      </w:r>
+      <w:r>
+        <w:rPr>
+          <w:b/>
+        </w:rPr>
+        <w:t>Open Settings Folder</w:t>
+      </w:r>
+      <w:r>
+        <w:t xml:space="preserve"> button.</w:t>
+      </w:r>
+    </w:p>
+    <w:p>
+      <w:r>
+        <w:t xml:space="preserve">To revert everything to factory defaults, use </w:t>
+      </w:r>
+      <w:r>
+        <w:rPr>
+          <w:b/>
+        </w:rPr>
+        <w:t>Restore Defaults</w:t>
+      </w:r>
+      <w:r>
+        <w:t xml:space="preserve"> in the About dialog.</w:t>
+      </w:r>
+    </w:p>
+    <w:p>
+      <w:pPr>
+        <w:pStyle w:val="Heading3"/>
+      </w:pPr>
+      <w:bookmarkStart w:id="42" w:name="_Toc230524800"/>
+      <w:r>
+        <w:t>Update checks</w:t>
+      </w:r>
+      <w:bookmarkEnd w:id="42"/>
+    </w:p>
+    <w:p>
+      <w:r>
+        <w:t xml:space="preserve">If the developer has configured a manifest URL, the program checks for a newer release in the background at launch (no more than once every 24 hours). When a newer version is found, a non-modal dialog opens with the release notes and a button that opens the download page in your browser — you can ignore it and keep using the app, or click </w:t>
+      </w:r>
+      <w:r>
+        <w:rPr>
+          <w:b/>
+        </w:rPr>
+        <w:t>Skip this version</w:t>
+      </w:r>
+      <w:r>
+        <w:t xml:space="preserve"> to not be reminded about that particular version again.</w:t>
+      </w:r>
+    </w:p>
+    <w:p>
+      <w:r>
+        <w:t xml:space="preserve">The check is read-only and never auto-downloads or auto-installs. To trigger a check manually, use </w:t>
+      </w:r>
+      <w:r>
+        <w:rPr>
+          <w:b/>
+        </w:rPr>
+        <w:t>Help → Check for Updates…</w:t>
+      </w:r>
+      <w:r>
+        <w:t xml:space="preserve">. To disable auto-checks, set </w:t>
+      </w:r>
+      <w:r>
+        <w:rPr>
+          <w:rFonts w:ascii="Consolas" w:hAnsi="Consolas"/>
+          <w:sz w:val="20"/>
+        </w:rPr>
+        <w:t>auto_check = false</w:t>
+      </w:r>
+      <w:r>
+        <w:t xml:space="preserve"> under </w:t>
+      </w:r>
+      <w:r>
+        <w:rPr>
+          <w:rFonts w:ascii="Consolas" w:hAnsi="Consolas"/>
+          <w:sz w:val="20"/>
+        </w:rPr>
         <w:t>[updates]</w:t>
       </w:r>
       <w:r>
@@ -8870,7 +8915,7 @@
       <w:pPr>
         <w:pStyle w:val="Heading3"/>
       </w:pPr>
-      <w:bookmarkStart w:id="43" w:name="_Toc230455048"/>
+      <w:bookmarkStart w:id="43" w:name="_Toc230524801"/>
       <w:r>
         <w:t>Tips for pulsar work</w:t>
       </w:r>
@@ -8975,7 +9020,7 @@
         <w:color w:val="595959"/>
         <w:sz w:val="18"/>
       </w:rPr>
-      <w:t>23-May-26</w:t>
+      <w:t>24-May-26</w:t>
     </w:r>
     <w:r>
       <w:rPr>
@@ -9060,7 +9105,14 @@
         <w:b/>
         <w:color w:val="156082"/>
       </w:rPr>
-      <w:t>DSES Spectrum Analyzer</w:t>
+      <w:t xml:space="preserve">DSES </w:t>
+    </w:r>
+    <w:r>
+      <w:rPr>
+        <w:b/>
+        <w:color w:val="156082"/>
+      </w:rPr>
+      <w:t>Spectrum Analyzer</w:t>
     </w:r>
   </w:p>
   <w:p>
@@ -9249,31 +9301,31 @@
       </w:rPr>
     </w:lvl>
   </w:abstractNum>
-  <w:num w:numId="1" w16cid:durableId="924992125">
+  <w:num w:numId="1" w16cid:durableId="469636636">
     <w:abstractNumId w:val="8"/>
   </w:num>
-  <w:num w:numId="2" w16cid:durableId="1012686574">
+  <w:num w:numId="2" w16cid:durableId="268318830">
     <w:abstractNumId w:val="6"/>
   </w:num>
-  <w:num w:numId="3" w16cid:durableId="600920557">
+  <w:num w:numId="3" w16cid:durableId="1613973453">
     <w:abstractNumId w:val="5"/>
   </w:num>
-  <w:num w:numId="4" w16cid:durableId="407390094">
+  <w:num w:numId="4" w16cid:durableId="1797868134">
     <w:abstractNumId w:val="4"/>
   </w:num>
-  <w:num w:numId="5" w16cid:durableId="1530559664">
+  <w:num w:numId="5" w16cid:durableId="729883056">
     <w:abstractNumId w:val="7"/>
   </w:num>
-  <w:num w:numId="6" w16cid:durableId="1074354974">
+  <w:num w:numId="6" w16cid:durableId="617493681">
     <w:abstractNumId w:val="3"/>
   </w:num>
-  <w:num w:numId="7" w16cid:durableId="601227978">
+  <w:num w:numId="7" w16cid:durableId="1926765675">
     <w:abstractNumId w:val="2"/>
   </w:num>
-  <w:num w:numId="8" w16cid:durableId="875778055">
+  <w:num w:numId="8" w16cid:durableId="914165719">
     <w:abstractNumId w:val="1"/>
   </w:num>
-  <w:num w:numId="9" w16cid:durableId="364405975">
+  <w:num w:numId="9" w16cid:durableId="1925793664">
     <w:abstractNumId w:val="0"/>
   </w:num>
 </w:numbering>
@@ -20668,7 +20720,7 @@
     <w:autoRedefine/>
     <w:uiPriority w:val="39"/>
     <w:unhideWhenUsed/>
-    <w:rsid w:val="00497544"/>
+    <w:rsid w:val="00087463"/>
     <w:pPr>
       <w:spacing w:after="100"/>
     </w:pPr>
@@ -20680,7 +20732,7 @@
     <w:autoRedefine/>
     <w:uiPriority w:val="39"/>
     <w:unhideWhenUsed/>
-    <w:rsid w:val="00497544"/>
+    <w:rsid w:val="00087463"/>
     <w:pPr>
       <w:spacing w:after="100"/>
       <w:ind w:left="220"/>
@@ -20693,7 +20745,7 @@
     <w:autoRedefine/>
     <w:uiPriority w:val="39"/>
     <w:unhideWhenUsed/>
-    <w:rsid w:val="00497544"/>
+    <w:rsid w:val="00087463"/>
     <w:pPr>
       <w:spacing w:after="100"/>
       <w:ind w:left="440"/>
@@ -20704,7 +20756,7 @@
     <w:basedOn w:val="DefaultParagraphFont"/>
     <w:uiPriority w:val="99"/>
     <w:unhideWhenUsed/>
-    <w:rsid w:val="00497544"/>
+    <w:rsid w:val="00087463"/>
     <w:rPr>
       <w:color w:val="0000FF" w:themeColor="hyperlink"/>
       <w:u w:val="single"/>

</xml_diff>

<commit_message>
Store window geometry as plain x/y/width/height ints, not a saveGeometry blob
The base64 saveGeometry() approach round-trips perfectly on Windows but the
blob stored on the user's Mac came back with a corrupted (nibble-shifted)
magic header, so restoreGeometry() rejected it and the window always opened
at the default size. Switch to plain integers in [window] (x/y/width/height)
restored via resize()/move(): human-readable, corruption-proof, and free of
Qt's geometry magic/version. width/height 0 = not-yet-saved. Updated the
install guide settings reference.
</commit_message>
<xml_diff>
--- a/DSES_RFI_Spectrum_Analyzer_Installation.docx
+++ b/DSES_RFI_Spectrum_Analyzer_Installation.docx
@@ -41,7 +41,7 @@
           <w:noProof/>
         </w:rPr>
         <w:drawing>
-          <wp:inline distT="0" distB="0" distL="0" distR="0" wp14:anchorId="02F7E94C" wp14:editId="7BBDAAA0">
+          <wp:inline distT="0" distB="0" distL="0" distR="0" wp14:anchorId="396BE141" wp14:editId="7AAD52BA">
             <wp:extent cx="1371600" cy="1371600"/>
             <wp:effectExtent l="0" t="0" r="0" b="0"/>
             <wp:docPr id="1" name="Picture 1"/>
@@ -138,7 +138,7 @@
         <w:pStyle w:val="Heading1"/>
         <w:shd w:val="clear" w:color="auto" w:fill="156082"/>
       </w:pPr>
-      <w:bookmarkStart w:id="0" w:name="_Toc230524758"/>
+      <w:bookmarkStart w:id="0" w:name="_Toc230525468"/>
       <w:r>
         <w:lastRenderedPageBreak/>
         <w:t>Contents</w:t>
@@ -169,7 +169,7 @@
       <w:r>
         <w:fldChar w:fldCharType="separate"/>
       </w:r>
-      <w:hyperlink w:anchor="_Toc230524758" w:history="1">
+      <w:hyperlink w:anchor="_Toc230525468" w:history="1">
         <w:r>
           <w:rPr>
             <w:rStyle w:val="Hyperlink"/>
@@ -196,7 +196,7 @@
             <w:noProof/>
             <w:webHidden/>
           </w:rPr>
-          <w:instrText xml:space="preserve"> PAGEREF _Toc230524758 \h </w:instrText>
+          <w:instrText xml:space="preserve"> PAGEREF _Toc230525468 \h </w:instrText>
         </w:r>
         <w:r>
           <w:rPr>
@@ -242,7 +242,7 @@
           <w14:ligatures w14:val="standardContextual"/>
         </w:rPr>
       </w:pPr>
-      <w:hyperlink w:anchor="_Toc230524759" w:history="1">
+      <w:hyperlink w:anchor="_Toc230525469" w:history="1">
         <w:r>
           <w:rPr>
             <w:rStyle w:val="Hyperlink"/>
@@ -269,7 +269,7 @@
             <w:noProof/>
             <w:webHidden/>
           </w:rPr>
-          <w:instrText xml:space="preserve"> PAGEREF _Toc230524759 \h </w:instrText>
+          <w:instrText xml:space="preserve"> PAGEREF _Toc230525469 \h </w:instrText>
         </w:r>
         <w:r>
           <w:rPr>
@@ -315,7 +315,7 @@
           <w14:ligatures w14:val="standardContextual"/>
         </w:rPr>
       </w:pPr>
-      <w:hyperlink w:anchor="_Toc230524760" w:history="1">
+      <w:hyperlink w:anchor="_Toc230525470" w:history="1">
         <w:r>
           <w:rPr>
             <w:rStyle w:val="Hyperlink"/>
@@ -342,7 +342,7 @@
             <w:noProof/>
             <w:webHidden/>
           </w:rPr>
-          <w:instrText xml:space="preserve"> PAGEREF _Toc230524760 \h </w:instrText>
+          <w:instrText xml:space="preserve"> PAGEREF _Toc230525470 \h </w:instrText>
         </w:r>
         <w:r>
           <w:rPr>
@@ -388,7 +388,7 @@
           <w14:ligatures w14:val="standardContextual"/>
         </w:rPr>
       </w:pPr>
-      <w:hyperlink w:anchor="_Toc230524761" w:history="1">
+      <w:hyperlink w:anchor="_Toc230525471" w:history="1">
         <w:r>
           <w:rPr>
             <w:rStyle w:val="Hyperlink"/>
@@ -415,7 +415,7 @@
             <w:noProof/>
             <w:webHidden/>
           </w:rPr>
-          <w:instrText xml:space="preserve"> PAGEREF _Toc230524761 \h </w:instrText>
+          <w:instrText xml:space="preserve"> PAGEREF _Toc230525471 \h </w:instrText>
         </w:r>
         <w:r>
           <w:rPr>
@@ -461,7 +461,7 @@
           <w14:ligatures w14:val="standardContextual"/>
         </w:rPr>
       </w:pPr>
-      <w:hyperlink w:anchor="_Toc230524762" w:history="1">
+      <w:hyperlink w:anchor="_Toc230525472" w:history="1">
         <w:r>
           <w:rPr>
             <w:rStyle w:val="Hyperlink"/>
@@ -488,7 +488,7 @@
             <w:noProof/>
             <w:webHidden/>
           </w:rPr>
-          <w:instrText xml:space="preserve"> PAGEREF _Toc230524762 \h </w:instrText>
+          <w:instrText xml:space="preserve"> PAGEREF _Toc230525472 \h </w:instrText>
         </w:r>
         <w:r>
           <w:rPr>
@@ -534,7 +534,7 @@
           <w14:ligatures w14:val="standardContextual"/>
         </w:rPr>
       </w:pPr>
-      <w:hyperlink w:anchor="_Toc230524763" w:history="1">
+      <w:hyperlink w:anchor="_Toc230525473" w:history="1">
         <w:r>
           <w:rPr>
             <w:rStyle w:val="Hyperlink"/>
@@ -561,7 +561,7 @@
             <w:noProof/>
             <w:webHidden/>
           </w:rPr>
-          <w:instrText xml:space="preserve"> PAGEREF _Toc230524763 \h </w:instrText>
+          <w:instrText xml:space="preserve"> PAGEREF _Toc230525473 \h </w:instrText>
         </w:r>
         <w:r>
           <w:rPr>
@@ -607,7 +607,7 @@
           <w14:ligatures w14:val="standardContextual"/>
         </w:rPr>
       </w:pPr>
-      <w:hyperlink w:anchor="_Toc230524764" w:history="1">
+      <w:hyperlink w:anchor="_Toc230525474" w:history="1">
         <w:r>
           <w:rPr>
             <w:rStyle w:val="Hyperlink"/>
@@ -634,7 +634,7 @@
             <w:noProof/>
             <w:webHidden/>
           </w:rPr>
-          <w:instrText xml:space="preserve"> PAGEREF _Toc230524764 \h </w:instrText>
+          <w:instrText xml:space="preserve"> PAGEREF _Toc230525474 \h </w:instrText>
         </w:r>
         <w:r>
           <w:rPr>
@@ -680,7 +680,7 @@
           <w14:ligatures w14:val="standardContextual"/>
         </w:rPr>
       </w:pPr>
-      <w:hyperlink w:anchor="_Toc230524765" w:history="1">
+      <w:hyperlink w:anchor="_Toc230525475" w:history="1">
         <w:r>
           <w:rPr>
             <w:rStyle w:val="Hyperlink"/>
@@ -707,7 +707,7 @@
             <w:noProof/>
             <w:webHidden/>
           </w:rPr>
-          <w:instrText xml:space="preserve"> PAGEREF _Toc230524765 \h </w:instrText>
+          <w:instrText xml:space="preserve"> PAGEREF _Toc230525475 \h </w:instrText>
         </w:r>
         <w:r>
           <w:rPr>
@@ -753,7 +753,7 @@
           <w14:ligatures w14:val="standardContextual"/>
         </w:rPr>
       </w:pPr>
-      <w:hyperlink w:anchor="_Toc230524766" w:history="1">
+      <w:hyperlink w:anchor="_Toc230525476" w:history="1">
         <w:r>
           <w:rPr>
             <w:rStyle w:val="Hyperlink"/>
@@ -780,7 +780,7 @@
             <w:noProof/>
             <w:webHidden/>
           </w:rPr>
-          <w:instrText xml:space="preserve"> PAGEREF _Toc230524766 \h </w:instrText>
+          <w:instrText xml:space="preserve"> PAGEREF _Toc230525476 \h </w:instrText>
         </w:r>
         <w:r>
           <w:rPr>
@@ -826,7 +826,7 @@
           <w14:ligatures w14:val="standardContextual"/>
         </w:rPr>
       </w:pPr>
-      <w:hyperlink w:anchor="_Toc230524767" w:history="1">
+      <w:hyperlink w:anchor="_Toc230525477" w:history="1">
         <w:r>
           <w:rPr>
             <w:rStyle w:val="Hyperlink"/>
@@ -853,7 +853,7 @@
             <w:noProof/>
             <w:webHidden/>
           </w:rPr>
-          <w:instrText xml:space="preserve"> PAGEREF _Toc230524767 \h </w:instrText>
+          <w:instrText xml:space="preserve"> PAGEREF _Toc230525477 \h </w:instrText>
         </w:r>
         <w:r>
           <w:rPr>
@@ -899,7 +899,7 @@
           <w14:ligatures w14:val="standardContextual"/>
         </w:rPr>
       </w:pPr>
-      <w:hyperlink w:anchor="_Toc230524768" w:history="1">
+      <w:hyperlink w:anchor="_Toc230525478" w:history="1">
         <w:r>
           <w:rPr>
             <w:rStyle w:val="Hyperlink"/>
@@ -926,7 +926,7 @@
             <w:noProof/>
             <w:webHidden/>
           </w:rPr>
-          <w:instrText xml:space="preserve"> PAGEREF _Toc230524768 \h </w:instrText>
+          <w:instrText xml:space="preserve"> PAGEREF _Toc230525478 \h </w:instrText>
         </w:r>
         <w:r>
           <w:rPr>
@@ -972,7 +972,7 @@
           <w14:ligatures w14:val="standardContextual"/>
         </w:rPr>
       </w:pPr>
-      <w:hyperlink w:anchor="_Toc230524769" w:history="1">
+      <w:hyperlink w:anchor="_Toc230525479" w:history="1">
         <w:r>
           <w:rPr>
             <w:rStyle w:val="Hyperlink"/>
@@ -999,7 +999,7 @@
             <w:noProof/>
             <w:webHidden/>
           </w:rPr>
-          <w:instrText xml:space="preserve"> PAGEREF _Toc230524769 \h </w:instrText>
+          <w:instrText xml:space="preserve"> PAGEREF _Toc230525479 \h </w:instrText>
         </w:r>
         <w:r>
           <w:rPr>
@@ -1045,7 +1045,7 @@
           <w14:ligatures w14:val="standardContextual"/>
         </w:rPr>
       </w:pPr>
-      <w:hyperlink w:anchor="_Toc230524770" w:history="1">
+      <w:hyperlink w:anchor="_Toc230525480" w:history="1">
         <w:r>
           <w:rPr>
             <w:rStyle w:val="Hyperlink"/>
@@ -1072,7 +1072,7 @@
             <w:noProof/>
             <w:webHidden/>
           </w:rPr>
-          <w:instrText xml:space="preserve"> PAGEREF _Toc230524770 \h </w:instrText>
+          <w:instrText xml:space="preserve"> PAGEREF _Toc230525480 \h </w:instrText>
         </w:r>
         <w:r>
           <w:rPr>
@@ -1118,7 +1118,7 @@
           <w14:ligatures w14:val="standardContextual"/>
         </w:rPr>
       </w:pPr>
-      <w:hyperlink w:anchor="_Toc230524771" w:history="1">
+      <w:hyperlink w:anchor="_Toc230525481" w:history="1">
         <w:r>
           <w:rPr>
             <w:rStyle w:val="Hyperlink"/>
@@ -1145,7 +1145,7 @@
             <w:noProof/>
             <w:webHidden/>
           </w:rPr>
-          <w:instrText xml:space="preserve"> PAGEREF _Toc230524771 \h </w:instrText>
+          <w:instrText xml:space="preserve"> PAGEREF _Toc230525481 \h </w:instrText>
         </w:r>
         <w:r>
           <w:rPr>
@@ -1191,7 +1191,7 @@
           <w14:ligatures w14:val="standardContextual"/>
         </w:rPr>
       </w:pPr>
-      <w:hyperlink w:anchor="_Toc230524772" w:history="1">
+      <w:hyperlink w:anchor="_Toc230525482" w:history="1">
         <w:r>
           <w:rPr>
             <w:rStyle w:val="Hyperlink"/>
@@ -1218,7 +1218,7 @@
             <w:noProof/>
             <w:webHidden/>
           </w:rPr>
-          <w:instrText xml:space="preserve"> PAGEREF _Toc230524772 \h </w:instrText>
+          <w:instrText xml:space="preserve"> PAGEREF _Toc230525482 \h </w:instrText>
         </w:r>
         <w:r>
           <w:rPr>
@@ -1264,7 +1264,7 @@
           <w14:ligatures w14:val="standardContextual"/>
         </w:rPr>
       </w:pPr>
-      <w:hyperlink w:anchor="_Toc230524773" w:history="1">
+      <w:hyperlink w:anchor="_Toc230525483" w:history="1">
         <w:r>
           <w:rPr>
             <w:rStyle w:val="Hyperlink"/>
@@ -1291,7 +1291,7 @@
             <w:noProof/>
             <w:webHidden/>
           </w:rPr>
-          <w:instrText xml:space="preserve"> PAGEREF _Toc230524773 \h </w:instrText>
+          <w:instrText xml:space="preserve"> PAGEREF _Toc230525483 \h </w:instrText>
         </w:r>
         <w:r>
           <w:rPr>
@@ -1337,7 +1337,7 @@
           <w14:ligatures w14:val="standardContextual"/>
         </w:rPr>
       </w:pPr>
-      <w:hyperlink w:anchor="_Toc230524774" w:history="1">
+      <w:hyperlink w:anchor="_Toc230525484" w:history="1">
         <w:r>
           <w:rPr>
             <w:rStyle w:val="Hyperlink"/>
@@ -1364,7 +1364,7 @@
             <w:noProof/>
             <w:webHidden/>
           </w:rPr>
-          <w:instrText xml:space="preserve"> PAGEREF _Toc230524774 \h </w:instrText>
+          <w:instrText xml:space="preserve"> PAGEREF _Toc230525484 \h </w:instrText>
         </w:r>
         <w:r>
           <w:rPr>
@@ -1410,7 +1410,7 @@
           <w14:ligatures w14:val="standardContextual"/>
         </w:rPr>
       </w:pPr>
-      <w:hyperlink w:anchor="_Toc230524775" w:history="1">
+      <w:hyperlink w:anchor="_Toc230525485" w:history="1">
         <w:r>
           <w:rPr>
             <w:rStyle w:val="Hyperlink"/>
@@ -1437,7 +1437,7 @@
             <w:noProof/>
             <w:webHidden/>
           </w:rPr>
-          <w:instrText xml:space="preserve"> PAGEREF _Toc230524775 \h </w:instrText>
+          <w:instrText xml:space="preserve"> PAGEREF _Toc230525485 \h </w:instrText>
         </w:r>
         <w:r>
           <w:rPr>
@@ -1483,7 +1483,7 @@
           <w14:ligatures w14:val="standardContextual"/>
         </w:rPr>
       </w:pPr>
-      <w:hyperlink w:anchor="_Toc230524776" w:history="1">
+      <w:hyperlink w:anchor="_Toc230525486" w:history="1">
         <w:r>
           <w:rPr>
             <w:rStyle w:val="Hyperlink"/>
@@ -1510,7 +1510,7 @@
             <w:noProof/>
             <w:webHidden/>
           </w:rPr>
-          <w:instrText xml:space="preserve"> PAGEREF _Toc230524776 \h </w:instrText>
+          <w:instrText xml:space="preserve"> PAGEREF _Toc230525486 \h </w:instrText>
         </w:r>
         <w:r>
           <w:rPr>
@@ -1556,7 +1556,7 @@
           <w14:ligatures w14:val="standardContextual"/>
         </w:rPr>
       </w:pPr>
-      <w:hyperlink w:anchor="_Toc230524777" w:history="1">
+      <w:hyperlink w:anchor="_Toc230525487" w:history="1">
         <w:r>
           <w:rPr>
             <w:rStyle w:val="Hyperlink"/>
@@ -1583,7 +1583,7 @@
             <w:noProof/>
             <w:webHidden/>
           </w:rPr>
-          <w:instrText xml:space="preserve"> PAGEREF _Toc230524777 \h </w:instrText>
+          <w:instrText xml:space="preserve"> PAGEREF _Toc230525487 \h </w:instrText>
         </w:r>
         <w:r>
           <w:rPr>
@@ -1629,7 +1629,7 @@
           <w14:ligatures w14:val="standardContextual"/>
         </w:rPr>
       </w:pPr>
-      <w:hyperlink w:anchor="_Toc230524778" w:history="1">
+      <w:hyperlink w:anchor="_Toc230525488" w:history="1">
         <w:r>
           <w:rPr>
             <w:rStyle w:val="Hyperlink"/>
@@ -1656,7 +1656,7 @@
             <w:noProof/>
             <w:webHidden/>
           </w:rPr>
-          <w:instrText xml:space="preserve"> PAGEREF _Toc230524778 \h </w:instrText>
+          <w:instrText xml:space="preserve"> PAGEREF _Toc230525488 \h </w:instrText>
         </w:r>
         <w:r>
           <w:rPr>
@@ -1702,7 +1702,7 @@
           <w14:ligatures w14:val="standardContextual"/>
         </w:rPr>
       </w:pPr>
-      <w:hyperlink w:anchor="_Toc230524779" w:history="1">
+      <w:hyperlink w:anchor="_Toc230525489" w:history="1">
         <w:r>
           <w:rPr>
             <w:rStyle w:val="Hyperlink"/>
@@ -1729,7 +1729,7 @@
             <w:noProof/>
             <w:webHidden/>
           </w:rPr>
-          <w:instrText xml:space="preserve"> PAGEREF _Toc230524779 \h </w:instrText>
+          <w:instrText xml:space="preserve"> PAGEREF _Toc230525489 \h </w:instrText>
         </w:r>
         <w:r>
           <w:rPr>
@@ -1775,7 +1775,7 @@
           <w14:ligatures w14:val="standardContextual"/>
         </w:rPr>
       </w:pPr>
-      <w:hyperlink w:anchor="_Toc230524780" w:history="1">
+      <w:hyperlink w:anchor="_Toc230525490" w:history="1">
         <w:r>
           <w:rPr>
             <w:rStyle w:val="Hyperlink"/>
@@ -1802,7 +1802,7 @@
             <w:noProof/>
             <w:webHidden/>
           </w:rPr>
-          <w:instrText xml:space="preserve"> PAGEREF _Toc230524780 \h </w:instrText>
+          <w:instrText xml:space="preserve"> PAGEREF _Toc230525490 \h </w:instrText>
         </w:r>
         <w:r>
           <w:rPr>
@@ -1848,7 +1848,7 @@
           <w14:ligatures w14:val="standardContextual"/>
         </w:rPr>
       </w:pPr>
-      <w:hyperlink w:anchor="_Toc230524781" w:history="1">
+      <w:hyperlink w:anchor="_Toc230525491" w:history="1">
         <w:r>
           <w:rPr>
             <w:rStyle w:val="Hyperlink"/>
@@ -1875,7 +1875,7 @@
             <w:noProof/>
             <w:webHidden/>
           </w:rPr>
-          <w:instrText xml:space="preserve"> PAGEREF _Toc230524781 \h </w:instrText>
+          <w:instrText xml:space="preserve"> PAGEREF _Toc230525491 \h </w:instrText>
         </w:r>
         <w:r>
           <w:rPr>
@@ -1921,7 +1921,7 @@
           <w14:ligatures w14:val="standardContextual"/>
         </w:rPr>
       </w:pPr>
-      <w:hyperlink w:anchor="_Toc230524782" w:history="1">
+      <w:hyperlink w:anchor="_Toc230525492" w:history="1">
         <w:r>
           <w:rPr>
             <w:rStyle w:val="Hyperlink"/>
@@ -1948,7 +1948,7 @@
             <w:noProof/>
             <w:webHidden/>
           </w:rPr>
-          <w:instrText xml:space="preserve"> PAGEREF _Toc230524782 \h </w:instrText>
+          <w:instrText xml:space="preserve"> PAGEREF _Toc230525492 \h </w:instrText>
         </w:r>
         <w:r>
           <w:rPr>
@@ -1994,7 +1994,7 @@
           <w14:ligatures w14:val="standardContextual"/>
         </w:rPr>
       </w:pPr>
-      <w:hyperlink w:anchor="_Toc230524783" w:history="1">
+      <w:hyperlink w:anchor="_Toc230525493" w:history="1">
         <w:r>
           <w:rPr>
             <w:rStyle w:val="Hyperlink"/>
@@ -2021,7 +2021,7 @@
             <w:noProof/>
             <w:webHidden/>
           </w:rPr>
-          <w:instrText xml:space="preserve"> PAGEREF _Toc230524783 \h </w:instrText>
+          <w:instrText xml:space="preserve"> PAGEREF _Toc230525493 \h </w:instrText>
         </w:r>
         <w:r>
           <w:rPr>
@@ -2067,7 +2067,7 @@
           <w14:ligatures w14:val="standardContextual"/>
         </w:rPr>
       </w:pPr>
-      <w:hyperlink w:anchor="_Toc230524784" w:history="1">
+      <w:hyperlink w:anchor="_Toc230525494" w:history="1">
         <w:r>
           <w:rPr>
             <w:rStyle w:val="Hyperlink"/>
@@ -2094,7 +2094,7 @@
             <w:noProof/>
             <w:webHidden/>
           </w:rPr>
-          <w:instrText xml:space="preserve"> PAGEREF _Toc230524784 \h </w:instrText>
+          <w:instrText xml:space="preserve"> PAGEREF _Toc230525494 \h </w:instrText>
         </w:r>
         <w:r>
           <w:rPr>
@@ -2140,7 +2140,7 @@
           <w14:ligatures w14:val="standardContextual"/>
         </w:rPr>
       </w:pPr>
-      <w:hyperlink w:anchor="_Toc230524785" w:history="1">
+      <w:hyperlink w:anchor="_Toc230525495" w:history="1">
         <w:r>
           <w:rPr>
             <w:rStyle w:val="Hyperlink"/>
@@ -2167,7 +2167,7 @@
             <w:noProof/>
             <w:webHidden/>
           </w:rPr>
-          <w:instrText xml:space="preserve"> PAGEREF _Toc230524785 \h </w:instrText>
+          <w:instrText xml:space="preserve"> PAGEREF _Toc230525495 \h </w:instrText>
         </w:r>
         <w:r>
           <w:rPr>
@@ -2213,7 +2213,7 @@
           <w14:ligatures w14:val="standardContextual"/>
         </w:rPr>
       </w:pPr>
-      <w:hyperlink w:anchor="_Toc230524786" w:history="1">
+      <w:hyperlink w:anchor="_Toc230525496" w:history="1">
         <w:r>
           <w:rPr>
             <w:rStyle w:val="Hyperlink"/>
@@ -2240,7 +2240,7 @@
             <w:noProof/>
             <w:webHidden/>
           </w:rPr>
-          <w:instrText xml:space="preserve"> PAGEREF _Toc230524786 \h </w:instrText>
+          <w:instrText xml:space="preserve"> PAGEREF _Toc230525496 \h </w:instrText>
         </w:r>
         <w:r>
           <w:rPr>
@@ -2286,7 +2286,7 @@
           <w14:ligatures w14:val="standardContextual"/>
         </w:rPr>
       </w:pPr>
-      <w:hyperlink w:anchor="_Toc230524787" w:history="1">
+      <w:hyperlink w:anchor="_Toc230525497" w:history="1">
         <w:r>
           <w:rPr>
             <w:rStyle w:val="Hyperlink"/>
@@ -2313,7 +2313,7 @@
             <w:noProof/>
             <w:webHidden/>
           </w:rPr>
-          <w:instrText xml:space="preserve"> PAGEREF _Toc230524787 \h </w:instrText>
+          <w:instrText xml:space="preserve"> PAGEREF _Toc230525497 \h </w:instrText>
         </w:r>
         <w:r>
           <w:rPr>
@@ -2359,7 +2359,7 @@
           <w14:ligatures w14:val="standardContextual"/>
         </w:rPr>
       </w:pPr>
-      <w:hyperlink w:anchor="_Toc230524788" w:history="1">
+      <w:hyperlink w:anchor="_Toc230525498" w:history="1">
         <w:r>
           <w:rPr>
             <w:rStyle w:val="Hyperlink"/>
@@ -2386,7 +2386,7 @@
             <w:noProof/>
             <w:webHidden/>
           </w:rPr>
-          <w:instrText xml:space="preserve"> PAGEREF _Toc230524788 \h </w:instrText>
+          <w:instrText xml:space="preserve"> PAGEREF _Toc230525498 \h </w:instrText>
         </w:r>
         <w:r>
           <w:rPr>
@@ -2432,7 +2432,7 @@
           <w14:ligatures w14:val="standardContextual"/>
         </w:rPr>
       </w:pPr>
-      <w:hyperlink w:anchor="_Toc230524789" w:history="1">
+      <w:hyperlink w:anchor="_Toc230525499" w:history="1">
         <w:r>
           <w:rPr>
             <w:rStyle w:val="Hyperlink"/>
@@ -2459,7 +2459,7 @@
             <w:noProof/>
             <w:webHidden/>
           </w:rPr>
-          <w:instrText xml:space="preserve"> PAGEREF _Toc230524789 \h </w:instrText>
+          <w:instrText xml:space="preserve"> PAGEREF _Toc230525499 \h </w:instrText>
         </w:r>
         <w:r>
           <w:rPr>
@@ -2505,7 +2505,7 @@
           <w14:ligatures w14:val="standardContextual"/>
         </w:rPr>
       </w:pPr>
-      <w:hyperlink w:anchor="_Toc230524790" w:history="1">
+      <w:hyperlink w:anchor="_Toc230525500" w:history="1">
         <w:r>
           <w:rPr>
             <w:rStyle w:val="Hyperlink"/>
@@ -2532,7 +2532,7 @@
             <w:noProof/>
             <w:webHidden/>
           </w:rPr>
-          <w:instrText xml:space="preserve"> PAGEREF _Toc230524790 \h </w:instrText>
+          <w:instrText xml:space="preserve"> PAGEREF _Toc230525500 \h </w:instrText>
         </w:r>
         <w:r>
           <w:rPr>
@@ -2578,7 +2578,7 @@
           <w14:ligatures w14:val="standardContextual"/>
         </w:rPr>
       </w:pPr>
-      <w:hyperlink w:anchor="_Toc230524791" w:history="1">
+      <w:hyperlink w:anchor="_Toc230525501" w:history="1">
         <w:r>
           <w:rPr>
             <w:rStyle w:val="Hyperlink"/>
@@ -2605,7 +2605,7 @@
             <w:noProof/>
             <w:webHidden/>
           </w:rPr>
-          <w:instrText xml:space="preserve"> PAGEREF _Toc230524791 \h </w:instrText>
+          <w:instrText xml:space="preserve"> PAGEREF _Toc230525501 \h </w:instrText>
         </w:r>
         <w:r>
           <w:rPr>
@@ -2651,7 +2651,7 @@
           <w14:ligatures w14:val="standardContextual"/>
         </w:rPr>
       </w:pPr>
-      <w:hyperlink w:anchor="_Toc230524792" w:history="1">
+      <w:hyperlink w:anchor="_Toc230525502" w:history="1">
         <w:r>
           <w:rPr>
             <w:rStyle w:val="Hyperlink"/>
@@ -2678,7 +2678,7 @@
             <w:noProof/>
             <w:webHidden/>
           </w:rPr>
-          <w:instrText xml:space="preserve"> PAGEREF _Toc230524792 \h </w:instrText>
+          <w:instrText xml:space="preserve"> PAGEREF _Toc230525502 \h </w:instrText>
         </w:r>
         <w:r>
           <w:rPr>
@@ -2724,7 +2724,7 @@
           <w14:ligatures w14:val="standardContextual"/>
         </w:rPr>
       </w:pPr>
-      <w:hyperlink w:anchor="_Toc230524793" w:history="1">
+      <w:hyperlink w:anchor="_Toc230525503" w:history="1">
         <w:r>
           <w:rPr>
             <w:rStyle w:val="Hyperlink"/>
@@ -2751,7 +2751,7 @@
             <w:noProof/>
             <w:webHidden/>
           </w:rPr>
-          <w:instrText xml:space="preserve"> PAGEREF _Toc230524793 \h </w:instrText>
+          <w:instrText xml:space="preserve"> PAGEREF _Toc230525503 \h </w:instrText>
         </w:r>
         <w:r>
           <w:rPr>
@@ -2797,7 +2797,7 @@
           <w14:ligatures w14:val="standardContextual"/>
         </w:rPr>
       </w:pPr>
-      <w:hyperlink w:anchor="_Toc230524794" w:history="1">
+      <w:hyperlink w:anchor="_Toc230525504" w:history="1">
         <w:r>
           <w:rPr>
             <w:rStyle w:val="Hyperlink"/>
@@ -2824,7 +2824,7 @@
             <w:noProof/>
             <w:webHidden/>
           </w:rPr>
-          <w:instrText xml:space="preserve"> PAGEREF _Toc230524794 \h </w:instrText>
+          <w:instrText xml:space="preserve"> PAGEREF _Toc230525504 \h </w:instrText>
         </w:r>
         <w:r>
           <w:rPr>
@@ -2870,7 +2870,7 @@
           <w14:ligatures w14:val="standardContextual"/>
         </w:rPr>
       </w:pPr>
-      <w:hyperlink w:anchor="_Toc230524795" w:history="1">
+      <w:hyperlink w:anchor="_Toc230525505" w:history="1">
         <w:r>
           <w:rPr>
             <w:rStyle w:val="Hyperlink"/>
@@ -2897,7 +2897,7 @@
             <w:noProof/>
             <w:webHidden/>
           </w:rPr>
-          <w:instrText xml:space="preserve"> PAGEREF _Toc230524795 \h </w:instrText>
+          <w:instrText xml:space="preserve"> PAGEREF _Toc230525505 \h </w:instrText>
         </w:r>
         <w:r>
           <w:rPr>
@@ -2943,7 +2943,7 @@
           <w14:ligatures w14:val="standardContextual"/>
         </w:rPr>
       </w:pPr>
-      <w:hyperlink w:anchor="_Toc230524796" w:history="1">
+      <w:hyperlink w:anchor="_Toc230525506" w:history="1">
         <w:r>
           <w:rPr>
             <w:rStyle w:val="Hyperlink"/>
@@ -2970,7 +2970,7 @@
             <w:noProof/>
             <w:webHidden/>
           </w:rPr>
-          <w:instrText xml:space="preserve"> PAGEREF _Toc230524796 \h </w:instrText>
+          <w:instrText xml:space="preserve"> PAGEREF _Toc230525506 \h </w:instrText>
         </w:r>
         <w:r>
           <w:rPr>
@@ -3016,7 +3016,7 @@
           <w14:ligatures w14:val="standardContextual"/>
         </w:rPr>
       </w:pPr>
-      <w:hyperlink w:anchor="_Toc230524797" w:history="1">
+      <w:hyperlink w:anchor="_Toc230525507" w:history="1">
         <w:r>
           <w:rPr>
             <w:rStyle w:val="Hyperlink"/>
@@ -3043,7 +3043,7 @@
             <w:noProof/>
             <w:webHidden/>
           </w:rPr>
-          <w:instrText xml:space="preserve"> PAGEREF _Toc230524797 \h </w:instrText>
+          <w:instrText xml:space="preserve"> PAGEREF _Toc230525507 \h </w:instrText>
         </w:r>
         <w:r>
           <w:rPr>
@@ -3089,7 +3089,7 @@
           <w14:ligatures w14:val="standardContextual"/>
         </w:rPr>
       </w:pPr>
-      <w:hyperlink w:anchor="_Toc230524798" w:history="1">
+      <w:hyperlink w:anchor="_Toc230525508" w:history="1">
         <w:r>
           <w:rPr>
             <w:rStyle w:val="Hyperlink"/>
@@ -3116,7 +3116,7 @@
             <w:noProof/>
             <w:webHidden/>
           </w:rPr>
-          <w:instrText xml:space="preserve"> PAGEREF _Toc230524798 \h </w:instrText>
+          <w:instrText xml:space="preserve"> PAGEREF _Toc230525508 \h </w:instrText>
         </w:r>
         <w:r>
           <w:rPr>
@@ -3162,7 +3162,7 @@
           <w14:ligatures w14:val="standardContextual"/>
         </w:rPr>
       </w:pPr>
-      <w:hyperlink w:anchor="_Toc230524799" w:history="1">
+      <w:hyperlink w:anchor="_Toc230525509" w:history="1">
         <w:r>
           <w:rPr>
             <w:rStyle w:val="Hyperlink"/>
@@ -3189,7 +3189,7 @@
             <w:noProof/>
             <w:webHidden/>
           </w:rPr>
-          <w:instrText xml:space="preserve"> PAGEREF _Toc230524799 \h </w:instrText>
+          <w:instrText xml:space="preserve"> PAGEREF _Toc230525509 \h </w:instrText>
         </w:r>
         <w:r>
           <w:rPr>
@@ -3235,7 +3235,7 @@
           <w14:ligatures w14:val="standardContextual"/>
         </w:rPr>
       </w:pPr>
-      <w:hyperlink w:anchor="_Toc230524800" w:history="1">
+      <w:hyperlink w:anchor="_Toc230525510" w:history="1">
         <w:r>
           <w:rPr>
             <w:rStyle w:val="Hyperlink"/>
@@ -3262,7 +3262,7 @@
             <w:noProof/>
             <w:webHidden/>
           </w:rPr>
-          <w:instrText xml:space="preserve"> PAGEREF _Toc230524800 \h </w:instrText>
+          <w:instrText xml:space="preserve"> PAGEREF _Toc230525510 \h </w:instrText>
         </w:r>
         <w:r>
           <w:rPr>
@@ -3308,7 +3308,7 @@
           <w14:ligatures w14:val="standardContextual"/>
         </w:rPr>
       </w:pPr>
-      <w:hyperlink w:anchor="_Toc230524801" w:history="1">
+      <w:hyperlink w:anchor="_Toc230525511" w:history="1">
         <w:r>
           <w:rPr>
             <w:rStyle w:val="Hyperlink"/>
@@ -3335,7 +3335,7 @@
             <w:noProof/>
             <w:webHidden/>
           </w:rPr>
-          <w:instrText xml:space="preserve"> PAGEREF _Toc230524801 \h </w:instrText>
+          <w:instrText xml:space="preserve"> PAGEREF _Toc230525511 \h </w:instrText>
         </w:r>
         <w:r>
           <w:rPr>
@@ -3381,7 +3381,7 @@
         <w:pStyle w:val="Heading1"/>
         <w:shd w:val="clear" w:color="auto" w:fill="156082"/>
       </w:pPr>
-      <w:bookmarkStart w:id="1" w:name="_Toc230524759"/>
+      <w:bookmarkStart w:id="1" w:name="_Toc230525469"/>
       <w:r>
         <w:lastRenderedPageBreak/>
         <w:t xml:space="preserve">DSES Spectrum Analyzer — </w:t>
@@ -3460,7 +3460,7 @@
       <w:pPr>
         <w:pStyle w:val="Heading2"/>
       </w:pPr>
-      <w:bookmarkStart w:id="2" w:name="_Toc230524760"/>
+      <w:bookmarkStart w:id="2" w:name="_Toc230525470"/>
       <w:r>
         <w:t>1. What the recipient needs to know first</w:t>
       </w:r>
@@ -3617,7 +3617,7 @@
       <w:pPr>
         <w:pStyle w:val="Heading3"/>
       </w:pPr>
-      <w:bookmarkStart w:id="3" w:name="_Toc230524761"/>
+      <w:bookmarkStart w:id="3" w:name="_Toc230525471"/>
       <w:r>
         <w:t>System requirements</w:t>
       </w:r>
@@ -3896,7 +3896,7 @@
       <w:pPr>
         <w:pStyle w:val="Heading2"/>
       </w:pPr>
-      <w:bookmarkStart w:id="4" w:name="_Toc230524762"/>
+      <w:bookmarkStart w:id="4" w:name="_Toc230525472"/>
       <w:r>
         <w:t>2. Installing Radioconda</w:t>
       </w:r>
@@ -3906,7 +3906,7 @@
       <w:pPr>
         <w:pStyle w:val="Heading3"/>
       </w:pPr>
-      <w:bookmarkStart w:id="5" w:name="_Toc230524763"/>
+      <w:bookmarkStart w:id="5" w:name="_Toc230525473"/>
       <w:r>
         <w:t>2.1 Windows 11</w:t>
       </w:r>
@@ -4130,7 +4130,7 @@
       <w:pPr>
         <w:pStyle w:val="Heading3"/>
       </w:pPr>
-      <w:bookmarkStart w:id="6" w:name="_Toc230524764"/>
+      <w:bookmarkStart w:id="6" w:name="_Toc230525474"/>
       <w:r>
         <w:t>2.2 Linux</w:t>
       </w:r>
@@ -4397,7 +4397,7 @@
       <w:pPr>
         <w:pStyle w:val="Heading3"/>
       </w:pPr>
-      <w:bookmarkStart w:id="7" w:name="_Toc230524765"/>
+      <w:bookmarkStart w:id="7" w:name="_Toc230525475"/>
       <w:r>
         <w:t>2.3 macOS (Intel and Apple Silicon)</w:t>
       </w:r>
@@ -4717,7 +4717,7 @@
       <w:pPr>
         <w:pStyle w:val="Heading3"/>
       </w:pPr>
-      <w:bookmarkStart w:id="8" w:name="_Toc230524766"/>
+      <w:bookmarkStart w:id="8" w:name="_Toc230525476"/>
       <w:r>
         <w:t>2.4 Add the packages the analyzer needs (all platforms)</w:t>
       </w:r>
@@ -4878,7 +4878,7 @@
       <w:pPr>
         <w:pStyle w:val="Heading2"/>
       </w:pPr>
-      <w:bookmarkStart w:id="9" w:name="_Toc230524767"/>
+      <w:bookmarkStart w:id="9" w:name="_Toc230525477"/>
       <w:r>
         <w:t>3. Installing the DSES Spectrum Analyzer</w:t>
       </w:r>
@@ -4947,7 +4947,7 @@
       <w:pPr>
         <w:pStyle w:val="Heading3"/>
       </w:pPr>
-      <w:bookmarkStart w:id="10" w:name="_Toc230524768"/>
+      <w:bookmarkStart w:id="10" w:name="_Toc230525478"/>
       <w:r>
         <w:t>3.1 Windows 11</w:t>
       </w:r>
@@ -5221,7 +5221,7 @@
       <w:pPr>
         <w:pStyle w:val="Heading3"/>
       </w:pPr>
-      <w:bookmarkStart w:id="11" w:name="_Toc230524769"/>
+      <w:bookmarkStart w:id="11" w:name="_Toc230525479"/>
       <w:r>
         <w:t>3.2 Linux</w:t>
       </w:r>
@@ -5518,7 +5518,7 @@
       <w:pPr>
         <w:pStyle w:val="Heading3"/>
       </w:pPr>
-      <w:bookmarkStart w:id="12" w:name="_Toc230524770"/>
+      <w:bookmarkStart w:id="12" w:name="_Toc230525480"/>
       <w:r>
         <w:t>3.3 macOS</w:t>
       </w:r>
@@ -5714,7 +5714,7 @@
       <w:pPr>
         <w:pStyle w:val="Heading2"/>
       </w:pPr>
-      <w:bookmarkStart w:id="13" w:name="_Toc230524771"/>
+      <w:bookmarkStart w:id="13" w:name="_Toc230525481"/>
       <w:r>
         <w:t>3A. Extra setup for SDRPlay receivers (RSP1A / RSP1B / RSPduo / RSPdx)</w:t>
       </w:r>
@@ -5756,7 +5756,7 @@
       <w:pPr>
         <w:pStyle w:val="Heading3"/>
       </w:pPr>
-      <w:bookmarkStart w:id="14" w:name="_Toc230524772"/>
+      <w:bookmarkStart w:id="14" w:name="_Toc230525482"/>
       <w:r>
         <w:t>3A.1 Install the SDRplay API</w:t>
       </w:r>
@@ -5868,7 +5868,7 @@
       <w:pPr>
         <w:pStyle w:val="Heading3"/>
       </w:pPr>
-      <w:bookmarkStart w:id="15" w:name="_Toc230524773"/>
+      <w:bookmarkStart w:id="15" w:name="_Toc230525483"/>
       <w:r>
         <w:t>3A.2 Install the SoapySDRPlay module</w:t>
       </w:r>
@@ -6237,7 +6237,7 @@
       <w:pPr>
         <w:pStyle w:val="Heading2"/>
       </w:pPr>
-      <w:bookmarkStart w:id="16" w:name="_Toc230524774"/>
+      <w:bookmarkStart w:id="16" w:name="_Toc230525484"/>
       <w:r>
         <w:t>4. First-run checklist</w:t>
       </w:r>
@@ -6349,7 +6349,7 @@
       <w:pPr>
         <w:pStyle w:val="Heading3"/>
       </w:pPr>
-      <w:bookmarkStart w:id="17" w:name="_Toc230524775"/>
+      <w:bookmarkStart w:id="17" w:name="_Toc230525485"/>
       <w:r>
         <w:t>Recommended one-time VOLK tuning</w:t>
       </w:r>
@@ -6501,7 +6501,7 @@
       <w:pPr>
         <w:pStyle w:val="Heading2"/>
       </w:pPr>
-      <w:bookmarkStart w:id="18" w:name="_Toc230524776"/>
+      <w:bookmarkStart w:id="18" w:name="_Toc230525486"/>
       <w:r>
         <w:t>5. Updating to a new version</w:t>
       </w:r>
@@ -6511,7 +6511,7 @@
       <w:pPr>
         <w:pStyle w:val="Heading3"/>
       </w:pPr>
-      <w:bookmarkStart w:id="19" w:name="_Toc230524777"/>
+      <w:bookmarkStart w:id="19" w:name="_Toc230525487"/>
       <w:r>
         <w:t>Auto-update notifications</w:t>
       </w:r>
@@ -6602,7 +6602,7 @@
       <w:pPr>
         <w:pStyle w:val="Heading3"/>
       </w:pPr>
-      <w:bookmarkStart w:id="20" w:name="_Toc230524778"/>
+      <w:bookmarkStart w:id="20" w:name="_Toc230525488"/>
       <w:r>
         <w:t>Performing the update</w:t>
       </w:r>
@@ -6698,7 +6698,7 @@
       <w:pPr>
         <w:pStyle w:val="Heading3"/>
       </w:pPr>
-      <w:bookmarkStart w:id="21" w:name="_Toc230524779"/>
+      <w:bookmarkStart w:id="21" w:name="_Toc230525489"/>
       <w:r>
         <w:t>What is preserved across versions</w:t>
       </w:r>
@@ -6884,24 +6884,74 @@
         <w:t>[window]</w:t>
       </w:r>
       <w:r>
-        <w:t xml:space="preserve"> section (a base64 </w:t>
+        <w:t xml:space="preserve"> section (plain </w:t>
       </w:r>
       <w:r>
         <w:rPr>
           <w:rFonts w:ascii="Consolas" w:hAnsi="Consolas"/>
           <w:sz w:val="20"/>
         </w:rPr>
-        <w:t>geometry_b64</w:t>
-      </w:r>
-      <w:r>
-        <w:t xml:space="preserve"> value). You don’t need to touch it; deleting that line just makes the window open at its default size next time.</w:t>
+        <w:t>x</w:t>
+      </w:r>
+      <w:r>
+        <w:t xml:space="preserve"> / </w:t>
+      </w:r>
+      <w:r>
+        <w:rPr>
+          <w:rFonts w:ascii="Consolas" w:hAnsi="Consolas"/>
+          <w:sz w:val="20"/>
+        </w:rPr>
+        <w:t>y</w:t>
+      </w:r>
+      <w:r>
+        <w:t xml:space="preserve"> / </w:t>
+      </w:r>
+      <w:r>
+        <w:rPr>
+          <w:rFonts w:ascii="Consolas" w:hAnsi="Consolas"/>
+          <w:sz w:val="20"/>
+        </w:rPr>
+        <w:t>width</w:t>
+      </w:r>
+      <w:r>
+        <w:t xml:space="preserve"> / </w:t>
+      </w:r>
+      <w:r>
+        <w:rPr>
+          <w:rFonts w:ascii="Consolas" w:hAnsi="Consolas"/>
+          <w:sz w:val="20"/>
+        </w:rPr>
+        <w:t>height</w:t>
+      </w:r>
+      <w:r>
+        <w:t xml:space="preserve"> integers). You don’t need to touch it; setting </w:t>
+      </w:r>
+      <w:r>
+        <w:rPr>
+          <w:rFonts w:ascii="Consolas" w:hAnsi="Consolas"/>
+          <w:sz w:val="20"/>
+        </w:rPr>
+        <w:t>width</w:t>
+      </w:r>
+      <w:r>
+        <w:t>/</w:t>
+      </w:r>
+      <w:r>
+        <w:rPr>
+          <w:rFonts w:ascii="Consolas" w:hAnsi="Consolas"/>
+          <w:sz w:val="20"/>
+        </w:rPr>
+        <w:t>height</w:t>
+      </w:r>
+      <w:r>
+        <w:t xml:space="preserve"> to 0 (or deleting the lines) makes the window open at its default size next time.</w:t>
       </w:r>
     </w:p>
     <w:p>
       <w:pPr>
         <w:pStyle w:val="Heading3"/>
       </w:pPr>
-      <w:bookmarkStart w:id="22" w:name="_Toc230524780"/>
+      <w:bookmarkStart w:id="22" w:name="_Toc230525490"/>
       <w:r>
         <w:lastRenderedPageBreak/>
         <w:t>Backing up your settings</w:t>
@@ -6961,7 +7011,7 @@
       <w:pPr>
         <w:pStyle w:val="Heading2"/>
       </w:pPr>
-      <w:bookmarkStart w:id="23" w:name="_Toc230524781"/>
+      <w:bookmarkStart w:id="23" w:name="_Toc230525491"/>
       <w:r>
         <w:t>6. Troubleshooting</w:t>
       </w:r>
@@ -6971,7 +7021,7 @@
       <w:pPr>
         <w:pStyle w:val="Heading3"/>
       </w:pPr>
-      <w:bookmarkStart w:id="24" w:name="_Toc230524782"/>
+      <w:bookmarkStart w:id="24" w:name="_Toc230525492"/>
       <w:r>
         <w:t>“Radioconda not found in standard locations”</w:t>
       </w:r>
@@ -7115,7 +7165,7 @@
       <w:pPr>
         <w:pStyle w:val="Heading3"/>
       </w:pPr>
-      <w:bookmarkStart w:id="25" w:name="_Toc230524783"/>
+      <w:bookmarkStart w:id="25" w:name="_Toc230525493"/>
       <w:r>
         <w:t>“Missing required packages (PySide6, pyqtgraph, and/or scipy)” — or `ModuleNotFoundError: No module named 'PySide6'`</w:t>
       </w:r>
@@ -7161,7 +7211,7 @@
       <w:pPr>
         <w:pStyle w:val="Heading3"/>
       </w:pPr>
-      <w:bookmarkStart w:id="26" w:name="_Toc230524784"/>
+      <w:bookmarkStart w:id="26" w:name="_Toc230525494"/>
       <w:r>
         <w:t>“No UHD Devices Found”</w:t>
       </w:r>
@@ -7261,7 +7311,7 @@
       <w:pPr>
         <w:pStyle w:val="Heading3"/>
       </w:pPr>
-      <w:bookmarkStart w:id="27" w:name="_Toc230524785"/>
+      <w:bookmarkStart w:id="27" w:name="_Toc230525495"/>
       <w:r>
         <w:t>Persistent “O” overflows at high sample rates</w:t>
       </w:r>
@@ -7269,7 +7319,10 @@
     </w:p>
     <w:p>
       <w:r>
-        <w:t>Some “O” characters in the Overflow box on the right sidebar at startup are normal as the USB pipe warms up. A continuous stream during steady-state operation usually means the host can’t keep up with the sample rate:</w:t>
+        <w:t xml:space="preserve">Some “O” characters in the Overflow box on the right sidebar at startup are normal as the USB pipe warms up. A </w:t>
+      </w:r>
+      <w:r>
+        <w:t>continuous stream during steady-state operation usually means the host can’t keep up with the sample rate:</w:t>
       </w:r>
     </w:p>
     <w:p>
@@ -7305,7 +7358,7 @@
       <w:pPr>
         <w:pStyle w:val="Heading3"/>
       </w:pPr>
-      <w:bookmarkStart w:id="28" w:name="_Toc230524786"/>
+      <w:bookmarkStart w:id="28" w:name="_Toc230525496"/>
       <w:r>
         <w:t>Spectrum looks flat at −140 dB</w:t>
       </w:r>
@@ -7344,7 +7397,7 @@
       <w:pPr>
         <w:pStyle w:val="Heading3"/>
       </w:pPr>
-      <w:bookmarkStart w:id="29" w:name="_Toc230524787"/>
+      <w:bookmarkStart w:id="29" w:name="_Toc230525497"/>
       <w:r>
         <w:t>macOS: “developer cannot be verified”</w:t>
       </w:r>
@@ -7380,7 +7433,7 @@
       <w:pPr>
         <w:pStyle w:val="Heading3"/>
       </w:pPr>
-      <w:bookmarkStart w:id="30" w:name="_Toc230524788"/>
+      <w:bookmarkStart w:id="30" w:name="_Toc230525498"/>
       <w:r>
         <w:t>Settings won’t persist</w:t>
       </w:r>
@@ -7419,7 +7472,13 @@
         <w:rPr>
           <w:b/>
         </w:rPr>
-        <w:t>Help → About → Open Settings Folder</w:t>
+        <w:t xml:space="preserve">Help → </w:t>
+      </w:r>
+      <w:r>
+        <w:rPr>
+          <w:b/>
+        </w:rPr>
+        <w:t>About → Open Settings Folder</w:t>
       </w:r>
       <w:r>
         <w:t xml:space="preserve"> to verify it opens cleanly.</w:t>
@@ -7429,7 +7488,7 @@
       <w:pPr>
         <w:pStyle w:val="Heading2"/>
       </w:pPr>
-      <w:bookmarkStart w:id="31" w:name="_Toc230524789"/>
+      <w:bookmarkStart w:id="31" w:name="_Toc230525499"/>
       <w:r>
         <w:t>7. Appendix A — Settings file reference</w:t>
       </w:r>
@@ -7593,251 +7652,301 @@
         <w:t>[window]</w:t>
       </w:r>
       <w:r>
-        <w:t xml:space="preserve"> — </w:t>
+        <w:t xml:space="preserve"> — saved window position/size as </w:t>
       </w:r>
       <w:r>
         <w:rPr>
           <w:rFonts w:ascii="Consolas" w:hAnsi="Consolas"/>
           <w:sz w:val="20"/>
         </w:rPr>
-        <w:t>geometry_b64</w:t>
-      </w:r>
-      <w:r>
-        <w:t>, the saved window size/position (base64). Delete the line to reset to the default window size.</w:t>
-      </w:r>
-    </w:p>
-    <w:p>
-      <w:pPr>
-        <w:pStyle w:val="ListBullet"/>
-      </w:pPr>
+        <w:t>x</w:t>
+      </w:r>
+      <w:r>
+        <w:t xml:space="preserve"> / </w:t>
+      </w:r>
       <w:r>
         <w:rPr>
           <w:rFonts w:ascii="Consolas" w:hAnsi="Consolas"/>
           <w:sz w:val="20"/>
         </w:rPr>
-        <w:t>[updates]</w:t>
-      </w:r>
-      <w:r>
-        <w:t xml:space="preserve"> — </w:t>
+        <w:t>y</w:t>
+      </w:r>
+      <w:r>
+        <w:t xml:space="preserve"> / </w:t>
       </w:r>
       <w:r>
         <w:rPr>
           <w:rFonts w:ascii="Consolas" w:hAnsi="Consolas"/>
           <w:sz w:val="20"/>
         </w:rPr>
-        <w:t>auto_check</w:t>
-      </w:r>
-      <w:r>
-        <w:t xml:space="preserve"> (set to </w:t>
+        <w:t>width</w:t>
+      </w:r>
+      <w:r>
+        <w:t xml:space="preserve"> / </w:t>
       </w:r>
       <w:r>
         <w:rPr>
           <w:rFonts w:ascii="Consolas" w:hAnsi="Consolas"/>
           <w:sz w:val="20"/>
         </w:rPr>
-        <w:t>false</w:t>
-      </w:r>
-      <w:r>
-        <w:t xml:space="preserve"> to disable update notifications), plus internal book-keeping fields the program manages on its own.</w:t>
-      </w:r>
-    </w:p>
-    <w:p>
-      <w:r>
-        <w:t>Missing keys are filled in from built-in defaults on next launch. The file is rewritten on close with a header comment explaining what it is.</w:t>
-      </w:r>
-    </w:p>
-    <w:p>
-      <w:r>
-        <w:t xml:space="preserve">To reset every value to its default: use </w:t>
-      </w:r>
-      <w:r>
-        <w:rPr>
-          <w:b/>
-        </w:rPr>
-        <w:t>Help → About → Restore Defaults…</w:t>
-      </w:r>
-      <w:r>
-        <w:t>, or just delete the file and launch the app.</w:t>
-      </w:r>
-    </w:p>
-    <w:p>
-      <w:pPr>
-        <w:pStyle w:val="Heading2"/>
-      </w:pPr>
-      <w:bookmarkStart w:id="32" w:name="_Toc230524790"/>
-      <w:r>
-        <w:t>8. Appendix B — Device selection and SigMF playback</w:t>
-      </w:r>
-      <w:bookmarkEnd w:id="32"/>
-    </w:p>
-    <w:p>
-      <w:pPr>
-        <w:pStyle w:val="Heading3"/>
-      </w:pPr>
-      <w:bookmarkStart w:id="33" w:name="_Toc230524791"/>
-      <w:r>
-        <w:t>Choosing among multiple radios</w:t>
-      </w:r>
-      <w:bookmarkEnd w:id="33"/>
-    </w:p>
-    <w:p>
-      <w:r>
-        <w:t>The program enumerates everything supported at launch — Ettus B210s via UHD, plus any SoapySDR-recognised receiver (SDRPlay, RTL-SDR, HackRF, Airspy, Airspy HF+, BladeRF, LimeSDR, PlutoSDR). Behavior:</w:t>
-      </w:r>
-    </w:p>
-    <w:p>
-      <w:pPr>
-        <w:pStyle w:val="ListBullet"/>
-      </w:pPr>
-      <w:r>
-        <w:rPr>
-          <w:b/>
-        </w:rPr>
-        <w:t>No radio attached, no playback sample:</w:t>
-      </w:r>
-      <w:r>
-        <w:t xml:space="preserve"> an error dialog says “No radio found” and explains how to enable playback (see below). The app exits.</w:t>
-      </w:r>
-    </w:p>
-    <w:p>
-      <w:pPr>
-        <w:pStyle w:val="ListBullet"/>
-      </w:pPr>
-      <w:r>
-        <w:rPr>
-          <w:b/>
-        </w:rPr>
-        <w:t>No radio attached, but `sample.sigmf-data` + `sample.sigmf-meta` are present next to the program:</w:t>
-      </w:r>
-      <w:r>
-        <w:t xml:space="preserve"> the app falls back to </w:t>
-      </w:r>
-      <w:r>
-        <w:rPr>
-          <w:b/>
-        </w:rPr>
-        <w:t>SigMF playback mode</w:t>
-      </w:r>
-      <w:r>
-        <w:t xml:space="preserve"> (see below). An informational dialog announces the fallback.</w:t>
-      </w:r>
-    </w:p>
-    <w:p>
-      <w:pPr>
-        <w:pStyle w:val="ListBullet"/>
-      </w:pPr>
-      <w:r>
-        <w:rPr>
-          <w:b/>
-        </w:rPr>
-        <w:t>One radio attached:</w:t>
-      </w:r>
-      <w:r>
-        <w:t xml:space="preserve"> the app opens it silently and remembers it in </w:t>
+        <w:t>height</w:t>
+      </w:r>
+      <w:r>
+        <w:t xml:space="preserve">. Set </w:t>
       </w:r>
       <w:r>
         <w:rPr>
           <w:rFonts w:ascii="Consolas" w:hAnsi="Consolas"/>
           <w:sz w:val="20"/>
         </w:rPr>
-        <w:t>settings.ini</w:t>
-      </w:r>
-      <w:r>
-        <w:t>.</w:t>
-      </w:r>
-    </w:p>
-    <w:p>
-      <w:pPr>
-        <w:pStyle w:val="ListBullet"/>
-      </w:pPr>
-      <w:r>
-        <w:rPr>
-          <w:b/>
-        </w:rPr>
-        <w:t>Two or more radios attached</w:t>
-      </w:r>
-      <w:r>
-        <w:t xml:space="preserve"> (any mix of B210s and SoapySDR receivers): a picker always appears so you choose which one to use. Your previously-used radio is pre-selected, so pressing Enter reuses the same one. The app remembers your selection for next launch.</w:t>
-      </w:r>
-    </w:p>
-    <w:p>
-      <w:r>
-        <w:t xml:space="preserve">The </w:t>
-      </w:r>
-      <w:r>
-        <w:rPr>
-          <w:b/>
-        </w:rPr>
-        <w:t>RX</w:t>
-      </w:r>
-      <w:r>
-        <w:t xml:space="preserve"> sidebar group has a button labeled </w:t>
+        <w:t>width</w:t>
+      </w:r>
+      <w:r>
+        <w:t>/</w:t>
       </w:r>
       <w:r>
         <w:rPr>
           <w:rFonts w:ascii="Consolas" w:hAnsi="Consolas"/>
           <w:sz w:val="20"/>
         </w:rPr>
-        <w:t>Device: &lt;product&gt; — &lt;serial&gt;</w:t>
-      </w:r>
-      <w:r>
-        <w:t xml:space="preserve"> showing which radio the current session is using. Clicking it re-opens the picker; the new choice is saved and takes effect on the next launch.</w:t>
-      </w:r>
-    </w:p>
-    <w:p>
-      <w:r>
-        <w:t>The sample-rate combo and gain-slider range adapt automatically to whichever radio is open. SDRPlay caps at 10 MHz; RTL-SDR maxes around 3.2 MHz; HackRF goes to 20 MHz; the B210 to 25 MHz. Saved gain is clamped to the new device’s range if you switch to a narrower one.</w:t>
-      </w:r>
-    </w:p>
-    <w:p>
-      <w:r>
-        <w:t xml:space="preserve">To pin a specific device permanently without using the picker, edit </w:t>
-      </w:r>
+        <w:t>height</w:t>
+      </w:r>
+      <w:r>
+        <w:t xml:space="preserve"> to 0 (or delete the lines) to reset to the default window size.</w:t>
+      </w:r>
+    </w:p>
+    <w:p>
+      <w:pPr>
+        <w:pStyle w:val="ListBullet"/>
+      </w:pPr>
       <w:r>
         <w:rPr>
           <w:rFonts w:ascii="Consolas" w:hAnsi="Consolas"/>
           <w:sz w:val="20"/>
         </w:rPr>
-        <w:t>settings.ini</w:t>
-      </w:r>
-      <w:r>
-        <w:t xml:space="preserve"> and set </w:t>
+        <w:t>[updates]</w:t>
+      </w:r>
+      <w:r>
+        <w:t xml:space="preserve"> — </w:t>
       </w:r>
       <w:r>
         <w:rPr>
           <w:rFonts w:ascii="Consolas" w:hAnsi="Consolas"/>
           <w:sz w:val="20"/>
         </w:rPr>
-        <w:t>device_driver</w:t>
-      </w:r>
-      <w:r>
-        <w:t xml:space="preserve"> + </w:t>
+        <w:t>auto_check</w:t>
+      </w:r>
+      <w:r>
+        <w:t xml:space="preserve"> (set to </w:t>
       </w:r>
       <w:r>
         <w:rPr>
           <w:rFonts w:ascii="Consolas" w:hAnsi="Consolas"/>
           <w:sz w:val="20"/>
         </w:rPr>
-        <w:t>device_serial</w:t>
-      </w:r>
-      <w:r>
-        <w:t xml:space="preserve"> under </w:t>
+        <w:t>false</w:t>
+      </w:r>
+      <w:r>
+        <w:t xml:space="preserve"> to disable update notifications), plus internal book-keeping fields the program manages on its own.</w:t>
+      </w:r>
+    </w:p>
+    <w:p>
+      <w:r>
+        <w:t>Missing keys are filled in from built-in defaults on next launch. The file is rewritten on close with a header comment explaining what it is.</w:t>
+      </w:r>
+    </w:p>
+    <w:p>
+      <w:r>
+        <w:t xml:space="preserve">To reset every value to its default: use </w:t>
+      </w:r>
+      <w:r>
+        <w:rPr>
+          <w:b/>
+        </w:rPr>
+        <w:t>Help → About → Restore Defaults…</w:t>
+      </w:r>
+      <w:r>
+        <w:t>, or just delete the file and launch the app.</w:t>
+      </w:r>
+    </w:p>
+    <w:p>
+      <w:pPr>
+        <w:pStyle w:val="Heading2"/>
+      </w:pPr>
+      <w:bookmarkStart w:id="32" w:name="_Toc230525500"/>
+      <w:r>
+        <w:t>8. Appendix B — Device selection and SigMF playback</w:t>
+      </w:r>
+      <w:bookmarkEnd w:id="32"/>
+    </w:p>
+    <w:p>
+      <w:pPr>
+        <w:pStyle w:val="Heading3"/>
+      </w:pPr>
+      <w:bookmarkStart w:id="33" w:name="_Toc230525501"/>
+      <w:r>
+        <w:t>Choosing among multiple radios</w:t>
+      </w:r>
+      <w:bookmarkEnd w:id="33"/>
+    </w:p>
+    <w:p>
+      <w:r>
+        <w:t>The program enumerates everything supported at launch — Ettus B210s via UHD, plus any SoapySDR-recognised receiver (SDRPlay, RTL-SDR, HackRF, Airspy, Airspy HF+, BladeRF, LimeSDR, PlutoSDR). Behavior:</w:t>
+      </w:r>
+    </w:p>
+    <w:p>
+      <w:pPr>
+        <w:pStyle w:val="ListBullet"/>
+      </w:pPr>
+      <w:r>
+        <w:rPr>
+          <w:b/>
+        </w:rPr>
+        <w:t>No radio attached, no playback sample:</w:t>
+      </w:r>
+      <w:r>
+        <w:t xml:space="preserve"> an error dialog says “No radio found” and explains how to enable playback (see below). The app exits.</w:t>
+      </w:r>
+    </w:p>
+    <w:p>
+      <w:pPr>
+        <w:pStyle w:val="ListBullet"/>
+      </w:pPr>
+      <w:r>
+        <w:rPr>
+          <w:b/>
+        </w:rPr>
+        <w:t>No radio attached, but `sample.sigmf-data` + `sample.sigmf-meta` are present next to the program:</w:t>
+      </w:r>
+      <w:r>
+        <w:t xml:space="preserve"> the app falls back to </w:t>
+      </w:r>
+      <w:r>
+        <w:rPr>
+          <w:b/>
+        </w:rPr>
+        <w:t>SigMF playback mode</w:t>
+      </w:r>
+      <w:r>
+        <w:t xml:space="preserve"> (see below). An informational dialog announces the fallback.</w:t>
+      </w:r>
+    </w:p>
+    <w:p>
+      <w:pPr>
+        <w:pStyle w:val="ListBullet"/>
+      </w:pPr>
+      <w:r>
+        <w:rPr>
+          <w:b/>
+        </w:rPr>
+        <w:t>One radio attached:</w:t>
+      </w:r>
+      <w:r>
+        <w:t xml:space="preserve"> the app opens it silently and remembers it in </w:t>
       </w:r>
       <w:r>
         <w:rPr>
           <w:rFonts w:ascii="Consolas" w:hAnsi="Consolas"/>
           <w:sz w:val="20"/>
         </w:rPr>
-        <w:t>[rx]</w:t>
-      </w:r>
-      <w:r>
-        <w:t xml:space="preserve">. Use </w:t>
+        <w:t>settings.ini</w:t>
+      </w:r>
+      <w:r>
+        <w:t>.</w:t>
+      </w:r>
+    </w:p>
+    <w:p>
+      <w:pPr>
+        <w:pStyle w:val="ListBullet"/>
+      </w:pPr>
+      <w:r>
+        <w:rPr>
+          <w:b/>
+        </w:rPr>
+        <w:t>Two or more radios attached</w:t>
+      </w:r>
+      <w:r>
+        <w:t xml:space="preserve"> (any mix of B210s and SoapySDR receivers): a picker always appears so you choose which one to use. Your previously-used radio is pre-selected, so pressing Enter reuses the same one. The app remembers your selection for next launch.</w:t>
+      </w:r>
+    </w:p>
+    <w:p>
+      <w:r>
+        <w:t xml:space="preserve">The </w:t>
+      </w:r>
+      <w:r>
+        <w:rPr>
+          <w:b/>
+        </w:rPr>
+        <w:t>RX</w:t>
+      </w:r>
+      <w:r>
+        <w:t xml:space="preserve"> sidebar group has a button labeled </w:t>
       </w:r>
       <w:r>
         <w:rPr>
           <w:rFonts w:ascii="Consolas" w:hAnsi="Consolas"/>
           <w:sz w:val="20"/>
         </w:rPr>
+        <w:t>Device: &lt;product&gt; — &lt;serial&gt;</w:t>
+      </w:r>
+      <w:r>
+        <w:t xml:space="preserve"> showing which radio the current session is using. Clicking it re-opens the picker; the new choice is saved and takes effect on the next launch.</w:t>
+      </w:r>
+    </w:p>
+    <w:p>
+      <w:r>
+        <w:t>The sample-rate combo and gain-slider range adapt automatically to whichever radio is open. SDRPlay caps at 10 MHz; RTL-SDR maxes around 3.2 MHz; HackRF goes to 20 MHz; the B210 to 25 MHz. Saved gain is clamped to the new device’s range if you switch to a narrower one.</w:t>
+      </w:r>
+    </w:p>
+    <w:p>
+      <w:r>
+        <w:t xml:space="preserve">To pin a specific device permanently without using the picker, edit </w:t>
+      </w:r>
+      <w:r>
+        <w:rPr>
+          <w:rFonts w:ascii="Consolas" w:hAnsi="Consolas"/>
+          <w:sz w:val="20"/>
+        </w:rPr>
+        <w:t>settings.ini</w:t>
+      </w:r>
+      <w:r>
+        <w:t xml:space="preserve"> and set </w:t>
+      </w:r>
+      <w:r>
+        <w:rPr>
+          <w:rFonts w:ascii="Consolas" w:hAnsi="Consolas"/>
+          <w:sz w:val="20"/>
+        </w:rPr>
+        <w:t>device_driver</w:t>
+      </w:r>
+      <w:r>
+        <w:t xml:space="preserve"> + </w:t>
+      </w:r>
+      <w:r>
+        <w:rPr>
+          <w:rFonts w:ascii="Consolas" w:hAnsi="Consolas"/>
+          <w:sz w:val="20"/>
+        </w:rPr>
+        <w:t>device_serial</w:t>
+      </w:r>
+      <w:r>
+        <w:t xml:space="preserve"> under </w:t>
+      </w:r>
+      <w:r>
+        <w:rPr>
+          <w:rFonts w:ascii="Consolas" w:hAnsi="Consolas"/>
+          <w:sz w:val="20"/>
+        </w:rPr>
+        <w:t>[rx]</w:t>
+      </w:r>
+      <w:r>
+        <w:t xml:space="preserve">. Use </w:t>
+      </w:r>
+      <w:r>
+        <w:rPr>
+          <w:rFonts w:ascii="Consolas" w:hAnsi="Consolas"/>
+          <w:sz w:val="20"/>
+        </w:rPr>
         <w:t>device_serial = auto</w:t>
       </w:r>
       <w:r>
@@ -7848,7 +7957,7 @@
       <w:pPr>
         <w:pStyle w:val="Heading3"/>
       </w:pPr>
-      <w:bookmarkStart w:id="34" w:name="_Toc230524792"/>
+      <w:bookmarkStart w:id="34" w:name="_Toc230525502"/>
       <w:r>
         <w:lastRenderedPageBreak/>
         <w:t>SigMF playback mode (no-device fallback)</w:t>
@@ -7857,7 +7966,10 @@
     </w:p>
     <w:p>
       <w:r>
-        <w:t>The distribution bundle includes a short SigMF recording so that users without any SDR attached can still launch the program, see live spectrum, and try the controls.</w:t>
+        <w:t xml:space="preserve">The distribution bundle includes a short </w:t>
+      </w:r>
+      <w:r>
+        <w:t>SigMF recording so that users without any SDR attached can still launch the program, see live spectrum, and try the controls.</w:t>
       </w:r>
     </w:p>
     <w:p>
@@ -7901,10 +8013,7 @@
         <w:pStyle w:val="ListBullet"/>
       </w:pPr>
       <w:r>
-        <w:t xml:space="preserve">The file is </w:t>
-      </w:r>
-      <w:r>
-        <w:t>read in a continuous loop, paced to match the original capture’s sample rate.</w:t>
+        <w:t>The file is read in a continuous loop, paced to match the original capture’s sample rate.</w:t>
       </w:r>
     </w:p>
     <w:p>
@@ -8050,7 +8159,7 @@
       <w:pPr>
         <w:pStyle w:val="Heading2"/>
       </w:pPr>
-      <w:bookmarkStart w:id="35" w:name="_Toc230524793"/>
+      <w:bookmarkStart w:id="35" w:name="_Toc230525503"/>
       <w:r>
         <w:t>9. Appendix C — Operating Guide</w:t>
       </w:r>
@@ -8072,17 +8181,17 @@
     </w:p>
     <w:p>
       <w:r>
-        <w:t xml:space="preserve">This is a live spectrum analyzer and waterfall display for the Ettus USRP </w:t>
-      </w:r>
-      <w:r>
-        <w:t>B210 and other software-defined radios (SDRPlay RSP1A/RSP1B/RSPduo/RSPdx, RTL-SDR, HackRF, Airspy, BladeRF, LimeSDR, PlutoSDR via SoapySDR), designed for pulsar RFI investigation but useful for general-purpose spectrum monitoring.</w:t>
+        <w:t xml:space="preserve">This is a live spectrum analyzer and </w:t>
+      </w:r>
+      <w:r>
+        <w:t>waterfall display for the Ettus USRP B210 and other software-defined radios (SDRPlay RSP1A/RSP1B/RSPduo/RSPdx, RTL-SDR, HackRF, Airspy, BladeRF, LimeSDR, PlutoSDR via SoapySDR), designed for pulsar RFI investigation but useful for general-purpose spectrum monitoring.</w:t>
       </w:r>
     </w:p>
     <w:p>
       <w:pPr>
         <w:pStyle w:val="Heading3"/>
       </w:pPr>
-      <w:bookmarkStart w:id="36" w:name="_Toc230524794"/>
+      <w:bookmarkStart w:id="36" w:name="_Toc230525504"/>
       <w:r>
         <w:t>Starting up — device selection</w:t>
       </w:r>
@@ -8187,7 +8296,7 @@
       <w:pPr>
         <w:pStyle w:val="Heading3"/>
       </w:pPr>
-      <w:bookmarkStart w:id="37" w:name="_Toc230524795"/>
+      <w:bookmarkStart w:id="37" w:name="_Toc230525505"/>
       <w:r>
         <w:t>Playback mode</w:t>
       </w:r>
@@ -8313,7 +8422,7 @@
       <w:pPr>
         <w:pStyle w:val="Heading3"/>
       </w:pPr>
-      <w:bookmarkStart w:id="38" w:name="_Toc230524796"/>
+      <w:bookmarkStart w:id="38" w:name="_Toc230525506"/>
       <w:r>
         <w:t>Sidebar controls (right side)</w:t>
       </w:r>
@@ -8372,10 +8481,7 @@
         <w:t>Fine Tune</w:t>
       </w:r>
       <w:r>
-        <w:t xml:space="preserve">: ±10 MHz </w:t>
-      </w:r>
-      <w:r>
-        <w:t>offset, layered on top of Coarse Tune.</w:t>
+        <w:t>: ±10 MHz offset, layered on top of Coarse Tune.</w:t>
       </w:r>
     </w:p>
     <w:p>
@@ -8600,7 +8706,7 @@
       <w:pPr>
         <w:pStyle w:val="Heading3"/>
       </w:pPr>
-      <w:bookmarkStart w:id="39" w:name="_Toc230524797"/>
+      <w:bookmarkStart w:id="39" w:name="_Toc230525507"/>
       <w:r>
         <w:t>Spectrum (top plot)</w:t>
       </w:r>
@@ -8608,10 +8714,7 @@
     </w:p>
     <w:p>
       <w:r>
-        <w:t xml:space="preserve">Live FFT magnitude in dB. Use the control panel on the right side to </w:t>
-      </w:r>
-      <w:r>
-        <w:t>adjust:</w:t>
+        <w:t>Live FFT magnitude in dB. Use the control panel on the right side to adjust:</w:t>
       </w:r>
     </w:p>
     <w:p>
@@ -8639,7 +8742,10 @@
         <w:t>Window</w:t>
       </w:r>
       <w:r>
-        <w:t>: Blackman-Harris is the default — low sidelobes, good for RFI hunting. Hann/Hamming have narrower main lobes; Rectangular has the sharpest peak but the worst sidelobes.</w:t>
+        <w:t xml:space="preserve">: </w:t>
+      </w:r>
+      <w:r>
+        <w:t>Blackman-Harris is the default — low sidelobes, good for RFI hunting. Hann/Hamming have narrower main lobes; Rectangular has the sharpest peak but the worst sidelobes.</w:t>
       </w:r>
     </w:p>
     <w:p>
@@ -8743,7 +8849,7 @@
       <w:pPr>
         <w:pStyle w:val="Heading3"/>
       </w:pPr>
-      <w:bookmarkStart w:id="40" w:name="_Toc230524798"/>
+      <w:bookmarkStart w:id="40" w:name="_Toc230525508"/>
       <w:r>
         <w:t>Waterfall (bottom plot)</w:t>
       </w:r>
@@ -8809,7 +8915,7 @@
       <w:pPr>
         <w:pStyle w:val="Heading3"/>
       </w:pPr>
-      <w:bookmarkStart w:id="41" w:name="_Toc230524799"/>
+      <w:bookmarkStart w:id="41" w:name="_Toc230525509"/>
       <w:r>
         <w:lastRenderedPageBreak/>
         <w:t>Persistence</w:t>
@@ -8857,7 +8963,7 @@
       <w:pPr>
         <w:pStyle w:val="Heading3"/>
       </w:pPr>
-      <w:bookmarkStart w:id="42" w:name="_Toc230524800"/>
+      <w:bookmarkStart w:id="42" w:name="_Toc230525510"/>
       <w:r>
         <w:t>Update checks</w:t>
       </w:r>
@@ -8915,7 +9021,7 @@
       <w:pPr>
         <w:pStyle w:val="Heading3"/>
       </w:pPr>
-      <w:bookmarkStart w:id="43" w:name="_Toc230524801"/>
+      <w:bookmarkStart w:id="43" w:name="_Toc230525511"/>
       <w:r>
         <w:t>Tips for pulsar work</w:t>
       </w:r>
@@ -9105,14 +9211,7 @@
         <w:b/>
         <w:color w:val="156082"/>
       </w:rPr>
-      <w:t xml:space="preserve">DSES </w:t>
-    </w:r>
-    <w:r>
-      <w:rPr>
-        <w:b/>
-        <w:color w:val="156082"/>
-      </w:rPr>
-      <w:t>Spectrum Analyzer</w:t>
+      <w:t>DSES Spectrum Analyzer</w:t>
     </w:r>
   </w:p>
   <w:p>
@@ -9301,31 +9400,31 @@
       </w:rPr>
     </w:lvl>
   </w:abstractNum>
-  <w:num w:numId="1" w16cid:durableId="469636636">
+  <w:num w:numId="1" w16cid:durableId="457646003">
     <w:abstractNumId w:val="8"/>
   </w:num>
-  <w:num w:numId="2" w16cid:durableId="268318830">
+  <w:num w:numId="2" w16cid:durableId="608440365">
     <w:abstractNumId w:val="6"/>
   </w:num>
-  <w:num w:numId="3" w16cid:durableId="1613973453">
+  <w:num w:numId="3" w16cid:durableId="1663653323">
     <w:abstractNumId w:val="5"/>
   </w:num>
-  <w:num w:numId="4" w16cid:durableId="1797868134">
+  <w:num w:numId="4" w16cid:durableId="2113237361">
     <w:abstractNumId w:val="4"/>
   </w:num>
-  <w:num w:numId="5" w16cid:durableId="729883056">
+  <w:num w:numId="5" w16cid:durableId="1438209547">
     <w:abstractNumId w:val="7"/>
   </w:num>
-  <w:num w:numId="6" w16cid:durableId="617493681">
+  <w:num w:numId="6" w16cid:durableId="194541386">
     <w:abstractNumId w:val="3"/>
   </w:num>
-  <w:num w:numId="7" w16cid:durableId="1926765675">
+  <w:num w:numId="7" w16cid:durableId="2102942328">
     <w:abstractNumId w:val="2"/>
   </w:num>
-  <w:num w:numId="8" w16cid:durableId="914165719">
+  <w:num w:numId="8" w16cid:durableId="1527450313">
     <w:abstractNumId w:val="1"/>
   </w:num>
-  <w:num w:numId="9" w16cid:durableId="1925793664">
+  <w:num w:numId="9" w16cid:durableId="1671910092">
     <w:abstractNumId w:val="0"/>
   </w:num>
 </w:numbering>
@@ -20720,7 +20819,7 @@
     <w:autoRedefine/>
     <w:uiPriority w:val="39"/>
     <w:unhideWhenUsed/>
-    <w:rsid w:val="00087463"/>
+    <w:rsid w:val="00677984"/>
     <w:pPr>
       <w:spacing w:after="100"/>
     </w:pPr>
@@ -20732,7 +20831,7 @@
     <w:autoRedefine/>
     <w:uiPriority w:val="39"/>
     <w:unhideWhenUsed/>
-    <w:rsid w:val="00087463"/>
+    <w:rsid w:val="00677984"/>
     <w:pPr>
       <w:spacing w:after="100"/>
       <w:ind w:left="220"/>
@@ -20745,7 +20844,7 @@
     <w:autoRedefine/>
     <w:uiPriority w:val="39"/>
     <w:unhideWhenUsed/>
-    <w:rsid w:val="00087463"/>
+    <w:rsid w:val="00677984"/>
     <w:pPr>
       <w:spacing w:after="100"/>
       <w:ind w:left="440"/>
@@ -20756,7 +20855,7 @@
     <w:basedOn w:val="DefaultParagraphFont"/>
     <w:uiPriority w:val="99"/>
     <w:unhideWhenUsed/>
-    <w:rsid w:val="00087463"/>
+    <w:rsid w:val="00677984"/>
     <w:rPr>
       <w:color w:val="0000FF" w:themeColor="hyperlink"/>
       <w:u w:val="single"/>

</xml_diff>